<commit_message>
Se agrega nombre del co-asesor en el formato del proyecto.
</commit_message>
<xml_diff>
--- a/Formato Proyecto Investigación.docx
+++ b/Formato Proyecto Investigación.docx
@@ -193,12 +193,12 @@
     </w:p>
     <w:p>
       <w:pPr>
+        <w:pStyle w:val="PrrAPA"/>
         <w:jc w:val="center"/>
-        <w:rPr>
-          <w:rFonts w:cs="Times New Roman"/>
-          <w:szCs w:val="24"/>
-        </w:rPr>
-      </w:pPr>
+      </w:pPr>
+      <w:r>
+        <w:t>Co-asesor: Julián Arango Toro</w:t>
+      </w:r>
     </w:p>
     <w:p>
       <w:pPr>
@@ -6310,6 +6310,9 @@
         <w:ind w:left="1080"/>
       </w:pPr>
       <w:r>
+        <w:rPr>
+          <w:noProof/>
+        </w:rPr>
         <w:drawing>
           <wp:inline distT="0" distB="0" distL="0" distR="0" wp14:anchorId="607205E3" wp14:editId="748872D1">
             <wp:extent cx="4711700" cy="5225896"/>
@@ -7329,8 +7332,16 @@
             <w:rPr>
               <w:rFonts w:cs="Times New Roman"/>
               <w:noProof/>
+              <w:lang w:val="en-US"/>
             </w:rPr>
-            <w:t>Codina, L. (2026). La biblioteca unversitaria en la era de la IA.pdf (p. 48).</w:t>
+            <w:t xml:space="preserve">Codina, L. (2026). </w:t>
+          </w:r>
+          <w:r>
+            <w:rPr>
+              <w:rFonts w:cs="Times New Roman"/>
+              <w:noProof/>
+            </w:rPr>
+            <w:t>La biblioteca unversitaria en la era de la IA.pdf (p. 48).</w:t>
           </w:r>
         </w:p>
         <w:p>
@@ -14754,14 +14765,6 @@
 </file>
 
 <file path=customXml/item1.xml><?xml version="1.0" encoding="utf-8"?>
-<p:properties xmlns:p="http://schemas.microsoft.com/office/2006/metadata/properties" xmlns:xsi="http://www.w3.org/2001/XMLSchema-instance" xmlns:pc="http://schemas.microsoft.com/office/infopath/2007/PartnerControls">
-  <documentManagement>
-    <_activity xmlns="152b35e6-23a1-4beb-a1fd-2689778f6058" xsi:nil="true"/>
-  </documentManagement>
-</p:properties>
-</file>
-
-<file path=customXml/item2.xml><?xml version="1.0" encoding="utf-8"?>
 <b:Sources xmlns:b="http://schemas.openxmlformats.org/officeDocument/2006/bibliography" xmlns="http://schemas.openxmlformats.org/officeDocument/2006/bibliography" SelectedStyle="\APASixthEditionOfficeOnline.xsl" StyleName="APA" Version="6">
   <b:Source>
     <b:Tag>Men90</b:Tag>
@@ -15493,7 +15496,24 @@
 </b:Sources>
 </file>
 
+<file path=customXml/item2.xml><?xml version="1.0" encoding="utf-8"?>
+<p:properties xmlns:p="http://schemas.microsoft.com/office/2006/metadata/properties" xmlns:xsi="http://www.w3.org/2001/XMLSchema-instance" xmlns:pc="http://schemas.microsoft.com/office/infopath/2007/PartnerControls">
+  <documentManagement>
+    <_activity xmlns="152b35e6-23a1-4beb-a1fd-2689778f6058" xsi:nil="true"/>
+  </documentManagement>
+</p:properties>
+</file>
+
 <file path=customXml/item3.xml><?xml version="1.0" encoding="utf-8"?>
+<?mso-contentType ?>
+<FormTemplates xmlns="http://schemas.microsoft.com/sharepoint/v3/contenttype/forms">
+  <Display>DocumentLibraryForm</Display>
+  <Edit>DocumentLibraryForm</Edit>
+  <New>DocumentLibraryForm</New>
+</FormTemplates>
+</file>
+
+<file path=customXml/item4.xml><?xml version="1.0" encoding="utf-8"?>
 <ct:contentTypeSchema xmlns:ct="http://schemas.microsoft.com/office/2006/metadata/contentType" xmlns:ma="http://schemas.microsoft.com/office/2006/metadata/properties/metaAttributes" ct:_="" ma:_="" ma:contentTypeName="Documento" ma:contentTypeID="0x01010015BDB27AF1A6EC4C99611A7AD03A3206" ma:contentTypeVersion="18" ma:contentTypeDescription="Crear nuevo documento." ma:contentTypeScope="" ma:versionID="56de9a8de695fa7f309cf2eb59d05ef4">
   <xsd:schema xmlns:xsd="http://www.w3.org/2001/XMLSchema" xmlns:xs="http://www.w3.org/2001/XMLSchema" xmlns:p="http://schemas.microsoft.com/office/2006/metadata/properties" xmlns:ns3="ed1181c6-4963-4f9c-a6e4-d7efb21233a0" xmlns:ns4="152b35e6-23a1-4beb-a1fd-2689778f6058" targetNamespace="http://schemas.microsoft.com/office/2006/metadata/properties" ma:root="true" ma:fieldsID="cae7528616b6d30ad4c29b83143ea2c0" ns3:_="" ns4:_="">
     <xsd:import namespace="ed1181c6-4963-4f9c-a6e4-d7efb21233a0"/>
@@ -15746,16 +15766,15 @@
 </ct:contentTypeSchema>
 </file>
 
-<file path=customXml/item4.xml><?xml version="1.0" encoding="utf-8"?>
-<?mso-contentType ?>
-<FormTemplates xmlns="http://schemas.microsoft.com/sharepoint/v3/contenttype/forms">
-  <Display>DocumentLibraryForm</Display>
-  <Edit>DocumentLibraryForm</Edit>
-  <New>DocumentLibraryForm</New>
-</FormTemplates>
+<file path=customXml/itemProps1.xml><?xml version="1.0" encoding="utf-8"?>
+<ds:datastoreItem xmlns:ds="http://schemas.openxmlformats.org/officeDocument/2006/customXml" ds:itemID="{2F2CB120-89EE-4E4C-AC3A-037C340CBE59}">
+  <ds:schemaRefs>
+    <ds:schemaRef ds:uri="http://schemas.openxmlformats.org/officeDocument/2006/bibliography"/>
+  </ds:schemaRefs>
+</ds:datastoreItem>
 </file>
 
-<file path=customXml/itemProps1.xml><?xml version="1.0" encoding="utf-8"?>
+<file path=customXml/itemProps2.xml><?xml version="1.0" encoding="utf-8"?>
 <ds:datastoreItem xmlns:ds="http://schemas.openxmlformats.org/officeDocument/2006/customXml" ds:itemID="{B58D4DAF-C7F0-4FA3-950B-89D41305B414}">
   <ds:schemaRefs>
     <ds:schemaRef ds:uri="http://schemas.microsoft.com/office/2006/metadata/properties"/>
@@ -15765,15 +15784,15 @@
 </ds:datastoreItem>
 </file>
 
-<file path=customXml/itemProps2.xml><?xml version="1.0" encoding="utf-8"?>
-<ds:datastoreItem xmlns:ds="http://schemas.openxmlformats.org/officeDocument/2006/customXml" ds:itemID="{2F2CB120-89EE-4E4C-AC3A-037C340CBE59}">
+<file path=customXml/itemProps3.xml><?xml version="1.0" encoding="utf-8"?>
+<ds:datastoreItem xmlns:ds="http://schemas.openxmlformats.org/officeDocument/2006/customXml" ds:itemID="{7F74FD34-EBDF-4094-A9AD-E46225785B9A}">
   <ds:schemaRefs>
-    <ds:schemaRef ds:uri="http://schemas.openxmlformats.org/officeDocument/2006/bibliography"/>
+    <ds:schemaRef ds:uri="http://schemas.microsoft.com/sharepoint/v3/contenttype/forms"/>
   </ds:schemaRefs>
 </ds:datastoreItem>
 </file>
 
-<file path=customXml/itemProps3.xml><?xml version="1.0" encoding="utf-8"?>
+<file path=customXml/itemProps4.xml><?xml version="1.0" encoding="utf-8"?>
 <ds:datastoreItem xmlns:ds="http://schemas.openxmlformats.org/officeDocument/2006/customXml" ds:itemID="{71334E21-6B6C-4687-847F-D6F99FF4EBD6}">
   <ds:schemaRefs>
     <ds:schemaRef ds:uri="http://schemas.microsoft.com/office/2006/metadata/contentType"/>
@@ -15790,12 +15809,4 @@
     <ds:schemaRef ds:uri="http://schemas.microsoft.com/internal/obd"/>
   </ds:schemaRefs>
 </ds:datastoreItem>
-</file>
-
-<file path=customXml/itemProps4.xml><?xml version="1.0" encoding="utf-8"?>
-<ds:datastoreItem xmlns:ds="http://schemas.openxmlformats.org/officeDocument/2006/customXml" ds:itemID="{7F74FD34-EBDF-4094-A9AD-E46225785B9A}">
-  <ds:schemaRefs>
-    <ds:schemaRef ds:uri="http://schemas.microsoft.com/sharepoint/v3/contenttype/forms"/>
-  </ds:schemaRefs>
-</ds:datastoreItem>
 </file>
</xml_diff>

<commit_message>
Se elimina parte de Hipótesis de trabajo.
</commit_message>
<xml_diff>
--- a/Formato Proyecto Investigación.docx
+++ b/Formato Proyecto Investigación.docx
@@ -5458,9 +5458,9 @@
     </w:p>
     <w:p>
       <w:pPr>
-        <w:ind w:firstLine="708"/>
-        <w:rPr>
-          <w:rFonts w:cs="Times New Roman"/>
+        <w:rPr>
+          <w:rFonts w:cs="Times New Roman"/>
+          <w:b/>
           <w:szCs w:val="24"/>
         </w:rPr>
       </w:pPr>
@@ -5472,8 +5472,7 @@
           <w:b/>
         </w:rPr>
       </w:pPr>
-      <w:bookmarkStart w:id="29" w:name="_Toc440985133"/>
-      <w:commentRangeStart w:id="30"/>
+      <w:bookmarkStart w:id="29" w:name="_Toc440985134"/>
       <w:r>
         <w:rPr>
           <w:b/>
@@ -5484,112 +5483,21 @@
         <w:rPr>
           <w:b/>
         </w:rPr>
-        <w:t>.1</w:t>
-      </w:r>
-      <w:commentRangeEnd w:id="30"/>
-      <w:r>
-        <w:rPr>
-          <w:rStyle w:val="Refdecomentario"/>
-          <w:b/>
-          <w:sz w:val="24"/>
-          <w:szCs w:val="22"/>
-        </w:rPr>
-        <w:commentReference w:id="30"/>
-      </w:r>
-      <w:r>
-        <w:rPr>
-          <w:b/>
-        </w:rPr>
-        <w:t xml:space="preserve"> Hipótesis de </w:t>
-      </w:r>
-      <w:r>
-        <w:rPr>
-          <w:b/>
-        </w:rPr>
-        <w:t>t</w:t>
-      </w:r>
-      <w:r>
-        <w:rPr>
-          <w:b/>
-        </w:rPr>
-        <w:t>rabajo</w:t>
+        <w:t xml:space="preserve">.2 Hipótesis </w:t>
+      </w:r>
+      <w:r>
+        <w:rPr>
+          <w:b/>
+        </w:rPr>
+        <w:t>e</w:t>
+      </w:r>
+      <w:r>
+        <w:rPr>
+          <w:b/>
+        </w:rPr>
+        <w:t>stadística</w:t>
       </w:r>
       <w:bookmarkEnd w:id="29"/>
-    </w:p>
-    <w:p>
-      <w:pPr>
-        <w:rPr>
-          <w:rFonts w:cs="Times New Roman"/>
-          <w:b/>
-          <w:szCs w:val="24"/>
-        </w:rPr>
-      </w:pPr>
-    </w:p>
-    <w:p>
-      <w:pPr>
-        <w:ind w:firstLine="708"/>
-        <w:rPr>
-          <w:rFonts w:cs="Times New Roman"/>
-          <w:szCs w:val="24"/>
-        </w:rPr>
-      </w:pPr>
-      <w:r>
-        <w:rPr>
-          <w:rFonts w:cs="Times New Roman"/>
-          <w:szCs w:val="24"/>
-        </w:rPr>
-        <w:t>Texto descriptivo</w:t>
-      </w:r>
-      <w:r>
-        <w:rPr>
-          <w:rFonts w:cs="Times New Roman"/>
-          <w:szCs w:val="24"/>
-        </w:rPr>
-        <w:t>.</w:t>
-      </w:r>
-    </w:p>
-    <w:p>
-      <w:pPr>
-        <w:rPr>
-          <w:rFonts w:cs="Times New Roman"/>
-          <w:b/>
-          <w:szCs w:val="24"/>
-        </w:rPr>
-      </w:pPr>
-    </w:p>
-    <w:p>
-      <w:pPr>
-        <w:jc w:val="left"/>
-        <w:rPr>
-          <w:b/>
-        </w:rPr>
-      </w:pPr>
-      <w:bookmarkStart w:id="31" w:name="_Toc440985134"/>
-      <w:r>
-        <w:rPr>
-          <w:b/>
-        </w:rPr>
-        <w:t>5</w:t>
-      </w:r>
-      <w:r>
-        <w:rPr>
-          <w:b/>
-        </w:rPr>
-        <w:t xml:space="preserve">.2 Hipótesis </w:t>
-      </w:r>
-      <w:r>
-        <w:rPr>
-          <w:b/>
-        </w:rPr>
-        <w:t>e</w:t>
-      </w:r>
-      <w:r>
-        <w:rPr>
-          <w:b/>
-        </w:rPr>
-        <w:t>stadística</w:t>
-      </w:r>
-      <w:bookmarkEnd w:id="31"/>
     </w:p>
     <w:p>
       <w:pPr>
@@ -5749,7 +5657,6 @@
           <w:rFonts w:cs="Times New Roman"/>
           <w:szCs w:val="24"/>
         </w:rPr>
-        <w:lastRenderedPageBreak/>
         <w:t xml:space="preserve">Porcentaje de actualización en tiempo real (coherencia entre inventario físico y </w:t>
       </w:r>
       <w:r>
@@ -5793,7 +5700,7 @@
           <w:b/>
         </w:rPr>
       </w:pPr>
-      <w:bookmarkStart w:id="32" w:name="_Toc440985137"/>
+      <w:bookmarkStart w:id="30" w:name="_Toc440985137"/>
       <w:r>
         <w:rPr>
           <w:b/>
@@ -5818,7 +5725,7 @@
         </w:rPr>
         <w:t>eórico</w:t>
       </w:r>
-      <w:bookmarkEnd w:id="32"/>
+      <w:bookmarkEnd w:id="30"/>
     </w:p>
     <w:p>
       <w:pPr>
@@ -5912,7 +5819,7 @@
           <w:b/>
         </w:rPr>
       </w:pPr>
-      <w:bookmarkStart w:id="33" w:name="_Toc440985138"/>
+      <w:bookmarkStart w:id="31" w:name="_Toc440985138"/>
       <w:r>
         <w:rPr>
           <w:b/>
@@ -5932,16 +5839,16 @@
         </w:rPr>
         <w:t xml:space="preserve"> </w:t>
       </w:r>
-      <w:bookmarkStart w:id="34" w:name="_Toc440985139"/>
+      <w:bookmarkStart w:id="32" w:name="_Toc440985139"/>
       <w:r>
         <w:rPr>
           <w:b/>
         </w:rPr>
         <w:t>Metodología</w:t>
       </w:r>
-      <w:bookmarkEnd w:id="34"/>
-    </w:p>
-    <w:bookmarkEnd w:id="33"/>
+      <w:bookmarkEnd w:id="32"/>
+    </w:p>
+    <w:bookmarkEnd w:id="31"/>
     <w:p>
       <w:pPr>
         <w:rPr>
@@ -6457,7 +6364,7 @@
           <w:bCs/>
         </w:rPr>
       </w:pPr>
-      <w:bookmarkStart w:id="35" w:name="_Toc440985140"/>
+      <w:bookmarkStart w:id="33" w:name="_Toc440985140"/>
       <w:r>
         <w:rPr>
           <w:b/>
@@ -6473,7 +6380,7 @@
         </w:rPr>
         <w:t xml:space="preserve"> Resultados</w:t>
       </w:r>
-      <w:bookmarkEnd w:id="35"/>
+      <w:bookmarkEnd w:id="33"/>
     </w:p>
     <w:p>
       <w:pPr>
@@ -6521,7 +6428,7 @@
         </w:rPr>
         <w:t xml:space="preserve">, proyecto o investigación. Aquí se pueden incluir tablas, figuras, diagramas y demás material demostrativo. </w:t>
       </w:r>
-      <w:bookmarkStart w:id="36" w:name="_Ref57038153"/>
+      <w:bookmarkStart w:id="34" w:name="_Ref57038153"/>
     </w:p>
     <w:p>
       <w:pPr>
@@ -6531,8 +6438,8 @@
           <w:b/>
         </w:rPr>
       </w:pPr>
-      <w:bookmarkStart w:id="37" w:name="_Toc440985141"/>
-      <w:bookmarkEnd w:id="36"/>
+      <w:bookmarkStart w:id="35" w:name="_Toc440985141"/>
+      <w:bookmarkEnd w:id="34"/>
       <w:r>
         <w:rPr>
           <w:b/>
@@ -6563,7 +6470,7 @@
         </w:rPr>
         <w:t xml:space="preserve"> Discusión</w:t>
       </w:r>
-      <w:bookmarkEnd w:id="37"/>
+      <w:bookmarkEnd w:id="35"/>
     </w:p>
     <w:p>
       <w:pPr>
@@ -6629,7 +6536,7 @@
           <w:bCs/>
         </w:rPr>
       </w:pPr>
-      <w:bookmarkStart w:id="38" w:name="_Toc440985142"/>
+      <w:bookmarkStart w:id="36" w:name="_Toc440985142"/>
       <w:r>
         <w:rPr>
           <w:b/>
@@ -6645,7 +6552,7 @@
         </w:rPr>
         <w:t xml:space="preserve"> Conclusiones</w:t>
       </w:r>
-      <w:bookmarkEnd w:id="38"/>
+      <w:bookmarkEnd w:id="36"/>
     </w:p>
     <w:p>
       <w:pPr>
@@ -7068,30 +6975,30 @@
       <w:pPr>
         <w:pStyle w:val="Ttulo1"/>
       </w:pPr>
-      <w:bookmarkStart w:id="39" w:name="_Toc440985143"/>
-      <w:bookmarkStart w:id="40" w:name="_Toc758643157"/>
+      <w:bookmarkStart w:id="37" w:name="_Toc440985143"/>
+      <w:bookmarkStart w:id="38" w:name="_Toc758643157"/>
       <w:r>
         <w:br w:type="page"/>
       </w:r>
-      <w:commentRangeStart w:id="41"/>
+      <w:commentRangeStart w:id="39"/>
       <w:r>
         <w:lastRenderedPageBreak/>
         <w:t>R</w:t>
       </w:r>
-      <w:commentRangeEnd w:id="41"/>
+      <w:commentRangeEnd w:id="39"/>
       <w:r>
         <w:rPr>
           <w:rStyle w:val="Refdecomentario"/>
           <w:sz w:val="24"/>
           <w:szCs w:val="32"/>
         </w:rPr>
-        <w:commentReference w:id="41"/>
+        <w:commentReference w:id="39"/>
       </w:r>
       <w:r>
         <w:t>eferencias</w:t>
       </w:r>
-      <w:bookmarkEnd w:id="39"/>
-      <w:bookmarkEnd w:id="40"/>
+      <w:bookmarkEnd w:id="37"/>
+      <w:bookmarkEnd w:id="38"/>
     </w:p>
     <w:p/>
     <w:sdt>
@@ -8593,15 +8500,15 @@
           <w:b/>
         </w:rPr>
       </w:pPr>
-      <w:bookmarkStart w:id="42" w:name="_Toc440985144"/>
-      <w:commentRangeStart w:id="43"/>
+      <w:bookmarkStart w:id="40" w:name="_Toc440985144"/>
+      <w:commentRangeStart w:id="41"/>
       <w:r>
         <w:rPr>
           <w:b/>
         </w:rPr>
         <w:t>A</w:t>
       </w:r>
-      <w:commentRangeEnd w:id="43"/>
+      <w:commentRangeEnd w:id="41"/>
       <w:r>
         <w:rPr>
           <w:rStyle w:val="Refdecomentario"/>
@@ -8609,7 +8516,7 @@
           <w:sz w:val="24"/>
           <w:szCs w:val="22"/>
         </w:rPr>
-        <w:commentReference w:id="43"/>
+        <w:commentReference w:id="41"/>
       </w:r>
       <w:r>
         <w:rPr>
@@ -8617,7 +8524,7 @@
         </w:rPr>
         <w:t>nexos</w:t>
       </w:r>
-      <w:bookmarkEnd w:id="42"/>
+      <w:bookmarkEnd w:id="40"/>
     </w:p>
     <w:p>
       <w:pPr>
@@ -9722,7 +9629,7 @@
       </w:r>
     </w:p>
   </w:comment>
-  <w:comment w:id="30" w:author="Autor" w:initials="A">
+  <w:comment w:id="39" w:author="Autor" w:initials="A">
     <w:p>
       <w:pPr>
         <w:pStyle w:val="Textocomentario"/>
@@ -9735,12 +9642,36 @@
       </w:r>
       <w:r>
         <w:rPr>
-          <w:b/>
-        </w:rPr>
-        <w:t>Nivel 2 APA</w:t>
-      </w:r>
-      <w:r>
-        <w:t>: número arábigo, alineado a la izquierda, negritas, minúsculas. Este estilo ya está configurado en: Inicio &gt; Nivel 2 APA</w:t>
+          <w:rFonts w:cs="Times New Roman"/>
+        </w:rPr>
+        <w:t>Lista alfabética de fuentes consultadas.</w:t>
+      </w:r>
+      <w:r>
+        <w:t xml:space="preserve"> </w:t>
+      </w:r>
+      <w:r>
+        <w:rPr>
+          <w:rFonts w:cs="Times New Roman"/>
+        </w:rPr>
+        <w:t>Todas, sin excepción, deben estar citadas dentro del texto</w:t>
+      </w:r>
+      <w:r>
+        <w:rPr>
+          <w:rFonts w:cs="Times New Roman"/>
+        </w:rPr>
+        <w:t xml:space="preserve"> al menos una vez</w:t>
+      </w:r>
+      <w:r>
+        <w:rPr>
+          <w:rFonts w:cs="Times New Roman"/>
+        </w:rPr>
+        <w:t xml:space="preserve">. </w:t>
+      </w:r>
+      <w:r>
+        <w:rPr>
+          <w:rFonts w:cs="Times New Roman"/>
+        </w:rPr>
+        <w:t>Se debe conservar la estructura de citación según las normas APA.</w:t>
       </w:r>
     </w:p>
     <w:p>
@@ -9750,57 +9681,6 @@
     </w:p>
   </w:comment>
   <w:comment w:id="41" w:author="Autor" w:initials="A">
-    <w:p>
-      <w:pPr>
-        <w:pStyle w:val="Textocomentario"/>
-      </w:pPr>
-      <w:r>
-        <w:rPr>
-          <w:rStyle w:val="Refdecomentario"/>
-        </w:rPr>
-        <w:annotationRef/>
-      </w:r>
-      <w:r>
-        <w:rPr>
-          <w:rFonts w:cs="Times New Roman"/>
-        </w:rPr>
-        <w:t>Lista alfabética de fuentes consultadas.</w:t>
-      </w:r>
-      <w:r>
-        <w:t xml:space="preserve"> </w:t>
-      </w:r>
-      <w:r>
-        <w:rPr>
-          <w:rFonts w:cs="Times New Roman"/>
-        </w:rPr>
-        <w:t>Todas, sin excepción, deben estar citadas dentro del texto</w:t>
-      </w:r>
-      <w:r>
-        <w:rPr>
-          <w:rFonts w:cs="Times New Roman"/>
-        </w:rPr>
-        <w:t xml:space="preserve"> al menos una vez</w:t>
-      </w:r>
-      <w:r>
-        <w:rPr>
-          <w:rFonts w:cs="Times New Roman"/>
-        </w:rPr>
-        <w:t xml:space="preserve">. </w:t>
-      </w:r>
-      <w:r>
-        <w:rPr>
-          <w:rFonts w:cs="Times New Roman"/>
-        </w:rPr>
-        <w:t>Se debe conservar la estructura de citación según las normas APA.</w:t>
-      </w:r>
-    </w:p>
-    <w:p>
-      <w:pPr>
-        <w:pStyle w:val="Textocomentario"/>
-      </w:pPr>
-    </w:p>
-  </w:comment>
-  <w:comment w:id="43" w:author="Autor" w:initials="A">
     <w:p>
       <w:pPr>
         <w:pStyle w:val="Textocomentario"/>
@@ -9888,7 +9768,6 @@
   <w15:commentEx w15:paraId="33EB55E0" w15:done="0"/>
   <w15:commentEx w15:paraId="278B3905" w15:done="0"/>
   <w15:commentEx w15:paraId="054A37B0" w15:done="0"/>
-  <w15:commentEx w15:paraId="36A0914C" w15:done="0"/>
   <w15:commentEx w15:paraId="07FA2090" w15:done="0"/>
   <w15:commentEx w15:paraId="12DDE124" w15:done="0"/>
 </w15:commentsEx>
@@ -9912,7 +9791,6 @@
   <w16cid:commentId w16cid:paraId="33EB55E0" w16cid:durableId="2B4B62E1"/>
   <w16cid:commentId w16cid:paraId="278B3905" w16cid:durableId="2B4B6F67"/>
   <w16cid:commentId w16cid:paraId="054A37B0" w16cid:durableId="2B4B6F7C"/>
-  <w16cid:commentId w16cid:paraId="36A0914C" w16cid:durableId="2B4B7219"/>
   <w16cid:commentId w16cid:paraId="07FA2090" w16cid:durableId="2B546375"/>
   <w16cid:commentId w16cid:paraId="12DDE124" w16cid:durableId="2B548902"/>
 </w16cid:commentsIds>

</xml_diff>

<commit_message>
Actualización de referencias y correcciones solicitados en el formato
</commit_message>
<xml_diff>
--- a/Formato Proyecto Investigación.docx
+++ b/Formato Proyecto Investigación.docx
@@ -193,12 +193,12 @@
     </w:p>
     <w:p>
       <w:pPr>
-        <w:pStyle w:val="PrrAPA"/>
         <w:jc w:val="center"/>
-      </w:pPr>
-      <w:r>
-        <w:t>Co-asesor: Julián Arango Toro</w:t>
-      </w:r>
+        <w:rPr>
+          <w:rFonts w:cs="Times New Roman"/>
+          <w:szCs w:val="24"/>
+        </w:rPr>
+      </w:pPr>
     </w:p>
     <w:p>
       <w:pPr>
@@ -799,7 +799,7 @@
     <w:sdt>
       <w:sdtPr>
         <w:rPr>
-          <w:rFonts w:eastAsiaTheme="minorHAnsi" w:cstheme="minorBidi"/>
+          <w:rFonts w:eastAsiaTheme="minorEastAsia" w:cstheme="minorBidi"/>
           <w:b w:val="0"/>
           <w:szCs w:val="22"/>
           <w:lang w:eastAsia="en-US"/>
@@ -2259,63 +2259,50 @@
       <w:bookmarkStart w:id="16" w:name="_Toc1036221317"/>
       <w:r>
         <w:lastRenderedPageBreak/>
-        <w:t>Introducció</w:t>
-      </w:r>
-      <w:commentRangeStart w:id="17"/>
-      <w:r>
-        <w:t>n</w:t>
+        <w:t>Introducción</w:t>
       </w:r>
       <w:bookmarkEnd w:id="13"/>
       <w:bookmarkEnd w:id="14"/>
       <w:bookmarkEnd w:id="15"/>
       <w:bookmarkEnd w:id="16"/>
+    </w:p>
+    <w:p>
+      <w:pPr>
+        <w:ind w:firstLine="708"/>
+        <w:rPr>
+          <w:szCs w:val="24"/>
+        </w:rPr>
+      </w:pPr>
+    </w:p>
+    <w:p>
+      <w:pPr>
+        <w:ind w:firstLine="708"/>
+        <w:rPr>
+          <w:szCs w:val="24"/>
+        </w:rPr>
+      </w:pPr>
+      <w:r>
+        <w:rPr>
+          <w:szCs w:val="24"/>
+        </w:rPr>
+        <w:t>La introducción de un trabajo de grado debe presentar el tema de investigación, explicando el por qué y el para qué del estudio. Debe incluir el planteamiento del problema, los objetivos generales y específicos, las preguntas de investigación y la justificación del trabajo, resaltando su relevancia. Se debe explicar brevemente el enfoque metodológico y la estructura del documento. Aunque se recomienda el uso de tercera persona, las Normas APA permiten primera persona singular o plural, dependiendo de la cantidad de autores, por lo que es importante confirmar el estilo con el asesor</w:t>
+      </w:r>
+      <w:commentRangeStart w:id="17"/>
+      <w:r>
+        <w:rPr>
+          <w:rStyle w:val="Refdenotaalpie"/>
+          <w:szCs w:val="24"/>
+        </w:rPr>
+        <w:footnoteReference w:id="2"/>
+      </w:r>
       <w:commentRangeEnd w:id="17"/>
       <w:r>
         <w:rPr>
           <w:rStyle w:val="Refdecomentario"/>
           <w:sz w:val="24"/>
-          <w:szCs w:val="32"/>
+          <w:szCs w:val="24"/>
         </w:rPr>
         <w:commentReference w:id="17"/>
-      </w:r>
-    </w:p>
-    <w:p>
-      <w:pPr>
-        <w:ind w:firstLine="708"/>
-        <w:rPr>
-          <w:szCs w:val="24"/>
-        </w:rPr>
-      </w:pPr>
-    </w:p>
-    <w:p>
-      <w:pPr>
-        <w:ind w:firstLine="708"/>
-        <w:rPr>
-          <w:szCs w:val="24"/>
-        </w:rPr>
-      </w:pPr>
-      <w:r>
-        <w:rPr>
-          <w:szCs w:val="24"/>
-        </w:rPr>
-        <w:t>La introducción de un trabajo de grado debe presentar el tema de investigación, explicando el por qué y el para qué del estudio. Debe incluir el planteamiento del problema, los objetivos generales y específicos, las preguntas de investigación y la justificación del trabajo, resaltando su relevancia. Se debe explicar brevemente el enfoque metodológico y la estructura del documento. Aunque se recomienda el uso de tercera persona, las Normas APA permiten primera persona singular o plural, dependiendo de la cantidad de autores, por lo que es importante confirmar el estilo con el asesor</w:t>
-      </w:r>
-      <w:commentRangeStart w:id="18"/>
-      <w:r>
-        <w:rPr>
-          <w:rStyle w:val="Refdenotaalpie"/>
-          <w:szCs w:val="24"/>
-        </w:rPr>
-        <w:footnoteReference w:id="2"/>
-      </w:r>
-      <w:commentRangeEnd w:id="18"/>
-      <w:r>
-        <w:rPr>
-          <w:rStyle w:val="Refdecomentario"/>
-          <w:sz w:val="24"/>
-          <w:szCs w:val="24"/>
-        </w:rPr>
-        <w:commentReference w:id="18"/>
       </w:r>
       <w:r>
         <w:rPr>
@@ -3119,7 +3106,7 @@
           <w:b/>
         </w:rPr>
       </w:pPr>
-      <w:bookmarkStart w:id="19" w:name="_Toc440985126"/>
+      <w:bookmarkStart w:id="18" w:name="_Toc440985126"/>
     </w:p>
     <w:p>
       <w:pPr>
@@ -3144,13 +3131,13 @@
         </w:rPr>
         <w:t xml:space="preserve">1 </w:t>
       </w:r>
-      <w:bookmarkEnd w:id="19"/>
+      <w:bookmarkEnd w:id="18"/>
       <w:r>
         <w:rPr>
           <w:b/>
           <w:bCs/>
         </w:rPr>
-        <w:t>Antecedentes</w:t>
+        <w:t>antecedentes</w:t>
       </w:r>
     </w:p>
     <w:p>
@@ -3172,7 +3159,98 @@
         <w:rPr>
           <w:rFonts w:cs="Times New Roman"/>
         </w:rPr>
-        <w:t>Hoy en día, la tecnología de identificación por radiofrecuencia (RFID) se ha consolidado como un recurso clave en múltiples sectores, incluyendo la salud, la agricultura, el entretenimiento, la construcción y la seguridad, donde se emplea para la prevención del robo de vehículos y mercancías. En el ámbito de la logística y la cadena de suministro, el RFID ha sido ampliamente estudiado como herramienta que facilita la colaboración y la visibilidad entre actores, reflejándose en beneficios como la reducción de quiebres de inventario y la mejora de la trazabilidad de productos. Sin embargo, su adopción aún enfrenta limitaciones relacionadas con los costos de implementación, la falta de estandarización y los desafíos de seguridad (Bendavid et al., 2007).</w:t>
+        <w:t>Hoy en día, la tecnología de identificación por radiofrecuencia (RFID) se ha consolidado como un recurso clave en múltiples sectores, incluyendo la salud, la agricultura, el entretenimiento, la construcción y la seguridad, donde se emplea para la prevención del robo de vehículos y mercancías</w:t>
+      </w:r>
+      <w:r>
+        <w:rPr>
+          <w:rFonts w:cs="Times New Roman"/>
+        </w:rPr>
+        <w:t xml:space="preserve"> </w:t>
+      </w:r>
+      <w:r>
+        <w:rPr>
+          <w:rFonts w:cs="Times New Roman"/>
+        </w:rPr>
+        <w:t>(</w:t>
+      </w:r>
+      <w:r>
+        <w:rPr>
+          <w:rFonts w:cs="Times New Roman"/>
+        </w:rPr>
+        <w:t>Rachmatullah &amp; Faizin</w:t>
+      </w:r>
+      <w:r>
+        <w:rPr>
+          <w:rFonts w:cs="Times New Roman"/>
+        </w:rPr>
+        <w:t>, 20</w:t>
+      </w:r>
+      <w:r>
+        <w:rPr>
+          <w:rFonts w:cs="Times New Roman"/>
+        </w:rPr>
+        <w:t>23</w:t>
+      </w:r>
+      <w:r>
+        <w:rPr>
+          <w:rFonts w:cs="Times New Roman"/>
+        </w:rPr>
+        <w:t>).</w:t>
+      </w:r>
+      <w:r>
+        <w:rPr>
+          <w:rFonts w:cs="Times New Roman"/>
+        </w:rPr>
+        <w:t xml:space="preserve"> En el ámbito de la logística y la cadena de suministro, el RFID ha sido ampliamente estudiado como herramienta que facilita la colaboración y la visibilidad entre actores, reflejándose en beneficios como la reducción de quiebres de inventario y la mejora de la trazabilidad de productos</w:t>
+      </w:r>
+      <w:r>
+        <w:rPr>
+          <w:rFonts w:cs="Times New Roman"/>
+        </w:rPr>
+        <w:t xml:space="preserve"> </w:t>
+      </w:r>
+      <w:r>
+        <w:rPr>
+          <w:rFonts w:cs="Times New Roman"/>
+        </w:rPr>
+        <w:fldChar w:fldCharType="begin" w:fldLock="1"/>
+      </w:r>
+      <w:r>
+        <w:rPr>
+          <w:rFonts w:cs="Times New Roman"/>
+        </w:rPr>
+        <w:instrText>ADDIN CSL_CITATION {"citationItems":[{"id":"ITEM-1","itemData":{"DOI":"10.37934/araset.33.1.163174","ISSN":"24621943","abstract":"Radio Frequency Identification (RFID) refers to a wireless system comprising two components: tags and readers. The reader is a device with one or more antennas that emit radio waves and receive signals from the RFID tag. This system is available on most systems applications especially involving security systems, including house/office access systems, toll systems, and library systems. The accessing data is made stand-alone or data-based through the existing conventional RFID system on the market, especially in library systems. Also, the tag provided is only limited to the same type, either cards or stickers. From that, it will produce problems in monitoring the status of books, especially for loans or returns. At the same time, the difference in detection sensitivity will be the effect of the detection range for the types of tag used. Through this research, the development of adaptive RFID on IoT platforms with different types of passive tag library systems highly emphasized monitoring the status of books besides maximum range detection by using different types of passive tag and at the same time increasing the security by implementing the book status detection on the gate of the library. The tag sticker used can be read/written in the 13.56 MHz frequency with the High Frequency (HF) band due to its affordability and ease of implementation. RFID tags are embedded in all books and activated; it triggers the alarm system if the status return gets captured on the memory of the RFID tag. The alarm accuracy is almost 100%. The result showed that within the acceptable range of 5 cm, the RFID reader works efficiently in detecting books. It shows that the card tag gives 90% sensitivity of range detection, followed by the sticker and keychain tag at 70%, and, lastly, the transparent card tags at 40%.","author":[{"dropping-particle":"","family":"Ali","given":"Kharudin","non-dropping-particle":"","parse-names":false,"suffix":""},{"dropping-particle":"","family":"Rifai","given":"Damhuji","non-dropping-particle":"","parse-names":false,"suffix":""},{"dropping-particle":"","family":"Abdullah","given":"Afizullah","non-dropping-particle":"","parse-names":false,"suffix":""},{"dropping-particle":"","family":"Zain","given":"Muhammad Luqman Muhd","non-dropping-particle":"","parse-names":false,"suffix":""},{"dropping-particle":"","family":"Joraimee","given":"Ahmad","non-dropping-particle":"","parse-names":false,"suffix":""},{"dropping-particle":"","family":"Abdallah","given":"Ahmed N.","non-dropping-particle":"","parse-names":false,"suffix":""},{"dropping-particle":"","family":"Awang","given":"Nur Amalina","non-dropping-particle":"","parse-names":false,"suffix":""},{"dropping-particle":"","family":"Tan","given":"Jian Ding","non-dropping-particle":"","parse-names":false,"suffix":""},{"dropping-particle":"","family":"Paw","given":"Johnny Koh Siaw","non-dropping-particle":"","parse-names":false,"suffix":""},{"dropping-particle":"","family":"Yaw","given":"Chong Tak","non-dropping-particle":"","parse-names":false,"suffix":""}],"container-title":"Journal of Advanced Research in Applied Sciences and Engineering Technology","id":"ITEM-1","issue":"1","issued":{"date-parts":[["2023"]]},"page":"163-174","title":"Design of Adaptive RFID RC522 on IoT Platform with Different Types Passive Tag Based on Self-Service Library Management System (SSLMS)","type":"article-journal","volume":"33"},"uris":["http://www.mendeley.com/documents/?uuid=fcf6d57f-14c6-4443-b96b-ddd2953ced9f","http://www.mendeley.com/documents/?uuid=458909a3-3316-43f3-ad3d-6d3d795bf02f"]}],"mendeley":{"formattedCitation":"(Ali et al., 2023)","plainTextFormattedCitation":"(Ali et al., 2023)","previouslyFormattedCitation":"(Ali et al., 2023)"},"properties":{"noteIndex":0},"schema":"https://github.com/citation-style-language/schema/raw/master/csl-citation.json"}</w:instrText>
+      </w:r>
+      <w:r>
+        <w:rPr>
+          <w:rFonts w:cs="Times New Roman"/>
+        </w:rPr>
+        <w:fldChar w:fldCharType="separate"/>
+      </w:r>
+      <w:r>
+        <w:rPr>
+          <w:rFonts w:cs="Times New Roman"/>
+          <w:noProof/>
+        </w:rPr>
+        <w:t>(Ali et al., 2023)</w:t>
+      </w:r>
+      <w:r>
+        <w:rPr>
+          <w:rFonts w:cs="Times New Roman"/>
+        </w:rPr>
+        <w:fldChar w:fldCharType="end"/>
+      </w:r>
+      <w:r>
+        <w:rPr>
+          <w:rFonts w:cs="Times New Roman"/>
+        </w:rPr>
+        <w:t xml:space="preserve">. Sin embargo, su adopción aún enfrenta limitaciones relacionadas con los costos de implementación, la falta de estandarización y los desafíos de </w:t>
+      </w:r>
+      <w:r>
+        <w:rPr>
+          <w:rFonts w:cs="Times New Roman"/>
+        </w:rPr>
+        <w:t>seguridad (Bendavid et al., 2007).</w:t>
       </w:r>
     </w:p>
     <w:p>
@@ -3221,7 +3299,10 @@
         <w:fldChar w:fldCharType="end"/>
       </w:r>
       <w:r>
-        <w:t>, y de esta manera se deben transformar para seguir prestando sus servicios de una manera óptima pero también ágil.</w:t>
+        <w:t>,</w:t>
+      </w:r>
+      <w:r>
+        <w:t xml:space="preserve"> y de esta manera se deben transformar para seguir prestando sus servicios de una manera óptima pero también ágil.</w:t>
       </w:r>
     </w:p>
     <w:p>
@@ -3243,23 +3324,300 @@
         <w:rPr>
           <w:rFonts w:cs="Times New Roman"/>
         </w:rPr>
-        <w:t xml:space="preserve">Los sistemas RFID se caracteriza generalmente por el uso de un dispositivo simple en un extremo, llamado etiqueta, las etiquetas RFID pueden ser adhesivas, de papel o de plástico, también, de diversos tamaños. Dentro de la etiqueta se encuentra un chip capaz de almacenar cierta cantidad de información, por otro lado, se encuentra un dispositivo en el otro extremo del enlace, llamado lector. Una etiqueta consta de una antena y un chip de circuito </w:t>
-      </w:r>
-      <w:commentRangeStart w:id="20"/>
-      <w:r>
-        <w:rPr>
-          <w:rFonts w:cs="Times New Roman"/>
-        </w:rPr>
-        <w:t xml:space="preserve">integrado de aplicación </w:t>
+        <w:t xml:space="preserve">Los sistemas RFID se caracteriza generalmente por el uso de un dispositivo simple en un extremo, llamado etiqueta, las etiquetas RFID pueden ser adhesivas, de papel o de plástico, también, de diversos tamaños. Dentro de la etiqueta se encuentra un chip capaz de almacenar cierta cantidad de información, por otro lado, se encuentra un dispositivo en el otro extremo del enlace, </w:t>
       </w:r>
       <w:r>
         <w:rPr>
           <w:rFonts w:cs="Times New Roman"/>
         </w:rPr>
         <w:lastRenderedPageBreak/>
-        <w:t xml:space="preserve">específica (ASIC) </w:t>
-      </w:r>
-      <w:commentRangeEnd w:id="20"/>
+        <w:t xml:space="preserve">llamado lector. Una etiqueta consta de una antena y un chip de circuito integrado de aplicación específica (ASIC) </w:t>
+      </w:r>
+      <w:r>
+        <w:rPr>
+          <w:rFonts w:cs="Times New Roman"/>
+        </w:rPr>
+        <w:t xml:space="preserve"> que, por lo general, en las bibliotecas suele usarse HF (13,56 MHz, ISO 15693/18000-3) por su buen acoplamiento cercano y menor apantallamiento por papel; para patios/logística domina UHF (ISO 18000-63 / EPC Gen2) por mayor alcance </w:t>
+      </w:r>
+      <w:r>
+        <w:rPr>
+          <w:rFonts w:cs="Times New Roman"/>
+        </w:rPr>
+        <w:t xml:space="preserve">y, </w:t>
+      </w:r>
+      <w:r>
+        <w:rPr>
+          <w:rFonts w:cs="Times New Roman"/>
+        </w:rPr>
+        <w:t xml:space="preserve">además, </w:t>
+      </w:r>
+      <w:r>
+        <w:rPr>
+          <w:rFonts w:cs="Times New Roman"/>
+        </w:rPr>
+        <w:t>e</w:t>
+      </w:r>
+      <w:r>
+        <w:rPr>
+          <w:rFonts w:cs="Times New Roman"/>
+        </w:rPr>
+        <w:t>stas</w:t>
+      </w:r>
+      <w:r>
+        <w:rPr>
+          <w:rFonts w:cs="Times New Roman"/>
+        </w:rPr>
+        <w:t xml:space="preserve"> </w:t>
+      </w:r>
+      <w:r>
+        <w:rPr>
+          <w:rFonts w:cs="Times New Roman"/>
+        </w:rPr>
+        <w:t>contiene</w:t>
+      </w:r>
+      <w:r>
+        <w:rPr>
+          <w:rFonts w:cs="Times New Roman"/>
+        </w:rPr>
+        <w:t>n</w:t>
+      </w:r>
+      <w:r>
+        <w:rPr>
+          <w:rFonts w:cs="Times New Roman"/>
+        </w:rPr>
+        <w:t xml:space="preserve"> la memoria donde se almacenan los datos. En ocasiones, pueden incluir una red de adaptación, ubicada entre la antena y el chip, para lograr una adaptación de impedancia precisa. El lector consta de una antena, un módulo electrónico de radiofrecuencia, responsable de la comunicación con la etiqueta, y un módulo de control electrónico, responsable de la comunicación con el ordenador central, generalmente conectado al lector para procesar la información entrante de forma centralizada. Los primeros intentos de introducir la tecnología de identificación por radiofrecuencia en las bibliotecas comenzaron a mediados de la década de 1990. La empresa pionera en este aspecto fue 3M (EE. UU.), que desde finales de la década de 1990 comenzó a producir e instalar sistemas de radiofrecuencia en bibliotecas </w:t>
+      </w:r>
+      <w:r>
+        <w:rPr>
+          <w:rFonts w:cs="Times New Roman"/>
+        </w:rPr>
+        <w:fldChar w:fldCharType="begin" w:fldLock="1"/>
+      </w:r>
+      <w:r>
+        <w:rPr>
+          <w:rFonts w:cs="Times New Roman"/>
+        </w:rPr>
+        <w:instrText>ADDIN CSL_CITATION {"citationItems":[{"id":"ITEM-1","itemData":{"author":[{"dropping-particle":"","family":"Usman Arfan","given":"","non-dropping-particle":"","parse-names":false,"suffix":""}],"id":"ITEM-1","issued":{"date-parts":[["2024"]]},"page":"698-712","title":"Page_698","type":"article-journal"},"uris":["http://www.mendeley.com/documents/?uuid=772d7620-bfa8-4db9-9cce-0198c67e1a4f","http://www.mendeley.com/documents/?uuid=ba468603-f076-433e-a5d7-9ba64f2a9fa9"]}],"mendeley":{"formattedCitation":"(Usman Arfan, 2024)","plainTextFormattedCitation":"(Usman Arfan, 2024)","previouslyFormattedCitation":"(Usman Arfan, 2024)"},"properties":{"noteIndex":0},"schema":"https://github.com/citation-style-language/schema/raw/master/csl-citation.json"}</w:instrText>
+      </w:r>
+      <w:r>
+        <w:rPr>
+          <w:rFonts w:cs="Times New Roman"/>
+        </w:rPr>
+        <w:fldChar w:fldCharType="separate"/>
+      </w:r>
+      <w:r>
+        <w:rPr>
+          <w:rFonts w:cs="Times New Roman"/>
+          <w:noProof/>
+        </w:rPr>
+        <w:t>(Usman Arfan, 2024)</w:t>
+      </w:r>
+      <w:r>
+        <w:rPr>
+          <w:rFonts w:cs="Times New Roman"/>
+        </w:rPr>
+        <w:fldChar w:fldCharType="end"/>
+      </w:r>
+      <w:r>
+        <w:rPr>
+          <w:rFonts w:cs="Times New Roman"/>
+        </w:rPr>
+        <w:t>,</w:t>
+      </w:r>
+      <w:r>
+        <w:rPr>
+          <w:rFonts w:cs="Times New Roman"/>
+        </w:rPr>
+        <w:t xml:space="preserve"> adicionalmente, la teoría del </w:t>
+      </w:r>
+      <w:r>
+        <w:rPr>
+          <w:rFonts w:cs="Times New Roman"/>
+          <w:i/>
+          <w:iCs/>
+        </w:rPr>
+        <w:t>reverse product cycle</w:t>
+      </w:r>
+      <w:r>
+        <w:rPr>
+          <w:rFonts w:cs="Times New Roman"/>
+        </w:rPr>
+        <w:t xml:space="preserve"> muestra cómo las bibliotecas han pasado de innovaciones centradas en procesos a innovaciones en productos y servicios, sobreviviendo a la amenaza de la digitalización mediante la reinvención constante </w:t>
+      </w:r>
+      <w:r>
+        <w:rPr>
+          <w:rFonts w:cs="Times New Roman"/>
+        </w:rPr>
+        <w:fldChar w:fldCharType="begin" w:fldLock="1"/>
+      </w:r>
+      <w:r>
+        <w:rPr>
+          <w:rFonts w:cs="Times New Roman"/>
+        </w:rPr>
+        <w:instrText>ADDIN CSL_CITATION {"citationItems":[{"id":"ITEM-1","itemData":{"DOI":"10.1016/j.respol.2025.105297","ISSN":"00487333","abstract":"Focusing on innovation dynamics in public libraries, this article begins by revisiting one of the very first attempts to construct a theory of innovation in services: the reverse product cycle (RPC), published in Research Policy (Barras, 1986, 1990). With reference to ICT-based innovation trajectories in libraries, the article validates the RPC by identifying a cycle that begins with a stage dominated by process innovations, followed by one dominated by product innovations. It goes further by extending – and in some respects updating – the model, taking into account forgotten technologies and introducing new waves of enabling technologies associated with Industry 4.0 and 5.0. The rise of the internet and digitization posed an existential threat to libraries. Their survival, however, is due to their ability to reinvent themselves – transforming this threat into an opportunity, and embracing innovative trajectories that aren't solely ICT-based. These include book-, object-, individual-, and space-based trajectories.","author":[{"dropping-particle":"","family":"Desmarchelier","given":"Benoît","non-dropping-particle":"","parse-names":false,"suffix":""},{"dropping-particle":"","family":"Djellal","given":"Faridah","non-dropping-particle":"","parse-names":false,"suffix":""},{"dropping-particle":"","family":"Gallouj","given":"Faïz","non-dropping-particle":"","parse-names":false,"suffix":""},{"dropping-particle":"","family":"Gallouj","given":"Nassim","non-dropping-particle":"","parse-names":false,"suffix":""}],"container-title":"Research Policy","id":"ITEM-1","issue":"8","issued":{"date-parts":[["2025"]]},"page":"105297","publisher":"Elsevier B.V.","title":"Beyond the reverse product cycle: An exploration of the digital, social and spatial transformation of libraries","type":"article-journal","volume":"54"},"uris":["http://www.mendeley.com/documents/?uuid=cbb10858-afaf-44d2-98a4-942d01201743","http://www.mendeley.com/documents/?uuid=3012e72a-1744-438a-b42f-97302c490a70"]}],"mendeley":{"formattedCitation":"(Desmarchelier et al., 2025)","plainTextFormattedCitation":"(Desmarchelier et al., 2025)","previouslyFormattedCitation":"(Desmarchelier et al., 2025)"},"properties":{"noteIndex":0},"schema":"https://github.com/citation-style-language/schema/raw/master/csl-citation.json"}</w:instrText>
+      </w:r>
+      <w:r>
+        <w:rPr>
+          <w:rFonts w:cs="Times New Roman"/>
+        </w:rPr>
+        <w:fldChar w:fldCharType="separate"/>
+      </w:r>
+      <w:r>
+        <w:rPr>
+          <w:rFonts w:cs="Times New Roman"/>
+          <w:noProof/>
+        </w:rPr>
+        <w:t>(Desmarchelier et al., 2025)</w:t>
+      </w:r>
+      <w:r>
+        <w:rPr>
+          <w:rFonts w:cs="Times New Roman"/>
+        </w:rPr>
+        <w:fldChar w:fldCharType="end"/>
+      </w:r>
+      <w:r>
+        <w:rPr>
+          <w:rFonts w:cs="Times New Roman"/>
+        </w:rPr>
+        <w:t>.</w:t>
+      </w:r>
+    </w:p>
+    <w:p>
+      <w:pPr>
+        <w:ind w:firstLine="708"/>
+        <w:rPr>
+          <w:rFonts w:cs="Times New Roman"/>
+        </w:rPr>
+      </w:pPr>
+      <w:r>
+        <w:rPr>
+          <w:rFonts w:cs="Times New Roman"/>
+        </w:rPr>
+        <w:t>En primer lugar, encontramos lo que ser</w:t>
+      </w:r>
+      <w:r>
+        <w:rPr>
+          <w:rFonts w:cs="Times New Roman"/>
+        </w:rPr>
+        <w:t>í</w:t>
+      </w:r>
+      <w:r>
+        <w:rPr>
+          <w:rFonts w:cs="Times New Roman"/>
+        </w:rPr>
+        <w:t xml:space="preserve">a las problemáticas o desafíos que presentan las bibliotecas, y todo esto se logra identificar con estudios o investigaciones realizadas, como por ejemplo </w:t>
+      </w:r>
+      <w:r>
+        <w:rPr>
+          <w:rFonts w:cs="Times New Roman"/>
+        </w:rPr>
+        <w:fldChar w:fldCharType="begin" w:fldLock="1"/>
+      </w:r>
+      <w:r>
+        <w:rPr>
+          <w:rFonts w:cs="Times New Roman"/>
+        </w:rPr>
+        <w:instrText>ADDIN CSL_CITATION {"citationItems":[{"id":"ITEM-1","itemData":{"DOI":"10.23974/ijol.2025.vol10.1.438","abstract":"The study surveyed the challenges facing Mzumbe University Library in using ESSs with three specific objectives: to analyze the types of ESSs used at MU, evaluate the effectiveness of ESSs, and identify challenges facing MU Library in using ESSs. The study adopted qualitative and quantitative data collection approaches, and the questionnaire guide was disseminated to 41 library staff members. Purposive sampling techniques were used to select respondents. Data were analyzed using Statistical Package for the Social Sciences (SPSS) 22 program version 20 and Microsoft Excel. The result of the study shows that there are three types of ESSs used at MU library: Theft detection, smoke detection, and closed-circuit television (CCTV) cameras. Also, the study identifies the challenges facing Mzumbe University Library in operating ESS which, are personal, technical, management, and financial factors. The study recommended that the university management should consider the allocation of enough funds for the system maintenance, repair, and facilitating training programs for library staff concerning ESSs. In addition, the study also recommended the enforcement of policies showing a clear penalty for anyone found guilty of theft or damage of any library material even if he/she is a library staff.\r  ","author":[{"dropping-particle":"","family":"Lucas","given":"Makuti","non-dropping-particle":"","parse-names":false,"suffix":""},{"dropping-particle":"","family":"Ibrahim","given":"Zuhura","non-dropping-particle":"","parse-names":false,"suffix":""}],"container-title":"International Journal of Librarianship","id":"ITEM-1","issue":"1","issued":{"date-parts":[["2025"]]},"page":"13-35","title":"Investigating Ineffectiveness of Electronic Security Systems in Safeguarding Library Materials at Mzumbe University Library","type":"article-journal","volume":"10"},"uris":["http://www.mendeley.com/documents/?uuid=e6641c36-93ab-4030-a4eb-8cc2f4840967","http://www.mendeley.com/documents/?uuid=09a5f5d0-93a7-46b3-ba5b-a4bf921e4e51"]}],"mendeley":{"formattedCitation":"(Lucas &amp; Ibrahim, 2025)","plainTextFormattedCitation":"(Lucas &amp; Ibrahim, 2025)","previouslyFormattedCitation":"(Lucas &amp; Ibrahim, 2025)"},"properties":{"noteIndex":0},"schema":"https://github.com/citation-style-language/schema/raw/master/csl-citation.json"}</w:instrText>
+      </w:r>
+      <w:r>
+        <w:rPr>
+          <w:rFonts w:cs="Times New Roman"/>
+        </w:rPr>
+        <w:fldChar w:fldCharType="separate"/>
+      </w:r>
+      <w:r>
+        <w:rPr>
+          <w:rFonts w:cs="Times New Roman"/>
+          <w:noProof/>
+        </w:rPr>
+        <w:t>(Lucas &amp; Ibrahim, 2025)</w:t>
+      </w:r>
+      <w:r>
+        <w:rPr>
+          <w:rFonts w:cs="Times New Roman"/>
+        </w:rPr>
+        <w:fldChar w:fldCharType="end"/>
+      </w:r>
+      <w:r>
+        <w:rPr>
+          <w:rFonts w:cs="Times New Roman"/>
+        </w:rPr>
+        <w:t>,</w:t>
+      </w:r>
+      <w:r>
+        <w:rPr>
+          <w:rFonts w:cs="Times New Roman"/>
+        </w:rPr>
+        <w:t xml:space="preserve"> </w:t>
+      </w:r>
+      <w:r>
+        <w:t>e</w:t>
+      </w:r>
+      <w:r>
+        <w:t xml:space="preserve">ncontraron que, a) </w:t>
+      </w:r>
+      <w:r>
+        <w:t>los sistemas de control de acceso, RFID, grabación electrónica y sistemas de seguridad de red/servidor, no se utilizan.</w:t>
+      </w:r>
+      <w:r>
+        <w:t xml:space="preserve"> b) </w:t>
+      </w:r>
+      <w:r>
+        <w:t>L</w:t>
+      </w:r>
+      <w:r>
+        <w:t>a Biblioteca de la Universidad de Michigan (MU) ha adoptado únicamente tres tipos principales de ESS: máquinas de detección de robos (68%), detectores de humo (20%) y cámaras de CCTV (12%).</w:t>
+      </w:r>
+      <w:r>
+        <w:rPr>
+          <w:rFonts w:cs="Times New Roman"/>
+        </w:rPr>
+        <w:t xml:space="preserve"> </w:t>
+      </w:r>
+      <w:r>
+        <w:rPr>
+          <w:rFonts w:cs="Times New Roman"/>
+        </w:rPr>
+        <w:t>Por otro lado</w:t>
+      </w:r>
+      <w:r>
+        <w:rPr>
+          <w:rFonts w:cs="Times New Roman"/>
+        </w:rPr>
+        <w:t xml:space="preserve">, </w:t>
+      </w:r>
+      <w:r>
+        <w:rPr>
+          <w:rFonts w:cs="Times New Roman"/>
+        </w:rPr>
+        <w:t xml:space="preserve">en la investigación se </w:t>
+      </w:r>
+      <w:r>
+        <w:rPr>
+          <w:rFonts w:cs="Times New Roman"/>
+        </w:rPr>
+        <w:t>incluy</w:t>
+      </w:r>
+      <w:r>
+        <w:rPr>
+          <w:rFonts w:cs="Times New Roman"/>
+        </w:rPr>
+        <w:t>ó</w:t>
+      </w:r>
+      <w:r>
+        <w:rPr>
+          <w:rFonts w:cs="Times New Roman"/>
+        </w:rPr>
+        <w:t xml:space="preserve"> los tipos de sistemas de seguridad electrónica usados en esta universidad, también evaluar su efectividad e identificar los desafíos que esta presenta, de igual manera desafíos complementarios como los son los tecnológicos, de personal, financieros y organizativos, sin embargo; distintos estudios confirman que la implementación de sistemas de seguridad y gestión basados en RFID fortalece la protección de colecciones, agiliza préstamos y devoluciones y mejora la experiencia de los </w:t>
+      </w:r>
+      <w:commentRangeStart w:id="19"/>
+      <w:r>
+        <w:rPr>
+          <w:rFonts w:cs="Times New Roman"/>
+        </w:rPr>
+        <w:t>usuarios</w:t>
+      </w:r>
+      <w:commentRangeEnd w:id="19"/>
       <w:r>
         <w:rPr>
           <w:rStyle w:val="Refdecomentario"/>
@@ -3267,37 +3625,152 @@
           <w:sz w:val="24"/>
           <w:szCs w:val="22"/>
         </w:rPr>
+        <w:commentReference w:id="19"/>
+      </w:r>
+      <w:r>
+        <w:rPr>
+          <w:rFonts w:cs="Times New Roman"/>
+        </w:rPr>
+        <w:t xml:space="preserve"> </w:t>
+      </w:r>
+      <w:r>
+        <w:rPr>
+          <w:rFonts w:cs="Times New Roman"/>
+          <w:highlight w:val="red"/>
+        </w:rPr>
+        <w:fldChar w:fldCharType="begin" w:fldLock="1"/>
+      </w:r>
+      <w:r>
+        <w:rPr>
+          <w:rFonts w:cs="Times New Roman"/>
+          <w:highlight w:val="red"/>
+        </w:rPr>
+        <w:instrText>ADDIN CSL_CITATION {"citationItems":[{"id":"ITEM-1","itemData":{"abstract":"For many years, libraries were operated manually which made the job of the Librarian tedious and slow. However, in recent years, modern life has increased the demand for reliable communication systems and internet technologies. Activity such as e-learning has forced the global educational institution to adopt an automated library, the Radio Frequency Identification (RFID) system was introduced and also, the need for tracking and identification of library resources. In this paper, an RFID-based detection system was used. It involves the use of radio frequency and microchip technology, alongside other components to identify books leaving the library efficiently. The RFID tag used is the passive read/write tag in the 13.56 MHz unlicensed Radio Frequency band, due to its affordability and ease of implementation. This paper seeks to enlighten library users, such as administrators about the importance of RFID technology in the improvement of library management. The proposed system consists of the antitheft security gate, used to detect, if a library book has been properly checked out and a database (middleware) to know which book or material was taken or is about to leave. The result showed that within the acceptable range of 40 mm, the RFID reader works efficiently in theft detection. This range can extend for large-scale deployment.","author":[{"dropping-particle":"","family":"Adeniran","given":"Temitayo Caroline","non-dropping-particle":"","parse-names":false,"suffix":""},{"dropping-particle":"","family":"Zubairu","given":"Joy Hadiza","non-dropping-particle":"","parse-names":false,"suffix":""},{"dropping-particle":"","family":"Onidare","given":"Samuel Olusayo","non-dropping-particle":"","parse-names":false,"suffix":""}],"container-title":"International Journal of Information Processing and Communication (IJIPC)","id":"ITEM-1","issue":"2","issued":{"date-parts":[["2018"]]},"page":"334-346","title":"Design and Implementation of a Secured Automated Library Using RFID","type":"article-journal","volume":"6"},"uris":["http://www.mendeley.com/documents/?uuid=230efa4d-f119-4c13-bdb2-efd2b1d693e6","http://www.mendeley.com/documents/?uuid=152b819f-32a4-468e-9f11-39ef2a4ff935"]}],"mendeley":{"formattedCitation":"(Adeniran et al., 2018)","plainTextFormattedCitation":"(Adeniran et al., 2018)","previouslyFormattedCitation":"(Adeniran et al., 2018)"},"properties":{"noteIndex":0},"schema":"https://github.com/citation-style-language/schema/raw/master/csl-citation.json"}</w:instrText>
+      </w:r>
+      <w:r>
+        <w:rPr>
+          <w:rFonts w:cs="Times New Roman"/>
+          <w:highlight w:val="red"/>
+        </w:rPr>
+        <w:fldChar w:fldCharType="separate"/>
+      </w:r>
+      <w:r>
+        <w:rPr>
+          <w:rFonts w:cs="Times New Roman"/>
+          <w:noProof/>
+          <w:highlight w:val="red"/>
+        </w:rPr>
+        <w:t>(Adeniran et al., 2018)</w:t>
+      </w:r>
+      <w:r>
+        <w:rPr>
+          <w:rFonts w:cs="Times New Roman"/>
+          <w:highlight w:val="red"/>
+        </w:rPr>
+        <w:fldChar w:fldCharType="end"/>
+      </w:r>
+      <w:r>
+        <w:rPr>
+          <w:rFonts w:cs="Times New Roman"/>
+          <w:highlight w:val="red"/>
+        </w:rPr>
+        <w:t>.</w:t>
+      </w:r>
+      <w:r>
+        <w:rPr>
+          <w:rFonts w:cs="Times New Roman"/>
+        </w:rPr>
+        <w:t xml:space="preserve">  </w:t>
+      </w:r>
+    </w:p>
+    <w:p>
+      <w:pPr>
+        <w:ind w:firstLine="708"/>
+        <w:rPr>
+          <w:rFonts w:cs="Times New Roman"/>
+        </w:rPr>
+      </w:pPr>
+      <w:r>
+        <w:rPr>
+          <w:rFonts w:cs="Times New Roman"/>
+        </w:rPr>
+        <w:t xml:space="preserve">En HF (13.56 MHz) y UHF (860–960 MHz), el desempeño depende en gran medida de la distancia entre el sensor y la etiqueta, del tipo y grosor de la barrera que los separa, así como de la </w:t>
+      </w:r>
+      <w:r>
+        <w:rPr>
+          <w:rFonts w:cs="Times New Roman"/>
+        </w:rPr>
+        <w:lastRenderedPageBreak/>
+        <w:t>presencia de objetos sólidos que interfieren con la señal (</w:t>
+      </w:r>
+      <w:r>
+        <w:rPr>
+          <w:rFonts w:cs="Times New Roman"/>
+        </w:rPr>
+        <w:t>Informatika et al., 2023).</w:t>
+      </w:r>
+      <w:r>
+        <w:rPr>
+          <w:rFonts w:cs="Times New Roman"/>
+        </w:rPr>
+        <w:t xml:space="preserve"> Investigaciones recientes destacan que la frecuencia de operación, el acoplamiento entre antenas y las condiciones del entorno siguen siendo factores críticos para el </w:t>
+      </w:r>
+      <w:r>
+        <w:rPr>
+          <w:rFonts w:cs="Times New Roman"/>
+        </w:rPr>
+        <w:t>rendimiento (Khair et al., 2022),</w:t>
+      </w:r>
+      <w:r>
+        <w:rPr>
+          <w:rFonts w:cs="Times New Roman"/>
+        </w:rPr>
+        <w:t xml:space="preserve"> lo que reafirma observaciones previas realizadas en Japón sobre la sensibilidad del sistema ante estas variables </w:t>
+      </w:r>
+      <w:r>
+        <w:rPr>
+          <w:rFonts w:cs="Times New Roman"/>
+          <w:highlight w:val="red"/>
+        </w:rPr>
+        <w:t>(</w:t>
+      </w:r>
+      <w:commentRangeStart w:id="20"/>
+      <w:r>
+        <w:rPr>
+          <w:rFonts w:cs="Times New Roman"/>
+          <w:highlight w:val="red"/>
+        </w:rPr>
+        <w:t>Fujisaki, 2015).</w:t>
+      </w:r>
+      <w:commentRangeEnd w:id="20"/>
+      <w:r>
+        <w:rPr>
+          <w:rStyle w:val="Refdecomentario"/>
+          <w:rFonts w:cs="Times New Roman"/>
+          <w:sz w:val="24"/>
+          <w:szCs w:val="22"/>
+        </w:rPr>
         <w:commentReference w:id="20"/>
       </w:r>
-      <w:r>
-        <w:rPr>
-          <w:rFonts w:cs="Times New Roman"/>
-        </w:rPr>
-        <w:t xml:space="preserve"> que, por lo general, en las bi</w:t>
-      </w:r>
-      <w:r>
-        <w:rPr>
-          <w:rFonts w:cs="Times New Roman"/>
-        </w:rPr>
-        <w:t>bliotecas suele usarse HF (13,56 MHz, ISO 15693/18000-3) por su buen acoplamiento cercano y menor apantallamiento por papel; para patios/logística domina UHF (ISO 18000-63 / EPC Gen2) por mayor alcance</w:t>
-      </w:r>
-      <w:r>
-        <w:rPr>
-          <w:rFonts w:cs="Times New Roman"/>
-        </w:rPr>
-        <w:t xml:space="preserve"> </w:t>
-      </w:r>
-      <w:r>
-        <w:rPr>
-          <w:rFonts w:cs="Times New Roman"/>
-        </w:rPr>
-        <w:t xml:space="preserve">y, además, Estas </w:t>
-      </w:r>
-      <w:r>
-        <w:rPr>
-          <w:rFonts w:cs="Times New Roman"/>
-        </w:rPr>
-        <w:t xml:space="preserve">contiene la memoria donde se almacenan los datos. En ocasiones, pueden incluir una red de adaptación, ubicada entre la antena y el chip, para lograr una adaptación de impedancia precisa. El lector consta de una antena, un módulo electrónico de radiofrecuencia, responsable de la comunicación con la etiqueta, y un módulo de control electrónico, responsable de la comunicación con el ordenador central, generalmente conectado al lector para procesar la información entrante de forma centralizada. Los primeros intentos de introducir la tecnología de identificación por radiofrecuencia en las bibliotecas comenzaron a mediados de la década de 1990. La empresa pionera en este aspecto fue 3M (EE. UU.), que desde finales de la década de 1990 comenzó a producir e instalar sistemas de radiofrecuencia en bibliotecas </w:t>
+    </w:p>
+    <w:p>
+      <w:pPr>
+        <w:ind w:firstLine="708"/>
+        <w:rPr>
+          <w:rFonts w:cs="Times New Roman"/>
+        </w:rPr>
+      </w:pPr>
+      <w:r>
+        <w:rPr>
+          <w:rFonts w:cs="Times New Roman"/>
+        </w:rPr>
+        <w:t>Por lo tanto, para dar solución o dar avances hacia esta se proponen o implementan sistemas con tecnología RFID o NFC, como por ejemplo</w:t>
+      </w:r>
+      <w:r>
+        <w:rPr>
+          <w:rFonts w:cs="Times New Roman"/>
+        </w:rPr>
+        <w:t xml:space="preserve">, </w:t>
       </w:r>
       <w:r>
         <w:rPr>
@@ -3309,7 +3782,7 @@
         <w:rPr>
           <w:rFonts w:cs="Times New Roman"/>
         </w:rPr>
-        <w:instrText>ADDIN CSL_CITATION {"citationItems":[{"id":"ITEM-1","itemData":{"author":[{"dropping-particle":"","family":"Usman Arfan","given":"","non-dropping-particle":"","parse-names":false,"suffix":""}],"id":"ITEM-1","issued":{"date-parts":[["2024"]]},"page":"698-712","title":"Page_698","type":"article-journal"},"uris":["http://www.mendeley.com/documents/?uuid=772d7620-bfa8-4db9-9cce-0198c67e1a4f","http://www.mendeley.com/documents/?uuid=ba468603-f076-433e-a5d7-9ba64f2a9fa9"]}],"mendeley":{"formattedCitation":"(Usman Arfan, 2024)","plainTextFormattedCitation":"(Usman Arfan, 2024)","previouslyFormattedCitation":"(Usman Arfan, 2024)"},"properties":{"noteIndex":0},"schema":"https://github.com/citation-style-language/schema/raw/master/csl-citation.json"}</w:instrText>
+        <w:instrText>ADDIN CSL_CITATION {"citationItems":[{"id":"ITEM-1","itemData":{"DOI":"10.24191/JMECHE.V12I1.24642","ISSN":"2550164X","abstract":"Libraries are crucial for diverse resources, particularly for students and educators. The Library Management System (LMS) in Perpustakaan Raja Tun Uda (PRTU) still used barcode technology, which was inadequate and could increase the workload of the librarians. This study presented the development and evaluation of the Smart Portable Library Management System (SPLMS) using RFID technology. The study addressed the gap in the literature by focusing on the impact of angle adjustment on the performance of UHF RFID readers in reading RFID tags placed on book spines. The study was conducted by implementing the SPLMS and performing system testing at different angles. The scope of the study encompassed the design and implementation of the SPLMS, system testing with varying angles, and evaluation of the reader's success rate in reading RFID tags. The validation of ZK-RFID101 of the results have shown that the reader has a 100% success rate for distances between 1 and 3 meters, but the success rate drops to 80% at 5 and 6 meters due to radio frequency interference. The main findings indicated that increasing the angle from 0 to 90-degrees improved the reader's performance, although certain tags still presented challenges. The results from the five conducted trials strongly indicated that a 90-degree angle was the optimum performance. The study concluded that the angle and placement of RFID readers was crucial for optimal performance in library management systems. The SPLMS provided librarians with a user-friendly dashboard for efficient book collection management, boosting productivity and enhancing user experience.","author":[{"dropping-particle":"","family":"Suhaimi","given":"Maizatul Mazni","non-dropping-particle":"","parse-names":false,"suffix":""},{"dropping-particle":"","family":"Mohamed","given":"Zulkifli","non-dropping-particle":"","parse-names":false,"suffix":""},{"dropping-particle":"","family":"Khusaini","given":"Nurul Syuhadah","non-dropping-particle":"","parse-names":false,"suffix":""}],"container-title":"Journal of Mechanical Engineering","id":"ITEM-1","issued":{"date-parts":[["2023"]]},"page":"133-152","title":"Effectiveness of RFID Smart Library Management System","type":"article-journal","volume":"SI12"},"uris":["http://www.mendeley.com/documents/?uuid=1f3d0b09-f64a-4719-b3e7-9c91755768d8"]}],"mendeley":{"formattedCitation":"(Suhaimi et al., 2023)","plainTextFormattedCitation":"(Suhaimi et al., 2023)","previouslyFormattedCitation":"(Suhaimi et al., 2023)"},"properties":{"noteIndex":0},"schema":"https://github.com/citation-style-language/schema/raw/master/csl-citation.json"}</w:instrText>
       </w:r>
       <w:r>
         <w:rPr>
@@ -3322,7 +3795,7 @@
           <w:rFonts w:cs="Times New Roman"/>
           <w:noProof/>
         </w:rPr>
-        <w:t>(Usman Arfan, 2024)</w:t>
+        <w:t>(Suhaimi et al., 2023)</w:t>
       </w:r>
       <w:r>
         <w:rPr>
@@ -3334,21 +3807,7 @@
         <w:rPr>
           <w:rFonts w:cs="Times New Roman"/>
         </w:rPr>
-        <w:t xml:space="preserve">, adicionalmente, la teoría del </w:t>
-      </w:r>
-      <w:r>
-        <w:rPr>
-          <w:rFonts w:cs="Times New Roman"/>
-          <w:i/>
-          <w:iCs/>
-        </w:rPr>
-        <w:t>reverse product cycle</w:t>
-      </w:r>
-      <w:r>
-        <w:rPr>
-          <w:rFonts w:cs="Times New Roman"/>
-        </w:rPr>
-        <w:t xml:space="preserve"> muestra cómo las bibliotecas han pasado de innovaciones centradas en procesos a innovaciones en productos y servicios, sobreviviendo a la amenaza de la digitalización mediante la reinvención constante </w:t>
+        <w:t xml:space="preserve"> los cuales implementaron un sistema de gestión de bibliotecas portátil inteligente el cual tiene como función leer las etiquetas RFID de los libros y así analizar los diferentes alcances y ángulos para la lecturas de las etiquetas, realizaron el estudio y pudieron definir ciertos alcances, dando como resultado una efectividad del 100% de las lecturas en los primeros 3 metros, y que al aumentar el ángulo de 0 a 90 grados mejoraba la efectividad, Asimismo, </w:t>
       </w:r>
       <w:r>
         <w:rPr>
@@ -3360,7 +3819,7 @@
         <w:rPr>
           <w:rFonts w:cs="Times New Roman"/>
         </w:rPr>
-        <w:instrText>ADDIN CSL_CITATION {"citationItems":[{"id":"ITEM-1","itemData":{"DOI":"10.1016/j.respol.2025.105297","ISSN":"00487333","abstract":"Focusing on innovation dynamics in public libraries, this article begins by revisiting one of the very first attempts to construct a theory of innovation in services: the reverse product cycle (RPC), published in Research Policy (Barras, 1986, 1990). With reference to ICT-based innovation trajectories in libraries, the article validates the RPC by identifying a cycle that begins with a stage dominated by process innovations, followed by one dominated by product innovations. It goes further by extending – and in some respects updating – the model, taking into account forgotten technologies and introducing new waves of enabling technologies associated with Industry 4.0 and 5.0. The rise of the internet and digitization posed an existential threat to libraries. Their survival, however, is due to their ability to reinvent themselves – transforming this threat into an opportunity, and embracing innovative trajectories that aren't solely ICT-based. These include book-, object-, individual-, and space-based trajectories.","author":[{"dropping-particle":"","family":"Desmarchelier","given":"Benoît","non-dropping-particle":"","parse-names":false,"suffix":""},{"dropping-particle":"","family":"Djellal","given":"Faridah","non-dropping-particle":"","parse-names":false,"suffix":""},{"dropping-particle":"","family":"Gallouj","given":"Faïz","non-dropping-particle":"","parse-names":false,"suffix":""},{"dropping-particle":"","family":"Gallouj","given":"Nassim","non-dropping-particle":"","parse-names":false,"suffix":""}],"container-title":"Research Policy","id":"ITEM-1","issue":"8","issued":{"date-parts":[["2025"]]},"page":"105297","publisher":"Elsevier B.V.","title":"Beyond the reverse product cycle: An exploration of the digital, social and spatial transformation of libraries","type":"article-journal","volume":"54"},"uris":["http://www.mendeley.com/documents/?uuid=cbb10858-afaf-44d2-98a4-942d01201743","http://www.mendeley.com/documents/?uuid=3012e72a-1744-438a-b42f-97302c490a70"]}],"mendeley":{"formattedCitation":"(Desmarchelier et al., 2025)","plainTextFormattedCitation":"(Desmarchelier et al., 2025)","previouslyFormattedCitation":"(Desmarchelier et al., 2025)"},"properties":{"noteIndex":0},"schema":"https://github.com/citation-style-language/schema/raw/master/csl-citation.json"}</w:instrText>
+        <w:instrText>ADDIN CSL_CITATION {"citationItems":[{"id":"ITEM-1","itemData":{"DOI":"10.30574/gjeta.2022.12.1.0115","abstract":"Rapid technological developments provide benefits for library management. One of them is the application of automatic identifiers in library management, through RFID and QR Code implementation. Some problems that are faced by libraries at the moment, include the lack of guarantees for the safety management of books in the library, lack of services human resources library management, and book availability information has not been accurate. This research conducts the development of a library management information system to solve the problems by using automatic identifiers utilizing Near Field Communication and QR Code technology. The implementation scenario is each library member has the NFC Card and their personal information stored in the NFC card, also each book in the library is put with a QR Code label containing book code information. Transaction of book loan and book return are done by initially tapping NFC Card to record visitor returned or borrow the book and then continue to scanning QR Code label of each book borrowed or returned. In the final stage, the application tested by tapping the NFC card (RFID) on the reader/writer device, and it found the NFC Card could be read or record data from the device at a maximum of 7 cm, while testing phase conducted QR Code label could be read at a maximum distance of 40 centimeters from the device. Implementing automatic identifier help to manage transaction in library more accurate, improve services and provide added value for the library.","author":[{"dropping-particle":"","family":"Putra","given":"I Gede Sujana Eka","non-dropping-particle":"","parse-names":false,"suffix":""},{"dropping-particle":"","family":"Labasariyani","given":"Ni Luh Putu","non-dropping-particle":"","parse-names":false,"suffix":""}],"container-title":"Global Journal of Engineering and Technology Advances","id":"ITEM-1","issue":"1","issued":{"date-parts":[["2022"]]},"page":"110-119","title":"Automation identifier approach for library management information system","type":"article-journal","volume":"12"},"uris":["http://www.mendeley.com/documents/?uuid=366c8983-4b63-4292-9ec1-dac983f83a70","http://www.mendeley.com/documents/?uuid=3f9f5e02-5adf-4e88-b125-21bfa68bb835"]}],"mendeley":{"formattedCitation":"(Putra &amp; Labasariyani, 2022)","plainTextFormattedCitation":"(Putra &amp; Labasariyani, 2022)","previouslyFormattedCitation":"(Putra &amp; Labasariyani, 2022)"},"properties":{"noteIndex":0},"schema":"https://github.com/citation-style-language/schema/raw/master/csl-citation.json"}</w:instrText>
       </w:r>
       <w:r>
         <w:rPr>
@@ -3373,7 +3832,7 @@
           <w:rFonts w:cs="Times New Roman"/>
           <w:noProof/>
         </w:rPr>
-        <w:t>(Desmarchelier et al., 2025)</w:t>
+        <w:t>(Putra &amp; Labasariyani, 2022)</w:t>
       </w:r>
       <w:r>
         <w:rPr>
@@ -3381,6 +3840,49 @@
         </w:rPr>
         <w:fldChar w:fldCharType="end"/>
       </w:r>
+      <w:r>
+        <w:rPr>
+          <w:rFonts w:cs="Times New Roman"/>
+        </w:rPr>
+        <w:t xml:space="preserve">, realizaron las etapas de desarrollo del sistema de gestión de bibliotecas consisten en la observación directa, el estudio bibliográfico y la recopilación de datos, el diseño del sistema y el análisis de hardware, el diseño de la base de datos y la interfaz de usuario, el desarrollo del sistema y las pruebas del sistema. En su investigación observaron que las tarjetas RFID puede leerse y escribirse a una distancia máxima de hasta 7 cm del dispositivo. De la misma forma, </w:t>
+      </w:r>
+      <w:r>
+        <w:rPr>
+          <w:rFonts w:cs="Times New Roman"/>
+        </w:rPr>
+        <w:fldChar w:fldCharType="begin" w:fldLock="1"/>
+      </w:r>
+      <w:r>
+        <w:rPr>
+          <w:rFonts w:cs="Times New Roman"/>
+        </w:rPr>
+        <w:instrText>ADDIN CSL_CITATION {"citationItems":[{"id":"ITEM-1","itemData":{"DOI":"10.37934/araset.33.1.163174","ISSN":"24621943","abstract":"Radio Frequency Identification (RFID) refers to a wireless system comprising two components: tags and readers. The reader is a device with one or more antennas that emit radio waves and receive signals from the RFID tag. This system is available on most systems applications especially involving security systems, including house/office access systems, toll systems, and library systems. The accessing data is made stand-alone or data-based through the existing conventional RFID system on the market, especially in library systems. Also, the tag provided is only limited to the same type, either cards or stickers. From that, it will produce problems in monitoring the status of books, especially for loans or returns. At the same time, the difference in detection sensitivity will be the effect of the detection range for the types of tag used. Through this research, the development of adaptive RFID on IoT platforms with different types of passive tag library systems highly emphasized monitoring the status of books besides maximum range detection by using different types of passive tag and at the same time increasing the security by implementing the book status detection on the gate of the library. The tag sticker used can be read/written in the 13.56 MHz frequency with the High Frequency (HF) band due to its affordability and ease of implementation. RFID tags are embedded in all books and activated; it triggers the alarm system if the status return gets captured on the memory of the RFID tag. The alarm accuracy is almost 100%. The result showed that within the acceptable range of 5 cm, the RFID reader works efficiently in detecting books. It shows that the card tag gives 90% sensitivity of range detection, followed by the sticker and keychain tag at 70%, and, lastly, the transparent card tags at 40%.","author":[{"dropping-particle":"","family":"Ali","given":"Kharudin","non-dropping-particle":"","parse-names":false,"suffix":""},{"dropping-particle":"","family":"Rifai","given":"Damhuji","non-dropping-particle":"","parse-names":false,"suffix":""},{"dropping-particle":"","family":"Abdullah","given":"Afizullah","non-dropping-particle":"","parse-names":false,"suffix":""},{"dropping-particle":"","family":"Zain","given":"Muhammad Luqman Muhd","non-dropping-particle":"","parse-names":false,"suffix":""},{"dropping-particle":"","family":"Joraimee","given":"Ahmad","non-dropping-particle":"","parse-names":false,"suffix":""},{"dropping-particle":"","family":"Abdallah","given":"Ahmed N.","non-dropping-particle":"","parse-names":false,"suffix":""},{"dropping-particle":"","family":"Awang","given":"Nur Amalina","non-dropping-particle":"","parse-names":false,"suffix":""},{"dropping-particle":"","family":"Tan","given":"Jian Ding","non-dropping-particle":"","parse-names":false,"suffix":""},{"dropping-particle":"","family":"Paw","given":"Johnny Koh Siaw","non-dropping-particle":"","parse-names":false,"suffix":""},{"dropping-particle":"","family":"Yaw","given":"Chong Tak","non-dropping-particle":"","parse-names":false,"suffix":""}],"container-title":"Journal of Advanced Research in Applied Sciences and Engineering Technology","id":"ITEM-1","issue":"1","issued":{"date-parts":[["2023"]]},"page":"163-174","title":"Design of Adaptive RFID RC522 on IoT Platform with Different Types Passive Tag Based on Self-Service Library Management System (SSLMS)","type":"article-journal","volume":"33"},"uris":["http://www.mendeley.com/documents/?uuid=fcf6d57f-14c6-4443-b96b-ddd2953ced9f","http://www.mendeley.com/documents/?uuid=458909a3-3316-43f3-ad3d-6d3d795bf02f"]}],"mendeley":{"formattedCitation":"(Ali et al., 2023)","plainTextFormattedCitation":"(Ali et al., 2023)","previouslyFormattedCitation":"(Ali et al., 2023)"},"properties":{"noteIndex":0},"schema":"https://github.com/citation-style-language/schema/raw/master/csl-citation.json"}</w:instrText>
+      </w:r>
+      <w:r>
+        <w:rPr>
+          <w:rFonts w:cs="Times New Roman"/>
+        </w:rPr>
+        <w:fldChar w:fldCharType="separate"/>
+      </w:r>
+      <w:r>
+        <w:rPr>
+          <w:rFonts w:cs="Times New Roman"/>
+          <w:noProof/>
+        </w:rPr>
+        <w:t>(Ali et al., 2023)</w:t>
+      </w:r>
+      <w:r>
+        <w:rPr>
+          <w:rFonts w:cs="Times New Roman"/>
+        </w:rPr>
+        <w:fldChar w:fldCharType="end"/>
+      </w:r>
+      <w:r>
+        <w:rPr>
+          <w:rFonts w:cs="Times New Roman"/>
+        </w:rPr>
+        <w:t xml:space="preserve"> han desarrollado y caracterizado con éxito el diseño de un lector RFID adaptativo RC522 en una plataforma IoT con diferentes tipos de etiquetas pasivas basadas en sistemas de gestión de bibliotecas de autoservicio e incluyendo los diferentes alcances que tiene los tipos de elementos RFID como los son las tarjetas, llaveros, stickers y tarjetas transparentes, dando como resultado que la tarjeta tiene un alcance de 4.5 cm y por otro lado el sticker 3.5 cm. </w:t>
+      </w:r>
     </w:p>
     <w:p>
       <w:pPr>
@@ -3393,313 +3895,13 @@
         <w:rPr>
           <w:rFonts w:cs="Times New Roman"/>
         </w:rPr>
-        <w:t>En primer lugar, encontramos lo que ser</w:t>
-      </w:r>
-      <w:r>
-        <w:rPr>
-          <w:rFonts w:cs="Times New Roman"/>
-        </w:rPr>
-        <w:t>í</w:t>
-      </w:r>
-      <w:r>
-        <w:rPr>
-          <w:rFonts w:cs="Times New Roman"/>
-        </w:rPr>
-        <w:t xml:space="preserve">a las problemáticas o desafíos que presentan las bibliotecas, y todo esto se logra identificar con estudios o investigaciones realizadas, como por ejemplo </w:t>
-      </w:r>
-      <w:r>
-        <w:rPr>
-          <w:rFonts w:cs="Times New Roman"/>
-        </w:rPr>
-        <w:fldChar w:fldCharType="begin" w:fldLock="1"/>
-      </w:r>
-      <w:r>
-        <w:rPr>
-          <w:rFonts w:cs="Times New Roman"/>
-        </w:rPr>
-        <w:instrText>ADDIN CSL_CITATION {"citationItems":[{"id":"ITEM-1","itemData":{"DOI":"10.23974/ijol.2025.vol10.1.438","abstract":"The study surveyed the challenges facing Mzumbe University Library in using ESSs with three specific objectives: to analyze the types of ESSs used at MU, evaluate the effectiveness of ESSs, and identify challenges facing MU Library in using ESSs. The study adopted qualitative and quantitative data collection approaches, and the questionnaire guide was disseminated to 41 library staff members. Purposive sampling techniques were used to select respondents. Data were analyzed using Statistical Package for the Social Sciences (SPSS) 22 program version 20 and Microsoft Excel. The result of the study shows that there are three types of ESSs used at MU library: Theft detection, smoke detection, and closed-circuit television (CCTV) cameras. Also, the study identifies the challenges facing Mzumbe University Library in operating ESS which, are personal, technical, management, and financial factors. The study recommended that the university management should consider the allocation of enough funds for the system maintenance, repair, and facilitating training programs for library staff concerning ESSs. In addition, the study also recommended the enforcement of policies showing a clear penalty for anyone found guilty of theft or damage of any library material even if he/she is a library staff.\r  ","author":[{"dropping-particle":"","family":"Lucas","given":"Makuti","non-dropping-particle":"","parse-names":false,"suffix":""},{"dropping-particle":"","family":"Ibrahim","given":"Zuhura","non-dropping-particle":"","parse-names":false,"suffix":""}],"container-title":"International Journal of Librarianship","id":"ITEM-1","issue":"1","issued":{"date-parts":[["2025"]]},"page":"13-35","title":"Investigating Ineffectiveness of Electronic Security Systems in Safeguarding Library Materials at Mzumbe University Library","type":"article-journal","volume":"10"},"uris":["http://www.mendeley.com/documents/?uuid=e6641c36-93ab-4030-a4eb-8cc2f4840967","http://www.mendeley.com/documents/?uuid=09a5f5d0-93a7-46b3-ba5b-a4bf921e4e51"]}],"mendeley":{"formattedCitation":"(Lucas &amp; Ibrahim, 2025)","plainTextFormattedCitation":"(Lucas &amp; Ibrahim, 2025)","previouslyFormattedCitation":"(Lucas &amp; Ibrahim, 2025)"},"properties":{"noteIndex":0},"schema":"https://github.com/citation-style-language/schema/raw/master/csl-citation.json"}</w:instrText>
-      </w:r>
-      <w:r>
-        <w:rPr>
-          <w:rFonts w:cs="Times New Roman"/>
-        </w:rPr>
-        <w:fldChar w:fldCharType="separate"/>
-      </w:r>
-      <w:r>
-        <w:rPr>
-          <w:rFonts w:cs="Times New Roman"/>
-          <w:noProof/>
-        </w:rPr>
-        <w:t>(Lucas &amp; Ibrahim, 2025)</w:t>
-      </w:r>
-      <w:r>
-        <w:rPr>
-          <w:rFonts w:cs="Times New Roman"/>
-        </w:rPr>
-        <w:fldChar w:fldCharType="end"/>
+        <w:t>De la misma forma</w:t>
       </w:r>
       <w:r>
         <w:rPr>
           <w:rFonts w:cs="Times New Roman"/>
         </w:rPr>
         <w:t xml:space="preserve">, </w:t>
-      </w:r>
-      <w:r>
-        <w:t>e</w:t>
-      </w:r>
-      <w:r>
-        <w:t xml:space="preserve">ncontraron que, a) </w:t>
-      </w:r>
-      <w:r>
-        <w:t>los sistemas de control de acceso, RFID, grabación electrónica y sistemas de seguridad de red/servidor, no se utilizan.</w:t>
-      </w:r>
-      <w:r>
-        <w:t xml:space="preserve"> b) </w:t>
-      </w:r>
-      <w:r>
-        <w:t>L</w:t>
-      </w:r>
-      <w:r>
-        <w:t>a Biblioteca de la Universidad de Michigan (MU) ha adoptado únicamente tres tipos principales de ESS: máquinas de detección de robos (68%), detectores de humo (20%) y cámaras de CCTV (12%).</w:t>
-      </w:r>
-      <w:r>
-        <w:rPr>
-          <w:rFonts w:cs="Times New Roman"/>
-        </w:rPr>
-        <w:t xml:space="preserve"> </w:t>
-      </w:r>
-      <w:r>
-        <w:rPr>
-          <w:rFonts w:cs="Times New Roman"/>
-        </w:rPr>
-        <w:t>Por otro lado</w:t>
-      </w:r>
-      <w:r>
-        <w:rPr>
-          <w:rFonts w:cs="Times New Roman"/>
-        </w:rPr>
-        <w:t xml:space="preserve">, </w:t>
-      </w:r>
-      <w:r>
-        <w:rPr>
-          <w:rFonts w:cs="Times New Roman"/>
-        </w:rPr>
-        <w:t xml:space="preserve">en la investigación se </w:t>
-      </w:r>
-      <w:r>
-        <w:rPr>
-          <w:rFonts w:cs="Times New Roman"/>
-        </w:rPr>
-        <w:t>incluy</w:t>
-      </w:r>
-      <w:r>
-        <w:rPr>
-          <w:rFonts w:cs="Times New Roman"/>
-        </w:rPr>
-        <w:t>ó</w:t>
-      </w:r>
-      <w:r>
-        <w:rPr>
-          <w:rFonts w:cs="Times New Roman"/>
-        </w:rPr>
-        <w:t xml:space="preserve"> los tipos de sistemas de seguridad electrónica usados en esta universidad, también evaluar su efectividad e identificar los desafíos que esta presenta, de igual manera desafíos complementarios como los son los tecnológicos, de personal, financieros y organizativos, sin embargo; distintos estudios confirman que la implementación de sistemas de seguridad y gestión basados en RFID fortalece la protección de colecciones, agiliza préstamos y devoluciones y mejora la experiencia de los usuarios </w:t>
-      </w:r>
-      <w:r>
-        <w:rPr>
-          <w:rFonts w:cs="Times New Roman"/>
-        </w:rPr>
-        <w:fldChar w:fldCharType="begin" w:fldLock="1"/>
-      </w:r>
-      <w:r>
-        <w:rPr>
-          <w:rFonts w:cs="Times New Roman"/>
-        </w:rPr>
-        <w:instrText>ADDIN CSL_CITATION {"citationItems":[{"id":"ITEM-1","itemData":{"abstract":"For many years, libraries were operated manually which made the job of the Librarian tedious and slow. However, in recent years, modern life has increased the demand for reliable communication systems and internet technologies. Activity such as e-learning has forced the global educational institution to adopt an automated library, the Radio Frequency Identification (RFID) system was introduced and also, the need for tracking and identification of library resources. In this paper, an RFID-based detection system was used. It involves the use of radio frequency and microchip technology, alongside other components to identify books leaving the library efficiently. The RFID tag used is the passive read/write tag in the 13.56 MHz unlicensed Radio Frequency band, due to its affordability and ease of implementation. This paper seeks to enlighten library users, such as administrators about the importance of RFID technology in the improvement of library management. The proposed system consists of the antitheft security gate, used to detect, if a library book has been properly checked out and a database (middleware) to know which book or material was taken or is about to leave. The result showed that within the acceptable range of 40 mm, the RFID reader works efficiently in theft detection. This range can extend for large-scale deployment.","author":[{"dropping-particle":"","family":"Adeniran","given":"Temitayo Caroline","non-dropping-particle":"","parse-names":false,"suffix":""},{"dropping-particle":"","family":"Zubairu","given":"Joy Hadiza","non-dropping-particle":"","parse-names":false,"suffix":""},{"dropping-particle":"","family":"Onidare","given":"Samuel Olusayo","non-dropping-particle":"","parse-names":false,"suffix":""}],"container-title":"International Journal of Information Processing and Communication (IJIPC)","id":"ITEM-1","issue":"2","issued":{"date-parts":[["2018"]]},"page":"334-346","title":"Design and Implementation of a Secured Automated Library Using RFID","type":"article-journal","volume":"6"},"uris":["http://www.mendeley.com/documents/?uuid=230efa4d-f119-4c13-bdb2-efd2b1d693e6","http://www.mendeley.com/documents/?uuid=152b819f-32a4-468e-9f11-39ef2a4ff935"]}],"mendeley":{"formattedCitation":"(Adeniran et al., 2018)","plainTextFormattedCitation":"(Adeniran et al., 2018)","previouslyFormattedCitation":"(Adeniran et al., 2018)"},"properties":{"noteIndex":0},"schema":"https://github.com/citation-style-language/schema/raw/master/csl-citation.json"}</w:instrText>
-      </w:r>
-      <w:r>
-        <w:rPr>
-          <w:rFonts w:cs="Times New Roman"/>
-        </w:rPr>
-        <w:fldChar w:fldCharType="separate"/>
-      </w:r>
-      <w:r>
-        <w:rPr>
-          <w:rFonts w:cs="Times New Roman"/>
-          <w:noProof/>
-        </w:rPr>
-        <w:t>(Adeniran et al., 2018)</w:t>
-      </w:r>
-      <w:r>
-        <w:rPr>
-          <w:rFonts w:cs="Times New Roman"/>
-        </w:rPr>
-        <w:fldChar w:fldCharType="end"/>
-      </w:r>
-      <w:r>
-        <w:rPr>
-          <w:rFonts w:cs="Times New Roman"/>
-        </w:rPr>
-        <w:t xml:space="preserve">.  </w:t>
-      </w:r>
-    </w:p>
-    <w:p>
-      <w:pPr>
-        <w:ind w:firstLine="708"/>
-        <w:rPr>
-          <w:rFonts w:cs="Times New Roman"/>
-        </w:rPr>
-      </w:pPr>
-      <w:r>
-        <w:rPr>
-          <w:rFonts w:cs="Times New Roman"/>
-        </w:rPr>
-        <w:t xml:space="preserve">En HF (13.56 MHz) y UHF (860–960 MHz), el desempeño depende en gran medida de la distancia entre el sensor y la etiqueta, del tipo y grosor de la barrera que los separa, así como de la presencia de objetos sólidos que interfieren con la señal (Informatika et al., 2023). Investigaciones </w:t>
-      </w:r>
-      <w:r>
-        <w:rPr>
-          <w:rFonts w:cs="Times New Roman"/>
-        </w:rPr>
-        <w:lastRenderedPageBreak/>
-        <w:t>recientes destacan que la frecuencia de operación, el acoplamiento entre antenas y las condiciones del entorno siguen siendo factores críticos para el rendimiento (Khair et al., 2022), lo que reafirma observaciones previas realizadas en Japón sobre la sensibilidad del sistema ante estas variables (Fujisaki, 2015).</w:t>
-      </w:r>
-    </w:p>
-    <w:p>
-      <w:pPr>
-        <w:ind w:firstLine="708"/>
-        <w:rPr>
-          <w:rFonts w:cs="Times New Roman"/>
-        </w:rPr>
-      </w:pPr>
-      <w:r>
-        <w:rPr>
-          <w:rFonts w:cs="Times New Roman"/>
-        </w:rPr>
-        <w:t xml:space="preserve">Por lo tanto, para dar solución o dar avances hacia esta se proponen o implementan sistemas con tecnología RFID o NFC, como por ejemplo, </w:t>
-      </w:r>
-      <w:r>
-        <w:rPr>
-          <w:rFonts w:cs="Times New Roman"/>
-        </w:rPr>
-        <w:fldChar w:fldCharType="begin" w:fldLock="1"/>
-      </w:r>
-      <w:r>
-        <w:rPr>
-          <w:rFonts w:cs="Times New Roman"/>
-        </w:rPr>
-        <w:instrText>ADDIN CSL_CITATION {"citationItems":[{"id":"ITEM-1","itemData":{"DOI":"10.24191/JMECHE.V12I1.24642","ISSN":"2550164X","abstract":"Libraries are crucial for diverse resources, particularly for students and educators. The Library Management System (LMS) in Perpustakaan Raja Tun Uda (PRTU) still used barcode technology, which was inadequate and could increase the workload of the librarians. This study presented the development and evaluation of the Smart Portable Library Management System (SPLMS) using RFID technology. The study addressed the gap in the literature by focusing on the impact of angle adjustment on the performance of UHF RFID readers in reading RFID tags placed on book spines. The study was conducted by implementing the SPLMS and performing system testing at different angles. The scope of the study encompassed the design and implementation of the SPLMS, system testing with varying angles, and evaluation of the reader's success rate in reading RFID tags. The validation of ZK-RFID101 of the results have shown that the reader has a 100% success rate for distances between 1 and 3 meters, but the success rate drops to 80% at 5 and 6 meters due to radio frequency interference. The main findings indicated that increasing the angle from 0 to 90-degrees improved the reader's performance, although certain tags still presented challenges. The results from the five conducted trials strongly indicated that a 90-degree angle was the optimum performance. The study concluded that the angle and placement of RFID readers was crucial for optimal performance in library management systems. The SPLMS provided librarians with a user-friendly dashboard for efficient book collection management, boosting productivity and enhancing user experience.","author":[{"dropping-particle":"","family":"Suhaimi","given":"Maizatul Mazni","non-dropping-particle":"","parse-names":false,"suffix":""},{"dropping-particle":"","family":"Mohamed","given":"Zulkifli","non-dropping-particle":"","parse-names":false,"suffix":""},{"dropping-particle":"","family":"Khusaini","given":"Nurul Syuhadah","non-dropping-particle":"","parse-names":false,"suffix":""}],"container-title":"Journal of Mechanical Engineering","id":"ITEM-1","issued":{"date-parts":[["2023"]]},"page":"133-152","title":"Effectiveness of RFID Smart Library Management System","type":"article-journal","volume":"SI12"},"uris":["http://www.mendeley.com/documents/?uuid=1f3d0b09-f64a-4719-b3e7-9c91755768d8"]}],"mendeley":{"formattedCitation":"(Suhaimi et al., 2023)","plainTextFormattedCitation":"(Suhaimi et al., 2023)","previouslyFormattedCitation":"(Suhaimi et al., 2023)"},"properties":{"noteIndex":0},"schema":"https://github.com/citation-style-language/schema/raw/master/csl-citation.json"}</w:instrText>
-      </w:r>
-      <w:r>
-        <w:rPr>
-          <w:rFonts w:cs="Times New Roman"/>
-        </w:rPr>
-        <w:fldChar w:fldCharType="separate"/>
-      </w:r>
-      <w:r>
-        <w:rPr>
-          <w:rFonts w:cs="Times New Roman"/>
-          <w:noProof/>
-        </w:rPr>
-        <w:t>(Suhaimi et al., 2023)</w:t>
-      </w:r>
-      <w:r>
-        <w:rPr>
-          <w:rFonts w:cs="Times New Roman"/>
-        </w:rPr>
-        <w:fldChar w:fldCharType="end"/>
-      </w:r>
-      <w:r>
-        <w:rPr>
-          <w:rFonts w:cs="Times New Roman"/>
-        </w:rPr>
-        <w:t xml:space="preserve"> los cuales implementaron un sistema de gestión de bibliotecas portátil inteligente el cual tiene como función leer las etiquetas RFID de los libros y así analizar los diferentes alcances y ángulos para la lecturas de las etiquetas, realizaron el estudio y pudieron definir ciertos alcances, dando como resultado una efectividad del 100% de las lecturas en los primeros 3 metros, y que al aumentar el ángulo de 0 a 90 grados mejoraba la efectividad, Asimismo, </w:t>
-      </w:r>
-      <w:r>
-        <w:rPr>
-          <w:rFonts w:cs="Times New Roman"/>
-        </w:rPr>
-        <w:fldChar w:fldCharType="begin" w:fldLock="1"/>
-      </w:r>
-      <w:r>
-        <w:rPr>
-          <w:rFonts w:cs="Times New Roman"/>
-        </w:rPr>
-        <w:instrText>ADDIN CSL_CITATION {"citationItems":[{"id":"ITEM-1","itemData":{"DOI":"10.30574/gjeta.2022.12.1.0115","abstract":"Rapid technological developments provide benefits for library management. One of them is the application of automatic identifiers in library management, through RFID and QR Code implementation. Some problems that are faced by libraries at the moment, include the lack of guarantees for the safety management of books in the library, lack of services human resources library management, and book availability information has not been accurate. This research conducts the development of a library management information system to solve the problems by using automatic identifiers utilizing Near Field Communication and QR Code technology. The implementation scenario is each library member has the NFC Card and their personal information stored in the NFC card, also each book in the library is put with a QR Code label containing book code information. Transaction of book loan and book return are done by initially tapping NFC Card to record visitor returned or borrow the book and then continue to scanning QR Code label of each book borrowed or returned. In the final stage, the application tested by tapping the NFC card (RFID) on the reader/writer device, and it found the NFC Card could be read or record data from the device at a maximum of 7 cm, while testing phase conducted QR Code label could be read at a maximum distance of 40 centimeters from the device. Implementing automatic identifier help to manage transaction in library more accurate, improve services and provide added value for the library.","author":[{"dropping-particle":"","family":"Putra","given":"I Gede Sujana Eka","non-dropping-particle":"","parse-names":false,"suffix":""},{"dropping-particle":"","family":"Labasariyani","given":"Ni Luh Putu","non-dropping-particle":"","parse-names":false,"suffix":""}],"container-title":"Global Journal of Engineering and Technology Advances","id":"ITEM-1","issue":"1","issued":{"date-parts":[["2022"]]},"page":"110-119","title":"Automation identifier approach for library management information system","type":"article-journal","volume":"12"},"uris":["http://www.mendeley.com/documents/?uuid=366c8983-4b63-4292-9ec1-dac983f83a70","http://www.mendeley.com/documents/?uuid=3f9f5e02-5adf-4e88-b125-21bfa68bb835"]}],"mendeley":{"formattedCitation":"(Putra &amp; Labasariyani, 2022)","plainTextFormattedCitation":"(Putra &amp; Labasariyani, 2022)","previouslyFormattedCitation":"(Putra &amp; Labasariyani, 2022)"},"properties":{"noteIndex":0},"schema":"https://github.com/citation-style-language/schema/raw/master/csl-citation.json"}</w:instrText>
-      </w:r>
-      <w:r>
-        <w:rPr>
-          <w:rFonts w:cs="Times New Roman"/>
-        </w:rPr>
-        <w:fldChar w:fldCharType="separate"/>
-      </w:r>
-      <w:r>
-        <w:rPr>
-          <w:rFonts w:cs="Times New Roman"/>
-          <w:noProof/>
-        </w:rPr>
-        <w:t>(Putra &amp; Labasariyani, 2022)</w:t>
-      </w:r>
-      <w:r>
-        <w:rPr>
-          <w:rFonts w:cs="Times New Roman"/>
-        </w:rPr>
-        <w:fldChar w:fldCharType="end"/>
-      </w:r>
-      <w:r>
-        <w:rPr>
-          <w:rFonts w:cs="Times New Roman"/>
-        </w:rPr>
-        <w:t xml:space="preserve">, realizaron las etapas de desarrollo del sistema de gestión de bibliotecas consisten en la observación directa, el estudio bibliográfico y la recopilación de datos, el diseño del sistema y el análisis de hardware, el diseño de la base de datos y la interfaz de usuario, el desarrollo del sistema y las pruebas del sistema. En su investigación observaron que las tarjetas RFID puede leerse y escribirse a una distancia máxima de hasta 7 cm del dispositivo. De la misma forma, </w:t>
-      </w:r>
-      <w:r>
-        <w:rPr>
-          <w:rFonts w:cs="Times New Roman"/>
-        </w:rPr>
-        <w:fldChar w:fldCharType="begin" w:fldLock="1"/>
-      </w:r>
-      <w:r>
-        <w:rPr>
-          <w:rFonts w:cs="Times New Roman"/>
-        </w:rPr>
-        <w:instrText>ADDIN CSL_CITATION {"citationItems":[{"id":"ITEM-1","itemData":{"DOI":"10.37934/araset.33.1.163174","ISSN":"24621943","abstract":"Radio Frequency Identification (RFID) refers to a wireless system comprising two components: tags and readers. The reader is a device with one or more antennas that emit radio waves and receive signals from the RFID tag. This system is available on most systems applications especially involving security systems, including house/office access systems, toll systems, and library systems. The accessing data is made stand-alone or data-based through the existing conventional RFID system on the market, especially in library systems. Also, the tag provided is only limited to the same type, either cards or stickers. From that, it will produce problems in monitoring the status of books, especially for loans or returns. At the same time, the difference in detection sensitivity will be the effect of the detection range for the types of tag used. Through this research, the development of adaptive RFID on IoT platforms with different types of passive tag library systems highly emphasized monitoring the status of books besides maximum range detection by using different types of passive tag and at the same time increasing the security by implementing the book status detection on the gate of the library. The tag sticker used can be read/written in the 13.56 MHz frequency with the High Frequency (HF) band due to its affordability and ease of implementation. RFID tags are embedded in all books and activated; it triggers the alarm system if the status return gets captured on the memory of the RFID tag. The alarm accuracy is almost 100%. The result showed that within the acceptable range of 5 cm, the RFID reader works efficiently in detecting books. It shows that the card tag gives 90% sensitivity of range detection, followed by the sticker and keychain tag at 70%, and, lastly, the transparent card tags at 40%.","author":[{"dropping-particle":"","family":"Ali","given":"Kharudin","non-dropping-particle":"","parse-names":false,"suffix":""},{"dropping-particle":"","family":"Rifai","given":"Damhuji","non-dropping-particle":"","parse-names":false,"suffix":""},{"dropping-particle":"","family":"Abdullah","given":"Afizullah","non-dropping-particle":"","parse-names":false,"suffix":""},{"dropping-particle":"","family":"Zain","given":"Muhammad Luqman Muhd","non-dropping-particle":"","parse-names":false,"suffix":""},{"dropping-particle":"","family":"Joraimee","given":"Ahmad","non-dropping-particle":"","parse-names":false,"suffix":""},{"dropping-particle":"","family":"Abdallah","given":"Ahmed N.","non-dropping-particle":"","parse-names":false,"suffix":""},{"dropping-particle":"","family":"Awang","given":"Nur Amalina","non-dropping-particle":"","parse-names":false,"suffix":""},{"dropping-particle":"","family":"Tan","given":"Jian Ding","non-dropping-particle":"","parse-names":false,"suffix":""},{"dropping-particle":"","family":"Paw","given":"Johnny Koh Siaw","non-dropping-particle":"","parse-names":false,"suffix":""},{"dropping-particle":"","family":"Yaw","given":"Chong Tak","non-dropping-particle":"","parse-names":false,"suffix":""}],"container-title":"Journal of Advanced Research in Applied Sciences and Engineering Technology","id":"ITEM-1","issue":"1","issued":{"date-parts":[["2023"]]},"page":"163-174","title":"Design of Adaptive RFID RC522 on IoT Platform with Different Types Passive Tag Based on Self-Service Library Management System (SSLMS)","type":"article-journal","volume":"33"},"uris":["http://www.mendeley.com/documents/?uuid=fcf6d57f-14c6-4443-b96b-ddd2953ced9f","http://www.mendeley.com/documents/?uuid=458909a3-3316-43f3-ad3d-6d3d795bf02f"]}],"mendeley":{"formattedCitation":"(Ali et al., 2023)","plainTextFormattedCitation":"(Ali et al., 2023)","previouslyFormattedCitation":"(Ali et al., 2023)"},"properties":{"noteIndex":0},"schema":"https://github.com/citation-style-language/schema/raw/master/csl-citation.json"}</w:instrText>
-      </w:r>
-      <w:r>
-        <w:rPr>
-          <w:rFonts w:cs="Times New Roman"/>
-        </w:rPr>
-        <w:fldChar w:fldCharType="separate"/>
-      </w:r>
-      <w:r>
-        <w:rPr>
-          <w:rFonts w:cs="Times New Roman"/>
-          <w:noProof/>
-        </w:rPr>
-        <w:t>(Ali et al., 2023)</w:t>
-      </w:r>
-      <w:r>
-        <w:rPr>
-          <w:rFonts w:cs="Times New Roman"/>
-        </w:rPr>
-        <w:fldChar w:fldCharType="end"/>
-      </w:r>
-      <w:r>
-        <w:rPr>
-          <w:rFonts w:cs="Times New Roman"/>
-        </w:rPr>
-        <w:t xml:space="preserve"> han desarrollado y caracterizado con éxito el diseño de un lector RFID adaptativo RC522 en una plataforma IoT con diferentes tipos de etiquetas pasivas basadas en sistemas de gestión de bibliotecas de autoservicio e incluyendo los diferentes alcances que tiene los tipos de elementos RFID como los son las tarjetas, llaveros, stickers y tarjetas transparentes, dando como resultado que la tarjeta tiene un alcance de 4.5 cm y por otro lado el sticker 3.5 cm. </w:t>
-      </w:r>
-    </w:p>
-    <w:p>
-      <w:pPr>
-        <w:ind w:firstLine="708"/>
-        <w:rPr>
-          <w:rFonts w:cs="Times New Roman"/>
-        </w:rPr>
-      </w:pPr>
-      <w:r>
-        <w:rPr>
-          <w:rFonts w:cs="Times New Roman"/>
-        </w:rPr>
-        <w:t xml:space="preserve">De la misma forma, </w:t>
       </w:r>
       <w:r>
         <w:rPr>
@@ -3833,7 +4035,13 @@
         <w:rPr>
           <w:rFonts w:cs="Times New Roman"/>
         </w:rPr>
-        <w:t>En línea con ello, la literatura reciente señala que RFID no solo moderniza los procesos de inventario, circulación y seguridad, sino que además facilita la integración de sistemas de autoservicio y monitoreo en tiempo real, aportando eficiencia y reduciendo la intervención manual. No obstante, su implementación aún enfrenta desafíos relacionados con costos de instalación, mantenimiento y privacidad de los datos</w:t>
+        <w:t xml:space="preserve">En línea con ello, la literatura reciente señala que RFID no solo moderniza los procesos de inventario, circulación y seguridad, sino que además facilita la integración de sistemas de autoservicio y monitoreo en tiempo real, aportando eficiencia y reduciendo la intervención manual. No obstante, su implementación aún enfrenta desafíos relacionados con costos de instalación, mantenimiento y privacidad de los </w:t>
+      </w:r>
+      <w:r>
+        <w:rPr>
+          <w:rFonts w:cs="Times New Roman"/>
+        </w:rPr>
+        <w:t>datos</w:t>
       </w:r>
       <w:r>
         <w:rPr>
@@ -3891,7 +4099,10 @@
         <w:fldChar w:fldCharType="end"/>
       </w:r>
       <w:r>
-        <w:t>, se puede observar que las bibliotecas deben evolucionar rápidamente y esto requiere impulsar las medidas de seguridad para desarrollar sistemas de control que mejoren la experiencia de los usuarios, y es ahí donde los sistemas RFID toman fuerza para brindar una solución como algoritmos inteligentes en la evolución de estas bibliotecas.</w:t>
+        <w:t>,</w:t>
+      </w:r>
+      <w:r>
+        <w:t xml:space="preserve"> se puede observar que las bibliotecas deben evolucionar rápidamente y esto requiere impulsar las medidas de seguridad para desarrollar sistemas de control que mejoren la experiencia de los usuarios, y es ahí donde los sistemas RFID toman fuerza para brindar una solución como algoritmos inteligentes en la evolución de estas bibliotecas.</w:t>
       </w:r>
     </w:p>
     <w:p>
@@ -3905,7 +4116,13 @@
         <w:rPr>
           <w:rFonts w:cs="Times New Roman"/>
         </w:rPr>
-        <w:t xml:space="preserve">Desde una perspectiva más amplia, el Internet de las Cosas (IoT) ha comenzado a ser adoptado en bibliotecas universitarias como estrategia para fortalecer la gestión del conocimiento. Casos en África muestran que, aunque la adopción es todavía incipiente, existe una relación positiva entre IoT, acceso a la información y colaboración académica, siempre que se cuente con infraestructura robusta y formación adecuada del personal </w:t>
+        <w:t xml:space="preserve">Desde una perspectiva más amplia, el Internet de las Cosas (IoT) ha comenzado a ser adoptado en bibliotecas universitarias como estrategia para fortalecer la gestión del conocimiento. Casos en África muestran que, aunque la adopción es todavía incipiente, existe una relación positiva entre IoT, acceso a la información y colaboración </w:t>
+      </w:r>
+      <w:r>
+        <w:rPr>
+          <w:rFonts w:cs="Times New Roman"/>
+        </w:rPr>
+        <w:t xml:space="preserve">académica, siempre que se cuente con infraestructura robusta y formación adecuada del personal </w:t>
       </w:r>
       <w:r>
         <w:rPr>
@@ -3982,21 +4199,25 @@
         </w:rPr>
         <w:t xml:space="preserve">En cuanto a la evolución tecnológica en Asia, se observa que el uso de RFID en la gestión bibliotecaria ha transformado los servicios al permitir identificación sin contacto, organización más eficiente de colecciones y una notable reducción en la carga operativa del personal. La experiencia de China y Estados Unidos muestra que estas soluciones han pasado de ser experimentales a sistemas consolidados, con amplia aceptación entre usuarios </w:t>
       </w:r>
-      <w:r>
-        <w:rPr>
-          <w:rFonts w:cs="Times New Roman"/>
+      <w:commentRangeStart w:id="21"/>
+      <w:r>
+        <w:rPr>
+          <w:rFonts w:cs="Times New Roman"/>
+          <w:highlight w:val="red"/>
         </w:rPr>
         <w:fldChar w:fldCharType="begin" w:fldLock="1"/>
       </w:r>
       <w:r>
         <w:rPr>
           <w:rFonts w:cs="Times New Roman"/>
+          <w:highlight w:val="red"/>
         </w:rPr>
         <w:instrText>ADDIN CSL_CITATION {"citationItems":[{"id":"ITEM-1","itemData":{"DOI":"10.4028/www.scientific.net/AMM.513-517.620","ISBN":"9783038350125","ISSN":"16609336","abstract":"As the application of the information network technology continuously extended, library management service platform is experiencing a shift to the information service system. In the library information management field, researchers are seeking a library identification system which is more convenient and comprehensive. Under the circumstance of the information technology conditions, Radio Frequency Identification (RFID) technology completes the automatic identification of the electronic identification tags--the two-dimensional code. The RFID technology is a contactless scanning recognition technology. And the core technology of RFID can be described as follows: using two-dimensional code as the filter identification tool according to backup data of the book management. © (2014) Trans Tech Publications, Switzerland.","author":[{"dropping-particle":"","family":"Wang","given":"Ji Kun","non-dropping-particle":"","parse-names":false,"suffix":""},{"dropping-particle":"","family":"Hu","given":"Xing Zhi","non-dropping-particle":"","parse-names":false,"suffix":""},{"dropping-particle":"","family":"Li","given":"Xue Zhe","non-dropping-particle":"","parse-names":false,"suffix":""},{"dropping-particle":"","family":"Ding","given":"Fei Ji","non-dropping-particle":"","parse-names":false,"suffix":""}],"container-title":"Applied Mechanics and Materials","id":"ITEM-1","issued":{"date-parts":[["2014"]]},"page":"620-623","title":"A research of the application of the RFID in the library management","type":"article-journal","volume":"513-517"},"uris":["http://www.mendeley.com/documents/?uuid=972affde-b6af-4977-93fc-54ee591aecd4","http://www.mendeley.com/documents/?uuid=42e6b205-ac53-4bc0-91b0-d06bba0735ff"]}],"mendeley":{"formattedCitation":"(Wang et al., 2014)","plainTextFormattedCitation":"(Wang et al., 2014)","previouslyFormattedCitation":"(Wang et al., 2014)"},"properties":{"noteIndex":0},"schema":"https://github.com/citation-style-language/schema/raw/master/csl-citation.json"}</w:instrText>
       </w:r>
       <w:r>
         <w:rPr>
           <w:rFonts w:cs="Times New Roman"/>
+          <w:highlight w:val="red"/>
         </w:rPr>
         <w:fldChar w:fldCharType="separate"/>
       </w:r>
@@ -4004,21 +4225,34 @@
         <w:rPr>
           <w:rFonts w:cs="Times New Roman"/>
           <w:noProof/>
+          <w:highlight w:val="red"/>
         </w:rPr>
         <w:t>(Wang et al., 2014)</w:t>
       </w:r>
       <w:r>
         <w:rPr>
           <w:rFonts w:cs="Times New Roman"/>
+          <w:highlight w:val="red"/>
         </w:rPr>
         <w:fldChar w:fldCharType="end"/>
       </w:r>
       <w:r>
         <w:rPr>
           <w:rFonts w:cs="Times New Roman"/>
+          <w:highlight w:val="red"/>
         </w:rPr>
         <w:t>.</w:t>
       </w:r>
+      <w:commentRangeEnd w:id="21"/>
+      <w:r>
+        <w:rPr>
+          <w:rStyle w:val="Refdecomentario"/>
+          <w:rFonts w:cs="Times New Roman"/>
+          <w:sz w:val="24"/>
+          <w:szCs w:val="22"/>
+        </w:rPr>
+        <w:commentReference w:id="21"/>
+      </w:r>
     </w:p>
     <w:p>
       <w:pPr>
@@ -4107,7 +4341,13 @@
           <w:rFonts w:cs="Times New Roman"/>
         </w:rPr>
         <w:lastRenderedPageBreak/>
-        <w:t>Observando otras implementaciones, se observa que diseñaron e implementaron soluciones orientadas a la automatización de procesos clave, como la circulación, la seguridad, el inventario y la recuperación de libros, sustituyendo los códigos de barras y las tiras electromagnéticas por etiquetas RFID integradas a lectores y antenas instalados en puertas de seguridad, estanterías y kioskos de autoservicio</w:t>
+        <w:t xml:space="preserve">Observando otras implementaciones, se observa que diseñaron e implementaron soluciones orientadas a la automatización de procesos clave, como la circulación, la seguridad, el inventario y la recuperación de libros, sustituyendo los códigos de barras y las tiras electromagnéticas por etiquetas RFID integradas a lectores y antenas instalados en puertas de seguridad, estanterías y kioskos de </w:t>
+      </w:r>
+      <w:r>
+        <w:rPr>
+          <w:rFonts w:cs="Times New Roman"/>
+        </w:rPr>
+        <w:t>autoservicio</w:t>
       </w:r>
       <w:r>
         <w:rPr>
@@ -4181,29 +4421,61 @@
         <w:rPr>
           <w:rFonts w:cs="Times New Roman"/>
         </w:rPr>
-        <w:t>, donde muestran la eficiencia en la implementación de gestión bibliotecaria por medio de tecnología RFID</w:t>
-      </w:r>
-      <w:r>
-        <w:rPr>
-          <w:rFonts w:cs="Times New Roman"/>
-        </w:rPr>
-        <w:t xml:space="preserve">. Otros trabajos se enfocaron en la gestión de inventario en tiempo real, diseñando, simulando e implementando sistemas capaces de contar y localizar libros directamente en los estantes, superando así las limitaciones de los lectores portátiles y del escaneo manual propio de los códigos de barras </w:t>
-      </w:r>
-      <w:r>
-        <w:rPr>
-          <w:rFonts w:cs="Times New Roman"/>
+        <w:t>,</w:t>
+      </w:r>
+      <w:r>
+        <w:rPr>
+          <w:rFonts w:cs="Times New Roman"/>
+        </w:rPr>
+        <w:t xml:space="preserve"> donde muestran la eficiencia en la implementación de gestión bibliotecaria por medio de tecnología RFID</w:t>
+      </w:r>
+      <w:r>
+        <w:rPr>
+          <w:rFonts w:cs="Times New Roman"/>
+        </w:rPr>
+        <w:t xml:space="preserve">. Otros trabajos se enfocaron en la gestión de inventario en tiempo real, diseñando, simulando e implementando sistemas capaces de contar y localizar libros directamente en los estantes, superando así las limitaciones de los lectores portátiles y del escaneo manual propio de los códigos de </w:t>
+      </w:r>
+      <w:commentRangeStart w:id="22"/>
+      <w:r>
+        <w:rPr>
+          <w:rFonts w:cs="Times New Roman"/>
+        </w:rPr>
+        <w:t>barras</w:t>
+      </w:r>
+      <w:commentRangeEnd w:id="22"/>
+      <w:r>
+        <w:rPr>
+          <w:rStyle w:val="Refdecomentario"/>
+          <w:rFonts w:cs="Times New Roman"/>
+          <w:sz w:val="24"/>
+          <w:szCs w:val="22"/>
+        </w:rPr>
+        <w:commentReference w:id="22"/>
+      </w:r>
+      <w:r>
+        <w:rPr>
+          <w:rFonts w:cs="Times New Roman"/>
+        </w:rPr>
+        <w:t xml:space="preserve"> </w:t>
+      </w:r>
+      <w:r>
+        <w:rPr>
+          <w:rFonts w:cs="Times New Roman"/>
+          <w:highlight w:val="magenta"/>
         </w:rPr>
         <w:fldChar w:fldCharType="begin" w:fldLock="1"/>
       </w:r>
       <w:r>
         <w:rPr>
           <w:rFonts w:cs="Times New Roman"/>
+          <w:highlight w:val="magenta"/>
         </w:rPr>
         <w:instrText>ADDIN CSL_CITATION {"citationItems":[{"id":"ITEM-1","itemData":{"author":[{"dropping-particle":"","family":"Mvoulabolo","given":"Meryle K","non-dropping-particle":"","parse-names":false,"suffix":""}],"id":"ITEM-1","issue":"December","issued":{"date-parts":[["2019"]]},"title":"DESIGN AND IMPLEMENTATION OF AN INVENTORY MANAGEMENT SYSTEM IN LIBRARIES USING RADIO FREQUENCY IDENTIFICATION A dissertation submitted in the fulfilment of the requirements for Master of Engineering : Electrical Department of Process Control &amp; Computer Sy","type":"article-journal"},"uris":["http://www.mendeley.com/documents/?uuid=53b2dcbf-9def-493b-87da-6c2c443205c2"]}],"mendeley":{"formattedCitation":"(Mvoulabolo, 2019)","plainTextFormattedCitation":"(Mvoulabolo, 2019)","previouslyFormattedCitation":"(Mvoulabolo, 2019)"},"properties":{"noteIndex":0},"schema":"https://github.com/citation-style-language/schema/raw/master/csl-citation.json"}</w:instrText>
       </w:r>
       <w:r>
         <w:rPr>
           <w:rFonts w:cs="Times New Roman"/>
+          <w:highlight w:val="magenta"/>
         </w:rPr>
         <w:fldChar w:fldCharType="separate"/>
       </w:r>
@@ -4211,12 +4483,14 @@
         <w:rPr>
           <w:rFonts w:cs="Times New Roman"/>
           <w:noProof/>
+          <w:highlight w:val="magenta"/>
         </w:rPr>
         <w:t>(Mvoulabolo, 2019)</w:t>
       </w:r>
       <w:r>
         <w:rPr>
           <w:rFonts w:cs="Times New Roman"/>
+          <w:highlight w:val="magenta"/>
         </w:rPr>
         <w:fldChar w:fldCharType="end"/>
       </w:r>
@@ -4224,23 +4498,49 @@
         <w:rPr>
           <w:rFonts w:cs="Times New Roman"/>
         </w:rPr>
-        <w:t xml:space="preserve">. También se han desarrollado soluciones más especializadas, como el diseño y prueba de una antena RFID impresa a 915 MHz, optimizada para mejorar la cobertura y la precisión de lectura en múltiples estantes, reduciendo los errores por la orientación de los tags y las restricciones físicas del espacio </w:t>
-      </w:r>
-      <w:r>
-        <w:rPr>
-          <w:rFonts w:cs="Times New Roman"/>
+        <w:t xml:space="preserve">. También se han desarrollado soluciones más especializadas, como el diseño y prueba de una antena RFID impresa a 915 MHz, optimizada para mejorar la cobertura y la precisión de lectura en múltiples estantes, reduciendo los errores por la orientación de los tags y las restricciones físicas del </w:t>
+      </w:r>
+      <w:commentRangeStart w:id="23"/>
+      <w:r>
+        <w:rPr>
+          <w:rFonts w:cs="Times New Roman"/>
+        </w:rPr>
+        <w:t>espacio</w:t>
+      </w:r>
+      <w:commentRangeEnd w:id="23"/>
+      <w:r>
+        <w:rPr>
+          <w:rStyle w:val="Refdecomentario"/>
+          <w:rFonts w:cs="Times New Roman"/>
+          <w:sz w:val="24"/>
+          <w:szCs w:val="22"/>
+        </w:rPr>
+        <w:commentReference w:id="23"/>
+      </w:r>
+      <w:r>
+        <w:rPr>
+          <w:rFonts w:cs="Times New Roman"/>
+        </w:rPr>
+        <w:t xml:space="preserve"> </w:t>
+      </w:r>
+      <w:r>
+        <w:rPr>
+          <w:rFonts w:cs="Times New Roman"/>
+          <w:highlight w:val="red"/>
         </w:rPr>
         <w:fldChar w:fldCharType="begin" w:fldLock="1"/>
       </w:r>
       <w:r>
         <w:rPr>
           <w:rFonts w:cs="Times New Roman"/>
+          <w:highlight w:val="red"/>
         </w:rPr>
         <w:instrText>ADDIN CSL_CITATION {"citationItems":[{"id":"ITEM-1","itemData":{"DOI":"10.1051/matecconf/201712300028","ISSN":"2261236X","abstract":"A 915 MHz printed radio-frequency-identification (RFID) antennas with the characteristics of good gain and omnidirectional beam wave is constructed and evaluated in this study. The objective is to find out their best reading rates for providing effective wireless communications among RFID antenna during the library book inventory process. And an optimal library inventory system which is based on electromagnetic identification (EMID) technology is proposed, which is constructed to find the optimal tag location for a book, test the tag readability for bookshelves, and connect a couple of multi-layer bookshelves with multiplexers and updat the tag reading status in the database of the computer terminal. The fabricated antenna reader and the proposed system are embedded into different locations of bookshelves and tested at the library of Cheng Shiu University in Taiwan. According to the experimental results, the designed prototype of the antenna reader has the characteristics of the directional radiation pattern, good gain, simple shape, low cost and is easy to be integrated into the bookshelf. And the designed library inventory system can authenticate the location of a book automatically. They can benefit administrating librarians with the capabilities of decreasing the library inventory processing time and reducing the possibility of the books being misplaced.","author":[{"dropping-particle":"","family":"Cheng","given":"Ching Chien","non-dropping-particle":"","parse-names":false,"suffix":""},{"dropping-particle":"","family":"Shih","given":"Sung Tsun","non-dropping-particle":"","parse-names":false,"suffix":""},{"dropping-particle":"","family":"Cheng","given":"Kong Xin","non-dropping-particle":"","parse-names":false,"suffix":""},{"dropping-particle":"","family":"Kung","given":"Huang Kuang","non-dropping-particle":"","parse-names":false,"suffix":""},{"dropping-particle":"","family":"Wang","given":"Chin Yu","non-dropping-particle":"","parse-names":false,"suffix":""}],"container-title":"MATEC Web of Conferences","id":"ITEM-1","issued":{"date-parts":[["2017"]]},"title":"Design of books inventory with RFID antenna in library management system","type":"article-journal","volume":"123"},"uris":["http://www.mendeley.com/documents/?uuid=efbbf0f9-0d66-42b3-b76e-70b47ef777e2"]}],"mendeley":{"formattedCitation":"(Cheng et al., 2017)","plainTextFormattedCitation":"(Cheng et al., 2017)","previouslyFormattedCitation":"(Cheng et al., 2017)"},"properties":{"noteIndex":0},"schema":"https://github.com/citation-style-language/schema/raw/master/csl-citation.json"}</w:instrText>
       </w:r>
       <w:r>
         <w:rPr>
           <w:rFonts w:cs="Times New Roman"/>
+          <w:highlight w:val="red"/>
         </w:rPr>
         <w:fldChar w:fldCharType="separate"/>
       </w:r>
@@ -4248,12 +4548,14 @@
         <w:rPr>
           <w:rFonts w:cs="Times New Roman"/>
           <w:noProof/>
+          <w:highlight w:val="red"/>
         </w:rPr>
         <w:t>(Cheng et al., 2017)</w:t>
       </w:r>
       <w:r>
         <w:rPr>
           <w:rFonts w:cs="Times New Roman"/>
+          <w:highlight w:val="red"/>
         </w:rPr>
         <w:fldChar w:fldCharType="end"/>
       </w:r>
@@ -4312,23 +4614,33 @@
         <w:rPr>
           <w:rFonts w:cs="Times New Roman"/>
         </w:rPr>
-        <w:t xml:space="preserve">. De manera similar, otros autores propusieron e implementaron sistemas RFID para automatizar préstamos, devoluciones, inventario y seguridad, con el objetivo de reemplazar los códigos de barras tradicionales y mejorar la eficiencia operativa </w:t>
-      </w:r>
-      <w:r>
-        <w:rPr>
-          <w:rFonts w:cs="Times New Roman"/>
+        <w:t>.</w:t>
+      </w:r>
+      <w:r>
+        <w:rPr>
+          <w:rFonts w:cs="Times New Roman"/>
+        </w:rPr>
+        <w:t xml:space="preserve"> De manera similar, otros autores propusieron e implementaron sistemas RFID para automatizar préstamos, devoluciones, inventario y seguridad, con el objetivo de reemplazar los códigos de barras tradicionales y mejorar la eficiencia operativa </w:t>
+      </w:r>
+      <w:commentRangeStart w:id="24"/>
+      <w:r>
+        <w:rPr>
+          <w:rFonts w:cs="Times New Roman"/>
+          <w:highlight w:val="darkYellow"/>
         </w:rPr>
         <w:fldChar w:fldCharType="begin" w:fldLock="1"/>
       </w:r>
       <w:r>
         <w:rPr>
           <w:rFonts w:cs="Times New Roman"/>
+          <w:highlight w:val="darkYellow"/>
         </w:rPr>
         <w:instrText>ADDIN CSL_CITATION {"citationItems":[{"id":"ITEM-1","itemData":{"DOI":"10.1108/IJEM-05-2017-0129","ISBN":"9788195275700","ISSN":"0951354X","abstract":"Purpose: The purpose of this paper is to research on knowledge management (KM) in higher education institutions (HEIs) by studying its processes, knowledge creation (KC), knowledge sharing (KS) and knowledge transfer (KT), in Mauritius. Design/methodology/approach: Semi-structured interviews were conducted with senior staff in the main public and private HEIs in Mauritius. Questions focussed on KM strategy and processes. Interviews were recorded and transcribed prior to thematic analysis. Findings: Although participants could discuss KM processes, none of the participating institutions had a KM strategy. All institutions are involved in KC and acquisition, KS and KT. In addition to research, knowledge was regarded as being created through teaching and learning activities, consultancies, organisational documentation and acquisition from external sources. Knowledge is shared among peers during departmental and curriculum meetings, through annual research seminars and during conferences and publications in journals. KT with industry through consultancies is restricted to a few public HEIs. In the remaining HEIs, KT is limited to their students joining the workforce and to organising tailor-made courses and training programmes for public and private institutions. The study also provides evidence that some processes and activities contribute to more than one of KC, sharing and transfer. Originality/value: This study contributes to the very limited body of research into KM processes in countries with developing higher education sectors. In addition, this research disaggregates the processes associated with KC, sharing and transfer, whilst also examining the relationship between them.","author":[{"dropping-particle":"","family":"Veer Ramjeawon","given":"Poonam","non-dropping-particle":"","parse-names":false,"suffix":""},{"dropping-particle":"","family":"Rowley","given":"Jennifer","non-dropping-particle":"","parse-names":false,"suffix":""}],"container-title":"International Journal of Educational Management","id":"ITEM-1","issue":"7","issued":{"date-parts":[["2018"]]},"number-of-pages":"1319-1332","title":"Knowledge management in higher education institutions in Mauritius","type":"book","volume":"32"},"uris":["http://www.mendeley.com/documents/?uuid=8f8efa09-eb87-43cb-a632-b492359a6153"]}],"mendeley":{"formattedCitation":"(Veer Ramjeawon &amp; Rowley, 2018)","plainTextFormattedCitation":"(Veer Ramjeawon &amp; Rowley, 2018)","previouslyFormattedCitation":"(Veer Ramjeawon &amp; Rowley, 2018)"},"properties":{"noteIndex":0},"schema":"https://github.com/citation-style-language/schema/raw/master/csl-citation.json"}</w:instrText>
       </w:r>
       <w:r>
         <w:rPr>
           <w:rFonts w:cs="Times New Roman"/>
+          <w:highlight w:val="darkYellow"/>
         </w:rPr>
         <w:fldChar w:fldCharType="separate"/>
       </w:r>
@@ -4336,20 +4648,38 @@
         <w:rPr>
           <w:rFonts w:cs="Times New Roman"/>
           <w:noProof/>
+          <w:highlight w:val="darkYellow"/>
         </w:rPr>
         <w:t>(Veer Ramjeawon &amp; Rowley, 2018)</w:t>
       </w:r>
       <w:r>
         <w:rPr>
           <w:rFonts w:cs="Times New Roman"/>
+          <w:highlight w:val="darkYellow"/>
         </w:rPr>
         <w:fldChar w:fldCharType="end"/>
       </w:r>
-      <w:r>
-        <w:rPr>
-          <w:rFonts w:cs="Times New Roman"/>
-        </w:rPr>
-        <w:t xml:space="preserve">. Desde una perspectiva más amplia, algunos estudios realizaron una revisión de casos internacionales de implementación de RFID en bibliotecas, evaluando su papel en la automatización de inventarios, la circulación, la seguridad, el autoservicio y la mejora de la experiencia de usuario </w:t>
+      <w:commentRangeEnd w:id="24"/>
+      <w:r>
+        <w:rPr>
+          <w:rStyle w:val="Refdecomentario"/>
+          <w:rFonts w:cs="Times New Roman"/>
+          <w:sz w:val="24"/>
+          <w:szCs w:val="22"/>
+        </w:rPr>
+        <w:commentReference w:id="24"/>
+      </w:r>
+      <w:r>
+        <w:rPr>
+          <w:rFonts w:cs="Times New Roman"/>
+        </w:rPr>
+        <w:t>. Desde una perspectiva más amplia, algunos estudios realizaron una revisión de casos internacionales de implementación de RFID en bibliotecas, evaluando su papel en la automatización de inventarios, la circulación, la seguridad, el autoservicio y la mejora d</w:t>
+      </w:r>
+      <w:r>
+        <w:rPr>
+          <w:rFonts w:cs="Times New Roman"/>
+        </w:rPr>
+        <w:t xml:space="preserve">e la experiencia de usuario </w:t>
       </w:r>
       <w:r>
         <w:rPr>
@@ -4437,7 +4767,13 @@
         <w:rPr>
           <w:rFonts w:cs="Times New Roman"/>
         </w:rPr>
-        <w:t xml:space="preserve">. Finalmente, otros enfoques se centraron en reforzar la </w:t>
+        <w:t>.</w:t>
+      </w:r>
+      <w:r>
+        <w:rPr>
+          <w:rFonts w:cs="Times New Roman"/>
+        </w:rPr>
+        <w:t xml:space="preserve"> Finalmente, otros enfoques se centraron en reforzar la </w:t>
       </w:r>
       <w:r>
         <w:rPr>
@@ -4477,6 +4813,12 @@
         </w:rPr>
         <w:fldChar w:fldCharType="end"/>
       </w:r>
+      <w:r>
+        <w:rPr>
+          <w:rFonts w:cs="Times New Roman"/>
+        </w:rPr>
+        <w:t>.</w:t>
+      </w:r>
     </w:p>
     <w:p>
       <w:pPr>
@@ -4526,7 +4868,19 @@
         <w:rPr>
           <w:rFonts w:cs="Times New Roman"/>
         </w:rPr>
-        <w:t xml:space="preserve">, y de igual manera, </w:t>
+        <w:t>,</w:t>
+      </w:r>
+      <w:r>
+        <w:rPr>
+          <w:rFonts w:cs="Times New Roman"/>
+        </w:rPr>
+        <w:t xml:space="preserve"> y de igual manera</w:t>
+      </w:r>
+      <w:r>
+        <w:rPr>
+          <w:rFonts w:cs="Times New Roman"/>
+        </w:rPr>
+        <w:t xml:space="preserve">, </w:t>
       </w:r>
       <w:r>
         <w:rPr>
@@ -4563,7 +4917,19 @@
         <w:rPr>
           <w:rFonts w:cs="Times New Roman"/>
         </w:rPr>
-        <w:t xml:space="preserve"> nos explica que la tecnología RFID representa una oportunidad transformadora para la comunidad bibliotecaria, lista para redefinir la gestión bibliotecaria tradicional en los próximos años. Su capacidad para el inventario a alta velocidad y la identificación eficiente de artículos extraviados la convierten en una herramienta indispensable para las bibliotecas modernas.</w:t>
+        <w:t xml:space="preserve"> nos explica</w:t>
+      </w:r>
+      <w:r>
+        <w:rPr>
+          <w:rFonts w:cs="Times New Roman"/>
+        </w:rPr>
+        <w:t>n</w:t>
+      </w:r>
+      <w:r>
+        <w:rPr>
+          <w:rFonts w:cs="Times New Roman"/>
+        </w:rPr>
+        <w:t xml:space="preserve"> que la tecnología RFID representa una oportunidad transformadora para la comunidad bibliotecaria, lista para redefinir la gestión bibliotecaria tradicional en los próximos años. Su capacidad para el inventario a alta velocidad y la identificación eficiente de artículos extraviados la convierten en una herramienta indispensable para las bibliotecas modernas.</w:t>
       </w:r>
     </w:p>
     <w:p>
@@ -4592,7 +4958,27 @@
           <w:rFonts w:cs="Times New Roman"/>
         </w:rPr>
         <w:lastRenderedPageBreak/>
-        <w:t>control e identificación eficiente de libros, con metas de reducción de tiempos de inventario, incremento de tasas de lectura y disminución de pérdidas</w:t>
+        <w:t>control e identificación eficiente de libros, con metas de reducción de tiempos de inventario, incremento de tasas de lectura y disminución de pérdida</w:t>
+      </w:r>
+      <w:r>
+        <w:rPr>
+          <w:rFonts w:cs="Times New Roman"/>
+        </w:rPr>
+        <w:t>s.</w:t>
+      </w:r>
+    </w:p>
+    <w:p>
+      <w:pPr>
+        <w:ind w:firstLine="708"/>
+        <w:rPr>
+          <w:rFonts w:cs="Times New Roman"/>
+        </w:rPr>
+      </w:pPr>
+      <w:r>
+        <w:rPr>
+          <w:rFonts w:cs="Times New Roman"/>
+        </w:rPr>
+        <w:t>Asimismo, investigaciones recientes han demostrado la viabilidad de integrar tecnologías de Internet de las Cosas (IoT) con RFID para optimizar los sistemas de gestión bibliotecaria. En este sentido, Victor et al. (2025) desarrollaron e implementaron un sistema de biblioteca basado en IoT que integra etiquetas RFID en los libros, lectores de radiofrecuencia y una base de datos central para automatizar los procesos de préstamo, devolución y seguimiento del material bibliográfico. El sistema fue implementado en una biblioteca universitaria en Nigeria y permitió mejorar significativamente la eficiencia operativa, reducir los tiempos de transacción y aumentar la precisión en la gestión del inventario. Los resultados obtenidos evidenciaron que más del 90 % de los usuarios percibieron el proceso de préstamo como más rápido y conveniente en comparación con el sistema tradicional, además de reportarse mejoras en la experiencia del usuario y en el control de los recursos bibliográficos (Victor et al., 2025). Estos hallazgos refuerzan la idea de que la adopción de RFID en entornos bibliotecarios no solo moderniza los procesos de circulación, sino que también contribuye a la automatización, la trazabilidad de los libros y la optimización de los servicios bibliotecarios en contextos académicos</w:t>
       </w:r>
       <w:r>
         <w:rPr>
@@ -4603,6 +4989,35 @@
     </w:p>
     <w:p>
       <w:pPr>
+        <w:ind w:firstLine="708"/>
+        <w:rPr>
+          <w:rFonts w:cs="Times New Roman"/>
+        </w:rPr>
+      </w:pPr>
+      <w:r>
+        <w:rPr>
+          <w:rFonts w:cs="Times New Roman"/>
+        </w:rPr>
+        <w:t>De igual manera, el desarrollo de bibliotecas digitales y plataformas de acceso abierto ha tomado gran relevancia en los últimos años. Un ejemplo de ello es la National Digital Library of India (NDLI), una iniciativa orientada a integrar recursos educativos y académicos en una única plataforma digital que facilite el acceso al conocimiento a estudiantes, investigadores y docentes. Este proyecto busca consolidar colecciones provenientes de múltiples instituciones y ofrecer servicios de búsqueda, organización y acceso a grandes volúmenes de información digital, contribuyendo al fortalecimiento de los ecosistemas de conocimiento y aprendizaje en entornos académicos. Estas iniciativas evidencian cómo las bibliotecas modernas no solo evolucionan en la gestión de recursos físicos, sino también en la integración de plataformas digitales que amplían el acceso a la información y complementan los servicios bibliotecarios tradicionales (NDLI, 2025).</w:t>
+      </w:r>
+    </w:p>
+    <w:p>
+      <w:pPr>
+        <w:ind w:firstLine="708"/>
+        <w:rPr>
+          <w:rFonts w:cs="Times New Roman"/>
+        </w:rPr>
+      </w:pPr>
+    </w:p>
+    <w:p>
+      <w:pPr>
+        <w:rPr>
+          <w:rFonts w:cs="Times New Roman"/>
+        </w:rPr>
+      </w:pPr>
+    </w:p>
+    <w:p>
+      <w:pPr>
         <w:pStyle w:val="PrrAPA"/>
       </w:pPr>
     </w:p>
@@ -4622,7 +5037,7 @@
           <w:b/>
         </w:rPr>
       </w:pPr>
-      <w:bookmarkStart w:id="21" w:name="_Toc440985128"/>
+      <w:bookmarkStart w:id="25" w:name="_Toc440985128"/>
     </w:p>
     <w:p>
       <w:pPr>
@@ -4679,7 +5094,7 @@
         <w:lastRenderedPageBreak/>
         <w:t>2 Justificación</w:t>
       </w:r>
-      <w:bookmarkEnd w:id="21"/>
+      <w:bookmarkEnd w:id="25"/>
     </w:p>
     <w:p>
       <w:pPr>
@@ -4740,7 +5155,7 @@
         </w:rPr>
         <w:t>.</w:t>
       </w:r>
-      <w:commentRangeStart w:id="22"/>
+      <w:commentRangeStart w:id="26"/>
       <w:r>
         <w:rPr>
           <w:rFonts w:cs="Times New Roman"/>
@@ -4748,7 +5163,7 @@
         </w:rPr>
         <w:t xml:space="preserve"> </w:t>
       </w:r>
-      <w:commentRangeEnd w:id="22"/>
+      <w:commentRangeEnd w:id="26"/>
       <w:r>
         <w:rPr>
           <w:rStyle w:val="Refdecomentario"/>
@@ -4756,7 +5171,7 @@
           <w:sz w:val="24"/>
           <w:szCs w:val="24"/>
         </w:rPr>
-        <w:commentReference w:id="22"/>
+        <w:commentReference w:id="26"/>
       </w:r>
     </w:p>
     <w:p>
@@ -4890,7 +5305,7 @@
           <w:b/>
         </w:rPr>
       </w:pPr>
-      <w:bookmarkStart w:id="23" w:name="_Toc440985129"/>
+      <w:bookmarkStart w:id="27" w:name="_Toc440985129"/>
     </w:p>
     <w:p>
       <w:pPr>
@@ -4947,22 +5362,22 @@
         <w:lastRenderedPageBreak/>
         <w:t>3 Objetivos</w:t>
       </w:r>
-      <w:bookmarkEnd w:id="23"/>
-    </w:p>
-    <w:p>
-      <w:pPr>
-        <w:rPr>
-          <w:b/>
-        </w:rPr>
-      </w:pPr>
-    </w:p>
-    <w:p>
-      <w:pPr>
-        <w:rPr>
-          <w:b/>
-        </w:rPr>
-      </w:pPr>
-      <w:bookmarkStart w:id="24" w:name="_Toc440985130"/>
+      <w:bookmarkEnd w:id="27"/>
+    </w:p>
+    <w:p>
+      <w:pPr>
+        <w:rPr>
+          <w:b/>
+        </w:rPr>
+      </w:pPr>
+    </w:p>
+    <w:p>
+      <w:pPr>
+        <w:rPr>
+          <w:b/>
+        </w:rPr>
+      </w:pPr>
+      <w:bookmarkStart w:id="28" w:name="_Toc440985130"/>
       <w:r>
         <w:rPr>
           <w:b/>
@@ -4981,7 +5396,7 @@
         </w:rPr>
         <w:t>eneral</w:t>
       </w:r>
-      <w:bookmarkEnd w:id="24"/>
+      <w:bookmarkEnd w:id="28"/>
     </w:p>
     <w:p>
       <w:pPr>
@@ -5047,7 +5462,7 @@
           <w:b/>
         </w:rPr>
       </w:pPr>
-      <w:bookmarkStart w:id="25" w:name="_Toc440985131"/>
+      <w:bookmarkStart w:id="29" w:name="_Toc440985131"/>
       <w:r>
         <w:rPr>
           <w:b/>
@@ -5066,7 +5481,7 @@
         </w:rPr>
         <w:t>specíficos</w:t>
       </w:r>
-      <w:bookmarkEnd w:id="25"/>
+      <w:bookmarkEnd w:id="29"/>
     </w:p>
     <w:p/>
     <w:p>
@@ -5194,214 +5609,17 @@
           <w:bCs/>
         </w:rPr>
       </w:pPr>
+      <w:commentRangeStart w:id="30"/>
       <w:r>
         <w:rPr>
           <w:b/>
           <w:bCs/>
+          <w:highlight w:val="red"/>
         </w:rPr>
         <w:lastRenderedPageBreak/>
-        <w:t xml:space="preserve">4 </w:t>
-      </w:r>
-      <w:r>
-        <w:rPr>
-          <w:b/>
-          <w:bCs/>
-        </w:rPr>
-        <w:t>Problema de investigación</w:t>
-      </w:r>
-    </w:p>
-    <w:p>
-      <w:pPr>
-        <w:ind w:firstLine="708"/>
-        <w:rPr>
-          <w:rFonts w:cs="Times New Roman"/>
-          <w:szCs w:val="24"/>
-        </w:rPr>
-      </w:pPr>
-    </w:p>
-    <w:p>
-      <w:pPr>
-        <w:ind w:firstLine="360"/>
-        <w:rPr>
-          <w:rFonts w:cs="Times New Roman"/>
-          <w:szCs w:val="24"/>
-        </w:rPr>
-      </w:pPr>
-      <w:r>
-        <w:rPr>
-          <w:rFonts w:cs="Times New Roman"/>
-          <w:szCs w:val="24"/>
-        </w:rPr>
-        <w:t>La biblioteca Monseñor Héctor Rueda Hernández de la Institución Universitaria Salazar y Herrera (IUSH) cumple un papel fundamental en el apoyo a los procesos académicos, investigativos y culturales de la comunidad universitaria. Sin embargo, enfrenta dificultades en la gestión y control de su colección bibliográfica, debido a que los sistemas tradicionales de identificación y préstamo de libros se basan principalmente en códigos de barras.</w:t>
-      </w:r>
-    </w:p>
-    <w:p>
-      <w:pPr>
-        <w:ind w:firstLine="360"/>
-        <w:rPr>
-          <w:rFonts w:cs="Times New Roman"/>
-          <w:szCs w:val="24"/>
-        </w:rPr>
-      </w:pPr>
-      <w:r>
-        <w:rPr>
-          <w:rFonts w:cs="Times New Roman"/>
-          <w:szCs w:val="24"/>
-        </w:rPr>
-        <w:t>Este método presenta limitaciones significativas: requiere lectura individual y línea de visión</w:t>
-      </w:r>
-      <w:r>
-        <w:rPr>
-          <w:rFonts w:cs="Times New Roman"/>
-          <w:szCs w:val="24"/>
-        </w:rPr>
-        <w:t xml:space="preserve"> libro por libro</w:t>
-      </w:r>
-      <w:r>
-        <w:rPr>
-          <w:rFonts w:cs="Times New Roman"/>
-          <w:szCs w:val="24"/>
-        </w:rPr>
-        <w:t>, lo que hace que procesos como el préstamo, la devolución, el inventario y la búsqueda de ejemplares sean lentos, repetitivos y dependientes del personal de la biblioteca. Estas limitaciones generan congestión en los servicios de circulación, retrasos en la atención a los usuarios y dificultades para mantener una actualización en tiempo real de la disponibilidad de materiales.</w:t>
-      </w:r>
-    </w:p>
-    <w:p>
-      <w:pPr>
-        <w:ind w:firstLine="360"/>
-        <w:rPr>
-          <w:rFonts w:cs="Times New Roman"/>
-          <w:szCs w:val="24"/>
-        </w:rPr>
-      </w:pPr>
-      <w:r>
-        <w:rPr>
-          <w:rFonts w:cs="Times New Roman"/>
-          <w:szCs w:val="24"/>
-        </w:rPr>
-        <w:t>A lo anterior se suma el riesgo de extravío o pérdida de libros, así como la dificultad para detectar salidas no autorizadas, pues los sistemas de seguridad tradicionales presentan baja efectividad frente a la complejidad actual de la gestión de colecciones. Esto impacta no solo la seguridad del material bibliográfico, sino también la experiencia del estudiante y del docente, quienes demandan procesos más ágiles, confiables y alineados con el entorno tecnológico actual.</w:t>
-      </w:r>
-    </w:p>
-    <w:p>
-      <w:pPr>
-        <w:ind w:firstLine="360"/>
-        <w:rPr>
-          <w:rFonts w:cs="Times New Roman"/>
-          <w:szCs w:val="24"/>
-        </w:rPr>
-      </w:pPr>
-      <w:r>
-        <w:rPr>
-          <w:rFonts w:cs="Times New Roman"/>
-          <w:szCs w:val="24"/>
-        </w:rPr>
-        <w:t>Diversos estudios demuestran que la tecnología RFID ofrece ventajas significativas frente a los sistemas tradicionales, ya que permite la lectura simultánea de múltiples ejemplares, la automatización de préstamos y devoluciones, la gestión de inventario en tiempo real y el fortalecimiento de la seguridad de las colecciones. Sin embargo, su adopción en instituciones educativas como la IUSH se ha visto limitada por los costos iniciales, la necesidad de infraestructura adecuada, la capacitación del personal y las dudas en torno a la integración con los sistemas existentes.</w:t>
-      </w:r>
-    </w:p>
-    <w:p>
-      <w:pPr>
-        <w:ind w:firstLine="360"/>
-        <w:rPr>
-          <w:rFonts w:cs="Times New Roman"/>
-          <w:szCs w:val="24"/>
-        </w:rPr>
-      </w:pPr>
-      <w:r>
-        <w:rPr>
-          <w:rFonts w:cs="Times New Roman"/>
-          <w:szCs w:val="24"/>
-        </w:rPr>
-        <w:t>En este contexto, surge la necesidad de diseñar un sistema RFID adaptado a la biblioteca Monseñor Héctor Rueda Hernández, que permita optimizar el control e identificación de los libros, mejorar los procesos de circulación e inventario, y garantizar la seguridad de la colección, contribuyendo así al fortalecimiento de la gestión bibliotecaria de la IUSH y a la satisfacción de su comunidad académica.</w:t>
-      </w:r>
-    </w:p>
-    <w:p>
-      <w:pPr>
-        <w:ind w:firstLine="360"/>
-        <w:rPr>
-          <w:rFonts w:cs="Times New Roman"/>
-          <w:szCs w:val="24"/>
-        </w:rPr>
-      </w:pPr>
-      <w:r>
-        <w:rPr>
-          <w:rFonts w:cs="Times New Roman"/>
-          <w:szCs w:val="24"/>
-        </w:rPr>
-        <w:lastRenderedPageBreak/>
-        <w:t>En este contexto, surge la siguiente pregunta problema:</w:t>
-      </w:r>
-    </w:p>
-    <w:p>
-      <w:pPr>
-        <w:ind w:firstLine="360"/>
-        <w:rPr>
-          <w:rFonts w:cs="Times New Roman"/>
-          <w:szCs w:val="24"/>
-        </w:rPr>
-      </w:pPr>
-      <w:r>
-        <w:rPr>
-          <w:rFonts w:cs="Times New Roman"/>
-          <w:szCs w:val="24"/>
-        </w:rPr>
-        <w:t>¿Cómo implementar un sistema de identificación por radiofrecuencia (RFID) que permita el control eficiente, seguro y automatizado de libros en bibliotecas, superando las limitaciones de los métodos tradicionales de identificación, mejorando</w:t>
-      </w:r>
-      <w:r>
-        <w:rPr>
-          <w:rFonts w:cs="Times New Roman"/>
-          <w:szCs w:val="24"/>
-        </w:rPr>
-        <w:t xml:space="preserve"> así</w:t>
-      </w:r>
-      <w:r>
-        <w:rPr>
-          <w:rFonts w:cs="Times New Roman"/>
-          <w:szCs w:val="24"/>
-        </w:rPr>
-        <w:t xml:space="preserve"> la trazabilidad, el acceso y la gestión del inventario?</w:t>
-      </w:r>
-    </w:p>
-    <w:p>
-      <w:pPr>
-        <w:spacing w:after="160" w:line="259" w:lineRule="auto"/>
-        <w:jc w:val="left"/>
-        <w:rPr>
-          <w:b/>
-        </w:rPr>
-      </w:pPr>
-      <w:bookmarkStart w:id="26" w:name="_Toc440985132"/>
-    </w:p>
-    <w:p>
-      <w:pPr>
-        <w:jc w:val="center"/>
-        <w:rPr>
-          <w:b/>
-          <w:bCs/>
-        </w:rPr>
-      </w:pPr>
-      <w:r>
-        <w:rPr>
-          <w:b/>
-          <w:bCs/>
-        </w:rPr>
-        <w:t>5</w:t>
-      </w:r>
-      <w:r>
-        <w:rPr>
-          <w:b/>
-          <w:bCs/>
-        </w:rPr>
-        <w:t xml:space="preserve"> </w:t>
-      </w:r>
-      <w:commentRangeStart w:id="27"/>
-      <w:commentRangeStart w:id="28"/>
-      <w:r>
-        <w:rPr>
-          <w:b/>
-          <w:bCs/>
-        </w:rPr>
-        <w:t>H</w:t>
-      </w:r>
-      <w:commentRangeEnd w:id="28"/>
+        <w:t>4</w:t>
+      </w:r>
+      <w:commentRangeEnd w:id="30"/>
       <w:r>
         <w:rPr>
           <w:rStyle w:val="Refdecomentario"/>
@@ -5409,36 +5627,26 @@
           <w:bCs/>
           <w:sz w:val="24"/>
           <w:szCs w:val="22"/>
-        </w:rPr>
-        <w:commentReference w:id="28"/>
+          <w:highlight w:val="red"/>
+        </w:rPr>
+        <w:commentReference w:id="30"/>
       </w:r>
       <w:r>
         <w:rPr>
           <w:b/>
           <w:bCs/>
-        </w:rPr>
-        <w:t>ipótesis</w:t>
-      </w:r>
-      <w:bookmarkEnd w:id="26"/>
-      <w:commentRangeEnd w:id="27"/>
-      <w:r>
-        <w:rPr>
-          <w:rStyle w:val="Refdecomentario"/>
+          <w:highlight w:val="red"/>
+        </w:rPr>
+        <w:t xml:space="preserve"> </w:t>
+      </w:r>
+      <w:r>
+        <w:rPr>
           <w:b/>
           <w:bCs/>
-          <w:sz w:val="24"/>
-          <w:szCs w:val="22"/>
-        </w:rPr>
-        <w:commentReference w:id="27"/>
-      </w:r>
-    </w:p>
-    <w:p>
-      <w:pPr>
-        <w:rPr>
-          <w:rFonts w:cs="Times New Roman"/>
-          <w:szCs w:val="24"/>
-        </w:rPr>
-      </w:pPr>
+          <w:highlight w:val="red"/>
+        </w:rPr>
+        <w:t>Problema de investigación</w:t>
+      </w:r>
     </w:p>
     <w:p>
       <w:pPr>
@@ -5448,6 +5656,198 @@
           <w:szCs w:val="24"/>
         </w:rPr>
       </w:pPr>
+    </w:p>
+    <w:p>
+      <w:pPr>
+        <w:ind w:firstLine="360"/>
+        <w:rPr>
+          <w:rFonts w:cs="Times New Roman"/>
+          <w:szCs w:val="24"/>
+        </w:rPr>
+      </w:pPr>
+      <w:r>
+        <w:rPr>
+          <w:rFonts w:cs="Times New Roman"/>
+          <w:szCs w:val="24"/>
+        </w:rPr>
+        <w:t>La biblioteca Monseñor Héctor Rueda Hernández de la Institución Universitaria Salazar y Herrera (IUSH) cumple un papel fundamental en el apoyo a los procesos académicos, investigativos y culturales de la comunidad universitaria. Sin embargo, enfrenta dificultades en la gestión y control de su colección bibliográfica, debido a que los sistemas tradicionales de identificación y préstamo de libros se basan principalmente en códigos de barras.</w:t>
+      </w:r>
+    </w:p>
+    <w:p>
+      <w:pPr>
+        <w:ind w:firstLine="360"/>
+        <w:rPr>
+          <w:rFonts w:cs="Times New Roman"/>
+          <w:szCs w:val="24"/>
+        </w:rPr>
+      </w:pPr>
+      <w:r>
+        <w:rPr>
+          <w:rFonts w:cs="Times New Roman"/>
+          <w:szCs w:val="24"/>
+        </w:rPr>
+        <w:t>Este método presenta limitaciones significativas: requiere lectura individual y línea de visión</w:t>
+      </w:r>
+      <w:r>
+        <w:rPr>
+          <w:rFonts w:cs="Times New Roman"/>
+          <w:szCs w:val="24"/>
+        </w:rPr>
+        <w:t xml:space="preserve"> libro por libro</w:t>
+      </w:r>
+      <w:r>
+        <w:rPr>
+          <w:rFonts w:cs="Times New Roman"/>
+          <w:szCs w:val="24"/>
+        </w:rPr>
+        <w:t>, lo que hace que procesos como el préstamo, la devolución, el inventario y la búsqueda de ejemplares sean lentos, repetitivos y dependientes del personal de la biblioteca. Estas limitaciones generan congestión en los servicios de circulación, retrasos en la atención a los usuarios y dificultades para mantener una actualización en tiempo real de la disponibilidad de materiales.</w:t>
+      </w:r>
+    </w:p>
+    <w:p>
+      <w:pPr>
+        <w:ind w:firstLine="360"/>
+        <w:rPr>
+          <w:rFonts w:cs="Times New Roman"/>
+          <w:szCs w:val="24"/>
+        </w:rPr>
+      </w:pPr>
+      <w:r>
+        <w:rPr>
+          <w:rFonts w:cs="Times New Roman"/>
+          <w:szCs w:val="24"/>
+        </w:rPr>
+        <w:t>A lo anterior se suma el riesgo de extravío o pérdida de libros, así como la dificultad para detectar salidas no autorizadas, pues los sistemas de seguridad tradicionales presentan baja efectividad frente a la complejidad actual de la gestión de colecciones. Esto impacta no solo la seguridad del material bibliográfico, sino también la experiencia del estudiante y del docente, quienes demandan procesos más ágiles, confiables y alineados con el entorno tecnológico actual.</w:t>
+      </w:r>
+    </w:p>
+    <w:p>
+      <w:pPr>
+        <w:ind w:firstLine="360"/>
+        <w:rPr>
+          <w:rFonts w:cs="Times New Roman"/>
+          <w:szCs w:val="24"/>
+        </w:rPr>
+      </w:pPr>
+      <w:r>
+        <w:rPr>
+          <w:rFonts w:cs="Times New Roman"/>
+          <w:szCs w:val="24"/>
+        </w:rPr>
+        <w:t>Diversos estudios demuestran que la tecnología RFID ofrece ventajas significativas frente a los sistemas tradicionales, ya que permite la lectura simultánea de múltiples ejemplares, la automatización de préstamos y devoluciones, la gestión de inventario en tiempo real y el fortalecimiento de la seguridad de las colecciones. Sin embargo, su adopción en instituciones educativas como la IUSH se ha visto limitada por los costos iniciales, la necesidad de infraestructura adecuada, la capacitación del personal y las dudas en torno a la integración con los sistemas existentes.</w:t>
+      </w:r>
+    </w:p>
+    <w:p>
+      <w:pPr>
+        <w:ind w:firstLine="360"/>
+        <w:rPr>
+          <w:rFonts w:cs="Times New Roman"/>
+          <w:szCs w:val="24"/>
+        </w:rPr>
+      </w:pPr>
+      <w:r>
+        <w:rPr>
+          <w:rFonts w:cs="Times New Roman"/>
+          <w:szCs w:val="24"/>
+        </w:rPr>
+        <w:t>En este contexto, surge la necesidad de diseñar un sistema RFID adaptado a la biblioteca Monseñor Héctor Rueda Hernández, que permita optimizar el control e identificación de los libros, mejorar los procesos de circulación e inventario, y garantizar la seguridad de la colección, contribuyendo así al fortalecimiento de la gestión bibliotecaria de la IUSH y a la satisfacción de su comunidad académica.</w:t>
+      </w:r>
+    </w:p>
+    <w:p>
+      <w:pPr>
+        <w:ind w:firstLine="360"/>
+        <w:rPr>
+          <w:rFonts w:cs="Times New Roman"/>
+          <w:szCs w:val="24"/>
+        </w:rPr>
+      </w:pPr>
+      <w:r>
+        <w:rPr>
+          <w:rFonts w:cs="Times New Roman"/>
+          <w:szCs w:val="24"/>
+        </w:rPr>
+        <w:lastRenderedPageBreak/>
+        <w:t>En este contexto, surge la siguiente pregunta problema:</w:t>
+      </w:r>
+    </w:p>
+    <w:p>
+      <w:pPr>
+        <w:ind w:firstLine="360"/>
+        <w:rPr>
+          <w:rFonts w:cs="Times New Roman"/>
+          <w:szCs w:val="24"/>
+        </w:rPr>
+      </w:pPr>
+      <w:r>
+        <w:rPr>
+          <w:rFonts w:cs="Times New Roman"/>
+          <w:szCs w:val="24"/>
+        </w:rPr>
+        <w:t>¿Cómo implementar un sistema de identificación por radiofrecuencia (RFID) que permita el control eficiente, seguro y automatizado de libros en bibliotecas, superando las limitaciones de los métodos tradicionales de identificación, mejorando</w:t>
+      </w:r>
+      <w:r>
+        <w:rPr>
+          <w:rFonts w:cs="Times New Roman"/>
+          <w:szCs w:val="24"/>
+        </w:rPr>
+        <w:t xml:space="preserve"> así</w:t>
+      </w:r>
+      <w:r>
+        <w:rPr>
+          <w:rFonts w:cs="Times New Roman"/>
+          <w:szCs w:val="24"/>
+        </w:rPr>
+        <w:t xml:space="preserve"> la trazabilidad, el acceso y la gestión del inventario?</w:t>
+      </w:r>
+    </w:p>
+    <w:p>
+      <w:pPr>
+        <w:spacing w:after="160" w:line="259" w:lineRule="auto"/>
+        <w:jc w:val="left"/>
+        <w:rPr>
+          <w:b/>
+        </w:rPr>
+      </w:pPr>
+      <w:bookmarkStart w:id="31" w:name="_Toc440985132"/>
+    </w:p>
+    <w:p>
+      <w:pPr>
+        <w:jc w:val="center"/>
+        <w:rPr>
+          <w:b/>
+          <w:bCs/>
+        </w:rPr>
+      </w:pPr>
+      <w:r>
+        <w:rPr>
+          <w:b/>
+          <w:bCs/>
+        </w:rPr>
+        <w:t>5</w:t>
+      </w:r>
+      <w:r>
+        <w:rPr>
+          <w:b/>
+          <w:bCs/>
+        </w:rPr>
+        <w:t xml:space="preserve"> Hipótesis</w:t>
+      </w:r>
+      <w:bookmarkEnd w:id="31"/>
+    </w:p>
+    <w:p>
+      <w:pPr>
+        <w:rPr>
+          <w:rFonts w:cs="Times New Roman"/>
+          <w:szCs w:val="24"/>
+        </w:rPr>
+      </w:pPr>
+    </w:p>
+    <w:p>
+      <w:pPr>
+        <w:ind w:firstLine="708"/>
+        <w:rPr>
+          <w:rFonts w:cs="Times New Roman"/>
+          <w:szCs w:val="24"/>
+        </w:rPr>
+      </w:pPr>
       <w:r>
         <w:rPr>
           <w:rFonts w:cs="Times New Roman"/>
@@ -5472,7 +5872,7 @@
           <w:b/>
         </w:rPr>
       </w:pPr>
-      <w:bookmarkStart w:id="29" w:name="_Toc440985134"/>
+      <w:bookmarkStart w:id="32" w:name="_Toc440985134"/>
       <w:r>
         <w:rPr>
           <w:b/>
@@ -5483,7 +5883,19 @@
         <w:rPr>
           <w:b/>
         </w:rPr>
-        <w:t xml:space="preserve">.2 Hipótesis </w:t>
+        <w:t>.</w:t>
+      </w:r>
+      <w:r>
+        <w:rPr>
+          <w:b/>
+        </w:rPr>
+        <w:t>1</w:t>
+      </w:r>
+      <w:r>
+        <w:rPr>
+          <w:b/>
+        </w:rPr>
+        <w:t xml:space="preserve"> Hipótesis </w:t>
       </w:r>
       <w:r>
         <w:rPr>
@@ -5497,7 +5909,7 @@
         </w:rPr>
         <w:t>stadística</w:t>
       </w:r>
-      <w:bookmarkEnd w:id="29"/>
+      <w:bookmarkEnd w:id="32"/>
     </w:p>
     <w:p>
       <w:pPr>
@@ -5678,6 +6090,22 @@
       <w:pPr>
         <w:rPr>
           <w:rFonts w:cs="Times New Roman"/>
+          <w:szCs w:val="24"/>
+        </w:rPr>
+      </w:pPr>
+    </w:p>
+    <w:p>
+      <w:pPr>
+        <w:rPr>
+          <w:rFonts w:cs="Times New Roman"/>
+          <w:szCs w:val="24"/>
+        </w:rPr>
+      </w:pPr>
+    </w:p>
+    <w:p>
+      <w:pPr>
+        <w:rPr>
+          <w:rFonts w:cs="Times New Roman"/>
           <w:b/>
           <w:szCs w:val="24"/>
         </w:rPr>
@@ -5687,24 +6115,15 @@
       <w:pPr>
         <w:jc w:val="center"/>
         <w:rPr>
-          <w:rFonts w:cs="Times New Roman"/>
-          <w:b/>
-          <w:szCs w:val="24"/>
-        </w:rPr>
-      </w:pPr>
-    </w:p>
-    <w:p>
-      <w:pPr>
-        <w:jc w:val="center"/>
-        <w:rPr>
-          <w:b/>
-        </w:rPr>
-      </w:pPr>
-      <w:bookmarkStart w:id="30" w:name="_Toc440985137"/>
-      <w:r>
-        <w:rPr>
-          <w:b/>
-        </w:rPr>
+          <w:b/>
+        </w:rPr>
+      </w:pPr>
+      <w:bookmarkStart w:id="33" w:name="_Toc440985137"/>
+      <w:r>
+        <w:rPr>
+          <w:b/>
+        </w:rPr>
+        <w:lastRenderedPageBreak/>
         <w:t>6</w:t>
       </w:r>
       <w:r>
@@ -5725,7 +6144,7 @@
         </w:rPr>
         <w:t>eórico</w:t>
       </w:r>
-      <w:bookmarkEnd w:id="30"/>
+      <w:bookmarkEnd w:id="33"/>
     </w:p>
     <w:p>
       <w:pPr>
@@ -5819,7 +6238,7 @@
           <w:b/>
         </w:rPr>
       </w:pPr>
-      <w:bookmarkStart w:id="31" w:name="_Toc440985138"/>
+      <w:bookmarkStart w:id="34" w:name="_Toc440985138"/>
       <w:r>
         <w:rPr>
           <w:b/>
@@ -5839,16 +6258,16 @@
         </w:rPr>
         <w:t xml:space="preserve"> </w:t>
       </w:r>
-      <w:bookmarkStart w:id="32" w:name="_Toc440985139"/>
+      <w:bookmarkStart w:id="35" w:name="_Toc440985139"/>
       <w:r>
         <w:rPr>
           <w:b/>
         </w:rPr>
         <w:t>Metodología</w:t>
       </w:r>
-      <w:bookmarkEnd w:id="32"/>
-    </w:p>
-    <w:bookmarkEnd w:id="31"/>
+      <w:bookmarkEnd w:id="35"/>
+    </w:p>
+    <w:bookmarkEnd w:id="34"/>
     <w:p>
       <w:pPr>
         <w:rPr>
@@ -6221,7 +6640,7 @@
           <w:noProof/>
         </w:rPr>
         <w:drawing>
-          <wp:inline distT="0" distB="0" distL="0" distR="0" wp14:anchorId="607205E3" wp14:editId="748872D1">
+          <wp:inline distT="0" distB="0" distL="0" distR="0" wp14:anchorId="607205E3" wp14:editId="264D1E54">
             <wp:extent cx="4711700" cy="5225896"/>
             <wp:effectExtent l="0" t="0" r="0" b="0"/>
             <wp:docPr id="1622224241" name="Imagen 2"/>
@@ -6364,7 +6783,7 @@
           <w:bCs/>
         </w:rPr>
       </w:pPr>
-      <w:bookmarkStart w:id="33" w:name="_Toc440985140"/>
+      <w:bookmarkStart w:id="36" w:name="_Toc440985140"/>
       <w:r>
         <w:rPr>
           <w:b/>
@@ -6380,7 +6799,7 @@
         </w:rPr>
         <w:t xml:space="preserve"> Resultados</w:t>
       </w:r>
-      <w:bookmarkEnd w:id="33"/>
+      <w:bookmarkEnd w:id="36"/>
     </w:p>
     <w:p>
       <w:pPr>
@@ -6428,7 +6847,7 @@
         </w:rPr>
         <w:t xml:space="preserve">, proyecto o investigación. Aquí se pueden incluir tablas, figuras, diagramas y demás material demostrativo. </w:t>
       </w:r>
-      <w:bookmarkStart w:id="34" w:name="_Ref57038153"/>
+      <w:bookmarkStart w:id="37" w:name="_Ref57038153"/>
     </w:p>
     <w:p>
       <w:pPr>
@@ -6438,8 +6857,8 @@
           <w:b/>
         </w:rPr>
       </w:pPr>
-      <w:bookmarkStart w:id="35" w:name="_Toc440985141"/>
-      <w:bookmarkEnd w:id="34"/>
+      <w:bookmarkStart w:id="38" w:name="_Toc440985141"/>
+      <w:bookmarkEnd w:id="37"/>
       <w:r>
         <w:rPr>
           <w:b/>
@@ -6470,7 +6889,7 @@
         </w:rPr>
         <w:t xml:space="preserve"> Discusión</w:t>
       </w:r>
-      <w:bookmarkEnd w:id="35"/>
+      <w:bookmarkEnd w:id="38"/>
     </w:p>
     <w:p>
       <w:pPr>
@@ -6536,7 +6955,7 @@
           <w:bCs/>
         </w:rPr>
       </w:pPr>
-      <w:bookmarkStart w:id="36" w:name="_Toc440985142"/>
+      <w:bookmarkStart w:id="39" w:name="_Toc440985142"/>
       <w:r>
         <w:rPr>
           <w:b/>
@@ -6552,7 +6971,7 @@
         </w:rPr>
         <w:t xml:space="preserve"> Conclusiones</w:t>
       </w:r>
-      <w:bookmarkEnd w:id="36"/>
+      <w:bookmarkEnd w:id="39"/>
     </w:p>
     <w:p>
       <w:pPr>
@@ -6975,30 +7394,30 @@
       <w:pPr>
         <w:pStyle w:val="Ttulo1"/>
       </w:pPr>
-      <w:bookmarkStart w:id="37" w:name="_Toc440985143"/>
-      <w:bookmarkStart w:id="38" w:name="_Toc758643157"/>
+      <w:bookmarkStart w:id="40" w:name="_Toc440985143"/>
+      <w:bookmarkStart w:id="41" w:name="_Toc758643157"/>
       <w:r>
         <w:br w:type="page"/>
       </w:r>
-      <w:commentRangeStart w:id="39"/>
+      <w:commentRangeStart w:id="42"/>
       <w:r>
         <w:lastRenderedPageBreak/>
         <w:t>R</w:t>
       </w:r>
-      <w:commentRangeEnd w:id="39"/>
+      <w:commentRangeEnd w:id="42"/>
       <w:r>
         <w:rPr>
           <w:rStyle w:val="Refdecomentario"/>
           <w:sz w:val="24"/>
           <w:szCs w:val="32"/>
         </w:rPr>
-        <w:commentReference w:id="39"/>
+        <w:commentReference w:id="42"/>
       </w:r>
       <w:r>
         <w:t>eferencias</w:t>
       </w:r>
-      <w:bookmarkEnd w:id="37"/>
-      <w:bookmarkEnd w:id="38"/>
+      <w:bookmarkEnd w:id="40"/>
+      <w:bookmarkEnd w:id="41"/>
     </w:p>
     <w:p/>
     <w:sdt>
@@ -8404,45 +8823,95 @@
             <w:adjustRightInd w:val="0"/>
             <w:ind w:left="480" w:hanging="480"/>
             <w:rPr>
+              <w:i/>
+              <w:iCs/>
+              <w:noProof/>
+            </w:rPr>
+          </w:pPr>
+          <w:r>
+            <w:rPr>
               <w:rFonts w:cs="Times New Roman"/>
               <w:noProof/>
               <w:lang w:val="en-US"/>
             </w:rPr>
-          </w:pPr>
+            <w:t xml:space="preserve">Khair, N., Yusof, N. A., Ariff, M. H., Wahab, M. A., &amp; Bari, M. F. (2022). </w:t>
+          </w:r>
           <w:r>
+            <w:rPr>
+              <w:i/>
+              <w:iCs/>
+              <w:noProof/>
+            </w:rPr>
+            <w:t>(S/f). Researchgate.net. Recuperado el 15 de marzo de 2026, de https://www.researchgate.net/profile/Iyinoluwa-Oyelade/publication/390212295_IMPLEMENTATION_OF_INTERNET_OF_THINGS_IoT_LIBRARY_SYSTEM_IN_NIGERIAN_UNIVERSITIES/links/67ec569c9b1c6c48776d35c4/IMPLEMENTATION-OF-INTERNET-OF-THINGS-IoT-LIBRARY-SYSTEM-IN-NIGERIAN-UNIVERSITIES.pdf</w:t>
+          </w:r>
+        </w:p>
+        <w:p>
+          <w:pPr>
+            <w:widowControl w:val="0"/>
+            <w:autoSpaceDE w:val="0"/>
+            <w:autoSpaceDN w:val="0"/>
+            <w:adjustRightInd w:val="0"/>
+            <w:ind w:left="480" w:hanging="480"/>
             <w:rPr>
               <w:rFonts w:cs="Times New Roman"/>
               <w:noProof/>
               <w:lang w:val="en-US"/>
             </w:rPr>
-            <w:t xml:space="preserve">Khair, N., Yusof, N. A., Ariff, M. H., Wahab, M. A., &amp; Bari, M. F. (2022). </w:t>
-          </w:r>
-          <w:r>
-            <w:rPr>
-              <w:rFonts w:cs="Times New Roman"/>
-              <w:i/>
-              <w:iCs/>
-              <w:noProof/>
-              <w:lang w:val="en-US"/>
-            </w:rPr>
-            <w:t>Recent advances and open challenges in RFID antenna applications.</w:t>
-          </w:r>
+          </w:pPr>
           <w:r>
             <w:rPr>
               <w:rFonts w:cs="Times New Roman"/>
               <w:noProof/>
               <w:lang w:val="en-US"/>
             </w:rPr>
-            <w:t xml:space="preserve"> International Journal of Advanced Computer Science and Applications, 13(5), 45–53.</w:t>
+            <w:t>International Journal of Advanced Computer Science and Applications, 13(5), 45–53.</w:t>
           </w:r>
+        </w:p>
+        <w:p>
+          <w:pPr>
+            <w:widowControl w:val="0"/>
+            <w:autoSpaceDE w:val="0"/>
+            <w:autoSpaceDN w:val="0"/>
+            <w:adjustRightInd w:val="0"/>
+            <w:ind w:left="480" w:hanging="480"/>
+            <w:rPr>
+              <w:rFonts w:cs="Times New Roman"/>
+              <w:noProof/>
+            </w:rPr>
+          </w:pPr>
+          <w:r>
+            <w:rPr>
+              <w:rFonts w:cs="Times New Roman"/>
+              <w:noProof/>
+            </w:rPr>
+            <w:t>(S/f). Cloudfront.net. Recuperado el 15 de marzo de 2026, de https://d1wqtxts1xzle7.cloudfront.net/125469756/KEDLD2025_1_-libre.pdf?1763778070=&amp;response-content-disposition=inline%3B+filename%3DNational_Digital_Library_of_India_NDLI_a.pdf&amp;Expires=1773545232&amp;Signature=SptK-SVemPZLkKjo17LI28xozvbsPaMyhdi68fWj7hLZ6kL-Icx7hhRaOwaO1DTS5ecWR-825jjN-YNxrPQPH6VCJJ5AWxkulteCTx-</w:t>
+          </w:r>
+          <w:r>
+            <w:rPr>
+              <w:rFonts w:cs="Times New Roman"/>
+              <w:noProof/>
+            </w:rPr>
+            <w:lastRenderedPageBreak/>
+            <w:t>QyHjxqqCJMlG6jqd6yYmBi7q6pxawN4jWdegDeJxqvlFl4qh6jaW-uZBJ7d7~xG0mXb0xy0Jt5IXpxQDyBUyi5y~vFseQ2idd36TnQdL1z3xe7xf6eyKlFZeTRzr-HU1o9SDD7SiZEk1--AQ2UVFgHnKfq0~RoNWg-igbK71b1v3LcVxAodNWIsLBfp3lvTxrD6KkHVWqStlvC2GNwq2Iz4Yk9VMgxYbJECgbGEeukUJeow__&amp;Key-Pair-Id=APKAJLOHF5GGSLRBV4ZA</w:t>
+          </w:r>
+        </w:p>
+        <w:p>
+          <w:pPr>
+            <w:widowControl w:val="0"/>
+            <w:autoSpaceDE w:val="0"/>
+            <w:autoSpaceDN w:val="0"/>
+            <w:adjustRightInd w:val="0"/>
+            <w:ind w:left="480" w:hanging="480"/>
+            <w:rPr>
+              <w:rFonts w:cs="Times New Roman"/>
+              <w:noProof/>
+            </w:rPr>
+          </w:pPr>
         </w:p>
         <w:p>
           <w:pPr>
             <w:pStyle w:val="Bibliografa"/>
             <w:ind w:left="720" w:hanging="720"/>
-            <w:rPr>
-              <w:lang w:val="en-US"/>
-            </w:rPr>
           </w:pPr>
           <w:r>
             <w:rPr>
@@ -8500,15 +8969,15 @@
           <w:b/>
         </w:rPr>
       </w:pPr>
-      <w:bookmarkStart w:id="40" w:name="_Toc440985144"/>
-      <w:commentRangeStart w:id="41"/>
+      <w:bookmarkStart w:id="43" w:name="_Toc440985144"/>
+      <w:commentRangeStart w:id="44"/>
       <w:r>
         <w:rPr>
           <w:b/>
         </w:rPr>
         <w:t>A</w:t>
       </w:r>
-      <w:commentRangeEnd w:id="41"/>
+      <w:commentRangeEnd w:id="44"/>
       <w:r>
         <w:rPr>
           <w:rStyle w:val="Refdecomentario"/>
@@ -8516,7 +8985,7 @@
           <w:sz w:val="24"/>
           <w:szCs w:val="22"/>
         </w:rPr>
-        <w:commentReference w:id="41"/>
+        <w:commentReference w:id="44"/>
       </w:r>
       <w:r>
         <w:rPr>
@@ -8524,7 +8993,7 @@
         </w:rPr>
         <w:t>nexos</w:t>
       </w:r>
-      <w:bookmarkEnd w:id="40"/>
+      <w:bookmarkEnd w:id="43"/>
     </w:p>
     <w:p>
       <w:pPr>
@@ -9434,16 +9903,7 @@
         <w:annotationRef/>
       </w:r>
       <w:r>
-        <w:t xml:space="preserve">Marca todos los capítulos y subcapítulos dependiendo de los niveles que se utilicen en norma APA, en la ruta: </w:t>
-      </w:r>
-      <w:r>
-        <w:rPr>
-          <w:b/>
-        </w:rPr>
-        <w:t>Inicio</w:t>
-      </w:r>
-      <w:r>
-        <w:t xml:space="preserve"> &gt; Nivel 1 APA, Nivel 2 APA, Nivel 3 APA, Nivel 4 APA, Nivel 5 APA.</w:t>
+        <w:t>Si no vas a utilizar esta nota al pie, elimínala. Si vas a utilizar la segunda nota al pie o subsiguientes, insértalas así:</w:t>
       </w:r>
     </w:p>
     <w:p>
@@ -9456,11 +9916,11 @@
         <w:pStyle w:val="Textocomentario"/>
       </w:pPr>
       <w:r>
-        <w:t>Si tienes dudas, solicita asesoría en Biblioteca.</w:t>
+        <w:t>Referencias &gt; Insertar nota al pie (Word lleva la numeración automática).</w:t>
       </w:r>
     </w:p>
   </w:comment>
-  <w:comment w:id="18" w:author="Autor" w:initials="A">
+  <w:comment w:id="19" w:author="Autor" w:initials="A">
     <w:p>
       <w:pPr>
         <w:pStyle w:val="Textocomentario"/>
@@ -9472,20 +9932,7 @@
         <w:annotationRef/>
       </w:r>
       <w:r>
-        <w:t>Si no vas a utilizar esta nota al pie, elimínala. Si vas a utilizar la segunda nota al pie o subsiguientes, insértalas así:</w:t>
-      </w:r>
-    </w:p>
-    <w:p>
-      <w:pPr>
-        <w:pStyle w:val="Textocomentario"/>
-      </w:pPr>
-    </w:p>
-    <w:p>
-      <w:pPr>
-        <w:pStyle w:val="Textocomentario"/>
-      </w:pPr>
-      <w:r>
-        <w:t>Referencias &gt; Insertar nota al pie (Word lleva la numeración automática).</w:t>
+        <w:t>Actualizar cita</w:t>
       </w:r>
     </w:p>
   </w:comment>
@@ -9493,7 +9940,6 @@
     <w:p>
       <w:pPr>
         <w:pStyle w:val="Textocomentario"/>
-        <w:jc w:val="left"/>
       </w:pPr>
       <w:r>
         <w:rPr>
@@ -9502,27 +9948,23 @@
         <w:annotationRef/>
       </w:r>
       <w:r>
-        <w:t xml:space="preserve">En bibliotecas suele usarse </w:t>
-      </w:r>
-      <w:r>
-        <w:rPr>
-          <w:b/>
-          <w:bCs/>
-        </w:rPr>
-        <w:t>HF (13,56 MHz, ISO 15693/18000-3)</w:t>
-      </w:r>
-      <w:r>
-        <w:t xml:space="preserve"> por su buen acoplamiento cercano y menor apantallamiento por papel; para patios/logística domina </w:t>
-      </w:r>
-      <w:r>
-        <w:rPr>
-          <w:b/>
-          <w:bCs/>
-        </w:rPr>
-        <w:t>UHF (ISO 18000-63 / EPC Gen2)</w:t>
-      </w:r>
-      <w:r>
-        <w:t xml:space="preserve"> por mayor alcance. </w:t>
+        <w:t>Actualizar fecha</w:t>
+      </w:r>
+    </w:p>
+  </w:comment>
+  <w:comment w:id="21" w:author="Autor" w:initials="A">
+    <w:p>
+      <w:pPr>
+        <w:pStyle w:val="Textocomentario"/>
+      </w:pPr>
+      <w:r>
+        <w:rPr>
+          <w:rStyle w:val="Refdecomentario"/>
+        </w:rPr>
+        <w:annotationRef/>
+      </w:r>
+      <w:r>
+        <w:t>Actualizar fecha</w:t>
       </w:r>
     </w:p>
   </w:comment>
@@ -9538,6 +9980,54 @@
         <w:annotationRef/>
       </w:r>
       <w:r>
+        <w:t>Actualizar fecha</w:t>
+      </w:r>
+    </w:p>
+  </w:comment>
+  <w:comment w:id="23" w:author="Autor" w:initials="A">
+    <w:p>
+      <w:pPr>
+        <w:pStyle w:val="Textocomentario"/>
+      </w:pPr>
+      <w:r>
+        <w:rPr>
+          <w:rStyle w:val="Refdecomentario"/>
+        </w:rPr>
+        <w:annotationRef/>
+      </w:r>
+      <w:r>
+        <w:t>Actualizar fecha</w:t>
+      </w:r>
+    </w:p>
+  </w:comment>
+  <w:comment w:id="24" w:author="Autor" w:initials="A">
+    <w:p>
+      <w:pPr>
+        <w:pStyle w:val="Textocomentario"/>
+      </w:pPr>
+      <w:r>
+        <w:rPr>
+          <w:rStyle w:val="Refdecomentario"/>
+        </w:rPr>
+        <w:annotationRef/>
+      </w:r>
+      <w:r>
+        <w:t>Actualizar fecha</w:t>
+      </w:r>
+    </w:p>
+  </w:comment>
+  <w:comment w:id="26" w:author="Autor" w:initials="A">
+    <w:p>
+      <w:pPr>
+        <w:pStyle w:val="Textocomentario"/>
+      </w:pPr>
+      <w:r>
+        <w:rPr>
+          <w:rStyle w:val="Refdecomentario"/>
+        </w:rPr>
+        <w:annotationRef/>
+      </w:r>
+      <w:r>
         <w:t>Entre párrafo y párrafo se debe utilizar 1 espacio sencillo.</w:t>
       </w:r>
     </w:p>
@@ -9547,11 +10037,89 @@
       </w:pPr>
     </w:p>
   </w:comment>
-  <w:comment w:id="28" w:author="Autor" w:initials="A">
+  <w:comment w:id="30" w:author="Autor" w:initials="A">
+    <w:p>
+      <w:pPr>
+        <w:pStyle w:val="NormalWeb"/>
+        <w:spacing w:before="0" w:beforeAutospacing="0" w:after="0" w:afterAutospacing="0" w:line="300" w:lineRule="atLeast"/>
+        <w:rPr>
+          <w:rFonts w:ascii="Segoe UI" w:hAnsi="Segoe UI" w:cs="Segoe UI"/>
+          <w:sz w:val="21"/>
+          <w:szCs w:val="21"/>
+        </w:rPr>
+      </w:pPr>
+      <w:r>
+        <w:rPr>
+          <w:rStyle w:val="Refdecomentario"/>
+        </w:rPr>
+        <w:annotationRef/>
+      </w:r>
+      <w:r>
+        <w:rPr>
+          <w:rFonts w:ascii="Segoe UI" w:hAnsi="Segoe UI" w:cs="Segoe UI"/>
+          <w:sz w:val="21"/>
+          <w:szCs w:val="21"/>
+        </w:rPr>
+        <w:t xml:space="preserve">El planteamiento del problema debe </w:t>
+      </w:r>
+      <w:r>
+        <w:rPr>
+          <w:rFonts w:ascii="Segoe UI" w:hAnsi="Segoe UI" w:cs="Segoe UI"/>
+          <w:sz w:val="21"/>
+          <w:szCs w:val="21"/>
+          <w:shd w:val="clear" w:color="auto" w:fill="FF0000"/>
+        </w:rPr>
+        <w:t>sus</w:t>
+      </w:r>
+      <w:r>
+        <w:rPr>
+          <w:rFonts w:ascii="Segoe UI" w:hAnsi="Segoe UI" w:cs="Segoe UI"/>
+          <w:sz w:val="21"/>
+          <w:szCs w:val="21"/>
+          <w:shd w:val="clear" w:color="auto" w:fill="FF0000"/>
+        </w:rPr>
+        <w:t>tentarse</w:t>
+      </w:r>
+      <w:r>
+        <w:rPr>
+          <w:rFonts w:ascii="Segoe UI" w:hAnsi="Segoe UI" w:cs="Segoe UI"/>
+          <w:sz w:val="21"/>
+          <w:szCs w:val="21"/>
+          <w:shd w:val="clear" w:color="auto" w:fill="FF0000"/>
+        </w:rPr>
+        <w:t xml:space="preserve"> con datos o evidencia académic</w:t>
+      </w:r>
+      <w:r>
+        <w:rPr>
+          <w:rFonts w:ascii="Segoe UI" w:hAnsi="Segoe UI" w:cs="Segoe UI"/>
+          <w:sz w:val="21"/>
+          <w:szCs w:val="21"/>
+        </w:rPr>
+        <w:t xml:space="preserve">a. </w:t>
+      </w:r>
+    </w:p>
+    <w:p>
+      <w:pPr>
+        <w:pStyle w:val="NormalWeb"/>
+        <w:spacing w:before="0" w:beforeAutospacing="0" w:after="0" w:afterAutospacing="0" w:line="300" w:lineRule="atLeast"/>
+        <w:rPr>
+          <w:rFonts w:ascii="Segoe UI" w:hAnsi="Segoe UI" w:cs="Segoe UI"/>
+          <w:sz w:val="21"/>
+          <w:szCs w:val="21"/>
+        </w:rPr>
+      </w:pPr>
+    </w:p>
     <w:p>
       <w:pPr>
         <w:pStyle w:val="Textocomentario"/>
       </w:pPr>
+    </w:p>
+  </w:comment>
+  <w:comment w:id="42" w:author="Autor" w:initials="A">
+    <w:p>
+      <w:pPr>
+        <w:pStyle w:val="Textocomentario"/>
+      </w:pPr>
       <w:r>
         <w:rPr>
           <w:rStyle w:val="Refdecomentario"/>
@@ -9560,24 +10128,36 @@
       </w:r>
       <w:r>
         <w:rPr>
-          <w:b/>
-        </w:rPr>
-        <w:t>Nivel</w:t>
-      </w:r>
-      <w:r>
-        <w:rPr>
-          <w:b/>
-        </w:rPr>
-        <w:t>es</w:t>
-      </w:r>
-      <w:r>
-        <w:rPr>
-          <w:b/>
-        </w:rPr>
-        <w:t xml:space="preserve"> 1 APA:</w:t>
-      </w:r>
-      <w:r>
-        <w:t xml:space="preserve"> número arábigo, centrado, negritas, minúsculas. Este estilo ya está configurado en: Inicio &gt; Nivel 1 APA</w:t>
+          <w:rFonts w:cs="Times New Roman"/>
+        </w:rPr>
+        <w:t>Lista alfabética de fuentes consultadas.</w:t>
+      </w:r>
+      <w:r>
+        <w:t xml:space="preserve"> </w:t>
+      </w:r>
+      <w:r>
+        <w:rPr>
+          <w:rFonts w:cs="Times New Roman"/>
+        </w:rPr>
+        <w:t>Todas, sin excepción, deben estar citadas dentro del texto</w:t>
+      </w:r>
+      <w:r>
+        <w:rPr>
+          <w:rFonts w:cs="Times New Roman"/>
+        </w:rPr>
+        <w:t xml:space="preserve"> al menos una vez</w:t>
+      </w:r>
+      <w:r>
+        <w:rPr>
+          <w:rFonts w:cs="Times New Roman"/>
+        </w:rPr>
+        <w:t xml:space="preserve">. </w:t>
+      </w:r>
+      <w:r>
+        <w:rPr>
+          <w:rFonts w:cs="Times New Roman"/>
+        </w:rPr>
+        <w:t>Se debe conservar la estructura de citación según las normas APA.</w:t>
       </w:r>
     </w:p>
     <w:p>
@@ -9586,101 +10166,7 @@
       </w:pPr>
     </w:p>
   </w:comment>
-  <w:comment w:id="27" w:author="Autor" w:initials="A">
-    <w:p>
-      <w:pPr>
-        <w:pStyle w:val="Textocomentario"/>
-      </w:pPr>
-      <w:r>
-        <w:rPr>
-          <w:rStyle w:val="Refdecomentario"/>
-        </w:rPr>
-        <w:annotationRef/>
-      </w:r>
-      <w:r>
-        <w:t xml:space="preserve">NOTA IMPORTANTE: </w:t>
-      </w:r>
-      <w:r>
-        <w:t>Según la naturaleza de cada investigación y la orientación del asesor</w:t>
-      </w:r>
-      <w:r>
-        <w:t>/a</w:t>
-      </w:r>
-      <w:r>
-        <w:t xml:space="preserve"> de trabajo de grado</w:t>
-      </w:r>
-      <w:r>
-        <w:t>,</w:t>
-      </w:r>
-      <w:r>
-        <w:t xml:space="preserve"> se incluirá</w:t>
-      </w:r>
-      <w:r>
-        <w:t xml:space="preserve"> o no</w:t>
-      </w:r>
-      <w:r>
-        <w:t xml:space="preserve"> una hipótesis en el proyecto</w:t>
-      </w:r>
-      <w:r>
-        <w:t xml:space="preserve"> y también los tipos de hipótesis que se consideren</w:t>
-      </w:r>
-      <w:r>
-        <w:t>.</w:t>
-      </w:r>
-    </w:p>
-  </w:comment>
-  <w:comment w:id="39" w:author="Autor" w:initials="A">
-    <w:p>
-      <w:pPr>
-        <w:pStyle w:val="Textocomentario"/>
-      </w:pPr>
-      <w:r>
-        <w:rPr>
-          <w:rStyle w:val="Refdecomentario"/>
-        </w:rPr>
-        <w:annotationRef/>
-      </w:r>
-      <w:r>
-        <w:rPr>
-          <w:rFonts w:cs="Times New Roman"/>
-        </w:rPr>
-        <w:t>Lista alfabética de fuentes consultadas.</w:t>
-      </w:r>
-      <w:r>
-        <w:t xml:space="preserve"> </w:t>
-      </w:r>
-      <w:r>
-        <w:rPr>
-          <w:rFonts w:cs="Times New Roman"/>
-        </w:rPr>
-        <w:t>Todas, sin excepción, deben estar citadas dentro del texto</w:t>
-      </w:r>
-      <w:r>
-        <w:rPr>
-          <w:rFonts w:cs="Times New Roman"/>
-        </w:rPr>
-        <w:t xml:space="preserve"> al menos una vez</w:t>
-      </w:r>
-      <w:r>
-        <w:rPr>
-          <w:rFonts w:cs="Times New Roman"/>
-        </w:rPr>
-        <w:t xml:space="preserve">. </w:t>
-      </w:r>
-      <w:r>
-        <w:rPr>
-          <w:rFonts w:cs="Times New Roman"/>
-        </w:rPr>
-        <w:t>Se debe conservar la estructura de citación según las normas APA.</w:t>
-      </w:r>
-    </w:p>
-    <w:p>
-      <w:pPr>
-        <w:pStyle w:val="Textocomentario"/>
-      </w:pPr>
-    </w:p>
-  </w:comment>
-  <w:comment w:id="41" w:author="Autor" w:initials="A">
+  <w:comment w:id="44" w:author="Autor" w:initials="A">
     <w:p>
       <w:pPr>
         <w:pStyle w:val="Textocomentario"/>
@@ -9762,12 +10248,15 @@
   <w15:commentEx w15:paraId="258A4246" w15:done="0"/>
   <w15:commentEx w15:paraId="7E6B1428" w15:done="0"/>
   <w15:commentEx w15:paraId="78BD42ED" w15:done="0"/>
-  <w15:commentEx w15:paraId="5FC2F72E" w15:done="0"/>
   <w15:commentEx w15:paraId="5A191319" w15:done="0"/>
-  <w15:commentEx w15:paraId="44131166" w15:done="1"/>
+  <w15:commentEx w15:paraId="73F4C825" w15:done="0"/>
+  <w15:commentEx w15:paraId="541D2E9A" w15:done="0"/>
+  <w15:commentEx w15:paraId="466D76AE" w15:done="0"/>
+  <w15:commentEx w15:paraId="5CF03A36" w15:done="0"/>
+  <w15:commentEx w15:paraId="69DD4CFB" w15:done="0"/>
+  <w15:commentEx w15:paraId="1A7C9256" w15:done="0"/>
   <w15:commentEx w15:paraId="33EB55E0" w15:done="0"/>
-  <w15:commentEx w15:paraId="278B3905" w15:done="0"/>
-  <w15:commentEx w15:paraId="054A37B0" w15:done="0"/>
+  <w15:commentEx w15:paraId="44DE10D4" w15:done="0"/>
   <w15:commentEx w15:paraId="07FA2090" w15:done="0"/>
   <w15:commentEx w15:paraId="12DDE124" w15:done="0"/>
 </w15:commentsEx>
@@ -9785,12 +10274,15 @@
   <w16cid:commentId w16cid:paraId="258A4246" w16cid:durableId="2338205A"/>
   <w16cid:commentId w16cid:paraId="7E6B1428" w16cid:durableId="2338205B"/>
   <w16cid:commentId w16cid:paraId="78BD42ED" w16cid:durableId="2338205C"/>
-  <w16cid:commentId w16cid:paraId="5FC2F72E" w16cid:durableId="2338205D"/>
   <w16cid:commentId w16cid:paraId="5A191319" w16cid:durableId="23382060"/>
-  <w16cid:commentId w16cid:paraId="44131166" w16cid:durableId="7411A2AA"/>
+  <w16cid:commentId w16cid:paraId="73F4C825" w16cid:durableId="2D597696"/>
+  <w16cid:commentId w16cid:paraId="541D2E9A" w16cid:durableId="2D5976CF"/>
+  <w16cid:commentId w16cid:paraId="466D76AE" w16cid:durableId="2D597735"/>
+  <w16cid:commentId w16cid:paraId="5CF03A36" w16cid:durableId="2D597781"/>
+  <w16cid:commentId w16cid:paraId="69DD4CFB" w16cid:durableId="2D597794"/>
+  <w16cid:commentId w16cid:paraId="1A7C9256" w16cid:durableId="2D5977B2"/>
   <w16cid:commentId w16cid:paraId="33EB55E0" w16cid:durableId="2B4B62E1"/>
-  <w16cid:commentId w16cid:paraId="278B3905" w16cid:durableId="2B4B6F67"/>
-  <w16cid:commentId w16cid:paraId="054A37B0" w16cid:durableId="2B4B6F7C"/>
+  <w16cid:commentId w16cid:paraId="44DE10D4" w16cid:durableId="2D597939"/>
   <w16cid:commentId w16cid:paraId="07FA2090" w16cid:durableId="2B546375"/>
   <w16cid:commentId w16cid:paraId="12DDE124" w16cid:durableId="2B548902"/>
 </w16cid:commentsIds>
@@ -12771,82 +13263,82 @@
       </w:pPr>
     </w:lvl>
   </w:abstractNum>
-  <w:num w:numId="1" w16cid:durableId="204104855">
+  <w:num w:numId="1" w16cid:durableId="765148310">
     <w:abstractNumId w:val="7"/>
   </w:num>
-  <w:num w:numId="2" w16cid:durableId="1793163019">
+  <w:num w:numId="2" w16cid:durableId="1570572705">
     <w:abstractNumId w:val="18"/>
   </w:num>
-  <w:num w:numId="3" w16cid:durableId="834108088">
+  <w:num w:numId="3" w16cid:durableId="1075132380">
     <w:abstractNumId w:val="24"/>
   </w:num>
-  <w:num w:numId="4" w16cid:durableId="1624310831">
+  <w:num w:numId="4" w16cid:durableId="640698773">
     <w:abstractNumId w:val="13"/>
   </w:num>
-  <w:num w:numId="5" w16cid:durableId="1248882816">
+  <w:num w:numId="5" w16cid:durableId="2094205322">
     <w:abstractNumId w:val="4"/>
   </w:num>
-  <w:num w:numId="6" w16cid:durableId="1603222009">
+  <w:num w:numId="6" w16cid:durableId="1107852567">
     <w:abstractNumId w:val="19"/>
   </w:num>
-  <w:num w:numId="7" w16cid:durableId="627786870">
+  <w:num w:numId="7" w16cid:durableId="193083723">
     <w:abstractNumId w:val="1"/>
   </w:num>
-  <w:num w:numId="8" w16cid:durableId="1414010986">
+  <w:num w:numId="8" w16cid:durableId="867765813">
     <w:abstractNumId w:val="9"/>
   </w:num>
-  <w:num w:numId="9" w16cid:durableId="1345670746">
+  <w:num w:numId="9" w16cid:durableId="1217619536">
     <w:abstractNumId w:val="22"/>
   </w:num>
-  <w:num w:numId="10" w16cid:durableId="1030688457">
+  <w:num w:numId="10" w16cid:durableId="1966890489">
     <w:abstractNumId w:val="14"/>
   </w:num>
-  <w:num w:numId="11" w16cid:durableId="1940021612">
+  <w:num w:numId="11" w16cid:durableId="890966808">
     <w:abstractNumId w:val="11"/>
   </w:num>
-  <w:num w:numId="12" w16cid:durableId="892930867">
+  <w:num w:numId="12" w16cid:durableId="756710485">
     <w:abstractNumId w:val="23"/>
   </w:num>
-  <w:num w:numId="13" w16cid:durableId="509031985">
+  <w:num w:numId="13" w16cid:durableId="1277177773">
     <w:abstractNumId w:val="15"/>
   </w:num>
-  <w:num w:numId="14" w16cid:durableId="105201213">
+  <w:num w:numId="14" w16cid:durableId="677390718">
     <w:abstractNumId w:val="2"/>
   </w:num>
-  <w:num w:numId="15" w16cid:durableId="705372606">
+  <w:num w:numId="15" w16cid:durableId="1749038905">
     <w:abstractNumId w:val="8"/>
   </w:num>
-  <w:num w:numId="16" w16cid:durableId="1523056986">
+  <w:num w:numId="16" w16cid:durableId="1960187501">
     <w:abstractNumId w:val="5"/>
   </w:num>
-  <w:num w:numId="17" w16cid:durableId="476872564">
+  <w:num w:numId="17" w16cid:durableId="2046902234">
     <w:abstractNumId w:val="3"/>
   </w:num>
-  <w:num w:numId="18" w16cid:durableId="1696037078">
+  <w:num w:numId="18" w16cid:durableId="1061103095">
     <w:abstractNumId w:val="21"/>
   </w:num>
-  <w:num w:numId="19" w16cid:durableId="1152215020">
+  <w:num w:numId="19" w16cid:durableId="472065800">
     <w:abstractNumId w:val="6"/>
   </w:num>
-  <w:num w:numId="20" w16cid:durableId="800075743">
+  <w:num w:numId="20" w16cid:durableId="1439789267">
     <w:abstractNumId w:val="12"/>
   </w:num>
-  <w:num w:numId="21" w16cid:durableId="27222581">
+  <w:num w:numId="21" w16cid:durableId="1075276787">
     <w:abstractNumId w:val="17"/>
   </w:num>
-  <w:num w:numId="22" w16cid:durableId="499583074">
+  <w:num w:numId="22" w16cid:durableId="1800996081">
     <w:abstractNumId w:val="20"/>
   </w:num>
-  <w:num w:numId="23" w16cid:durableId="123082288">
+  <w:num w:numId="23" w16cid:durableId="383796873">
     <w:abstractNumId w:val="25"/>
   </w:num>
-  <w:num w:numId="24" w16cid:durableId="1857649583">
+  <w:num w:numId="24" w16cid:durableId="240529759">
     <w:abstractNumId w:val="10"/>
   </w:num>
-  <w:num w:numId="25" w16cid:durableId="748696788">
+  <w:num w:numId="25" w16cid:durableId="1695692798">
     <w:abstractNumId w:val="16"/>
   </w:num>
-  <w:num w:numId="26" w16cid:durableId="440034585">
+  <w:num w:numId="26" w16cid:durableId="1282567565">
     <w:abstractNumId w:val="0"/>
   </w:num>
 </w:numbering>
@@ -14643,6 +15135,215 @@
 </file>
 
 <file path=customXml/item1.xml><?xml version="1.0" encoding="utf-8"?>
+<ct:contentTypeSchema xmlns:ct="http://schemas.microsoft.com/office/2006/metadata/contentType" xmlns:ma="http://schemas.microsoft.com/office/2006/metadata/properties/metaAttributes" ct:_="" ma:_="" ma:contentTypeName="Document" ma:contentTypeID="0x0101006D04E2305BF7F54FA7D6E0248C2500D9" ma:contentTypeVersion="10" ma:contentTypeDescription="Create a new document." ma:contentTypeScope="" ma:versionID="dd10ca140d1ea1bbb7d218f74e8b029c">
+  <xsd:schema xmlns:xsd="http://www.w3.org/2001/XMLSchema" xmlns:xs="http://www.w3.org/2001/XMLSchema" xmlns:p="http://schemas.microsoft.com/office/2006/metadata/properties" xmlns:ns2="2fbea1be-444b-4810-a171-216b375690c2" xmlns:ns3="78beeb7a-d011-4854-8ba0-0712d94e68d3" targetNamespace="http://schemas.microsoft.com/office/2006/metadata/properties" ma:root="true" ma:fieldsID="64c721ace28926f2a46387699be0b7f5" ns2:_="" ns3:_="">
+    <xsd:import namespace="2fbea1be-444b-4810-a171-216b375690c2"/>
+    <xsd:import namespace="78beeb7a-d011-4854-8ba0-0712d94e68d3"/>
+    <xsd:element name="properties">
+      <xsd:complexType>
+        <xsd:sequence>
+          <xsd:element name="documentManagement">
+            <xsd:complexType>
+              <xsd:all>
+                <xsd:element ref="ns2:MediaServiceMetadata" minOccurs="0"/>
+                <xsd:element ref="ns2:MediaServiceFastMetadata" minOccurs="0"/>
+                <xsd:element ref="ns2:MediaServiceSearchProperties" minOccurs="0"/>
+                <xsd:element ref="ns2:MediaServiceDateTaken" minOccurs="0"/>
+                <xsd:element ref="ns2:lcf76f155ced4ddcb4097134ff3c332f" minOccurs="0"/>
+                <xsd:element ref="ns3:TaxCatchAll" minOccurs="0"/>
+                <xsd:element ref="ns2:MediaServiceOCR" minOccurs="0"/>
+                <xsd:element ref="ns2:MediaServiceGenerationTime" minOccurs="0"/>
+                <xsd:element ref="ns2:MediaServiceEventHashCode" minOccurs="0"/>
+              </xsd:all>
+            </xsd:complexType>
+          </xsd:element>
+        </xsd:sequence>
+      </xsd:complexType>
+    </xsd:element>
+  </xsd:schema>
+  <xsd:schema xmlns:xsd="http://www.w3.org/2001/XMLSchema" xmlns:xs="http://www.w3.org/2001/XMLSchema" xmlns:dms="http://schemas.microsoft.com/office/2006/documentManagement/types" xmlns:pc="http://schemas.microsoft.com/office/infopath/2007/PartnerControls" targetNamespace="2fbea1be-444b-4810-a171-216b375690c2" elementFormDefault="qualified">
+    <xsd:import namespace="http://schemas.microsoft.com/office/2006/documentManagement/types"/>
+    <xsd:import namespace="http://schemas.microsoft.com/office/infopath/2007/PartnerControls"/>
+    <xsd:element name="MediaServiceMetadata" ma:index="8" nillable="true" ma:displayName="MediaServiceMetadata" ma:hidden="true" ma:internalName="MediaServiceMetadata" ma:readOnly="true">
+      <xsd:simpleType>
+        <xsd:restriction base="dms:Note"/>
+      </xsd:simpleType>
+    </xsd:element>
+    <xsd:element name="MediaServiceFastMetadata" ma:index="9" nillable="true" ma:displayName="MediaServiceFastMetadata" ma:hidden="true" ma:internalName="MediaServiceFastMetadata" ma:readOnly="true">
+      <xsd:simpleType>
+        <xsd:restriction base="dms:Note"/>
+      </xsd:simpleType>
+    </xsd:element>
+    <xsd:element name="MediaServiceSearchProperties" ma:index="10" nillable="true" ma:displayName="MediaServiceSearchProperties" ma:hidden="true" ma:internalName="MediaServiceSearchProperties" ma:readOnly="true">
+      <xsd:simpleType>
+        <xsd:restriction base="dms:Note"/>
+      </xsd:simpleType>
+    </xsd:element>
+    <xsd:element name="MediaServiceDateTaken" ma:index="11" nillable="true" ma:displayName="MediaServiceDateTaken" ma:hidden="true" ma:indexed="true" ma:internalName="MediaServiceDateTaken" ma:readOnly="true">
+      <xsd:simpleType>
+        <xsd:restriction base="dms:Text"/>
+      </xsd:simpleType>
+    </xsd:element>
+    <xsd:element name="lcf76f155ced4ddcb4097134ff3c332f" ma:index="13" nillable="true" ma:taxonomy="true" ma:internalName="lcf76f155ced4ddcb4097134ff3c332f" ma:taxonomyFieldName="MediaServiceImageTags" ma:displayName="Image Tags" ma:readOnly="false" ma:fieldId="{5cf76f15-5ced-4ddc-b409-7134ff3c332f}" ma:taxonomyMulti="true" ma:sspId="a0a33bb2-55a7-4816-9808-61a2c78e777e" ma:termSetId="09814cd3-568e-fe90-9814-8d621ff8fb84" ma:anchorId="fba54fb3-c3e1-fe81-a776-ca4b69148c4d" ma:open="true" ma:isKeyword="false">
+      <xsd:complexType>
+        <xsd:sequence>
+          <xsd:element ref="pc:Terms" minOccurs="0" maxOccurs="1"/>
+        </xsd:sequence>
+      </xsd:complexType>
+    </xsd:element>
+    <xsd:element name="MediaServiceOCR" ma:index="15" nillable="true" ma:displayName="Extracted Text" ma:internalName="MediaServiceOCR" ma:readOnly="true">
+      <xsd:simpleType>
+        <xsd:restriction base="dms:Note">
+          <xsd:maxLength value="255"/>
+        </xsd:restriction>
+      </xsd:simpleType>
+    </xsd:element>
+    <xsd:element name="MediaServiceGenerationTime" ma:index="16" nillable="true" ma:displayName="MediaServiceGenerationTime" ma:hidden="true" ma:internalName="MediaServiceGenerationTime" ma:readOnly="true">
+      <xsd:simpleType>
+        <xsd:restriction base="dms:Text"/>
+      </xsd:simpleType>
+    </xsd:element>
+    <xsd:element name="MediaServiceEventHashCode" ma:index="17" nillable="true" ma:displayName="MediaServiceEventHashCode" ma:hidden="true" ma:internalName="MediaServiceEventHashCode" ma:readOnly="true">
+      <xsd:simpleType>
+        <xsd:restriction base="dms:Text"/>
+      </xsd:simpleType>
+    </xsd:element>
+  </xsd:schema>
+  <xsd:schema xmlns:xsd="http://www.w3.org/2001/XMLSchema" xmlns:xs="http://www.w3.org/2001/XMLSchema" xmlns:dms="http://schemas.microsoft.com/office/2006/documentManagement/types" xmlns:pc="http://schemas.microsoft.com/office/infopath/2007/PartnerControls" targetNamespace="78beeb7a-d011-4854-8ba0-0712d94e68d3" elementFormDefault="qualified">
+    <xsd:import namespace="http://schemas.microsoft.com/office/2006/documentManagement/types"/>
+    <xsd:import namespace="http://schemas.microsoft.com/office/infopath/2007/PartnerControls"/>
+    <xsd:element name="TaxCatchAll" ma:index="14" nillable="true" ma:displayName="Taxonomy Catch All Column" ma:hidden="true" ma:list="{3a8cedc2-1744-4932-a37c-a94ae96e0391}" ma:internalName="TaxCatchAll" ma:showField="CatchAllData" ma:web="78beeb7a-d011-4854-8ba0-0712d94e68d3">
+      <xsd:complexType>
+        <xsd:complexContent>
+          <xsd:extension base="dms:MultiChoiceLookup">
+            <xsd:sequence>
+              <xsd:element name="Value" type="dms:Lookup" maxOccurs="unbounded" minOccurs="0" nillable="true"/>
+            </xsd:sequence>
+          </xsd:extension>
+        </xsd:complexContent>
+      </xsd:complexType>
+    </xsd:element>
+  </xsd:schema>
+  <xsd:schema xmlns="http://schemas.openxmlformats.org/package/2006/metadata/core-properties" xmlns:xsd="http://www.w3.org/2001/XMLSchema" xmlns:xsi="http://www.w3.org/2001/XMLSchema-instance" xmlns:dc="http://purl.org/dc/elements/1.1/" xmlns:dcterms="http://purl.org/dc/terms/" xmlns:odoc="http://schemas.microsoft.com/internal/obd" targetNamespace="http://schemas.openxmlformats.org/package/2006/metadata/core-properties" elementFormDefault="qualified" attributeFormDefault="unqualified" blockDefault="#all">
+    <xsd:import namespace="http://purl.org/dc/elements/1.1/" schemaLocation="http://dublincore.org/schemas/xmls/qdc/2003/04/02/dc.xsd"/>
+    <xsd:import namespace="http://purl.org/dc/terms/" schemaLocation="http://dublincore.org/schemas/xmls/qdc/2003/04/02/dcterms.xsd"/>
+    <xsd:element name="coreProperties" type="CT_coreProperties"/>
+    <xsd:complexType name="CT_coreProperties">
+      <xsd:all>
+        <xsd:element ref="dc:creator" minOccurs="0" maxOccurs="1"/>
+        <xsd:element ref="dcterms:created" minOccurs="0" maxOccurs="1"/>
+        <xsd:element ref="dc:identifier" minOccurs="0" maxOccurs="1"/>
+        <xsd:element name="contentType" minOccurs="0" maxOccurs="1" type="xsd:string" ma:index="0" ma:displayName="Content Type"/>
+        <xsd:element ref="dc:title" minOccurs="0" maxOccurs="1" ma:index="4" ma:displayName="Title"/>
+        <xsd:element ref="dc:subject" minOccurs="0" maxOccurs="1"/>
+        <xsd:element ref="dc:description" minOccurs="0" maxOccurs="1"/>
+        <xsd:element name="keywords" minOccurs="0" maxOccurs="1" type="xsd:string"/>
+        <xsd:element ref="dc:language" minOccurs="0" maxOccurs="1"/>
+        <xsd:element name="category" minOccurs="0" maxOccurs="1" type="xsd:string"/>
+        <xsd:element name="version" minOccurs="0" maxOccurs="1" type="xsd:string"/>
+        <xsd:element name="revision" minOccurs="0" maxOccurs="1" type="xsd:string">
+          <xsd:annotation>
+            <xsd:documentation>
+                        This value indicates the number of saves or revisions. The application is responsible for updating this value after each revision.
+                    </xsd:documentation>
+          </xsd:annotation>
+        </xsd:element>
+        <xsd:element name="lastModifiedBy" minOccurs="0" maxOccurs="1" type="xsd:string"/>
+        <xsd:element ref="dcterms:modified" minOccurs="0" maxOccurs="1"/>
+        <xsd:element name="contentStatus" minOccurs="0" maxOccurs="1" type="xsd:string"/>
+      </xsd:all>
+    </xsd:complexType>
+  </xsd:schema>
+  <xs:schema xmlns:pc="http://schemas.microsoft.com/office/infopath/2007/PartnerControls" xmlns:xs="http://www.w3.org/2001/XMLSchema" targetNamespace="http://schemas.microsoft.com/office/infopath/2007/PartnerControls" elementFormDefault="qualified" attributeFormDefault="unqualified">
+    <xs:element name="Person">
+      <xs:complexType>
+        <xs:sequence>
+          <xs:element ref="pc:DisplayName" minOccurs="0"/>
+          <xs:element ref="pc:AccountId" minOccurs="0"/>
+          <xs:element ref="pc:AccountType" minOccurs="0"/>
+        </xs:sequence>
+      </xs:complexType>
+    </xs:element>
+    <xs:element name="DisplayName" type="xs:string"/>
+    <xs:element name="AccountId" type="xs:string"/>
+    <xs:element name="AccountType" type="xs:string"/>
+    <xs:element name="BDCAssociatedEntity">
+      <xs:complexType>
+        <xs:sequence>
+          <xs:element ref="pc:BDCEntity" minOccurs="0" maxOccurs="unbounded"/>
+        </xs:sequence>
+        <xs:attribute ref="pc:EntityNamespace"/>
+        <xs:attribute ref="pc:EntityName"/>
+        <xs:attribute ref="pc:SystemInstanceName"/>
+        <xs:attribute ref="pc:AssociationName"/>
+      </xs:complexType>
+    </xs:element>
+    <xs:attribute name="EntityNamespace" type="xs:string"/>
+    <xs:attribute name="EntityName" type="xs:string"/>
+    <xs:attribute name="SystemInstanceName" type="xs:string"/>
+    <xs:attribute name="AssociationName" type="xs:string"/>
+    <xs:element name="BDCEntity">
+      <xs:complexType>
+        <xs:sequence>
+          <xs:element ref="pc:EntityDisplayName" minOccurs="0"/>
+          <xs:element ref="pc:EntityInstanceReference" minOccurs="0"/>
+          <xs:element ref="pc:EntityId1" minOccurs="0"/>
+          <xs:element ref="pc:EntityId2" minOccurs="0"/>
+          <xs:element ref="pc:EntityId3" minOccurs="0"/>
+          <xs:element ref="pc:EntityId4" minOccurs="0"/>
+          <xs:element ref="pc:EntityId5" minOccurs="0"/>
+        </xs:sequence>
+      </xs:complexType>
+    </xs:element>
+    <xs:element name="EntityDisplayName" type="xs:string"/>
+    <xs:element name="EntityInstanceReference" type="xs:string"/>
+    <xs:element name="EntityId1" type="xs:string"/>
+    <xs:element name="EntityId2" type="xs:string"/>
+    <xs:element name="EntityId3" type="xs:string"/>
+    <xs:element name="EntityId4" type="xs:string"/>
+    <xs:element name="EntityId5" type="xs:string"/>
+    <xs:element name="Terms">
+      <xs:complexType>
+        <xs:sequence>
+          <xs:element ref="pc:TermInfo" minOccurs="0" maxOccurs="unbounded"/>
+        </xs:sequence>
+      </xs:complexType>
+    </xs:element>
+    <xs:element name="TermInfo">
+      <xs:complexType>
+        <xs:sequence>
+          <xs:element ref="pc:TermName" minOccurs="0"/>
+          <xs:element ref="pc:TermId" minOccurs="0"/>
+        </xs:sequence>
+      </xs:complexType>
+    </xs:element>
+    <xs:element name="TermName" type="xs:string"/>
+    <xs:element name="TermId" type="xs:string"/>
+  </xs:schema>
+</ct:contentTypeSchema>
+</file>
+
+<file path=customXml/item2.xml><?xml version="1.0" encoding="utf-8"?>
+<?mso-contentType ?>
+<FormTemplates xmlns="http://schemas.microsoft.com/sharepoint/v3/contenttype/forms">
+  <Display>DocumentLibraryForm</Display>
+  <Edit>DocumentLibraryForm</Edit>
+  <New>DocumentLibraryForm</New>
+</FormTemplates>
+</file>
+
+<file path=customXml/item3.xml><?xml version="1.0" encoding="utf-8"?>
+<p:properties xmlns:p="http://schemas.microsoft.com/office/2006/metadata/properties" xmlns:xsi="http://www.w3.org/2001/XMLSchema-instance" xmlns:pc="http://schemas.microsoft.com/office/infopath/2007/PartnerControls">
+  <documentManagement>
+    <lcf76f155ced4ddcb4097134ff3c332f xmlns="2fbea1be-444b-4810-a171-216b375690c2">
+      <Terms xmlns="http://schemas.microsoft.com/office/infopath/2007/PartnerControls"/>
+    </lcf76f155ced4ddcb4097134ff3c332f>
+    <TaxCatchAll xmlns="78beeb7a-d011-4854-8ba0-0712d94e68d3" xsi:nil="true"/>
+  </documentManagement>
+</p:properties>
+</file>
+
+<file path=customXml/item4.xml><?xml version="1.0" encoding="utf-8"?>
 <b:Sources xmlns:b="http://schemas.openxmlformats.org/officeDocument/2006/bibliography" xmlns="http://schemas.openxmlformats.org/officeDocument/2006/bibliography" SelectedStyle="\APASixthEditionOfficeOnline.xsl" StyleName="APA" Version="6">
   <b:Source>
     <b:Tag>Men90</b:Tag>
@@ -15374,311 +16075,15 @@
 </b:Sources>
 </file>
 
-<file path=customXml/item2.xml><?xml version="1.0" encoding="utf-8"?>
-<p:properties xmlns:p="http://schemas.microsoft.com/office/2006/metadata/properties" xmlns:xsi="http://www.w3.org/2001/XMLSchema-instance" xmlns:pc="http://schemas.microsoft.com/office/infopath/2007/PartnerControls">
-  <documentManagement>
-    <_activity xmlns="152b35e6-23a1-4beb-a1fd-2689778f6058" xsi:nil="true"/>
-  </documentManagement>
-</p:properties>
-</file>
-
-<file path=customXml/item3.xml><?xml version="1.0" encoding="utf-8"?>
-<?mso-contentType ?>
-<FormTemplates xmlns="http://schemas.microsoft.com/sharepoint/v3/contenttype/forms">
-  <Display>DocumentLibraryForm</Display>
-  <Edit>DocumentLibraryForm</Edit>
-  <New>DocumentLibraryForm</New>
-</FormTemplates>
-</file>
-
-<file path=customXml/item4.xml><?xml version="1.0" encoding="utf-8"?>
-<ct:contentTypeSchema xmlns:ct="http://schemas.microsoft.com/office/2006/metadata/contentType" xmlns:ma="http://schemas.microsoft.com/office/2006/metadata/properties/metaAttributes" ct:_="" ma:_="" ma:contentTypeName="Documento" ma:contentTypeID="0x01010015BDB27AF1A6EC4C99611A7AD03A3206" ma:contentTypeVersion="18" ma:contentTypeDescription="Crear nuevo documento." ma:contentTypeScope="" ma:versionID="56de9a8de695fa7f309cf2eb59d05ef4">
-  <xsd:schema xmlns:xsd="http://www.w3.org/2001/XMLSchema" xmlns:xs="http://www.w3.org/2001/XMLSchema" xmlns:p="http://schemas.microsoft.com/office/2006/metadata/properties" xmlns:ns3="ed1181c6-4963-4f9c-a6e4-d7efb21233a0" xmlns:ns4="152b35e6-23a1-4beb-a1fd-2689778f6058" targetNamespace="http://schemas.microsoft.com/office/2006/metadata/properties" ma:root="true" ma:fieldsID="cae7528616b6d30ad4c29b83143ea2c0" ns3:_="" ns4:_="">
-    <xsd:import namespace="ed1181c6-4963-4f9c-a6e4-d7efb21233a0"/>
-    <xsd:import namespace="152b35e6-23a1-4beb-a1fd-2689778f6058"/>
-    <xsd:element name="properties">
-      <xsd:complexType>
-        <xsd:sequence>
-          <xsd:element name="documentManagement">
-            <xsd:complexType>
-              <xsd:all>
-                <xsd:element ref="ns3:SharedWithUsers" minOccurs="0"/>
-                <xsd:element ref="ns3:SharedWithDetails" minOccurs="0"/>
-                <xsd:element ref="ns3:SharingHintHash" minOccurs="0"/>
-                <xsd:element ref="ns4:MediaServiceMetadata" minOccurs="0"/>
-                <xsd:element ref="ns4:MediaServiceFastMetadata" minOccurs="0"/>
-                <xsd:element ref="ns4:MediaServiceDateTaken" minOccurs="0"/>
-                <xsd:element ref="ns4:MediaServiceAutoTags" minOccurs="0"/>
-                <xsd:element ref="ns4:MediaServiceGenerationTime" minOccurs="0"/>
-                <xsd:element ref="ns4:MediaServiceEventHashCode" minOccurs="0"/>
-                <xsd:element ref="ns4:MediaServiceOCR" minOccurs="0"/>
-                <xsd:element ref="ns4:MediaLengthInSeconds" minOccurs="0"/>
-                <xsd:element ref="ns4:MediaServiceAutoKeyPoints" minOccurs="0"/>
-                <xsd:element ref="ns4:MediaServiceKeyPoints" minOccurs="0"/>
-                <xsd:element ref="ns4:_activity" minOccurs="0"/>
-                <xsd:element ref="ns4:MediaServiceObjectDetectorVersions" minOccurs="0"/>
-                <xsd:element ref="ns4:MediaServiceLocation" minOccurs="0"/>
-                <xsd:element ref="ns4:MediaServiceSystemTags" minOccurs="0"/>
-                <xsd:element ref="ns4:MediaServiceSearchProperties" minOccurs="0"/>
-              </xsd:all>
-            </xsd:complexType>
-          </xsd:element>
-        </xsd:sequence>
-      </xsd:complexType>
-    </xsd:element>
-  </xsd:schema>
-  <xsd:schema xmlns:xsd="http://www.w3.org/2001/XMLSchema" xmlns:xs="http://www.w3.org/2001/XMLSchema" xmlns:dms="http://schemas.microsoft.com/office/2006/documentManagement/types" xmlns:pc="http://schemas.microsoft.com/office/infopath/2007/PartnerControls" targetNamespace="ed1181c6-4963-4f9c-a6e4-d7efb21233a0" elementFormDefault="qualified">
-    <xsd:import namespace="http://schemas.microsoft.com/office/2006/documentManagement/types"/>
-    <xsd:import namespace="http://schemas.microsoft.com/office/infopath/2007/PartnerControls"/>
-    <xsd:element name="SharedWithUsers" ma:index="8" nillable="true" ma:displayName="Compartido con" ma:internalName="SharedWithUsers" ma:readOnly="true">
-      <xsd:complexType>
-        <xsd:complexContent>
-          <xsd:extension base="dms:UserMulti">
-            <xsd:sequence>
-              <xsd:element name="UserInfo" minOccurs="0" maxOccurs="unbounded">
-                <xsd:complexType>
-                  <xsd:sequence>
-                    <xsd:element name="DisplayName" type="xsd:string" minOccurs="0"/>
-                    <xsd:element name="AccountId" type="dms:UserId" minOccurs="0" nillable="true"/>
-                    <xsd:element name="AccountType" type="xsd:string" minOccurs="0"/>
-                  </xsd:sequence>
-                </xsd:complexType>
-              </xsd:element>
-            </xsd:sequence>
-          </xsd:extension>
-        </xsd:complexContent>
-      </xsd:complexType>
-    </xsd:element>
-    <xsd:element name="SharedWithDetails" ma:index="9" nillable="true" ma:displayName="Detalles de uso compartido" ma:internalName="SharedWithDetails" ma:readOnly="true">
-      <xsd:simpleType>
-        <xsd:restriction base="dms:Note">
-          <xsd:maxLength value="255"/>
-        </xsd:restriction>
-      </xsd:simpleType>
-    </xsd:element>
-    <xsd:element name="SharingHintHash" ma:index="10" nillable="true" ma:displayName="Hash de la sugerencia para compartir" ma:hidden="true" ma:internalName="SharingHintHash" ma:readOnly="true">
-      <xsd:simpleType>
-        <xsd:restriction base="dms:Text"/>
-      </xsd:simpleType>
-    </xsd:element>
-  </xsd:schema>
-  <xsd:schema xmlns:xsd="http://www.w3.org/2001/XMLSchema" xmlns:xs="http://www.w3.org/2001/XMLSchema" xmlns:dms="http://schemas.microsoft.com/office/2006/documentManagement/types" xmlns:pc="http://schemas.microsoft.com/office/infopath/2007/PartnerControls" targetNamespace="152b35e6-23a1-4beb-a1fd-2689778f6058" elementFormDefault="qualified">
-    <xsd:import namespace="http://schemas.microsoft.com/office/2006/documentManagement/types"/>
-    <xsd:import namespace="http://schemas.microsoft.com/office/infopath/2007/PartnerControls"/>
-    <xsd:element name="MediaServiceMetadata" ma:index="11" nillable="true" ma:displayName="MediaServiceMetadata" ma:hidden="true" ma:internalName="MediaServiceMetadata" ma:readOnly="true">
-      <xsd:simpleType>
-        <xsd:restriction base="dms:Note"/>
-      </xsd:simpleType>
-    </xsd:element>
-    <xsd:element name="MediaServiceFastMetadata" ma:index="12" nillable="true" ma:displayName="MediaServiceFastMetadata" ma:hidden="true" ma:internalName="MediaServiceFastMetadata" ma:readOnly="true">
-      <xsd:simpleType>
-        <xsd:restriction base="dms:Note"/>
-      </xsd:simpleType>
-    </xsd:element>
-    <xsd:element name="MediaServiceDateTaken" ma:index="13" nillable="true" ma:displayName="MediaServiceDateTaken" ma:hidden="true" ma:internalName="MediaServiceDateTaken" ma:readOnly="true">
-      <xsd:simpleType>
-        <xsd:restriction base="dms:Text"/>
-      </xsd:simpleType>
-    </xsd:element>
-    <xsd:element name="MediaServiceAutoTags" ma:index="14" nillable="true" ma:displayName="Tags" ma:internalName="MediaServiceAutoTags" ma:readOnly="true">
-      <xsd:simpleType>
-        <xsd:restriction base="dms:Text"/>
-      </xsd:simpleType>
-    </xsd:element>
-    <xsd:element name="MediaServiceGenerationTime" ma:index="15" nillable="true" ma:displayName="MediaServiceGenerationTime" ma:hidden="true" ma:internalName="MediaServiceGenerationTime" ma:readOnly="true">
-      <xsd:simpleType>
-        <xsd:restriction base="dms:Text"/>
-      </xsd:simpleType>
-    </xsd:element>
-    <xsd:element name="MediaServiceEventHashCode" ma:index="16" nillable="true" ma:displayName="MediaServiceEventHashCode" ma:hidden="true" ma:internalName="MediaServiceEventHashCode" ma:readOnly="true">
-      <xsd:simpleType>
-        <xsd:restriction base="dms:Text"/>
-      </xsd:simpleType>
-    </xsd:element>
-    <xsd:element name="MediaServiceOCR" ma:index="17" nillable="true" ma:displayName="Extracted Text" ma:internalName="MediaServiceOCR" ma:readOnly="true">
-      <xsd:simpleType>
-        <xsd:restriction base="dms:Note">
-          <xsd:maxLength value="255"/>
-        </xsd:restriction>
-      </xsd:simpleType>
-    </xsd:element>
-    <xsd:element name="MediaLengthInSeconds" ma:index="18" nillable="true" ma:displayName="Length (seconds)" ma:internalName="MediaLengthInSeconds" ma:readOnly="true">
-      <xsd:simpleType>
-        <xsd:restriction base="dms:Unknown"/>
-      </xsd:simpleType>
-    </xsd:element>
-    <xsd:element name="MediaServiceAutoKeyPoints" ma:index="19" nillable="true" ma:displayName="MediaServiceAutoKeyPoints" ma:hidden="true" ma:internalName="MediaServiceAutoKeyPoints" ma:readOnly="true">
-      <xsd:simpleType>
-        <xsd:restriction base="dms:Note"/>
-      </xsd:simpleType>
-    </xsd:element>
-    <xsd:element name="MediaServiceKeyPoints" ma:index="20" nillable="true" ma:displayName="KeyPoints" ma:internalName="MediaServiceKeyPoints" ma:readOnly="true">
-      <xsd:simpleType>
-        <xsd:restriction base="dms:Note">
-          <xsd:maxLength value="255"/>
-        </xsd:restriction>
-      </xsd:simpleType>
-    </xsd:element>
-    <xsd:element name="_activity" ma:index="21" nillable="true" ma:displayName="_activity" ma:hidden="true" ma:internalName="_activity">
-      <xsd:simpleType>
-        <xsd:restriction base="dms:Note"/>
-      </xsd:simpleType>
-    </xsd:element>
-    <xsd:element name="MediaServiceObjectDetectorVersions" ma:index="22" nillable="true" ma:displayName="MediaServiceObjectDetectorVersions" ma:hidden="true" ma:indexed="true" ma:internalName="MediaServiceObjectDetectorVersions" ma:readOnly="true">
-      <xsd:simpleType>
-        <xsd:restriction base="dms:Text"/>
-      </xsd:simpleType>
-    </xsd:element>
-    <xsd:element name="MediaServiceLocation" ma:index="23" nillable="true" ma:displayName="Location" ma:indexed="true" ma:internalName="MediaServiceLocation" ma:readOnly="true">
-      <xsd:simpleType>
-        <xsd:restriction base="dms:Text"/>
-      </xsd:simpleType>
-    </xsd:element>
-    <xsd:element name="MediaServiceSystemTags" ma:index="24" nillable="true" ma:displayName="MediaServiceSystemTags" ma:hidden="true" ma:internalName="MediaServiceSystemTags" ma:readOnly="true">
-      <xsd:simpleType>
-        <xsd:restriction base="dms:Note"/>
-      </xsd:simpleType>
-    </xsd:element>
-    <xsd:element name="MediaServiceSearchProperties" ma:index="25" nillable="true" ma:displayName="MediaServiceSearchProperties" ma:hidden="true" ma:internalName="MediaServiceSearchProperties" ma:readOnly="true">
-      <xsd:simpleType>
-        <xsd:restriction base="dms:Note"/>
-      </xsd:simpleType>
-    </xsd:element>
-  </xsd:schema>
-  <xsd:schema xmlns="http://schemas.openxmlformats.org/package/2006/metadata/core-properties" xmlns:xsd="http://www.w3.org/2001/XMLSchema" xmlns:xsi="http://www.w3.org/2001/XMLSchema-instance" xmlns:dc="http://purl.org/dc/elements/1.1/" xmlns:dcterms="http://purl.org/dc/terms/" xmlns:odoc="http://schemas.microsoft.com/internal/obd" targetNamespace="http://schemas.openxmlformats.org/package/2006/metadata/core-properties" elementFormDefault="qualified" attributeFormDefault="unqualified" blockDefault="#all">
-    <xsd:import namespace="http://purl.org/dc/elements/1.1/" schemaLocation="http://dublincore.org/schemas/xmls/qdc/2003/04/02/dc.xsd"/>
-    <xsd:import namespace="http://purl.org/dc/terms/" schemaLocation="http://dublincore.org/schemas/xmls/qdc/2003/04/02/dcterms.xsd"/>
-    <xsd:element name="coreProperties" type="CT_coreProperties"/>
-    <xsd:complexType name="CT_coreProperties">
-      <xsd:all>
-        <xsd:element ref="dc:creator" minOccurs="0" maxOccurs="1"/>
-        <xsd:element ref="dcterms:created" minOccurs="0" maxOccurs="1"/>
-        <xsd:element ref="dc:identifier" minOccurs="0" maxOccurs="1"/>
-        <xsd:element name="contentType" minOccurs="0" maxOccurs="1" type="xsd:string" ma:index="0" ma:displayName="Tipo de contenido"/>
-        <xsd:element ref="dc:title" minOccurs="0" maxOccurs="1" ma:index="4" ma:displayName="Título"/>
-        <xsd:element ref="dc:subject" minOccurs="0" maxOccurs="1"/>
-        <xsd:element ref="dc:description" minOccurs="0" maxOccurs="1"/>
-        <xsd:element name="keywords" minOccurs="0" maxOccurs="1" type="xsd:string"/>
-        <xsd:element ref="dc:language" minOccurs="0" maxOccurs="1"/>
-        <xsd:element name="category" minOccurs="0" maxOccurs="1" type="xsd:string"/>
-        <xsd:element name="version" minOccurs="0" maxOccurs="1" type="xsd:string"/>
-        <xsd:element name="revision" minOccurs="0" maxOccurs="1" type="xsd:string">
-          <xsd:annotation>
-            <xsd:documentation>
-                        This value indicates the number of saves or revisions. The application is responsible for updating this value after each revision.
-                    </xsd:documentation>
-          </xsd:annotation>
-        </xsd:element>
-        <xsd:element name="lastModifiedBy" minOccurs="0" maxOccurs="1" type="xsd:string"/>
-        <xsd:element ref="dcterms:modified" minOccurs="0" maxOccurs="1"/>
-        <xsd:element name="contentStatus" minOccurs="0" maxOccurs="1" type="xsd:string"/>
-      </xsd:all>
-    </xsd:complexType>
-  </xsd:schema>
-  <xs:schema xmlns:pc="http://schemas.microsoft.com/office/infopath/2007/PartnerControls" xmlns:xs="http://www.w3.org/2001/XMLSchema" targetNamespace="http://schemas.microsoft.com/office/infopath/2007/PartnerControls" elementFormDefault="qualified" attributeFormDefault="unqualified">
-    <xs:element name="Person">
-      <xs:complexType>
-        <xs:sequence>
-          <xs:element ref="pc:DisplayName" minOccurs="0"/>
-          <xs:element ref="pc:AccountId" minOccurs="0"/>
-          <xs:element ref="pc:AccountType" minOccurs="0"/>
-        </xs:sequence>
-      </xs:complexType>
-    </xs:element>
-    <xs:element name="DisplayName" type="xs:string"/>
-    <xs:element name="AccountId" type="xs:string"/>
-    <xs:element name="AccountType" type="xs:string"/>
-    <xs:element name="BDCAssociatedEntity">
-      <xs:complexType>
-        <xs:sequence>
-          <xs:element ref="pc:BDCEntity" minOccurs="0" maxOccurs="unbounded"/>
-        </xs:sequence>
-        <xs:attribute ref="pc:EntityNamespace"/>
-        <xs:attribute ref="pc:EntityName"/>
-        <xs:attribute ref="pc:SystemInstanceName"/>
-        <xs:attribute ref="pc:AssociationName"/>
-      </xs:complexType>
-    </xs:element>
-    <xs:attribute name="EntityNamespace" type="xs:string"/>
-    <xs:attribute name="EntityName" type="xs:string"/>
-    <xs:attribute name="SystemInstanceName" type="xs:string"/>
-    <xs:attribute name="AssociationName" type="xs:string"/>
-    <xs:element name="BDCEntity">
-      <xs:complexType>
-        <xs:sequence>
-          <xs:element ref="pc:EntityDisplayName" minOccurs="0"/>
-          <xs:element ref="pc:EntityInstanceReference" minOccurs="0"/>
-          <xs:element ref="pc:EntityId1" minOccurs="0"/>
-          <xs:element ref="pc:EntityId2" minOccurs="0"/>
-          <xs:element ref="pc:EntityId3" minOccurs="0"/>
-          <xs:element ref="pc:EntityId4" minOccurs="0"/>
-          <xs:element ref="pc:EntityId5" minOccurs="0"/>
-        </xs:sequence>
-      </xs:complexType>
-    </xs:element>
-    <xs:element name="EntityDisplayName" type="xs:string"/>
-    <xs:element name="EntityInstanceReference" type="xs:string"/>
-    <xs:element name="EntityId1" type="xs:string"/>
-    <xs:element name="EntityId2" type="xs:string"/>
-    <xs:element name="EntityId3" type="xs:string"/>
-    <xs:element name="EntityId4" type="xs:string"/>
-    <xs:element name="EntityId5" type="xs:string"/>
-    <xs:element name="Terms">
-      <xs:complexType>
-        <xs:sequence>
-          <xs:element ref="pc:TermInfo" minOccurs="0" maxOccurs="unbounded"/>
-        </xs:sequence>
-      </xs:complexType>
-    </xs:element>
-    <xs:element name="TermInfo">
-      <xs:complexType>
-        <xs:sequence>
-          <xs:element ref="pc:TermName" minOccurs="0"/>
-          <xs:element ref="pc:TermId" minOccurs="0"/>
-        </xs:sequence>
-      </xs:complexType>
-    </xs:element>
-    <xs:element name="TermName" type="xs:string"/>
-    <xs:element name="TermId" type="xs:string"/>
-  </xs:schema>
-</ct:contentTypeSchema>
-</file>
-
 <file path=customXml/itemProps1.xml><?xml version="1.0" encoding="utf-8"?>
-<ds:datastoreItem xmlns:ds="http://schemas.openxmlformats.org/officeDocument/2006/customXml" ds:itemID="{2F2CB120-89EE-4E4C-AC3A-037C340CBE59}">
-  <ds:schemaRefs>
-    <ds:schemaRef ds:uri="http://schemas.openxmlformats.org/officeDocument/2006/bibliography"/>
-  </ds:schemaRefs>
-</ds:datastoreItem>
-</file>
-
-<file path=customXml/itemProps2.xml><?xml version="1.0" encoding="utf-8"?>
-<ds:datastoreItem xmlns:ds="http://schemas.openxmlformats.org/officeDocument/2006/customXml" ds:itemID="{B58D4DAF-C7F0-4FA3-950B-89D41305B414}">
-  <ds:schemaRefs>
-    <ds:schemaRef ds:uri="http://schemas.microsoft.com/office/2006/metadata/properties"/>
-    <ds:schemaRef ds:uri="http://schemas.microsoft.com/office/infopath/2007/PartnerControls"/>
-    <ds:schemaRef ds:uri="152b35e6-23a1-4beb-a1fd-2689778f6058"/>
-  </ds:schemaRefs>
-</ds:datastoreItem>
-</file>
-
-<file path=customXml/itemProps3.xml><?xml version="1.0" encoding="utf-8"?>
-<ds:datastoreItem xmlns:ds="http://schemas.openxmlformats.org/officeDocument/2006/customXml" ds:itemID="{7F74FD34-EBDF-4094-A9AD-E46225785B9A}">
-  <ds:schemaRefs>
-    <ds:schemaRef ds:uri="http://schemas.microsoft.com/sharepoint/v3/contenttype/forms"/>
-  </ds:schemaRefs>
-</ds:datastoreItem>
-</file>
-
-<file path=customXml/itemProps4.xml><?xml version="1.0" encoding="utf-8"?>
-<ds:datastoreItem xmlns:ds="http://schemas.openxmlformats.org/officeDocument/2006/customXml" ds:itemID="{71334E21-6B6C-4687-847F-D6F99FF4EBD6}">
+<ds:datastoreItem xmlns:ds="http://schemas.openxmlformats.org/officeDocument/2006/customXml" ds:itemID="{64EBD5FD-079D-4E80-B32B-51B9F5FEEFB7}">
   <ds:schemaRefs>
     <ds:schemaRef ds:uri="http://schemas.microsoft.com/office/2006/metadata/contentType"/>
     <ds:schemaRef ds:uri="http://schemas.microsoft.com/office/2006/metadata/properties/metaAttributes"/>
     <ds:schemaRef ds:uri="http://www.w3.org/2001/XMLSchema"/>
     <ds:schemaRef ds:uri="http://schemas.microsoft.com/office/2006/metadata/properties"/>
-    <ds:schemaRef ds:uri="ed1181c6-4963-4f9c-a6e4-d7efb21233a0"/>
-    <ds:schemaRef ds:uri="152b35e6-23a1-4beb-a1fd-2689778f6058"/>
+    <ds:schemaRef ds:uri="2fbea1be-444b-4810-a171-216b375690c2"/>
+    <ds:schemaRef ds:uri="78beeb7a-d011-4854-8ba0-0712d94e68d3"/>
     <ds:schemaRef ds:uri="http://schemas.microsoft.com/office/2006/documentManagement/types"/>
     <ds:schemaRef ds:uri="http://schemas.microsoft.com/office/infopath/2007/PartnerControls"/>
     <ds:schemaRef ds:uri="http://schemas.openxmlformats.org/package/2006/metadata/core-properties"/>
@@ -15687,4 +16092,31 @@
     <ds:schemaRef ds:uri="http://schemas.microsoft.com/internal/obd"/>
   </ds:schemaRefs>
 </ds:datastoreItem>
+</file>
+
+<file path=customXml/itemProps2.xml><?xml version="1.0" encoding="utf-8"?>
+<ds:datastoreItem xmlns:ds="http://schemas.openxmlformats.org/officeDocument/2006/customXml" ds:itemID="{7F74FD34-EBDF-4094-A9AD-E46225785B9A}">
+  <ds:schemaRefs>
+    <ds:schemaRef ds:uri="http://schemas.microsoft.com/sharepoint/v3/contenttype/forms"/>
+  </ds:schemaRefs>
+</ds:datastoreItem>
+</file>
+
+<file path=customXml/itemProps3.xml><?xml version="1.0" encoding="utf-8"?>
+<ds:datastoreItem xmlns:ds="http://schemas.openxmlformats.org/officeDocument/2006/customXml" ds:itemID="{B58D4DAF-C7F0-4FA3-950B-89D41305B414}">
+  <ds:schemaRefs>
+    <ds:schemaRef ds:uri="http://schemas.microsoft.com/office/2006/metadata/properties"/>
+    <ds:schemaRef ds:uri="http://schemas.microsoft.com/office/infopath/2007/PartnerControls"/>
+    <ds:schemaRef ds:uri="2fbea1be-444b-4810-a171-216b375690c2"/>
+    <ds:schemaRef ds:uri="78beeb7a-d011-4854-8ba0-0712d94e68d3"/>
+  </ds:schemaRefs>
+</ds:datastoreItem>
+</file>
+
+<file path=customXml/itemProps4.xml><?xml version="1.0" encoding="utf-8"?>
+<ds:datastoreItem xmlns:ds="http://schemas.openxmlformats.org/officeDocument/2006/customXml" ds:itemID="{0D9B032B-9C44-4303-84EB-41A19654C7BA}">
+  <ds:schemaRefs>
+    <ds:schemaRef ds:uri="http://schemas.openxmlformats.org/officeDocument/2006/bibliography"/>
+  </ds:schemaRefs>
+</ds:datastoreItem>
 </file>
</xml_diff>

<commit_message>
Se modifico la tabla de recoleccion de datos
</commit_message>
<xml_diff>
--- a/Formato Proyecto Investigación.docx
+++ b/Formato Proyecto Investigación.docx
@@ -193,12 +193,12 @@
     </w:p>
     <w:p>
       <w:pPr>
+        <w:pStyle w:val="PrrAPA"/>
         <w:jc w:val="center"/>
-        <w:rPr>
-          <w:rFonts w:cs="Times New Roman"/>
-          <w:szCs w:val="24"/>
-        </w:rPr>
-      </w:pPr>
+      </w:pPr>
+      <w:r>
+        <w:t>Co-asesor: Julián Arango Toro</w:t>
+      </w:r>
     </w:p>
     <w:p>
       <w:pPr>
@@ -799,7 +799,7 @@
     <w:sdt>
       <w:sdtPr>
         <w:rPr>
-          <w:rFonts w:eastAsiaTheme="minorEastAsia" w:cstheme="minorBidi"/>
+          <w:rFonts w:eastAsiaTheme="minorHAnsi" w:cstheme="minorBidi"/>
           <w:b w:val="0"/>
           <w:szCs w:val="22"/>
           <w:lang w:eastAsia="en-US"/>
@@ -2259,50 +2259,63 @@
       <w:bookmarkStart w:id="16" w:name="_Toc1036221317"/>
       <w:r>
         <w:lastRenderedPageBreak/>
-        <w:t>Introducción</w:t>
+        <w:t>Introducció</w:t>
+      </w:r>
+      <w:commentRangeStart w:id="17"/>
+      <w:r>
+        <w:t>n</w:t>
       </w:r>
       <w:bookmarkEnd w:id="13"/>
       <w:bookmarkEnd w:id="14"/>
       <w:bookmarkEnd w:id="15"/>
       <w:bookmarkEnd w:id="16"/>
-    </w:p>
-    <w:p>
-      <w:pPr>
-        <w:ind w:firstLine="708"/>
-        <w:rPr>
-          <w:szCs w:val="24"/>
-        </w:rPr>
-      </w:pPr>
-    </w:p>
-    <w:p>
-      <w:pPr>
-        <w:ind w:firstLine="708"/>
-        <w:rPr>
-          <w:szCs w:val="24"/>
-        </w:rPr>
-      </w:pPr>
-      <w:r>
-        <w:rPr>
-          <w:szCs w:val="24"/>
-        </w:rPr>
-        <w:t>La introducción de un trabajo de grado debe presentar el tema de investigación, explicando el por qué y el para qué del estudio. Debe incluir el planteamiento del problema, los objetivos generales y específicos, las preguntas de investigación y la justificación del trabajo, resaltando su relevancia. Se debe explicar brevemente el enfoque metodológico y la estructura del documento. Aunque se recomienda el uso de tercera persona, las Normas APA permiten primera persona singular o plural, dependiendo de la cantidad de autores, por lo que es importante confirmar el estilo con el asesor</w:t>
-      </w:r>
-      <w:commentRangeStart w:id="17"/>
-      <w:r>
-        <w:rPr>
-          <w:rStyle w:val="Refdenotaalpie"/>
-          <w:szCs w:val="24"/>
-        </w:rPr>
-        <w:footnoteReference w:id="2"/>
-      </w:r>
       <w:commentRangeEnd w:id="17"/>
       <w:r>
         <w:rPr>
           <w:rStyle w:val="Refdecomentario"/>
           <w:sz w:val="24"/>
-          <w:szCs w:val="24"/>
+          <w:szCs w:val="32"/>
         </w:rPr>
         <w:commentReference w:id="17"/>
+      </w:r>
+    </w:p>
+    <w:p>
+      <w:pPr>
+        <w:ind w:firstLine="708"/>
+        <w:rPr>
+          <w:szCs w:val="24"/>
+        </w:rPr>
+      </w:pPr>
+    </w:p>
+    <w:p>
+      <w:pPr>
+        <w:ind w:firstLine="708"/>
+        <w:rPr>
+          <w:szCs w:val="24"/>
+        </w:rPr>
+      </w:pPr>
+      <w:r>
+        <w:rPr>
+          <w:szCs w:val="24"/>
+        </w:rPr>
+        <w:t>La introducción de un trabajo de grado debe presentar el tema de investigación, explicando el por qué y el para qué del estudio. Debe incluir el planteamiento del problema, los objetivos generales y específicos, las preguntas de investigación y la justificación del trabajo, resaltando su relevancia. Se debe explicar brevemente el enfoque metodológico y la estructura del documento. Aunque se recomienda el uso de tercera persona, las Normas APA permiten primera persona singular o plural, dependiendo de la cantidad de autores, por lo que es importante confirmar el estilo con el asesor</w:t>
+      </w:r>
+      <w:commentRangeStart w:id="18"/>
+      <w:r>
+        <w:rPr>
+          <w:rStyle w:val="Refdenotaalpie"/>
+          <w:szCs w:val="24"/>
+        </w:rPr>
+        <w:footnoteReference w:id="2"/>
+      </w:r>
+      <w:commentRangeEnd w:id="18"/>
+      <w:r>
+        <w:rPr>
+          <w:rStyle w:val="Refdecomentario"/>
+          <w:sz w:val="24"/>
+          <w:szCs w:val="24"/>
+        </w:rPr>
+        <w:commentReference w:id="18"/>
       </w:r>
       <w:r>
         <w:rPr>
@@ -3106,7 +3119,7 @@
           <w:b/>
         </w:rPr>
       </w:pPr>
-      <w:bookmarkStart w:id="18" w:name="_Toc440985126"/>
+      <w:bookmarkStart w:id="19" w:name="_Toc440985126"/>
     </w:p>
     <w:p>
       <w:pPr>
@@ -3131,13 +3144,13 @@
         </w:rPr>
         <w:t xml:space="preserve">1 </w:t>
       </w:r>
-      <w:bookmarkEnd w:id="18"/>
+      <w:bookmarkEnd w:id="19"/>
       <w:r>
         <w:rPr>
           <w:b/>
           <w:bCs/>
         </w:rPr>
-        <w:t>antecedentes</w:t>
+        <w:t>Antecedentes</w:t>
       </w:r>
     </w:p>
     <w:p>
@@ -3159,7 +3172,114 @@
         <w:rPr>
           <w:rFonts w:cs="Times New Roman"/>
         </w:rPr>
-        <w:t>Hoy en día, la tecnología de identificación por radiofrecuencia (RFID) se ha consolidado como un recurso clave en múltiples sectores, incluyendo la salud, la agricultura, el entretenimiento, la construcción y la seguridad, donde se emplea para la prevención del robo de vehículos y mercancías</w:t>
+        <w:t>Hoy en día, la tecnología de identificación por radiofrecuencia (RFID) se ha consolidado como un recurso clave en múltiples sectores, incluyendo la salud, la agricultura, el entretenimiento, la construcción y la seguridad, donde se emplea para la prevención del robo de vehículos y mercancías. En el ámbito de la logística y la cadena de suministro, el RFID ha sido ampliamente estudiado como herramienta que facilita la colaboración y la visibilidad entre actores, reflejándose en beneficios como la reducción de quiebres de inventario y la mejora de la trazabilidad de productos. Sin embargo, su adopción aún enfrenta limitaciones relacionadas con los costos de implementación, la falta de estandarización y los desafíos de seguridad (Bendavid et al., 2007).</w:t>
+      </w:r>
+    </w:p>
+    <w:p>
+      <w:pPr>
+        <w:ind w:firstLine="708"/>
+        <w:rPr>
+          <w:rFonts w:cs="Times New Roman"/>
+        </w:rPr>
+      </w:pPr>
+    </w:p>
+    <w:p>
+      <w:pPr>
+        <w:ind w:firstLine="708"/>
+        <w:rPr>
+          <w:rFonts w:cs="Times New Roman"/>
+        </w:rPr>
+      </w:pPr>
+      <w:r>
+        <w:rPr>
+          <w:rFonts w:cs="Times New Roman"/>
+        </w:rPr>
+        <w:t>En este contexto, la aplicación del RFID en bibliotecas y centros de documentación surge como una solución eficiente para el control e identificación de libros. Este tipo de sistemas permite agilizar los procesos de préstamo y devolución, optimizar la gestión del inventario, fortalecer la seguridad frente a pérdidas o extravíos y mejorar la experiencia de los usuarios al reducir tiempos y errores en las operaciones.</w:t>
+      </w:r>
+      <w:r>
+        <w:rPr>
+          <w:rFonts w:cs="Times New Roman"/>
+        </w:rPr>
+        <w:t xml:space="preserve"> Es importante resaltar que a pesar de la irrupción tecnológica, las bibliotecas siguen teniendo funciones esenciales en diferentes aspectos, como dar acceso a información, apoyo a investigación y transferencia de conocimiento </w:t>
+      </w:r>
+      <w:r>
+        <w:fldChar w:fldCharType="begin" w:fldLock="1"/>
+      </w:r>
+      <w:r>
+        <w:instrText>ADDIN CSL_CITATION {"citationItems":[{"id":"ITEM-1","itemData":{"author":[{"dropping-particle":"","family":"Codina","given":"Lluís","non-dropping-particle":"","parse-names":false,"suffix":""}],"id":"ITEM-1","issued":{"date-parts":[["2026"]]},"page":"48","publisher-place":"Barcelona","title":"La biblioteca unversitaria en la era de la IA.pdf","type":"article"},"uris":["http://www.mendeley.com/documents/?uuid=b6d9b2e2-d2ab-44e3-bad2-3fd34cf63500"]}],"mendeley":{"formattedCitation":"(Codina, 2026)","plainTextFormattedCitation":"(Codina, 2026)","previouslyFormattedCitation":"(Codina, 2026)"},"properties":{"noteIndex":0},"schema":"https://github.com/citation-style-language/schema/raw/master/csl-citation.json"}</w:instrText>
+      </w:r>
+      <w:r>
+        <w:fldChar w:fldCharType="separate"/>
+      </w:r>
+      <w:r>
+        <w:rPr>
+          <w:noProof/>
+        </w:rPr>
+        <w:t>(Codina, 2026)</w:t>
+      </w:r>
+      <w:r>
+        <w:fldChar w:fldCharType="end"/>
+      </w:r>
+      <w:r>
+        <w:t>, y de esta manera se deben transformar para seguir prestando sus servicios de una manera óptima pero también ágil.</w:t>
+      </w:r>
+    </w:p>
+    <w:p>
+      <w:pPr>
+        <w:ind w:firstLine="708"/>
+        <w:rPr>
+          <w:rFonts w:cs="Times New Roman"/>
+        </w:rPr>
+      </w:pPr>
+    </w:p>
+    <w:p>
+      <w:pPr>
+        <w:ind w:firstLine="708"/>
+        <w:rPr>
+          <w:rFonts w:cs="Times New Roman"/>
+        </w:rPr>
+      </w:pPr>
+      <w:r>
+        <w:rPr>
+          <w:rFonts w:cs="Times New Roman"/>
+        </w:rPr>
+        <w:t xml:space="preserve">Los sistemas RFID se caracteriza generalmente por el uso de un dispositivo simple en un extremo, llamado etiqueta, las etiquetas RFID pueden ser adhesivas, de papel o de plástico, también, de diversos tamaños. Dentro de la etiqueta se encuentra un chip capaz de almacenar cierta cantidad de información, por otro lado, se encuentra un dispositivo en el otro extremo del enlace, llamado lector. Una etiqueta consta de una antena y un chip de circuito </w:t>
+      </w:r>
+      <w:commentRangeStart w:id="20"/>
+      <w:r>
+        <w:rPr>
+          <w:rFonts w:cs="Times New Roman"/>
+        </w:rPr>
+        <w:t xml:space="preserve">integrado de aplicación </w:t>
+      </w:r>
+      <w:r>
+        <w:rPr>
+          <w:rFonts w:cs="Times New Roman"/>
+        </w:rPr>
+        <w:lastRenderedPageBreak/>
+        <w:t xml:space="preserve">específica (ASIC) </w:t>
+      </w:r>
+      <w:commentRangeEnd w:id="20"/>
+      <w:r>
+        <w:rPr>
+          <w:rStyle w:val="Refdecomentario"/>
+          <w:rFonts w:cs="Times New Roman"/>
+          <w:sz w:val="24"/>
+          <w:szCs w:val="22"/>
+        </w:rPr>
+        <w:commentReference w:id="20"/>
+      </w:r>
+      <w:r>
+        <w:rPr>
+          <w:rFonts w:cs="Times New Roman"/>
+        </w:rPr>
+        <w:t xml:space="preserve"> que, por lo general, en las bi</w:t>
+      </w:r>
+      <w:r>
+        <w:rPr>
+          <w:rFonts w:cs="Times New Roman"/>
+        </w:rPr>
+        <w:t>bliotecas suele usarse HF (13,56 MHz, ISO 15693/18000-3) por su buen acoplamiento cercano y menor apantallamiento por papel; para patios/logística domina UHF (ISO 18000-63 / EPC Gen2) por mayor alcance</w:t>
       </w:r>
       <w:r>
         <w:rPr>
@@ -3171,43 +3291,13 @@
         <w:rPr>
           <w:rFonts w:cs="Times New Roman"/>
         </w:rPr>
-        <w:t>(</w:t>
-      </w:r>
-      <w:r>
-        <w:rPr>
-          <w:rFonts w:cs="Times New Roman"/>
-        </w:rPr>
-        <w:t>Rachmatullah &amp; Faizin</w:t>
-      </w:r>
-      <w:r>
-        <w:rPr>
-          <w:rFonts w:cs="Times New Roman"/>
-        </w:rPr>
-        <w:t>, 20</w:t>
-      </w:r>
-      <w:r>
-        <w:rPr>
-          <w:rFonts w:cs="Times New Roman"/>
-        </w:rPr>
-        <w:t>23</w:t>
-      </w:r>
-      <w:r>
-        <w:rPr>
-          <w:rFonts w:cs="Times New Roman"/>
-        </w:rPr>
-        <w:t>).</w:t>
-      </w:r>
-      <w:r>
-        <w:rPr>
-          <w:rFonts w:cs="Times New Roman"/>
-        </w:rPr>
-        <w:t xml:space="preserve"> En el ámbito de la logística y la cadena de suministro, el RFID ha sido ampliamente estudiado como herramienta que facilita la colaboración y la visibilidad entre actores, reflejándose en beneficios como la reducción de quiebres de inventario y la mejora de la trazabilidad de productos</w:t>
-      </w:r>
-      <w:r>
-        <w:rPr>
-          <w:rFonts w:cs="Times New Roman"/>
-        </w:rPr>
-        <w:t xml:space="preserve"> </w:t>
+        <w:t xml:space="preserve">y, además, Estas </w:t>
+      </w:r>
+      <w:r>
+        <w:rPr>
+          <w:rFonts w:cs="Times New Roman"/>
+        </w:rPr>
+        <w:t xml:space="preserve">contiene la memoria donde se almacenan los datos. En ocasiones, pueden incluir una red de adaptación, ubicada entre la antena y el chip, para lograr una adaptación de impedancia precisa. El lector consta de una antena, un módulo electrónico de radiofrecuencia, responsable de la comunicación con la etiqueta, y un módulo de control electrónico, responsable de la comunicación con el ordenador central, generalmente conectado al lector para procesar la información entrante de forma centralizada. Los primeros intentos de introducir la tecnología de identificación por radiofrecuencia en las bibliotecas comenzaron a mediados de la década de 1990. La empresa pionera en este aspecto fue 3M (EE. UU.), que desde finales de la década de 1990 comenzó a producir e instalar sistemas de radiofrecuencia en bibliotecas </w:t>
       </w:r>
       <w:r>
         <w:rPr>
@@ -3219,7 +3309,7 @@
         <w:rPr>
           <w:rFonts w:cs="Times New Roman"/>
         </w:rPr>
-        <w:instrText>ADDIN CSL_CITATION {"citationItems":[{"id":"ITEM-1","itemData":{"DOI":"10.37934/araset.33.1.163174","ISSN":"24621943","abstract":"Radio Frequency Identification (RFID) refers to a wireless system comprising two components: tags and readers. The reader is a device with one or more antennas that emit radio waves and receive signals from the RFID tag. This system is available on most systems applications especially involving security systems, including house/office access systems, toll systems, and library systems. The accessing data is made stand-alone or data-based through the existing conventional RFID system on the market, especially in library systems. Also, the tag provided is only limited to the same type, either cards or stickers. From that, it will produce problems in monitoring the status of books, especially for loans or returns. At the same time, the difference in detection sensitivity will be the effect of the detection range for the types of tag used. Through this research, the development of adaptive RFID on IoT platforms with different types of passive tag library systems highly emphasized monitoring the status of books besides maximum range detection by using different types of passive tag and at the same time increasing the security by implementing the book status detection on the gate of the library. The tag sticker used can be read/written in the 13.56 MHz frequency with the High Frequency (HF) band due to its affordability and ease of implementation. RFID tags are embedded in all books and activated; it triggers the alarm system if the status return gets captured on the memory of the RFID tag. The alarm accuracy is almost 100%. The result showed that within the acceptable range of 5 cm, the RFID reader works efficiently in detecting books. It shows that the card tag gives 90% sensitivity of range detection, followed by the sticker and keychain tag at 70%, and, lastly, the transparent card tags at 40%.","author":[{"dropping-particle":"","family":"Ali","given":"Kharudin","non-dropping-particle":"","parse-names":false,"suffix":""},{"dropping-particle":"","family":"Rifai","given":"Damhuji","non-dropping-particle":"","parse-names":false,"suffix":""},{"dropping-particle":"","family":"Abdullah","given":"Afizullah","non-dropping-particle":"","parse-names":false,"suffix":""},{"dropping-particle":"","family":"Zain","given":"Muhammad Luqman Muhd","non-dropping-particle":"","parse-names":false,"suffix":""},{"dropping-particle":"","family":"Joraimee","given":"Ahmad","non-dropping-particle":"","parse-names":false,"suffix":""},{"dropping-particle":"","family":"Abdallah","given":"Ahmed N.","non-dropping-particle":"","parse-names":false,"suffix":""},{"dropping-particle":"","family":"Awang","given":"Nur Amalina","non-dropping-particle":"","parse-names":false,"suffix":""},{"dropping-particle":"","family":"Tan","given":"Jian Ding","non-dropping-particle":"","parse-names":false,"suffix":""},{"dropping-particle":"","family":"Paw","given":"Johnny Koh Siaw","non-dropping-particle":"","parse-names":false,"suffix":""},{"dropping-particle":"","family":"Yaw","given":"Chong Tak","non-dropping-particle":"","parse-names":false,"suffix":""}],"container-title":"Journal of Advanced Research in Applied Sciences and Engineering Technology","id":"ITEM-1","issue":"1","issued":{"date-parts":[["2023"]]},"page":"163-174","title":"Design of Adaptive RFID RC522 on IoT Platform with Different Types Passive Tag Based on Self-Service Library Management System (SSLMS)","type":"article-journal","volume":"33"},"uris":["http://www.mendeley.com/documents/?uuid=fcf6d57f-14c6-4443-b96b-ddd2953ced9f","http://www.mendeley.com/documents/?uuid=458909a3-3316-43f3-ad3d-6d3d795bf02f"]}],"mendeley":{"formattedCitation":"(Ali et al., 2023)","plainTextFormattedCitation":"(Ali et al., 2023)","previouslyFormattedCitation":"(Ali et al., 2023)"},"properties":{"noteIndex":0},"schema":"https://github.com/citation-style-language/schema/raw/master/csl-citation.json"}</w:instrText>
+        <w:instrText>ADDIN CSL_CITATION {"citationItems":[{"id":"ITEM-1","itemData":{"author":[{"dropping-particle":"","family":"Usman Arfan","given":"","non-dropping-particle":"","parse-names":false,"suffix":""}],"id":"ITEM-1","issued":{"date-parts":[["2024"]]},"page":"698-712","title":"Page_698","type":"article-journal"},"uris":["http://www.mendeley.com/documents/?uuid=772d7620-bfa8-4db9-9cce-0198c67e1a4f","http://www.mendeley.com/documents/?uuid=ba468603-f076-433e-a5d7-9ba64f2a9fa9"]}],"mendeley":{"formattedCitation":"(Usman Arfan, 2024)","plainTextFormattedCitation":"(Usman Arfan, 2024)","previouslyFormattedCitation":"(Usman Arfan, 2024)"},"properties":{"noteIndex":0},"schema":"https://github.com/citation-style-language/schema/raw/master/csl-citation.json"}</w:instrText>
       </w:r>
       <w:r>
         <w:rPr>
@@ -3232,7 +3322,7 @@
           <w:rFonts w:cs="Times New Roman"/>
           <w:noProof/>
         </w:rPr>
-        <w:t>(Ali et al., 2023)</w:t>
+        <w:t>(Usman Arfan, 2024)</w:t>
       </w:r>
       <w:r>
         <w:rPr>
@@ -3244,191 +3334,7 @@
         <w:rPr>
           <w:rFonts w:cs="Times New Roman"/>
         </w:rPr>
-        <w:t xml:space="preserve">. Sin embargo, su adopción aún enfrenta limitaciones relacionadas con los costos de implementación, la falta de estandarización y los desafíos de </w:t>
-      </w:r>
-      <w:r>
-        <w:rPr>
-          <w:rFonts w:cs="Times New Roman"/>
-        </w:rPr>
-        <w:t>seguridad (Bendavid et al., 2007).</w:t>
-      </w:r>
-    </w:p>
-    <w:p>
-      <w:pPr>
-        <w:ind w:firstLine="708"/>
-        <w:rPr>
-          <w:rFonts w:cs="Times New Roman"/>
-        </w:rPr>
-      </w:pPr>
-    </w:p>
-    <w:p>
-      <w:pPr>
-        <w:ind w:firstLine="708"/>
-        <w:rPr>
-          <w:rFonts w:cs="Times New Roman"/>
-        </w:rPr>
-      </w:pPr>
-      <w:r>
-        <w:rPr>
-          <w:rFonts w:cs="Times New Roman"/>
-        </w:rPr>
-        <w:t>En este contexto, la aplicación del RFID en bibliotecas y centros de documentación surge como una solución eficiente para el control e identificación de libros. Este tipo de sistemas permite agilizar los procesos de préstamo y devolución, optimizar la gestión del inventario, fortalecer la seguridad frente a pérdidas o extravíos y mejorar la experiencia de los usuarios al reducir tiempos y errores en las operaciones.</w:t>
-      </w:r>
-      <w:r>
-        <w:rPr>
-          <w:rFonts w:cs="Times New Roman"/>
-        </w:rPr>
-        <w:t xml:space="preserve"> Es importante resaltar que a pesar de la irrupción tecnológica, las bibliotecas siguen teniendo funciones esenciales en diferentes aspectos, como dar acceso a información, apoyo a investigación y transferencia de conocimiento </w:t>
-      </w:r>
-      <w:r>
-        <w:fldChar w:fldCharType="begin" w:fldLock="1"/>
-      </w:r>
-      <w:r>
-        <w:instrText>ADDIN CSL_CITATION {"citationItems":[{"id":"ITEM-1","itemData":{"author":[{"dropping-particle":"","family":"Codina","given":"Lluís","non-dropping-particle":"","parse-names":false,"suffix":""}],"id":"ITEM-1","issued":{"date-parts":[["2026"]]},"page":"48","publisher-place":"Barcelona","title":"La biblioteca unversitaria en la era de la IA.pdf","type":"article"},"uris":["http://www.mendeley.com/documents/?uuid=b6d9b2e2-d2ab-44e3-bad2-3fd34cf63500"]}],"mendeley":{"formattedCitation":"(Codina, 2026)","plainTextFormattedCitation":"(Codina, 2026)","previouslyFormattedCitation":"(Codina, 2026)"},"properties":{"noteIndex":0},"schema":"https://github.com/citation-style-language/schema/raw/master/csl-citation.json"}</w:instrText>
-      </w:r>
-      <w:r>
-        <w:fldChar w:fldCharType="separate"/>
-      </w:r>
-      <w:r>
-        <w:rPr>
-          <w:noProof/>
-        </w:rPr>
-        <w:t>(Codina, 2026)</w:t>
-      </w:r>
-      <w:r>
-        <w:fldChar w:fldCharType="end"/>
-      </w:r>
-      <w:r>
-        <w:t>,</w:t>
-      </w:r>
-      <w:r>
-        <w:t xml:space="preserve"> y de esta manera se deben transformar para seguir prestando sus servicios de una manera óptima pero también ágil.</w:t>
-      </w:r>
-    </w:p>
-    <w:p>
-      <w:pPr>
-        <w:ind w:firstLine="708"/>
-        <w:rPr>
-          <w:rFonts w:cs="Times New Roman"/>
-        </w:rPr>
-      </w:pPr>
-    </w:p>
-    <w:p>
-      <w:pPr>
-        <w:ind w:firstLine="708"/>
-        <w:rPr>
-          <w:rFonts w:cs="Times New Roman"/>
-        </w:rPr>
-      </w:pPr>
-      <w:r>
-        <w:rPr>
-          <w:rFonts w:cs="Times New Roman"/>
-        </w:rPr>
-        <w:t xml:space="preserve">Los sistemas RFID se caracteriza generalmente por el uso de un dispositivo simple en un extremo, llamado etiqueta, las etiquetas RFID pueden ser adhesivas, de papel o de plástico, también, de diversos tamaños. Dentro de la etiqueta se encuentra un chip capaz de almacenar cierta cantidad de información, por otro lado, se encuentra un dispositivo en el otro extremo del enlace, </w:t>
-      </w:r>
-      <w:r>
-        <w:rPr>
-          <w:rFonts w:cs="Times New Roman"/>
-        </w:rPr>
-        <w:lastRenderedPageBreak/>
-        <w:t xml:space="preserve">llamado lector. Una etiqueta consta de una antena y un chip de circuito integrado de aplicación específica (ASIC) </w:t>
-      </w:r>
-      <w:r>
-        <w:rPr>
-          <w:rFonts w:cs="Times New Roman"/>
-        </w:rPr>
-        <w:t xml:space="preserve"> que, por lo general, en las bibliotecas suele usarse HF (13,56 MHz, ISO 15693/18000-3) por su buen acoplamiento cercano y menor apantallamiento por papel; para patios/logística domina UHF (ISO 18000-63 / EPC Gen2) por mayor alcance </w:t>
-      </w:r>
-      <w:r>
-        <w:rPr>
-          <w:rFonts w:cs="Times New Roman"/>
-        </w:rPr>
-        <w:t xml:space="preserve">y, </w:t>
-      </w:r>
-      <w:r>
-        <w:rPr>
-          <w:rFonts w:cs="Times New Roman"/>
-        </w:rPr>
-        <w:t xml:space="preserve">además, </w:t>
-      </w:r>
-      <w:r>
-        <w:rPr>
-          <w:rFonts w:cs="Times New Roman"/>
-        </w:rPr>
-        <w:t>e</w:t>
-      </w:r>
-      <w:r>
-        <w:rPr>
-          <w:rFonts w:cs="Times New Roman"/>
-        </w:rPr>
-        <w:t>stas</w:t>
-      </w:r>
-      <w:r>
-        <w:rPr>
-          <w:rFonts w:cs="Times New Roman"/>
-        </w:rPr>
-        <w:t xml:space="preserve"> </w:t>
-      </w:r>
-      <w:r>
-        <w:rPr>
-          <w:rFonts w:cs="Times New Roman"/>
-        </w:rPr>
-        <w:t>contiene</w:t>
-      </w:r>
-      <w:r>
-        <w:rPr>
-          <w:rFonts w:cs="Times New Roman"/>
-        </w:rPr>
-        <w:t>n</w:t>
-      </w:r>
-      <w:r>
-        <w:rPr>
-          <w:rFonts w:cs="Times New Roman"/>
-        </w:rPr>
-        <w:t xml:space="preserve"> la memoria donde se almacenan los datos. En ocasiones, pueden incluir una red de adaptación, ubicada entre la antena y el chip, para lograr una adaptación de impedancia precisa. El lector consta de una antena, un módulo electrónico de radiofrecuencia, responsable de la comunicación con la etiqueta, y un módulo de control electrónico, responsable de la comunicación con el ordenador central, generalmente conectado al lector para procesar la información entrante de forma centralizada. Los primeros intentos de introducir la tecnología de identificación por radiofrecuencia en las bibliotecas comenzaron a mediados de la década de 1990. La empresa pionera en este aspecto fue 3M (EE. UU.), que desde finales de la década de 1990 comenzó a producir e instalar sistemas de radiofrecuencia en bibliotecas </w:t>
-      </w:r>
-      <w:r>
-        <w:rPr>
-          <w:rFonts w:cs="Times New Roman"/>
-        </w:rPr>
-        <w:fldChar w:fldCharType="begin" w:fldLock="1"/>
-      </w:r>
-      <w:r>
-        <w:rPr>
-          <w:rFonts w:cs="Times New Roman"/>
-        </w:rPr>
-        <w:instrText>ADDIN CSL_CITATION {"citationItems":[{"id":"ITEM-1","itemData":{"author":[{"dropping-particle":"","family":"Usman Arfan","given":"","non-dropping-particle":"","parse-names":false,"suffix":""}],"id":"ITEM-1","issued":{"date-parts":[["2024"]]},"page":"698-712","title":"Page_698","type":"article-journal"},"uris":["http://www.mendeley.com/documents/?uuid=772d7620-bfa8-4db9-9cce-0198c67e1a4f","http://www.mendeley.com/documents/?uuid=ba468603-f076-433e-a5d7-9ba64f2a9fa9"]}],"mendeley":{"formattedCitation":"(Usman Arfan, 2024)","plainTextFormattedCitation":"(Usman Arfan, 2024)","previouslyFormattedCitation":"(Usman Arfan, 2024)"},"properties":{"noteIndex":0},"schema":"https://github.com/citation-style-language/schema/raw/master/csl-citation.json"}</w:instrText>
-      </w:r>
-      <w:r>
-        <w:rPr>
-          <w:rFonts w:cs="Times New Roman"/>
-        </w:rPr>
-        <w:fldChar w:fldCharType="separate"/>
-      </w:r>
-      <w:r>
-        <w:rPr>
-          <w:rFonts w:cs="Times New Roman"/>
-          <w:noProof/>
-        </w:rPr>
-        <w:t>(Usman Arfan, 2024)</w:t>
-      </w:r>
-      <w:r>
-        <w:rPr>
-          <w:rFonts w:cs="Times New Roman"/>
-        </w:rPr>
-        <w:fldChar w:fldCharType="end"/>
-      </w:r>
-      <w:r>
-        <w:rPr>
-          <w:rFonts w:cs="Times New Roman"/>
-        </w:rPr>
-        <w:t>,</w:t>
-      </w:r>
-      <w:r>
-        <w:rPr>
-          <w:rFonts w:cs="Times New Roman"/>
-        </w:rPr>
-        <w:t xml:space="preserve"> adicionalmente, la teoría del </w:t>
+        <w:t xml:space="preserve">, adicionalmente, la teoría del </w:t>
       </w:r>
       <w:r>
         <w:rPr>
@@ -3475,12 +3381,6 @@
         </w:rPr>
         <w:fldChar w:fldCharType="end"/>
       </w:r>
-      <w:r>
-        <w:rPr>
-          <w:rFonts w:cs="Times New Roman"/>
-        </w:rPr>
-        <w:t>.</w:t>
-      </w:r>
     </w:p>
     <w:p>
       <w:pPr>
@@ -3542,7 +3442,25 @@
         <w:rPr>
           <w:rFonts w:cs="Times New Roman"/>
         </w:rPr>
-        <w:t>,</w:t>
+        <w:t xml:space="preserve">, </w:t>
+      </w:r>
+      <w:r>
+        <w:t>e</w:t>
+      </w:r>
+      <w:r>
+        <w:t xml:space="preserve">ncontraron que, a) </w:t>
+      </w:r>
+      <w:r>
+        <w:t>los sistemas de control de acceso, RFID, grabación electrónica y sistemas de seguridad de red/servidor, no se utilizan.</w:t>
+      </w:r>
+      <w:r>
+        <w:t xml:space="preserve"> b) </w:t>
+      </w:r>
+      <w:r>
+        <w:t>L</w:t>
+      </w:r>
+      <w:r>
+        <w:t>a Biblioteca de la Universidad de Michigan (MU) ha adoptado únicamente tres tipos principales de ESS: máquinas de detección de robos (68%), detectores de humo (20%) y cámaras de CCTV (12%).</w:t>
       </w:r>
       <w:r>
         <w:rPr>
@@ -3551,30 +3469,6 @@
         <w:t xml:space="preserve"> </w:t>
       </w:r>
       <w:r>
-        <w:t>e</w:t>
-      </w:r>
-      <w:r>
-        <w:t xml:space="preserve">ncontraron que, a) </w:t>
-      </w:r>
-      <w:r>
-        <w:t>los sistemas de control de acceso, RFID, grabación electrónica y sistemas de seguridad de red/servidor, no se utilizan.</w:t>
-      </w:r>
-      <w:r>
-        <w:t xml:space="preserve"> b) </w:t>
-      </w:r>
-      <w:r>
-        <w:t>L</w:t>
-      </w:r>
-      <w:r>
-        <w:t>a Biblioteca de la Universidad de Michigan (MU) ha adoptado únicamente tres tipos principales de ESS: máquinas de detección de robos (68%), detectores de humo (20%) y cámaras de CCTV (12%).</w:t>
-      </w:r>
-      <w:r>
-        <w:rPr>
-          <w:rFonts w:cs="Times New Roman"/>
-        </w:rPr>
-        <w:t xml:space="preserve"> </w:t>
-      </w:r>
-      <w:r>
         <w:rPr>
           <w:rFonts w:cs="Times New Roman"/>
         </w:rPr>
@@ -3608,49 +3502,23 @@
         <w:rPr>
           <w:rFonts w:cs="Times New Roman"/>
         </w:rPr>
-        <w:t xml:space="preserve"> los tipos de sistemas de seguridad electrónica usados en esta universidad, también evaluar su efectividad e identificar los desafíos que esta presenta, de igual manera desafíos complementarios como los son los tecnológicos, de personal, financieros y organizativos, sin embargo; distintos estudios confirman que la implementación de sistemas de seguridad y gestión basados en RFID fortalece la protección de colecciones, agiliza préstamos y devoluciones y mejora la experiencia de los </w:t>
-      </w:r>
-      <w:commentRangeStart w:id="19"/>
-      <w:r>
-        <w:rPr>
-          <w:rFonts w:cs="Times New Roman"/>
-        </w:rPr>
-        <w:t>usuarios</w:t>
-      </w:r>
-      <w:commentRangeEnd w:id="19"/>
-      <w:r>
-        <w:rPr>
-          <w:rStyle w:val="Refdecomentario"/>
-          <w:rFonts w:cs="Times New Roman"/>
-          <w:sz w:val="24"/>
-          <w:szCs w:val="22"/>
-        </w:rPr>
-        <w:commentReference w:id="19"/>
-      </w:r>
-      <w:r>
-        <w:rPr>
-          <w:rFonts w:cs="Times New Roman"/>
-        </w:rPr>
-        <w:t xml:space="preserve"> </w:t>
-      </w:r>
-      <w:r>
-        <w:rPr>
-          <w:rFonts w:cs="Times New Roman"/>
-          <w:highlight w:val="red"/>
+        <w:t xml:space="preserve"> los tipos de sistemas de seguridad electrónica usados en esta universidad, también evaluar su efectividad e identificar los desafíos que esta presenta, de igual manera desafíos complementarios como los son los tecnológicos, de personal, financieros y organizativos, sin embargo; distintos estudios confirman que la implementación de sistemas de seguridad y gestión basados en RFID fortalece la protección de colecciones, agiliza préstamos y devoluciones y mejora la experiencia de los usuarios </w:t>
+      </w:r>
+      <w:r>
+        <w:rPr>
+          <w:rFonts w:cs="Times New Roman"/>
         </w:rPr>
         <w:fldChar w:fldCharType="begin" w:fldLock="1"/>
       </w:r>
       <w:r>
         <w:rPr>
           <w:rFonts w:cs="Times New Roman"/>
-          <w:highlight w:val="red"/>
         </w:rPr>
         <w:instrText>ADDIN CSL_CITATION {"citationItems":[{"id":"ITEM-1","itemData":{"abstract":"For many years, libraries were operated manually which made the job of the Librarian tedious and slow. However, in recent years, modern life has increased the demand for reliable communication systems and internet technologies. Activity such as e-learning has forced the global educational institution to adopt an automated library, the Radio Frequency Identification (RFID) system was introduced and also, the need for tracking and identification of library resources. In this paper, an RFID-based detection system was used. It involves the use of radio frequency and microchip technology, alongside other components to identify books leaving the library efficiently. The RFID tag used is the passive read/write tag in the 13.56 MHz unlicensed Radio Frequency band, due to its affordability and ease of implementation. This paper seeks to enlighten library users, such as administrators about the importance of RFID technology in the improvement of library management. The proposed system consists of the antitheft security gate, used to detect, if a library book has been properly checked out and a database (middleware) to know which book or material was taken or is about to leave. The result showed that within the acceptable range of 40 mm, the RFID reader works efficiently in theft detection. This range can extend for large-scale deployment.","author":[{"dropping-particle":"","family":"Adeniran","given":"Temitayo Caroline","non-dropping-particle":"","parse-names":false,"suffix":""},{"dropping-particle":"","family":"Zubairu","given":"Joy Hadiza","non-dropping-particle":"","parse-names":false,"suffix":""},{"dropping-particle":"","family":"Onidare","given":"Samuel Olusayo","non-dropping-particle":"","parse-names":false,"suffix":""}],"container-title":"International Journal of Information Processing and Communication (IJIPC)","id":"ITEM-1","issue":"2","issued":{"date-parts":[["2018"]]},"page":"334-346","title":"Design and Implementation of a Secured Automated Library Using RFID","type":"article-journal","volume":"6"},"uris":["http://www.mendeley.com/documents/?uuid=230efa4d-f119-4c13-bdb2-efd2b1d693e6","http://www.mendeley.com/documents/?uuid=152b819f-32a4-468e-9f11-39ef2a4ff935"]}],"mendeley":{"formattedCitation":"(Adeniran et al., 2018)","plainTextFormattedCitation":"(Adeniran et al., 2018)","previouslyFormattedCitation":"(Adeniran et al., 2018)"},"properties":{"noteIndex":0},"schema":"https://github.com/citation-style-language/schema/raw/master/csl-citation.json"}</w:instrText>
       </w:r>
       <w:r>
         <w:rPr>
           <w:rFonts w:cs="Times New Roman"/>
-          <w:highlight w:val="red"/>
         </w:rPr>
         <w:fldChar w:fldCharType="separate"/>
       </w:r>
@@ -3658,29 +3526,20 @@
         <w:rPr>
           <w:rFonts w:cs="Times New Roman"/>
           <w:noProof/>
-          <w:highlight w:val="red"/>
         </w:rPr>
         <w:t>(Adeniran et al., 2018)</w:t>
       </w:r>
       <w:r>
         <w:rPr>
           <w:rFonts w:cs="Times New Roman"/>
-          <w:highlight w:val="red"/>
         </w:rPr>
         <w:fldChar w:fldCharType="end"/>
       </w:r>
       <w:r>
         <w:rPr>
           <w:rFonts w:cs="Times New Roman"/>
-          <w:highlight w:val="red"/>
-        </w:rPr>
-        <w:t>.</w:t>
-      </w:r>
-      <w:r>
-        <w:rPr>
-          <w:rFonts w:cs="Times New Roman"/>
-        </w:rPr>
-        <w:t xml:space="preserve">  </w:t>
+        </w:rPr>
+        <w:t xml:space="preserve">.  </w:t>
       </w:r>
     </w:p>
     <w:p>
@@ -3694,63 +3553,14 @@
         <w:rPr>
           <w:rFonts w:cs="Times New Roman"/>
         </w:rPr>
-        <w:t xml:space="preserve">En HF (13.56 MHz) y UHF (860–960 MHz), el desempeño depende en gran medida de la distancia entre el sensor y la etiqueta, del tipo y grosor de la barrera que los separa, así como de la </w:t>
+        <w:t xml:space="preserve">En HF (13.56 MHz) y UHF (860–960 MHz), el desempeño depende en gran medida de la distancia entre el sensor y la etiqueta, del tipo y grosor de la barrera que los separa, así como de la presencia de objetos sólidos que interfieren con la señal (Informatika et al., 2023). Investigaciones </w:t>
       </w:r>
       <w:r>
         <w:rPr>
           <w:rFonts w:cs="Times New Roman"/>
         </w:rPr>
         <w:lastRenderedPageBreak/>
-        <w:t>presencia de objetos sólidos que interfieren con la señal (</w:t>
-      </w:r>
-      <w:r>
-        <w:rPr>
-          <w:rFonts w:cs="Times New Roman"/>
-        </w:rPr>
-        <w:t>Informatika et al., 2023).</w:t>
-      </w:r>
-      <w:r>
-        <w:rPr>
-          <w:rFonts w:cs="Times New Roman"/>
-        </w:rPr>
-        <w:t xml:space="preserve"> Investigaciones recientes destacan que la frecuencia de operación, el acoplamiento entre antenas y las condiciones del entorno siguen siendo factores críticos para el </w:t>
-      </w:r>
-      <w:r>
-        <w:rPr>
-          <w:rFonts w:cs="Times New Roman"/>
-        </w:rPr>
-        <w:t>rendimiento (Khair et al., 2022),</w:t>
-      </w:r>
-      <w:r>
-        <w:rPr>
-          <w:rFonts w:cs="Times New Roman"/>
-        </w:rPr>
-        <w:t xml:space="preserve"> lo que reafirma observaciones previas realizadas en Japón sobre la sensibilidad del sistema ante estas variables </w:t>
-      </w:r>
-      <w:r>
-        <w:rPr>
-          <w:rFonts w:cs="Times New Roman"/>
-          <w:highlight w:val="red"/>
-        </w:rPr>
-        <w:t>(</w:t>
-      </w:r>
-      <w:commentRangeStart w:id="20"/>
-      <w:r>
-        <w:rPr>
-          <w:rFonts w:cs="Times New Roman"/>
-          <w:highlight w:val="red"/>
-        </w:rPr>
-        <w:t>Fujisaki, 2015).</w:t>
-      </w:r>
-      <w:commentRangeEnd w:id="20"/>
-      <w:r>
-        <w:rPr>
-          <w:rStyle w:val="Refdecomentario"/>
-          <w:rFonts w:cs="Times New Roman"/>
-          <w:sz w:val="24"/>
-          <w:szCs w:val="22"/>
-        </w:rPr>
-        <w:commentReference w:id="20"/>
+        <w:t>recientes destacan que la frecuencia de operación, el acoplamiento entre antenas y las condiciones del entorno siguen siendo factores críticos para el rendimiento (Khair et al., 2022), lo que reafirma observaciones previas realizadas en Japón sobre la sensibilidad del sistema ante estas variables (Fujisaki, 2015).</w:t>
       </w:r>
     </w:p>
     <w:p>
@@ -3764,13 +3574,7 @@
         <w:rPr>
           <w:rFonts w:cs="Times New Roman"/>
         </w:rPr>
-        <w:t>Por lo tanto, para dar solución o dar avances hacia esta se proponen o implementan sistemas con tecnología RFID o NFC, como por ejemplo</w:t>
-      </w:r>
-      <w:r>
-        <w:rPr>
-          <w:rFonts w:cs="Times New Roman"/>
-        </w:rPr>
-        <w:t xml:space="preserve">, </w:t>
+        <w:t xml:space="preserve">Por lo tanto, para dar solución o dar avances hacia esta se proponen o implementan sistemas con tecnología RFID o NFC, como por ejemplo, </w:t>
       </w:r>
       <w:r>
         <w:rPr>
@@ -3895,13 +3699,7 @@
         <w:rPr>
           <w:rFonts w:cs="Times New Roman"/>
         </w:rPr>
-        <w:t>De la misma forma</w:t>
-      </w:r>
-      <w:r>
-        <w:rPr>
-          <w:rFonts w:cs="Times New Roman"/>
-        </w:rPr>
-        <w:t xml:space="preserve">, </w:t>
+        <w:t xml:space="preserve">De la misma forma, </w:t>
       </w:r>
       <w:r>
         <w:rPr>
@@ -4035,13 +3833,7 @@
         <w:rPr>
           <w:rFonts w:cs="Times New Roman"/>
         </w:rPr>
-        <w:t xml:space="preserve">En línea con ello, la literatura reciente señala que RFID no solo moderniza los procesos de inventario, circulación y seguridad, sino que además facilita la integración de sistemas de autoservicio y monitoreo en tiempo real, aportando eficiencia y reduciendo la intervención manual. No obstante, su implementación aún enfrenta desafíos relacionados con costos de instalación, mantenimiento y privacidad de los </w:t>
-      </w:r>
-      <w:r>
-        <w:rPr>
-          <w:rFonts w:cs="Times New Roman"/>
-        </w:rPr>
-        <w:t>datos</w:t>
+        <w:t>En línea con ello, la literatura reciente señala que RFID no solo moderniza los procesos de inventario, circulación y seguridad, sino que además facilita la integración de sistemas de autoservicio y monitoreo en tiempo real, aportando eficiencia y reduciendo la intervención manual. No obstante, su implementación aún enfrenta desafíos relacionados con costos de instalación, mantenimiento y privacidad de los datos</w:t>
       </w:r>
       <w:r>
         <w:rPr>
@@ -4099,10 +3891,7 @@
         <w:fldChar w:fldCharType="end"/>
       </w:r>
       <w:r>
-        <w:t>,</w:t>
-      </w:r>
-      <w:r>
-        <w:t xml:space="preserve"> se puede observar que las bibliotecas deben evolucionar rápidamente y esto requiere impulsar las medidas de seguridad para desarrollar sistemas de control que mejoren la experiencia de los usuarios, y es ahí donde los sistemas RFID toman fuerza para brindar una solución como algoritmos inteligentes en la evolución de estas bibliotecas.</w:t>
+        <w:t>, se puede observar que las bibliotecas deben evolucionar rápidamente y esto requiere impulsar las medidas de seguridad para desarrollar sistemas de control que mejoren la experiencia de los usuarios, y es ahí donde los sistemas RFID toman fuerza para brindar una solución como algoritmos inteligentes en la evolución de estas bibliotecas.</w:t>
       </w:r>
     </w:p>
     <w:p>
@@ -4116,13 +3905,7 @@
         <w:rPr>
           <w:rFonts w:cs="Times New Roman"/>
         </w:rPr>
-        <w:t xml:space="preserve">Desde una perspectiva más amplia, el Internet de las Cosas (IoT) ha comenzado a ser adoptado en bibliotecas universitarias como estrategia para fortalecer la gestión del conocimiento. Casos en África muestran que, aunque la adopción es todavía incipiente, existe una relación positiva entre IoT, acceso a la información y colaboración </w:t>
-      </w:r>
-      <w:r>
-        <w:rPr>
-          <w:rFonts w:cs="Times New Roman"/>
-        </w:rPr>
-        <w:t xml:space="preserve">académica, siempre que se cuente con infraestructura robusta y formación adecuada del personal </w:t>
+        <w:t xml:space="preserve">Desde una perspectiva más amplia, el Internet de las Cosas (IoT) ha comenzado a ser adoptado en bibliotecas universitarias como estrategia para fortalecer la gestión del conocimiento. Casos en África muestran que, aunque la adopción es todavía incipiente, existe una relación positiva entre IoT, acceso a la información y colaboración académica, siempre que se cuente con infraestructura robusta y formación adecuada del personal </w:t>
       </w:r>
       <w:r>
         <w:rPr>
@@ -4199,25 +3982,21 @@
         </w:rPr>
         <w:t xml:space="preserve">En cuanto a la evolución tecnológica en Asia, se observa que el uso de RFID en la gestión bibliotecaria ha transformado los servicios al permitir identificación sin contacto, organización más eficiente de colecciones y una notable reducción en la carga operativa del personal. La experiencia de China y Estados Unidos muestra que estas soluciones han pasado de ser experimentales a sistemas consolidados, con amplia aceptación entre usuarios </w:t>
       </w:r>
-      <w:commentRangeStart w:id="21"/>
-      <w:r>
-        <w:rPr>
-          <w:rFonts w:cs="Times New Roman"/>
-          <w:highlight w:val="red"/>
+      <w:r>
+        <w:rPr>
+          <w:rFonts w:cs="Times New Roman"/>
         </w:rPr>
         <w:fldChar w:fldCharType="begin" w:fldLock="1"/>
       </w:r>
       <w:r>
         <w:rPr>
           <w:rFonts w:cs="Times New Roman"/>
-          <w:highlight w:val="red"/>
         </w:rPr>
         <w:instrText>ADDIN CSL_CITATION {"citationItems":[{"id":"ITEM-1","itemData":{"DOI":"10.4028/www.scientific.net/AMM.513-517.620","ISBN":"9783038350125","ISSN":"16609336","abstract":"As the application of the information network technology continuously extended, library management service platform is experiencing a shift to the information service system. In the library information management field, researchers are seeking a library identification system which is more convenient and comprehensive. Under the circumstance of the information technology conditions, Radio Frequency Identification (RFID) technology completes the automatic identification of the electronic identification tags--the two-dimensional code. The RFID technology is a contactless scanning recognition technology. And the core technology of RFID can be described as follows: using two-dimensional code as the filter identification tool according to backup data of the book management. © (2014) Trans Tech Publications, Switzerland.","author":[{"dropping-particle":"","family":"Wang","given":"Ji Kun","non-dropping-particle":"","parse-names":false,"suffix":""},{"dropping-particle":"","family":"Hu","given":"Xing Zhi","non-dropping-particle":"","parse-names":false,"suffix":""},{"dropping-particle":"","family":"Li","given":"Xue Zhe","non-dropping-particle":"","parse-names":false,"suffix":""},{"dropping-particle":"","family":"Ding","given":"Fei Ji","non-dropping-particle":"","parse-names":false,"suffix":""}],"container-title":"Applied Mechanics and Materials","id":"ITEM-1","issued":{"date-parts":[["2014"]]},"page":"620-623","title":"A research of the application of the RFID in the library management","type":"article-journal","volume":"513-517"},"uris":["http://www.mendeley.com/documents/?uuid=972affde-b6af-4977-93fc-54ee591aecd4","http://www.mendeley.com/documents/?uuid=42e6b205-ac53-4bc0-91b0-d06bba0735ff"]}],"mendeley":{"formattedCitation":"(Wang et al., 2014)","plainTextFormattedCitation":"(Wang et al., 2014)","previouslyFormattedCitation":"(Wang et al., 2014)"},"properties":{"noteIndex":0},"schema":"https://github.com/citation-style-language/schema/raw/master/csl-citation.json"}</w:instrText>
       </w:r>
       <w:r>
         <w:rPr>
           <w:rFonts w:cs="Times New Roman"/>
-          <w:highlight w:val="red"/>
         </w:rPr>
         <w:fldChar w:fldCharType="separate"/>
       </w:r>
@@ -4225,34 +4004,21 @@
         <w:rPr>
           <w:rFonts w:cs="Times New Roman"/>
           <w:noProof/>
-          <w:highlight w:val="red"/>
         </w:rPr>
         <w:t>(Wang et al., 2014)</w:t>
       </w:r>
       <w:r>
         <w:rPr>
           <w:rFonts w:cs="Times New Roman"/>
-          <w:highlight w:val="red"/>
         </w:rPr>
         <w:fldChar w:fldCharType="end"/>
       </w:r>
       <w:r>
         <w:rPr>
           <w:rFonts w:cs="Times New Roman"/>
-          <w:highlight w:val="red"/>
         </w:rPr>
         <w:t>.</w:t>
       </w:r>
-      <w:commentRangeEnd w:id="21"/>
-      <w:r>
-        <w:rPr>
-          <w:rStyle w:val="Refdecomentario"/>
-          <w:rFonts w:cs="Times New Roman"/>
-          <w:sz w:val="24"/>
-          <w:szCs w:val="22"/>
-        </w:rPr>
-        <w:commentReference w:id="21"/>
-      </w:r>
     </w:p>
     <w:p>
       <w:pPr>
@@ -4341,13 +4107,7 @@
           <w:rFonts w:cs="Times New Roman"/>
         </w:rPr>
         <w:lastRenderedPageBreak/>
-        <w:t xml:space="preserve">Observando otras implementaciones, se observa que diseñaron e implementaron soluciones orientadas a la automatización de procesos clave, como la circulación, la seguridad, el inventario y la recuperación de libros, sustituyendo los códigos de barras y las tiras electromagnéticas por etiquetas RFID integradas a lectores y antenas instalados en puertas de seguridad, estanterías y kioskos de </w:t>
-      </w:r>
-      <w:r>
-        <w:rPr>
-          <w:rFonts w:cs="Times New Roman"/>
-        </w:rPr>
-        <w:t>autoservicio</w:t>
+        <w:t>Observando otras implementaciones, se observa que diseñaron e implementaron soluciones orientadas a la automatización de procesos clave, como la circulación, la seguridad, el inventario y la recuperación de libros, sustituyendo los códigos de barras y las tiras electromagnéticas por etiquetas RFID integradas a lectores y antenas instalados en puertas de seguridad, estanterías y kioskos de autoservicio</w:t>
       </w:r>
       <w:r>
         <w:rPr>
@@ -4421,61 +4181,29 @@
         <w:rPr>
           <w:rFonts w:cs="Times New Roman"/>
         </w:rPr>
-        <w:t>,</w:t>
-      </w:r>
-      <w:r>
-        <w:rPr>
-          <w:rFonts w:cs="Times New Roman"/>
-        </w:rPr>
-        <w:t xml:space="preserve"> donde muestran la eficiencia en la implementación de gestión bibliotecaria por medio de tecnología RFID</w:t>
-      </w:r>
-      <w:r>
-        <w:rPr>
-          <w:rFonts w:cs="Times New Roman"/>
-        </w:rPr>
-        <w:t xml:space="preserve">. Otros trabajos se enfocaron en la gestión de inventario en tiempo real, diseñando, simulando e implementando sistemas capaces de contar y localizar libros directamente en los estantes, superando así las limitaciones de los lectores portátiles y del escaneo manual propio de los códigos de </w:t>
-      </w:r>
-      <w:commentRangeStart w:id="22"/>
-      <w:r>
-        <w:rPr>
-          <w:rFonts w:cs="Times New Roman"/>
-        </w:rPr>
-        <w:t>barras</w:t>
-      </w:r>
-      <w:commentRangeEnd w:id="22"/>
-      <w:r>
-        <w:rPr>
-          <w:rStyle w:val="Refdecomentario"/>
-          <w:rFonts w:cs="Times New Roman"/>
-          <w:sz w:val="24"/>
-          <w:szCs w:val="22"/>
-        </w:rPr>
-        <w:commentReference w:id="22"/>
-      </w:r>
-      <w:r>
-        <w:rPr>
-          <w:rFonts w:cs="Times New Roman"/>
-        </w:rPr>
-        <w:t xml:space="preserve"> </w:t>
-      </w:r>
-      <w:r>
-        <w:rPr>
-          <w:rFonts w:cs="Times New Roman"/>
-          <w:highlight w:val="magenta"/>
+        <w:t>, donde muestran la eficiencia en la implementación de gestión bibliotecaria por medio de tecnología RFID</w:t>
+      </w:r>
+      <w:r>
+        <w:rPr>
+          <w:rFonts w:cs="Times New Roman"/>
+        </w:rPr>
+        <w:t xml:space="preserve">. Otros trabajos se enfocaron en la gestión de inventario en tiempo real, diseñando, simulando e implementando sistemas capaces de contar y localizar libros directamente en los estantes, superando así las limitaciones de los lectores portátiles y del escaneo manual propio de los códigos de barras </w:t>
+      </w:r>
+      <w:r>
+        <w:rPr>
+          <w:rFonts w:cs="Times New Roman"/>
         </w:rPr>
         <w:fldChar w:fldCharType="begin" w:fldLock="1"/>
       </w:r>
       <w:r>
         <w:rPr>
           <w:rFonts w:cs="Times New Roman"/>
-          <w:highlight w:val="magenta"/>
         </w:rPr>
         <w:instrText>ADDIN CSL_CITATION {"citationItems":[{"id":"ITEM-1","itemData":{"author":[{"dropping-particle":"","family":"Mvoulabolo","given":"Meryle K","non-dropping-particle":"","parse-names":false,"suffix":""}],"id":"ITEM-1","issue":"December","issued":{"date-parts":[["2019"]]},"title":"DESIGN AND IMPLEMENTATION OF AN INVENTORY MANAGEMENT SYSTEM IN LIBRARIES USING RADIO FREQUENCY IDENTIFICATION A dissertation submitted in the fulfilment of the requirements for Master of Engineering : Electrical Department of Process Control &amp; Computer Sy","type":"article-journal"},"uris":["http://www.mendeley.com/documents/?uuid=53b2dcbf-9def-493b-87da-6c2c443205c2"]}],"mendeley":{"formattedCitation":"(Mvoulabolo, 2019)","plainTextFormattedCitation":"(Mvoulabolo, 2019)","previouslyFormattedCitation":"(Mvoulabolo, 2019)"},"properties":{"noteIndex":0},"schema":"https://github.com/citation-style-language/schema/raw/master/csl-citation.json"}</w:instrText>
       </w:r>
       <w:r>
         <w:rPr>
           <w:rFonts w:cs="Times New Roman"/>
-          <w:highlight w:val="magenta"/>
         </w:rPr>
         <w:fldChar w:fldCharType="separate"/>
       </w:r>
@@ -4483,14 +4211,12 @@
         <w:rPr>
           <w:rFonts w:cs="Times New Roman"/>
           <w:noProof/>
-          <w:highlight w:val="magenta"/>
         </w:rPr>
         <w:t>(Mvoulabolo, 2019)</w:t>
       </w:r>
       <w:r>
         <w:rPr>
           <w:rFonts w:cs="Times New Roman"/>
-          <w:highlight w:val="magenta"/>
         </w:rPr>
         <w:fldChar w:fldCharType="end"/>
       </w:r>
@@ -4498,49 +4224,23 @@
         <w:rPr>
           <w:rFonts w:cs="Times New Roman"/>
         </w:rPr>
-        <w:t xml:space="preserve">. También se han desarrollado soluciones más especializadas, como el diseño y prueba de una antena RFID impresa a 915 MHz, optimizada para mejorar la cobertura y la precisión de lectura en múltiples estantes, reduciendo los errores por la orientación de los tags y las restricciones físicas del </w:t>
-      </w:r>
-      <w:commentRangeStart w:id="23"/>
-      <w:r>
-        <w:rPr>
-          <w:rFonts w:cs="Times New Roman"/>
-        </w:rPr>
-        <w:t>espacio</w:t>
-      </w:r>
-      <w:commentRangeEnd w:id="23"/>
-      <w:r>
-        <w:rPr>
-          <w:rStyle w:val="Refdecomentario"/>
-          <w:rFonts w:cs="Times New Roman"/>
-          <w:sz w:val="24"/>
-          <w:szCs w:val="22"/>
-        </w:rPr>
-        <w:commentReference w:id="23"/>
-      </w:r>
-      <w:r>
-        <w:rPr>
-          <w:rFonts w:cs="Times New Roman"/>
-        </w:rPr>
-        <w:t xml:space="preserve"> </w:t>
-      </w:r>
-      <w:r>
-        <w:rPr>
-          <w:rFonts w:cs="Times New Roman"/>
-          <w:highlight w:val="red"/>
+        <w:t xml:space="preserve">. También se han desarrollado soluciones más especializadas, como el diseño y prueba de una antena RFID impresa a 915 MHz, optimizada para mejorar la cobertura y la precisión de lectura en múltiples estantes, reduciendo los errores por la orientación de los tags y las restricciones físicas del espacio </w:t>
+      </w:r>
+      <w:r>
+        <w:rPr>
+          <w:rFonts w:cs="Times New Roman"/>
         </w:rPr>
         <w:fldChar w:fldCharType="begin" w:fldLock="1"/>
       </w:r>
       <w:r>
         <w:rPr>
           <w:rFonts w:cs="Times New Roman"/>
-          <w:highlight w:val="red"/>
         </w:rPr>
         <w:instrText>ADDIN CSL_CITATION {"citationItems":[{"id":"ITEM-1","itemData":{"DOI":"10.1051/matecconf/201712300028","ISSN":"2261236X","abstract":"A 915 MHz printed radio-frequency-identification (RFID) antennas with the characteristics of good gain and omnidirectional beam wave is constructed and evaluated in this study. The objective is to find out their best reading rates for providing effective wireless communications among RFID antenna during the library book inventory process. And an optimal library inventory system which is based on electromagnetic identification (EMID) technology is proposed, which is constructed to find the optimal tag location for a book, test the tag readability for bookshelves, and connect a couple of multi-layer bookshelves with multiplexers and updat the tag reading status in the database of the computer terminal. The fabricated antenna reader and the proposed system are embedded into different locations of bookshelves and tested at the library of Cheng Shiu University in Taiwan. According to the experimental results, the designed prototype of the antenna reader has the characteristics of the directional radiation pattern, good gain, simple shape, low cost and is easy to be integrated into the bookshelf. And the designed library inventory system can authenticate the location of a book automatically. They can benefit administrating librarians with the capabilities of decreasing the library inventory processing time and reducing the possibility of the books being misplaced.","author":[{"dropping-particle":"","family":"Cheng","given":"Ching Chien","non-dropping-particle":"","parse-names":false,"suffix":""},{"dropping-particle":"","family":"Shih","given":"Sung Tsun","non-dropping-particle":"","parse-names":false,"suffix":""},{"dropping-particle":"","family":"Cheng","given":"Kong Xin","non-dropping-particle":"","parse-names":false,"suffix":""},{"dropping-particle":"","family":"Kung","given":"Huang Kuang","non-dropping-particle":"","parse-names":false,"suffix":""},{"dropping-particle":"","family":"Wang","given":"Chin Yu","non-dropping-particle":"","parse-names":false,"suffix":""}],"container-title":"MATEC Web of Conferences","id":"ITEM-1","issued":{"date-parts":[["2017"]]},"title":"Design of books inventory with RFID antenna in library management system","type":"article-journal","volume":"123"},"uris":["http://www.mendeley.com/documents/?uuid=efbbf0f9-0d66-42b3-b76e-70b47ef777e2"]}],"mendeley":{"formattedCitation":"(Cheng et al., 2017)","plainTextFormattedCitation":"(Cheng et al., 2017)","previouslyFormattedCitation":"(Cheng et al., 2017)"},"properties":{"noteIndex":0},"schema":"https://github.com/citation-style-language/schema/raw/master/csl-citation.json"}</w:instrText>
       </w:r>
       <w:r>
         <w:rPr>
           <w:rFonts w:cs="Times New Roman"/>
-          <w:highlight w:val="red"/>
         </w:rPr>
         <w:fldChar w:fldCharType="separate"/>
       </w:r>
@@ -4548,14 +4248,12 @@
         <w:rPr>
           <w:rFonts w:cs="Times New Roman"/>
           <w:noProof/>
-          <w:highlight w:val="red"/>
         </w:rPr>
         <w:t>(Cheng et al., 2017)</w:t>
       </w:r>
       <w:r>
         <w:rPr>
           <w:rFonts w:cs="Times New Roman"/>
-          <w:highlight w:val="red"/>
         </w:rPr>
         <w:fldChar w:fldCharType="end"/>
       </w:r>
@@ -4614,33 +4312,23 @@
         <w:rPr>
           <w:rFonts w:cs="Times New Roman"/>
         </w:rPr>
-        <w:t>.</w:t>
-      </w:r>
-      <w:r>
-        <w:rPr>
-          <w:rFonts w:cs="Times New Roman"/>
-        </w:rPr>
-        <w:t xml:space="preserve"> De manera similar, otros autores propusieron e implementaron sistemas RFID para automatizar préstamos, devoluciones, inventario y seguridad, con el objetivo de reemplazar los códigos de barras tradicionales y mejorar la eficiencia operativa </w:t>
-      </w:r>
-      <w:commentRangeStart w:id="24"/>
-      <w:r>
-        <w:rPr>
-          <w:rFonts w:cs="Times New Roman"/>
-          <w:highlight w:val="darkYellow"/>
+        <w:t xml:space="preserve">. De manera similar, otros autores propusieron e implementaron sistemas RFID para automatizar préstamos, devoluciones, inventario y seguridad, con el objetivo de reemplazar los códigos de barras tradicionales y mejorar la eficiencia operativa </w:t>
+      </w:r>
+      <w:r>
+        <w:rPr>
+          <w:rFonts w:cs="Times New Roman"/>
         </w:rPr>
         <w:fldChar w:fldCharType="begin" w:fldLock="1"/>
       </w:r>
       <w:r>
         <w:rPr>
           <w:rFonts w:cs="Times New Roman"/>
-          <w:highlight w:val="darkYellow"/>
         </w:rPr>
         <w:instrText>ADDIN CSL_CITATION {"citationItems":[{"id":"ITEM-1","itemData":{"DOI":"10.1108/IJEM-05-2017-0129","ISBN":"9788195275700","ISSN":"0951354X","abstract":"Purpose: The purpose of this paper is to research on knowledge management (KM) in higher education institutions (HEIs) by studying its processes, knowledge creation (KC), knowledge sharing (KS) and knowledge transfer (KT), in Mauritius. Design/methodology/approach: Semi-structured interviews were conducted with senior staff in the main public and private HEIs in Mauritius. Questions focussed on KM strategy and processes. Interviews were recorded and transcribed prior to thematic analysis. Findings: Although participants could discuss KM processes, none of the participating institutions had a KM strategy. All institutions are involved in KC and acquisition, KS and KT. In addition to research, knowledge was regarded as being created through teaching and learning activities, consultancies, organisational documentation and acquisition from external sources. Knowledge is shared among peers during departmental and curriculum meetings, through annual research seminars and during conferences and publications in journals. KT with industry through consultancies is restricted to a few public HEIs. In the remaining HEIs, KT is limited to their students joining the workforce and to organising tailor-made courses and training programmes for public and private institutions. The study also provides evidence that some processes and activities contribute to more than one of KC, sharing and transfer. Originality/value: This study contributes to the very limited body of research into KM processes in countries with developing higher education sectors. In addition, this research disaggregates the processes associated with KC, sharing and transfer, whilst also examining the relationship between them.","author":[{"dropping-particle":"","family":"Veer Ramjeawon","given":"Poonam","non-dropping-particle":"","parse-names":false,"suffix":""},{"dropping-particle":"","family":"Rowley","given":"Jennifer","non-dropping-particle":"","parse-names":false,"suffix":""}],"container-title":"International Journal of Educational Management","id":"ITEM-1","issue":"7","issued":{"date-parts":[["2018"]]},"number-of-pages":"1319-1332","title":"Knowledge management in higher education institutions in Mauritius","type":"book","volume":"32"},"uris":["http://www.mendeley.com/documents/?uuid=8f8efa09-eb87-43cb-a632-b492359a6153"]}],"mendeley":{"formattedCitation":"(Veer Ramjeawon &amp; Rowley, 2018)","plainTextFormattedCitation":"(Veer Ramjeawon &amp; Rowley, 2018)","previouslyFormattedCitation":"(Veer Ramjeawon &amp; Rowley, 2018)"},"properties":{"noteIndex":0},"schema":"https://github.com/citation-style-language/schema/raw/master/csl-citation.json"}</w:instrText>
       </w:r>
       <w:r>
         <w:rPr>
           <w:rFonts w:cs="Times New Roman"/>
-          <w:highlight w:val="darkYellow"/>
         </w:rPr>
         <w:fldChar w:fldCharType="separate"/>
       </w:r>
@@ -4648,38 +4336,20 @@
         <w:rPr>
           <w:rFonts w:cs="Times New Roman"/>
           <w:noProof/>
-          <w:highlight w:val="darkYellow"/>
         </w:rPr>
         <w:t>(Veer Ramjeawon &amp; Rowley, 2018)</w:t>
       </w:r>
       <w:r>
         <w:rPr>
           <w:rFonts w:cs="Times New Roman"/>
-          <w:highlight w:val="darkYellow"/>
         </w:rPr>
         <w:fldChar w:fldCharType="end"/>
       </w:r>
-      <w:commentRangeEnd w:id="24"/>
-      <w:r>
-        <w:rPr>
-          <w:rStyle w:val="Refdecomentario"/>
-          <w:rFonts w:cs="Times New Roman"/>
-          <w:sz w:val="24"/>
-          <w:szCs w:val="22"/>
-        </w:rPr>
-        <w:commentReference w:id="24"/>
-      </w:r>
-      <w:r>
-        <w:rPr>
-          <w:rFonts w:cs="Times New Roman"/>
-        </w:rPr>
-        <w:t>. Desde una perspectiva más amplia, algunos estudios realizaron una revisión de casos internacionales de implementación de RFID en bibliotecas, evaluando su papel en la automatización de inventarios, la circulación, la seguridad, el autoservicio y la mejora d</w:t>
-      </w:r>
-      <w:r>
-        <w:rPr>
-          <w:rFonts w:cs="Times New Roman"/>
-        </w:rPr>
-        <w:t xml:space="preserve">e la experiencia de usuario </w:t>
+      <w:r>
+        <w:rPr>
+          <w:rFonts w:cs="Times New Roman"/>
+        </w:rPr>
+        <w:t xml:space="preserve">. Desde una perspectiva más amplia, algunos estudios realizaron una revisión de casos internacionales de implementación de RFID en bibliotecas, evaluando su papel en la automatización de inventarios, la circulación, la seguridad, el autoservicio y la mejora de la experiencia de usuario </w:t>
       </w:r>
       <w:r>
         <w:rPr>
@@ -4767,13 +4437,7 @@
         <w:rPr>
           <w:rFonts w:cs="Times New Roman"/>
         </w:rPr>
-        <w:t>.</w:t>
-      </w:r>
-      <w:r>
-        <w:rPr>
-          <w:rFonts w:cs="Times New Roman"/>
-        </w:rPr>
-        <w:t xml:space="preserve"> Finalmente, otros enfoques se centraron en reforzar la </w:t>
+        <w:t xml:space="preserve">. Finalmente, otros enfoques se centraron en reforzar la </w:t>
       </w:r>
       <w:r>
         <w:rPr>
@@ -4813,6 +4477,123 @@
         </w:rPr>
         <w:fldChar w:fldCharType="end"/>
       </w:r>
+    </w:p>
+    <w:p>
+      <w:pPr>
+        <w:ind w:firstLine="708"/>
+        <w:rPr>
+          <w:rFonts w:cs="Times New Roman"/>
+        </w:rPr>
+      </w:pPr>
+      <w:r>
+        <w:rPr>
+          <w:rFonts w:cs="Times New Roman"/>
+        </w:rPr>
+        <w:t xml:space="preserve">En conclusión, en términos de seguridad bibliotecaria, la tecnología RFID no solo es más avanzada, sino también más práctica, conveniente y asequible. En el ámbito de los materiales bibliotecarios, esta tecnología está reemplazando gradualmente al código de barras convencional. El uso de RFID en bibliotecas agiliza los procesos de préstamo, monitoreo y búsqueda de libros, liberando al personal para que se concentre en brindar un mejor servicio al usuario. Las etiquetas y lectores RFID deben ser de alta calidad para un rendimiento óptimo. La información que debe escribirse en las etiquetas es otro factor que influye en la eficacia del uso de la tecnología. Estos programas pueden mejorar el servicio al cliente, reducir el robo de libros, reducir significativamente los gastos de mano de obra y actualizar continuamente los registros de nuevas colecciones de libros. </w:t>
+      </w:r>
+      <w:r>
+        <w:rPr>
+          <w:rFonts w:cs="Times New Roman"/>
+        </w:rPr>
+        <w:fldChar w:fldCharType="begin" w:fldLock="1"/>
+      </w:r>
+      <w:r>
+        <w:rPr>
+          <w:rFonts w:cs="Times New Roman"/>
+        </w:rPr>
+        <w:instrText>ADDIN CSL_CITATION {"citationItems":[{"id":"ITEM-1","itemData":{"DOI":"10.47604/ijts.2041","abstract":"Purpose: The aim of this project is to design and build a library management system based on radio frequency identification that will help the librarian manage the shelves with less human involvement.\r Methodology: A dc supply at +5volts was connected to the microcontroller, with a voltage of +12volts dc connected to the buzzer, and a step-down transformer was used to convert 220volts to 5volts in this system. This power supply was connected to the switch, and by pressing a switch button, the current passed through the entire circuit. RFID collects all the data from the RFID tag. Using a UART module, the EM-18 RFID reader module was connected to 5v pic microcontrollers. The EM-1 RFID reader will read the tag number from an RFID tag when it is placed in its field of operation and output the information via a TX terminal. In order to signal successful tag detection, the beep terminal will turn low. Once the card is in front of the RFID reader, the student extracts the data from it and compares it to the data that is stored in the microprocessor, which is coded using embedded c language. If the data matches, the information is shown on the LCD.\r Finding: A library management system based on radio frequency identification and detection (RFID) was developed in this study to improve library use and management. To efficiently identify and manage the books, it will make use of the RFID reader. The student can search the database and, if the book is available, pick it up from the library because the database displays the book's availability at the library. The main advantages of this project in libraries include time savings, quick access to books, and the elimination of manual errors.\r Unique Contribution to Theory, Practice and policy: Every inventive technical design has its limits. This passive RFID-based library management system has some limitations as a technology for precise data collection. This study recommend that the RFID reader should be improved so that it has finger and thumb print access, which is needed to access student data and details. However, it should also include a facial recognition application, which would further strengthen the biometric security of the system and protect it from impersonation by careless students.","author":[{"dropping-particle":"","family":"Yusuf","given":"Moshood","non-dropping-particle":"","parse-names":false,"suffix":""},{"dropping-particle":"","family":"Akintunde","given":"Adigun","non-dropping-particle":"","parse-names":false,"suffix":""},{"dropping-particle":"","family":"Habeeb","given":"Shittu","non-dropping-particle":"","parse-names":false,"suffix":""},{"dropping-particle":"","family":"Quadri","given":"Adeyinka","non-dropping-particle":"","parse-names":false,"suffix":""}],"container-title":"International Journal of Technology and Systems","id":"ITEM-1","issue":"2","issued":{"date-parts":[["2023"]]},"page":"21-35","title":"Radio Frequency Identification (RFID) Based Library Management System","type":"article-journal","volume":"8"},"uris":["http://www.mendeley.com/documents/?uuid=a044af89-7407-4371-90c0-df23e6b6ed15","http://www.mendeley.com/documents/?uuid=48715fcd-d25c-420b-b3d1-066ce17ef2e0"]}],"mendeley":{"formattedCitation":"(Yusuf et al., 2023)","plainTextFormattedCitation":"(Yusuf et al., 2023)","previouslyFormattedCitation":"(Yusuf et al., 2023)"},"properties":{"noteIndex":0},"schema":"https://github.com/citation-style-language/schema/raw/master/csl-citation.json"}</w:instrText>
+      </w:r>
+      <w:r>
+        <w:rPr>
+          <w:rFonts w:cs="Times New Roman"/>
+        </w:rPr>
+        <w:fldChar w:fldCharType="separate"/>
+      </w:r>
+      <w:r>
+        <w:rPr>
+          <w:rFonts w:cs="Times New Roman"/>
+          <w:noProof/>
+        </w:rPr>
+        <w:t>(Yusuf et al., 2023)</w:t>
+      </w:r>
+      <w:r>
+        <w:rPr>
+          <w:rFonts w:cs="Times New Roman"/>
+        </w:rPr>
+        <w:fldChar w:fldCharType="end"/>
+      </w:r>
+      <w:r>
+        <w:rPr>
+          <w:rFonts w:cs="Times New Roman"/>
+        </w:rPr>
+        <w:t xml:space="preserve">, y de igual manera, </w:t>
+      </w:r>
+      <w:r>
+        <w:rPr>
+          <w:rFonts w:cs="Times New Roman"/>
+        </w:rPr>
+        <w:fldChar w:fldCharType="begin" w:fldLock="1"/>
+      </w:r>
+      <w:r>
+        <w:rPr>
+          <w:rFonts w:cs="Times New Roman"/>
+        </w:rPr>
+        <w:instrText>ADDIN CSL_CITATION {"citationItems":[{"id":"ITEM-1","itemData":{"author":[{"dropping-particle":"","family":"Nayak","given":"Rajib","non-dropping-particle":"","parse-names":false,"suffix":""},{"dropping-particle":"","family":"Singh","given":"Dharamvir","non-dropping-particle":"","parse-names":false,"suffix":""}],"id":"ITEM-1","issue":"7","issued":{"date-parts":[["2024"]]},"page":"1-7","title":"Challenges and Prospects of RFID Implementation in Academic Libraries of Challenges and Prospects of RFID Implementation in Academic Libraries of North East India","type":"article-journal","volume":"5"},"uris":["http://www.mendeley.com/documents/?uuid=e0ea4296-db88-45df-a22d-06dbdf02fb55","http://www.mendeley.com/documents/?uuid=ccf58a1c-812f-4e26-a583-1ce14765dfac"]}],"mendeley":{"formattedCitation":"(Nayak &amp; Singh, 2024)","plainTextFormattedCitation":"(Nayak &amp; Singh, 2024)","previouslyFormattedCitation":"(Nayak &amp; Singh, 2024)"},"properties":{"noteIndex":0},"schema":"https://github.com/citation-style-language/schema/raw/master/csl-citation.json"}</w:instrText>
+      </w:r>
+      <w:r>
+        <w:rPr>
+          <w:rFonts w:cs="Times New Roman"/>
+        </w:rPr>
+        <w:fldChar w:fldCharType="separate"/>
+      </w:r>
+      <w:r>
+        <w:rPr>
+          <w:rFonts w:cs="Times New Roman"/>
+          <w:noProof/>
+        </w:rPr>
+        <w:t>(Nayak &amp; Singh, 2024)</w:t>
+      </w:r>
+      <w:r>
+        <w:rPr>
+          <w:rFonts w:cs="Times New Roman"/>
+        </w:rPr>
+        <w:fldChar w:fldCharType="end"/>
+      </w:r>
+      <w:r>
+        <w:rPr>
+          <w:rFonts w:cs="Times New Roman"/>
+        </w:rPr>
+        <w:t xml:space="preserve"> nos explica que la tecnología RFID representa una oportunidad transformadora para la comunidad bibliotecaria, lista para redefinir la gestión bibliotecaria tradicional en los próximos años. Su capacidad para el inventario a alta velocidad y la identificación eficiente de artículos extraviados la convierten en una herramienta indispensable para las bibliotecas modernas.</w:t>
+      </w:r>
+    </w:p>
+    <w:p>
+      <w:pPr>
+        <w:ind w:firstLine="708"/>
+        <w:rPr>
+          <w:rFonts w:cs="Times New Roman"/>
+        </w:rPr>
+      </w:pPr>
+    </w:p>
+    <w:p>
+      <w:pPr>
+        <w:ind w:firstLine="708"/>
+        <w:rPr>
+          <w:rFonts w:cs="Times New Roman"/>
+        </w:rPr>
+      </w:pPr>
+      <w:r>
+        <w:rPr>
+          <w:rFonts w:cs="Times New Roman"/>
+        </w:rPr>
+        <w:t xml:space="preserve">Las bibliotecas universitarias enfrentan pérdidas de colección, inventarios lentos y errores en circulación que elevan costos operativos y deterioran la experiencia del usuario. Las soluciones con códigos de barras requieren línea de vista y escaneo individual, lo que limita la eficiencia en estantes y controles de salida. Aunque RFID ha mostrado mejoras en trazabilidad, autoservicio e inventario, su desempeño depende de la banda (HF/UHF), la orientación de etiquetas, los materiales y la integración con el SIGB; además, persisten barreras de costo total de propiedad, estandarización y privacidad. En nuestro contexto, no existe un diseño específico que optimice simultáneamente la circulación segura (HF, mostradores/portales) y el inventario rápido en estanterías (UHF) con alta tasa de acierto en lomos apilados y anti-colisión, interoperando con el SIGB. Este proyecto aborda dicha brecha mediante el diseño y validación de un sistema RFID para </w:t>
+      </w:r>
+      <w:r>
+        <w:rPr>
+          <w:rFonts w:cs="Times New Roman"/>
+        </w:rPr>
+        <w:lastRenderedPageBreak/>
+        <w:t>control e identificación eficiente de libros, con metas de reducción de tiempos de inventario, incremento de tasas de lectura y disminución de pérdidas</w:t>
+      </w:r>
       <w:r>
         <w:rPr>
           <w:rFonts w:cs="Times New Roman"/>
@@ -4822,202 +4603,6 @@
     </w:p>
     <w:p>
       <w:pPr>
-        <w:ind w:firstLine="708"/>
-        <w:rPr>
-          <w:rFonts w:cs="Times New Roman"/>
-        </w:rPr>
-      </w:pPr>
-      <w:r>
-        <w:rPr>
-          <w:rFonts w:cs="Times New Roman"/>
-        </w:rPr>
-        <w:t xml:space="preserve">En conclusión, en términos de seguridad bibliotecaria, la tecnología RFID no solo es más avanzada, sino también más práctica, conveniente y asequible. En el ámbito de los materiales bibliotecarios, esta tecnología está reemplazando gradualmente al código de barras convencional. El uso de RFID en bibliotecas agiliza los procesos de préstamo, monitoreo y búsqueda de libros, liberando al personal para que se concentre en brindar un mejor servicio al usuario. Las etiquetas y lectores RFID deben ser de alta calidad para un rendimiento óptimo. La información que debe escribirse en las etiquetas es otro factor que influye en la eficacia del uso de la tecnología. Estos programas pueden mejorar el servicio al cliente, reducir el robo de libros, reducir significativamente los gastos de mano de obra y actualizar continuamente los registros de nuevas colecciones de libros. </w:t>
-      </w:r>
-      <w:r>
-        <w:rPr>
-          <w:rFonts w:cs="Times New Roman"/>
-        </w:rPr>
-        <w:fldChar w:fldCharType="begin" w:fldLock="1"/>
-      </w:r>
-      <w:r>
-        <w:rPr>
-          <w:rFonts w:cs="Times New Roman"/>
-        </w:rPr>
-        <w:instrText>ADDIN CSL_CITATION {"citationItems":[{"id":"ITEM-1","itemData":{"DOI":"10.47604/ijts.2041","abstract":"Purpose: The aim of this project is to design and build a library management system based on radio frequency identification that will help the librarian manage the shelves with less human involvement.\r Methodology: A dc supply at +5volts was connected to the microcontroller, with a voltage of +12volts dc connected to the buzzer, and a step-down transformer was used to convert 220volts to 5volts in this system. This power supply was connected to the switch, and by pressing a switch button, the current passed through the entire circuit. RFID collects all the data from the RFID tag. Using a UART module, the EM-18 RFID reader module was connected to 5v pic microcontrollers. The EM-1 RFID reader will read the tag number from an RFID tag when it is placed in its field of operation and output the information via a TX terminal. In order to signal successful tag detection, the beep terminal will turn low. Once the card is in front of the RFID reader, the student extracts the data from it and compares it to the data that is stored in the microprocessor, which is coded using embedded c language. If the data matches, the information is shown on the LCD.\r Finding: A library management system based on radio frequency identification and detection (RFID) was developed in this study to improve library use and management. To efficiently identify and manage the books, it will make use of the RFID reader. The student can search the database and, if the book is available, pick it up from the library because the database displays the book's availability at the library. The main advantages of this project in libraries include time savings, quick access to books, and the elimination of manual errors.\r Unique Contribution to Theory, Practice and policy: Every inventive technical design has its limits. This passive RFID-based library management system has some limitations as a technology for precise data collection. This study recommend that the RFID reader should be improved so that it has finger and thumb print access, which is needed to access student data and details. However, it should also include a facial recognition application, which would further strengthen the biometric security of the system and protect it from impersonation by careless students.","author":[{"dropping-particle":"","family":"Yusuf","given":"Moshood","non-dropping-particle":"","parse-names":false,"suffix":""},{"dropping-particle":"","family":"Akintunde","given":"Adigun","non-dropping-particle":"","parse-names":false,"suffix":""},{"dropping-particle":"","family":"Habeeb","given":"Shittu","non-dropping-particle":"","parse-names":false,"suffix":""},{"dropping-particle":"","family":"Quadri","given":"Adeyinka","non-dropping-particle":"","parse-names":false,"suffix":""}],"container-title":"International Journal of Technology and Systems","id":"ITEM-1","issue":"2","issued":{"date-parts":[["2023"]]},"page":"21-35","title":"Radio Frequency Identification (RFID) Based Library Management System","type":"article-journal","volume":"8"},"uris":["http://www.mendeley.com/documents/?uuid=a044af89-7407-4371-90c0-df23e6b6ed15","http://www.mendeley.com/documents/?uuid=48715fcd-d25c-420b-b3d1-066ce17ef2e0"]}],"mendeley":{"formattedCitation":"(Yusuf et al., 2023)","plainTextFormattedCitation":"(Yusuf et al., 2023)","previouslyFormattedCitation":"(Yusuf et al., 2023)"},"properties":{"noteIndex":0},"schema":"https://github.com/citation-style-language/schema/raw/master/csl-citation.json"}</w:instrText>
-      </w:r>
-      <w:r>
-        <w:rPr>
-          <w:rFonts w:cs="Times New Roman"/>
-        </w:rPr>
-        <w:fldChar w:fldCharType="separate"/>
-      </w:r>
-      <w:r>
-        <w:rPr>
-          <w:rFonts w:cs="Times New Roman"/>
-          <w:noProof/>
-        </w:rPr>
-        <w:t>(Yusuf et al., 2023)</w:t>
-      </w:r>
-      <w:r>
-        <w:rPr>
-          <w:rFonts w:cs="Times New Roman"/>
-        </w:rPr>
-        <w:fldChar w:fldCharType="end"/>
-      </w:r>
-      <w:r>
-        <w:rPr>
-          <w:rFonts w:cs="Times New Roman"/>
-        </w:rPr>
-        <w:t>,</w:t>
-      </w:r>
-      <w:r>
-        <w:rPr>
-          <w:rFonts w:cs="Times New Roman"/>
-        </w:rPr>
-        <w:t xml:space="preserve"> y de igual manera</w:t>
-      </w:r>
-      <w:r>
-        <w:rPr>
-          <w:rFonts w:cs="Times New Roman"/>
-        </w:rPr>
-        <w:t xml:space="preserve">, </w:t>
-      </w:r>
-      <w:r>
-        <w:rPr>
-          <w:rFonts w:cs="Times New Roman"/>
-        </w:rPr>
-        <w:fldChar w:fldCharType="begin" w:fldLock="1"/>
-      </w:r>
-      <w:r>
-        <w:rPr>
-          <w:rFonts w:cs="Times New Roman"/>
-        </w:rPr>
-        <w:instrText>ADDIN CSL_CITATION {"citationItems":[{"id":"ITEM-1","itemData":{"author":[{"dropping-particle":"","family":"Nayak","given":"Rajib","non-dropping-particle":"","parse-names":false,"suffix":""},{"dropping-particle":"","family":"Singh","given":"Dharamvir","non-dropping-particle":"","parse-names":false,"suffix":""}],"id":"ITEM-1","issue":"7","issued":{"date-parts":[["2024"]]},"page":"1-7","title":"Challenges and Prospects of RFID Implementation in Academic Libraries of Challenges and Prospects of RFID Implementation in Academic Libraries of North East India","type":"article-journal","volume":"5"},"uris":["http://www.mendeley.com/documents/?uuid=e0ea4296-db88-45df-a22d-06dbdf02fb55","http://www.mendeley.com/documents/?uuid=ccf58a1c-812f-4e26-a583-1ce14765dfac"]}],"mendeley":{"formattedCitation":"(Nayak &amp; Singh, 2024)","plainTextFormattedCitation":"(Nayak &amp; Singh, 2024)","previouslyFormattedCitation":"(Nayak &amp; Singh, 2024)"},"properties":{"noteIndex":0},"schema":"https://github.com/citation-style-language/schema/raw/master/csl-citation.json"}</w:instrText>
-      </w:r>
-      <w:r>
-        <w:rPr>
-          <w:rFonts w:cs="Times New Roman"/>
-        </w:rPr>
-        <w:fldChar w:fldCharType="separate"/>
-      </w:r>
-      <w:r>
-        <w:rPr>
-          <w:rFonts w:cs="Times New Roman"/>
-          <w:noProof/>
-        </w:rPr>
-        <w:t>(Nayak &amp; Singh, 2024)</w:t>
-      </w:r>
-      <w:r>
-        <w:rPr>
-          <w:rFonts w:cs="Times New Roman"/>
-        </w:rPr>
-        <w:fldChar w:fldCharType="end"/>
-      </w:r>
-      <w:r>
-        <w:rPr>
-          <w:rFonts w:cs="Times New Roman"/>
-        </w:rPr>
-        <w:t xml:space="preserve"> nos explica</w:t>
-      </w:r>
-      <w:r>
-        <w:rPr>
-          <w:rFonts w:cs="Times New Roman"/>
-        </w:rPr>
-        <w:t>n</w:t>
-      </w:r>
-      <w:r>
-        <w:rPr>
-          <w:rFonts w:cs="Times New Roman"/>
-        </w:rPr>
-        <w:t xml:space="preserve"> que la tecnología RFID representa una oportunidad transformadora para la comunidad bibliotecaria, lista para redefinir la gestión bibliotecaria tradicional en los próximos años. Su capacidad para el inventario a alta velocidad y la identificación eficiente de artículos extraviados la convierten en una herramienta indispensable para las bibliotecas modernas.</w:t>
-      </w:r>
-    </w:p>
-    <w:p>
-      <w:pPr>
-        <w:ind w:firstLine="708"/>
-        <w:rPr>
-          <w:rFonts w:cs="Times New Roman"/>
-        </w:rPr>
-      </w:pPr>
-    </w:p>
-    <w:p>
-      <w:pPr>
-        <w:ind w:firstLine="708"/>
-        <w:rPr>
-          <w:rFonts w:cs="Times New Roman"/>
-        </w:rPr>
-      </w:pPr>
-      <w:r>
-        <w:rPr>
-          <w:rFonts w:cs="Times New Roman"/>
-        </w:rPr>
-        <w:t xml:space="preserve">Las bibliotecas universitarias enfrentan pérdidas de colección, inventarios lentos y errores en circulación que elevan costos operativos y deterioran la experiencia del usuario. Las soluciones con códigos de barras requieren línea de vista y escaneo individual, lo que limita la eficiencia en estantes y controles de salida. Aunque RFID ha mostrado mejoras en trazabilidad, autoservicio e inventario, su desempeño depende de la banda (HF/UHF), la orientación de etiquetas, los materiales y la integración con el SIGB; además, persisten barreras de costo total de propiedad, estandarización y privacidad. En nuestro contexto, no existe un diseño específico que optimice simultáneamente la circulación segura (HF, mostradores/portales) y el inventario rápido en estanterías (UHF) con alta tasa de acierto en lomos apilados y anti-colisión, interoperando con el SIGB. Este proyecto aborda dicha brecha mediante el diseño y validación de un sistema RFID para </w:t>
-      </w:r>
-      <w:r>
-        <w:rPr>
-          <w:rFonts w:cs="Times New Roman"/>
-        </w:rPr>
-        <w:lastRenderedPageBreak/>
-        <w:t>control e identificación eficiente de libros, con metas de reducción de tiempos de inventario, incremento de tasas de lectura y disminución de pérdida</w:t>
-      </w:r>
-      <w:r>
-        <w:rPr>
-          <w:rFonts w:cs="Times New Roman"/>
-        </w:rPr>
-        <w:t>s.</w:t>
-      </w:r>
-    </w:p>
-    <w:p>
-      <w:pPr>
-        <w:ind w:firstLine="708"/>
-        <w:rPr>
-          <w:rFonts w:cs="Times New Roman"/>
-        </w:rPr>
-      </w:pPr>
-      <w:r>
-        <w:rPr>
-          <w:rFonts w:cs="Times New Roman"/>
-        </w:rPr>
-        <w:t>Asimismo, investigaciones recientes han demostrado la viabilidad de integrar tecnologías de Internet de las Cosas (IoT) con RFID para optimizar los sistemas de gestión bibliotecaria. En este sentido, Victor et al. (2025) desarrollaron e implementaron un sistema de biblioteca basado en IoT que integra etiquetas RFID en los libros, lectores de radiofrecuencia y una base de datos central para automatizar los procesos de préstamo, devolución y seguimiento del material bibliográfico. El sistema fue implementado en una biblioteca universitaria en Nigeria y permitió mejorar significativamente la eficiencia operativa, reducir los tiempos de transacción y aumentar la precisión en la gestión del inventario. Los resultados obtenidos evidenciaron que más del 90 % de los usuarios percibieron el proceso de préstamo como más rápido y conveniente en comparación con el sistema tradicional, además de reportarse mejoras en la experiencia del usuario y en el control de los recursos bibliográficos (Victor et al., 2025). Estos hallazgos refuerzan la idea de que la adopción de RFID en entornos bibliotecarios no solo moderniza los procesos de circulación, sino que también contribuye a la automatización, la trazabilidad de los libros y la optimización de los servicios bibliotecarios en contextos académicos</w:t>
-      </w:r>
-      <w:r>
-        <w:rPr>
-          <w:rFonts w:cs="Times New Roman"/>
-        </w:rPr>
-        <w:t>.</w:t>
-      </w:r>
-    </w:p>
-    <w:p>
-      <w:pPr>
-        <w:ind w:firstLine="708"/>
-        <w:rPr>
-          <w:rFonts w:cs="Times New Roman"/>
-        </w:rPr>
-      </w:pPr>
-      <w:r>
-        <w:rPr>
-          <w:rFonts w:cs="Times New Roman"/>
-        </w:rPr>
-        <w:t>De igual manera, el desarrollo de bibliotecas digitales y plataformas de acceso abierto ha tomado gran relevancia en los últimos años. Un ejemplo de ello es la National Digital Library of India (NDLI), una iniciativa orientada a integrar recursos educativos y académicos en una única plataforma digital que facilite el acceso al conocimiento a estudiantes, investigadores y docentes. Este proyecto busca consolidar colecciones provenientes de múltiples instituciones y ofrecer servicios de búsqueda, organización y acceso a grandes volúmenes de información digital, contribuyendo al fortalecimiento de los ecosistemas de conocimiento y aprendizaje en entornos académicos. Estas iniciativas evidencian cómo las bibliotecas modernas no solo evolucionan en la gestión de recursos físicos, sino también en la integración de plataformas digitales que amplían el acceso a la información y complementan los servicios bibliotecarios tradicionales (NDLI, 2025).</w:t>
-      </w:r>
-    </w:p>
-    <w:p>
-      <w:pPr>
-        <w:ind w:firstLine="708"/>
-        <w:rPr>
-          <w:rFonts w:cs="Times New Roman"/>
-        </w:rPr>
-      </w:pPr>
-    </w:p>
-    <w:p>
-      <w:pPr>
-        <w:rPr>
-          <w:rFonts w:cs="Times New Roman"/>
-        </w:rPr>
-      </w:pPr>
-    </w:p>
-    <w:p>
-      <w:pPr>
         <w:pStyle w:val="PrrAPA"/>
       </w:pPr>
     </w:p>
@@ -5037,7 +4622,7 @@
           <w:b/>
         </w:rPr>
       </w:pPr>
-      <w:bookmarkStart w:id="25" w:name="_Toc440985128"/>
+      <w:bookmarkStart w:id="21" w:name="_Toc440985128"/>
     </w:p>
     <w:p>
       <w:pPr>
@@ -5094,7 +4679,7 @@
         <w:lastRenderedPageBreak/>
         <w:t>2 Justificación</w:t>
       </w:r>
-      <w:bookmarkEnd w:id="25"/>
+      <w:bookmarkEnd w:id="21"/>
     </w:p>
     <w:p>
       <w:pPr>
@@ -5155,7 +4740,7 @@
         </w:rPr>
         <w:t>.</w:t>
       </w:r>
-      <w:commentRangeStart w:id="26"/>
+      <w:commentRangeStart w:id="22"/>
       <w:r>
         <w:rPr>
           <w:rFonts w:cs="Times New Roman"/>
@@ -5163,7 +4748,7 @@
         </w:rPr>
         <w:t xml:space="preserve"> </w:t>
       </w:r>
-      <w:commentRangeEnd w:id="26"/>
+      <w:commentRangeEnd w:id="22"/>
       <w:r>
         <w:rPr>
           <w:rStyle w:val="Refdecomentario"/>
@@ -5171,7 +4756,7 @@
           <w:sz w:val="24"/>
           <w:szCs w:val="24"/>
         </w:rPr>
-        <w:commentReference w:id="26"/>
+        <w:commentReference w:id="22"/>
       </w:r>
     </w:p>
     <w:p>
@@ -5305,7 +4890,7 @@
           <w:b/>
         </w:rPr>
       </w:pPr>
-      <w:bookmarkStart w:id="27" w:name="_Toc440985129"/>
+      <w:bookmarkStart w:id="23" w:name="_Toc440985129"/>
     </w:p>
     <w:p>
       <w:pPr>
@@ -5362,22 +4947,22 @@
         <w:lastRenderedPageBreak/>
         <w:t>3 Objetivos</w:t>
       </w:r>
-      <w:bookmarkEnd w:id="27"/>
-    </w:p>
-    <w:p>
-      <w:pPr>
-        <w:rPr>
-          <w:b/>
-        </w:rPr>
-      </w:pPr>
-    </w:p>
-    <w:p>
-      <w:pPr>
-        <w:rPr>
-          <w:b/>
-        </w:rPr>
-      </w:pPr>
-      <w:bookmarkStart w:id="28" w:name="_Toc440985130"/>
+      <w:bookmarkEnd w:id="23"/>
+    </w:p>
+    <w:p>
+      <w:pPr>
+        <w:rPr>
+          <w:b/>
+        </w:rPr>
+      </w:pPr>
+    </w:p>
+    <w:p>
+      <w:pPr>
+        <w:rPr>
+          <w:b/>
+        </w:rPr>
+      </w:pPr>
+      <w:bookmarkStart w:id="24" w:name="_Toc440985130"/>
       <w:r>
         <w:rPr>
           <w:b/>
@@ -5396,7 +4981,7 @@
         </w:rPr>
         <w:t>eneral</w:t>
       </w:r>
-      <w:bookmarkEnd w:id="28"/>
+      <w:bookmarkEnd w:id="24"/>
     </w:p>
     <w:p>
       <w:pPr>
@@ -5462,7 +5047,7 @@
           <w:b/>
         </w:rPr>
       </w:pPr>
-      <w:bookmarkStart w:id="29" w:name="_Toc440985131"/>
+      <w:bookmarkStart w:id="25" w:name="_Toc440985131"/>
       <w:r>
         <w:rPr>
           <w:b/>
@@ -5481,7 +5066,7 @@
         </w:rPr>
         <w:t>specíficos</w:t>
       </w:r>
-      <w:bookmarkEnd w:id="29"/>
+      <w:bookmarkEnd w:id="25"/>
     </w:p>
     <w:p/>
     <w:p>
@@ -5609,17 +5194,214 @@
           <w:bCs/>
         </w:rPr>
       </w:pPr>
-      <w:commentRangeStart w:id="30"/>
       <w:r>
         <w:rPr>
           <w:b/>
           <w:bCs/>
-          <w:highlight w:val="red"/>
         </w:rPr>
         <w:lastRenderedPageBreak/>
-        <w:t>4</w:t>
-      </w:r>
-      <w:commentRangeEnd w:id="30"/>
+        <w:t xml:space="preserve">4 </w:t>
+      </w:r>
+      <w:r>
+        <w:rPr>
+          <w:b/>
+          <w:bCs/>
+        </w:rPr>
+        <w:t>Problema de investigación</w:t>
+      </w:r>
+    </w:p>
+    <w:p>
+      <w:pPr>
+        <w:ind w:firstLine="708"/>
+        <w:rPr>
+          <w:rFonts w:cs="Times New Roman"/>
+          <w:szCs w:val="24"/>
+        </w:rPr>
+      </w:pPr>
+    </w:p>
+    <w:p>
+      <w:pPr>
+        <w:ind w:firstLine="360"/>
+        <w:rPr>
+          <w:rFonts w:cs="Times New Roman"/>
+          <w:szCs w:val="24"/>
+        </w:rPr>
+      </w:pPr>
+      <w:r>
+        <w:rPr>
+          <w:rFonts w:cs="Times New Roman"/>
+          <w:szCs w:val="24"/>
+        </w:rPr>
+        <w:t>La biblioteca Monseñor Héctor Rueda Hernández de la Institución Universitaria Salazar y Herrera (IUSH) cumple un papel fundamental en el apoyo a los procesos académicos, investigativos y culturales de la comunidad universitaria. Sin embargo, enfrenta dificultades en la gestión y control de su colección bibliográfica, debido a que los sistemas tradicionales de identificación y préstamo de libros se basan principalmente en códigos de barras.</w:t>
+      </w:r>
+    </w:p>
+    <w:p>
+      <w:pPr>
+        <w:ind w:firstLine="360"/>
+        <w:rPr>
+          <w:rFonts w:cs="Times New Roman"/>
+          <w:szCs w:val="24"/>
+        </w:rPr>
+      </w:pPr>
+      <w:r>
+        <w:rPr>
+          <w:rFonts w:cs="Times New Roman"/>
+          <w:szCs w:val="24"/>
+        </w:rPr>
+        <w:t>Este método presenta limitaciones significativas: requiere lectura individual y línea de visión</w:t>
+      </w:r>
+      <w:r>
+        <w:rPr>
+          <w:rFonts w:cs="Times New Roman"/>
+          <w:szCs w:val="24"/>
+        </w:rPr>
+        <w:t xml:space="preserve"> libro por libro</w:t>
+      </w:r>
+      <w:r>
+        <w:rPr>
+          <w:rFonts w:cs="Times New Roman"/>
+          <w:szCs w:val="24"/>
+        </w:rPr>
+        <w:t>, lo que hace que procesos como el préstamo, la devolución, el inventario y la búsqueda de ejemplares sean lentos, repetitivos y dependientes del personal de la biblioteca. Estas limitaciones generan congestión en los servicios de circulación, retrasos en la atención a los usuarios y dificultades para mantener una actualización en tiempo real de la disponibilidad de materiales.</w:t>
+      </w:r>
+    </w:p>
+    <w:p>
+      <w:pPr>
+        <w:ind w:firstLine="360"/>
+        <w:rPr>
+          <w:rFonts w:cs="Times New Roman"/>
+          <w:szCs w:val="24"/>
+        </w:rPr>
+      </w:pPr>
+      <w:r>
+        <w:rPr>
+          <w:rFonts w:cs="Times New Roman"/>
+          <w:szCs w:val="24"/>
+        </w:rPr>
+        <w:t>A lo anterior se suma el riesgo de extravío o pérdida de libros, así como la dificultad para detectar salidas no autorizadas, pues los sistemas de seguridad tradicionales presentan baja efectividad frente a la complejidad actual de la gestión de colecciones. Esto impacta no solo la seguridad del material bibliográfico, sino también la experiencia del estudiante y del docente, quienes demandan procesos más ágiles, confiables y alineados con el entorno tecnológico actual.</w:t>
+      </w:r>
+    </w:p>
+    <w:p>
+      <w:pPr>
+        <w:ind w:firstLine="360"/>
+        <w:rPr>
+          <w:rFonts w:cs="Times New Roman"/>
+          <w:szCs w:val="24"/>
+        </w:rPr>
+      </w:pPr>
+      <w:r>
+        <w:rPr>
+          <w:rFonts w:cs="Times New Roman"/>
+          <w:szCs w:val="24"/>
+        </w:rPr>
+        <w:t>Diversos estudios demuestran que la tecnología RFID ofrece ventajas significativas frente a los sistemas tradicionales, ya que permite la lectura simultánea de múltiples ejemplares, la automatización de préstamos y devoluciones, la gestión de inventario en tiempo real y el fortalecimiento de la seguridad de las colecciones. Sin embargo, su adopción en instituciones educativas como la IUSH se ha visto limitada por los costos iniciales, la necesidad de infraestructura adecuada, la capacitación del personal y las dudas en torno a la integración con los sistemas existentes.</w:t>
+      </w:r>
+    </w:p>
+    <w:p>
+      <w:pPr>
+        <w:ind w:firstLine="360"/>
+        <w:rPr>
+          <w:rFonts w:cs="Times New Roman"/>
+          <w:szCs w:val="24"/>
+        </w:rPr>
+      </w:pPr>
+      <w:r>
+        <w:rPr>
+          <w:rFonts w:cs="Times New Roman"/>
+          <w:szCs w:val="24"/>
+        </w:rPr>
+        <w:t>En este contexto, surge la necesidad de diseñar un sistema RFID adaptado a la biblioteca Monseñor Héctor Rueda Hernández, que permita optimizar el control e identificación de los libros, mejorar los procesos de circulación e inventario, y garantizar la seguridad de la colección, contribuyendo así al fortalecimiento de la gestión bibliotecaria de la IUSH y a la satisfacción de su comunidad académica.</w:t>
+      </w:r>
+    </w:p>
+    <w:p>
+      <w:pPr>
+        <w:ind w:firstLine="360"/>
+        <w:rPr>
+          <w:rFonts w:cs="Times New Roman"/>
+          <w:szCs w:val="24"/>
+        </w:rPr>
+      </w:pPr>
+      <w:r>
+        <w:rPr>
+          <w:rFonts w:cs="Times New Roman"/>
+          <w:szCs w:val="24"/>
+        </w:rPr>
+        <w:lastRenderedPageBreak/>
+        <w:t>En este contexto, surge la siguiente pregunta problema:</w:t>
+      </w:r>
+    </w:p>
+    <w:p>
+      <w:pPr>
+        <w:ind w:firstLine="360"/>
+        <w:rPr>
+          <w:rFonts w:cs="Times New Roman"/>
+          <w:szCs w:val="24"/>
+        </w:rPr>
+      </w:pPr>
+      <w:r>
+        <w:rPr>
+          <w:rFonts w:cs="Times New Roman"/>
+          <w:szCs w:val="24"/>
+        </w:rPr>
+        <w:t>¿Cómo implementar un sistema de identificación por radiofrecuencia (RFID) que permita el control eficiente, seguro y automatizado de libros en bibliotecas, superando las limitaciones de los métodos tradicionales de identificación, mejorando</w:t>
+      </w:r>
+      <w:r>
+        <w:rPr>
+          <w:rFonts w:cs="Times New Roman"/>
+          <w:szCs w:val="24"/>
+        </w:rPr>
+        <w:t xml:space="preserve"> así</w:t>
+      </w:r>
+      <w:r>
+        <w:rPr>
+          <w:rFonts w:cs="Times New Roman"/>
+          <w:szCs w:val="24"/>
+        </w:rPr>
+        <w:t xml:space="preserve"> la trazabilidad, el acceso y la gestión del inventario?</w:t>
+      </w:r>
+    </w:p>
+    <w:p>
+      <w:pPr>
+        <w:spacing w:after="160" w:line="259" w:lineRule="auto"/>
+        <w:jc w:val="left"/>
+        <w:rPr>
+          <w:b/>
+        </w:rPr>
+      </w:pPr>
+      <w:bookmarkStart w:id="26" w:name="_Toc440985132"/>
+    </w:p>
+    <w:p>
+      <w:pPr>
+        <w:jc w:val="center"/>
+        <w:rPr>
+          <w:b/>
+          <w:bCs/>
+        </w:rPr>
+      </w:pPr>
+      <w:r>
+        <w:rPr>
+          <w:b/>
+          <w:bCs/>
+        </w:rPr>
+        <w:t>5</w:t>
+      </w:r>
+      <w:r>
+        <w:rPr>
+          <w:b/>
+          <w:bCs/>
+        </w:rPr>
+        <w:t xml:space="preserve"> </w:t>
+      </w:r>
+      <w:commentRangeStart w:id="27"/>
+      <w:commentRangeStart w:id="28"/>
+      <w:r>
+        <w:rPr>
+          <w:b/>
+          <w:bCs/>
+        </w:rPr>
+        <w:t>H</w:t>
+      </w:r>
+      <w:commentRangeEnd w:id="28"/>
       <w:r>
         <w:rPr>
           <w:rStyle w:val="Refdecomentario"/>
@@ -5627,26 +5409,36 @@
           <w:bCs/>
           <w:sz w:val="24"/>
           <w:szCs w:val="22"/>
-          <w:highlight w:val="red"/>
-        </w:rPr>
-        <w:commentReference w:id="30"/>
+        </w:rPr>
+        <w:commentReference w:id="28"/>
       </w:r>
       <w:r>
         <w:rPr>
           <w:b/>
           <w:bCs/>
-          <w:highlight w:val="red"/>
-        </w:rPr>
-        <w:t xml:space="preserve"> </w:t>
-      </w:r>
-      <w:r>
-        <w:rPr>
+        </w:rPr>
+        <w:t>ipótesis</w:t>
+      </w:r>
+      <w:bookmarkEnd w:id="26"/>
+      <w:commentRangeEnd w:id="27"/>
+      <w:r>
+        <w:rPr>
+          <w:rStyle w:val="Refdecomentario"/>
           <w:b/>
           <w:bCs/>
-          <w:highlight w:val="red"/>
-        </w:rPr>
-        <w:t>Problema de investigación</w:t>
-      </w:r>
+          <w:sz w:val="24"/>
+          <w:szCs w:val="22"/>
+        </w:rPr>
+        <w:commentReference w:id="27"/>
+      </w:r>
+    </w:p>
+    <w:p>
+      <w:pPr>
+        <w:rPr>
+          <w:rFonts w:cs="Times New Roman"/>
+          <w:szCs w:val="24"/>
+        </w:rPr>
+      </w:pPr>
     </w:p>
     <w:p>
       <w:pPr>
@@ -5656,246 +5448,42 @@
           <w:szCs w:val="24"/>
         </w:rPr>
       </w:pPr>
-    </w:p>
-    <w:p>
-      <w:pPr>
-        <w:ind w:firstLine="360"/>
-        <w:rPr>
-          <w:rFonts w:cs="Times New Roman"/>
-          <w:szCs w:val="24"/>
-        </w:rPr>
-      </w:pPr>
-      <w:r>
-        <w:rPr>
-          <w:rFonts w:cs="Times New Roman"/>
-          <w:szCs w:val="24"/>
-        </w:rPr>
-        <w:t>La biblioteca Monseñor Héctor Rueda Hernández de la Institución Universitaria Salazar y Herrera (IUSH) cumple un papel fundamental en el apoyo a los procesos académicos, investigativos y culturales de la comunidad universitaria. Sin embargo, enfrenta dificultades en la gestión y control de su colección bibliográfica, debido a que los sistemas tradicionales de identificación y préstamo de libros se basan principalmente en códigos de barras.</w:t>
-      </w:r>
-    </w:p>
-    <w:p>
-      <w:pPr>
-        <w:ind w:firstLine="360"/>
-        <w:rPr>
-          <w:rFonts w:cs="Times New Roman"/>
-          <w:szCs w:val="24"/>
-        </w:rPr>
-      </w:pPr>
-      <w:r>
-        <w:rPr>
-          <w:rFonts w:cs="Times New Roman"/>
-          <w:szCs w:val="24"/>
-        </w:rPr>
-        <w:t>Este método presenta limitaciones significativas: requiere lectura individual y línea de visión</w:t>
-      </w:r>
-      <w:r>
-        <w:rPr>
-          <w:rFonts w:cs="Times New Roman"/>
-          <w:szCs w:val="24"/>
-        </w:rPr>
-        <w:t xml:space="preserve"> libro por libro</w:t>
-      </w:r>
-      <w:r>
-        <w:rPr>
-          <w:rFonts w:cs="Times New Roman"/>
-          <w:szCs w:val="24"/>
-        </w:rPr>
-        <w:t>, lo que hace que procesos como el préstamo, la devolución, el inventario y la búsqueda de ejemplares sean lentos, repetitivos y dependientes del personal de la biblioteca. Estas limitaciones generan congestión en los servicios de circulación, retrasos en la atención a los usuarios y dificultades para mantener una actualización en tiempo real de la disponibilidad de materiales.</w:t>
-      </w:r>
-    </w:p>
-    <w:p>
-      <w:pPr>
-        <w:ind w:firstLine="360"/>
-        <w:rPr>
-          <w:rFonts w:cs="Times New Roman"/>
-          <w:szCs w:val="24"/>
-        </w:rPr>
-      </w:pPr>
-      <w:r>
-        <w:rPr>
-          <w:rFonts w:cs="Times New Roman"/>
-          <w:szCs w:val="24"/>
-        </w:rPr>
-        <w:t>A lo anterior se suma el riesgo de extravío o pérdida de libros, así como la dificultad para detectar salidas no autorizadas, pues los sistemas de seguridad tradicionales presentan baja efectividad frente a la complejidad actual de la gestión de colecciones. Esto impacta no solo la seguridad del material bibliográfico, sino también la experiencia del estudiante y del docente, quienes demandan procesos más ágiles, confiables y alineados con el entorno tecnológico actual.</w:t>
-      </w:r>
-    </w:p>
-    <w:p>
-      <w:pPr>
-        <w:ind w:firstLine="360"/>
-        <w:rPr>
-          <w:rFonts w:cs="Times New Roman"/>
-          <w:szCs w:val="24"/>
-        </w:rPr>
-      </w:pPr>
-      <w:r>
-        <w:rPr>
-          <w:rFonts w:cs="Times New Roman"/>
-          <w:szCs w:val="24"/>
-        </w:rPr>
-        <w:t>Diversos estudios demuestran que la tecnología RFID ofrece ventajas significativas frente a los sistemas tradicionales, ya que permite la lectura simultánea de múltiples ejemplares, la automatización de préstamos y devoluciones, la gestión de inventario en tiempo real y el fortalecimiento de la seguridad de las colecciones. Sin embargo, su adopción en instituciones educativas como la IUSH se ha visto limitada por los costos iniciales, la necesidad de infraestructura adecuada, la capacitación del personal y las dudas en torno a la integración con los sistemas existentes.</w:t>
-      </w:r>
-    </w:p>
-    <w:p>
-      <w:pPr>
-        <w:ind w:firstLine="360"/>
-        <w:rPr>
-          <w:rFonts w:cs="Times New Roman"/>
-          <w:szCs w:val="24"/>
-        </w:rPr>
-      </w:pPr>
-      <w:r>
-        <w:rPr>
-          <w:rFonts w:cs="Times New Roman"/>
-          <w:szCs w:val="24"/>
-        </w:rPr>
-        <w:t>En este contexto, surge la necesidad de diseñar un sistema RFID adaptado a la biblioteca Monseñor Héctor Rueda Hernández, que permita optimizar el control e identificación de los libros, mejorar los procesos de circulación e inventario, y garantizar la seguridad de la colección, contribuyendo así al fortalecimiento de la gestión bibliotecaria de la IUSH y a la satisfacción de su comunidad académica.</w:t>
-      </w:r>
-    </w:p>
-    <w:p>
-      <w:pPr>
-        <w:ind w:firstLine="360"/>
-        <w:rPr>
-          <w:rFonts w:cs="Times New Roman"/>
-          <w:szCs w:val="24"/>
-        </w:rPr>
-      </w:pPr>
-      <w:r>
-        <w:rPr>
-          <w:rFonts w:cs="Times New Roman"/>
-          <w:szCs w:val="24"/>
-        </w:rPr>
-        <w:lastRenderedPageBreak/>
-        <w:t>En este contexto, surge la siguiente pregunta problema:</w:t>
-      </w:r>
-    </w:p>
-    <w:p>
-      <w:pPr>
-        <w:ind w:firstLine="360"/>
-        <w:rPr>
-          <w:rFonts w:cs="Times New Roman"/>
-          <w:szCs w:val="24"/>
-        </w:rPr>
-      </w:pPr>
-      <w:r>
-        <w:rPr>
-          <w:rFonts w:cs="Times New Roman"/>
-          <w:szCs w:val="24"/>
-        </w:rPr>
-        <w:t>¿Cómo implementar un sistema de identificación por radiofrecuencia (RFID) que permita el control eficiente, seguro y automatizado de libros en bibliotecas, superando las limitaciones de los métodos tradicionales de identificación, mejorando</w:t>
-      </w:r>
-      <w:r>
-        <w:rPr>
-          <w:rFonts w:cs="Times New Roman"/>
-          <w:szCs w:val="24"/>
-        </w:rPr>
-        <w:t xml:space="preserve"> así</w:t>
-      </w:r>
-      <w:r>
-        <w:rPr>
-          <w:rFonts w:cs="Times New Roman"/>
-          <w:szCs w:val="24"/>
-        </w:rPr>
-        <w:t xml:space="preserve"> la trazabilidad, el acceso y la gestión del inventario?</w:t>
-      </w:r>
-    </w:p>
-    <w:p>
-      <w:pPr>
-        <w:spacing w:after="160" w:line="259" w:lineRule="auto"/>
+      <w:r>
+        <w:rPr>
+          <w:rFonts w:cs="Times New Roman"/>
+          <w:szCs w:val="24"/>
+        </w:rPr>
+        <w:t>La implementación de un sistema de identificación por radiofrecuencia (RFID) en la biblioteca “Monseñor Héctor Rueda Hernández” de la IUSH mejorará la eficiencia, seguridad y automatización en los procesos de préstamo, devolución e inventario de libros, al permitir una lectura simultánea sin necesidad de línea de visión y una actualización en tiempo real del inventario.</w:t>
+      </w:r>
+    </w:p>
+    <w:p>
+      <w:pPr>
+        <w:rPr>
+          <w:rFonts w:cs="Times New Roman"/>
+          <w:b/>
+          <w:szCs w:val="24"/>
+        </w:rPr>
+      </w:pPr>
+    </w:p>
+    <w:p>
+      <w:pPr>
         <w:jc w:val="left"/>
         <w:rPr>
           <w:b/>
         </w:rPr>
       </w:pPr>
-      <w:bookmarkStart w:id="31" w:name="_Toc440985132"/>
-    </w:p>
-    <w:p>
-      <w:pPr>
-        <w:jc w:val="center"/>
-        <w:rPr>
-          <w:b/>
-          <w:bCs/>
-        </w:rPr>
-      </w:pPr>
-      <w:r>
-        <w:rPr>
-          <w:b/>
-          <w:bCs/>
+      <w:bookmarkStart w:id="29" w:name="_Toc440985134"/>
+      <w:r>
+        <w:rPr>
+          <w:b/>
         </w:rPr>
         <w:t>5</w:t>
       </w:r>
       <w:r>
         <w:rPr>
           <w:b/>
-          <w:bCs/>
-        </w:rPr>
-        <w:t xml:space="preserve"> Hipótesis</w:t>
-      </w:r>
-      <w:bookmarkEnd w:id="31"/>
-    </w:p>
-    <w:p>
-      <w:pPr>
-        <w:rPr>
-          <w:rFonts w:cs="Times New Roman"/>
-          <w:szCs w:val="24"/>
-        </w:rPr>
-      </w:pPr>
-    </w:p>
-    <w:p>
-      <w:pPr>
-        <w:ind w:firstLine="708"/>
-        <w:rPr>
-          <w:rFonts w:cs="Times New Roman"/>
-          <w:szCs w:val="24"/>
-        </w:rPr>
-      </w:pPr>
-      <w:r>
-        <w:rPr>
-          <w:rFonts w:cs="Times New Roman"/>
-          <w:szCs w:val="24"/>
-        </w:rPr>
-        <w:t>La implementación de un sistema de identificación por radiofrecuencia (RFID) en la biblioteca “Monseñor Héctor Rueda Hernández” de la IUSH mejorará la eficiencia, seguridad y automatización en los procesos de préstamo, devolución e inventario de libros, al permitir una lectura simultánea sin necesidad de línea de visión y una actualización en tiempo real del inventario.</w:t>
-      </w:r>
-    </w:p>
-    <w:p>
-      <w:pPr>
-        <w:rPr>
-          <w:rFonts w:cs="Times New Roman"/>
-          <w:b/>
-          <w:szCs w:val="24"/>
-        </w:rPr>
-      </w:pPr>
-    </w:p>
-    <w:p>
-      <w:pPr>
-        <w:jc w:val="left"/>
-        <w:rPr>
-          <w:b/>
-        </w:rPr>
-      </w:pPr>
-      <w:bookmarkStart w:id="32" w:name="_Toc440985134"/>
-      <w:r>
-        <w:rPr>
-          <w:b/>
-        </w:rPr>
-        <w:t>5</w:t>
-      </w:r>
-      <w:r>
-        <w:rPr>
-          <w:b/>
-        </w:rPr>
-        <w:t>.</w:t>
-      </w:r>
-      <w:r>
-        <w:rPr>
-          <w:b/>
-        </w:rPr>
-        <w:t>1</w:t>
-      </w:r>
-      <w:r>
-        <w:rPr>
-          <w:b/>
-        </w:rPr>
-        <w:t xml:space="preserve"> Hipótesis </w:t>
+        </w:rPr>
+        <w:t xml:space="preserve">.2 Hipótesis </w:t>
       </w:r>
       <w:r>
         <w:rPr>
@@ -5909,7 +5497,7 @@
         </w:rPr>
         <w:t>stadística</w:t>
       </w:r>
-      <w:bookmarkEnd w:id="32"/>
+      <w:bookmarkEnd w:id="29"/>
     </w:p>
     <w:p>
       <w:pPr>
@@ -6090,22 +5678,6 @@
       <w:pPr>
         <w:rPr>
           <w:rFonts w:cs="Times New Roman"/>
-          <w:szCs w:val="24"/>
-        </w:rPr>
-      </w:pPr>
-    </w:p>
-    <w:p>
-      <w:pPr>
-        <w:rPr>
-          <w:rFonts w:cs="Times New Roman"/>
-          <w:szCs w:val="24"/>
-        </w:rPr>
-      </w:pPr>
-    </w:p>
-    <w:p>
-      <w:pPr>
-        <w:rPr>
-          <w:rFonts w:cs="Times New Roman"/>
           <w:b/>
           <w:szCs w:val="24"/>
         </w:rPr>
@@ -6115,15 +5687,24 @@
       <w:pPr>
         <w:jc w:val="center"/>
         <w:rPr>
-          <w:b/>
-        </w:rPr>
-      </w:pPr>
-      <w:bookmarkStart w:id="33" w:name="_Toc440985137"/>
-      <w:r>
-        <w:rPr>
-          <w:b/>
-        </w:rPr>
-        <w:lastRenderedPageBreak/>
+          <w:rFonts w:cs="Times New Roman"/>
+          <w:b/>
+          <w:szCs w:val="24"/>
+        </w:rPr>
+      </w:pPr>
+    </w:p>
+    <w:p>
+      <w:pPr>
+        <w:jc w:val="center"/>
+        <w:rPr>
+          <w:b/>
+        </w:rPr>
+      </w:pPr>
+      <w:bookmarkStart w:id="30" w:name="_Toc440985137"/>
+      <w:r>
+        <w:rPr>
+          <w:b/>
+        </w:rPr>
         <w:t>6</w:t>
       </w:r>
       <w:r>
@@ -6144,7 +5725,7 @@
         </w:rPr>
         <w:t>eórico</w:t>
       </w:r>
-      <w:bookmarkEnd w:id="33"/>
+      <w:bookmarkEnd w:id="30"/>
     </w:p>
     <w:p>
       <w:pPr>
@@ -6238,7 +5819,7 @@
           <w:b/>
         </w:rPr>
       </w:pPr>
-      <w:bookmarkStart w:id="34" w:name="_Toc440985138"/>
+      <w:bookmarkStart w:id="31" w:name="_Toc440985138"/>
       <w:r>
         <w:rPr>
           <w:b/>
@@ -6258,16 +5839,16 @@
         </w:rPr>
         <w:t xml:space="preserve"> </w:t>
       </w:r>
-      <w:bookmarkStart w:id="35" w:name="_Toc440985139"/>
+      <w:bookmarkStart w:id="32" w:name="_Toc440985139"/>
       <w:r>
         <w:rPr>
           <w:b/>
         </w:rPr>
         <w:t>Metodología</w:t>
       </w:r>
-      <w:bookmarkEnd w:id="35"/>
-    </w:p>
-    <w:bookmarkEnd w:id="34"/>
+      <w:bookmarkEnd w:id="32"/>
+    </w:p>
+    <w:bookmarkEnd w:id="31"/>
     <w:p>
       <w:pPr>
         <w:rPr>
@@ -6636,14 +6217,11 @@
         <w:ind w:left="1080"/>
       </w:pPr>
       <w:r>
-        <w:rPr>
-          <w:noProof/>
-        </w:rPr>
         <w:drawing>
-          <wp:inline distT="0" distB="0" distL="0" distR="0" wp14:anchorId="607205E3" wp14:editId="264D1E54">
-            <wp:extent cx="4711700" cy="5225896"/>
-            <wp:effectExtent l="0" t="0" r="0" b="0"/>
-            <wp:docPr id="1622224241" name="Imagen 2"/>
+          <wp:inline distT="0" distB="0" distL="0" distR="0" wp14:anchorId="466E7E1A" wp14:editId="24679CC6">
+            <wp:extent cx="4686300" cy="5230862"/>
+            <wp:effectExtent l="0" t="0" r="0" b="8255"/>
+            <wp:docPr id="1962154506" name="Imagen 2"/>
             <wp:cNvGraphicFramePr>
               <a:graphicFrameLocks xmlns:a="http://schemas.openxmlformats.org/drawingml/2006/main" noChangeAspect="1"/>
             </wp:cNvGraphicFramePr>
@@ -6672,7 +6250,7 @@
                   <pic:spPr bwMode="auto">
                     <a:xfrm>
                       <a:off x="0" y="0"/>
-                      <a:ext cx="4728287" cy="5244294"/>
+                      <a:ext cx="4696701" cy="5242472"/>
                     </a:xfrm>
                     <a:prstGeom prst="rect">
                       <a:avLst/>
@@ -6783,7 +6361,7 @@
           <w:bCs/>
         </w:rPr>
       </w:pPr>
-      <w:bookmarkStart w:id="36" w:name="_Toc440985140"/>
+      <w:bookmarkStart w:id="33" w:name="_Toc440985140"/>
       <w:r>
         <w:rPr>
           <w:b/>
@@ -6799,7 +6377,7 @@
         </w:rPr>
         <w:t xml:space="preserve"> Resultados</w:t>
       </w:r>
-      <w:bookmarkEnd w:id="36"/>
+      <w:bookmarkEnd w:id="33"/>
     </w:p>
     <w:p>
       <w:pPr>
@@ -6847,7 +6425,7 @@
         </w:rPr>
         <w:t xml:space="preserve">, proyecto o investigación. Aquí se pueden incluir tablas, figuras, diagramas y demás material demostrativo. </w:t>
       </w:r>
-      <w:bookmarkStart w:id="37" w:name="_Ref57038153"/>
+      <w:bookmarkStart w:id="34" w:name="_Ref57038153"/>
     </w:p>
     <w:p>
       <w:pPr>
@@ -6857,8 +6435,8 @@
           <w:b/>
         </w:rPr>
       </w:pPr>
-      <w:bookmarkStart w:id="38" w:name="_Toc440985141"/>
-      <w:bookmarkEnd w:id="37"/>
+      <w:bookmarkStart w:id="35" w:name="_Toc440985141"/>
+      <w:bookmarkEnd w:id="34"/>
       <w:r>
         <w:rPr>
           <w:b/>
@@ -6889,7 +6467,7 @@
         </w:rPr>
         <w:t xml:space="preserve"> Discusión</w:t>
       </w:r>
-      <w:bookmarkEnd w:id="38"/>
+      <w:bookmarkEnd w:id="35"/>
     </w:p>
     <w:p>
       <w:pPr>
@@ -6955,7 +6533,7 @@
           <w:bCs/>
         </w:rPr>
       </w:pPr>
-      <w:bookmarkStart w:id="39" w:name="_Toc440985142"/>
+      <w:bookmarkStart w:id="36" w:name="_Toc440985142"/>
       <w:r>
         <w:rPr>
           <w:b/>
@@ -6971,7 +6549,7 @@
         </w:rPr>
         <w:t xml:space="preserve"> Conclusiones</w:t>
       </w:r>
-      <w:bookmarkEnd w:id="39"/>
+      <w:bookmarkEnd w:id="36"/>
     </w:p>
     <w:p>
       <w:pPr>
@@ -7394,30 +6972,30 @@
       <w:pPr>
         <w:pStyle w:val="Ttulo1"/>
       </w:pPr>
-      <w:bookmarkStart w:id="40" w:name="_Toc440985143"/>
-      <w:bookmarkStart w:id="41" w:name="_Toc758643157"/>
+      <w:bookmarkStart w:id="37" w:name="_Toc440985143"/>
+      <w:bookmarkStart w:id="38" w:name="_Toc758643157"/>
       <w:r>
         <w:br w:type="page"/>
       </w:r>
-      <w:commentRangeStart w:id="42"/>
+      <w:commentRangeStart w:id="39"/>
       <w:r>
         <w:lastRenderedPageBreak/>
         <w:t>R</w:t>
       </w:r>
-      <w:commentRangeEnd w:id="42"/>
+      <w:commentRangeEnd w:id="39"/>
       <w:r>
         <w:rPr>
           <w:rStyle w:val="Refdecomentario"/>
           <w:sz w:val="24"/>
           <w:szCs w:val="32"/>
         </w:rPr>
-        <w:commentReference w:id="42"/>
+        <w:commentReference w:id="39"/>
       </w:r>
       <w:r>
         <w:t>eferencias</w:t>
       </w:r>
-      <w:bookmarkEnd w:id="40"/>
-      <w:bookmarkEnd w:id="41"/>
+      <w:bookmarkEnd w:id="37"/>
+      <w:bookmarkEnd w:id="38"/>
     </w:p>
     <w:p/>
     <w:sdt>
@@ -8823,95 +8401,45 @@
             <w:adjustRightInd w:val="0"/>
             <w:ind w:left="480" w:hanging="480"/>
             <w:rPr>
+              <w:rFonts w:cs="Times New Roman"/>
+              <w:noProof/>
+              <w:lang w:val="en-US"/>
+            </w:rPr>
+          </w:pPr>
+          <w:r>
+            <w:rPr>
+              <w:rFonts w:cs="Times New Roman"/>
+              <w:noProof/>
+              <w:lang w:val="en-US"/>
+            </w:rPr>
+            <w:t xml:space="preserve">Khair, N., Yusof, N. A., Ariff, M. H., Wahab, M. A., &amp; Bari, M. F. (2022). </w:t>
+          </w:r>
+          <w:r>
+            <w:rPr>
+              <w:rFonts w:cs="Times New Roman"/>
               <w:i/>
               <w:iCs/>
               <w:noProof/>
-            </w:rPr>
-          </w:pPr>
+              <w:lang w:val="en-US"/>
+            </w:rPr>
+            <w:t>Recent advances and open challenges in RFID antenna applications.</w:t>
+          </w:r>
           <w:r>
             <w:rPr>
               <w:rFonts w:cs="Times New Roman"/>
               <w:noProof/>
               <w:lang w:val="en-US"/>
             </w:rPr>
-            <w:t xml:space="preserve">Khair, N., Yusof, N. A., Ariff, M. H., Wahab, M. A., &amp; Bari, M. F. (2022). </w:t>
+            <w:t xml:space="preserve"> International Journal of Advanced Computer Science and Applications, 13(5), 45–53.</w:t>
           </w:r>
-          <w:r>
-            <w:rPr>
-              <w:i/>
-              <w:iCs/>
-              <w:noProof/>
-            </w:rPr>
-            <w:t>(S/f). Researchgate.net. Recuperado el 15 de marzo de 2026, de https://www.researchgate.net/profile/Iyinoluwa-Oyelade/publication/390212295_IMPLEMENTATION_OF_INTERNET_OF_THINGS_IoT_LIBRARY_SYSTEM_IN_NIGERIAN_UNIVERSITIES/links/67ec569c9b1c6c48776d35c4/IMPLEMENTATION-OF-INTERNET-OF-THINGS-IoT-LIBRARY-SYSTEM-IN-NIGERIAN-UNIVERSITIES.pdf</w:t>
-          </w:r>
-        </w:p>
-        <w:p>
-          <w:pPr>
-            <w:widowControl w:val="0"/>
-            <w:autoSpaceDE w:val="0"/>
-            <w:autoSpaceDN w:val="0"/>
-            <w:adjustRightInd w:val="0"/>
-            <w:ind w:left="480" w:hanging="480"/>
-            <w:rPr>
-              <w:rFonts w:cs="Times New Roman"/>
-              <w:noProof/>
-              <w:lang w:val="en-US"/>
-            </w:rPr>
-          </w:pPr>
-          <w:r>
-            <w:rPr>
-              <w:rFonts w:cs="Times New Roman"/>
-              <w:noProof/>
-              <w:lang w:val="en-US"/>
-            </w:rPr>
-            <w:t>International Journal of Advanced Computer Science and Applications, 13(5), 45–53.</w:t>
-          </w:r>
-        </w:p>
-        <w:p>
-          <w:pPr>
-            <w:widowControl w:val="0"/>
-            <w:autoSpaceDE w:val="0"/>
-            <w:autoSpaceDN w:val="0"/>
-            <w:adjustRightInd w:val="0"/>
-            <w:ind w:left="480" w:hanging="480"/>
-            <w:rPr>
-              <w:rFonts w:cs="Times New Roman"/>
-              <w:noProof/>
-            </w:rPr>
-          </w:pPr>
-          <w:r>
-            <w:rPr>
-              <w:rFonts w:cs="Times New Roman"/>
-              <w:noProof/>
-            </w:rPr>
-            <w:t>(S/f). Cloudfront.net. Recuperado el 15 de marzo de 2026, de https://d1wqtxts1xzle7.cloudfront.net/125469756/KEDLD2025_1_-libre.pdf?1763778070=&amp;response-content-disposition=inline%3B+filename%3DNational_Digital_Library_of_India_NDLI_a.pdf&amp;Expires=1773545232&amp;Signature=SptK-SVemPZLkKjo17LI28xozvbsPaMyhdi68fWj7hLZ6kL-Icx7hhRaOwaO1DTS5ecWR-825jjN-YNxrPQPH6VCJJ5AWxkulteCTx-</w:t>
-          </w:r>
-          <w:r>
-            <w:rPr>
-              <w:rFonts w:cs="Times New Roman"/>
-              <w:noProof/>
-            </w:rPr>
-            <w:lastRenderedPageBreak/>
-            <w:t>QyHjxqqCJMlG6jqd6yYmBi7q6pxawN4jWdegDeJxqvlFl4qh6jaW-uZBJ7d7~xG0mXb0xy0Jt5IXpxQDyBUyi5y~vFseQ2idd36TnQdL1z3xe7xf6eyKlFZeTRzr-HU1o9SDD7SiZEk1--AQ2UVFgHnKfq0~RoNWg-igbK71b1v3LcVxAodNWIsLBfp3lvTxrD6KkHVWqStlvC2GNwq2Iz4Yk9VMgxYbJECgbGEeukUJeow__&amp;Key-Pair-Id=APKAJLOHF5GGSLRBV4ZA</w:t>
-          </w:r>
-        </w:p>
-        <w:p>
-          <w:pPr>
-            <w:widowControl w:val="0"/>
-            <w:autoSpaceDE w:val="0"/>
-            <w:autoSpaceDN w:val="0"/>
-            <w:adjustRightInd w:val="0"/>
-            <w:ind w:left="480" w:hanging="480"/>
-            <w:rPr>
-              <w:rFonts w:cs="Times New Roman"/>
-              <w:noProof/>
-            </w:rPr>
-          </w:pPr>
         </w:p>
         <w:p>
           <w:pPr>
             <w:pStyle w:val="Bibliografa"/>
             <w:ind w:left="720" w:hanging="720"/>
+            <w:rPr>
+              <w:lang w:val="en-US"/>
+            </w:rPr>
           </w:pPr>
           <w:r>
             <w:rPr>
@@ -8969,15 +8497,15 @@
           <w:b/>
         </w:rPr>
       </w:pPr>
-      <w:bookmarkStart w:id="43" w:name="_Toc440985144"/>
-      <w:commentRangeStart w:id="44"/>
+      <w:bookmarkStart w:id="40" w:name="_Toc440985144"/>
+      <w:commentRangeStart w:id="41"/>
       <w:r>
         <w:rPr>
           <w:b/>
         </w:rPr>
         <w:t>A</w:t>
       </w:r>
-      <w:commentRangeEnd w:id="44"/>
+      <w:commentRangeEnd w:id="41"/>
       <w:r>
         <w:rPr>
           <w:rStyle w:val="Refdecomentario"/>
@@ -8985,7 +8513,7 @@
           <w:sz w:val="24"/>
           <w:szCs w:val="22"/>
         </w:rPr>
-        <w:commentReference w:id="44"/>
+        <w:commentReference w:id="41"/>
       </w:r>
       <w:r>
         <w:rPr>
@@ -8993,7 +8521,7 @@
         </w:rPr>
         <w:t>nexos</w:t>
       </w:r>
-      <w:bookmarkEnd w:id="43"/>
+      <w:bookmarkEnd w:id="40"/>
     </w:p>
     <w:p>
       <w:pPr>
@@ -9903,6 +9431,44 @@
         <w:annotationRef/>
       </w:r>
       <w:r>
+        <w:t xml:space="preserve">Marca todos los capítulos y subcapítulos dependiendo de los niveles que se utilicen en norma APA, en la ruta: </w:t>
+      </w:r>
+      <w:r>
+        <w:rPr>
+          <w:b/>
+        </w:rPr>
+        <w:t>Inicio</w:t>
+      </w:r>
+      <w:r>
+        <w:t xml:space="preserve"> &gt; Nivel 1 APA, Nivel 2 APA, Nivel 3 APA, Nivel 4 APA, Nivel 5 APA.</w:t>
+      </w:r>
+    </w:p>
+    <w:p>
+      <w:pPr>
+        <w:pStyle w:val="Textocomentario"/>
+      </w:pPr>
+    </w:p>
+    <w:p>
+      <w:pPr>
+        <w:pStyle w:val="Textocomentario"/>
+      </w:pPr>
+      <w:r>
+        <w:t>Si tienes dudas, solicita asesoría en Biblioteca.</w:t>
+      </w:r>
+    </w:p>
+  </w:comment>
+  <w:comment w:id="18" w:author="Autor" w:initials="A">
+    <w:p>
+      <w:pPr>
+        <w:pStyle w:val="Textocomentario"/>
+      </w:pPr>
+      <w:r>
+        <w:rPr>
+          <w:rStyle w:val="Refdecomentario"/>
+        </w:rPr>
+        <w:annotationRef/>
+      </w:r>
+      <w:r>
         <w:t>Si no vas a utilizar esta nota al pie, elimínala. Si vas a utilizar la segunda nota al pie o subsiguientes, insértalas así:</w:t>
       </w:r>
     </w:p>
@@ -9917,22 +9483,6 @@
       </w:pPr>
       <w:r>
         <w:t>Referencias &gt; Insertar nota al pie (Word lleva la numeración automática).</w:t>
-      </w:r>
-    </w:p>
-  </w:comment>
-  <w:comment w:id="19" w:author="Autor" w:initials="A">
-    <w:p>
-      <w:pPr>
-        <w:pStyle w:val="Textocomentario"/>
-      </w:pPr>
-      <w:r>
-        <w:rPr>
-          <w:rStyle w:val="Refdecomentario"/>
-        </w:rPr>
-        <w:annotationRef/>
-      </w:r>
-      <w:r>
-        <w:t>Actualizar cita</w:t>
       </w:r>
     </w:p>
   </w:comment>
@@ -9940,6 +9490,7 @@
     <w:p>
       <w:pPr>
         <w:pStyle w:val="Textocomentario"/>
+        <w:jc w:val="left"/>
       </w:pPr>
       <w:r>
         <w:rPr>
@@ -9948,23 +9499,27 @@
         <w:annotationRef/>
       </w:r>
       <w:r>
-        <w:t>Actualizar fecha</w:t>
-      </w:r>
-    </w:p>
-  </w:comment>
-  <w:comment w:id="21" w:author="Autor" w:initials="A">
-    <w:p>
-      <w:pPr>
-        <w:pStyle w:val="Textocomentario"/>
-      </w:pPr>
-      <w:r>
-        <w:rPr>
-          <w:rStyle w:val="Refdecomentario"/>
-        </w:rPr>
-        <w:annotationRef/>
-      </w:r>
-      <w:r>
-        <w:t>Actualizar fecha</w:t>
+        <w:t xml:space="preserve">En bibliotecas suele usarse </w:t>
+      </w:r>
+      <w:r>
+        <w:rPr>
+          <w:b/>
+          <w:bCs/>
+        </w:rPr>
+        <w:t>HF (13,56 MHz, ISO 15693/18000-3)</w:t>
+      </w:r>
+      <w:r>
+        <w:t xml:space="preserve"> por su buen acoplamiento cercano y menor apantallamiento por papel; para patios/logística domina </w:t>
+      </w:r>
+      <w:r>
+        <w:rPr>
+          <w:b/>
+          <w:bCs/>
+        </w:rPr>
+        <w:t>UHF (ISO 18000-63 / EPC Gen2)</w:t>
+      </w:r>
+      <w:r>
+        <w:t xml:space="preserve"> por mayor alcance. </w:t>
       </w:r>
     </w:p>
   </w:comment>
@@ -9980,11 +9535,16 @@
         <w:annotationRef/>
       </w:r>
       <w:r>
-        <w:t>Actualizar fecha</w:t>
-      </w:r>
+        <w:t>Entre párrafo y párrafo se debe utilizar 1 espacio sencillo.</w:t>
+      </w:r>
+    </w:p>
+    <w:p>
+      <w:pPr>
+        <w:pStyle w:val="Textocomentario"/>
+      </w:pPr>
     </w:p>
   </w:comment>
-  <w:comment w:id="23" w:author="Autor" w:initials="A">
+  <w:comment w:id="28" w:author="Autor" w:initials="A">
     <w:p>
       <w:pPr>
         <w:pStyle w:val="Textocomentario"/>
@@ -9996,11 +9556,34 @@
         <w:annotationRef/>
       </w:r>
       <w:r>
-        <w:t>Actualizar fecha</w:t>
-      </w:r>
+        <w:rPr>
+          <w:b/>
+        </w:rPr>
+        <w:t>Nivel</w:t>
+      </w:r>
+      <w:r>
+        <w:rPr>
+          <w:b/>
+        </w:rPr>
+        <w:t>es</w:t>
+      </w:r>
+      <w:r>
+        <w:rPr>
+          <w:b/>
+        </w:rPr>
+        <w:t xml:space="preserve"> 1 APA:</w:t>
+      </w:r>
+      <w:r>
+        <w:t xml:space="preserve"> número arábigo, centrado, negritas, minúsculas. Este estilo ya está configurado en: Inicio &gt; Nivel 1 APA</w:t>
+      </w:r>
+    </w:p>
+    <w:p>
+      <w:pPr>
+        <w:pStyle w:val="Textocomentario"/>
+      </w:pPr>
     </w:p>
   </w:comment>
-  <w:comment w:id="24" w:author="Autor" w:initials="A">
+  <w:comment w:id="27" w:author="Autor" w:initials="A">
     <w:p>
       <w:pPr>
         <w:pStyle w:val="Textocomentario"/>
@@ -10012,11 +9595,38 @@
         <w:annotationRef/>
       </w:r>
       <w:r>
-        <w:t>Actualizar fecha</w:t>
+        <w:t xml:space="preserve">NOTA IMPORTANTE: </w:t>
+      </w:r>
+      <w:r>
+        <w:t>Según la naturaleza de cada investigación y la orientación del asesor</w:t>
+      </w:r>
+      <w:r>
+        <w:t>/a</w:t>
+      </w:r>
+      <w:r>
+        <w:t xml:space="preserve"> de trabajo de grado</w:t>
+      </w:r>
+      <w:r>
+        <w:t>,</w:t>
+      </w:r>
+      <w:r>
+        <w:t xml:space="preserve"> se incluirá</w:t>
+      </w:r>
+      <w:r>
+        <w:t xml:space="preserve"> o no</w:t>
+      </w:r>
+      <w:r>
+        <w:t xml:space="preserve"> una hipótesis en el proyecto</w:t>
+      </w:r>
+      <w:r>
+        <w:t xml:space="preserve"> y también los tipos de hipótesis que se consideren</w:t>
+      </w:r>
+      <w:r>
+        <w:t>.</w:t>
       </w:r>
     </w:p>
   </w:comment>
-  <w:comment w:id="26" w:author="Autor" w:initials="A">
+  <w:comment w:id="39" w:author="Autor" w:initials="A">
     <w:p>
       <w:pPr>
         <w:pStyle w:val="Textocomentario"/>
@@ -10028,7 +9638,37 @@
         <w:annotationRef/>
       </w:r>
       <w:r>
-        <w:t>Entre párrafo y párrafo se debe utilizar 1 espacio sencillo.</w:t>
+        <w:rPr>
+          <w:rFonts w:cs="Times New Roman"/>
+        </w:rPr>
+        <w:t>Lista alfabética de fuentes consultadas.</w:t>
+      </w:r>
+      <w:r>
+        <w:t xml:space="preserve"> </w:t>
+      </w:r>
+      <w:r>
+        <w:rPr>
+          <w:rFonts w:cs="Times New Roman"/>
+        </w:rPr>
+        <w:t>Todas, sin excepción, deben estar citadas dentro del texto</w:t>
+      </w:r>
+      <w:r>
+        <w:rPr>
+          <w:rFonts w:cs="Times New Roman"/>
+        </w:rPr>
+        <w:t xml:space="preserve"> al menos una vez</w:t>
+      </w:r>
+      <w:r>
+        <w:rPr>
+          <w:rFonts w:cs="Times New Roman"/>
+        </w:rPr>
+        <w:t xml:space="preserve">. </w:t>
+      </w:r>
+      <w:r>
+        <w:rPr>
+          <w:rFonts w:cs="Times New Roman"/>
+        </w:rPr>
+        <w:t>Se debe conservar la estructura de citación según las normas APA.</w:t>
       </w:r>
     </w:p>
     <w:p>
@@ -10037,136 +9677,7 @@
       </w:pPr>
     </w:p>
   </w:comment>
-  <w:comment w:id="30" w:author="Autor" w:initials="A">
-    <w:p>
-      <w:pPr>
-        <w:pStyle w:val="NormalWeb"/>
-        <w:spacing w:before="0" w:beforeAutospacing="0" w:after="0" w:afterAutospacing="0" w:line="300" w:lineRule="atLeast"/>
-        <w:rPr>
-          <w:rFonts w:ascii="Segoe UI" w:hAnsi="Segoe UI" w:cs="Segoe UI"/>
-          <w:sz w:val="21"/>
-          <w:szCs w:val="21"/>
-        </w:rPr>
-      </w:pPr>
-      <w:r>
-        <w:rPr>
-          <w:rStyle w:val="Refdecomentario"/>
-        </w:rPr>
-        <w:annotationRef/>
-      </w:r>
-      <w:r>
-        <w:rPr>
-          <w:rFonts w:ascii="Segoe UI" w:hAnsi="Segoe UI" w:cs="Segoe UI"/>
-          <w:sz w:val="21"/>
-          <w:szCs w:val="21"/>
-        </w:rPr>
-        <w:t xml:space="preserve">El planteamiento del problema debe </w:t>
-      </w:r>
-      <w:r>
-        <w:rPr>
-          <w:rFonts w:ascii="Segoe UI" w:hAnsi="Segoe UI" w:cs="Segoe UI"/>
-          <w:sz w:val="21"/>
-          <w:szCs w:val="21"/>
-          <w:shd w:val="clear" w:color="auto" w:fill="FF0000"/>
-        </w:rPr>
-        <w:t>sus</w:t>
-      </w:r>
-      <w:r>
-        <w:rPr>
-          <w:rFonts w:ascii="Segoe UI" w:hAnsi="Segoe UI" w:cs="Segoe UI"/>
-          <w:sz w:val="21"/>
-          <w:szCs w:val="21"/>
-          <w:shd w:val="clear" w:color="auto" w:fill="FF0000"/>
-        </w:rPr>
-        <w:t>tentarse</w:t>
-      </w:r>
-      <w:r>
-        <w:rPr>
-          <w:rFonts w:ascii="Segoe UI" w:hAnsi="Segoe UI" w:cs="Segoe UI"/>
-          <w:sz w:val="21"/>
-          <w:szCs w:val="21"/>
-          <w:shd w:val="clear" w:color="auto" w:fill="FF0000"/>
-        </w:rPr>
-        <w:t xml:space="preserve"> con datos o evidencia académic</w:t>
-      </w:r>
-      <w:r>
-        <w:rPr>
-          <w:rFonts w:ascii="Segoe UI" w:hAnsi="Segoe UI" w:cs="Segoe UI"/>
-          <w:sz w:val="21"/>
-          <w:szCs w:val="21"/>
-        </w:rPr>
-        <w:t xml:space="preserve">a. </w:t>
-      </w:r>
-    </w:p>
-    <w:p>
-      <w:pPr>
-        <w:pStyle w:val="NormalWeb"/>
-        <w:spacing w:before="0" w:beforeAutospacing="0" w:after="0" w:afterAutospacing="0" w:line="300" w:lineRule="atLeast"/>
-        <w:rPr>
-          <w:rFonts w:ascii="Segoe UI" w:hAnsi="Segoe UI" w:cs="Segoe UI"/>
-          <w:sz w:val="21"/>
-          <w:szCs w:val="21"/>
-        </w:rPr>
-      </w:pPr>
-    </w:p>
-    <w:p>
-      <w:pPr>
-        <w:pStyle w:val="Textocomentario"/>
-      </w:pPr>
-    </w:p>
-  </w:comment>
-  <w:comment w:id="42" w:author="Autor" w:initials="A">
-    <w:p>
-      <w:pPr>
-        <w:pStyle w:val="Textocomentario"/>
-      </w:pPr>
-      <w:r>
-        <w:rPr>
-          <w:rStyle w:val="Refdecomentario"/>
-        </w:rPr>
-        <w:annotationRef/>
-      </w:r>
-      <w:r>
-        <w:rPr>
-          <w:rFonts w:cs="Times New Roman"/>
-        </w:rPr>
-        <w:t>Lista alfabética de fuentes consultadas.</w:t>
-      </w:r>
-      <w:r>
-        <w:t xml:space="preserve"> </w:t>
-      </w:r>
-      <w:r>
-        <w:rPr>
-          <w:rFonts w:cs="Times New Roman"/>
-        </w:rPr>
-        <w:t>Todas, sin excepción, deben estar citadas dentro del texto</w:t>
-      </w:r>
-      <w:r>
-        <w:rPr>
-          <w:rFonts w:cs="Times New Roman"/>
-        </w:rPr>
-        <w:t xml:space="preserve"> al menos una vez</w:t>
-      </w:r>
-      <w:r>
-        <w:rPr>
-          <w:rFonts w:cs="Times New Roman"/>
-        </w:rPr>
-        <w:t xml:space="preserve">. </w:t>
-      </w:r>
-      <w:r>
-        <w:rPr>
-          <w:rFonts w:cs="Times New Roman"/>
-        </w:rPr>
-        <w:t>Se debe conservar la estructura de citación según las normas APA.</w:t>
-      </w:r>
-    </w:p>
-    <w:p>
-      <w:pPr>
-        <w:pStyle w:val="Textocomentario"/>
-      </w:pPr>
-    </w:p>
-  </w:comment>
-  <w:comment w:id="44" w:author="Autor" w:initials="A">
+  <w:comment w:id="41" w:author="Autor" w:initials="A">
     <w:p>
       <w:pPr>
         <w:pStyle w:val="Textocomentario"/>
@@ -10248,15 +9759,12 @@
   <w15:commentEx w15:paraId="258A4246" w15:done="0"/>
   <w15:commentEx w15:paraId="7E6B1428" w15:done="0"/>
   <w15:commentEx w15:paraId="78BD42ED" w15:done="0"/>
+  <w15:commentEx w15:paraId="5FC2F72E" w15:done="0"/>
   <w15:commentEx w15:paraId="5A191319" w15:done="0"/>
-  <w15:commentEx w15:paraId="73F4C825" w15:done="0"/>
-  <w15:commentEx w15:paraId="541D2E9A" w15:done="0"/>
-  <w15:commentEx w15:paraId="466D76AE" w15:done="0"/>
-  <w15:commentEx w15:paraId="5CF03A36" w15:done="0"/>
-  <w15:commentEx w15:paraId="69DD4CFB" w15:done="0"/>
-  <w15:commentEx w15:paraId="1A7C9256" w15:done="0"/>
+  <w15:commentEx w15:paraId="44131166" w15:done="1"/>
   <w15:commentEx w15:paraId="33EB55E0" w15:done="0"/>
-  <w15:commentEx w15:paraId="44DE10D4" w15:done="0"/>
+  <w15:commentEx w15:paraId="278B3905" w15:done="0"/>
+  <w15:commentEx w15:paraId="054A37B0" w15:done="0"/>
   <w15:commentEx w15:paraId="07FA2090" w15:done="0"/>
   <w15:commentEx w15:paraId="12DDE124" w15:done="0"/>
 </w15:commentsEx>
@@ -10274,15 +9782,12 @@
   <w16cid:commentId w16cid:paraId="258A4246" w16cid:durableId="2338205A"/>
   <w16cid:commentId w16cid:paraId="7E6B1428" w16cid:durableId="2338205B"/>
   <w16cid:commentId w16cid:paraId="78BD42ED" w16cid:durableId="2338205C"/>
+  <w16cid:commentId w16cid:paraId="5FC2F72E" w16cid:durableId="2338205D"/>
   <w16cid:commentId w16cid:paraId="5A191319" w16cid:durableId="23382060"/>
-  <w16cid:commentId w16cid:paraId="73F4C825" w16cid:durableId="2D597696"/>
-  <w16cid:commentId w16cid:paraId="541D2E9A" w16cid:durableId="2D5976CF"/>
-  <w16cid:commentId w16cid:paraId="466D76AE" w16cid:durableId="2D597735"/>
-  <w16cid:commentId w16cid:paraId="5CF03A36" w16cid:durableId="2D597781"/>
-  <w16cid:commentId w16cid:paraId="69DD4CFB" w16cid:durableId="2D597794"/>
-  <w16cid:commentId w16cid:paraId="1A7C9256" w16cid:durableId="2D5977B2"/>
+  <w16cid:commentId w16cid:paraId="44131166" w16cid:durableId="7411A2AA"/>
   <w16cid:commentId w16cid:paraId="33EB55E0" w16cid:durableId="2B4B62E1"/>
-  <w16cid:commentId w16cid:paraId="44DE10D4" w16cid:durableId="2D597939"/>
+  <w16cid:commentId w16cid:paraId="278B3905" w16cid:durableId="2B4B6F67"/>
+  <w16cid:commentId w16cid:paraId="054A37B0" w16cid:durableId="2B4B6F7C"/>
   <w16cid:commentId w16cid:paraId="07FA2090" w16cid:durableId="2B546375"/>
   <w16cid:commentId w16cid:paraId="12DDE124" w16cid:durableId="2B548902"/>
 </w16cid:commentsIds>
@@ -13263,82 +12768,82 @@
       </w:pPr>
     </w:lvl>
   </w:abstractNum>
-  <w:num w:numId="1" w16cid:durableId="765148310">
+  <w:num w:numId="1" w16cid:durableId="204104855">
     <w:abstractNumId w:val="7"/>
   </w:num>
-  <w:num w:numId="2" w16cid:durableId="1570572705">
+  <w:num w:numId="2" w16cid:durableId="1793163019">
     <w:abstractNumId w:val="18"/>
   </w:num>
-  <w:num w:numId="3" w16cid:durableId="1075132380">
+  <w:num w:numId="3" w16cid:durableId="834108088">
     <w:abstractNumId w:val="24"/>
   </w:num>
-  <w:num w:numId="4" w16cid:durableId="640698773">
+  <w:num w:numId="4" w16cid:durableId="1624310831">
     <w:abstractNumId w:val="13"/>
   </w:num>
-  <w:num w:numId="5" w16cid:durableId="2094205322">
+  <w:num w:numId="5" w16cid:durableId="1248882816">
     <w:abstractNumId w:val="4"/>
   </w:num>
-  <w:num w:numId="6" w16cid:durableId="1107852567">
+  <w:num w:numId="6" w16cid:durableId="1603222009">
     <w:abstractNumId w:val="19"/>
   </w:num>
-  <w:num w:numId="7" w16cid:durableId="193083723">
+  <w:num w:numId="7" w16cid:durableId="627786870">
     <w:abstractNumId w:val="1"/>
   </w:num>
-  <w:num w:numId="8" w16cid:durableId="867765813">
+  <w:num w:numId="8" w16cid:durableId="1414010986">
     <w:abstractNumId w:val="9"/>
   </w:num>
-  <w:num w:numId="9" w16cid:durableId="1217619536">
+  <w:num w:numId="9" w16cid:durableId="1345670746">
     <w:abstractNumId w:val="22"/>
   </w:num>
-  <w:num w:numId="10" w16cid:durableId="1966890489">
+  <w:num w:numId="10" w16cid:durableId="1030688457">
     <w:abstractNumId w:val="14"/>
   </w:num>
-  <w:num w:numId="11" w16cid:durableId="890966808">
+  <w:num w:numId="11" w16cid:durableId="1940021612">
     <w:abstractNumId w:val="11"/>
   </w:num>
-  <w:num w:numId="12" w16cid:durableId="756710485">
+  <w:num w:numId="12" w16cid:durableId="892930867">
     <w:abstractNumId w:val="23"/>
   </w:num>
-  <w:num w:numId="13" w16cid:durableId="1277177773">
+  <w:num w:numId="13" w16cid:durableId="509031985">
     <w:abstractNumId w:val="15"/>
   </w:num>
-  <w:num w:numId="14" w16cid:durableId="677390718">
+  <w:num w:numId="14" w16cid:durableId="105201213">
     <w:abstractNumId w:val="2"/>
   </w:num>
-  <w:num w:numId="15" w16cid:durableId="1749038905">
+  <w:num w:numId="15" w16cid:durableId="705372606">
     <w:abstractNumId w:val="8"/>
   </w:num>
-  <w:num w:numId="16" w16cid:durableId="1960187501">
+  <w:num w:numId="16" w16cid:durableId="1523056986">
     <w:abstractNumId w:val="5"/>
   </w:num>
-  <w:num w:numId="17" w16cid:durableId="2046902234">
+  <w:num w:numId="17" w16cid:durableId="476872564">
     <w:abstractNumId w:val="3"/>
   </w:num>
-  <w:num w:numId="18" w16cid:durableId="1061103095">
+  <w:num w:numId="18" w16cid:durableId="1696037078">
     <w:abstractNumId w:val="21"/>
   </w:num>
-  <w:num w:numId="19" w16cid:durableId="472065800">
+  <w:num w:numId="19" w16cid:durableId="1152215020">
     <w:abstractNumId w:val="6"/>
   </w:num>
-  <w:num w:numId="20" w16cid:durableId="1439789267">
+  <w:num w:numId="20" w16cid:durableId="800075743">
     <w:abstractNumId w:val="12"/>
   </w:num>
-  <w:num w:numId="21" w16cid:durableId="1075276787">
+  <w:num w:numId="21" w16cid:durableId="27222581">
     <w:abstractNumId w:val="17"/>
   </w:num>
-  <w:num w:numId="22" w16cid:durableId="1800996081">
+  <w:num w:numId="22" w16cid:durableId="499583074">
     <w:abstractNumId w:val="20"/>
   </w:num>
-  <w:num w:numId="23" w16cid:durableId="383796873">
+  <w:num w:numId="23" w16cid:durableId="123082288">
     <w:abstractNumId w:val="25"/>
   </w:num>
-  <w:num w:numId="24" w16cid:durableId="240529759">
+  <w:num w:numId="24" w16cid:durableId="1857649583">
     <w:abstractNumId w:val="10"/>
   </w:num>
-  <w:num w:numId="25" w16cid:durableId="1695692798">
+  <w:num w:numId="25" w16cid:durableId="748696788">
     <w:abstractNumId w:val="16"/>
   </w:num>
-  <w:num w:numId="26" w16cid:durableId="1282567565">
+  <w:num w:numId="26" w16cid:durableId="440034585">
     <w:abstractNumId w:val="0"/>
   </w:num>
 </w:numbering>
@@ -15135,195 +14640,6 @@
 </file>
 
 <file path=customXml/item1.xml><?xml version="1.0" encoding="utf-8"?>
-<ct:contentTypeSchema xmlns:ct="http://schemas.microsoft.com/office/2006/metadata/contentType" xmlns:ma="http://schemas.microsoft.com/office/2006/metadata/properties/metaAttributes" ct:_="" ma:_="" ma:contentTypeName="Document" ma:contentTypeID="0x0101006D04E2305BF7F54FA7D6E0248C2500D9" ma:contentTypeVersion="10" ma:contentTypeDescription="Create a new document." ma:contentTypeScope="" ma:versionID="dd10ca140d1ea1bbb7d218f74e8b029c">
-  <xsd:schema xmlns:xsd="http://www.w3.org/2001/XMLSchema" xmlns:xs="http://www.w3.org/2001/XMLSchema" xmlns:p="http://schemas.microsoft.com/office/2006/metadata/properties" xmlns:ns2="2fbea1be-444b-4810-a171-216b375690c2" xmlns:ns3="78beeb7a-d011-4854-8ba0-0712d94e68d3" targetNamespace="http://schemas.microsoft.com/office/2006/metadata/properties" ma:root="true" ma:fieldsID="64c721ace28926f2a46387699be0b7f5" ns2:_="" ns3:_="">
-    <xsd:import namespace="2fbea1be-444b-4810-a171-216b375690c2"/>
-    <xsd:import namespace="78beeb7a-d011-4854-8ba0-0712d94e68d3"/>
-    <xsd:element name="properties">
-      <xsd:complexType>
-        <xsd:sequence>
-          <xsd:element name="documentManagement">
-            <xsd:complexType>
-              <xsd:all>
-                <xsd:element ref="ns2:MediaServiceMetadata" minOccurs="0"/>
-                <xsd:element ref="ns2:MediaServiceFastMetadata" minOccurs="0"/>
-                <xsd:element ref="ns2:MediaServiceSearchProperties" minOccurs="0"/>
-                <xsd:element ref="ns2:MediaServiceDateTaken" minOccurs="0"/>
-                <xsd:element ref="ns2:lcf76f155ced4ddcb4097134ff3c332f" minOccurs="0"/>
-                <xsd:element ref="ns3:TaxCatchAll" minOccurs="0"/>
-                <xsd:element ref="ns2:MediaServiceOCR" minOccurs="0"/>
-                <xsd:element ref="ns2:MediaServiceGenerationTime" minOccurs="0"/>
-                <xsd:element ref="ns2:MediaServiceEventHashCode" minOccurs="0"/>
-              </xsd:all>
-            </xsd:complexType>
-          </xsd:element>
-        </xsd:sequence>
-      </xsd:complexType>
-    </xsd:element>
-  </xsd:schema>
-  <xsd:schema xmlns:xsd="http://www.w3.org/2001/XMLSchema" xmlns:xs="http://www.w3.org/2001/XMLSchema" xmlns:dms="http://schemas.microsoft.com/office/2006/documentManagement/types" xmlns:pc="http://schemas.microsoft.com/office/infopath/2007/PartnerControls" targetNamespace="2fbea1be-444b-4810-a171-216b375690c2" elementFormDefault="qualified">
-    <xsd:import namespace="http://schemas.microsoft.com/office/2006/documentManagement/types"/>
-    <xsd:import namespace="http://schemas.microsoft.com/office/infopath/2007/PartnerControls"/>
-    <xsd:element name="MediaServiceMetadata" ma:index="8" nillable="true" ma:displayName="MediaServiceMetadata" ma:hidden="true" ma:internalName="MediaServiceMetadata" ma:readOnly="true">
-      <xsd:simpleType>
-        <xsd:restriction base="dms:Note"/>
-      </xsd:simpleType>
-    </xsd:element>
-    <xsd:element name="MediaServiceFastMetadata" ma:index="9" nillable="true" ma:displayName="MediaServiceFastMetadata" ma:hidden="true" ma:internalName="MediaServiceFastMetadata" ma:readOnly="true">
-      <xsd:simpleType>
-        <xsd:restriction base="dms:Note"/>
-      </xsd:simpleType>
-    </xsd:element>
-    <xsd:element name="MediaServiceSearchProperties" ma:index="10" nillable="true" ma:displayName="MediaServiceSearchProperties" ma:hidden="true" ma:internalName="MediaServiceSearchProperties" ma:readOnly="true">
-      <xsd:simpleType>
-        <xsd:restriction base="dms:Note"/>
-      </xsd:simpleType>
-    </xsd:element>
-    <xsd:element name="MediaServiceDateTaken" ma:index="11" nillable="true" ma:displayName="MediaServiceDateTaken" ma:hidden="true" ma:indexed="true" ma:internalName="MediaServiceDateTaken" ma:readOnly="true">
-      <xsd:simpleType>
-        <xsd:restriction base="dms:Text"/>
-      </xsd:simpleType>
-    </xsd:element>
-    <xsd:element name="lcf76f155ced4ddcb4097134ff3c332f" ma:index="13" nillable="true" ma:taxonomy="true" ma:internalName="lcf76f155ced4ddcb4097134ff3c332f" ma:taxonomyFieldName="MediaServiceImageTags" ma:displayName="Image Tags" ma:readOnly="false" ma:fieldId="{5cf76f15-5ced-4ddc-b409-7134ff3c332f}" ma:taxonomyMulti="true" ma:sspId="a0a33bb2-55a7-4816-9808-61a2c78e777e" ma:termSetId="09814cd3-568e-fe90-9814-8d621ff8fb84" ma:anchorId="fba54fb3-c3e1-fe81-a776-ca4b69148c4d" ma:open="true" ma:isKeyword="false">
-      <xsd:complexType>
-        <xsd:sequence>
-          <xsd:element ref="pc:Terms" minOccurs="0" maxOccurs="1"/>
-        </xsd:sequence>
-      </xsd:complexType>
-    </xsd:element>
-    <xsd:element name="MediaServiceOCR" ma:index="15" nillable="true" ma:displayName="Extracted Text" ma:internalName="MediaServiceOCR" ma:readOnly="true">
-      <xsd:simpleType>
-        <xsd:restriction base="dms:Note">
-          <xsd:maxLength value="255"/>
-        </xsd:restriction>
-      </xsd:simpleType>
-    </xsd:element>
-    <xsd:element name="MediaServiceGenerationTime" ma:index="16" nillable="true" ma:displayName="MediaServiceGenerationTime" ma:hidden="true" ma:internalName="MediaServiceGenerationTime" ma:readOnly="true">
-      <xsd:simpleType>
-        <xsd:restriction base="dms:Text"/>
-      </xsd:simpleType>
-    </xsd:element>
-    <xsd:element name="MediaServiceEventHashCode" ma:index="17" nillable="true" ma:displayName="MediaServiceEventHashCode" ma:hidden="true" ma:internalName="MediaServiceEventHashCode" ma:readOnly="true">
-      <xsd:simpleType>
-        <xsd:restriction base="dms:Text"/>
-      </xsd:simpleType>
-    </xsd:element>
-  </xsd:schema>
-  <xsd:schema xmlns:xsd="http://www.w3.org/2001/XMLSchema" xmlns:xs="http://www.w3.org/2001/XMLSchema" xmlns:dms="http://schemas.microsoft.com/office/2006/documentManagement/types" xmlns:pc="http://schemas.microsoft.com/office/infopath/2007/PartnerControls" targetNamespace="78beeb7a-d011-4854-8ba0-0712d94e68d3" elementFormDefault="qualified">
-    <xsd:import namespace="http://schemas.microsoft.com/office/2006/documentManagement/types"/>
-    <xsd:import namespace="http://schemas.microsoft.com/office/infopath/2007/PartnerControls"/>
-    <xsd:element name="TaxCatchAll" ma:index="14" nillable="true" ma:displayName="Taxonomy Catch All Column" ma:hidden="true" ma:list="{3a8cedc2-1744-4932-a37c-a94ae96e0391}" ma:internalName="TaxCatchAll" ma:showField="CatchAllData" ma:web="78beeb7a-d011-4854-8ba0-0712d94e68d3">
-      <xsd:complexType>
-        <xsd:complexContent>
-          <xsd:extension base="dms:MultiChoiceLookup">
-            <xsd:sequence>
-              <xsd:element name="Value" type="dms:Lookup" maxOccurs="unbounded" minOccurs="0" nillable="true"/>
-            </xsd:sequence>
-          </xsd:extension>
-        </xsd:complexContent>
-      </xsd:complexType>
-    </xsd:element>
-  </xsd:schema>
-  <xsd:schema xmlns="http://schemas.openxmlformats.org/package/2006/metadata/core-properties" xmlns:xsd="http://www.w3.org/2001/XMLSchema" xmlns:xsi="http://www.w3.org/2001/XMLSchema-instance" xmlns:dc="http://purl.org/dc/elements/1.1/" xmlns:dcterms="http://purl.org/dc/terms/" xmlns:odoc="http://schemas.microsoft.com/internal/obd" targetNamespace="http://schemas.openxmlformats.org/package/2006/metadata/core-properties" elementFormDefault="qualified" attributeFormDefault="unqualified" blockDefault="#all">
-    <xsd:import namespace="http://purl.org/dc/elements/1.1/" schemaLocation="http://dublincore.org/schemas/xmls/qdc/2003/04/02/dc.xsd"/>
-    <xsd:import namespace="http://purl.org/dc/terms/" schemaLocation="http://dublincore.org/schemas/xmls/qdc/2003/04/02/dcterms.xsd"/>
-    <xsd:element name="coreProperties" type="CT_coreProperties"/>
-    <xsd:complexType name="CT_coreProperties">
-      <xsd:all>
-        <xsd:element ref="dc:creator" minOccurs="0" maxOccurs="1"/>
-        <xsd:element ref="dcterms:created" minOccurs="0" maxOccurs="1"/>
-        <xsd:element ref="dc:identifier" minOccurs="0" maxOccurs="1"/>
-        <xsd:element name="contentType" minOccurs="0" maxOccurs="1" type="xsd:string" ma:index="0" ma:displayName="Content Type"/>
-        <xsd:element ref="dc:title" minOccurs="0" maxOccurs="1" ma:index="4" ma:displayName="Title"/>
-        <xsd:element ref="dc:subject" minOccurs="0" maxOccurs="1"/>
-        <xsd:element ref="dc:description" minOccurs="0" maxOccurs="1"/>
-        <xsd:element name="keywords" minOccurs="0" maxOccurs="1" type="xsd:string"/>
-        <xsd:element ref="dc:language" minOccurs="0" maxOccurs="1"/>
-        <xsd:element name="category" minOccurs="0" maxOccurs="1" type="xsd:string"/>
-        <xsd:element name="version" minOccurs="0" maxOccurs="1" type="xsd:string"/>
-        <xsd:element name="revision" minOccurs="0" maxOccurs="1" type="xsd:string">
-          <xsd:annotation>
-            <xsd:documentation>
-                        This value indicates the number of saves or revisions. The application is responsible for updating this value after each revision.
-                    </xsd:documentation>
-          </xsd:annotation>
-        </xsd:element>
-        <xsd:element name="lastModifiedBy" minOccurs="0" maxOccurs="1" type="xsd:string"/>
-        <xsd:element ref="dcterms:modified" minOccurs="0" maxOccurs="1"/>
-        <xsd:element name="contentStatus" minOccurs="0" maxOccurs="1" type="xsd:string"/>
-      </xsd:all>
-    </xsd:complexType>
-  </xsd:schema>
-  <xs:schema xmlns:pc="http://schemas.microsoft.com/office/infopath/2007/PartnerControls" xmlns:xs="http://www.w3.org/2001/XMLSchema" targetNamespace="http://schemas.microsoft.com/office/infopath/2007/PartnerControls" elementFormDefault="qualified" attributeFormDefault="unqualified">
-    <xs:element name="Person">
-      <xs:complexType>
-        <xs:sequence>
-          <xs:element ref="pc:DisplayName" minOccurs="0"/>
-          <xs:element ref="pc:AccountId" minOccurs="0"/>
-          <xs:element ref="pc:AccountType" minOccurs="0"/>
-        </xs:sequence>
-      </xs:complexType>
-    </xs:element>
-    <xs:element name="DisplayName" type="xs:string"/>
-    <xs:element name="AccountId" type="xs:string"/>
-    <xs:element name="AccountType" type="xs:string"/>
-    <xs:element name="BDCAssociatedEntity">
-      <xs:complexType>
-        <xs:sequence>
-          <xs:element ref="pc:BDCEntity" minOccurs="0" maxOccurs="unbounded"/>
-        </xs:sequence>
-        <xs:attribute ref="pc:EntityNamespace"/>
-        <xs:attribute ref="pc:EntityName"/>
-        <xs:attribute ref="pc:SystemInstanceName"/>
-        <xs:attribute ref="pc:AssociationName"/>
-      </xs:complexType>
-    </xs:element>
-    <xs:attribute name="EntityNamespace" type="xs:string"/>
-    <xs:attribute name="EntityName" type="xs:string"/>
-    <xs:attribute name="SystemInstanceName" type="xs:string"/>
-    <xs:attribute name="AssociationName" type="xs:string"/>
-    <xs:element name="BDCEntity">
-      <xs:complexType>
-        <xs:sequence>
-          <xs:element ref="pc:EntityDisplayName" minOccurs="0"/>
-          <xs:element ref="pc:EntityInstanceReference" minOccurs="0"/>
-          <xs:element ref="pc:EntityId1" minOccurs="0"/>
-          <xs:element ref="pc:EntityId2" minOccurs="0"/>
-          <xs:element ref="pc:EntityId3" minOccurs="0"/>
-          <xs:element ref="pc:EntityId4" minOccurs="0"/>
-          <xs:element ref="pc:EntityId5" minOccurs="0"/>
-        </xs:sequence>
-      </xs:complexType>
-    </xs:element>
-    <xs:element name="EntityDisplayName" type="xs:string"/>
-    <xs:element name="EntityInstanceReference" type="xs:string"/>
-    <xs:element name="EntityId1" type="xs:string"/>
-    <xs:element name="EntityId2" type="xs:string"/>
-    <xs:element name="EntityId3" type="xs:string"/>
-    <xs:element name="EntityId4" type="xs:string"/>
-    <xs:element name="EntityId5" type="xs:string"/>
-    <xs:element name="Terms">
-      <xs:complexType>
-        <xs:sequence>
-          <xs:element ref="pc:TermInfo" minOccurs="0" maxOccurs="unbounded"/>
-        </xs:sequence>
-      </xs:complexType>
-    </xs:element>
-    <xs:element name="TermInfo">
-      <xs:complexType>
-        <xs:sequence>
-          <xs:element ref="pc:TermName" minOccurs="0"/>
-          <xs:element ref="pc:TermId" minOccurs="0"/>
-        </xs:sequence>
-      </xs:complexType>
-    </xs:element>
-    <xs:element name="TermName" type="xs:string"/>
-    <xs:element name="TermId" type="xs:string"/>
-  </xs:schema>
-</ct:contentTypeSchema>
-</file>
-
-<file path=customXml/item2.xml><?xml version="1.0" encoding="utf-8"?>
 <?mso-contentType ?>
 <FormTemplates xmlns="http://schemas.microsoft.com/sharepoint/v3/contenttype/forms">
   <Display>DocumentLibraryForm</Display>
@@ -15332,18 +14648,15 @@
 </FormTemplates>
 </file>
 
-<file path=customXml/item3.xml><?xml version="1.0" encoding="utf-8"?>
+<file path=customXml/item2.xml><?xml version="1.0" encoding="utf-8"?>
 <p:properties xmlns:p="http://schemas.microsoft.com/office/2006/metadata/properties" xmlns:xsi="http://www.w3.org/2001/XMLSchema-instance" xmlns:pc="http://schemas.microsoft.com/office/infopath/2007/PartnerControls">
   <documentManagement>
-    <lcf76f155ced4ddcb4097134ff3c332f xmlns="2fbea1be-444b-4810-a171-216b375690c2">
-      <Terms xmlns="http://schemas.microsoft.com/office/infopath/2007/PartnerControls"/>
-    </lcf76f155ced4ddcb4097134ff3c332f>
-    <TaxCatchAll xmlns="78beeb7a-d011-4854-8ba0-0712d94e68d3" xsi:nil="true"/>
+    <_activity xmlns="152b35e6-23a1-4beb-a1fd-2689778f6058" xsi:nil="true"/>
   </documentManagement>
 </p:properties>
 </file>
 
-<file path=customXml/item4.xml><?xml version="1.0" encoding="utf-8"?>
+<file path=customXml/item3.xml><?xml version="1.0" encoding="utf-8"?>
 <b:Sources xmlns:b="http://schemas.openxmlformats.org/officeDocument/2006/bibliography" xmlns="http://schemas.openxmlformats.org/officeDocument/2006/bibliography" SelectedStyle="\APASixthEditionOfficeOnline.xsl" StyleName="APA" Version="6">
   <b:Source>
     <b:Tag>Men90</b:Tag>
@@ -16075,15 +15388,294 @@
 </b:Sources>
 </file>
 
+<file path=customXml/item4.xml><?xml version="1.0" encoding="utf-8"?>
+<ct:contentTypeSchema xmlns:ct="http://schemas.microsoft.com/office/2006/metadata/contentType" xmlns:ma="http://schemas.microsoft.com/office/2006/metadata/properties/metaAttributes" ct:_="" ma:_="" ma:contentTypeName="Documento" ma:contentTypeID="0x01010015BDB27AF1A6EC4C99611A7AD03A3206" ma:contentTypeVersion="18" ma:contentTypeDescription="Crear nuevo documento." ma:contentTypeScope="" ma:versionID="56de9a8de695fa7f309cf2eb59d05ef4">
+  <xsd:schema xmlns:xsd="http://www.w3.org/2001/XMLSchema" xmlns:xs="http://www.w3.org/2001/XMLSchema" xmlns:p="http://schemas.microsoft.com/office/2006/metadata/properties" xmlns:ns3="ed1181c6-4963-4f9c-a6e4-d7efb21233a0" xmlns:ns4="152b35e6-23a1-4beb-a1fd-2689778f6058" targetNamespace="http://schemas.microsoft.com/office/2006/metadata/properties" ma:root="true" ma:fieldsID="cae7528616b6d30ad4c29b83143ea2c0" ns3:_="" ns4:_="">
+    <xsd:import namespace="ed1181c6-4963-4f9c-a6e4-d7efb21233a0"/>
+    <xsd:import namespace="152b35e6-23a1-4beb-a1fd-2689778f6058"/>
+    <xsd:element name="properties">
+      <xsd:complexType>
+        <xsd:sequence>
+          <xsd:element name="documentManagement">
+            <xsd:complexType>
+              <xsd:all>
+                <xsd:element ref="ns3:SharedWithUsers" minOccurs="0"/>
+                <xsd:element ref="ns3:SharedWithDetails" minOccurs="0"/>
+                <xsd:element ref="ns3:SharingHintHash" minOccurs="0"/>
+                <xsd:element ref="ns4:MediaServiceMetadata" minOccurs="0"/>
+                <xsd:element ref="ns4:MediaServiceFastMetadata" minOccurs="0"/>
+                <xsd:element ref="ns4:MediaServiceDateTaken" minOccurs="0"/>
+                <xsd:element ref="ns4:MediaServiceAutoTags" minOccurs="0"/>
+                <xsd:element ref="ns4:MediaServiceGenerationTime" minOccurs="0"/>
+                <xsd:element ref="ns4:MediaServiceEventHashCode" minOccurs="0"/>
+                <xsd:element ref="ns4:MediaServiceOCR" minOccurs="0"/>
+                <xsd:element ref="ns4:MediaLengthInSeconds" minOccurs="0"/>
+                <xsd:element ref="ns4:MediaServiceAutoKeyPoints" minOccurs="0"/>
+                <xsd:element ref="ns4:MediaServiceKeyPoints" minOccurs="0"/>
+                <xsd:element ref="ns4:_activity" minOccurs="0"/>
+                <xsd:element ref="ns4:MediaServiceObjectDetectorVersions" minOccurs="0"/>
+                <xsd:element ref="ns4:MediaServiceLocation" minOccurs="0"/>
+                <xsd:element ref="ns4:MediaServiceSystemTags" minOccurs="0"/>
+                <xsd:element ref="ns4:MediaServiceSearchProperties" minOccurs="0"/>
+              </xsd:all>
+            </xsd:complexType>
+          </xsd:element>
+        </xsd:sequence>
+      </xsd:complexType>
+    </xsd:element>
+  </xsd:schema>
+  <xsd:schema xmlns:xsd="http://www.w3.org/2001/XMLSchema" xmlns:xs="http://www.w3.org/2001/XMLSchema" xmlns:dms="http://schemas.microsoft.com/office/2006/documentManagement/types" xmlns:pc="http://schemas.microsoft.com/office/infopath/2007/PartnerControls" targetNamespace="ed1181c6-4963-4f9c-a6e4-d7efb21233a0" elementFormDefault="qualified">
+    <xsd:import namespace="http://schemas.microsoft.com/office/2006/documentManagement/types"/>
+    <xsd:import namespace="http://schemas.microsoft.com/office/infopath/2007/PartnerControls"/>
+    <xsd:element name="SharedWithUsers" ma:index="8" nillable="true" ma:displayName="Compartido con" ma:internalName="SharedWithUsers" ma:readOnly="true">
+      <xsd:complexType>
+        <xsd:complexContent>
+          <xsd:extension base="dms:UserMulti">
+            <xsd:sequence>
+              <xsd:element name="UserInfo" minOccurs="0" maxOccurs="unbounded">
+                <xsd:complexType>
+                  <xsd:sequence>
+                    <xsd:element name="DisplayName" type="xsd:string" minOccurs="0"/>
+                    <xsd:element name="AccountId" type="dms:UserId" minOccurs="0" nillable="true"/>
+                    <xsd:element name="AccountType" type="xsd:string" minOccurs="0"/>
+                  </xsd:sequence>
+                </xsd:complexType>
+              </xsd:element>
+            </xsd:sequence>
+          </xsd:extension>
+        </xsd:complexContent>
+      </xsd:complexType>
+    </xsd:element>
+    <xsd:element name="SharedWithDetails" ma:index="9" nillable="true" ma:displayName="Detalles de uso compartido" ma:internalName="SharedWithDetails" ma:readOnly="true">
+      <xsd:simpleType>
+        <xsd:restriction base="dms:Note">
+          <xsd:maxLength value="255"/>
+        </xsd:restriction>
+      </xsd:simpleType>
+    </xsd:element>
+    <xsd:element name="SharingHintHash" ma:index="10" nillable="true" ma:displayName="Hash de la sugerencia para compartir" ma:hidden="true" ma:internalName="SharingHintHash" ma:readOnly="true">
+      <xsd:simpleType>
+        <xsd:restriction base="dms:Text"/>
+      </xsd:simpleType>
+    </xsd:element>
+  </xsd:schema>
+  <xsd:schema xmlns:xsd="http://www.w3.org/2001/XMLSchema" xmlns:xs="http://www.w3.org/2001/XMLSchema" xmlns:dms="http://schemas.microsoft.com/office/2006/documentManagement/types" xmlns:pc="http://schemas.microsoft.com/office/infopath/2007/PartnerControls" targetNamespace="152b35e6-23a1-4beb-a1fd-2689778f6058" elementFormDefault="qualified">
+    <xsd:import namespace="http://schemas.microsoft.com/office/2006/documentManagement/types"/>
+    <xsd:import namespace="http://schemas.microsoft.com/office/infopath/2007/PartnerControls"/>
+    <xsd:element name="MediaServiceMetadata" ma:index="11" nillable="true" ma:displayName="MediaServiceMetadata" ma:hidden="true" ma:internalName="MediaServiceMetadata" ma:readOnly="true">
+      <xsd:simpleType>
+        <xsd:restriction base="dms:Note"/>
+      </xsd:simpleType>
+    </xsd:element>
+    <xsd:element name="MediaServiceFastMetadata" ma:index="12" nillable="true" ma:displayName="MediaServiceFastMetadata" ma:hidden="true" ma:internalName="MediaServiceFastMetadata" ma:readOnly="true">
+      <xsd:simpleType>
+        <xsd:restriction base="dms:Note"/>
+      </xsd:simpleType>
+    </xsd:element>
+    <xsd:element name="MediaServiceDateTaken" ma:index="13" nillable="true" ma:displayName="MediaServiceDateTaken" ma:hidden="true" ma:internalName="MediaServiceDateTaken" ma:readOnly="true">
+      <xsd:simpleType>
+        <xsd:restriction base="dms:Text"/>
+      </xsd:simpleType>
+    </xsd:element>
+    <xsd:element name="MediaServiceAutoTags" ma:index="14" nillable="true" ma:displayName="Tags" ma:internalName="MediaServiceAutoTags" ma:readOnly="true">
+      <xsd:simpleType>
+        <xsd:restriction base="dms:Text"/>
+      </xsd:simpleType>
+    </xsd:element>
+    <xsd:element name="MediaServiceGenerationTime" ma:index="15" nillable="true" ma:displayName="MediaServiceGenerationTime" ma:hidden="true" ma:internalName="MediaServiceGenerationTime" ma:readOnly="true">
+      <xsd:simpleType>
+        <xsd:restriction base="dms:Text"/>
+      </xsd:simpleType>
+    </xsd:element>
+    <xsd:element name="MediaServiceEventHashCode" ma:index="16" nillable="true" ma:displayName="MediaServiceEventHashCode" ma:hidden="true" ma:internalName="MediaServiceEventHashCode" ma:readOnly="true">
+      <xsd:simpleType>
+        <xsd:restriction base="dms:Text"/>
+      </xsd:simpleType>
+    </xsd:element>
+    <xsd:element name="MediaServiceOCR" ma:index="17" nillable="true" ma:displayName="Extracted Text" ma:internalName="MediaServiceOCR" ma:readOnly="true">
+      <xsd:simpleType>
+        <xsd:restriction base="dms:Note">
+          <xsd:maxLength value="255"/>
+        </xsd:restriction>
+      </xsd:simpleType>
+    </xsd:element>
+    <xsd:element name="MediaLengthInSeconds" ma:index="18" nillable="true" ma:displayName="Length (seconds)" ma:internalName="MediaLengthInSeconds" ma:readOnly="true">
+      <xsd:simpleType>
+        <xsd:restriction base="dms:Unknown"/>
+      </xsd:simpleType>
+    </xsd:element>
+    <xsd:element name="MediaServiceAutoKeyPoints" ma:index="19" nillable="true" ma:displayName="MediaServiceAutoKeyPoints" ma:hidden="true" ma:internalName="MediaServiceAutoKeyPoints" ma:readOnly="true">
+      <xsd:simpleType>
+        <xsd:restriction base="dms:Note"/>
+      </xsd:simpleType>
+    </xsd:element>
+    <xsd:element name="MediaServiceKeyPoints" ma:index="20" nillable="true" ma:displayName="KeyPoints" ma:internalName="MediaServiceKeyPoints" ma:readOnly="true">
+      <xsd:simpleType>
+        <xsd:restriction base="dms:Note">
+          <xsd:maxLength value="255"/>
+        </xsd:restriction>
+      </xsd:simpleType>
+    </xsd:element>
+    <xsd:element name="_activity" ma:index="21" nillable="true" ma:displayName="_activity" ma:hidden="true" ma:internalName="_activity">
+      <xsd:simpleType>
+        <xsd:restriction base="dms:Note"/>
+      </xsd:simpleType>
+    </xsd:element>
+    <xsd:element name="MediaServiceObjectDetectorVersions" ma:index="22" nillable="true" ma:displayName="MediaServiceObjectDetectorVersions" ma:hidden="true" ma:indexed="true" ma:internalName="MediaServiceObjectDetectorVersions" ma:readOnly="true">
+      <xsd:simpleType>
+        <xsd:restriction base="dms:Text"/>
+      </xsd:simpleType>
+    </xsd:element>
+    <xsd:element name="MediaServiceLocation" ma:index="23" nillable="true" ma:displayName="Location" ma:indexed="true" ma:internalName="MediaServiceLocation" ma:readOnly="true">
+      <xsd:simpleType>
+        <xsd:restriction base="dms:Text"/>
+      </xsd:simpleType>
+    </xsd:element>
+    <xsd:element name="MediaServiceSystemTags" ma:index="24" nillable="true" ma:displayName="MediaServiceSystemTags" ma:hidden="true" ma:internalName="MediaServiceSystemTags" ma:readOnly="true">
+      <xsd:simpleType>
+        <xsd:restriction base="dms:Note"/>
+      </xsd:simpleType>
+    </xsd:element>
+    <xsd:element name="MediaServiceSearchProperties" ma:index="25" nillable="true" ma:displayName="MediaServiceSearchProperties" ma:hidden="true" ma:internalName="MediaServiceSearchProperties" ma:readOnly="true">
+      <xsd:simpleType>
+        <xsd:restriction base="dms:Note"/>
+      </xsd:simpleType>
+    </xsd:element>
+  </xsd:schema>
+  <xsd:schema xmlns="http://schemas.openxmlformats.org/package/2006/metadata/core-properties" xmlns:xsd="http://www.w3.org/2001/XMLSchema" xmlns:xsi="http://www.w3.org/2001/XMLSchema-instance" xmlns:dc="http://purl.org/dc/elements/1.1/" xmlns:dcterms="http://purl.org/dc/terms/" xmlns:odoc="http://schemas.microsoft.com/internal/obd" targetNamespace="http://schemas.openxmlformats.org/package/2006/metadata/core-properties" elementFormDefault="qualified" attributeFormDefault="unqualified" blockDefault="#all">
+    <xsd:import namespace="http://purl.org/dc/elements/1.1/" schemaLocation="http://dublincore.org/schemas/xmls/qdc/2003/04/02/dc.xsd"/>
+    <xsd:import namespace="http://purl.org/dc/terms/" schemaLocation="http://dublincore.org/schemas/xmls/qdc/2003/04/02/dcterms.xsd"/>
+    <xsd:element name="coreProperties" type="CT_coreProperties"/>
+    <xsd:complexType name="CT_coreProperties">
+      <xsd:all>
+        <xsd:element ref="dc:creator" minOccurs="0" maxOccurs="1"/>
+        <xsd:element ref="dcterms:created" minOccurs="0" maxOccurs="1"/>
+        <xsd:element ref="dc:identifier" minOccurs="0" maxOccurs="1"/>
+        <xsd:element name="contentType" minOccurs="0" maxOccurs="1" type="xsd:string" ma:index="0" ma:displayName="Tipo de contenido"/>
+        <xsd:element ref="dc:title" minOccurs="0" maxOccurs="1" ma:index="4" ma:displayName="Título"/>
+        <xsd:element ref="dc:subject" minOccurs="0" maxOccurs="1"/>
+        <xsd:element ref="dc:description" minOccurs="0" maxOccurs="1"/>
+        <xsd:element name="keywords" minOccurs="0" maxOccurs="1" type="xsd:string"/>
+        <xsd:element ref="dc:language" minOccurs="0" maxOccurs="1"/>
+        <xsd:element name="category" minOccurs="0" maxOccurs="1" type="xsd:string"/>
+        <xsd:element name="version" minOccurs="0" maxOccurs="1" type="xsd:string"/>
+        <xsd:element name="revision" minOccurs="0" maxOccurs="1" type="xsd:string">
+          <xsd:annotation>
+            <xsd:documentation>
+                        This value indicates the number of saves or revisions. The application is responsible for updating this value after each revision.
+                    </xsd:documentation>
+          </xsd:annotation>
+        </xsd:element>
+        <xsd:element name="lastModifiedBy" minOccurs="0" maxOccurs="1" type="xsd:string"/>
+        <xsd:element ref="dcterms:modified" minOccurs="0" maxOccurs="1"/>
+        <xsd:element name="contentStatus" minOccurs="0" maxOccurs="1" type="xsd:string"/>
+      </xsd:all>
+    </xsd:complexType>
+  </xsd:schema>
+  <xs:schema xmlns:pc="http://schemas.microsoft.com/office/infopath/2007/PartnerControls" xmlns:xs="http://www.w3.org/2001/XMLSchema" targetNamespace="http://schemas.microsoft.com/office/infopath/2007/PartnerControls" elementFormDefault="qualified" attributeFormDefault="unqualified">
+    <xs:element name="Person">
+      <xs:complexType>
+        <xs:sequence>
+          <xs:element ref="pc:DisplayName" minOccurs="0"/>
+          <xs:element ref="pc:AccountId" minOccurs="0"/>
+          <xs:element ref="pc:AccountType" minOccurs="0"/>
+        </xs:sequence>
+      </xs:complexType>
+    </xs:element>
+    <xs:element name="DisplayName" type="xs:string"/>
+    <xs:element name="AccountId" type="xs:string"/>
+    <xs:element name="AccountType" type="xs:string"/>
+    <xs:element name="BDCAssociatedEntity">
+      <xs:complexType>
+        <xs:sequence>
+          <xs:element ref="pc:BDCEntity" minOccurs="0" maxOccurs="unbounded"/>
+        </xs:sequence>
+        <xs:attribute ref="pc:EntityNamespace"/>
+        <xs:attribute ref="pc:EntityName"/>
+        <xs:attribute ref="pc:SystemInstanceName"/>
+        <xs:attribute ref="pc:AssociationName"/>
+      </xs:complexType>
+    </xs:element>
+    <xs:attribute name="EntityNamespace" type="xs:string"/>
+    <xs:attribute name="EntityName" type="xs:string"/>
+    <xs:attribute name="SystemInstanceName" type="xs:string"/>
+    <xs:attribute name="AssociationName" type="xs:string"/>
+    <xs:element name="BDCEntity">
+      <xs:complexType>
+        <xs:sequence>
+          <xs:element ref="pc:EntityDisplayName" minOccurs="0"/>
+          <xs:element ref="pc:EntityInstanceReference" minOccurs="0"/>
+          <xs:element ref="pc:EntityId1" minOccurs="0"/>
+          <xs:element ref="pc:EntityId2" minOccurs="0"/>
+          <xs:element ref="pc:EntityId3" minOccurs="0"/>
+          <xs:element ref="pc:EntityId4" minOccurs="0"/>
+          <xs:element ref="pc:EntityId5" minOccurs="0"/>
+        </xs:sequence>
+      </xs:complexType>
+    </xs:element>
+    <xs:element name="EntityDisplayName" type="xs:string"/>
+    <xs:element name="EntityInstanceReference" type="xs:string"/>
+    <xs:element name="EntityId1" type="xs:string"/>
+    <xs:element name="EntityId2" type="xs:string"/>
+    <xs:element name="EntityId3" type="xs:string"/>
+    <xs:element name="EntityId4" type="xs:string"/>
+    <xs:element name="EntityId5" type="xs:string"/>
+    <xs:element name="Terms">
+      <xs:complexType>
+        <xs:sequence>
+          <xs:element ref="pc:TermInfo" minOccurs="0" maxOccurs="unbounded"/>
+        </xs:sequence>
+      </xs:complexType>
+    </xs:element>
+    <xs:element name="TermInfo">
+      <xs:complexType>
+        <xs:sequence>
+          <xs:element ref="pc:TermName" minOccurs="0"/>
+          <xs:element ref="pc:TermId" minOccurs="0"/>
+        </xs:sequence>
+      </xs:complexType>
+    </xs:element>
+    <xs:element name="TermName" type="xs:string"/>
+    <xs:element name="TermId" type="xs:string"/>
+  </xs:schema>
+</ct:contentTypeSchema>
+</file>
+
 <file path=customXml/itemProps1.xml><?xml version="1.0" encoding="utf-8"?>
-<ds:datastoreItem xmlns:ds="http://schemas.openxmlformats.org/officeDocument/2006/customXml" ds:itemID="{64EBD5FD-079D-4E80-B32B-51B9F5FEEFB7}">
+<ds:datastoreItem xmlns:ds="http://schemas.openxmlformats.org/officeDocument/2006/customXml" ds:itemID="{7F74FD34-EBDF-4094-A9AD-E46225785B9A}">
+  <ds:schemaRefs>
+    <ds:schemaRef ds:uri="http://schemas.microsoft.com/sharepoint/v3/contenttype/forms"/>
+  </ds:schemaRefs>
+</ds:datastoreItem>
+</file>
+
+<file path=customXml/itemProps2.xml><?xml version="1.0" encoding="utf-8"?>
+<ds:datastoreItem xmlns:ds="http://schemas.openxmlformats.org/officeDocument/2006/customXml" ds:itemID="{B58D4DAF-C7F0-4FA3-950B-89D41305B414}">
+  <ds:schemaRefs>
+    <ds:schemaRef ds:uri="http://schemas.microsoft.com/office/2006/metadata/properties"/>
+    <ds:schemaRef ds:uri="http://schemas.microsoft.com/office/infopath/2007/PartnerControls"/>
+    <ds:schemaRef ds:uri="152b35e6-23a1-4beb-a1fd-2689778f6058"/>
+  </ds:schemaRefs>
+</ds:datastoreItem>
+</file>
+
+<file path=customXml/itemProps3.xml><?xml version="1.0" encoding="utf-8"?>
+<ds:datastoreItem xmlns:ds="http://schemas.openxmlformats.org/officeDocument/2006/customXml" ds:itemID="{2F2CB120-89EE-4E4C-AC3A-037C340CBE59}">
+  <ds:schemaRefs>
+    <ds:schemaRef ds:uri="http://schemas.openxmlformats.org/officeDocument/2006/bibliography"/>
+  </ds:schemaRefs>
+</ds:datastoreItem>
+</file>
+
+<file path=customXml/itemProps4.xml><?xml version="1.0" encoding="utf-8"?>
+<ds:datastoreItem xmlns:ds="http://schemas.openxmlformats.org/officeDocument/2006/customXml" ds:itemID="{71334E21-6B6C-4687-847F-D6F99FF4EBD6}">
   <ds:schemaRefs>
     <ds:schemaRef ds:uri="http://schemas.microsoft.com/office/2006/metadata/contentType"/>
     <ds:schemaRef ds:uri="http://schemas.microsoft.com/office/2006/metadata/properties/metaAttributes"/>
     <ds:schemaRef ds:uri="http://www.w3.org/2001/XMLSchema"/>
     <ds:schemaRef ds:uri="http://schemas.microsoft.com/office/2006/metadata/properties"/>
-    <ds:schemaRef ds:uri="2fbea1be-444b-4810-a171-216b375690c2"/>
-    <ds:schemaRef ds:uri="78beeb7a-d011-4854-8ba0-0712d94e68d3"/>
+    <ds:schemaRef ds:uri="ed1181c6-4963-4f9c-a6e4-d7efb21233a0"/>
+    <ds:schemaRef ds:uri="152b35e6-23a1-4beb-a1fd-2689778f6058"/>
     <ds:schemaRef ds:uri="http://schemas.microsoft.com/office/2006/documentManagement/types"/>
     <ds:schemaRef ds:uri="http://schemas.microsoft.com/office/infopath/2007/PartnerControls"/>
     <ds:schemaRef ds:uri="http://schemas.openxmlformats.org/package/2006/metadata/core-properties"/>
@@ -16092,31 +15684,4 @@
     <ds:schemaRef ds:uri="http://schemas.microsoft.com/internal/obd"/>
   </ds:schemaRefs>
 </ds:datastoreItem>
-</file>
-
-<file path=customXml/itemProps2.xml><?xml version="1.0" encoding="utf-8"?>
-<ds:datastoreItem xmlns:ds="http://schemas.openxmlformats.org/officeDocument/2006/customXml" ds:itemID="{7F74FD34-EBDF-4094-A9AD-E46225785B9A}">
-  <ds:schemaRefs>
-    <ds:schemaRef ds:uri="http://schemas.microsoft.com/sharepoint/v3/contenttype/forms"/>
-  </ds:schemaRefs>
-</ds:datastoreItem>
-</file>
-
-<file path=customXml/itemProps3.xml><?xml version="1.0" encoding="utf-8"?>
-<ds:datastoreItem xmlns:ds="http://schemas.openxmlformats.org/officeDocument/2006/customXml" ds:itemID="{B58D4DAF-C7F0-4FA3-950B-89D41305B414}">
-  <ds:schemaRefs>
-    <ds:schemaRef ds:uri="http://schemas.microsoft.com/office/2006/metadata/properties"/>
-    <ds:schemaRef ds:uri="http://schemas.microsoft.com/office/infopath/2007/PartnerControls"/>
-    <ds:schemaRef ds:uri="2fbea1be-444b-4810-a171-216b375690c2"/>
-    <ds:schemaRef ds:uri="78beeb7a-d011-4854-8ba0-0712d94e68d3"/>
-  </ds:schemaRefs>
-</ds:datastoreItem>
-</file>
-
-<file path=customXml/itemProps4.xml><?xml version="1.0" encoding="utf-8"?>
-<ds:datastoreItem xmlns:ds="http://schemas.openxmlformats.org/officeDocument/2006/customXml" ds:itemID="{0D9B032B-9C44-4303-84EB-41A19654C7BA}">
-  <ds:schemaRefs>
-    <ds:schemaRef ds:uri="http://schemas.openxmlformats.org/officeDocument/2006/bibliography"/>
-  </ds:schemaRefs>
-</ds:datastoreItem>
 </file>
</xml_diff>

<commit_message>
Se trabaja en el marco teórico, se agregan las 4 fuentes trabajadas.
</commit_message>
<xml_diff>
--- a/Formato Proyecto Investigación.docx
+++ b/Formato Proyecto Investigación.docx
@@ -4573,26 +4573,11 @@
           <w:rFonts w:cs="Times New Roman"/>
         </w:rPr>
       </w:pPr>
-    </w:p>
-    <w:p>
-      <w:pPr>
-        <w:ind w:firstLine="708"/>
-        <w:rPr>
-          <w:rFonts w:cs="Times New Roman"/>
-        </w:rPr>
-      </w:pPr>
-      <w:r>
-        <w:rPr>
-          <w:rFonts w:cs="Times New Roman"/>
-        </w:rPr>
-        <w:t xml:space="preserve">Las bibliotecas universitarias enfrentan pérdidas de colección, inventarios lentos y errores en circulación que elevan costos operativos y deterioran la experiencia del usuario. Las soluciones con códigos de barras requieren línea de vista y escaneo individual, lo que limita la eficiencia en estantes y controles de salida. Aunque RFID ha mostrado mejoras en trazabilidad, autoservicio e inventario, su desempeño depende de la banda (HF/UHF), la orientación de etiquetas, los materiales y la integración con el SIGB; además, persisten barreras de costo total de propiedad, estandarización y privacidad. En nuestro contexto, no existe un diseño específico que optimice simultáneamente la circulación segura (HF, mostradores/portales) y el inventario rápido en estanterías (UHF) con alta tasa de acierto en lomos apilados y anti-colisión, interoperando con el SIGB. Este proyecto aborda dicha brecha mediante el diseño y validación de un sistema RFID para </w:t>
-      </w:r>
-      <w:r>
-        <w:rPr>
-          <w:rFonts w:cs="Times New Roman"/>
-        </w:rPr>
-        <w:lastRenderedPageBreak/>
-        <w:t>control e identificación eficiente de libros, con metas de reducción de tiempos de inventario, incremento de tasas de lectura y disminución de pérdidas</w:t>
+      <w:r>
+        <w:rPr>
+          <w:rFonts w:cs="Times New Roman"/>
+        </w:rPr>
+        <w:t>Las bibliotecas universitarias enfrentan pérdidas de colección, inventarios lentos y errores en circulación que elevan costos operativos y deterioran la experiencia del usuario. Las soluciones con códigos de barras requieren línea de vista y escaneo individual, lo que limita la eficiencia en estantes y controles de salida. Aunque RFID ha mostrado mejoras en trazabilidad, autoservicio e inventario, su desempeño depende de la banda (HF/UHF), la orientación de etiquetas, los materiales y la integración con el SIGB; además, persisten barreras de costo total de propiedad, estandarización y privacidad. En nuestro contexto, no existe un diseño específico que optimice simultáneamente la circulación segura (HF, mostradores/portales) y el inventario rápido en estanterías (UHF) con alta tasa de acierto en lomos apilados y anti-colisión, interoperando con el SIGB. Este proyecto aborda dicha brecha mediante el diseño y validación de un sistema RFID para control e identificación eficiente de libros, con metas de reducción de tiempos de inventario, incremento de tasas de lectura y disminución de pérdidas</w:t>
       </w:r>
       <w:r>
         <w:rPr>
@@ -5685,6 +5670,15 @@
     </w:p>
     <w:p>
       <w:pPr>
+        <w:rPr>
+          <w:rFonts w:cs="Times New Roman"/>
+          <w:b/>
+          <w:szCs w:val="24"/>
+        </w:rPr>
+      </w:pPr>
+    </w:p>
+    <w:p>
+      <w:pPr>
         <w:jc w:val="center"/>
         <w:rPr>
           <w:rFonts w:cs="Times New Roman"/>
@@ -5705,6 +5699,7 @@
         <w:rPr>
           <w:b/>
         </w:rPr>
+        <w:lastRenderedPageBreak/>
         <w:t>6</w:t>
       </w:r>
       <w:r>
@@ -5738,72 +5733,1488 @@
     </w:p>
     <w:p>
       <w:pPr>
+        <w:jc w:val="left"/>
+        <w:rPr>
+          <w:rFonts w:cs="Times New Roman"/>
+          <w:b/>
+          <w:bCs/>
+          <w:szCs w:val="24"/>
+        </w:rPr>
+      </w:pPr>
+      <w:r>
+        <w:rPr>
+          <w:rFonts w:cs="Times New Roman"/>
+          <w:b/>
+          <w:bCs/>
+          <w:szCs w:val="24"/>
+        </w:rPr>
+        <w:t xml:space="preserve">6.1 </w:t>
+      </w:r>
+      <w:r>
+        <w:rPr>
+          <w:rFonts w:cs="Times New Roman"/>
+          <w:b/>
+          <w:bCs/>
+          <w:szCs w:val="24"/>
+        </w:rPr>
+        <w:t>Sistemas de identificación automática</w:t>
+      </w:r>
+      <w:r>
+        <w:rPr>
+          <w:rFonts w:cs="Times New Roman"/>
+          <w:b/>
+          <w:bCs/>
+          <w:szCs w:val="24"/>
+        </w:rPr>
+        <w:t>.</w:t>
+      </w:r>
+    </w:p>
+    <w:p>
+      <w:pPr>
+        <w:jc w:val="left"/>
+        <w:rPr>
+          <w:rFonts w:cs="Times New Roman"/>
+          <w:b/>
+          <w:bCs/>
+          <w:szCs w:val="24"/>
+        </w:rPr>
+      </w:pPr>
+      <w:r>
+        <w:rPr>
+          <w:rFonts w:cs="Times New Roman"/>
+          <w:b/>
+          <w:bCs/>
+          <w:szCs w:val="24"/>
+        </w:rPr>
+        <w:tab/>
+      </w:r>
+    </w:p>
+    <w:p>
+      <w:pPr>
         <w:ind w:firstLine="708"/>
-        <w:rPr>
-          <w:rFonts w:cs="Times New Roman"/>
-          <w:szCs w:val="24"/>
-        </w:rPr>
-      </w:pPr>
-      <w:r>
-        <w:rPr>
-          <w:rFonts w:cs="Times New Roman"/>
-          <w:szCs w:val="24"/>
-        </w:rPr>
-        <w:t xml:space="preserve">El marco teórico es una sección en la que se exponen los </w:t>
-      </w:r>
-      <w:r>
-        <w:rPr>
-          <w:rFonts w:cs="Times New Roman"/>
-          <w:szCs w:val="24"/>
-        </w:rPr>
-        <w:t>autores y</w:t>
-      </w:r>
-      <w:r>
-        <w:rPr>
-          <w:rFonts w:cs="Times New Roman"/>
-          <w:szCs w:val="24"/>
-        </w:rPr>
-        <w:t xml:space="preserve"> las teorías relevantes que sustentan la investigación. En esta parte, se citan a los autores cuya obra ha influido directamente en el tema de estudio. </w:t>
-      </w:r>
-      <w:r>
-        <w:rPr>
-          <w:rFonts w:cs="Times New Roman"/>
-          <w:szCs w:val="24"/>
-        </w:rPr>
-        <w:t>Es</w:t>
-      </w:r>
-      <w:r>
-        <w:rPr>
-          <w:rFonts w:cs="Times New Roman"/>
-          <w:szCs w:val="24"/>
-        </w:rPr>
-        <w:t xml:space="preserve"> importante evitar fuentes no académicas como blogs, Wikipedia o sitios no especializados, y buscar información en plataformas académicas de calidad para asegurar la validez de las referencias.</w:t>
+        <w:jc w:val="left"/>
+        <w:rPr>
+          <w:rFonts w:cs="Times New Roman"/>
+          <w:szCs w:val="24"/>
+        </w:rPr>
+      </w:pPr>
+      <w:r>
+        <w:rPr>
+          <w:rFonts w:cs="Times New Roman"/>
+          <w:szCs w:val="24"/>
+        </w:rPr>
+        <w:t>Los sistemas de identificación automática comprenden un conjunto de tecnologías diseñadas para identificar objetos, personas o activos y capturar información asociada a ellos de forma automática</w:t>
+      </w:r>
+      <w:r>
+        <w:rPr>
+          <w:rFonts w:cs="Times New Roman"/>
+          <w:szCs w:val="24"/>
+        </w:rPr>
+        <w:t xml:space="preserve"> </w:t>
+      </w:r>
+      <w:r>
+        <w:rPr>
+          <w:rFonts w:cs="Times New Roman"/>
+          <w:szCs w:val="24"/>
+        </w:rPr>
+        <w:t>(Pozar, 2012)</w:t>
+      </w:r>
+      <w:r>
+        <w:rPr>
+          <w:rFonts w:cs="Times New Roman"/>
+          <w:szCs w:val="24"/>
+        </w:rPr>
+        <w:t>. Estas tecnologías permiten reducir la intervención humana, minimizar errores operativos y mejorar la eficiencia en los procesos de gestión de información.</w:t>
       </w:r>
     </w:p>
     <w:p>
       <w:pPr>
         <w:ind w:firstLine="708"/>
-        <w:rPr>
-          <w:rFonts w:cs="Times New Roman"/>
-          <w:szCs w:val="24"/>
-        </w:rPr>
-      </w:pPr>
+        <w:jc w:val="left"/>
+        <w:rPr>
+          <w:rFonts w:cs="Times New Roman"/>
+          <w:szCs w:val="24"/>
+        </w:rPr>
+      </w:pPr>
+      <w:r>
+        <w:rPr>
+          <w:rFonts w:cs="Times New Roman"/>
+          <w:szCs w:val="24"/>
+        </w:rPr>
+        <w:t>Dentro de este campo se encuentra el concepto de AIDC (Automatic Identification and Data Capture)</w:t>
+      </w:r>
+      <w:r>
+        <w:rPr>
+          <w:rFonts w:cs="Times New Roman"/>
+          <w:szCs w:val="24"/>
+        </w:rPr>
+        <w:t xml:space="preserve"> </w:t>
+      </w:r>
+      <w:r>
+        <w:rPr>
+          <w:rFonts w:cs="Times New Roman"/>
+          <w:szCs w:val="24"/>
+        </w:rPr>
+        <w:t>(Finkenzeller, 2010)</w:t>
+      </w:r>
+      <w:r>
+        <w:rPr>
+          <w:rFonts w:cs="Times New Roman"/>
+          <w:szCs w:val="24"/>
+        </w:rPr>
+        <w:t>, que incluye tecnologías como códigos de barras, códigos QR, tarjetas inteligentes, biometría y la identificación por radiofrecuencia.</w:t>
+      </w:r>
     </w:p>
     <w:p>
       <w:pPr>
         <w:ind w:firstLine="708"/>
-      </w:pPr>
-      <w:r>
-        <w:rPr>
-          <w:rFonts w:cs="Times New Roman"/>
-          <w:szCs w:val="24"/>
-        </w:rPr>
-        <w:t xml:space="preserve">Las citas pueden ser textuales o parafraseadas. Cuando una cita tiene más de 40 palabras debe ir en un párrafo aparte. Si la cita tiene menos de 40 palabras debe ir al interior del texto. Para ver los ejemplos y citar correctamente se recomienda revisar las normas APA y consultar con el asesor del trabajo de grado. </w:t>
-      </w:r>
-    </w:p>
-    <w:p>
-      <w:pPr>
-        <w:jc w:val="center"/>
+        <w:jc w:val="left"/>
+        <w:rPr>
+          <w:rFonts w:cs="Times New Roman"/>
+          <w:szCs w:val="24"/>
+        </w:rPr>
+      </w:pPr>
+      <w:r>
+        <w:rPr>
+          <w:rFonts w:cs="Times New Roman"/>
+          <w:szCs w:val="24"/>
+        </w:rPr>
+        <w:t>Una de las tecnologías más utilizadas dentro de este grupo es la Radio Frequency Identification (RFID), que permite la identificación automática mediante el uso de ondas electromagnéticas</w:t>
+      </w:r>
+      <w:r>
+        <w:rPr>
+          <w:rFonts w:cs="Times New Roman"/>
+          <w:szCs w:val="24"/>
+        </w:rPr>
+        <w:t xml:space="preserve"> </w:t>
+      </w:r>
+      <w:r>
+        <w:rPr>
+          <w:rFonts w:cs="Times New Roman"/>
+          <w:szCs w:val="24"/>
+        </w:rPr>
+        <w:t>(Finkenzeller, 2010)</w:t>
+      </w:r>
+      <w:r>
+        <w:rPr>
+          <w:rFonts w:cs="Times New Roman"/>
+          <w:szCs w:val="24"/>
+        </w:rPr>
+        <w:t>.</w:t>
+      </w:r>
+      <w:r>
+        <w:rPr>
+          <w:rFonts w:cs="Times New Roman"/>
+          <w:szCs w:val="24"/>
+        </w:rPr>
+        <w:t xml:space="preserve"> A diferencia de los sistemas basados en códigos de barras, RFID no requiere línea de visión directa entre el lector y el objeto identificado, lo que permite realizar lecturas simultáneas de múltiples elementos.</w:t>
+      </w:r>
+    </w:p>
+    <w:p>
+      <w:pPr>
+        <w:ind w:firstLine="708"/>
+        <w:jc w:val="left"/>
+        <w:rPr>
+          <w:rFonts w:cs="Times New Roman"/>
+          <w:szCs w:val="24"/>
+        </w:rPr>
+      </w:pPr>
+      <w:r>
+        <w:rPr>
+          <w:rFonts w:cs="Times New Roman"/>
+          <w:szCs w:val="24"/>
+        </w:rPr>
+        <w:t>En bibliotecas modernas, los sistemas RFID se utilizan para automatizar procesos de gestión del material bibliográfico, incluyendo el registro de préstamos, devoluciones y control de inventarios. La implementación de esta tecnología permite optimizar el tiempo de gestión, reducir pérdidas de material y mejorar la trazabilidad de los recursos bibliográficos.</w:t>
+      </w:r>
+    </w:p>
+    <w:p>
+      <w:pPr>
+        <w:ind w:firstLine="708"/>
+        <w:jc w:val="left"/>
+        <w:rPr>
+          <w:rFonts w:cs="Times New Roman"/>
+          <w:szCs w:val="24"/>
+        </w:rPr>
+      </w:pPr>
+    </w:p>
+    <w:p>
+      <w:pPr>
+        <w:jc w:val="left"/>
+        <w:rPr>
+          <w:rFonts w:cs="Times New Roman"/>
+          <w:b/>
+          <w:bCs/>
+          <w:szCs w:val="24"/>
+        </w:rPr>
+      </w:pPr>
+      <w:r>
+        <w:rPr>
+          <w:rFonts w:cs="Times New Roman"/>
+          <w:b/>
+          <w:bCs/>
+          <w:szCs w:val="24"/>
+        </w:rPr>
+        <w:t xml:space="preserve">6.2 </w:t>
+      </w:r>
+      <w:r>
+        <w:rPr>
+          <w:rFonts w:cs="Times New Roman"/>
+          <w:b/>
+          <w:bCs/>
+          <w:szCs w:val="24"/>
+        </w:rPr>
+        <w:t xml:space="preserve">RFID: </w:t>
+      </w:r>
+      <w:r>
+        <w:rPr>
+          <w:rFonts w:cs="Times New Roman"/>
+          <w:b/>
+          <w:bCs/>
+          <w:szCs w:val="24"/>
+        </w:rPr>
+        <w:t>definición</w:t>
+      </w:r>
+      <w:r>
+        <w:rPr>
+          <w:rFonts w:cs="Times New Roman"/>
+          <w:b/>
+          <w:bCs/>
+          <w:szCs w:val="24"/>
+        </w:rPr>
+        <w:t xml:space="preserve"> y arquitectura</w:t>
+      </w:r>
+      <w:r>
+        <w:rPr>
+          <w:rFonts w:cs="Times New Roman"/>
+          <w:b/>
+          <w:bCs/>
+          <w:szCs w:val="24"/>
+        </w:rPr>
+        <w:t>.</w:t>
+      </w:r>
+    </w:p>
+    <w:p>
+      <w:pPr>
+        <w:jc w:val="left"/>
+        <w:rPr>
+          <w:rFonts w:cs="Times New Roman"/>
+          <w:szCs w:val="24"/>
+        </w:rPr>
+      </w:pPr>
+    </w:p>
+    <w:p>
+      <w:pPr>
+        <w:ind w:firstLine="708"/>
+        <w:jc w:val="left"/>
+        <w:rPr>
+          <w:rFonts w:cs="Times New Roman"/>
+          <w:szCs w:val="24"/>
+        </w:rPr>
+      </w:pPr>
+      <w:r>
+        <w:rPr>
+          <w:rFonts w:cs="Times New Roman"/>
+          <w:szCs w:val="24"/>
+        </w:rPr>
+        <w:t>La Radio Frequency Identification (RFID) es una tecnología de identificación inalámbrica que utiliza ondas de radio para transmitir información entre un lector y una etiqueta electrónica asociada a un objeto.</w:t>
+      </w:r>
+    </w:p>
+    <w:p>
+      <w:pPr>
+        <w:ind w:firstLine="708"/>
+        <w:jc w:val="left"/>
+        <w:rPr>
+          <w:rFonts w:cs="Times New Roman"/>
+          <w:szCs w:val="24"/>
+        </w:rPr>
+      </w:pPr>
+      <w:r>
+        <w:rPr>
+          <w:rFonts w:cs="Times New Roman"/>
+          <w:szCs w:val="24"/>
+        </w:rPr>
+        <w:t>Un sistema RFID está compuesto por tres elementos fundamentales:</w:t>
+      </w:r>
+    </w:p>
+    <w:p>
+      <w:pPr>
+        <w:numPr>
+          <w:ilvl w:val="0"/>
+          <w:numId w:val="27"/>
+        </w:numPr>
+        <w:jc w:val="left"/>
+        <w:rPr>
+          <w:rFonts w:cs="Times New Roman"/>
+          <w:szCs w:val="24"/>
+        </w:rPr>
+      </w:pPr>
+      <w:r>
+        <w:rPr>
+          <w:rFonts w:cs="Times New Roman"/>
+          <w:szCs w:val="24"/>
+        </w:rPr>
+        <w:t>Etiqueta RFID (tag)</w:t>
+      </w:r>
+      <w:r>
+        <w:rPr>
+          <w:rFonts w:cs="Times New Roman"/>
+          <w:szCs w:val="24"/>
+        </w:rPr>
+        <w:t>.</w:t>
+      </w:r>
+    </w:p>
+    <w:p>
+      <w:pPr>
+        <w:numPr>
+          <w:ilvl w:val="0"/>
+          <w:numId w:val="27"/>
+        </w:numPr>
+        <w:jc w:val="left"/>
+        <w:rPr>
+          <w:rFonts w:cs="Times New Roman"/>
+          <w:szCs w:val="24"/>
+        </w:rPr>
+      </w:pPr>
+      <w:r>
+        <w:rPr>
+          <w:rFonts w:cs="Times New Roman"/>
+          <w:szCs w:val="24"/>
+        </w:rPr>
+        <w:t>Lector RFID</w:t>
+      </w:r>
+      <w:r>
+        <w:rPr>
+          <w:rFonts w:cs="Times New Roman"/>
+          <w:szCs w:val="24"/>
+        </w:rPr>
+        <w:t>.</w:t>
+      </w:r>
+    </w:p>
+    <w:p>
+      <w:pPr>
+        <w:numPr>
+          <w:ilvl w:val="0"/>
+          <w:numId w:val="27"/>
+        </w:numPr>
+        <w:jc w:val="left"/>
+        <w:rPr>
+          <w:rFonts w:cs="Times New Roman"/>
+          <w:szCs w:val="24"/>
+        </w:rPr>
+      </w:pPr>
+      <w:r>
+        <w:rPr>
+          <w:rFonts w:cs="Times New Roman"/>
+          <w:szCs w:val="24"/>
+        </w:rPr>
+        <w:t>Sistema de procesamiento de datos</w:t>
+      </w:r>
+      <w:r>
+        <w:rPr>
+          <w:rFonts w:cs="Times New Roman"/>
+          <w:szCs w:val="24"/>
+        </w:rPr>
+        <w:t>.</w:t>
+      </w:r>
+    </w:p>
+    <w:p>
+      <w:pPr>
+        <w:ind w:firstLine="708"/>
+        <w:jc w:val="left"/>
+        <w:rPr>
+          <w:rFonts w:cs="Times New Roman"/>
+          <w:szCs w:val="24"/>
+        </w:rPr>
+      </w:pPr>
+      <w:r>
+        <w:rPr>
+          <w:rFonts w:cs="Times New Roman"/>
+          <w:szCs w:val="24"/>
+        </w:rPr>
+        <w:lastRenderedPageBreak/>
+        <w:t>El lector emite una señal electromagnética a través de una antena. Cuando una etiqueta RFID entra en el área de cobertura, esta recibe energía del campo electromagnético y transmite la información almacenada en su microchip.</w:t>
+      </w:r>
+    </w:p>
+    <w:p>
+      <w:pPr>
+        <w:ind w:firstLine="708"/>
+        <w:jc w:val="left"/>
+        <w:rPr>
+          <w:rFonts w:cs="Times New Roman"/>
+          <w:szCs w:val="24"/>
+        </w:rPr>
+      </w:pPr>
+      <w:r>
+        <w:rPr>
+          <w:rFonts w:cs="Times New Roman"/>
+          <w:szCs w:val="24"/>
+        </w:rPr>
+        <w:t>En sistemas</w:t>
+      </w:r>
+      <w:r>
+        <w:rPr>
+          <w:rFonts w:cs="Times New Roman"/>
+          <w:szCs w:val="24"/>
+        </w:rPr>
+        <w:t xml:space="preserve"> de gestión</w:t>
+      </w:r>
+      <w:r>
+        <w:rPr>
+          <w:rFonts w:cs="Times New Roman"/>
+          <w:szCs w:val="24"/>
+        </w:rPr>
+        <w:t xml:space="preserve"> de biblioteca</w:t>
+      </w:r>
+      <w:r>
+        <w:rPr>
+          <w:rFonts w:cs="Times New Roman"/>
+          <w:szCs w:val="24"/>
+        </w:rPr>
+        <w:t>ria</w:t>
+      </w:r>
+      <w:r>
+        <w:rPr>
+          <w:rFonts w:cs="Times New Roman"/>
+          <w:szCs w:val="24"/>
+        </w:rPr>
+        <w:t xml:space="preserve">, las etiquetas RFID </w:t>
+      </w:r>
+      <w:r>
+        <w:rPr>
+          <w:rFonts w:cs="Times New Roman"/>
+          <w:szCs w:val="24"/>
+        </w:rPr>
+        <w:t>deben ser</w:t>
+      </w:r>
+      <w:r>
+        <w:rPr>
+          <w:rFonts w:cs="Times New Roman"/>
+          <w:szCs w:val="24"/>
+        </w:rPr>
+        <w:t xml:space="preserve"> instaladas en cada libro para permitir su identificación automática cuando pasan cerca del lector.</w:t>
+      </w:r>
+    </w:p>
+    <w:p>
+      <w:pPr>
+        <w:ind w:firstLine="708"/>
+        <w:jc w:val="left"/>
+        <w:rPr>
+          <w:rFonts w:cs="Times New Roman"/>
+          <w:szCs w:val="24"/>
+        </w:rPr>
+      </w:pPr>
+      <w:r>
+        <w:rPr>
+          <w:rFonts w:cs="Times New Roman"/>
+          <w:szCs w:val="24"/>
+        </w:rPr>
+        <w:t>Las etiquetas pueden clasificarse en:</w:t>
+      </w:r>
+    </w:p>
+    <w:p>
+      <w:pPr>
+        <w:numPr>
+          <w:ilvl w:val="0"/>
+          <w:numId w:val="28"/>
+        </w:numPr>
+        <w:jc w:val="left"/>
+        <w:rPr>
+          <w:rFonts w:cs="Times New Roman"/>
+          <w:szCs w:val="24"/>
+        </w:rPr>
+      </w:pPr>
+      <w:r>
+        <w:rPr>
+          <w:rFonts w:cs="Times New Roman"/>
+          <w:szCs w:val="24"/>
+        </w:rPr>
+        <w:t>P</w:t>
+      </w:r>
+      <w:r>
+        <w:rPr>
+          <w:rFonts w:cs="Times New Roman"/>
+          <w:szCs w:val="24"/>
+        </w:rPr>
+        <w:t>asivas</w:t>
+      </w:r>
+    </w:p>
+    <w:p>
+      <w:pPr>
+        <w:numPr>
+          <w:ilvl w:val="0"/>
+          <w:numId w:val="28"/>
+        </w:numPr>
+        <w:jc w:val="left"/>
+        <w:rPr>
+          <w:rFonts w:cs="Times New Roman"/>
+          <w:szCs w:val="24"/>
+        </w:rPr>
+      </w:pPr>
+      <w:r>
+        <w:rPr>
+          <w:rFonts w:cs="Times New Roman"/>
+          <w:szCs w:val="24"/>
+        </w:rPr>
+        <w:t>A</w:t>
+      </w:r>
+      <w:r>
+        <w:rPr>
+          <w:rFonts w:cs="Times New Roman"/>
+          <w:szCs w:val="24"/>
+        </w:rPr>
+        <w:t>ctivas</w:t>
+      </w:r>
+    </w:p>
+    <w:p>
+      <w:pPr>
+        <w:numPr>
+          <w:ilvl w:val="0"/>
+          <w:numId w:val="28"/>
+        </w:numPr>
+        <w:jc w:val="left"/>
+        <w:rPr>
+          <w:rFonts w:cs="Times New Roman"/>
+          <w:szCs w:val="24"/>
+        </w:rPr>
+      </w:pPr>
+      <w:r>
+        <w:rPr>
+          <w:rFonts w:cs="Times New Roman"/>
+          <w:szCs w:val="24"/>
+        </w:rPr>
+        <w:t>S</w:t>
+      </w:r>
+      <w:r>
+        <w:rPr>
+          <w:rFonts w:cs="Times New Roman"/>
+          <w:szCs w:val="24"/>
+        </w:rPr>
+        <w:t>emipasivas</w:t>
+      </w:r>
+    </w:p>
+    <w:p>
+      <w:pPr>
+        <w:ind w:firstLine="708"/>
+        <w:jc w:val="left"/>
+        <w:rPr>
+          <w:rFonts w:cs="Times New Roman"/>
+          <w:szCs w:val="24"/>
+        </w:rPr>
+      </w:pPr>
+      <w:r>
+        <w:rPr>
+          <w:rFonts w:cs="Times New Roman"/>
+          <w:szCs w:val="24"/>
+        </w:rPr>
+        <w:t xml:space="preserve">En </w:t>
+      </w:r>
+      <w:r>
+        <w:rPr>
+          <w:rFonts w:cs="Times New Roman"/>
+          <w:szCs w:val="24"/>
+        </w:rPr>
+        <w:t xml:space="preserve">este tipo de </w:t>
+      </w:r>
+      <w:r>
+        <w:rPr>
+          <w:rFonts w:cs="Times New Roman"/>
+          <w:szCs w:val="24"/>
+        </w:rPr>
+        <w:t>aplicaciones se utilizan principalmente etiquetas pasivas, debido a su bajo costo, tamaño reducido y larga vida útil (Finkenzeller, 2010).</w:t>
+      </w:r>
+    </w:p>
+    <w:p>
+      <w:pPr>
+        <w:ind w:firstLine="708"/>
+        <w:jc w:val="left"/>
+        <w:rPr>
+          <w:rFonts w:cs="Times New Roman"/>
+          <w:szCs w:val="24"/>
+        </w:rPr>
+      </w:pPr>
+      <w:r>
+        <w:rPr>
+          <w:rFonts w:cs="Times New Roman"/>
+          <w:szCs w:val="24"/>
+        </w:rPr>
+        <w:t>En este contexto, el sistema RFID permite desarrollar soluciones automatizadas para el control eficiente de libros, facilitando procesos de inventario y localización dentro del sistema bibliotecario.</w:t>
+      </w:r>
+    </w:p>
+    <w:p>
+      <w:pPr>
+        <w:ind w:firstLine="708"/>
+        <w:jc w:val="left"/>
+        <w:rPr>
+          <w:rFonts w:cs="Times New Roman"/>
+          <w:szCs w:val="24"/>
+        </w:rPr>
+      </w:pPr>
+    </w:p>
+    <w:p>
+      <w:pPr>
+        <w:jc w:val="left"/>
+        <w:rPr>
+          <w:rFonts w:cs="Times New Roman"/>
+          <w:b/>
+          <w:bCs/>
+          <w:szCs w:val="24"/>
+        </w:rPr>
+      </w:pPr>
+      <w:r>
+        <w:rPr>
+          <w:rFonts w:cs="Times New Roman"/>
+          <w:b/>
+          <w:bCs/>
+          <w:szCs w:val="24"/>
+        </w:rPr>
+        <w:t>6.</w:t>
+      </w:r>
+      <w:r>
+        <w:rPr>
+          <w:rFonts w:cs="Times New Roman"/>
+          <w:b/>
+          <w:bCs/>
+          <w:szCs w:val="24"/>
+        </w:rPr>
+        <w:t>3</w:t>
+      </w:r>
+      <w:r>
+        <w:rPr>
+          <w:rFonts w:cs="Times New Roman"/>
+          <w:b/>
+          <w:bCs/>
+          <w:szCs w:val="24"/>
+        </w:rPr>
+        <w:t xml:space="preserve"> Antenas en sistemas RFID</w:t>
+      </w:r>
+    </w:p>
+    <w:p>
+      <w:pPr>
+        <w:jc w:val="left"/>
+        <w:rPr>
+          <w:rFonts w:cs="Times New Roman"/>
+          <w:szCs w:val="24"/>
+        </w:rPr>
+      </w:pPr>
+    </w:p>
+    <w:p>
+      <w:pPr>
+        <w:ind w:firstLine="708"/>
+        <w:jc w:val="left"/>
+        <w:rPr>
+          <w:rFonts w:cs="Times New Roman"/>
+          <w:szCs w:val="24"/>
+        </w:rPr>
+      </w:pPr>
+      <w:r>
+        <w:rPr>
+          <w:rFonts w:cs="Times New Roman"/>
+          <w:szCs w:val="24"/>
+        </w:rPr>
+        <w:t xml:space="preserve">Las antenas </w:t>
+      </w:r>
+      <w:r>
+        <w:rPr>
+          <w:rFonts w:cs="Times New Roman"/>
+          <w:szCs w:val="24"/>
+        </w:rPr>
+        <w:t>son</w:t>
+      </w:r>
+      <w:r>
+        <w:rPr>
+          <w:rFonts w:cs="Times New Roman"/>
+          <w:szCs w:val="24"/>
+        </w:rPr>
+        <w:t xml:space="preserve"> un componente fundamental en los sistemas RFID, ya que son responsables de la transmisión y recepción de las señales electromagnéticas que permiten la comunicación entre el lector y las etiquetas</w:t>
+      </w:r>
+      <w:r>
+        <w:rPr>
+          <w:rFonts w:cs="Times New Roman"/>
+          <w:szCs w:val="24"/>
+        </w:rPr>
+        <w:t xml:space="preserve"> </w:t>
+      </w:r>
+      <w:r>
+        <w:rPr>
+          <w:rFonts w:cs="Times New Roman"/>
+          <w:szCs w:val="24"/>
+        </w:rPr>
+        <w:t>(Balanis, 2016).</w:t>
+      </w:r>
+      <w:r>
+        <w:rPr>
+          <w:rFonts w:cs="Times New Roman"/>
+          <w:szCs w:val="24"/>
+        </w:rPr>
+        <w:t xml:space="preserve"> </w:t>
+      </w:r>
+    </w:p>
+    <w:p>
+      <w:pPr>
+        <w:ind w:firstLine="708"/>
+        <w:jc w:val="left"/>
+        <w:rPr>
+          <w:rFonts w:cs="Times New Roman"/>
+          <w:szCs w:val="24"/>
+        </w:rPr>
+      </w:pPr>
+      <w:r>
+        <w:rPr>
+          <w:rFonts w:cs="Times New Roman"/>
+          <w:szCs w:val="24"/>
+        </w:rPr>
+        <w:t>El desempeño del sistema RFID depende en gran medida de las características de la antena utilizada, tales como:</w:t>
+      </w:r>
+    </w:p>
+    <w:p>
+      <w:pPr>
+        <w:numPr>
+          <w:ilvl w:val="0"/>
+          <w:numId w:val="29"/>
+        </w:numPr>
+        <w:jc w:val="left"/>
+        <w:rPr>
+          <w:rFonts w:cs="Times New Roman"/>
+          <w:szCs w:val="24"/>
+        </w:rPr>
+      </w:pPr>
+      <w:r>
+        <w:rPr>
+          <w:rFonts w:cs="Times New Roman"/>
+          <w:szCs w:val="24"/>
+        </w:rPr>
+        <w:t>P</w:t>
+      </w:r>
+      <w:r>
+        <w:rPr>
+          <w:rFonts w:cs="Times New Roman"/>
+          <w:szCs w:val="24"/>
+        </w:rPr>
+        <w:t>atrón de radiación</w:t>
+      </w:r>
+      <w:r>
+        <w:rPr>
+          <w:rFonts w:cs="Times New Roman"/>
+          <w:szCs w:val="24"/>
+        </w:rPr>
+        <w:t>.</w:t>
+      </w:r>
+    </w:p>
+    <w:p>
+      <w:pPr>
+        <w:numPr>
+          <w:ilvl w:val="0"/>
+          <w:numId w:val="29"/>
+        </w:numPr>
+        <w:jc w:val="left"/>
+        <w:rPr>
+          <w:rFonts w:cs="Times New Roman"/>
+          <w:szCs w:val="24"/>
+        </w:rPr>
+      </w:pPr>
+      <w:r>
+        <w:rPr>
+          <w:rFonts w:cs="Times New Roman"/>
+          <w:szCs w:val="24"/>
+        </w:rPr>
+        <w:t>G</w:t>
+      </w:r>
+      <w:r>
+        <w:rPr>
+          <w:rFonts w:cs="Times New Roman"/>
+          <w:szCs w:val="24"/>
+        </w:rPr>
+        <w:t>anancia</w:t>
+      </w:r>
+      <w:r>
+        <w:rPr>
+          <w:rFonts w:cs="Times New Roman"/>
+          <w:szCs w:val="24"/>
+        </w:rPr>
+        <w:t>.</w:t>
+      </w:r>
+    </w:p>
+    <w:p>
+      <w:pPr>
+        <w:numPr>
+          <w:ilvl w:val="0"/>
+          <w:numId w:val="29"/>
+        </w:numPr>
+        <w:jc w:val="left"/>
+        <w:rPr>
+          <w:rFonts w:cs="Times New Roman"/>
+          <w:szCs w:val="24"/>
+        </w:rPr>
+      </w:pPr>
+      <w:r>
+        <w:rPr>
+          <w:rFonts w:cs="Times New Roman"/>
+          <w:szCs w:val="24"/>
+        </w:rPr>
+        <w:t>P</w:t>
+      </w:r>
+      <w:r>
+        <w:rPr>
+          <w:rFonts w:cs="Times New Roman"/>
+          <w:szCs w:val="24"/>
+        </w:rPr>
+        <w:t>olarización</w:t>
+      </w:r>
+      <w:r>
+        <w:rPr>
+          <w:rFonts w:cs="Times New Roman"/>
+          <w:szCs w:val="24"/>
+        </w:rPr>
+        <w:t>.</w:t>
+      </w:r>
+    </w:p>
+    <w:p>
+      <w:pPr>
+        <w:numPr>
+          <w:ilvl w:val="0"/>
+          <w:numId w:val="29"/>
+        </w:numPr>
+        <w:jc w:val="left"/>
+        <w:rPr>
+          <w:rFonts w:cs="Times New Roman"/>
+          <w:szCs w:val="24"/>
+        </w:rPr>
+      </w:pPr>
+      <w:r>
+        <w:rPr>
+          <w:rFonts w:cs="Times New Roman"/>
+          <w:szCs w:val="24"/>
+        </w:rPr>
+        <w:t>E</w:t>
+      </w:r>
+      <w:r>
+        <w:rPr>
+          <w:rFonts w:cs="Times New Roman"/>
+          <w:szCs w:val="24"/>
+        </w:rPr>
+        <w:t>ficiencia de radiación</w:t>
+      </w:r>
+      <w:r>
+        <w:rPr>
+          <w:rFonts w:cs="Times New Roman"/>
+          <w:szCs w:val="24"/>
+        </w:rPr>
+        <w:t>.</w:t>
+      </w:r>
+    </w:p>
+    <w:p>
+      <w:pPr>
+        <w:ind w:firstLine="708"/>
+        <w:jc w:val="left"/>
+        <w:rPr>
+          <w:rFonts w:cs="Times New Roman"/>
+          <w:szCs w:val="24"/>
+        </w:rPr>
+      </w:pPr>
+      <w:r>
+        <w:rPr>
+          <w:rFonts w:cs="Times New Roman"/>
+          <w:szCs w:val="24"/>
+        </w:rPr>
+        <w:t>Uno de los tipos de antenas más utilizados en aplicaciones RFID es la antena microstrip o patch, la cual está compuesta por un conductor metálico plano ubicado sobre un sustrato dieléctrico con un plano de tierra en la parte inferior.</w:t>
+      </w:r>
+    </w:p>
+    <w:p>
+      <w:pPr>
+        <w:ind w:firstLine="708"/>
+        <w:jc w:val="left"/>
+        <w:rPr>
+          <w:rFonts w:cs="Times New Roman"/>
+          <w:szCs w:val="24"/>
+        </w:rPr>
+      </w:pPr>
+      <w:r>
+        <w:rPr>
+          <w:rFonts w:cs="Times New Roman"/>
+          <w:szCs w:val="24"/>
+        </w:rPr>
+        <w:t>Este tipo de antena presenta ventajas importantes como:</w:t>
+      </w:r>
+    </w:p>
+    <w:p>
+      <w:pPr>
+        <w:numPr>
+          <w:ilvl w:val="0"/>
+          <w:numId w:val="30"/>
+        </w:numPr>
+        <w:jc w:val="left"/>
+        <w:rPr>
+          <w:rFonts w:cs="Times New Roman"/>
+          <w:szCs w:val="24"/>
+        </w:rPr>
+      </w:pPr>
+      <w:r>
+        <w:rPr>
+          <w:rFonts w:cs="Times New Roman"/>
+          <w:szCs w:val="24"/>
+        </w:rPr>
+        <w:lastRenderedPageBreak/>
+        <w:t>B</w:t>
+      </w:r>
+      <w:r>
+        <w:rPr>
+          <w:rFonts w:cs="Times New Roman"/>
+          <w:szCs w:val="24"/>
+        </w:rPr>
+        <w:t>ajo perfil</w:t>
+      </w:r>
+      <w:r>
+        <w:rPr>
+          <w:rFonts w:cs="Times New Roman"/>
+          <w:szCs w:val="24"/>
+        </w:rPr>
+        <w:t>.</w:t>
+      </w:r>
+    </w:p>
+    <w:p>
+      <w:pPr>
+        <w:numPr>
+          <w:ilvl w:val="0"/>
+          <w:numId w:val="30"/>
+        </w:numPr>
+        <w:jc w:val="left"/>
+        <w:rPr>
+          <w:rFonts w:cs="Times New Roman"/>
+          <w:szCs w:val="24"/>
+        </w:rPr>
+      </w:pPr>
+      <w:r>
+        <w:rPr>
+          <w:rFonts w:cs="Times New Roman"/>
+          <w:szCs w:val="24"/>
+        </w:rPr>
+        <w:t>F</w:t>
+      </w:r>
+      <w:r>
+        <w:rPr>
+          <w:rFonts w:cs="Times New Roman"/>
+          <w:szCs w:val="24"/>
+        </w:rPr>
+        <w:t>acilidad de fabricación</w:t>
+      </w:r>
+      <w:r>
+        <w:rPr>
+          <w:rFonts w:cs="Times New Roman"/>
+          <w:szCs w:val="24"/>
+        </w:rPr>
+        <w:t>.</w:t>
+      </w:r>
+    </w:p>
+    <w:p>
+      <w:pPr>
+        <w:numPr>
+          <w:ilvl w:val="0"/>
+          <w:numId w:val="30"/>
+        </w:numPr>
+        <w:jc w:val="left"/>
+        <w:rPr>
+          <w:rFonts w:cs="Times New Roman"/>
+          <w:szCs w:val="24"/>
+        </w:rPr>
+      </w:pPr>
+      <w:r>
+        <w:rPr>
+          <w:rFonts w:cs="Times New Roman"/>
+          <w:szCs w:val="24"/>
+        </w:rPr>
+        <w:t>I</w:t>
+      </w:r>
+      <w:r>
+        <w:rPr>
+          <w:rFonts w:cs="Times New Roman"/>
+          <w:szCs w:val="24"/>
+        </w:rPr>
+        <w:t>ntegración con circuitos impresos</w:t>
+      </w:r>
+      <w:r>
+        <w:rPr>
+          <w:rFonts w:cs="Times New Roman"/>
+          <w:szCs w:val="24"/>
+        </w:rPr>
+        <w:t>.</w:t>
+      </w:r>
+    </w:p>
+    <w:p>
+      <w:pPr>
+        <w:numPr>
+          <w:ilvl w:val="0"/>
+          <w:numId w:val="30"/>
+        </w:numPr>
+        <w:jc w:val="left"/>
+        <w:rPr>
+          <w:rFonts w:cs="Times New Roman"/>
+          <w:szCs w:val="24"/>
+        </w:rPr>
+      </w:pPr>
+      <w:r>
+        <w:rPr>
+          <w:rFonts w:cs="Times New Roman"/>
+          <w:szCs w:val="24"/>
+        </w:rPr>
+        <w:t>T</w:t>
+      </w:r>
+      <w:r>
+        <w:rPr>
+          <w:rFonts w:cs="Times New Roman"/>
+          <w:szCs w:val="24"/>
+        </w:rPr>
+        <w:t>amaño reducido</w:t>
+      </w:r>
+      <w:r>
+        <w:rPr>
+          <w:rFonts w:cs="Times New Roman"/>
+          <w:szCs w:val="24"/>
+        </w:rPr>
+        <w:t>.</w:t>
+      </w:r>
+    </w:p>
+    <w:p>
+      <w:pPr>
+        <w:ind w:firstLine="708"/>
+        <w:jc w:val="left"/>
+        <w:rPr>
+          <w:rFonts w:cs="Times New Roman"/>
+          <w:szCs w:val="24"/>
+        </w:rPr>
+      </w:pPr>
+      <w:r>
+        <w:rPr>
+          <w:rFonts w:cs="Times New Roman"/>
+          <w:szCs w:val="24"/>
+        </w:rPr>
+        <w:t>Estas características hacen que las antenas patch sean utilizadas en lectores RFID empleados en sistemas de control de inventarios y bibliotecas (Pozar, 2011).</w:t>
+      </w:r>
+    </w:p>
+    <w:p>
+      <w:pPr>
+        <w:jc w:val="left"/>
+        <w:rPr>
+          <w:rFonts w:cs="Times New Roman"/>
+          <w:szCs w:val="24"/>
+        </w:rPr>
+      </w:pPr>
+    </w:p>
+    <w:p>
+      <w:pPr>
+        <w:jc w:val="left"/>
+        <w:rPr>
+          <w:rFonts w:cs="Times New Roman"/>
+          <w:b/>
+          <w:bCs/>
+          <w:szCs w:val="24"/>
+        </w:rPr>
+      </w:pPr>
+      <w:r>
+        <w:rPr>
+          <w:rFonts w:cs="Times New Roman"/>
+          <w:b/>
+          <w:bCs/>
+          <w:szCs w:val="24"/>
+        </w:rPr>
+        <w:t>6.</w:t>
+      </w:r>
+      <w:r>
+        <w:rPr>
+          <w:rFonts w:cs="Times New Roman"/>
+          <w:b/>
+          <w:bCs/>
+          <w:szCs w:val="24"/>
+        </w:rPr>
+        <w:t>4</w:t>
+      </w:r>
+      <w:r>
+        <w:rPr>
+          <w:rFonts w:cs="Times New Roman"/>
+          <w:b/>
+          <w:bCs/>
+          <w:szCs w:val="24"/>
+        </w:rPr>
+        <w:t xml:space="preserve"> Propagación electromagnética</w:t>
+      </w:r>
+    </w:p>
+    <w:p>
+      <w:pPr>
+        <w:jc w:val="left"/>
+        <w:rPr>
+          <w:rFonts w:cs="Times New Roman"/>
+          <w:szCs w:val="24"/>
+        </w:rPr>
+      </w:pPr>
+    </w:p>
+    <w:p>
+      <w:pPr>
+        <w:ind w:firstLine="708"/>
+        <w:jc w:val="left"/>
+        <w:rPr>
+          <w:rFonts w:cs="Times New Roman"/>
+          <w:szCs w:val="24"/>
+        </w:rPr>
+      </w:pPr>
+      <w:r>
+        <w:rPr>
+          <w:rFonts w:cs="Times New Roman"/>
+          <w:szCs w:val="24"/>
+        </w:rPr>
+        <w:t>La propagación electromagnética describe el comportamiento de las ondas electromagnéticas cuando se transmiten a través del espacio o de diferentes medios</w:t>
+      </w:r>
+      <w:r>
+        <w:t xml:space="preserve"> </w:t>
+      </w:r>
+      <w:r>
+        <w:rPr>
+          <w:rFonts w:cs="Times New Roman"/>
+          <w:szCs w:val="24"/>
+        </w:rPr>
+        <w:t>(Sadiku, 2003)</w:t>
+      </w:r>
+      <w:r>
+        <w:rPr>
+          <w:rFonts w:cs="Times New Roman"/>
+          <w:szCs w:val="24"/>
+        </w:rPr>
+        <w:t>.</w:t>
+      </w:r>
+    </w:p>
+    <w:p>
+      <w:pPr>
+        <w:ind w:firstLine="708"/>
+        <w:jc w:val="left"/>
+        <w:rPr>
+          <w:rFonts w:cs="Times New Roman"/>
+          <w:szCs w:val="24"/>
+        </w:rPr>
+      </w:pPr>
+      <w:r>
+        <w:rPr>
+          <w:rFonts w:cs="Times New Roman"/>
+          <w:szCs w:val="24"/>
+        </w:rPr>
+        <w:t xml:space="preserve">El comportamiento de estas ondas está descrito por las </w:t>
+      </w:r>
+      <w:r>
+        <w:rPr>
+          <w:rFonts w:cs="Times New Roman"/>
+          <w:szCs w:val="24"/>
+        </w:rPr>
+        <w:t>ecuaciones de Maxwell</w:t>
+      </w:r>
+      <w:r>
+        <w:rPr>
+          <w:rFonts w:cs="Times New Roman"/>
+          <w:szCs w:val="24"/>
+        </w:rPr>
+        <w:t xml:space="preserve"> que relacionan los campos eléctricos y magnéticos.</w:t>
+      </w:r>
+    </w:p>
+    <w:p>
+      <w:pPr>
+        <w:ind w:firstLine="708"/>
+        <w:jc w:val="left"/>
+        <w:rPr>
+          <w:rFonts w:cs="Times New Roman"/>
+          <w:szCs w:val="24"/>
+        </w:rPr>
+      </w:pPr>
+      <w:r>
+        <w:rPr>
+          <w:rFonts w:cs="Times New Roman"/>
+          <w:szCs w:val="24"/>
+        </w:rPr>
+        <w:t>El principio fundamental establece que un campo eléctrico variable en el tiempo genera un campo magnético y viceversa, lo que permite la propagación de ondas electromagnéticas.</w:t>
+      </w:r>
+    </w:p>
+    <w:p>
+      <w:pPr>
+        <w:ind w:firstLine="708"/>
+        <w:jc w:val="left"/>
+        <w:rPr>
+          <w:rFonts w:cs="Times New Roman"/>
+          <w:szCs w:val="24"/>
+        </w:rPr>
+      </w:pPr>
+      <w:r>
+        <w:rPr>
+          <w:rFonts w:cs="Times New Roman"/>
+          <w:szCs w:val="24"/>
+        </w:rPr>
+        <w:t>La relación entre la frecuencia, la longitud de onda y la velocidad de propagación se expresa mediante la ecuación:</w:t>
+      </w:r>
+    </w:p>
+    <w:p>
+      <w:pPr>
+        <w:ind w:firstLine="708"/>
+        <w:jc w:val="left"/>
+        <w:rPr>
+          <w:rFonts w:cs="Times New Roman"/>
+          <w:szCs w:val="24"/>
+        </w:rPr>
+      </w:pPr>
+      <w:r>
+        <w:rPr>
+          <w:rFonts w:cs="Times New Roman"/>
+          <w:szCs w:val="24"/>
+        </w:rPr>
+        <w:t>donde:</w:t>
+      </w:r>
+    </w:p>
+    <w:p>
+      <w:pPr>
+        <w:ind w:firstLine="708"/>
+        <w:jc w:val="left"/>
+        <w:rPr>
+          <w:rFonts w:cs="Times New Roman"/>
+          <w:szCs w:val="24"/>
+        </w:rPr>
+      </w:pPr>
+      <m:oMathPara>
+        <m:oMath>
+          <m:r>
+            <w:rPr>
+              <w:rFonts w:ascii="Cambria Math" w:hAnsi="Cambria Math" w:cs="Times New Roman"/>
+              <w:szCs w:val="24"/>
+            </w:rPr>
+            <m:t xml:space="preserve">C= </m:t>
+          </m:r>
+          <m:f>
+            <m:fPr>
+              <m:ctrlPr>
+                <w:rPr>
+                  <w:rFonts w:ascii="Cambria Math" w:hAnsi="Cambria Math" w:cs="Times New Roman"/>
+                  <w:i/>
+                  <w:szCs w:val="24"/>
+                </w:rPr>
+              </m:ctrlPr>
+            </m:fPr>
+            <m:num>
+              <m:r>
+                <w:rPr>
+                  <w:rFonts w:ascii="Cambria Math" w:hAnsi="Cambria Math" w:cs="Times New Roman"/>
+                  <w:szCs w:val="24"/>
+                </w:rPr>
+                <m:t>f</m:t>
+              </m:r>
+            </m:num>
+            <m:den>
+              <m:r>
+                <w:rPr>
+                  <w:rFonts w:ascii="Cambria Math" w:hAnsi="Cambria Math" w:cs="Times New Roman"/>
+                  <w:szCs w:val="24"/>
+                </w:rPr>
+                <m:t>λ</m:t>
+              </m:r>
+            </m:den>
+          </m:f>
+        </m:oMath>
+      </m:oMathPara>
+    </w:p>
+    <w:p>
+      <w:pPr>
+        <w:numPr>
+          <w:ilvl w:val="0"/>
+          <w:numId w:val="31"/>
+        </w:numPr>
+        <w:jc w:val="left"/>
+        <w:rPr>
+          <w:rFonts w:cs="Times New Roman"/>
+          <w:szCs w:val="24"/>
+        </w:rPr>
+      </w:pPr>
+      <m:oMath>
+        <m:r>
+          <w:rPr>
+            <w:rFonts w:ascii="Cambria Math" w:hAnsi="Cambria Math" w:cs="Times New Roman"/>
+            <w:szCs w:val="24"/>
+          </w:rPr>
+          <m:t>C</m:t>
+        </m:r>
+      </m:oMath>
+      <w:r>
+        <w:rPr>
+          <w:rFonts w:eastAsiaTheme="minorEastAsia" w:cs="Times New Roman"/>
+          <w:szCs w:val="24"/>
+        </w:rPr>
+        <w:t xml:space="preserve"> </w:t>
+      </w:r>
+      <w:r>
+        <w:rPr>
+          <w:rFonts w:cs="Times New Roman"/>
+          <w:szCs w:val="24"/>
+        </w:rPr>
+        <w:t>es la velocidad de la luz</w:t>
+      </w:r>
+    </w:p>
+    <w:p>
+      <w:pPr>
+        <w:numPr>
+          <w:ilvl w:val="0"/>
+          <w:numId w:val="31"/>
+        </w:numPr>
+        <w:jc w:val="left"/>
+        <w:rPr>
+          <w:rFonts w:cs="Times New Roman"/>
+          <w:szCs w:val="24"/>
+        </w:rPr>
+      </w:pPr>
+      <m:oMath>
+        <m:r>
+          <w:rPr>
+            <w:rFonts w:ascii="Cambria Math" w:hAnsi="Cambria Math" w:cs="Times New Roman"/>
+            <w:szCs w:val="24"/>
+          </w:rPr>
+          <m:t>f</m:t>
+        </m:r>
+      </m:oMath>
+      <w:r>
+        <w:rPr>
+          <w:rFonts w:eastAsiaTheme="minorEastAsia" w:cs="Times New Roman"/>
+          <w:szCs w:val="24"/>
+        </w:rPr>
+        <w:t xml:space="preserve"> </w:t>
+      </w:r>
+      <w:r>
+        <w:rPr>
+          <w:rFonts w:cs="Times New Roman"/>
+          <w:szCs w:val="24"/>
+        </w:rPr>
+        <w:t>es la frecuencia</w:t>
+      </w:r>
+    </w:p>
+    <w:p>
+      <w:pPr>
+        <w:numPr>
+          <w:ilvl w:val="0"/>
+          <w:numId w:val="31"/>
+        </w:numPr>
+        <w:jc w:val="left"/>
+        <w:rPr>
+          <w:rFonts w:cs="Times New Roman"/>
+          <w:szCs w:val="24"/>
+        </w:rPr>
+      </w:pPr>
+      <m:oMath>
+        <m:r>
+          <w:rPr>
+            <w:rFonts w:ascii="Cambria Math" w:hAnsi="Cambria Math" w:cs="Times New Roman"/>
+            <w:szCs w:val="24"/>
+          </w:rPr>
+          <m:t>λ</m:t>
+        </m:r>
+      </m:oMath>
+      <w:r>
+        <w:rPr>
+          <w:rFonts w:eastAsiaTheme="minorEastAsia" w:cs="Times New Roman"/>
+          <w:szCs w:val="24"/>
+        </w:rPr>
+        <w:t xml:space="preserve"> </w:t>
+      </w:r>
+      <w:r>
+        <w:rPr>
+          <w:rFonts w:cs="Times New Roman"/>
+          <w:szCs w:val="24"/>
+        </w:rPr>
+        <w:t>es la longitud de onda</w:t>
+      </w:r>
+    </w:p>
+    <w:p>
+      <w:pPr>
+        <w:ind w:firstLine="708"/>
+        <w:jc w:val="left"/>
+        <w:rPr>
+          <w:rFonts w:cs="Times New Roman"/>
+          <w:szCs w:val="24"/>
+        </w:rPr>
+      </w:pPr>
+      <w:r>
+        <w:rPr>
+          <w:rFonts w:cs="Times New Roman"/>
+          <w:szCs w:val="24"/>
+        </w:rPr>
+        <w:t>Este principio es fundamental en el diseño de antenas RFID, ya que la longitud de onda determina dimensiones importantes de la antena.</w:t>
+      </w:r>
+    </w:p>
+    <w:p>
+      <w:pPr>
+        <w:ind w:firstLine="708"/>
+        <w:jc w:val="left"/>
+        <w:rPr>
+          <w:rFonts w:cs="Times New Roman"/>
+          <w:szCs w:val="24"/>
+        </w:rPr>
+      </w:pPr>
+      <w:r>
+        <w:rPr>
+          <w:rFonts w:cs="Times New Roman"/>
+          <w:szCs w:val="24"/>
+        </w:rPr>
+        <w:t xml:space="preserve">El </w:t>
+      </w:r>
+      <w:r>
+        <w:rPr>
+          <w:rFonts w:cs="Times New Roman"/>
+          <w:szCs w:val="24"/>
+        </w:rPr>
+        <w:t xml:space="preserve"> diseño adecuado de la antena y la frecuencia de operación permite garantizar una correcta lectura de las etiquetas incluso en entornos con múltiples objetos cercanos.</w:t>
+      </w:r>
+    </w:p>
+    <w:p>
+      <w:pPr>
+        <w:ind w:firstLine="708"/>
+        <w:jc w:val="left"/>
+        <w:rPr>
+          <w:rFonts w:cs="Times New Roman"/>
+          <w:szCs w:val="24"/>
+        </w:rPr>
+      </w:pPr>
+    </w:p>
+    <w:p>
+      <w:pPr>
+        <w:ind w:firstLine="708"/>
+        <w:jc w:val="left"/>
+        <w:rPr>
+          <w:rFonts w:cs="Times New Roman"/>
+          <w:szCs w:val="24"/>
+        </w:rPr>
+      </w:pPr>
+    </w:p>
+    <w:p>
+      <w:pPr>
+        <w:ind w:firstLine="708"/>
+        <w:jc w:val="left"/>
+        <w:rPr>
+          <w:rFonts w:cs="Times New Roman"/>
+          <w:szCs w:val="24"/>
+        </w:rPr>
+      </w:pPr>
+    </w:p>
+    <w:p>
+      <w:pPr>
+        <w:ind w:firstLine="708"/>
+        <w:jc w:val="left"/>
+        <w:rPr>
+          <w:rFonts w:cs="Times New Roman"/>
+          <w:szCs w:val="24"/>
+        </w:rPr>
+      </w:pPr>
+    </w:p>
+    <w:p>
+      <w:pPr>
+        <w:ind w:firstLine="708"/>
+        <w:jc w:val="left"/>
+        <w:rPr>
+          <w:rFonts w:cs="Times New Roman"/>
+          <w:szCs w:val="24"/>
+        </w:rPr>
+      </w:pPr>
+    </w:p>
+    <w:p>
+      <w:pPr>
+        <w:ind w:firstLine="708"/>
+        <w:jc w:val="left"/>
         <w:rPr>
           <w:rFonts w:cs="Times New Roman"/>
           <w:b/>
@@ -6217,6 +7628,9 @@
         <w:ind w:left="1080"/>
       </w:pPr>
       <w:r>
+        <w:rPr>
+          <w:noProof/>
+        </w:rPr>
         <w:drawing>
           <wp:inline distT="0" distB="0" distL="0" distR="0" wp14:anchorId="466E7E1A" wp14:editId="24679CC6">
             <wp:extent cx="4686300" cy="5230862"/>
@@ -6977,22 +8391,9 @@
       <w:r>
         <w:br w:type="page"/>
       </w:r>
-      <w:commentRangeStart w:id="39"/>
       <w:r>
         <w:lastRenderedPageBreak/>
-        <w:t>R</w:t>
-      </w:r>
-      <w:commentRangeEnd w:id="39"/>
-      <w:r>
-        <w:rPr>
-          <w:rStyle w:val="Refdecomentario"/>
-          <w:sz w:val="24"/>
-          <w:szCs w:val="32"/>
-        </w:rPr>
-        <w:commentReference w:id="39"/>
-      </w:r>
-      <w:r>
-        <w:t>eferencias</w:t>
+        <w:t>Referencias</w:t>
       </w:r>
       <w:bookmarkEnd w:id="37"/>
       <w:bookmarkEnd w:id="38"/>
@@ -7162,64 +8563,120 @@
             <w:t>(1), 163–174. https://doi.org/10.37934/araset.33.1.163174</w:t>
           </w:r>
         </w:p>
-        <w:p>
-          <w:pPr>
-            <w:widowControl w:val="0"/>
-            <w:autoSpaceDE w:val="0"/>
-            <w:autoSpaceDN w:val="0"/>
-            <w:adjustRightInd w:val="0"/>
-            <w:ind w:left="480" w:hanging="480"/>
-            <w:rPr>
-              <w:rFonts w:cs="Times New Roman"/>
-              <w:noProof/>
-              <w:lang w:val="en-US"/>
-            </w:rPr>
-          </w:pPr>
-          <w:r>
-            <w:rPr>
-              <w:rFonts w:cs="Times New Roman"/>
-              <w:noProof/>
-              <w:lang w:val="en-US"/>
-            </w:rPr>
-            <w:t xml:space="preserve">Cheng, C. C., Shih, S. T., Cheng, K. X., Kung, H. K., &amp; Wang, C. Y. (2017). Design of books inventory with RFID antenna in library management system. </w:t>
-          </w:r>
-          <w:r>
-            <w:rPr>
-              <w:rFonts w:cs="Times New Roman"/>
-              <w:i/>
-              <w:iCs/>
-              <w:noProof/>
-              <w:lang w:val="en-US"/>
-            </w:rPr>
-            <w:t>MATEC Web of Conferences</w:t>
-          </w:r>
-          <w:r>
-            <w:rPr>
-              <w:rFonts w:cs="Times New Roman"/>
-              <w:noProof/>
-              <w:lang w:val="en-US"/>
-            </w:rPr>
-            <w:t xml:space="preserve">, </w:t>
-          </w:r>
-          <w:r>
-            <w:rPr>
-              <w:rFonts w:cs="Times New Roman"/>
-              <w:i/>
-              <w:iCs/>
-              <w:noProof/>
-              <w:lang w:val="en-US"/>
-            </w:rPr>
-            <w:t>123</w:t>
-          </w:r>
-          <w:r>
-            <w:rPr>
-              <w:rFonts w:cs="Times New Roman"/>
-              <w:noProof/>
-              <w:lang w:val="en-US"/>
-            </w:rPr>
-            <w:t>. https://doi.org/10.1051/matecconf/201712300028</w:t>
-          </w:r>
-        </w:p>
+        <w:sdt>
+          <w:sdtPr>
+            <w:id w:val="-573587230"/>
+            <w:bibliography/>
+          </w:sdtPr>
+          <w:sdtContent>
+            <w:p>
+              <w:pPr>
+                <w:pStyle w:val="Bibliografa"/>
+                <w:ind w:left="720" w:hanging="720"/>
+                <w:rPr>
+                  <w:noProof/>
+                  <w:szCs w:val="24"/>
+                  <w:lang w:val="en-US"/>
+                </w:rPr>
+              </w:pPr>
+              <w:r>
+                <w:fldChar w:fldCharType="begin"/>
+              </w:r>
+              <w:r>
+                <w:rPr>
+                  <w:lang w:val="en-US"/>
+                </w:rPr>
+                <w:instrText>BIBLIOGRAPHY</w:instrText>
+              </w:r>
+              <w:r>
+                <w:fldChar w:fldCharType="separate"/>
+              </w:r>
+              <w:r>
+                <w:rPr>
+                  <w:noProof/>
+                  <w:lang w:val="en-US"/>
+                </w:rPr>
+                <w:t xml:space="preserve">Balanis, C. (2016). </w:t>
+              </w:r>
+              <w:r>
+                <w:rPr>
+                  <w:i/>
+                  <w:iCs/>
+                  <w:noProof/>
+                  <w:lang w:val="en-US"/>
+                </w:rPr>
+                <w:t>Antenna Theory</w:t>
+              </w:r>
+              <w:r>
+                <w:rPr>
+                  <w:noProof/>
+                  <w:lang w:val="en-US"/>
+                </w:rPr>
+                <w:t xml:space="preserve"> (4th ed.). Hoboken: John Wiley &amp; Sons.</w:t>
+              </w:r>
+            </w:p>
+            <w:p>
+              <w:pPr>
+                <w:rPr>
+                  <w:rFonts w:cs="Times New Roman"/>
+                  <w:noProof/>
+                  <w:lang w:val="en-US"/>
+                </w:rPr>
+              </w:pPr>
+              <w:r>
+                <w:rPr>
+                  <w:b/>
+                  <w:bCs/>
+                </w:rPr>
+                <w:fldChar w:fldCharType="end"/>
+              </w:r>
+              <w:r>
+                <w:rPr>
+                  <w:rFonts w:cs="Times New Roman"/>
+                  <w:noProof/>
+                  <w:lang w:val="en-US"/>
+                </w:rPr>
+                <w:t xml:space="preserve">Cheng, C. C., Shih, S. T., Cheng, K. X., Kung, H. K., &amp; Wang, C. Y. (2017). Design of books inventory with RFID antenna in library management system. </w:t>
+              </w:r>
+              <w:r>
+                <w:rPr>
+                  <w:rFonts w:cs="Times New Roman"/>
+                  <w:i/>
+                  <w:iCs/>
+                  <w:noProof/>
+                  <w:lang w:val="en-US"/>
+                </w:rPr>
+                <w:t>MATEC Web of Conferences</w:t>
+              </w:r>
+              <w:r>
+                <w:rPr>
+                  <w:rFonts w:cs="Times New Roman"/>
+                  <w:noProof/>
+                  <w:lang w:val="en-US"/>
+                </w:rPr>
+                <w:t xml:space="preserve">, </w:t>
+              </w:r>
+              <w:r>
+                <w:rPr>
+                  <w:rFonts w:cs="Times New Roman"/>
+                  <w:i/>
+                  <w:iCs/>
+                  <w:noProof/>
+                  <w:lang w:val="en-US"/>
+                </w:rPr>
+                <w:t>123</w:t>
+              </w:r>
+              <w:r>
+                <w:rPr>
+                  <w:rFonts w:cs="Times New Roman"/>
+                  <w:noProof/>
+                  <w:lang w:val="en-US"/>
+                </w:rPr>
+                <w:t>. https://doi.org/10.1051/matecconf/201712300028</w:t>
+              </w:r>
+            </w:p>
+          </w:sdtContent>
+        </w:sdt>
         <w:p>
           <w:pPr>
             <w:widowControl w:val="0"/>
@@ -7304,6 +8761,39 @@
               <w:lang w:val="en-US"/>
             </w:rPr>
             <w:t>(8), 105297. https://doi.org/10.1016/j.respol.2025.105297</w:t>
+          </w:r>
+        </w:p>
+        <w:p>
+          <w:pPr>
+            <w:pStyle w:val="Bibliografa"/>
+            <w:ind w:left="720" w:hanging="720"/>
+            <w:rPr>
+              <w:noProof/>
+              <w:lang w:val="en-US"/>
+            </w:rPr>
+          </w:pPr>
+          <w:r>
+            <w:rPr>
+              <w:noProof/>
+              <w:lang w:val="en-US"/>
+            </w:rPr>
+            <w:t xml:space="preserve">Finkenzeller, K. (2010). </w:t>
+          </w:r>
+          <w:r>
+            <w:rPr>
+              <w:i/>
+              <w:iCs/>
+              <w:noProof/>
+              <w:lang w:val="en-US"/>
+            </w:rPr>
+            <w:t>RFID Handbook.</w:t>
+          </w:r>
+          <w:r>
+            <w:rPr>
+              <w:noProof/>
+              <w:lang w:val="en-US"/>
+            </w:rPr>
+            <w:t xml:space="preserve"> Chinchester: John Wiley &amp; Sons.</w:t>
           </w:r>
         </w:p>
         <w:p>
@@ -7445,7 +8935,56 @@
               <w:noProof/>
               <w:lang w:val="en-US"/>
             </w:rPr>
-            <w:t>Krishnamo, P., &amp; Pack, M. (2025). RFID security mechanism of smart library combined with intelligent cognitive system. Icsssm. https://doi.org/10.2991/978-2-38476-533-1</w:t>
+            <w:t xml:space="preserve">Khair, N., Yusof, N. A., Ariff, M. H., Wahab, M. A., &amp; Bari, M. F. (2022). </w:t>
+          </w:r>
+          <w:r>
+            <w:rPr>
+              <w:rFonts w:cs="Times New Roman"/>
+              <w:i/>
+              <w:iCs/>
+              <w:noProof/>
+              <w:lang w:val="en-US"/>
+            </w:rPr>
+            <w:t>Recent advances and open challenges in RFID antenna applications.</w:t>
+          </w:r>
+          <w:r>
+            <w:rPr>
+              <w:rFonts w:cs="Times New Roman"/>
+              <w:noProof/>
+              <w:lang w:val="en-US"/>
+            </w:rPr>
+            <w:t xml:space="preserve"> International Journal of Advanced Computer Science and Applications, 13(5), 45–53.</w:t>
+          </w:r>
+        </w:p>
+        <w:p>
+          <w:pPr>
+            <w:widowControl w:val="0"/>
+            <w:autoSpaceDE w:val="0"/>
+            <w:autoSpaceDN w:val="0"/>
+            <w:adjustRightInd w:val="0"/>
+            <w:ind w:left="480" w:hanging="480"/>
+            <w:rPr>
+              <w:rFonts w:cs="Times New Roman"/>
+              <w:noProof/>
+              <w:lang w:val="en-US"/>
+            </w:rPr>
+          </w:pPr>
+          <w:r>
+            <w:rPr>
+              <w:rFonts w:cs="Times New Roman"/>
+              <w:noProof/>
+              <w:lang w:val="en-US"/>
+            </w:rPr>
+            <w:t xml:space="preserve">Krishnamo, P., &amp; Pack, M. (2025). RFID security mechanism of smart library combined with </w:t>
+          </w:r>
+          <w:r>
+            <w:rPr>
+              <w:rFonts w:cs="Times New Roman"/>
+              <w:noProof/>
+              <w:lang w:val="en-US"/>
+            </w:rPr>
+            <w:lastRenderedPageBreak/>
+            <w:t>intelligent cognitive system. Icsssm. https://doi.org/10.2991/978-2-38476-533-1</w:t>
           </w:r>
         </w:p>
         <w:p>
@@ -7507,7 +9046,6 @@
               <w:noProof/>
               <w:lang w:val="en-US"/>
             </w:rPr>
-            <w:lastRenderedPageBreak/>
             <w:t xml:space="preserve">Lucas, M., &amp; Ibrahim, Z. (2025). Investigating Ineffectiveness of Electronic Security Systems in Safeguarding Library Materials at Mzumbe University Library. </w:t>
           </w:r>
           <w:r>
@@ -7934,6 +9472,39 @@
         </w:p>
         <w:p>
           <w:pPr>
+            <w:pStyle w:val="Bibliografa"/>
+            <w:ind w:left="720" w:hanging="720"/>
+            <w:rPr>
+              <w:noProof/>
+              <w:lang w:val="en-US"/>
+            </w:rPr>
+          </w:pPr>
+          <w:r>
+            <w:rPr>
+              <w:noProof/>
+              <w:lang w:val="en-US"/>
+            </w:rPr>
+            <w:t xml:space="preserve">Pozar, D. (2012). </w:t>
+          </w:r>
+          <w:r>
+            <w:rPr>
+              <w:i/>
+              <w:iCs/>
+              <w:noProof/>
+              <w:lang w:val="en-US"/>
+            </w:rPr>
+            <w:t>Microwave Engineering</w:t>
+          </w:r>
+          <w:r>
+            <w:rPr>
+              <w:noProof/>
+              <w:lang w:val="en-US"/>
+            </w:rPr>
+            <w:t xml:space="preserve"> (4th ed.). Hoboken: John Wiley &amp; Sons.</w:t>
+          </w:r>
+        </w:p>
+        <w:p>
+          <w:pPr>
             <w:widowControl w:val="0"/>
             <w:autoSpaceDE w:val="0"/>
             <w:autoSpaceDN w:val="0"/>
@@ -7950,6 +9521,7 @@
               <w:rFonts w:cs="Times New Roman"/>
               <w:noProof/>
             </w:rPr>
+            <w:lastRenderedPageBreak/>
             <w:t xml:space="preserve">Putra, I. G. S. E., &amp; Labasariyani, N. L. P. (2022). </w:t>
           </w:r>
           <w:r>
@@ -7996,6 +9568,57 @@
             </w:rPr>
             <w:t>(1), 110–119. https://doi.org/10.30574/gjeta.2022.12.1.0115</w:t>
           </w:r>
+        </w:p>
+        <w:p>
+          <w:pPr>
+            <w:pStyle w:val="Bibliografa"/>
+            <w:ind w:left="720" w:hanging="720"/>
+            <w:rPr>
+              <w:noProof/>
+              <w:lang w:val="en-US"/>
+            </w:rPr>
+          </w:pPr>
+          <w:r>
+            <w:rPr>
+              <w:noProof/>
+            </w:rPr>
+            <w:t xml:space="preserve">Sadiku, M. (2003). </w:t>
+          </w:r>
+          <w:r>
+            <w:rPr>
+              <w:i/>
+              <w:iCs/>
+              <w:noProof/>
+            </w:rPr>
+            <w:t>Elementos de electromagnetismo</w:t>
+          </w:r>
+          <w:r>
+            <w:rPr>
+              <w:noProof/>
+            </w:rPr>
+            <w:t xml:space="preserve"> (3rd ed.). </w:t>
+          </w:r>
+          <w:r>
+            <w:rPr>
+              <w:noProof/>
+              <w:lang w:val="en-US"/>
+            </w:rPr>
+            <w:t>México D. F.: Oxford University Press.</w:t>
+          </w:r>
+        </w:p>
+        <w:p>
+          <w:pPr>
+            <w:widowControl w:val="0"/>
+            <w:autoSpaceDE w:val="0"/>
+            <w:autoSpaceDN w:val="0"/>
+            <w:adjustRightInd w:val="0"/>
+            <w:ind w:left="480" w:hanging="480"/>
+            <w:rPr>
+              <w:rFonts w:cs="Times New Roman"/>
+              <w:noProof/>
+              <w:lang w:val="en-US"/>
+            </w:rPr>
+          </w:pPr>
         </w:p>
         <w:p>
           <w:pPr>
@@ -8052,16 +9675,7 @@
               <w:noProof/>
               <w:lang w:val="en-US"/>
             </w:rPr>
-            <w:t xml:space="preserve">(6), 2321–9467. </w:t>
-          </w:r>
-          <w:r>
-            <w:rPr>
-              <w:rFonts w:cs="Times New Roman"/>
-              <w:noProof/>
-              <w:lang w:val="en-US"/>
-            </w:rPr>
-            <w:lastRenderedPageBreak/>
-            <w:t>https://doi.org/10.6025/ijis/2022/14/2/39-54</w:t>
+            <w:t>(6), 2321–9467. https://doi.org/10.6025/ijis/2022/14/2/39-54</w:t>
           </w:r>
         </w:p>
         <w:p>
@@ -8393,6 +10007,7 @@
             <w:t>(2), 21–35. https://doi.org/10.47604/ijts.2041</w:t>
           </w:r>
         </w:p>
+        <w:p/>
         <w:p>
           <w:pPr>
             <w:widowControl w:val="0"/>
@@ -8406,32 +10021,6 @@
               <w:lang w:val="en-US"/>
             </w:rPr>
           </w:pPr>
-          <w:r>
-            <w:rPr>
-              <w:rFonts w:cs="Times New Roman"/>
-              <w:noProof/>
-              <w:lang w:val="en-US"/>
-            </w:rPr>
-            <w:t xml:space="preserve">Khair, N., Yusof, N. A., Ariff, M. H., Wahab, M. A., &amp; Bari, M. F. (2022). </w:t>
-          </w:r>
-          <w:r>
-            <w:rPr>
-              <w:rFonts w:cs="Times New Roman"/>
-              <w:i/>
-              <w:iCs/>
-              <w:noProof/>
-              <w:lang w:val="en-US"/>
-            </w:rPr>
-            <w:t>Recent advances and open challenges in RFID antenna applications.</w:t>
-          </w:r>
-          <w:r>
-            <w:rPr>
-              <w:rFonts w:cs="Times New Roman"/>
-              <w:noProof/>
-              <w:lang w:val="en-US"/>
-            </w:rPr>
-            <w:t xml:space="preserve"> International Journal of Advanced Computer Science and Applications, 13(5), 45–53.</w:t>
-          </w:r>
         </w:p>
         <w:p>
           <w:pPr>
@@ -8497,15 +10086,15 @@
           <w:b/>
         </w:rPr>
       </w:pPr>
-      <w:bookmarkStart w:id="40" w:name="_Toc440985144"/>
-      <w:commentRangeStart w:id="41"/>
+      <w:bookmarkStart w:id="39" w:name="_Toc440985144"/>
+      <w:commentRangeStart w:id="40"/>
       <w:r>
         <w:rPr>
           <w:b/>
         </w:rPr>
         <w:t>A</w:t>
       </w:r>
-      <w:commentRangeEnd w:id="41"/>
+      <w:commentRangeEnd w:id="40"/>
       <w:r>
         <w:rPr>
           <w:rStyle w:val="Refdecomentario"/>
@@ -8513,7 +10102,7 @@
           <w:sz w:val="24"/>
           <w:szCs w:val="22"/>
         </w:rPr>
-        <w:commentReference w:id="41"/>
+        <w:commentReference w:id="40"/>
       </w:r>
       <w:r>
         <w:rPr>
@@ -8521,7 +10110,7 @@
         </w:rPr>
         <w:t>nexos</w:t>
       </w:r>
-      <w:bookmarkEnd w:id="40"/>
+      <w:bookmarkEnd w:id="39"/>
     </w:p>
     <w:p>
       <w:pPr>
@@ -8629,24 +10218,6 @@
     </w:p>
     <w:p>
       <w:pPr>
-        <w:jc w:val="left"/>
-        <w:rPr>
-          <w:rFonts w:cs="Times New Roman"/>
-          <w:b/>
-          <w:szCs w:val="24"/>
-        </w:rPr>
-      </w:pPr>
-      <w:r>
-        <w:rPr>
-          <w:rFonts w:cs="Times New Roman"/>
-          <w:b/>
-          <w:szCs w:val="24"/>
-        </w:rPr>
-        <w:t>Insertar salto de página</w:t>
-      </w:r>
-    </w:p>
-    <w:p>
-      <w:pPr>
         <w:ind w:firstLine="708"/>
         <w:jc w:val="center"/>
         <w:rPr>
@@ -8654,86 +10225,6 @@
           <w:szCs w:val="24"/>
         </w:rPr>
       </w:pPr>
-    </w:p>
-    <w:p>
-      <w:pPr>
-        <w:ind w:firstLine="708"/>
-        <w:rPr>
-          <w:rFonts w:cs="Times New Roman"/>
-        </w:rPr>
-      </w:pPr>
-      <w:r>
-        <w:rPr>
-          <w:rFonts w:cs="Times New Roman"/>
-        </w:rPr>
-        <w:t>Existe una sencilla función llamada “Salto de página” que ahorra tiempo en la estructura del texto, cuando se requiere iniciar en una nueva página en blanco, sin necesidad de insertar “Enter” una y otra vez en cada línea: Insertar &gt; Salto de página. Su método abreviado con el teclado es: Ctrl + Enter.</w:t>
-      </w:r>
-    </w:p>
-    <w:p>
-      <w:pPr>
-        <w:ind w:firstLine="708"/>
-        <w:jc w:val="center"/>
-        <w:rPr>
-          <w:rFonts w:cs="Times New Roman"/>
-          <w:szCs w:val="24"/>
-        </w:rPr>
-      </w:pPr>
-      <w:r>
-        <w:rPr>
-          <w:noProof/>
-          <w:lang w:eastAsia="es-CO"/>
-        </w:rPr>
-        <w:lastRenderedPageBreak/>
-        <w:drawing>
-          <wp:inline distT="0" distB="0" distL="0" distR="0" wp14:anchorId="6A379D7A" wp14:editId="72A13BF1">
-            <wp:extent cx="2252777" cy="1173461"/>
-            <wp:effectExtent l="190500" t="190500" r="186055" b="198755"/>
-            <wp:docPr id="13" name="Imagen 13"/>
-            <wp:cNvGraphicFramePr>
-              <a:graphicFrameLocks xmlns:a="http://schemas.openxmlformats.org/drawingml/2006/main" noChangeAspect="1"/>
-            </wp:cNvGraphicFramePr>
-            <a:graphic xmlns:a="http://schemas.openxmlformats.org/drawingml/2006/main">
-              <a:graphicData uri="http://schemas.openxmlformats.org/drawingml/2006/picture">
-                <pic:pic xmlns:pic="http://schemas.openxmlformats.org/drawingml/2006/picture">
-                  <pic:nvPicPr>
-                    <pic:cNvPr id="1" name=""/>
-                    <pic:cNvPicPr/>
-                  </pic:nvPicPr>
-                  <pic:blipFill rotWithShape="1">
-                    <a:blip r:embed="rId18"/>
-                    <a:srcRect t="7485" r="87109" b="80576"/>
-                    <a:stretch/>
-                  </pic:blipFill>
-                  <pic:spPr bwMode="auto">
-                    <a:xfrm>
-                      <a:off x="0" y="0"/>
-                      <a:ext cx="2333795" cy="1215663"/>
-                    </a:xfrm>
-                    <a:prstGeom prst="rect">
-                      <a:avLst/>
-                    </a:prstGeom>
-                    <a:ln>
-                      <a:noFill/>
-                    </a:ln>
-                    <a:effectLst>
-                      <a:outerShdw blurRad="190500" algn="tl" rotWithShape="0">
-                        <a:srgbClr val="000000">
-                          <a:alpha val="70000"/>
-                        </a:srgbClr>
-                      </a:outerShdw>
-                    </a:effectLst>
-                    <a:extLst>
-                      <a:ext uri="{53640926-AAD7-44D8-BBD7-CCE9431645EC}">
-                        <a14:shadowObscured xmlns:a14="http://schemas.microsoft.com/office/drawing/2010/main"/>
-                      </a:ext>
-                    </a:extLst>
-                  </pic:spPr>
-                </pic:pic>
-              </a:graphicData>
-            </a:graphic>
-          </wp:inline>
-        </w:drawing>
-      </w:r>
     </w:p>
     <w:sectPr>
       <w:type w:val="continuous"/>
@@ -9626,58 +11117,7 @@
       </w:r>
     </w:p>
   </w:comment>
-  <w:comment w:id="39" w:author="Autor" w:initials="A">
-    <w:p>
-      <w:pPr>
-        <w:pStyle w:val="Textocomentario"/>
-      </w:pPr>
-      <w:r>
-        <w:rPr>
-          <w:rStyle w:val="Refdecomentario"/>
-        </w:rPr>
-        <w:annotationRef/>
-      </w:r>
-      <w:r>
-        <w:rPr>
-          <w:rFonts w:cs="Times New Roman"/>
-        </w:rPr>
-        <w:t>Lista alfabética de fuentes consultadas.</w:t>
-      </w:r>
-      <w:r>
-        <w:t xml:space="preserve"> </w:t>
-      </w:r>
-      <w:r>
-        <w:rPr>
-          <w:rFonts w:cs="Times New Roman"/>
-        </w:rPr>
-        <w:t>Todas, sin excepción, deben estar citadas dentro del texto</w:t>
-      </w:r>
-      <w:r>
-        <w:rPr>
-          <w:rFonts w:cs="Times New Roman"/>
-        </w:rPr>
-        <w:t xml:space="preserve"> al menos una vez</w:t>
-      </w:r>
-      <w:r>
-        <w:rPr>
-          <w:rFonts w:cs="Times New Roman"/>
-        </w:rPr>
-        <w:t xml:space="preserve">. </w:t>
-      </w:r>
-      <w:r>
-        <w:rPr>
-          <w:rFonts w:cs="Times New Roman"/>
-        </w:rPr>
-        <w:t>Se debe conservar la estructura de citación según las normas APA.</w:t>
-      </w:r>
-    </w:p>
-    <w:p>
-      <w:pPr>
-        <w:pStyle w:val="Textocomentario"/>
-      </w:pPr>
-    </w:p>
-  </w:comment>
-  <w:comment w:id="41" w:author="Autor" w:initials="A">
+  <w:comment w:id="40" w:author="Autor" w:initials="A">
     <w:p>
       <w:pPr>
         <w:pStyle w:val="Textocomentario"/>
@@ -9765,7 +11205,6 @@
   <w15:commentEx w15:paraId="33EB55E0" w15:done="0"/>
   <w15:commentEx w15:paraId="278B3905" w15:done="0"/>
   <w15:commentEx w15:paraId="054A37B0" w15:done="0"/>
-  <w15:commentEx w15:paraId="07FA2090" w15:done="0"/>
   <w15:commentEx w15:paraId="12DDE124" w15:done="0"/>
 </w15:commentsEx>
 </file>
@@ -9788,7 +11227,6 @@
   <w16cid:commentId w16cid:paraId="33EB55E0" w16cid:durableId="2B4B62E1"/>
   <w16cid:commentId w16cid:paraId="278B3905" w16cid:durableId="2B4B6F67"/>
   <w16cid:commentId w16cid:paraId="054A37B0" w16cid:durableId="2B4B6F7C"/>
-  <w16cid:commentId w16cid:paraId="07FA2090" w16cid:durableId="2B546375"/>
   <w16cid:commentId w16cid:paraId="12DDE124" w16cid:durableId="2B548902"/>
 </w16cid:commentsIds>
 </file>
@@ -10992,6 +12430,304 @@
     </w:lvl>
   </w:abstractNum>
   <w:abstractNum w:abstractNumId="9" w15:restartNumberingAfterBreak="0">
+    <w:nsid w:val="2FBC7893"/>
+    <w:multiLevelType w:val="multilevel"/>
+    <w:tmpl w:val="CDB2BACA"/>
+    <w:lvl w:ilvl="0">
+      <w:start w:val="1"/>
+      <w:numFmt w:val="bullet"/>
+      <w:lvlText w:val=""/>
+      <w:lvlJc w:val="left"/>
+      <w:pPr>
+        <w:tabs>
+          <w:tab w:val="num" w:pos="720"/>
+        </w:tabs>
+        <w:ind w:left="720" w:hanging="360"/>
+      </w:pPr>
+      <w:rPr>
+        <w:rFonts w:ascii="Symbol" w:hAnsi="Symbol" w:hint="default"/>
+        <w:sz w:val="20"/>
+      </w:rPr>
+    </w:lvl>
+    <w:lvl w:ilvl="1" w:tentative="1">
+      <w:start w:val="1"/>
+      <w:numFmt w:val="bullet"/>
+      <w:lvlText w:val="o"/>
+      <w:lvlJc w:val="left"/>
+      <w:pPr>
+        <w:tabs>
+          <w:tab w:val="num" w:pos="1440"/>
+        </w:tabs>
+        <w:ind w:left="1440" w:hanging="360"/>
+      </w:pPr>
+      <w:rPr>
+        <w:rFonts w:ascii="Courier New" w:hAnsi="Courier New" w:hint="default"/>
+        <w:sz w:val="20"/>
+      </w:rPr>
+    </w:lvl>
+    <w:lvl w:ilvl="2" w:tentative="1">
+      <w:start w:val="1"/>
+      <w:numFmt w:val="bullet"/>
+      <w:lvlText w:val=""/>
+      <w:lvlJc w:val="left"/>
+      <w:pPr>
+        <w:tabs>
+          <w:tab w:val="num" w:pos="2160"/>
+        </w:tabs>
+        <w:ind w:left="2160" w:hanging="360"/>
+      </w:pPr>
+      <w:rPr>
+        <w:rFonts w:ascii="Wingdings" w:hAnsi="Wingdings" w:hint="default"/>
+        <w:sz w:val="20"/>
+      </w:rPr>
+    </w:lvl>
+    <w:lvl w:ilvl="3" w:tentative="1">
+      <w:start w:val="1"/>
+      <w:numFmt w:val="bullet"/>
+      <w:lvlText w:val=""/>
+      <w:lvlJc w:val="left"/>
+      <w:pPr>
+        <w:tabs>
+          <w:tab w:val="num" w:pos="2880"/>
+        </w:tabs>
+        <w:ind w:left="2880" w:hanging="360"/>
+      </w:pPr>
+      <w:rPr>
+        <w:rFonts w:ascii="Wingdings" w:hAnsi="Wingdings" w:hint="default"/>
+        <w:sz w:val="20"/>
+      </w:rPr>
+    </w:lvl>
+    <w:lvl w:ilvl="4" w:tentative="1">
+      <w:start w:val="1"/>
+      <w:numFmt w:val="bullet"/>
+      <w:lvlText w:val=""/>
+      <w:lvlJc w:val="left"/>
+      <w:pPr>
+        <w:tabs>
+          <w:tab w:val="num" w:pos="3600"/>
+        </w:tabs>
+        <w:ind w:left="3600" w:hanging="360"/>
+      </w:pPr>
+      <w:rPr>
+        <w:rFonts w:ascii="Wingdings" w:hAnsi="Wingdings" w:hint="default"/>
+        <w:sz w:val="20"/>
+      </w:rPr>
+    </w:lvl>
+    <w:lvl w:ilvl="5" w:tentative="1">
+      <w:start w:val="1"/>
+      <w:numFmt w:val="bullet"/>
+      <w:lvlText w:val=""/>
+      <w:lvlJc w:val="left"/>
+      <w:pPr>
+        <w:tabs>
+          <w:tab w:val="num" w:pos="4320"/>
+        </w:tabs>
+        <w:ind w:left="4320" w:hanging="360"/>
+      </w:pPr>
+      <w:rPr>
+        <w:rFonts w:ascii="Wingdings" w:hAnsi="Wingdings" w:hint="default"/>
+        <w:sz w:val="20"/>
+      </w:rPr>
+    </w:lvl>
+    <w:lvl w:ilvl="6" w:tentative="1">
+      <w:start w:val="1"/>
+      <w:numFmt w:val="bullet"/>
+      <w:lvlText w:val=""/>
+      <w:lvlJc w:val="left"/>
+      <w:pPr>
+        <w:tabs>
+          <w:tab w:val="num" w:pos="5040"/>
+        </w:tabs>
+        <w:ind w:left="5040" w:hanging="360"/>
+      </w:pPr>
+      <w:rPr>
+        <w:rFonts w:ascii="Wingdings" w:hAnsi="Wingdings" w:hint="default"/>
+        <w:sz w:val="20"/>
+      </w:rPr>
+    </w:lvl>
+    <w:lvl w:ilvl="7" w:tentative="1">
+      <w:start w:val="1"/>
+      <w:numFmt w:val="bullet"/>
+      <w:lvlText w:val=""/>
+      <w:lvlJc w:val="left"/>
+      <w:pPr>
+        <w:tabs>
+          <w:tab w:val="num" w:pos="5760"/>
+        </w:tabs>
+        <w:ind w:left="5760" w:hanging="360"/>
+      </w:pPr>
+      <w:rPr>
+        <w:rFonts w:ascii="Wingdings" w:hAnsi="Wingdings" w:hint="default"/>
+        <w:sz w:val="20"/>
+      </w:rPr>
+    </w:lvl>
+    <w:lvl w:ilvl="8" w:tentative="1">
+      <w:start w:val="1"/>
+      <w:numFmt w:val="bullet"/>
+      <w:lvlText w:val=""/>
+      <w:lvlJc w:val="left"/>
+      <w:pPr>
+        <w:tabs>
+          <w:tab w:val="num" w:pos="6480"/>
+        </w:tabs>
+        <w:ind w:left="6480" w:hanging="360"/>
+      </w:pPr>
+      <w:rPr>
+        <w:rFonts w:ascii="Wingdings" w:hAnsi="Wingdings" w:hint="default"/>
+        <w:sz w:val="20"/>
+      </w:rPr>
+    </w:lvl>
+  </w:abstractNum>
+  <w:abstractNum w:abstractNumId="10" w15:restartNumberingAfterBreak="0">
+    <w:nsid w:val="321175AB"/>
+    <w:multiLevelType w:val="multilevel"/>
+    <w:tmpl w:val="E27891E6"/>
+    <w:lvl w:ilvl="0">
+      <w:start w:val="1"/>
+      <w:numFmt w:val="bullet"/>
+      <w:lvlText w:val=""/>
+      <w:lvlJc w:val="left"/>
+      <w:pPr>
+        <w:tabs>
+          <w:tab w:val="num" w:pos="720"/>
+        </w:tabs>
+        <w:ind w:left="720" w:hanging="360"/>
+      </w:pPr>
+      <w:rPr>
+        <w:rFonts w:ascii="Symbol" w:hAnsi="Symbol" w:hint="default"/>
+        <w:sz w:val="20"/>
+      </w:rPr>
+    </w:lvl>
+    <w:lvl w:ilvl="1" w:tentative="1">
+      <w:start w:val="1"/>
+      <w:numFmt w:val="bullet"/>
+      <w:lvlText w:val="o"/>
+      <w:lvlJc w:val="left"/>
+      <w:pPr>
+        <w:tabs>
+          <w:tab w:val="num" w:pos="1440"/>
+        </w:tabs>
+        <w:ind w:left="1440" w:hanging="360"/>
+      </w:pPr>
+      <w:rPr>
+        <w:rFonts w:ascii="Courier New" w:hAnsi="Courier New" w:hint="default"/>
+        <w:sz w:val="20"/>
+      </w:rPr>
+    </w:lvl>
+    <w:lvl w:ilvl="2" w:tentative="1">
+      <w:start w:val="1"/>
+      <w:numFmt w:val="bullet"/>
+      <w:lvlText w:val=""/>
+      <w:lvlJc w:val="left"/>
+      <w:pPr>
+        <w:tabs>
+          <w:tab w:val="num" w:pos="2160"/>
+        </w:tabs>
+        <w:ind w:left="2160" w:hanging="360"/>
+      </w:pPr>
+      <w:rPr>
+        <w:rFonts w:ascii="Wingdings" w:hAnsi="Wingdings" w:hint="default"/>
+        <w:sz w:val="20"/>
+      </w:rPr>
+    </w:lvl>
+    <w:lvl w:ilvl="3" w:tentative="1">
+      <w:start w:val="1"/>
+      <w:numFmt w:val="bullet"/>
+      <w:lvlText w:val=""/>
+      <w:lvlJc w:val="left"/>
+      <w:pPr>
+        <w:tabs>
+          <w:tab w:val="num" w:pos="2880"/>
+        </w:tabs>
+        <w:ind w:left="2880" w:hanging="360"/>
+      </w:pPr>
+      <w:rPr>
+        <w:rFonts w:ascii="Wingdings" w:hAnsi="Wingdings" w:hint="default"/>
+        <w:sz w:val="20"/>
+      </w:rPr>
+    </w:lvl>
+    <w:lvl w:ilvl="4" w:tentative="1">
+      <w:start w:val="1"/>
+      <w:numFmt w:val="bullet"/>
+      <w:lvlText w:val=""/>
+      <w:lvlJc w:val="left"/>
+      <w:pPr>
+        <w:tabs>
+          <w:tab w:val="num" w:pos="3600"/>
+        </w:tabs>
+        <w:ind w:left="3600" w:hanging="360"/>
+      </w:pPr>
+      <w:rPr>
+        <w:rFonts w:ascii="Wingdings" w:hAnsi="Wingdings" w:hint="default"/>
+        <w:sz w:val="20"/>
+      </w:rPr>
+    </w:lvl>
+    <w:lvl w:ilvl="5" w:tentative="1">
+      <w:start w:val="1"/>
+      <w:numFmt w:val="bullet"/>
+      <w:lvlText w:val=""/>
+      <w:lvlJc w:val="left"/>
+      <w:pPr>
+        <w:tabs>
+          <w:tab w:val="num" w:pos="4320"/>
+        </w:tabs>
+        <w:ind w:left="4320" w:hanging="360"/>
+      </w:pPr>
+      <w:rPr>
+        <w:rFonts w:ascii="Wingdings" w:hAnsi="Wingdings" w:hint="default"/>
+        <w:sz w:val="20"/>
+      </w:rPr>
+    </w:lvl>
+    <w:lvl w:ilvl="6" w:tentative="1">
+      <w:start w:val="1"/>
+      <w:numFmt w:val="bullet"/>
+      <w:lvlText w:val=""/>
+      <w:lvlJc w:val="left"/>
+      <w:pPr>
+        <w:tabs>
+          <w:tab w:val="num" w:pos="5040"/>
+        </w:tabs>
+        <w:ind w:left="5040" w:hanging="360"/>
+      </w:pPr>
+      <w:rPr>
+        <w:rFonts w:ascii="Wingdings" w:hAnsi="Wingdings" w:hint="default"/>
+        <w:sz w:val="20"/>
+      </w:rPr>
+    </w:lvl>
+    <w:lvl w:ilvl="7" w:tentative="1">
+      <w:start w:val="1"/>
+      <w:numFmt w:val="bullet"/>
+      <w:lvlText w:val=""/>
+      <w:lvlJc w:val="left"/>
+      <w:pPr>
+        <w:tabs>
+          <w:tab w:val="num" w:pos="5760"/>
+        </w:tabs>
+        <w:ind w:left="5760" w:hanging="360"/>
+      </w:pPr>
+      <w:rPr>
+        <w:rFonts w:ascii="Wingdings" w:hAnsi="Wingdings" w:hint="default"/>
+        <w:sz w:val="20"/>
+      </w:rPr>
+    </w:lvl>
+    <w:lvl w:ilvl="8" w:tentative="1">
+      <w:start w:val="1"/>
+      <w:numFmt w:val="bullet"/>
+      <w:lvlText w:val=""/>
+      <w:lvlJc w:val="left"/>
+      <w:pPr>
+        <w:tabs>
+          <w:tab w:val="num" w:pos="6480"/>
+        </w:tabs>
+        <w:ind w:left="6480" w:hanging="360"/>
+      </w:pPr>
+      <w:rPr>
+        <w:rFonts w:ascii="Wingdings" w:hAnsi="Wingdings" w:hint="default"/>
+        <w:sz w:val="20"/>
+      </w:rPr>
+    </w:lvl>
+  </w:abstractNum>
+  <w:abstractNum w:abstractNumId="11" w15:restartNumberingAfterBreak="0">
     <w:nsid w:val="32A470A9"/>
     <w:multiLevelType w:val="hybridMultilevel"/>
     <w:tmpl w:val="C21E8F0C"/>
@@ -11105,7 +12841,305 @@
       </w:rPr>
     </w:lvl>
   </w:abstractNum>
-  <w:abstractNum w:abstractNumId="10" w15:restartNumberingAfterBreak="0">
+  <w:abstractNum w:abstractNumId="12" w15:restartNumberingAfterBreak="0">
+    <w:nsid w:val="339D458C"/>
+    <w:multiLevelType w:val="multilevel"/>
+    <w:tmpl w:val="C3A2A928"/>
+    <w:lvl w:ilvl="0">
+      <w:start w:val="1"/>
+      <w:numFmt w:val="bullet"/>
+      <w:lvlText w:val=""/>
+      <w:lvlJc w:val="left"/>
+      <w:pPr>
+        <w:tabs>
+          <w:tab w:val="num" w:pos="720"/>
+        </w:tabs>
+        <w:ind w:left="720" w:hanging="360"/>
+      </w:pPr>
+      <w:rPr>
+        <w:rFonts w:ascii="Symbol" w:hAnsi="Symbol" w:hint="default"/>
+        <w:sz w:val="20"/>
+      </w:rPr>
+    </w:lvl>
+    <w:lvl w:ilvl="1" w:tentative="1">
+      <w:start w:val="1"/>
+      <w:numFmt w:val="bullet"/>
+      <w:lvlText w:val="o"/>
+      <w:lvlJc w:val="left"/>
+      <w:pPr>
+        <w:tabs>
+          <w:tab w:val="num" w:pos="1440"/>
+        </w:tabs>
+        <w:ind w:left="1440" w:hanging="360"/>
+      </w:pPr>
+      <w:rPr>
+        <w:rFonts w:ascii="Courier New" w:hAnsi="Courier New" w:hint="default"/>
+        <w:sz w:val="20"/>
+      </w:rPr>
+    </w:lvl>
+    <w:lvl w:ilvl="2" w:tentative="1">
+      <w:start w:val="1"/>
+      <w:numFmt w:val="bullet"/>
+      <w:lvlText w:val=""/>
+      <w:lvlJc w:val="left"/>
+      <w:pPr>
+        <w:tabs>
+          <w:tab w:val="num" w:pos="2160"/>
+        </w:tabs>
+        <w:ind w:left="2160" w:hanging="360"/>
+      </w:pPr>
+      <w:rPr>
+        <w:rFonts w:ascii="Wingdings" w:hAnsi="Wingdings" w:hint="default"/>
+        <w:sz w:val="20"/>
+      </w:rPr>
+    </w:lvl>
+    <w:lvl w:ilvl="3" w:tentative="1">
+      <w:start w:val="1"/>
+      <w:numFmt w:val="bullet"/>
+      <w:lvlText w:val=""/>
+      <w:lvlJc w:val="left"/>
+      <w:pPr>
+        <w:tabs>
+          <w:tab w:val="num" w:pos="2880"/>
+        </w:tabs>
+        <w:ind w:left="2880" w:hanging="360"/>
+      </w:pPr>
+      <w:rPr>
+        <w:rFonts w:ascii="Wingdings" w:hAnsi="Wingdings" w:hint="default"/>
+        <w:sz w:val="20"/>
+      </w:rPr>
+    </w:lvl>
+    <w:lvl w:ilvl="4" w:tentative="1">
+      <w:start w:val="1"/>
+      <w:numFmt w:val="bullet"/>
+      <w:lvlText w:val=""/>
+      <w:lvlJc w:val="left"/>
+      <w:pPr>
+        <w:tabs>
+          <w:tab w:val="num" w:pos="3600"/>
+        </w:tabs>
+        <w:ind w:left="3600" w:hanging="360"/>
+      </w:pPr>
+      <w:rPr>
+        <w:rFonts w:ascii="Wingdings" w:hAnsi="Wingdings" w:hint="default"/>
+        <w:sz w:val="20"/>
+      </w:rPr>
+    </w:lvl>
+    <w:lvl w:ilvl="5" w:tentative="1">
+      <w:start w:val="1"/>
+      <w:numFmt w:val="bullet"/>
+      <w:lvlText w:val=""/>
+      <w:lvlJc w:val="left"/>
+      <w:pPr>
+        <w:tabs>
+          <w:tab w:val="num" w:pos="4320"/>
+        </w:tabs>
+        <w:ind w:left="4320" w:hanging="360"/>
+      </w:pPr>
+      <w:rPr>
+        <w:rFonts w:ascii="Wingdings" w:hAnsi="Wingdings" w:hint="default"/>
+        <w:sz w:val="20"/>
+      </w:rPr>
+    </w:lvl>
+    <w:lvl w:ilvl="6" w:tentative="1">
+      <w:start w:val="1"/>
+      <w:numFmt w:val="bullet"/>
+      <w:lvlText w:val=""/>
+      <w:lvlJc w:val="left"/>
+      <w:pPr>
+        <w:tabs>
+          <w:tab w:val="num" w:pos="5040"/>
+        </w:tabs>
+        <w:ind w:left="5040" w:hanging="360"/>
+      </w:pPr>
+      <w:rPr>
+        <w:rFonts w:ascii="Wingdings" w:hAnsi="Wingdings" w:hint="default"/>
+        <w:sz w:val="20"/>
+      </w:rPr>
+    </w:lvl>
+    <w:lvl w:ilvl="7" w:tentative="1">
+      <w:start w:val="1"/>
+      <w:numFmt w:val="bullet"/>
+      <w:lvlText w:val=""/>
+      <w:lvlJc w:val="left"/>
+      <w:pPr>
+        <w:tabs>
+          <w:tab w:val="num" w:pos="5760"/>
+        </w:tabs>
+        <w:ind w:left="5760" w:hanging="360"/>
+      </w:pPr>
+      <w:rPr>
+        <w:rFonts w:ascii="Wingdings" w:hAnsi="Wingdings" w:hint="default"/>
+        <w:sz w:val="20"/>
+      </w:rPr>
+    </w:lvl>
+    <w:lvl w:ilvl="8" w:tentative="1">
+      <w:start w:val="1"/>
+      <w:numFmt w:val="bullet"/>
+      <w:lvlText w:val=""/>
+      <w:lvlJc w:val="left"/>
+      <w:pPr>
+        <w:tabs>
+          <w:tab w:val="num" w:pos="6480"/>
+        </w:tabs>
+        <w:ind w:left="6480" w:hanging="360"/>
+      </w:pPr>
+      <w:rPr>
+        <w:rFonts w:ascii="Wingdings" w:hAnsi="Wingdings" w:hint="default"/>
+        <w:sz w:val="20"/>
+      </w:rPr>
+    </w:lvl>
+  </w:abstractNum>
+  <w:abstractNum w:abstractNumId="13" w15:restartNumberingAfterBreak="0">
+    <w:nsid w:val="33E81AD1"/>
+    <w:multiLevelType w:val="multilevel"/>
+    <w:tmpl w:val="0F2A0C5C"/>
+    <w:lvl w:ilvl="0">
+      <w:start w:val="1"/>
+      <w:numFmt w:val="bullet"/>
+      <w:lvlText w:val=""/>
+      <w:lvlJc w:val="left"/>
+      <w:pPr>
+        <w:tabs>
+          <w:tab w:val="num" w:pos="720"/>
+        </w:tabs>
+        <w:ind w:left="720" w:hanging="360"/>
+      </w:pPr>
+      <w:rPr>
+        <w:rFonts w:ascii="Symbol" w:hAnsi="Symbol" w:hint="default"/>
+        <w:sz w:val="20"/>
+      </w:rPr>
+    </w:lvl>
+    <w:lvl w:ilvl="1" w:tentative="1">
+      <w:start w:val="1"/>
+      <w:numFmt w:val="bullet"/>
+      <w:lvlText w:val="o"/>
+      <w:lvlJc w:val="left"/>
+      <w:pPr>
+        <w:tabs>
+          <w:tab w:val="num" w:pos="1440"/>
+        </w:tabs>
+        <w:ind w:left="1440" w:hanging="360"/>
+      </w:pPr>
+      <w:rPr>
+        <w:rFonts w:ascii="Courier New" w:hAnsi="Courier New" w:hint="default"/>
+        <w:sz w:val="20"/>
+      </w:rPr>
+    </w:lvl>
+    <w:lvl w:ilvl="2" w:tentative="1">
+      <w:start w:val="1"/>
+      <w:numFmt w:val="bullet"/>
+      <w:lvlText w:val=""/>
+      <w:lvlJc w:val="left"/>
+      <w:pPr>
+        <w:tabs>
+          <w:tab w:val="num" w:pos="2160"/>
+        </w:tabs>
+        <w:ind w:left="2160" w:hanging="360"/>
+      </w:pPr>
+      <w:rPr>
+        <w:rFonts w:ascii="Wingdings" w:hAnsi="Wingdings" w:hint="default"/>
+        <w:sz w:val="20"/>
+      </w:rPr>
+    </w:lvl>
+    <w:lvl w:ilvl="3" w:tentative="1">
+      <w:start w:val="1"/>
+      <w:numFmt w:val="bullet"/>
+      <w:lvlText w:val=""/>
+      <w:lvlJc w:val="left"/>
+      <w:pPr>
+        <w:tabs>
+          <w:tab w:val="num" w:pos="2880"/>
+        </w:tabs>
+        <w:ind w:left="2880" w:hanging="360"/>
+      </w:pPr>
+      <w:rPr>
+        <w:rFonts w:ascii="Wingdings" w:hAnsi="Wingdings" w:hint="default"/>
+        <w:sz w:val="20"/>
+      </w:rPr>
+    </w:lvl>
+    <w:lvl w:ilvl="4" w:tentative="1">
+      <w:start w:val="1"/>
+      <w:numFmt w:val="bullet"/>
+      <w:lvlText w:val=""/>
+      <w:lvlJc w:val="left"/>
+      <w:pPr>
+        <w:tabs>
+          <w:tab w:val="num" w:pos="3600"/>
+        </w:tabs>
+        <w:ind w:left="3600" w:hanging="360"/>
+      </w:pPr>
+      <w:rPr>
+        <w:rFonts w:ascii="Wingdings" w:hAnsi="Wingdings" w:hint="default"/>
+        <w:sz w:val="20"/>
+      </w:rPr>
+    </w:lvl>
+    <w:lvl w:ilvl="5" w:tentative="1">
+      <w:start w:val="1"/>
+      <w:numFmt w:val="bullet"/>
+      <w:lvlText w:val=""/>
+      <w:lvlJc w:val="left"/>
+      <w:pPr>
+        <w:tabs>
+          <w:tab w:val="num" w:pos="4320"/>
+        </w:tabs>
+        <w:ind w:left="4320" w:hanging="360"/>
+      </w:pPr>
+      <w:rPr>
+        <w:rFonts w:ascii="Wingdings" w:hAnsi="Wingdings" w:hint="default"/>
+        <w:sz w:val="20"/>
+      </w:rPr>
+    </w:lvl>
+    <w:lvl w:ilvl="6" w:tentative="1">
+      <w:start w:val="1"/>
+      <w:numFmt w:val="bullet"/>
+      <w:lvlText w:val=""/>
+      <w:lvlJc w:val="left"/>
+      <w:pPr>
+        <w:tabs>
+          <w:tab w:val="num" w:pos="5040"/>
+        </w:tabs>
+        <w:ind w:left="5040" w:hanging="360"/>
+      </w:pPr>
+      <w:rPr>
+        <w:rFonts w:ascii="Wingdings" w:hAnsi="Wingdings" w:hint="default"/>
+        <w:sz w:val="20"/>
+      </w:rPr>
+    </w:lvl>
+    <w:lvl w:ilvl="7" w:tentative="1">
+      <w:start w:val="1"/>
+      <w:numFmt w:val="bullet"/>
+      <w:lvlText w:val=""/>
+      <w:lvlJc w:val="left"/>
+      <w:pPr>
+        <w:tabs>
+          <w:tab w:val="num" w:pos="5760"/>
+        </w:tabs>
+        <w:ind w:left="5760" w:hanging="360"/>
+      </w:pPr>
+      <w:rPr>
+        <w:rFonts w:ascii="Wingdings" w:hAnsi="Wingdings" w:hint="default"/>
+        <w:sz w:val="20"/>
+      </w:rPr>
+    </w:lvl>
+    <w:lvl w:ilvl="8" w:tentative="1">
+      <w:start w:val="1"/>
+      <w:numFmt w:val="bullet"/>
+      <w:lvlText w:val=""/>
+      <w:lvlJc w:val="left"/>
+      <w:pPr>
+        <w:tabs>
+          <w:tab w:val="num" w:pos="6480"/>
+        </w:tabs>
+        <w:ind w:left="6480" w:hanging="360"/>
+      </w:pPr>
+      <w:rPr>
+        <w:rFonts w:ascii="Wingdings" w:hAnsi="Wingdings" w:hint="default"/>
+        <w:sz w:val="20"/>
+      </w:rPr>
+    </w:lvl>
+  </w:abstractNum>
+  <w:abstractNum w:abstractNumId="14" w15:restartNumberingAfterBreak="0">
     <w:nsid w:val="37027CC7"/>
     <w:multiLevelType w:val="multilevel"/>
     <w:tmpl w:val="53C88228"/>
@@ -11218,7 +13252,7 @@
       </w:pPr>
     </w:lvl>
   </w:abstractNum>
-  <w:abstractNum w:abstractNumId="11" w15:restartNumberingAfterBreak="0">
+  <w:abstractNum w:abstractNumId="15" w15:restartNumberingAfterBreak="0">
     <w:nsid w:val="3DF06D80"/>
     <w:multiLevelType w:val="hybridMultilevel"/>
     <w:tmpl w:val="A1E07936"/>
@@ -11309,7 +13343,7 @@
       </w:pPr>
     </w:lvl>
   </w:abstractNum>
-  <w:abstractNum w:abstractNumId="12" w15:restartNumberingAfterBreak="0">
+  <w:abstractNum w:abstractNumId="16" w15:restartNumberingAfterBreak="0">
     <w:nsid w:val="475F3B64"/>
     <w:multiLevelType w:val="hybridMultilevel"/>
     <w:tmpl w:val="BD760BAC"/>
@@ -11398,7 +13432,7 @@
       </w:pPr>
     </w:lvl>
   </w:abstractNum>
-  <w:abstractNum w:abstractNumId="13" w15:restartNumberingAfterBreak="0">
+  <w:abstractNum w:abstractNumId="17" w15:restartNumberingAfterBreak="0">
     <w:nsid w:val="49591BF3"/>
     <w:multiLevelType w:val="hybridMultilevel"/>
     <w:tmpl w:val="FBEE6CB2"/>
@@ -11511,7 +13545,7 @@
       </w:rPr>
     </w:lvl>
   </w:abstractNum>
-  <w:abstractNum w:abstractNumId="14" w15:restartNumberingAfterBreak="0">
+  <w:abstractNum w:abstractNumId="18" w15:restartNumberingAfterBreak="0">
     <w:nsid w:val="4FBD3EC9"/>
     <w:multiLevelType w:val="hybridMultilevel"/>
     <w:tmpl w:val="EC2E663A"/>
@@ -11624,7 +13658,7 @@
       </w:rPr>
     </w:lvl>
   </w:abstractNum>
-  <w:abstractNum w:abstractNumId="15" w15:restartNumberingAfterBreak="0">
+  <w:abstractNum w:abstractNumId="19" w15:restartNumberingAfterBreak="0">
     <w:nsid w:val="53871B94"/>
     <w:multiLevelType w:val="hybridMultilevel"/>
     <w:tmpl w:val="83EA4D42"/>
@@ -11737,7 +13771,156 @@
       </w:rPr>
     </w:lvl>
   </w:abstractNum>
-  <w:abstractNum w:abstractNumId="16" w15:restartNumberingAfterBreak="0">
+  <w:abstractNum w:abstractNumId="20" w15:restartNumberingAfterBreak="0">
+    <w:nsid w:val="57040E9A"/>
+    <w:multiLevelType w:val="multilevel"/>
+    <w:tmpl w:val="98DC97F6"/>
+    <w:lvl w:ilvl="0">
+      <w:start w:val="1"/>
+      <w:numFmt w:val="bullet"/>
+      <w:lvlText w:val=""/>
+      <w:lvlJc w:val="left"/>
+      <w:pPr>
+        <w:tabs>
+          <w:tab w:val="num" w:pos="720"/>
+        </w:tabs>
+        <w:ind w:left="720" w:hanging="360"/>
+      </w:pPr>
+      <w:rPr>
+        <w:rFonts w:ascii="Symbol" w:hAnsi="Symbol" w:hint="default"/>
+        <w:sz w:val="20"/>
+      </w:rPr>
+    </w:lvl>
+    <w:lvl w:ilvl="1" w:tentative="1">
+      <w:start w:val="1"/>
+      <w:numFmt w:val="bullet"/>
+      <w:lvlText w:val="o"/>
+      <w:lvlJc w:val="left"/>
+      <w:pPr>
+        <w:tabs>
+          <w:tab w:val="num" w:pos="1440"/>
+        </w:tabs>
+        <w:ind w:left="1440" w:hanging="360"/>
+      </w:pPr>
+      <w:rPr>
+        <w:rFonts w:ascii="Courier New" w:hAnsi="Courier New" w:hint="default"/>
+        <w:sz w:val="20"/>
+      </w:rPr>
+    </w:lvl>
+    <w:lvl w:ilvl="2" w:tentative="1">
+      <w:start w:val="1"/>
+      <w:numFmt w:val="bullet"/>
+      <w:lvlText w:val=""/>
+      <w:lvlJc w:val="left"/>
+      <w:pPr>
+        <w:tabs>
+          <w:tab w:val="num" w:pos="2160"/>
+        </w:tabs>
+        <w:ind w:left="2160" w:hanging="360"/>
+      </w:pPr>
+      <w:rPr>
+        <w:rFonts w:ascii="Wingdings" w:hAnsi="Wingdings" w:hint="default"/>
+        <w:sz w:val="20"/>
+      </w:rPr>
+    </w:lvl>
+    <w:lvl w:ilvl="3" w:tentative="1">
+      <w:start w:val="1"/>
+      <w:numFmt w:val="bullet"/>
+      <w:lvlText w:val=""/>
+      <w:lvlJc w:val="left"/>
+      <w:pPr>
+        <w:tabs>
+          <w:tab w:val="num" w:pos="2880"/>
+        </w:tabs>
+        <w:ind w:left="2880" w:hanging="360"/>
+      </w:pPr>
+      <w:rPr>
+        <w:rFonts w:ascii="Wingdings" w:hAnsi="Wingdings" w:hint="default"/>
+        <w:sz w:val="20"/>
+      </w:rPr>
+    </w:lvl>
+    <w:lvl w:ilvl="4" w:tentative="1">
+      <w:start w:val="1"/>
+      <w:numFmt w:val="bullet"/>
+      <w:lvlText w:val=""/>
+      <w:lvlJc w:val="left"/>
+      <w:pPr>
+        <w:tabs>
+          <w:tab w:val="num" w:pos="3600"/>
+        </w:tabs>
+        <w:ind w:left="3600" w:hanging="360"/>
+      </w:pPr>
+      <w:rPr>
+        <w:rFonts w:ascii="Wingdings" w:hAnsi="Wingdings" w:hint="default"/>
+        <w:sz w:val="20"/>
+      </w:rPr>
+    </w:lvl>
+    <w:lvl w:ilvl="5" w:tentative="1">
+      <w:start w:val="1"/>
+      <w:numFmt w:val="bullet"/>
+      <w:lvlText w:val=""/>
+      <w:lvlJc w:val="left"/>
+      <w:pPr>
+        <w:tabs>
+          <w:tab w:val="num" w:pos="4320"/>
+        </w:tabs>
+        <w:ind w:left="4320" w:hanging="360"/>
+      </w:pPr>
+      <w:rPr>
+        <w:rFonts w:ascii="Wingdings" w:hAnsi="Wingdings" w:hint="default"/>
+        <w:sz w:val="20"/>
+      </w:rPr>
+    </w:lvl>
+    <w:lvl w:ilvl="6" w:tentative="1">
+      <w:start w:val="1"/>
+      <w:numFmt w:val="bullet"/>
+      <w:lvlText w:val=""/>
+      <w:lvlJc w:val="left"/>
+      <w:pPr>
+        <w:tabs>
+          <w:tab w:val="num" w:pos="5040"/>
+        </w:tabs>
+        <w:ind w:left="5040" w:hanging="360"/>
+      </w:pPr>
+      <w:rPr>
+        <w:rFonts w:ascii="Wingdings" w:hAnsi="Wingdings" w:hint="default"/>
+        <w:sz w:val="20"/>
+      </w:rPr>
+    </w:lvl>
+    <w:lvl w:ilvl="7" w:tentative="1">
+      <w:start w:val="1"/>
+      <w:numFmt w:val="bullet"/>
+      <w:lvlText w:val=""/>
+      <w:lvlJc w:val="left"/>
+      <w:pPr>
+        <w:tabs>
+          <w:tab w:val="num" w:pos="5760"/>
+        </w:tabs>
+        <w:ind w:left="5760" w:hanging="360"/>
+      </w:pPr>
+      <w:rPr>
+        <w:rFonts w:ascii="Wingdings" w:hAnsi="Wingdings" w:hint="default"/>
+        <w:sz w:val="20"/>
+      </w:rPr>
+    </w:lvl>
+    <w:lvl w:ilvl="8" w:tentative="1">
+      <w:start w:val="1"/>
+      <w:numFmt w:val="bullet"/>
+      <w:lvlText w:val=""/>
+      <w:lvlJc w:val="left"/>
+      <w:pPr>
+        <w:tabs>
+          <w:tab w:val="num" w:pos="6480"/>
+        </w:tabs>
+        <w:ind w:left="6480" w:hanging="360"/>
+      </w:pPr>
+      <w:rPr>
+        <w:rFonts w:ascii="Wingdings" w:hAnsi="Wingdings" w:hint="default"/>
+        <w:sz w:val="20"/>
+      </w:rPr>
+    </w:lvl>
+  </w:abstractNum>
+  <w:abstractNum w:abstractNumId="21" w15:restartNumberingAfterBreak="0">
     <w:nsid w:val="63840B6F"/>
     <w:multiLevelType w:val="hybridMultilevel"/>
     <w:tmpl w:val="8DE404C2"/>
@@ -11823,7 +14006,7 @@
       </w:pPr>
     </w:lvl>
   </w:abstractNum>
-  <w:abstractNum w:abstractNumId="17" w15:restartNumberingAfterBreak="0">
+  <w:abstractNum w:abstractNumId="22" w15:restartNumberingAfterBreak="0">
     <w:nsid w:val="67690756"/>
     <w:multiLevelType w:val="hybridMultilevel"/>
     <w:tmpl w:val="2660ADFA"/>
@@ -11912,7 +14095,7 @@
       </w:pPr>
     </w:lvl>
   </w:abstractNum>
-  <w:abstractNum w:abstractNumId="18" w15:restartNumberingAfterBreak="0">
+  <w:abstractNum w:abstractNumId="23" w15:restartNumberingAfterBreak="0">
     <w:nsid w:val="6BEE4AEB"/>
     <w:multiLevelType w:val="hybridMultilevel"/>
     <w:tmpl w:val="1F80F1DC"/>
@@ -12025,7 +14208,7 @@
       </w:rPr>
     </w:lvl>
   </w:abstractNum>
-  <w:abstractNum w:abstractNumId="19" w15:restartNumberingAfterBreak="0">
+  <w:abstractNum w:abstractNumId="24" w15:restartNumberingAfterBreak="0">
     <w:nsid w:val="6E230BC7"/>
     <w:multiLevelType w:val="hybridMultilevel"/>
     <w:tmpl w:val="E9B0AF3A"/>
@@ -12138,7 +14321,7 @@
       </w:rPr>
     </w:lvl>
   </w:abstractNum>
-  <w:abstractNum w:abstractNumId="20" w15:restartNumberingAfterBreak="0">
+  <w:abstractNum w:abstractNumId="25" w15:restartNumberingAfterBreak="0">
     <w:nsid w:val="7082799A"/>
     <w:multiLevelType w:val="hybridMultilevel"/>
     <w:tmpl w:val="7E9CBE5E"/>
@@ -12227,7 +14410,7 @@
       </w:pPr>
     </w:lvl>
   </w:abstractNum>
-  <w:abstractNum w:abstractNumId="21" w15:restartNumberingAfterBreak="0">
+  <w:abstractNum w:abstractNumId="26" w15:restartNumberingAfterBreak="0">
     <w:nsid w:val="71994217"/>
     <w:multiLevelType w:val="hybridMultilevel"/>
     <w:tmpl w:val="610C75F8"/>
@@ -12340,7 +14523,7 @@
       </w:rPr>
     </w:lvl>
   </w:abstractNum>
-  <w:abstractNum w:abstractNumId="22" w15:restartNumberingAfterBreak="0">
+  <w:abstractNum w:abstractNumId="27" w15:restartNumberingAfterBreak="0">
     <w:nsid w:val="79366BEE"/>
     <w:multiLevelType w:val="hybridMultilevel"/>
     <w:tmpl w:val="A4B8BF4E"/>
@@ -12453,7 +14636,7 @@
       </w:rPr>
     </w:lvl>
   </w:abstractNum>
-  <w:abstractNum w:abstractNumId="23" w15:restartNumberingAfterBreak="0">
+  <w:abstractNum w:abstractNumId="28" w15:restartNumberingAfterBreak="0">
     <w:nsid w:val="7AA1489E"/>
     <w:multiLevelType w:val="hybridMultilevel"/>
     <w:tmpl w:val="49B4CBAE"/>
@@ -12566,7 +14749,7 @@
       </w:rPr>
     </w:lvl>
   </w:abstractNum>
-  <w:abstractNum w:abstractNumId="24" w15:restartNumberingAfterBreak="0">
+  <w:abstractNum w:abstractNumId="29" w15:restartNumberingAfterBreak="0">
     <w:nsid w:val="7CC7206D"/>
     <w:multiLevelType w:val="hybridMultilevel"/>
     <w:tmpl w:val="713EC5BE"/>
@@ -12679,7 +14862,7 @@
       </w:rPr>
     </w:lvl>
   </w:abstractNum>
-  <w:abstractNum w:abstractNumId="25" w15:restartNumberingAfterBreak="0">
+  <w:abstractNum w:abstractNumId="30" w15:restartNumberingAfterBreak="0">
     <w:nsid w:val="7DD10082"/>
     <w:multiLevelType w:val="hybridMultilevel"/>
     <w:tmpl w:val="A5FC64FA"/>
@@ -12772,40 +14955,40 @@
     <w:abstractNumId w:val="7"/>
   </w:num>
   <w:num w:numId="2" w16cid:durableId="1793163019">
-    <w:abstractNumId w:val="18"/>
+    <w:abstractNumId w:val="23"/>
   </w:num>
   <w:num w:numId="3" w16cid:durableId="834108088">
-    <w:abstractNumId w:val="24"/>
+    <w:abstractNumId w:val="29"/>
   </w:num>
   <w:num w:numId="4" w16cid:durableId="1624310831">
-    <w:abstractNumId w:val="13"/>
+    <w:abstractNumId w:val="17"/>
   </w:num>
   <w:num w:numId="5" w16cid:durableId="1248882816">
     <w:abstractNumId w:val="4"/>
   </w:num>
   <w:num w:numId="6" w16cid:durableId="1603222009">
-    <w:abstractNumId w:val="19"/>
+    <w:abstractNumId w:val="24"/>
   </w:num>
   <w:num w:numId="7" w16cid:durableId="627786870">
     <w:abstractNumId w:val="1"/>
   </w:num>
   <w:num w:numId="8" w16cid:durableId="1414010986">
-    <w:abstractNumId w:val="9"/>
+    <w:abstractNumId w:val="11"/>
   </w:num>
   <w:num w:numId="9" w16cid:durableId="1345670746">
-    <w:abstractNumId w:val="22"/>
+    <w:abstractNumId w:val="27"/>
   </w:num>
   <w:num w:numId="10" w16cid:durableId="1030688457">
-    <w:abstractNumId w:val="14"/>
+    <w:abstractNumId w:val="18"/>
   </w:num>
   <w:num w:numId="11" w16cid:durableId="1940021612">
-    <w:abstractNumId w:val="11"/>
+    <w:abstractNumId w:val="15"/>
   </w:num>
   <w:num w:numId="12" w16cid:durableId="892930867">
-    <w:abstractNumId w:val="23"/>
+    <w:abstractNumId w:val="28"/>
   </w:num>
   <w:num w:numId="13" w16cid:durableId="509031985">
-    <w:abstractNumId w:val="15"/>
+    <w:abstractNumId w:val="19"/>
   </w:num>
   <w:num w:numId="14" w16cid:durableId="105201213">
     <w:abstractNumId w:val="2"/>
@@ -12820,31 +15003,46 @@
     <w:abstractNumId w:val="3"/>
   </w:num>
   <w:num w:numId="18" w16cid:durableId="1696037078">
-    <w:abstractNumId w:val="21"/>
+    <w:abstractNumId w:val="26"/>
   </w:num>
   <w:num w:numId="19" w16cid:durableId="1152215020">
     <w:abstractNumId w:val="6"/>
   </w:num>
   <w:num w:numId="20" w16cid:durableId="800075743">
-    <w:abstractNumId w:val="12"/>
+    <w:abstractNumId w:val="16"/>
   </w:num>
   <w:num w:numId="21" w16cid:durableId="27222581">
-    <w:abstractNumId w:val="17"/>
+    <w:abstractNumId w:val="22"/>
   </w:num>
   <w:num w:numId="22" w16cid:durableId="499583074">
-    <w:abstractNumId w:val="20"/>
+    <w:abstractNumId w:val="25"/>
   </w:num>
   <w:num w:numId="23" w16cid:durableId="123082288">
-    <w:abstractNumId w:val="25"/>
+    <w:abstractNumId w:val="30"/>
   </w:num>
   <w:num w:numId="24" w16cid:durableId="1857649583">
-    <w:abstractNumId w:val="10"/>
+    <w:abstractNumId w:val="14"/>
   </w:num>
   <w:num w:numId="25" w16cid:durableId="748696788">
-    <w:abstractNumId w:val="16"/>
+    <w:abstractNumId w:val="21"/>
   </w:num>
   <w:num w:numId="26" w16cid:durableId="440034585">
     <w:abstractNumId w:val="0"/>
+  </w:num>
+  <w:num w:numId="27" w16cid:durableId="1971979936">
+    <w:abstractNumId w:val="12"/>
+  </w:num>
+  <w:num w:numId="28" w16cid:durableId="766999635">
+    <w:abstractNumId w:val="20"/>
+  </w:num>
+  <w:num w:numId="29" w16cid:durableId="781606969">
+    <w:abstractNumId w:val="9"/>
+  </w:num>
+  <w:num w:numId="30" w16cid:durableId="1557626791">
+    <w:abstractNumId w:val="10"/>
+  </w:num>
+  <w:num w:numId="31" w16cid:durableId="1396202716">
+    <w:abstractNumId w:val="13"/>
   </w:num>
 </w:numbering>
 </file>
@@ -13247,7 +15445,7 @@
   <w:style w:type="paragraph" w:default="1" w:styleId="Normal">
     <w:name w:val="Normal"/>
     <w:qFormat/>
-    <w:rsid w:val="00123135"/>
+    <w:rsid w:val="00042255"/>
     <w:pPr>
       <w:spacing w:after="0" w:line="360" w:lineRule="auto"/>
       <w:jc w:val="both"/>
@@ -13373,7 +15571,6 @@
   <w:style w:type="character" w:default="1" w:styleId="Fuentedeprrafopredeter">
     <w:name w:val="Default Paragraph Font"/>
     <w:uiPriority w:val="1"/>
-    <w:semiHidden/>
     <w:unhideWhenUsed/>
   </w:style>
   <w:style w:type="table" w:default="1" w:styleId="Tablanormal">
@@ -14640,12 +16837,256 @@
 </file>
 
 <file path=customXml/item1.xml><?xml version="1.0" encoding="utf-8"?>
-<?mso-contentType ?>
-<FormTemplates xmlns="http://schemas.microsoft.com/sharepoint/v3/contenttype/forms">
-  <Display>DocumentLibraryForm</Display>
-  <Edit>DocumentLibraryForm</Edit>
-  <New>DocumentLibraryForm</New>
-</FormTemplates>
+<ct:contentTypeSchema xmlns:ct="http://schemas.microsoft.com/office/2006/metadata/contentType" xmlns:ma="http://schemas.microsoft.com/office/2006/metadata/properties/metaAttributes" ct:_="" ma:_="" ma:contentTypeName="Documento" ma:contentTypeID="0x01010015BDB27AF1A6EC4C99611A7AD03A3206" ma:contentTypeVersion="18" ma:contentTypeDescription="Crear nuevo documento." ma:contentTypeScope="" ma:versionID="56de9a8de695fa7f309cf2eb59d05ef4">
+  <xsd:schema xmlns:xsd="http://www.w3.org/2001/XMLSchema" xmlns:xs="http://www.w3.org/2001/XMLSchema" xmlns:p="http://schemas.microsoft.com/office/2006/metadata/properties" xmlns:ns3="ed1181c6-4963-4f9c-a6e4-d7efb21233a0" xmlns:ns4="152b35e6-23a1-4beb-a1fd-2689778f6058" targetNamespace="http://schemas.microsoft.com/office/2006/metadata/properties" ma:root="true" ma:fieldsID="cae7528616b6d30ad4c29b83143ea2c0" ns3:_="" ns4:_="">
+    <xsd:import namespace="ed1181c6-4963-4f9c-a6e4-d7efb21233a0"/>
+    <xsd:import namespace="152b35e6-23a1-4beb-a1fd-2689778f6058"/>
+    <xsd:element name="properties">
+      <xsd:complexType>
+        <xsd:sequence>
+          <xsd:element name="documentManagement">
+            <xsd:complexType>
+              <xsd:all>
+                <xsd:element ref="ns3:SharedWithUsers" minOccurs="0"/>
+                <xsd:element ref="ns3:SharedWithDetails" minOccurs="0"/>
+                <xsd:element ref="ns3:SharingHintHash" minOccurs="0"/>
+                <xsd:element ref="ns4:MediaServiceMetadata" minOccurs="0"/>
+                <xsd:element ref="ns4:MediaServiceFastMetadata" minOccurs="0"/>
+                <xsd:element ref="ns4:MediaServiceDateTaken" minOccurs="0"/>
+                <xsd:element ref="ns4:MediaServiceAutoTags" minOccurs="0"/>
+                <xsd:element ref="ns4:MediaServiceGenerationTime" minOccurs="0"/>
+                <xsd:element ref="ns4:MediaServiceEventHashCode" minOccurs="0"/>
+                <xsd:element ref="ns4:MediaServiceOCR" minOccurs="0"/>
+                <xsd:element ref="ns4:MediaLengthInSeconds" minOccurs="0"/>
+                <xsd:element ref="ns4:MediaServiceAutoKeyPoints" minOccurs="0"/>
+                <xsd:element ref="ns4:MediaServiceKeyPoints" minOccurs="0"/>
+                <xsd:element ref="ns4:_activity" minOccurs="0"/>
+                <xsd:element ref="ns4:MediaServiceObjectDetectorVersions" minOccurs="0"/>
+                <xsd:element ref="ns4:MediaServiceLocation" minOccurs="0"/>
+                <xsd:element ref="ns4:MediaServiceSystemTags" minOccurs="0"/>
+                <xsd:element ref="ns4:MediaServiceSearchProperties" minOccurs="0"/>
+              </xsd:all>
+            </xsd:complexType>
+          </xsd:element>
+        </xsd:sequence>
+      </xsd:complexType>
+    </xsd:element>
+  </xsd:schema>
+  <xsd:schema xmlns:xsd="http://www.w3.org/2001/XMLSchema" xmlns:xs="http://www.w3.org/2001/XMLSchema" xmlns:dms="http://schemas.microsoft.com/office/2006/documentManagement/types" xmlns:pc="http://schemas.microsoft.com/office/infopath/2007/PartnerControls" targetNamespace="ed1181c6-4963-4f9c-a6e4-d7efb21233a0" elementFormDefault="qualified">
+    <xsd:import namespace="http://schemas.microsoft.com/office/2006/documentManagement/types"/>
+    <xsd:import namespace="http://schemas.microsoft.com/office/infopath/2007/PartnerControls"/>
+    <xsd:element name="SharedWithUsers" ma:index="8" nillable="true" ma:displayName="Compartido con" ma:internalName="SharedWithUsers" ma:readOnly="true">
+      <xsd:complexType>
+        <xsd:complexContent>
+          <xsd:extension base="dms:UserMulti">
+            <xsd:sequence>
+              <xsd:element name="UserInfo" minOccurs="0" maxOccurs="unbounded">
+                <xsd:complexType>
+                  <xsd:sequence>
+                    <xsd:element name="DisplayName" type="xsd:string" minOccurs="0"/>
+                    <xsd:element name="AccountId" type="dms:UserId" minOccurs="0" nillable="true"/>
+                    <xsd:element name="AccountType" type="xsd:string" minOccurs="0"/>
+                  </xsd:sequence>
+                </xsd:complexType>
+              </xsd:element>
+            </xsd:sequence>
+          </xsd:extension>
+        </xsd:complexContent>
+      </xsd:complexType>
+    </xsd:element>
+    <xsd:element name="SharedWithDetails" ma:index="9" nillable="true" ma:displayName="Detalles de uso compartido" ma:internalName="SharedWithDetails" ma:readOnly="true">
+      <xsd:simpleType>
+        <xsd:restriction base="dms:Note">
+          <xsd:maxLength value="255"/>
+        </xsd:restriction>
+      </xsd:simpleType>
+    </xsd:element>
+    <xsd:element name="SharingHintHash" ma:index="10" nillable="true" ma:displayName="Hash de la sugerencia para compartir" ma:hidden="true" ma:internalName="SharingHintHash" ma:readOnly="true">
+      <xsd:simpleType>
+        <xsd:restriction base="dms:Text"/>
+      </xsd:simpleType>
+    </xsd:element>
+  </xsd:schema>
+  <xsd:schema xmlns:xsd="http://www.w3.org/2001/XMLSchema" xmlns:xs="http://www.w3.org/2001/XMLSchema" xmlns:dms="http://schemas.microsoft.com/office/2006/documentManagement/types" xmlns:pc="http://schemas.microsoft.com/office/infopath/2007/PartnerControls" targetNamespace="152b35e6-23a1-4beb-a1fd-2689778f6058" elementFormDefault="qualified">
+    <xsd:import namespace="http://schemas.microsoft.com/office/2006/documentManagement/types"/>
+    <xsd:import namespace="http://schemas.microsoft.com/office/infopath/2007/PartnerControls"/>
+    <xsd:element name="MediaServiceMetadata" ma:index="11" nillable="true" ma:displayName="MediaServiceMetadata" ma:hidden="true" ma:internalName="MediaServiceMetadata" ma:readOnly="true">
+      <xsd:simpleType>
+        <xsd:restriction base="dms:Note"/>
+      </xsd:simpleType>
+    </xsd:element>
+    <xsd:element name="MediaServiceFastMetadata" ma:index="12" nillable="true" ma:displayName="MediaServiceFastMetadata" ma:hidden="true" ma:internalName="MediaServiceFastMetadata" ma:readOnly="true">
+      <xsd:simpleType>
+        <xsd:restriction base="dms:Note"/>
+      </xsd:simpleType>
+    </xsd:element>
+    <xsd:element name="MediaServiceDateTaken" ma:index="13" nillable="true" ma:displayName="MediaServiceDateTaken" ma:hidden="true" ma:internalName="MediaServiceDateTaken" ma:readOnly="true">
+      <xsd:simpleType>
+        <xsd:restriction base="dms:Text"/>
+      </xsd:simpleType>
+    </xsd:element>
+    <xsd:element name="MediaServiceAutoTags" ma:index="14" nillable="true" ma:displayName="Tags" ma:internalName="MediaServiceAutoTags" ma:readOnly="true">
+      <xsd:simpleType>
+        <xsd:restriction base="dms:Text"/>
+      </xsd:simpleType>
+    </xsd:element>
+    <xsd:element name="MediaServiceGenerationTime" ma:index="15" nillable="true" ma:displayName="MediaServiceGenerationTime" ma:hidden="true" ma:internalName="MediaServiceGenerationTime" ma:readOnly="true">
+      <xsd:simpleType>
+        <xsd:restriction base="dms:Text"/>
+      </xsd:simpleType>
+    </xsd:element>
+    <xsd:element name="MediaServiceEventHashCode" ma:index="16" nillable="true" ma:displayName="MediaServiceEventHashCode" ma:hidden="true" ma:internalName="MediaServiceEventHashCode" ma:readOnly="true">
+      <xsd:simpleType>
+        <xsd:restriction base="dms:Text"/>
+      </xsd:simpleType>
+    </xsd:element>
+    <xsd:element name="MediaServiceOCR" ma:index="17" nillable="true" ma:displayName="Extracted Text" ma:internalName="MediaServiceOCR" ma:readOnly="true">
+      <xsd:simpleType>
+        <xsd:restriction base="dms:Note">
+          <xsd:maxLength value="255"/>
+        </xsd:restriction>
+      </xsd:simpleType>
+    </xsd:element>
+    <xsd:element name="MediaLengthInSeconds" ma:index="18" nillable="true" ma:displayName="Length (seconds)" ma:internalName="MediaLengthInSeconds" ma:readOnly="true">
+      <xsd:simpleType>
+        <xsd:restriction base="dms:Unknown"/>
+      </xsd:simpleType>
+    </xsd:element>
+    <xsd:element name="MediaServiceAutoKeyPoints" ma:index="19" nillable="true" ma:displayName="MediaServiceAutoKeyPoints" ma:hidden="true" ma:internalName="MediaServiceAutoKeyPoints" ma:readOnly="true">
+      <xsd:simpleType>
+        <xsd:restriction base="dms:Note"/>
+      </xsd:simpleType>
+    </xsd:element>
+    <xsd:element name="MediaServiceKeyPoints" ma:index="20" nillable="true" ma:displayName="KeyPoints" ma:internalName="MediaServiceKeyPoints" ma:readOnly="true">
+      <xsd:simpleType>
+        <xsd:restriction base="dms:Note">
+          <xsd:maxLength value="255"/>
+        </xsd:restriction>
+      </xsd:simpleType>
+    </xsd:element>
+    <xsd:element name="_activity" ma:index="21" nillable="true" ma:displayName="_activity" ma:hidden="true" ma:internalName="_activity">
+      <xsd:simpleType>
+        <xsd:restriction base="dms:Note"/>
+      </xsd:simpleType>
+    </xsd:element>
+    <xsd:element name="MediaServiceObjectDetectorVersions" ma:index="22" nillable="true" ma:displayName="MediaServiceObjectDetectorVersions" ma:hidden="true" ma:indexed="true" ma:internalName="MediaServiceObjectDetectorVersions" ma:readOnly="true">
+      <xsd:simpleType>
+        <xsd:restriction base="dms:Text"/>
+      </xsd:simpleType>
+    </xsd:element>
+    <xsd:element name="MediaServiceLocation" ma:index="23" nillable="true" ma:displayName="Location" ma:indexed="true" ma:internalName="MediaServiceLocation" ma:readOnly="true">
+      <xsd:simpleType>
+        <xsd:restriction base="dms:Text"/>
+      </xsd:simpleType>
+    </xsd:element>
+    <xsd:element name="MediaServiceSystemTags" ma:index="24" nillable="true" ma:displayName="MediaServiceSystemTags" ma:hidden="true" ma:internalName="MediaServiceSystemTags" ma:readOnly="true">
+      <xsd:simpleType>
+        <xsd:restriction base="dms:Note"/>
+      </xsd:simpleType>
+    </xsd:element>
+    <xsd:element name="MediaServiceSearchProperties" ma:index="25" nillable="true" ma:displayName="MediaServiceSearchProperties" ma:hidden="true" ma:internalName="MediaServiceSearchProperties" ma:readOnly="true">
+      <xsd:simpleType>
+        <xsd:restriction base="dms:Note"/>
+      </xsd:simpleType>
+    </xsd:element>
+  </xsd:schema>
+  <xsd:schema xmlns="http://schemas.openxmlformats.org/package/2006/metadata/core-properties" xmlns:xsd="http://www.w3.org/2001/XMLSchema" xmlns:xsi="http://www.w3.org/2001/XMLSchema-instance" xmlns:dc="http://purl.org/dc/elements/1.1/" xmlns:dcterms="http://purl.org/dc/terms/" xmlns:odoc="http://schemas.microsoft.com/internal/obd" targetNamespace="http://schemas.openxmlformats.org/package/2006/metadata/core-properties" elementFormDefault="qualified" attributeFormDefault="unqualified" blockDefault="#all">
+    <xsd:import namespace="http://purl.org/dc/elements/1.1/" schemaLocation="http://dublincore.org/schemas/xmls/qdc/2003/04/02/dc.xsd"/>
+    <xsd:import namespace="http://purl.org/dc/terms/" schemaLocation="http://dublincore.org/schemas/xmls/qdc/2003/04/02/dcterms.xsd"/>
+    <xsd:element name="coreProperties" type="CT_coreProperties"/>
+    <xsd:complexType name="CT_coreProperties">
+      <xsd:all>
+        <xsd:element ref="dc:creator" minOccurs="0" maxOccurs="1"/>
+        <xsd:element ref="dcterms:created" minOccurs="0" maxOccurs="1"/>
+        <xsd:element ref="dc:identifier" minOccurs="0" maxOccurs="1"/>
+        <xsd:element name="contentType" minOccurs="0" maxOccurs="1" type="xsd:string" ma:index="0" ma:displayName="Tipo de contenido"/>
+        <xsd:element ref="dc:title" minOccurs="0" maxOccurs="1" ma:index="4" ma:displayName="Título"/>
+        <xsd:element ref="dc:subject" minOccurs="0" maxOccurs="1"/>
+        <xsd:element ref="dc:description" minOccurs="0" maxOccurs="1"/>
+        <xsd:element name="keywords" minOccurs="0" maxOccurs="1" type="xsd:string"/>
+        <xsd:element ref="dc:language" minOccurs="0" maxOccurs="1"/>
+        <xsd:element name="category" minOccurs="0" maxOccurs="1" type="xsd:string"/>
+        <xsd:element name="version" minOccurs="0" maxOccurs="1" type="xsd:string"/>
+        <xsd:element name="revision" minOccurs="0" maxOccurs="1" type="xsd:string">
+          <xsd:annotation>
+            <xsd:documentation>
+                        This value indicates the number of saves or revisions. The application is responsible for updating this value after each revision.
+                    </xsd:documentation>
+          </xsd:annotation>
+        </xsd:element>
+        <xsd:element name="lastModifiedBy" minOccurs="0" maxOccurs="1" type="xsd:string"/>
+        <xsd:element ref="dcterms:modified" minOccurs="0" maxOccurs="1"/>
+        <xsd:element name="contentStatus" minOccurs="0" maxOccurs="1" type="xsd:string"/>
+      </xsd:all>
+    </xsd:complexType>
+  </xsd:schema>
+  <xs:schema xmlns:pc="http://schemas.microsoft.com/office/infopath/2007/PartnerControls" xmlns:xs="http://www.w3.org/2001/XMLSchema" targetNamespace="http://schemas.microsoft.com/office/infopath/2007/PartnerControls" elementFormDefault="qualified" attributeFormDefault="unqualified">
+    <xs:element name="Person">
+      <xs:complexType>
+        <xs:sequence>
+          <xs:element ref="pc:DisplayName" minOccurs="0"/>
+          <xs:element ref="pc:AccountId" minOccurs="0"/>
+          <xs:element ref="pc:AccountType" minOccurs="0"/>
+        </xs:sequence>
+      </xs:complexType>
+    </xs:element>
+    <xs:element name="DisplayName" type="xs:string"/>
+    <xs:element name="AccountId" type="xs:string"/>
+    <xs:element name="AccountType" type="xs:string"/>
+    <xs:element name="BDCAssociatedEntity">
+      <xs:complexType>
+        <xs:sequence>
+          <xs:element ref="pc:BDCEntity" minOccurs="0" maxOccurs="unbounded"/>
+        </xs:sequence>
+        <xs:attribute ref="pc:EntityNamespace"/>
+        <xs:attribute ref="pc:EntityName"/>
+        <xs:attribute ref="pc:SystemInstanceName"/>
+        <xs:attribute ref="pc:AssociationName"/>
+      </xs:complexType>
+    </xs:element>
+    <xs:attribute name="EntityNamespace" type="xs:string"/>
+    <xs:attribute name="EntityName" type="xs:string"/>
+    <xs:attribute name="SystemInstanceName" type="xs:string"/>
+    <xs:attribute name="AssociationName" type="xs:string"/>
+    <xs:element name="BDCEntity">
+      <xs:complexType>
+        <xs:sequence>
+          <xs:element ref="pc:EntityDisplayName" minOccurs="0"/>
+          <xs:element ref="pc:EntityInstanceReference" minOccurs="0"/>
+          <xs:element ref="pc:EntityId1" minOccurs="0"/>
+          <xs:element ref="pc:EntityId2" minOccurs="0"/>
+          <xs:element ref="pc:EntityId3" minOccurs="0"/>
+          <xs:element ref="pc:EntityId4" minOccurs="0"/>
+          <xs:element ref="pc:EntityId5" minOccurs="0"/>
+        </xs:sequence>
+      </xs:complexType>
+    </xs:element>
+    <xs:element name="EntityDisplayName" type="xs:string"/>
+    <xs:element name="EntityInstanceReference" type="xs:string"/>
+    <xs:element name="EntityId1" type="xs:string"/>
+    <xs:element name="EntityId2" type="xs:string"/>
+    <xs:element name="EntityId3" type="xs:string"/>
+    <xs:element name="EntityId4" type="xs:string"/>
+    <xs:element name="EntityId5" type="xs:string"/>
+    <xs:element name="Terms">
+      <xs:complexType>
+        <xs:sequence>
+          <xs:element ref="pc:TermInfo" minOccurs="0" maxOccurs="unbounded"/>
+        </xs:sequence>
+      </xs:complexType>
+    </xs:element>
+    <xs:element name="TermInfo">
+      <xs:complexType>
+        <xs:sequence>
+          <xs:element ref="pc:TermName" minOccurs="0"/>
+          <xs:element ref="pc:TermId" minOccurs="0"/>
+        </xs:sequence>
+      </xs:complexType>
+    </xs:element>
+    <xs:element name="TermName" type="xs:string"/>
+    <xs:element name="TermId" type="xs:string"/>
+  </xs:schema>
+</ct:contentTypeSchema>
 </file>
 
 <file path=customXml/item2.xml><?xml version="1.0" encoding="utf-8"?>
@@ -14657,6 +17098,15 @@
 </file>
 
 <file path=customXml/item3.xml><?xml version="1.0" encoding="utf-8"?>
+<?mso-contentType ?>
+<FormTemplates xmlns="http://schemas.microsoft.com/sharepoint/v3/contenttype/forms">
+  <Display>DocumentLibraryForm</Display>
+  <Edit>DocumentLibraryForm</Edit>
+  <New>DocumentLibraryForm</New>
+</FormTemplates>
+</file>
+
+<file path=customXml/item4.xml><?xml version="1.0" encoding="utf-8"?>
 <b:Sources xmlns:b="http://schemas.openxmlformats.org/officeDocument/2006/bibliography" xmlns="http://schemas.openxmlformats.org/officeDocument/2006/bibliography" SelectedStyle="\APASixthEditionOfficeOnline.xsl" StyleName="APA" Version="6">
   <b:Source>
     <b:Tag>Men90</b:Tag>
@@ -15385,289 +17835,113 @@
     <b:URL>https://www.revista.unam.mx/2021v22n2/transicion_de_la_educacion_media_superior_a_la_educacion_superior_estudio_en_la_unam/</b:URL>
     <b:RefOrder>34</b:RefOrder>
   </b:Source>
+  <b:Source>
+    <b:Tag>Fin101</b:Tag>
+    <b:SourceType>Book</b:SourceType>
+    <b:Guid>{9141EB1C-BBBA-4D3B-B420-08D61A852C51}</b:Guid>
+    <b:Title>RFID Handbook</b:Title>
+    <b:Year>2010</b:Year>
+    <b:Author>
+      <b:Author>
+        <b:NameList>
+          <b:Person>
+            <b:Last>Finkenzeller</b:Last>
+            <b:First>Klaus</b:First>
+          </b:Person>
+        </b:NameList>
+      </b:Author>
+    </b:Author>
+    <b:City>Chinchester</b:City>
+    <b:Publisher>John Wiley &amp; Sons</b:Publisher>
+    <b:RefOrder>1</b:RefOrder>
+  </b:Source>
+  <b:Source>
+    <b:Tag>Poz12</b:Tag>
+    <b:SourceType>Book</b:SourceType>
+    <b:Guid>{2A278AB5-34AB-4157-95FE-78997F08619A}</b:Guid>
+    <b:Title>Microwave Engineering</b:Title>
+    <b:Year>2012</b:Year>
+    <b:City>Hoboken</b:City>
+    <b:Publisher>John Wiley &amp; Sons</b:Publisher>
+    <b:Author>
+      <b:Author>
+        <b:NameList>
+          <b:Person>
+            <b:Last>Pozar</b:Last>
+            <b:First>David. M</b:First>
+          </b:Person>
+        </b:NameList>
+      </b:Author>
+    </b:Author>
+    <b:RefOrder>2</b:RefOrder>
+  </b:Source>
+  <b:Source>
+    <b:Tag>Bal16</b:Tag>
+    <b:SourceType>Book</b:SourceType>
+    <b:Guid>{96DE19E0-EAF8-46F9-B142-0AC3568F6E26}</b:Guid>
+    <b:Title>Antenna Theory</b:Title>
+    <b:Year>2016</b:Year>
+    <b:City>Hoboken</b:City>
+    <b:Publisher>John Wiley &amp; Sons</b:Publisher>
+    <b:Author>
+      <b:Author>
+        <b:NameList>
+          <b:Person>
+            <b:Last>Balanis</b:Last>
+            <b:First>Constatine A.</b:First>
+          </b:Person>
+        </b:NameList>
+      </b:Author>
+    </b:Author>
+    <b:Edition>4th</b:Edition>
+    <b:RefOrder>3</b:RefOrder>
+  </b:Source>
+  <b:Source>
+    <b:Tag>Sad03</b:Tag>
+    <b:SourceType>Book</b:SourceType>
+    <b:Guid>{E4D4CF18-DFB3-45A9-860B-4CC6B9DA90A3}</b:Guid>
+    <b:Title>Elementos de electromagnetismo</b:Title>
+    <b:Year>2003</b:Year>
+    <b:City>México D. F.</b:City>
+    <b:Publisher>Oxford University Press</b:Publisher>
+    <b:Author>
+      <b:Author>
+        <b:NameList>
+          <b:Person>
+            <b:Last>Sadiku</b:Last>
+            <b:First>Matthew N. O.</b:First>
+          </b:Person>
+        </b:NameList>
+      </b:Author>
+    </b:Author>
+    <b:Edition>3rd</b:Edition>
+    <b:RefOrder>4</b:RefOrder>
+  </b:Source>
+  <b:Source>
+    <b:Tag>MarcadorDePosición1</b:Tag>
+    <b:SourceType>Book</b:SourceType>
+    <b:Guid>{5A46FBCE-2317-4F01-9DD5-9F1C158BA9CE}</b:Guid>
+    <b:Title>Microwave Engineering</b:Title>
+    <b:Year>2012</b:Year>
+    <b:City>Hoboken</b:City>
+    <b:Publisher>John Wiley &amp; Sons</b:Publisher>
+    <b:Author>
+      <b:Author>
+        <b:NameList>
+          <b:Person>
+            <b:Last>Pozar</b:Last>
+            <b:First>David. M</b:First>
+          </b:Person>
+        </b:NameList>
+      </b:Author>
+    </b:Author>
+    <b:Edition>4th</b:Edition>
+    <b:RefOrder>2</b:RefOrder>
+  </b:Source>
 </b:Sources>
 </file>
 
-<file path=customXml/item4.xml><?xml version="1.0" encoding="utf-8"?>
-<ct:contentTypeSchema xmlns:ct="http://schemas.microsoft.com/office/2006/metadata/contentType" xmlns:ma="http://schemas.microsoft.com/office/2006/metadata/properties/metaAttributes" ct:_="" ma:_="" ma:contentTypeName="Documento" ma:contentTypeID="0x01010015BDB27AF1A6EC4C99611A7AD03A3206" ma:contentTypeVersion="18" ma:contentTypeDescription="Crear nuevo documento." ma:contentTypeScope="" ma:versionID="56de9a8de695fa7f309cf2eb59d05ef4">
-  <xsd:schema xmlns:xsd="http://www.w3.org/2001/XMLSchema" xmlns:xs="http://www.w3.org/2001/XMLSchema" xmlns:p="http://schemas.microsoft.com/office/2006/metadata/properties" xmlns:ns3="ed1181c6-4963-4f9c-a6e4-d7efb21233a0" xmlns:ns4="152b35e6-23a1-4beb-a1fd-2689778f6058" targetNamespace="http://schemas.microsoft.com/office/2006/metadata/properties" ma:root="true" ma:fieldsID="cae7528616b6d30ad4c29b83143ea2c0" ns3:_="" ns4:_="">
-    <xsd:import namespace="ed1181c6-4963-4f9c-a6e4-d7efb21233a0"/>
-    <xsd:import namespace="152b35e6-23a1-4beb-a1fd-2689778f6058"/>
-    <xsd:element name="properties">
-      <xsd:complexType>
-        <xsd:sequence>
-          <xsd:element name="documentManagement">
-            <xsd:complexType>
-              <xsd:all>
-                <xsd:element ref="ns3:SharedWithUsers" minOccurs="0"/>
-                <xsd:element ref="ns3:SharedWithDetails" minOccurs="0"/>
-                <xsd:element ref="ns3:SharingHintHash" minOccurs="0"/>
-                <xsd:element ref="ns4:MediaServiceMetadata" minOccurs="0"/>
-                <xsd:element ref="ns4:MediaServiceFastMetadata" minOccurs="0"/>
-                <xsd:element ref="ns4:MediaServiceDateTaken" minOccurs="0"/>
-                <xsd:element ref="ns4:MediaServiceAutoTags" minOccurs="0"/>
-                <xsd:element ref="ns4:MediaServiceGenerationTime" minOccurs="0"/>
-                <xsd:element ref="ns4:MediaServiceEventHashCode" minOccurs="0"/>
-                <xsd:element ref="ns4:MediaServiceOCR" minOccurs="0"/>
-                <xsd:element ref="ns4:MediaLengthInSeconds" minOccurs="0"/>
-                <xsd:element ref="ns4:MediaServiceAutoKeyPoints" minOccurs="0"/>
-                <xsd:element ref="ns4:MediaServiceKeyPoints" minOccurs="0"/>
-                <xsd:element ref="ns4:_activity" minOccurs="0"/>
-                <xsd:element ref="ns4:MediaServiceObjectDetectorVersions" minOccurs="0"/>
-                <xsd:element ref="ns4:MediaServiceLocation" minOccurs="0"/>
-                <xsd:element ref="ns4:MediaServiceSystemTags" minOccurs="0"/>
-                <xsd:element ref="ns4:MediaServiceSearchProperties" minOccurs="0"/>
-              </xsd:all>
-            </xsd:complexType>
-          </xsd:element>
-        </xsd:sequence>
-      </xsd:complexType>
-    </xsd:element>
-  </xsd:schema>
-  <xsd:schema xmlns:xsd="http://www.w3.org/2001/XMLSchema" xmlns:xs="http://www.w3.org/2001/XMLSchema" xmlns:dms="http://schemas.microsoft.com/office/2006/documentManagement/types" xmlns:pc="http://schemas.microsoft.com/office/infopath/2007/PartnerControls" targetNamespace="ed1181c6-4963-4f9c-a6e4-d7efb21233a0" elementFormDefault="qualified">
-    <xsd:import namespace="http://schemas.microsoft.com/office/2006/documentManagement/types"/>
-    <xsd:import namespace="http://schemas.microsoft.com/office/infopath/2007/PartnerControls"/>
-    <xsd:element name="SharedWithUsers" ma:index="8" nillable="true" ma:displayName="Compartido con" ma:internalName="SharedWithUsers" ma:readOnly="true">
-      <xsd:complexType>
-        <xsd:complexContent>
-          <xsd:extension base="dms:UserMulti">
-            <xsd:sequence>
-              <xsd:element name="UserInfo" minOccurs="0" maxOccurs="unbounded">
-                <xsd:complexType>
-                  <xsd:sequence>
-                    <xsd:element name="DisplayName" type="xsd:string" minOccurs="0"/>
-                    <xsd:element name="AccountId" type="dms:UserId" minOccurs="0" nillable="true"/>
-                    <xsd:element name="AccountType" type="xsd:string" minOccurs="0"/>
-                  </xsd:sequence>
-                </xsd:complexType>
-              </xsd:element>
-            </xsd:sequence>
-          </xsd:extension>
-        </xsd:complexContent>
-      </xsd:complexType>
-    </xsd:element>
-    <xsd:element name="SharedWithDetails" ma:index="9" nillable="true" ma:displayName="Detalles de uso compartido" ma:internalName="SharedWithDetails" ma:readOnly="true">
-      <xsd:simpleType>
-        <xsd:restriction base="dms:Note">
-          <xsd:maxLength value="255"/>
-        </xsd:restriction>
-      </xsd:simpleType>
-    </xsd:element>
-    <xsd:element name="SharingHintHash" ma:index="10" nillable="true" ma:displayName="Hash de la sugerencia para compartir" ma:hidden="true" ma:internalName="SharingHintHash" ma:readOnly="true">
-      <xsd:simpleType>
-        <xsd:restriction base="dms:Text"/>
-      </xsd:simpleType>
-    </xsd:element>
-  </xsd:schema>
-  <xsd:schema xmlns:xsd="http://www.w3.org/2001/XMLSchema" xmlns:xs="http://www.w3.org/2001/XMLSchema" xmlns:dms="http://schemas.microsoft.com/office/2006/documentManagement/types" xmlns:pc="http://schemas.microsoft.com/office/infopath/2007/PartnerControls" targetNamespace="152b35e6-23a1-4beb-a1fd-2689778f6058" elementFormDefault="qualified">
-    <xsd:import namespace="http://schemas.microsoft.com/office/2006/documentManagement/types"/>
-    <xsd:import namespace="http://schemas.microsoft.com/office/infopath/2007/PartnerControls"/>
-    <xsd:element name="MediaServiceMetadata" ma:index="11" nillable="true" ma:displayName="MediaServiceMetadata" ma:hidden="true" ma:internalName="MediaServiceMetadata" ma:readOnly="true">
-      <xsd:simpleType>
-        <xsd:restriction base="dms:Note"/>
-      </xsd:simpleType>
-    </xsd:element>
-    <xsd:element name="MediaServiceFastMetadata" ma:index="12" nillable="true" ma:displayName="MediaServiceFastMetadata" ma:hidden="true" ma:internalName="MediaServiceFastMetadata" ma:readOnly="true">
-      <xsd:simpleType>
-        <xsd:restriction base="dms:Note"/>
-      </xsd:simpleType>
-    </xsd:element>
-    <xsd:element name="MediaServiceDateTaken" ma:index="13" nillable="true" ma:displayName="MediaServiceDateTaken" ma:hidden="true" ma:internalName="MediaServiceDateTaken" ma:readOnly="true">
-      <xsd:simpleType>
-        <xsd:restriction base="dms:Text"/>
-      </xsd:simpleType>
-    </xsd:element>
-    <xsd:element name="MediaServiceAutoTags" ma:index="14" nillable="true" ma:displayName="Tags" ma:internalName="MediaServiceAutoTags" ma:readOnly="true">
-      <xsd:simpleType>
-        <xsd:restriction base="dms:Text"/>
-      </xsd:simpleType>
-    </xsd:element>
-    <xsd:element name="MediaServiceGenerationTime" ma:index="15" nillable="true" ma:displayName="MediaServiceGenerationTime" ma:hidden="true" ma:internalName="MediaServiceGenerationTime" ma:readOnly="true">
-      <xsd:simpleType>
-        <xsd:restriction base="dms:Text"/>
-      </xsd:simpleType>
-    </xsd:element>
-    <xsd:element name="MediaServiceEventHashCode" ma:index="16" nillable="true" ma:displayName="MediaServiceEventHashCode" ma:hidden="true" ma:internalName="MediaServiceEventHashCode" ma:readOnly="true">
-      <xsd:simpleType>
-        <xsd:restriction base="dms:Text"/>
-      </xsd:simpleType>
-    </xsd:element>
-    <xsd:element name="MediaServiceOCR" ma:index="17" nillable="true" ma:displayName="Extracted Text" ma:internalName="MediaServiceOCR" ma:readOnly="true">
-      <xsd:simpleType>
-        <xsd:restriction base="dms:Note">
-          <xsd:maxLength value="255"/>
-        </xsd:restriction>
-      </xsd:simpleType>
-    </xsd:element>
-    <xsd:element name="MediaLengthInSeconds" ma:index="18" nillable="true" ma:displayName="Length (seconds)" ma:internalName="MediaLengthInSeconds" ma:readOnly="true">
-      <xsd:simpleType>
-        <xsd:restriction base="dms:Unknown"/>
-      </xsd:simpleType>
-    </xsd:element>
-    <xsd:element name="MediaServiceAutoKeyPoints" ma:index="19" nillable="true" ma:displayName="MediaServiceAutoKeyPoints" ma:hidden="true" ma:internalName="MediaServiceAutoKeyPoints" ma:readOnly="true">
-      <xsd:simpleType>
-        <xsd:restriction base="dms:Note"/>
-      </xsd:simpleType>
-    </xsd:element>
-    <xsd:element name="MediaServiceKeyPoints" ma:index="20" nillable="true" ma:displayName="KeyPoints" ma:internalName="MediaServiceKeyPoints" ma:readOnly="true">
-      <xsd:simpleType>
-        <xsd:restriction base="dms:Note">
-          <xsd:maxLength value="255"/>
-        </xsd:restriction>
-      </xsd:simpleType>
-    </xsd:element>
-    <xsd:element name="_activity" ma:index="21" nillable="true" ma:displayName="_activity" ma:hidden="true" ma:internalName="_activity">
-      <xsd:simpleType>
-        <xsd:restriction base="dms:Note"/>
-      </xsd:simpleType>
-    </xsd:element>
-    <xsd:element name="MediaServiceObjectDetectorVersions" ma:index="22" nillable="true" ma:displayName="MediaServiceObjectDetectorVersions" ma:hidden="true" ma:indexed="true" ma:internalName="MediaServiceObjectDetectorVersions" ma:readOnly="true">
-      <xsd:simpleType>
-        <xsd:restriction base="dms:Text"/>
-      </xsd:simpleType>
-    </xsd:element>
-    <xsd:element name="MediaServiceLocation" ma:index="23" nillable="true" ma:displayName="Location" ma:indexed="true" ma:internalName="MediaServiceLocation" ma:readOnly="true">
-      <xsd:simpleType>
-        <xsd:restriction base="dms:Text"/>
-      </xsd:simpleType>
-    </xsd:element>
-    <xsd:element name="MediaServiceSystemTags" ma:index="24" nillable="true" ma:displayName="MediaServiceSystemTags" ma:hidden="true" ma:internalName="MediaServiceSystemTags" ma:readOnly="true">
-      <xsd:simpleType>
-        <xsd:restriction base="dms:Note"/>
-      </xsd:simpleType>
-    </xsd:element>
-    <xsd:element name="MediaServiceSearchProperties" ma:index="25" nillable="true" ma:displayName="MediaServiceSearchProperties" ma:hidden="true" ma:internalName="MediaServiceSearchProperties" ma:readOnly="true">
-      <xsd:simpleType>
-        <xsd:restriction base="dms:Note"/>
-      </xsd:simpleType>
-    </xsd:element>
-  </xsd:schema>
-  <xsd:schema xmlns="http://schemas.openxmlformats.org/package/2006/metadata/core-properties" xmlns:xsd="http://www.w3.org/2001/XMLSchema" xmlns:xsi="http://www.w3.org/2001/XMLSchema-instance" xmlns:dc="http://purl.org/dc/elements/1.1/" xmlns:dcterms="http://purl.org/dc/terms/" xmlns:odoc="http://schemas.microsoft.com/internal/obd" targetNamespace="http://schemas.openxmlformats.org/package/2006/metadata/core-properties" elementFormDefault="qualified" attributeFormDefault="unqualified" blockDefault="#all">
-    <xsd:import namespace="http://purl.org/dc/elements/1.1/" schemaLocation="http://dublincore.org/schemas/xmls/qdc/2003/04/02/dc.xsd"/>
-    <xsd:import namespace="http://purl.org/dc/terms/" schemaLocation="http://dublincore.org/schemas/xmls/qdc/2003/04/02/dcterms.xsd"/>
-    <xsd:element name="coreProperties" type="CT_coreProperties"/>
-    <xsd:complexType name="CT_coreProperties">
-      <xsd:all>
-        <xsd:element ref="dc:creator" minOccurs="0" maxOccurs="1"/>
-        <xsd:element ref="dcterms:created" minOccurs="0" maxOccurs="1"/>
-        <xsd:element ref="dc:identifier" minOccurs="0" maxOccurs="1"/>
-        <xsd:element name="contentType" minOccurs="0" maxOccurs="1" type="xsd:string" ma:index="0" ma:displayName="Tipo de contenido"/>
-        <xsd:element ref="dc:title" minOccurs="0" maxOccurs="1" ma:index="4" ma:displayName="Título"/>
-        <xsd:element ref="dc:subject" minOccurs="0" maxOccurs="1"/>
-        <xsd:element ref="dc:description" minOccurs="0" maxOccurs="1"/>
-        <xsd:element name="keywords" minOccurs="0" maxOccurs="1" type="xsd:string"/>
-        <xsd:element ref="dc:language" minOccurs="0" maxOccurs="1"/>
-        <xsd:element name="category" minOccurs="0" maxOccurs="1" type="xsd:string"/>
-        <xsd:element name="version" minOccurs="0" maxOccurs="1" type="xsd:string"/>
-        <xsd:element name="revision" minOccurs="0" maxOccurs="1" type="xsd:string">
-          <xsd:annotation>
-            <xsd:documentation>
-                        This value indicates the number of saves or revisions. The application is responsible for updating this value after each revision.
-                    </xsd:documentation>
-          </xsd:annotation>
-        </xsd:element>
-        <xsd:element name="lastModifiedBy" minOccurs="0" maxOccurs="1" type="xsd:string"/>
-        <xsd:element ref="dcterms:modified" minOccurs="0" maxOccurs="1"/>
-        <xsd:element name="contentStatus" minOccurs="0" maxOccurs="1" type="xsd:string"/>
-      </xsd:all>
-    </xsd:complexType>
-  </xsd:schema>
-  <xs:schema xmlns:pc="http://schemas.microsoft.com/office/infopath/2007/PartnerControls" xmlns:xs="http://www.w3.org/2001/XMLSchema" targetNamespace="http://schemas.microsoft.com/office/infopath/2007/PartnerControls" elementFormDefault="qualified" attributeFormDefault="unqualified">
-    <xs:element name="Person">
-      <xs:complexType>
-        <xs:sequence>
-          <xs:element ref="pc:DisplayName" minOccurs="0"/>
-          <xs:element ref="pc:AccountId" minOccurs="0"/>
-          <xs:element ref="pc:AccountType" minOccurs="0"/>
-        </xs:sequence>
-      </xs:complexType>
-    </xs:element>
-    <xs:element name="DisplayName" type="xs:string"/>
-    <xs:element name="AccountId" type="xs:string"/>
-    <xs:element name="AccountType" type="xs:string"/>
-    <xs:element name="BDCAssociatedEntity">
-      <xs:complexType>
-        <xs:sequence>
-          <xs:element ref="pc:BDCEntity" minOccurs="0" maxOccurs="unbounded"/>
-        </xs:sequence>
-        <xs:attribute ref="pc:EntityNamespace"/>
-        <xs:attribute ref="pc:EntityName"/>
-        <xs:attribute ref="pc:SystemInstanceName"/>
-        <xs:attribute ref="pc:AssociationName"/>
-      </xs:complexType>
-    </xs:element>
-    <xs:attribute name="EntityNamespace" type="xs:string"/>
-    <xs:attribute name="EntityName" type="xs:string"/>
-    <xs:attribute name="SystemInstanceName" type="xs:string"/>
-    <xs:attribute name="AssociationName" type="xs:string"/>
-    <xs:element name="BDCEntity">
-      <xs:complexType>
-        <xs:sequence>
-          <xs:element ref="pc:EntityDisplayName" minOccurs="0"/>
-          <xs:element ref="pc:EntityInstanceReference" minOccurs="0"/>
-          <xs:element ref="pc:EntityId1" minOccurs="0"/>
-          <xs:element ref="pc:EntityId2" minOccurs="0"/>
-          <xs:element ref="pc:EntityId3" minOccurs="0"/>
-          <xs:element ref="pc:EntityId4" minOccurs="0"/>
-          <xs:element ref="pc:EntityId5" minOccurs="0"/>
-        </xs:sequence>
-      </xs:complexType>
-    </xs:element>
-    <xs:element name="EntityDisplayName" type="xs:string"/>
-    <xs:element name="EntityInstanceReference" type="xs:string"/>
-    <xs:element name="EntityId1" type="xs:string"/>
-    <xs:element name="EntityId2" type="xs:string"/>
-    <xs:element name="EntityId3" type="xs:string"/>
-    <xs:element name="EntityId4" type="xs:string"/>
-    <xs:element name="EntityId5" type="xs:string"/>
-    <xs:element name="Terms">
-      <xs:complexType>
-        <xs:sequence>
-          <xs:element ref="pc:TermInfo" minOccurs="0" maxOccurs="unbounded"/>
-        </xs:sequence>
-      </xs:complexType>
-    </xs:element>
-    <xs:element name="TermInfo">
-      <xs:complexType>
-        <xs:sequence>
-          <xs:element ref="pc:TermName" minOccurs="0"/>
-          <xs:element ref="pc:TermId" minOccurs="0"/>
-        </xs:sequence>
-      </xs:complexType>
-    </xs:element>
-    <xs:element name="TermName" type="xs:string"/>
-    <xs:element name="TermId" type="xs:string"/>
-  </xs:schema>
-</ct:contentTypeSchema>
-</file>
-
 <file path=customXml/itemProps1.xml><?xml version="1.0" encoding="utf-8"?>
-<ds:datastoreItem xmlns:ds="http://schemas.openxmlformats.org/officeDocument/2006/customXml" ds:itemID="{7F74FD34-EBDF-4094-A9AD-E46225785B9A}">
-  <ds:schemaRefs>
-    <ds:schemaRef ds:uri="http://schemas.microsoft.com/sharepoint/v3/contenttype/forms"/>
-  </ds:schemaRefs>
-</ds:datastoreItem>
-</file>
-
-<file path=customXml/itemProps2.xml><?xml version="1.0" encoding="utf-8"?>
-<ds:datastoreItem xmlns:ds="http://schemas.openxmlformats.org/officeDocument/2006/customXml" ds:itemID="{B58D4DAF-C7F0-4FA3-950B-89D41305B414}">
-  <ds:schemaRefs>
-    <ds:schemaRef ds:uri="http://schemas.microsoft.com/office/2006/metadata/properties"/>
-    <ds:schemaRef ds:uri="http://schemas.microsoft.com/office/infopath/2007/PartnerControls"/>
-    <ds:schemaRef ds:uri="152b35e6-23a1-4beb-a1fd-2689778f6058"/>
-  </ds:schemaRefs>
-</ds:datastoreItem>
-</file>
-
-<file path=customXml/itemProps3.xml><?xml version="1.0" encoding="utf-8"?>
-<ds:datastoreItem xmlns:ds="http://schemas.openxmlformats.org/officeDocument/2006/customXml" ds:itemID="{2F2CB120-89EE-4E4C-AC3A-037C340CBE59}">
-  <ds:schemaRefs>
-    <ds:schemaRef ds:uri="http://schemas.openxmlformats.org/officeDocument/2006/bibliography"/>
-  </ds:schemaRefs>
-</ds:datastoreItem>
-</file>
-
-<file path=customXml/itemProps4.xml><?xml version="1.0" encoding="utf-8"?>
 <ds:datastoreItem xmlns:ds="http://schemas.openxmlformats.org/officeDocument/2006/customXml" ds:itemID="{71334E21-6B6C-4687-847F-D6F99FF4EBD6}">
   <ds:schemaRefs>
     <ds:schemaRef ds:uri="http://schemas.microsoft.com/office/2006/metadata/contentType"/>
@@ -15684,4 +17958,30 @@
     <ds:schemaRef ds:uri="http://schemas.microsoft.com/internal/obd"/>
   </ds:schemaRefs>
 </ds:datastoreItem>
+</file>
+
+<file path=customXml/itemProps2.xml><?xml version="1.0" encoding="utf-8"?>
+<ds:datastoreItem xmlns:ds="http://schemas.openxmlformats.org/officeDocument/2006/customXml" ds:itemID="{B58D4DAF-C7F0-4FA3-950B-89D41305B414}">
+  <ds:schemaRefs>
+    <ds:schemaRef ds:uri="http://schemas.microsoft.com/office/2006/metadata/properties"/>
+    <ds:schemaRef ds:uri="http://schemas.microsoft.com/office/infopath/2007/PartnerControls"/>
+    <ds:schemaRef ds:uri="152b35e6-23a1-4beb-a1fd-2689778f6058"/>
+  </ds:schemaRefs>
+</ds:datastoreItem>
+</file>
+
+<file path=customXml/itemProps3.xml><?xml version="1.0" encoding="utf-8"?>
+<ds:datastoreItem xmlns:ds="http://schemas.openxmlformats.org/officeDocument/2006/customXml" ds:itemID="{7F74FD34-EBDF-4094-A9AD-E46225785B9A}">
+  <ds:schemaRefs>
+    <ds:schemaRef ds:uri="http://schemas.microsoft.com/sharepoint/v3/contenttype/forms"/>
+  </ds:schemaRefs>
+</ds:datastoreItem>
+</file>
+
+<file path=customXml/itemProps4.xml><?xml version="1.0" encoding="utf-8"?>
+<ds:datastoreItem xmlns:ds="http://schemas.openxmlformats.org/officeDocument/2006/customXml" ds:itemID="{27BD2DDD-D5B5-4DDA-B090-C036D7EEAD0E}">
+  <ds:schemaRefs>
+    <ds:schemaRef ds:uri="http://schemas.openxmlformats.org/officeDocument/2006/bibliography"/>
+  </ds:schemaRefs>
+</ds:datastoreItem>
 </file>
</xml_diff>

<commit_message>
Se trabaja en el artículo y se sube el script de matlab
</commit_message>
<xml_diff>
--- a/Formato Proyecto Investigación.docx
+++ b/Formato Proyecto Investigación.docx
@@ -691,22 +691,6 @@
         </w:rPr>
         <w:tab/>
       </w:r>
-    </w:p>
-    <w:p>
-      <w:pPr>
-        <w:rPr>
-          <w:rFonts w:cs="Times New Roman"/>
-          <w:szCs w:val="24"/>
-        </w:rPr>
-      </w:pPr>
-    </w:p>
-    <w:p>
-      <w:pPr>
-        <w:rPr>
-          <w:rFonts w:cs="Times New Roman"/>
-          <w:szCs w:val="24"/>
-        </w:rPr>
-      </w:pPr>
     </w:p>
     <w:p>
       <w:pPr>
@@ -3134,6 +3118,214 @@
         <w:jc w:val="center"/>
         <w:rPr>
           <w:b/>
+        </w:rPr>
+      </w:pPr>
+    </w:p>
+    <w:p>
+      <w:pPr>
+        <w:jc w:val="center"/>
+        <w:rPr>
+          <w:b/>
+        </w:rPr>
+      </w:pPr>
+    </w:p>
+    <w:p>
+      <w:pPr>
+        <w:jc w:val="center"/>
+        <w:rPr>
+          <w:b/>
+        </w:rPr>
+      </w:pPr>
+    </w:p>
+    <w:p>
+      <w:pPr>
+        <w:jc w:val="center"/>
+        <w:rPr>
+          <w:b/>
+        </w:rPr>
+      </w:pPr>
+    </w:p>
+    <w:p>
+      <w:pPr>
+        <w:jc w:val="center"/>
+        <w:rPr>
+          <w:b/>
+        </w:rPr>
+      </w:pPr>
+    </w:p>
+    <w:p>
+      <w:pPr>
+        <w:jc w:val="center"/>
+        <w:rPr>
+          <w:b/>
+        </w:rPr>
+      </w:pPr>
+    </w:p>
+    <w:p>
+      <w:pPr>
+        <w:jc w:val="center"/>
+        <w:rPr>
+          <w:b/>
+        </w:rPr>
+      </w:pPr>
+    </w:p>
+    <w:p>
+      <w:pPr>
+        <w:jc w:val="center"/>
+        <w:rPr>
+          <w:b/>
+        </w:rPr>
+      </w:pPr>
+    </w:p>
+    <w:p>
+      <w:pPr>
+        <w:jc w:val="center"/>
+        <w:rPr>
+          <w:b/>
+        </w:rPr>
+      </w:pPr>
+    </w:p>
+    <w:p>
+      <w:pPr>
+        <w:jc w:val="center"/>
+        <w:rPr>
+          <w:b/>
+        </w:rPr>
+      </w:pPr>
+    </w:p>
+    <w:p>
+      <w:pPr>
+        <w:jc w:val="center"/>
+        <w:rPr>
+          <w:b/>
+        </w:rPr>
+      </w:pPr>
+    </w:p>
+    <w:p>
+      <w:pPr>
+        <w:jc w:val="center"/>
+        <w:rPr>
+          <w:b/>
+        </w:rPr>
+      </w:pPr>
+    </w:p>
+    <w:p>
+      <w:pPr>
+        <w:jc w:val="center"/>
+        <w:rPr>
+          <w:b/>
+        </w:rPr>
+      </w:pPr>
+    </w:p>
+    <w:p>
+      <w:pPr>
+        <w:jc w:val="center"/>
+        <w:rPr>
+          <w:b/>
+        </w:rPr>
+      </w:pPr>
+    </w:p>
+    <w:p>
+      <w:pPr>
+        <w:jc w:val="center"/>
+        <w:rPr>
+          <w:b/>
+        </w:rPr>
+      </w:pPr>
+    </w:p>
+    <w:p>
+      <w:pPr>
+        <w:jc w:val="center"/>
+        <w:rPr>
+          <w:b/>
+        </w:rPr>
+      </w:pPr>
+    </w:p>
+    <w:p>
+      <w:pPr>
+        <w:jc w:val="center"/>
+        <w:rPr>
+          <w:b/>
+        </w:rPr>
+      </w:pPr>
+    </w:p>
+    <w:p>
+      <w:pPr>
+        <w:jc w:val="center"/>
+        <w:rPr>
+          <w:b/>
+        </w:rPr>
+      </w:pPr>
+    </w:p>
+    <w:p>
+      <w:pPr>
+        <w:jc w:val="center"/>
+        <w:rPr>
+          <w:b/>
+        </w:rPr>
+      </w:pPr>
+    </w:p>
+    <w:p>
+      <w:pPr>
+        <w:jc w:val="center"/>
+        <w:rPr>
+          <w:b/>
+        </w:rPr>
+      </w:pPr>
+    </w:p>
+    <w:p>
+      <w:pPr>
+        <w:jc w:val="center"/>
+        <w:rPr>
+          <w:b/>
+        </w:rPr>
+      </w:pPr>
+    </w:p>
+    <w:p>
+      <w:pPr>
+        <w:jc w:val="center"/>
+        <w:rPr>
+          <w:b/>
+        </w:rPr>
+      </w:pPr>
+    </w:p>
+    <w:p>
+      <w:pPr>
+        <w:jc w:val="center"/>
+        <w:rPr>
+          <w:b/>
+        </w:rPr>
+      </w:pPr>
+    </w:p>
+    <w:p>
+      <w:pPr>
+        <w:jc w:val="center"/>
+        <w:rPr>
+          <w:b/>
+        </w:rPr>
+      </w:pPr>
+    </w:p>
+    <w:p>
+      <w:pPr>
+        <w:jc w:val="center"/>
+        <w:rPr>
+          <w:b/>
+        </w:rPr>
+      </w:pPr>
+    </w:p>
+    <w:p>
+      <w:pPr>
+        <w:jc w:val="center"/>
+        <w:rPr>
+          <w:b/>
+        </w:rPr>
+      </w:pPr>
+    </w:p>
+    <w:p>
+      <w:pPr>
+        <w:jc w:val="center"/>
+        <w:rPr>
+          <w:b/>
           <w:bCs/>
         </w:rPr>
       </w:pPr>
@@ -3142,6 +3334,7 @@
           <w:b/>
           <w:bCs/>
         </w:rPr>
+        <w:lastRenderedPageBreak/>
         <w:t xml:space="preserve">1 </w:t>
       </w:r>
       <w:bookmarkEnd w:id="19"/>
@@ -3250,14 +3443,7 @@
         <w:rPr>
           <w:rFonts w:cs="Times New Roman"/>
         </w:rPr>
-        <w:t xml:space="preserve">integrado de aplicación </w:t>
-      </w:r>
-      <w:r>
-        <w:rPr>
-          <w:rFonts w:cs="Times New Roman"/>
-        </w:rPr>
-        <w:lastRenderedPageBreak/>
-        <w:t xml:space="preserve">específica (ASIC) </w:t>
+        <w:t xml:space="preserve">integrado de aplicación específica (ASIC) </w:t>
       </w:r>
       <w:commentRangeEnd w:id="20"/>
       <w:r>
@@ -3297,7 +3483,14 @@
         <w:rPr>
           <w:rFonts w:cs="Times New Roman"/>
         </w:rPr>
-        <w:t xml:space="preserve">contiene la memoria donde se almacenan los datos. En ocasiones, pueden incluir una red de adaptación, ubicada entre la antena y el chip, para lograr una adaptación de impedancia precisa. El lector consta de una antena, un módulo electrónico de radiofrecuencia, responsable de la comunicación con la etiqueta, y un módulo de control electrónico, responsable de la comunicación con el ordenador central, generalmente conectado al lector para procesar la información entrante de forma centralizada. Los primeros intentos de introducir la tecnología de identificación por radiofrecuencia en las bibliotecas comenzaron a mediados de la década de 1990. La empresa pionera en este aspecto fue 3M (EE. UU.), que desde finales de la década de 1990 comenzó a producir e instalar sistemas de radiofrecuencia en bibliotecas </w:t>
+        <w:t xml:space="preserve">contiene la memoria donde se almacenan los datos. En ocasiones, pueden incluir una red de </w:t>
+      </w:r>
+      <w:r>
+        <w:rPr>
+          <w:rFonts w:cs="Times New Roman"/>
+        </w:rPr>
+        <w:lastRenderedPageBreak/>
+        <w:t xml:space="preserve">adaptación, ubicada entre la antena y el chip, para lograr una adaptación de impedancia precisa. El lector consta de una antena, un módulo electrónico de radiofrecuencia, responsable de la comunicación con la etiqueta, y un módulo de control electrónico, responsable de la comunicación con el ordenador central, generalmente conectado al lector para procesar la información entrante de forma centralizada. Los primeros intentos de introducir la tecnología de identificación por radiofrecuencia en las bibliotecas comenzaron a mediados de la década de 1990. La empresa pionera en este aspecto fue 3M (EE. UU.), que desde finales de la década de 1990 comenzó a producir e instalar sistemas de radiofrecuencia en bibliotecas </w:t>
       </w:r>
       <w:r>
         <w:rPr>
@@ -3381,6 +3574,12 @@
         </w:rPr>
         <w:fldChar w:fldCharType="end"/>
       </w:r>
+      <w:r>
+        <w:rPr>
+          <w:rFonts w:cs="Times New Roman"/>
+        </w:rPr>
+        <w:t>.</w:t>
+      </w:r>
     </w:p>
     <w:p>
       <w:pPr>
@@ -3389,6 +3588,14 @@
           <w:rFonts w:cs="Times New Roman"/>
         </w:rPr>
       </w:pPr>
+    </w:p>
+    <w:p>
+      <w:pPr>
+        <w:ind w:firstLine="708"/>
+        <w:rPr>
+          <w:rFonts w:cs="Times New Roman"/>
+        </w:rPr>
+      </w:pPr>
       <w:r>
         <w:rPr>
           <w:rFonts w:cs="Times New Roman"/>
@@ -3549,18 +3756,26 @@
           <w:rFonts w:cs="Times New Roman"/>
         </w:rPr>
       </w:pPr>
-      <w:r>
-        <w:rPr>
-          <w:rFonts w:cs="Times New Roman"/>
-        </w:rPr>
-        <w:t xml:space="preserve">En HF (13.56 MHz) y UHF (860–960 MHz), el desempeño depende en gran medida de la distancia entre el sensor y la etiqueta, del tipo y grosor de la barrera que los separa, así como de la presencia de objetos sólidos que interfieren con la señal (Informatika et al., 2023). Investigaciones </w:t>
+    </w:p>
+    <w:p>
+      <w:pPr>
+        <w:ind w:firstLine="708"/>
+        <w:rPr>
+          <w:rFonts w:cs="Times New Roman"/>
+        </w:rPr>
+      </w:pPr>
+      <w:r>
+        <w:rPr>
+          <w:rFonts w:cs="Times New Roman"/>
+        </w:rPr>
+        <w:t xml:space="preserve">En HF (13.56 MHz) y UHF (860–960 MHz), el desempeño depende en gran medida de la distancia entre el sensor y la etiqueta, del tipo y grosor de la barrera que los separa, así como de la presencia de objetos sólidos que interfieren con la señal (Informatika et al., 2023). Investigaciones recientes destacan que la frecuencia de operación, el acoplamiento entre antenas y las condiciones del entorno siguen siendo factores críticos para el rendimiento (Khair et al., 2022), lo que reafirma </w:t>
       </w:r>
       <w:r>
         <w:rPr>
           <w:rFonts w:cs="Times New Roman"/>
         </w:rPr>
         <w:lastRenderedPageBreak/>
-        <w:t>recientes destacan que la frecuencia de operación, el acoplamiento entre antenas y las condiciones del entorno siguen siendo factores críticos para el rendimiento (Khair et al., 2022), lo que reafirma observaciones previas realizadas en Japón sobre la sensibilidad del sistema ante estas variables (Fujisaki, 2015).</w:t>
+        <w:t>observaciones previas realizadas en Japón sobre la sensibilidad del sistema ante estas variables (Fujisaki, 2015).</w:t>
       </w:r>
     </w:p>
     <w:p>
@@ -3570,6 +3785,14 @@
           <w:rFonts w:cs="Times New Roman"/>
         </w:rPr>
       </w:pPr>
+    </w:p>
+    <w:p>
+      <w:pPr>
+        <w:ind w:firstLine="708"/>
+        <w:rPr>
+          <w:rFonts w:cs="Times New Roman"/>
+        </w:rPr>
+      </w:pPr>
       <w:r>
         <w:rPr>
           <w:rFonts w:cs="Times New Roman"/>
@@ -3695,6 +3918,14 @@
           <w:rFonts w:cs="Times New Roman"/>
         </w:rPr>
       </w:pPr>
+    </w:p>
+    <w:p>
+      <w:pPr>
+        <w:ind w:firstLine="708"/>
+        <w:rPr>
+          <w:rFonts w:cs="Times New Roman"/>
+        </w:rPr>
+      </w:pPr>
       <w:r>
         <w:rPr>
           <w:rFonts w:cs="Times New Roman"/>
@@ -3779,9 +4010,6 @@
     <w:p>
       <w:pPr>
         <w:ind w:firstLine="708"/>
-        <w:rPr>
-          <w:rFonts w:cs="Times New Roman"/>
-        </w:rPr>
       </w:pPr>
       <w:r>
         <w:rPr>
@@ -3827,8 +4055,12 @@
         </w:rPr>
         <w:t>.</w:t>
       </w:r>
-    </w:p>
-    <w:p>
+      <w:r>
+        <w:rPr>
+          <w:rFonts w:cs="Times New Roman"/>
+        </w:rPr>
+        <w:t xml:space="preserve"> </w:t>
+      </w:r>
       <w:r>
         <w:rPr>
           <w:rFonts w:cs="Times New Roman"/>
@@ -3897,6 +4129,11 @@
     <w:p>
       <w:pPr>
         <w:ind w:firstLine="708"/>
+      </w:pPr>
+    </w:p>
+    <w:p>
+      <w:pPr>
+        <w:ind w:firstLine="708"/>
         <w:rPr>
           <w:rFonts w:cs="Times New Roman"/>
         </w:rPr>
@@ -3976,6 +4213,14 @@
           <w:rFonts w:cs="Times New Roman"/>
         </w:rPr>
       </w:pPr>
+    </w:p>
+    <w:p>
+      <w:pPr>
+        <w:ind w:firstLine="708"/>
+        <w:rPr>
+          <w:rFonts w:cs="Times New Roman"/>
+        </w:rPr>
+      </w:pPr>
       <w:r>
         <w:rPr>
           <w:rFonts w:cs="Times New Roman"/>
@@ -4027,11 +4272,26 @@
           <w:rFonts w:cs="Times New Roman"/>
         </w:rPr>
       </w:pPr>
-      <w:r>
-        <w:rPr>
-          <w:rFonts w:cs="Times New Roman"/>
-        </w:rPr>
-        <w:t xml:space="preserve">Ampliando el panorama, investigaciones globales resaltan que la automatización bibliotecaria, el uso de redes y las tecnologías emergentes son esenciales para mantener la relevancia de las bibliotecas como centros de conocimiento. La integración de RFID, IoT y procesos digitales asegura bibliotecas más dinámicas, seguras y alineadas con las demandas de la era digital </w:t>
+    </w:p>
+    <w:p>
+      <w:pPr>
+        <w:ind w:firstLine="708"/>
+        <w:rPr>
+          <w:rFonts w:cs="Times New Roman"/>
+        </w:rPr>
+      </w:pPr>
+      <w:r>
+        <w:rPr>
+          <w:rFonts w:cs="Times New Roman"/>
+        </w:rPr>
+        <w:t xml:space="preserve">Ampliando el panorama, investigaciones globales resaltan que la automatización bibliotecaria, el uso de redes y las tecnologías emergentes son esenciales para mantener la relevancia de las bibliotecas como centros de conocimiento. La integración de RFID, IoT y </w:t>
+      </w:r>
+      <w:r>
+        <w:rPr>
+          <w:rFonts w:cs="Times New Roman"/>
+        </w:rPr>
+        <w:lastRenderedPageBreak/>
+        <w:t xml:space="preserve">procesos digitales asegura bibliotecas más dinámicas, seguras y alineadas con las demandas de la era digital </w:t>
       </w:r>
       <w:r>
         <w:rPr>
@@ -4094,6 +4354,12 @@
         </w:rPr>
         <w:tab/>
       </w:r>
+      <w:r>
+        <w:rPr>
+          <w:rFonts w:cs="Times New Roman"/>
+        </w:rPr>
+        <w:t>.</w:t>
+      </w:r>
     </w:p>
     <w:p>
       <w:pPr>
@@ -4102,12 +4368,329 @@
           <w:rFonts w:cs="Times New Roman"/>
         </w:rPr>
       </w:pPr>
+    </w:p>
+    <w:p>
+      <w:pPr>
+        <w:ind w:firstLine="708"/>
+        <w:rPr>
+          <w:rFonts w:cs="Times New Roman"/>
+        </w:rPr>
+      </w:pPr>
+      <w:r>
+        <w:rPr>
+          <w:rFonts w:cs="Times New Roman"/>
+        </w:rPr>
+        <w:t>Observando otras implementaciones, se observa que diseñaron e implementaron soluciones orientadas a la automatización de procesos clave, como la circulación, la seguridad, el inventario y la recuperación de libros, sustituyendo los códigos de barras y las tiras electromagnéticas por etiquetas RFID integradas a lectores y antenas instalados en puertas de seguridad, estanterías y kioskos de autoservicio</w:t>
+      </w:r>
+      <w:r>
+        <w:rPr>
+          <w:rFonts w:cs="Times New Roman"/>
+        </w:rPr>
+        <w:fldChar w:fldCharType="begin" w:fldLock="1"/>
+      </w:r>
+      <w:r>
+        <w:rPr>
+          <w:rFonts w:cs="Times New Roman"/>
+        </w:rPr>
+        <w:instrText>ADDIN CSL_CITATION {"citationItems":[{"id":"ITEM-1","itemData":{"author":[{"dropping-particle":"","family":"Wambua","given":"Stephen","non-dropping-particle":"","parse-names":false,"suffix":""}],"id":"ITEM-1","issued":{"date-parts":[["2010"]]},"title":"RFID (Radio Frequency IDentification) technology in Libraries","type":"article-journal"},"uris":["http://www.mendeley.com/documents/?uuid=da2ba388-8d8f-4ed4-b163-77fd5887886e"]}],"mendeley":{"formattedCitation":"(Wambua, 2010)","plainTextFormattedCitation":"(Wambua, 2010)","previouslyFormattedCitation":"(Wambua, 2010)"},"properties":{"noteIndex":0},"schema":"https://github.com/citation-style-language/schema/raw/master/csl-citation.json"}</w:instrText>
+      </w:r>
+      <w:r>
+        <w:rPr>
+          <w:rFonts w:cs="Times New Roman"/>
+        </w:rPr>
+        <w:fldChar w:fldCharType="separate"/>
+      </w:r>
+      <w:r>
+        <w:rPr>
+          <w:rFonts w:cs="Times New Roman"/>
+          <w:noProof/>
+        </w:rPr>
+        <w:t>(Wambua, 2010)</w:t>
+      </w:r>
+      <w:r>
+        <w:rPr>
+          <w:rFonts w:cs="Times New Roman"/>
+        </w:rPr>
+        <w:fldChar w:fldCharType="end"/>
+      </w:r>
+      <w:r>
+        <w:rPr>
+          <w:rFonts w:cs="Times New Roman"/>
+        </w:rPr>
+        <w:t xml:space="preserve"> y respaldado por estudios recientes como en los de </w:t>
+      </w:r>
+      <w:r>
+        <w:rPr>
+          <w:rFonts w:cs="Times New Roman"/>
+        </w:rPr>
+        <w:fldChar w:fldCharType="begin" w:fldLock="1"/>
+      </w:r>
+      <w:r>
+        <w:rPr>
+          <w:rFonts w:cs="Times New Roman"/>
+        </w:rPr>
+        <w:instrText>ADDIN CSL_CITATION {"citationItems":[{"id":"ITEM-1","itemData":{"author":[{"dropping-particle":"","family":"Nadeem Akhtar","given":"Muhammad","non-dropping-particle":"","parse-names":false,"suffix":""},{"dropping-particle":"","family":"Farooque Channar","given":"Ghulam","non-dropping-particle":"","parse-names":false,"suffix":""},{"dropping-particle":"","family":"Naushad Sabzwari","given":"Muhammad","non-dropping-particle":"","parse-names":false,"suffix":""},{"dropping-particle":"","family":"Saeed Hashmi","given":"Ferhana","non-dropping-particle":"","parse-names":false,"suffix":""},{"dropping-particle":"","family":"Waqar Aslam","given":"Muhammad","non-dropping-particle":"","parse-names":false,"suffix":""},{"dropping-particle":"","family":"Batool","given":"Sidra","non-dropping-particle":"","parse-names":false,"suffix":""},{"dropping-particle":"","family":"Shahzad","given":"Khurram","non-dropping-particle":"","parse-names":false,"suffix":""}],"id":"ITEM-1","issue":"4","issued":{"date-parts":[["2025"]]},"page":"417-431","title":"Dialogue Social Science Review ( DSSR ) Investigating the Current Usage and Challenges in Technology in University Libraries of Pakistan Dialogue Social Science Review ( DSSR )","type":"article-journal","volume":"3"},"uris":["http://www.mendeley.com/documents/?uuid=e8268ddc-5545-4c79-855d-89973d963bdf"]}],"mendeley":{"formattedCitation":"(Nadeem Akhtar et al., 2025)","plainTextFormattedCitation":"(Nadeem Akhtar et al., 2025)","previouslyFormattedCitation":"(Radio &amp; Identification, 2025)"},"properties":{"noteIndex":0},"schema":"https://github.com/citation-style-language/schema/raw/master/csl-citation.json"}</w:instrText>
+      </w:r>
+      <w:r>
+        <w:rPr>
+          <w:rFonts w:cs="Times New Roman"/>
+        </w:rPr>
+        <w:fldChar w:fldCharType="separate"/>
+      </w:r>
+      <w:r>
+        <w:rPr>
+          <w:rFonts w:cs="Times New Roman"/>
+          <w:noProof/>
+        </w:rPr>
+        <w:t>(Nadeem Akhtar et al., 2025)</w:t>
+      </w:r>
+      <w:r>
+        <w:rPr>
+          <w:rFonts w:cs="Times New Roman"/>
+        </w:rPr>
+        <w:fldChar w:fldCharType="end"/>
+      </w:r>
+      <w:r>
+        <w:rPr>
+          <w:rFonts w:cs="Times New Roman"/>
+        </w:rPr>
+        <w:t>, donde muestran la eficiencia en la implementación de gestión bibliotecaria por medio de tecnología RFID</w:t>
+      </w:r>
+      <w:r>
+        <w:rPr>
+          <w:rFonts w:cs="Times New Roman"/>
+        </w:rPr>
+        <w:t xml:space="preserve">. Otros trabajos se enfocaron en la gestión de inventario en tiempo real, diseñando, simulando e implementando sistemas capaces de contar y localizar libros directamente en los estantes, superando así las limitaciones de los lectores portátiles y del escaneo manual propio de los códigos de barras </w:t>
+      </w:r>
+      <w:r>
+        <w:rPr>
+          <w:rFonts w:cs="Times New Roman"/>
+        </w:rPr>
+        <w:fldChar w:fldCharType="begin" w:fldLock="1"/>
+      </w:r>
+      <w:r>
+        <w:rPr>
+          <w:rFonts w:cs="Times New Roman"/>
+        </w:rPr>
+        <w:instrText>ADDIN CSL_CITATION {"citationItems":[{"id":"ITEM-1","itemData":{"author":[{"dropping-particle":"","family":"Mvoulabolo","given":"Meryle K","non-dropping-particle":"","parse-names":false,"suffix":""}],"id":"ITEM-1","issue":"December","issued":{"date-parts":[["2019"]]},"title":"DESIGN AND IMPLEMENTATION OF AN INVENTORY MANAGEMENT SYSTEM IN LIBRARIES USING RADIO FREQUENCY IDENTIFICATION A dissertation submitted in the fulfilment of the requirements for Master of Engineering : Electrical Department of Process Control &amp; Computer Sy","type":"article-journal"},"uris":["http://www.mendeley.com/documents/?uuid=53b2dcbf-9def-493b-87da-6c2c443205c2"]}],"mendeley":{"formattedCitation":"(Mvoulabolo, 2019)","plainTextFormattedCitation":"(Mvoulabolo, 2019)","previouslyFormattedCitation":"(Mvoulabolo, 2019)"},"properties":{"noteIndex":0},"schema":"https://github.com/citation-style-language/schema/raw/master/csl-citation.json"}</w:instrText>
+      </w:r>
+      <w:r>
+        <w:rPr>
+          <w:rFonts w:cs="Times New Roman"/>
+        </w:rPr>
+        <w:fldChar w:fldCharType="separate"/>
+      </w:r>
+      <w:r>
+        <w:rPr>
+          <w:rFonts w:cs="Times New Roman"/>
+          <w:noProof/>
+        </w:rPr>
+        <w:t>(Mvoulabolo, 2019)</w:t>
+      </w:r>
+      <w:r>
+        <w:rPr>
+          <w:rFonts w:cs="Times New Roman"/>
+        </w:rPr>
+        <w:fldChar w:fldCharType="end"/>
+      </w:r>
+      <w:r>
+        <w:rPr>
+          <w:rFonts w:cs="Times New Roman"/>
+        </w:rPr>
+        <w:t xml:space="preserve">. También se han desarrollado soluciones más especializadas, como el diseño y prueba de una antena RFID impresa a 915 MHz, optimizada para mejorar la cobertura y la precisión de lectura en múltiples estantes, reduciendo los errores por la orientación de los tags y las restricciones físicas del espacio </w:t>
+      </w:r>
+      <w:r>
+        <w:rPr>
+          <w:rFonts w:cs="Times New Roman"/>
+        </w:rPr>
+        <w:fldChar w:fldCharType="begin" w:fldLock="1"/>
+      </w:r>
+      <w:r>
+        <w:rPr>
+          <w:rFonts w:cs="Times New Roman"/>
+        </w:rPr>
+        <w:instrText>ADDIN CSL_CITATION {"citationItems":[{"id":"ITEM-1","itemData":{"DOI":"10.1051/matecconf/201712300028","ISSN":"2261236X","abstract":"A 915 MHz printed radio-frequency-identification (RFID) antennas with the characteristics of good gain and omnidirectional beam wave is constructed and evaluated in this study. The objective is to find out their best reading rates for providing effective wireless communications among RFID antenna during the library book inventory process. And an optimal library inventory system which is based on electromagnetic identification (EMID) technology is proposed, which is constructed to find the optimal tag location for a book, test the tag readability for bookshelves, and connect a couple of multi-layer bookshelves with multiplexers and updat the tag reading status in the database of the computer terminal. The fabricated antenna reader and the proposed system are embedded into different locations of bookshelves and tested at the library of Cheng Shiu University in Taiwan. According to the experimental results, the designed prototype of the antenna reader has the characteristics of the directional radiation pattern, good gain, simple shape, low cost and is easy to be integrated into the bookshelf. And the designed library inventory system can authenticate the location of a book automatically. They can benefit administrating librarians with the capabilities of decreasing the library inventory processing time and reducing the possibility of the books being misplaced.","author":[{"dropping-particle":"","family":"Cheng","given":"Ching Chien","non-dropping-particle":"","parse-names":false,"suffix":""},{"dropping-particle":"","family":"Shih","given":"Sung Tsun","non-dropping-particle":"","parse-names":false,"suffix":""},{"dropping-particle":"","family":"Cheng","given":"Kong Xin","non-dropping-particle":"","parse-names":false,"suffix":""},{"dropping-particle":"","family":"Kung","given":"Huang Kuang","non-dropping-particle":"","parse-names":false,"suffix":""},{"dropping-particle":"","family":"Wang","given":"Chin Yu","non-dropping-particle":"","parse-names":false,"suffix":""}],"container-title":"MATEC Web of Conferences","id":"ITEM-1","issued":{"date-parts":[["2017"]]},"title":"Design of books inventory with RFID antenna in library management system","type":"article-journal","volume":"123"},"uris":["http://www.mendeley.com/documents/?uuid=efbbf0f9-0d66-42b3-b76e-70b47ef777e2"]}],"mendeley":{"formattedCitation":"(Cheng et al., 2017)","plainTextFormattedCitation":"(Cheng et al., 2017)","previouslyFormattedCitation":"(Cheng et al., 2017)"},"properties":{"noteIndex":0},"schema":"https://github.com/citation-style-language/schema/raw/master/csl-citation.json"}</w:instrText>
+      </w:r>
+      <w:r>
+        <w:rPr>
+          <w:rFonts w:cs="Times New Roman"/>
+        </w:rPr>
+        <w:fldChar w:fldCharType="separate"/>
+      </w:r>
+      <w:r>
+        <w:rPr>
+          <w:rFonts w:cs="Times New Roman"/>
+          <w:noProof/>
+        </w:rPr>
+        <w:t>(Cheng et al., 2017)</w:t>
+      </w:r>
+      <w:r>
+        <w:rPr>
+          <w:rFonts w:cs="Times New Roman"/>
+        </w:rPr>
+        <w:fldChar w:fldCharType="end"/>
+      </w:r>
+      <w:r>
+        <w:rPr>
+          <w:rFonts w:cs="Times New Roman"/>
+        </w:rPr>
+        <w:t>.</w:t>
+      </w:r>
+    </w:p>
+    <w:p>
+      <w:pPr>
+        <w:ind w:firstLine="708"/>
+        <w:rPr>
+          <w:rFonts w:cs="Times New Roman"/>
+        </w:rPr>
+      </w:pPr>
+    </w:p>
+    <w:p>
+      <w:pPr>
+        <w:ind w:firstLine="708"/>
+        <w:rPr>
+          <w:rFonts w:cs="Times New Roman"/>
+        </w:rPr>
+      </w:pPr>
+      <w:r>
+        <w:rPr>
+          <w:rFonts w:cs="Times New Roman"/>
+        </w:rPr>
+        <w:t xml:space="preserve">En el ámbito aplicado, se diseñó e implementó un Smart Portable Library Management System (SPLMS) basado en RFID UHF en la biblioteca Perpustakaan Raja Tun Uda (Malasia), con el propósito de evaluar la eficiencia y efectividad de los lectores RFID en el manejo de inventarios, prestando especial atención a cómo la orientación angular del lector influye en la tasa de lectura de las etiquetas ubicadas en los lomos de los libros </w:t>
+      </w:r>
+      <w:r>
+        <w:rPr>
+          <w:rFonts w:cs="Times New Roman"/>
+        </w:rPr>
+        <w:fldChar w:fldCharType="begin" w:fldLock="1"/>
+      </w:r>
+      <w:r>
+        <w:rPr>
+          <w:rFonts w:cs="Times New Roman"/>
+        </w:rPr>
+        <w:instrText>ADDIN CSL_CITATION {"citationItems":[{"id":"ITEM-1","itemData":{"DOI":"10.24191/JMECHE.V12I1.24642","ISSN":"2550164X","abstract":"Libraries are crucial for diverse resources, particularly for students and educators. The Library Management System (LMS) in Perpustakaan Raja Tun Uda (PRTU) still used barcode technology, which was inadequate and could increase the workload of the librarians. This study presented the development and evaluation of the Smart Portable Library Management System (SPLMS) using RFID technology. The study addressed the gap in the literature by focusing on the impact of angle adjustment on the performance of UHF RFID readers in reading RFID tags placed on book spines. The study was conducted by implementing the SPLMS and performing system testing at different angles. The scope of the study encompassed the design and implementation of the SPLMS, system testing with varying angles, and evaluation of the reader's success rate in reading RFID tags. The validation of ZK-RFID101 of the results have shown that the reader has a 100% success rate for distances between 1 and 3 meters, but the success rate drops to 80% at 5 and 6 meters due to radio frequency interference. The main findings indicated that increasing the angle from 0 to 90-degrees improved the reader's performance, although certain tags still presented challenges. The results from the five conducted trials strongly indicated that a 90-degree angle was the optimum performance. The study concluded that the angle and placement of RFID readers was crucial for optimal performance in library management systems. The SPLMS provided librarians with a user-friendly dashboard for efficient book collection management, boosting productivity and enhancing user experience.","author":[{"dropping-particle":"","family":"Suhaimi","given":"Maizatul Mazni","non-dropping-particle":"","parse-names":false,"suffix":""},{"dropping-particle":"","family":"Mohamed","given":"Zulkifli","non-dropping-particle":"","parse-names":false,"suffix":""},{"dropping-particle":"","family":"Khusaini","given":"Nurul Syuhadah","non-dropping-particle":"","parse-names":false,"suffix":""}],"container-title":"Journal of Mechanical Engineering","id":"ITEM-1","issued":{"date-parts":[["2023"]]},"page":"133-152","title":"Effectiveness of RFID Smart Library Management System","type":"article-journal","volume":"SI12"},"uris":["http://www.mendeley.com/documents/?uuid=1f3d0b09-f64a-4719-b3e7-9c91755768d8"]}],"mendeley":{"formattedCitation":"(Suhaimi et al., 2023)","plainTextFormattedCitation":"(Suhaimi et al., 2023)","previouslyFormattedCitation":"(Suhaimi et al., 2023)"},"properties":{"noteIndex":0},"schema":"https://github.com/citation-style-language/schema/raw/master/csl-citation.json"}</w:instrText>
+      </w:r>
+      <w:r>
+        <w:rPr>
+          <w:rFonts w:cs="Times New Roman"/>
+        </w:rPr>
+        <w:fldChar w:fldCharType="separate"/>
+      </w:r>
+      <w:r>
+        <w:rPr>
+          <w:rFonts w:cs="Times New Roman"/>
+          <w:noProof/>
+        </w:rPr>
+        <w:t>(Suhaimi et al., 2023)</w:t>
+      </w:r>
+      <w:r>
+        <w:rPr>
+          <w:rFonts w:cs="Times New Roman"/>
+        </w:rPr>
+        <w:fldChar w:fldCharType="end"/>
+      </w:r>
+      <w:r>
+        <w:rPr>
+          <w:rFonts w:cs="Times New Roman"/>
+        </w:rPr>
+        <w:t xml:space="preserve">. De manera similar, otros autores propusieron e implementaron sistemas RFID para automatizar préstamos, devoluciones, inventario y seguridad, con el objetivo de reemplazar los códigos de barras tradicionales y mejorar la eficiencia operativa </w:t>
+      </w:r>
+      <w:r>
+        <w:rPr>
+          <w:rFonts w:cs="Times New Roman"/>
+        </w:rPr>
+        <w:fldChar w:fldCharType="begin" w:fldLock="1"/>
+      </w:r>
+      <w:r>
+        <w:rPr>
+          <w:rFonts w:cs="Times New Roman"/>
+        </w:rPr>
+        <w:instrText>ADDIN CSL_CITATION {"citationItems":[{"id":"ITEM-1","itemData":{"DOI":"10.1108/IJEM-05-2017-0129","ISBN":"9788195275700","ISSN":"0951354X","abstract":"Purpose: The purpose of this paper is to research on knowledge management (KM) in higher education institutions (HEIs) by studying its processes, knowledge creation (KC), knowledge sharing (KS) and knowledge transfer (KT), in Mauritius. Design/methodology/approach: Semi-structured interviews were conducted with senior staff in the main public and private HEIs in Mauritius. Questions focussed on KM strategy and processes. Interviews were recorded and transcribed prior to thematic analysis. Findings: Although participants could discuss KM processes, none of the participating institutions had a KM strategy. All institutions are involved in KC and acquisition, KS and KT. In addition to research, knowledge was regarded as being created through teaching and learning activities, consultancies, organisational documentation and acquisition from external sources. Knowledge is shared among peers during departmental and curriculum meetings, through annual research seminars and during conferences and publications in journals. KT with industry through consultancies is restricted to a few public HEIs. In the remaining HEIs, KT is limited to their students joining the workforce and to organising tailor-made courses and training programmes for public and private institutions. The study also provides evidence that some processes and activities contribute to more than one of KC, sharing and transfer. Originality/value: This study contributes to the very limited body of research into KM processes in countries with developing higher education sectors. In addition, this research disaggregates the processes associated with KC, sharing and transfer, whilst also examining the relationship between them.","author":[{"dropping-particle":"","family":"Veer Ramjeawon","given":"Poonam","non-dropping-particle":"","parse-names":false,"suffix":""},{"dropping-particle":"","family":"Rowley","given":"Jennifer","non-dropping-particle":"","parse-names":false,"suffix":""}],"container-title":"International Journal of Educational Management","id":"ITEM-1","issue":"7","issued":{"date-parts":[["2018"]]},"number-of-pages":"1319-1332","title":"Knowledge management in higher education institutions in Mauritius","type":"book","volume":"32"},"uris":["http://www.mendeley.com/documents/?uuid=8f8efa09-eb87-43cb-a632-b492359a6153"]}],"mendeley":{"formattedCitation":"(Veer Ramjeawon &amp; Rowley, 2018)","plainTextFormattedCitation":"(Veer Ramjeawon &amp; Rowley, 2018)","previouslyFormattedCitation":"(Veer Ramjeawon &amp; Rowley, 2018)"},"properties":{"noteIndex":0},"schema":"https://github.com/citation-style-language/schema/raw/master/csl-citation.json"}</w:instrText>
+      </w:r>
+      <w:r>
+        <w:rPr>
+          <w:rFonts w:cs="Times New Roman"/>
+        </w:rPr>
+        <w:fldChar w:fldCharType="separate"/>
+      </w:r>
+      <w:r>
+        <w:rPr>
+          <w:rFonts w:cs="Times New Roman"/>
+          <w:noProof/>
+        </w:rPr>
+        <w:t>(Veer Ramjeawon &amp; Rowley, 2018)</w:t>
+      </w:r>
+      <w:r>
+        <w:rPr>
+          <w:rFonts w:cs="Times New Roman"/>
+        </w:rPr>
+        <w:fldChar w:fldCharType="end"/>
+      </w:r>
+      <w:r>
+        <w:rPr>
+          <w:rFonts w:cs="Times New Roman"/>
+        </w:rPr>
+        <w:t xml:space="preserve">. Desde una perspectiva más amplia, algunos estudios realizaron una revisión de casos internacionales de implementación de RFID en bibliotecas, evaluando su papel en la automatización de inventarios, la circulación, la seguridad, el autoservicio y la mejora de la experiencia de usuario </w:t>
+      </w:r>
+      <w:r>
+        <w:rPr>
+          <w:rFonts w:cs="Times New Roman"/>
+        </w:rPr>
+        <w:fldChar w:fldCharType="begin" w:fldLock="1"/>
+      </w:r>
+      <w:r>
+        <w:rPr>
+          <w:rFonts w:cs="Times New Roman"/>
+        </w:rPr>
+        <w:instrText>ADDIN CSL_CITATION {"citationItems":[{"id":"ITEM-1","itemData":{"DOI":"10.26761/ijrls.10.4.2024.1795","author":[{"dropping-particle":"","family":"Patil","given":"Somanagouda Shankargouda","non-dropping-particle":"","parse-names":false,"suffix":""},{"dropping-particle":"","family":"Dasar","given":"Manjunath G","non-dropping-particle":"","parse-names":false,"suffix":""},{"dropping-particle":"","family":"Melinamani","given":"Pooja Ravi","non-dropping-particle":"","parse-names":false,"suffix":""},{"dropping-particle":"","family":"Patil","given":"Jyoti","non-dropping-particle":"","parse-names":false,"suffix":""},{"dropping-particle":"","family":"Waddar","given":"Nataraj","non-dropping-particle":"","parse-names":false,"suffix":""}],"container-title":"International Journal of Research in Library Science","id":"ITEM-1","issue":"4","issued":{"date-parts":[["2024"]]},"page":"57-66","title":"Unlocking Efficiency: The Role of Radio Frequency Identification (RFID) Technology in Modernizing Library Management Systems","type":"article-journal","volume":"10"},"uris":["http://www.mendeley.com/documents/?uuid=308df8b7-deed-4a41-90e5-725d25859928"]}],"mendeley":{"formattedCitation":"(Patil et al., 2024)","plainTextFormattedCitation":"(Patil et al., 2024)","previouslyFormattedCitation":"(Patil et al., 2024)"},"properties":{"noteIndex":0},"schema":"https://github.com/citation-style-language/schema/raw/master/csl-citation.json"}</w:instrText>
+      </w:r>
+      <w:r>
+        <w:rPr>
+          <w:rFonts w:cs="Times New Roman"/>
+        </w:rPr>
+        <w:fldChar w:fldCharType="separate"/>
+      </w:r>
+      <w:r>
+        <w:rPr>
+          <w:rFonts w:cs="Times New Roman"/>
+          <w:noProof/>
+        </w:rPr>
+        <w:t>(Patil et al., 2024)</w:t>
+      </w:r>
+      <w:r>
+        <w:rPr>
+          <w:rFonts w:cs="Times New Roman"/>
+        </w:rPr>
+        <w:fldChar w:fldCharType="end"/>
+      </w:r>
+      <w:r>
+        <w:rPr>
+          <w:rFonts w:cs="Times New Roman"/>
+        </w:rPr>
+        <w:t xml:space="preserve">. </w:t>
+      </w:r>
+    </w:p>
+    <w:p>
+      <w:pPr>
+        <w:ind w:firstLine="708"/>
+        <w:rPr>
+          <w:rFonts w:cs="Times New Roman"/>
+        </w:rPr>
+      </w:pPr>
+    </w:p>
+    <w:p>
+      <w:pPr>
+        <w:ind w:firstLine="708"/>
+        <w:rPr>
+          <w:rFonts w:cs="Times New Roman"/>
+        </w:rPr>
+      </w:pPr>
       <w:r>
         <w:rPr>
           <w:rFonts w:cs="Times New Roman"/>
         </w:rPr>
         <w:lastRenderedPageBreak/>
-        <w:t>Observando otras implementaciones, se observa que diseñaron e implementaron soluciones orientadas a la automatización de procesos clave, como la circulación, la seguridad, el inventario y la recuperación de libros, sustituyendo los códigos de barras y las tiras electromagnéticas por etiquetas RFID integradas a lectores y antenas instalados en puertas de seguridad, estanterías y kioskos de autoservicio</w:t>
+        <w:t xml:space="preserve">En el plano innovador, se han desarrollado sistemas inteligentes que integran RFID con técnicas de machine learning, los cuales no solo automatizan los procesos de circulación, sino que además permiten identificar los libros más y menos utilizados, calcular multas de manera automática, clasificar libros por departamento y predecir cuáles deben descartarse por bajo uso o deterioro </w:t>
       </w:r>
       <w:r>
         <w:rPr>
@@ -4119,7 +4702,7 @@
         <w:rPr>
           <w:rFonts w:cs="Times New Roman"/>
         </w:rPr>
-        <w:instrText>ADDIN CSL_CITATION {"citationItems":[{"id":"ITEM-1","itemData":{"author":[{"dropping-particle":"","family":"Wambua","given":"Stephen","non-dropping-particle":"","parse-names":false,"suffix":""}],"id":"ITEM-1","issued":{"date-parts":[["2010"]]},"title":"RFID (Radio Frequency IDentification) technology in Libraries","type":"article-journal"},"uris":["http://www.mendeley.com/documents/?uuid=da2ba388-8d8f-4ed4-b163-77fd5887886e"]}],"mendeley":{"formattedCitation":"(Wambua, 2010)","plainTextFormattedCitation":"(Wambua, 2010)","previouslyFormattedCitation":"(Wambua, 2010)"},"properties":{"noteIndex":0},"schema":"https://github.com/citation-style-language/schema/raw/master/csl-citation.json"}</w:instrText>
+        <w:instrText>ADDIN CSL_CITATION {"citationItems":[{"id":"ITEM-1","itemData":{"DOI":"10.1109/CONECCT52877.2021.9622566","ISBN":"9781665428491","abstract":"The term RFID stands for Frequency Identification Technology that may be a distinctive technology that uses magnetism fields to keep track of things, products or objects. Intelligent-RFID Technology in libraries helps us to analyze and predict the demand of books, books that are less utilized, count of books issued in each department, fine calculation, book enquiry, percentage ratio of total number of books in the library to total books issued, thus imparting intelligence to libraries. The process of automating the library tasks addresses the issues relating to book-searching, and tracking, thereby ensuring the safety and security of library materials. This paper proposes an Intelligent and Automated RFID based library management system along with user interface for different types that enables the quick flow of books. A PyQt web portal is designed for creating user interface to perform the desired library tasks and predictive analysis. In addition, data processing is performed to analyze various parameters required to produce statistical analysis on extensively used or less used books, which helps us to protect or discard the books from time to time and prevent the library assets from termite attacks. Fine calculation helps to calculate the fine and send text information to the users in case of expiry of due dates or lost books from some of the borrowers.","author":[{"dropping-particle":"","family":"Neha Mukund","given":"R.","non-dropping-particle":"","parse-names":false,"suffix":""},{"dropping-particle":"","family":"Arun","given":"Sanjana","non-dropping-particle":"","parse-names":false,"suffix":""},{"dropping-particle":"","family":"Kusuma","given":"S. M.","non-dropping-particle":"","parse-names":false,"suffix":""},{"dropping-particle":"","family":"Vishak","given":"K. R.","non-dropping-particle":"","parse-names":false,"suffix":""},{"dropping-particle":"","family":"Monisha","given":"M.","non-dropping-particle":"","parse-names":false,"suffix":""}],"container-title":"Proceedings of CONECCT 2021: 7th IEEE International Conference on Electronics, Computing and Communication Technologies","id":"ITEM-1","issue":"Id","issued":{"date-parts":[["2021"]]},"title":"Intelligent RFID Based Library Management System","type":"article-journal"},"uris":["http://www.mendeley.com/documents/?uuid=77f2ef32-027e-4f52-949b-cca835c20e29"]}],"mendeley":{"formattedCitation":"(Neha Mukund et al., 2021)","plainTextFormattedCitation":"(Neha Mukund et al., 2021)","previouslyFormattedCitation":"(Neha Mukund et al., 2021)"},"properties":{"noteIndex":0},"schema":"https://github.com/citation-style-language/schema/raw/master/csl-citation.json"}</w:instrText>
       </w:r>
       <w:r>
         <w:rPr>
@@ -4132,7 +4715,7 @@
           <w:rFonts w:cs="Times New Roman"/>
           <w:noProof/>
         </w:rPr>
-        <w:t>(Wambua, 2010)</w:t>
+        <w:t>(Neha Mukund et al., 2021)</w:t>
       </w:r>
       <w:r>
         <w:rPr>
@@ -4144,7 +4727,7 @@
         <w:rPr>
           <w:rFonts w:cs="Times New Roman"/>
         </w:rPr>
-        <w:t xml:space="preserve"> y respaldado por estudios recientes como en los de </w:t>
+        <w:t xml:space="preserve">. Finalmente, otros enfoques se centraron en reforzar la seguridad de las colecciones mediante sistemas RFID que automatizan préstamos, devoluciones y renovaciones, al tiempo que ofrecen mayor capacidad de detección de robos, superando las limitaciones de los códigos de barras en cuanto a la necesidad de línea de visión y el escaneo individualizado </w:t>
       </w:r>
       <w:r>
         <w:rPr>
@@ -4156,7 +4739,7 @@
         <w:rPr>
           <w:rFonts w:cs="Times New Roman"/>
         </w:rPr>
-        <w:instrText>ADDIN CSL_CITATION {"citationItems":[{"id":"ITEM-1","itemData":{"author":[{"dropping-particle":"","family":"Nadeem Akhtar","given":"Muhammad","non-dropping-particle":"","parse-names":false,"suffix":""},{"dropping-particle":"","family":"Farooque Channar","given":"Ghulam","non-dropping-particle":"","parse-names":false,"suffix":""},{"dropping-particle":"","family":"Naushad Sabzwari","given":"Muhammad","non-dropping-particle":"","parse-names":false,"suffix":""},{"dropping-particle":"","family":"Saeed Hashmi","given":"Ferhana","non-dropping-particle":"","parse-names":false,"suffix":""},{"dropping-particle":"","family":"Waqar Aslam","given":"Muhammad","non-dropping-particle":"","parse-names":false,"suffix":""},{"dropping-particle":"","family":"Batool","given":"Sidra","non-dropping-particle":"","parse-names":false,"suffix":""},{"dropping-particle":"","family":"Shahzad","given":"Khurram","non-dropping-particle":"","parse-names":false,"suffix":""}],"id":"ITEM-1","issue":"4","issued":{"date-parts":[["2025"]]},"page":"417-431","title":"Dialogue Social Science Review ( DSSR ) Investigating the Current Usage and Challenges in Technology in University Libraries of Pakistan Dialogue Social Science Review ( DSSR )","type":"article-journal","volume":"3"},"uris":["http://www.mendeley.com/documents/?uuid=e8268ddc-5545-4c79-855d-89973d963bdf"]}],"mendeley":{"formattedCitation":"(Nadeem Akhtar et al., 2025)","plainTextFormattedCitation":"(Nadeem Akhtar et al., 2025)","previouslyFormattedCitation":"(Radio &amp; Identification, 2025)"},"properties":{"noteIndex":0},"schema":"https://github.com/citation-style-language/schema/raw/master/csl-citation.json"}</w:instrText>
+        <w:instrText>ADDIN CSL_CITATION {"citationItems":[{"id":"ITEM-1","itemData":{"ISBN":"9788195588473","author":[{"dropping-particle":"","family":"Kumari","given":"Kirna","non-dropping-particle":"","parse-names":false,"suffix":""}],"id":"ITEM-1","issue":"December","issued":{"date-parts":[["2022"]]},"title":"CONFERENCE PROCEEDING OF INTERNATIONAL MULTIDISCIPLINARY CONFERENCE 2022 Volume 1 , December 2022 ISBN : 978-81-955884-7-3 Conference Proceeding of International Multidisciplinary Conference 2022","type":"book","volume":"1"},"uris":["http://www.mendeley.com/documents/?uuid=b3f7776c-d629-423f-88ea-a849278495ae"]}],"mendeley":{"formattedCitation":"(Kumari, 2022)","plainTextFormattedCitation":"(Kumari, 2022)","previouslyFormattedCitation":"(Kumari, 2022)"},"properties":{"noteIndex":0},"schema":"https://github.com/citation-style-language/schema/raw/master/csl-citation.json"}</w:instrText>
       </w:r>
       <w:r>
         <w:rPr>
@@ -4169,7 +4752,7 @@
           <w:rFonts w:cs="Times New Roman"/>
           <w:noProof/>
         </w:rPr>
-        <w:t>(Nadeem Akhtar et al., 2025)</w:t>
+        <w:t>(Kumari, 2022)</w:t>
       </w:r>
       <w:r>
         <w:rPr>
@@ -4181,13 +4764,29 @@
         <w:rPr>
           <w:rFonts w:cs="Times New Roman"/>
         </w:rPr>
-        <w:t>, donde muestran la eficiencia en la implementación de gestión bibliotecaria por medio de tecnología RFID</w:t>
-      </w:r>
-      <w:r>
-        <w:rPr>
-          <w:rFonts w:cs="Times New Roman"/>
-        </w:rPr>
-        <w:t xml:space="preserve">. Otros trabajos se enfocaron en la gestión de inventario en tiempo real, diseñando, simulando e implementando sistemas capaces de contar y localizar libros directamente en los estantes, superando así las limitaciones de los lectores portátiles y del escaneo manual propio de los códigos de barras </w:t>
+        <w:t>.</w:t>
+      </w:r>
+    </w:p>
+    <w:p>
+      <w:pPr>
+        <w:ind w:firstLine="708"/>
+        <w:rPr>
+          <w:rFonts w:cs="Times New Roman"/>
+        </w:rPr>
+      </w:pPr>
+    </w:p>
+    <w:p>
+      <w:pPr>
+        <w:ind w:firstLine="708"/>
+        <w:rPr>
+          <w:rFonts w:cs="Times New Roman"/>
+        </w:rPr>
+      </w:pPr>
+      <w:r>
+        <w:rPr>
+          <w:rFonts w:cs="Times New Roman"/>
+        </w:rPr>
+        <w:t xml:space="preserve">En conclusión, en términos de seguridad bibliotecaria, la tecnología RFID no solo es más avanzada, sino también más práctica, conveniente y asequible. En el ámbito de los materiales bibliotecarios, esta tecnología está reemplazando gradualmente al código de barras convencional. El uso de RFID en bibliotecas agiliza los procesos de préstamo, monitoreo y búsqueda de libros, liberando al personal para que se concentre en brindar un mejor servicio al usuario. Las etiquetas y lectores RFID deben ser de alta calidad para un rendimiento óptimo. La información que debe escribirse en las etiquetas es otro factor que influye en la eficacia del uso de la tecnología. Estos programas pueden mejorar el servicio al cliente, reducir el robo de libros, reducir significativamente los gastos de mano de obra y actualizar continuamente los registros de nuevas colecciones de libros. </w:t>
       </w:r>
       <w:r>
         <w:rPr>
@@ -4199,7 +4798,7 @@
         <w:rPr>
           <w:rFonts w:cs="Times New Roman"/>
         </w:rPr>
-        <w:instrText>ADDIN CSL_CITATION {"citationItems":[{"id":"ITEM-1","itemData":{"author":[{"dropping-particle":"","family":"Mvoulabolo","given":"Meryle K","non-dropping-particle":"","parse-names":false,"suffix":""}],"id":"ITEM-1","issue":"December","issued":{"date-parts":[["2019"]]},"title":"DESIGN AND IMPLEMENTATION OF AN INVENTORY MANAGEMENT SYSTEM IN LIBRARIES USING RADIO FREQUENCY IDENTIFICATION A dissertation submitted in the fulfilment of the requirements for Master of Engineering : Electrical Department of Process Control &amp; Computer Sy","type":"article-journal"},"uris":["http://www.mendeley.com/documents/?uuid=53b2dcbf-9def-493b-87da-6c2c443205c2"]}],"mendeley":{"formattedCitation":"(Mvoulabolo, 2019)","plainTextFormattedCitation":"(Mvoulabolo, 2019)","previouslyFormattedCitation":"(Mvoulabolo, 2019)"},"properties":{"noteIndex":0},"schema":"https://github.com/citation-style-language/schema/raw/master/csl-citation.json"}</w:instrText>
+        <w:instrText>ADDIN CSL_CITATION {"citationItems":[{"id":"ITEM-1","itemData":{"DOI":"10.47604/ijts.2041","abstract":"Purpose: The aim of this project is to design and build a library management system based on radio frequency identification that will help the librarian manage the shelves with less human involvement.\r Methodology: A dc supply at +5volts was connected to the microcontroller, with a voltage of +12volts dc connected to the buzzer, and a step-down transformer was used to convert 220volts to 5volts in this system. This power supply was connected to the switch, and by pressing a switch button, the current passed through the entire circuit. RFID collects all the data from the RFID tag. Using a UART module, the EM-18 RFID reader module was connected to 5v pic microcontrollers. The EM-1 RFID reader will read the tag number from an RFID tag when it is placed in its field of operation and output the information via a TX terminal. In order to signal successful tag detection, the beep terminal will turn low. Once the card is in front of the RFID reader, the student extracts the data from it and compares it to the data that is stored in the microprocessor, which is coded using embedded c language. If the data matches, the information is shown on the LCD.\r Finding: A library management system based on radio frequency identification and detection (RFID) was developed in this study to improve library use and management. To efficiently identify and manage the books, it will make use of the RFID reader. The student can search the database and, if the book is available, pick it up from the library because the database displays the book's availability at the library. The main advantages of this project in libraries include time savings, quick access to books, and the elimination of manual errors.\r Unique Contribution to Theory, Practice and policy: Every inventive technical design has its limits. This passive RFID-based library management system has some limitations as a technology for precise data collection. This study recommend that the RFID reader should be improved so that it has finger and thumb print access, which is needed to access student data and details. However, it should also include a facial recognition application, which would further strengthen the biometric security of the system and protect it from impersonation by careless students.","author":[{"dropping-particle":"","family":"Yusuf","given":"Moshood","non-dropping-particle":"","parse-names":false,"suffix":""},{"dropping-particle":"","family":"Akintunde","given":"Adigun","non-dropping-particle":"","parse-names":false,"suffix":""},{"dropping-particle":"","family":"Habeeb","given":"Shittu","non-dropping-particle":"","parse-names":false,"suffix":""},{"dropping-particle":"","family":"Quadri","given":"Adeyinka","non-dropping-particle":"","parse-names":false,"suffix":""}],"container-title":"International Journal of Technology and Systems","id":"ITEM-1","issue":"2","issued":{"date-parts":[["2023"]]},"page":"21-35","title":"Radio Frequency Identification (RFID) Based Library Management System","type":"article-journal","volume":"8"},"uris":["http://www.mendeley.com/documents/?uuid=a044af89-7407-4371-90c0-df23e6b6ed15","http://www.mendeley.com/documents/?uuid=48715fcd-d25c-420b-b3d1-066ce17ef2e0"]}],"mendeley":{"formattedCitation":"(Yusuf et al., 2023)","plainTextFormattedCitation":"(Yusuf et al., 2023)","previouslyFormattedCitation":"(Yusuf et al., 2023)"},"properties":{"noteIndex":0},"schema":"https://github.com/citation-style-language/schema/raw/master/csl-citation.json"}</w:instrText>
       </w:r>
       <w:r>
         <w:rPr>
@@ -4212,7 +4811,7 @@
           <w:rFonts w:cs="Times New Roman"/>
           <w:noProof/>
         </w:rPr>
-        <w:t>(Mvoulabolo, 2019)</w:t>
+        <w:t>(Yusuf et al., 2023)</w:t>
       </w:r>
       <w:r>
         <w:rPr>
@@ -4224,7 +4823,7 @@
         <w:rPr>
           <w:rFonts w:cs="Times New Roman"/>
         </w:rPr>
-        <w:t xml:space="preserve">. También se han desarrollado soluciones más especializadas, como el diseño y prueba de una antena RFID impresa a 915 MHz, optimizada para mejorar la cobertura y la precisión de lectura en múltiples estantes, reduciendo los errores por la orientación de los tags y las restricciones físicas del espacio </w:t>
+        <w:t xml:space="preserve">, y de igual manera, </w:t>
       </w:r>
       <w:r>
         <w:rPr>
@@ -4236,7 +4835,7 @@
         <w:rPr>
           <w:rFonts w:cs="Times New Roman"/>
         </w:rPr>
-        <w:instrText>ADDIN CSL_CITATION {"citationItems":[{"id":"ITEM-1","itemData":{"DOI":"10.1051/matecconf/201712300028","ISSN":"2261236X","abstract":"A 915 MHz printed radio-frequency-identification (RFID) antennas with the characteristics of good gain and omnidirectional beam wave is constructed and evaluated in this study. The objective is to find out their best reading rates for providing effective wireless communications among RFID antenna during the library book inventory process. And an optimal library inventory system which is based on electromagnetic identification (EMID) technology is proposed, which is constructed to find the optimal tag location for a book, test the tag readability for bookshelves, and connect a couple of multi-layer bookshelves with multiplexers and updat the tag reading status in the database of the computer terminal. The fabricated antenna reader and the proposed system are embedded into different locations of bookshelves and tested at the library of Cheng Shiu University in Taiwan. According to the experimental results, the designed prototype of the antenna reader has the characteristics of the directional radiation pattern, good gain, simple shape, low cost and is easy to be integrated into the bookshelf. And the designed library inventory system can authenticate the location of a book automatically. They can benefit administrating librarians with the capabilities of decreasing the library inventory processing time and reducing the possibility of the books being misplaced.","author":[{"dropping-particle":"","family":"Cheng","given":"Ching Chien","non-dropping-particle":"","parse-names":false,"suffix":""},{"dropping-particle":"","family":"Shih","given":"Sung Tsun","non-dropping-particle":"","parse-names":false,"suffix":""},{"dropping-particle":"","family":"Cheng","given":"Kong Xin","non-dropping-particle":"","parse-names":false,"suffix":""},{"dropping-particle":"","family":"Kung","given":"Huang Kuang","non-dropping-particle":"","parse-names":false,"suffix":""},{"dropping-particle":"","family":"Wang","given":"Chin Yu","non-dropping-particle":"","parse-names":false,"suffix":""}],"container-title":"MATEC Web of Conferences","id":"ITEM-1","issued":{"date-parts":[["2017"]]},"title":"Design of books inventory with RFID antenna in library management system","type":"article-journal","volume":"123"},"uris":["http://www.mendeley.com/documents/?uuid=efbbf0f9-0d66-42b3-b76e-70b47ef777e2"]}],"mendeley":{"formattedCitation":"(Cheng et al., 2017)","plainTextFormattedCitation":"(Cheng et al., 2017)","previouslyFormattedCitation":"(Cheng et al., 2017)"},"properties":{"noteIndex":0},"schema":"https://github.com/citation-style-language/schema/raw/master/csl-citation.json"}</w:instrText>
+        <w:instrText>ADDIN CSL_CITATION {"citationItems":[{"id":"ITEM-1","itemData":{"author":[{"dropping-particle":"","family":"Nayak","given":"Rajib","non-dropping-particle":"","parse-names":false,"suffix":""},{"dropping-particle":"","family":"Singh","given":"Dharamvir","non-dropping-particle":"","parse-names":false,"suffix":""}],"id":"ITEM-1","issue":"7","issued":{"date-parts":[["2024"]]},"page":"1-7","title":"Challenges and Prospects of RFID Implementation in Academic Libraries of Challenges and Prospects of RFID Implementation in Academic Libraries of North East India","type":"article-journal","volume":"5"},"uris":["http://www.mendeley.com/documents/?uuid=e0ea4296-db88-45df-a22d-06dbdf02fb55","http://www.mendeley.com/documents/?uuid=ccf58a1c-812f-4e26-a583-1ce14765dfac"]}],"mendeley":{"formattedCitation":"(Nayak &amp; Singh, 2024)","plainTextFormattedCitation":"(Nayak &amp; Singh, 2024)","previouslyFormattedCitation":"(Nayak &amp; Singh, 2024)"},"properties":{"noteIndex":0},"schema":"https://github.com/citation-style-language/schema/raw/master/csl-citation.json"}</w:instrText>
       </w:r>
       <w:r>
         <w:rPr>
@@ -4249,7 +4848,7 @@
           <w:rFonts w:cs="Times New Roman"/>
           <w:noProof/>
         </w:rPr>
-        <w:t>(Cheng et al., 2017)</w:t>
+        <w:t>(Nayak &amp; Singh, 2024)</w:t>
       </w:r>
       <w:r>
         <w:rPr>
@@ -4261,6 +4860,41 @@
         <w:rPr>
           <w:rFonts w:cs="Times New Roman"/>
         </w:rPr>
+        <w:t xml:space="preserve"> nos explica que la tecnología RFID representa una oportunidad transformadora para la comunidad bibliotecaria, lista para redefinir la gestión bibliotecaria tradicional en los próximos años. Su capacidad para el inventario a alta velocidad y la identificación eficiente de artículos extraviados la convierten en una herramienta indispensable para las bibliotecas modernas.</w:t>
+      </w:r>
+    </w:p>
+    <w:p>
+      <w:pPr>
+        <w:ind w:firstLine="708"/>
+        <w:rPr>
+          <w:rFonts w:cs="Times New Roman"/>
+        </w:rPr>
+      </w:pPr>
+    </w:p>
+    <w:p>
+      <w:pPr>
+        <w:ind w:firstLine="708"/>
+        <w:rPr>
+          <w:rFonts w:cs="Times New Roman"/>
+        </w:rPr>
+      </w:pPr>
+      <w:r>
+        <w:rPr>
+          <w:rFonts w:cs="Times New Roman"/>
+        </w:rPr>
+        <w:t xml:space="preserve">Las bibliotecas universitarias enfrentan pérdidas de colección, inventarios lentos y errores en circulación que elevan costos operativos y deterioran la experiencia del usuario. Las soluciones con códigos de barras requieren línea de vista y escaneo individual, lo que limita la eficiencia en estantes y controles de salida. Aunque RFID ha mostrado mejoras en trazabilidad, autoservicio e inventario, su desempeño depende de la banda (HF/UHF), la orientación de etiquetas, los </w:t>
+      </w:r>
+      <w:r>
+        <w:rPr>
+          <w:rFonts w:cs="Times New Roman"/>
+        </w:rPr>
+        <w:lastRenderedPageBreak/>
+        <w:t>materiales y la integración con el SIGB; además, persisten barreras de costo total de propiedad, estandarización y privacidad. En nuestro contexto, no existe un diseño específico que optimice simultáneamente la circulación segura (HF, mostradores/portales) y el inventario rápido en estanterías (UHF) con alta tasa de acierto en lomos apilados y anti-colisión, interoperando con el SIGB. Este proyecto aborda dicha brecha mediante el diseño y validación de un sistema RFID para control e identificación eficiente de libros, con metas de reducción de tiempos de inventario, incremento de tasas de lectura y disminución de pérdidas</w:t>
+      </w:r>
+      <w:r>
+        <w:rPr>
+          <w:rFonts w:cs="Times New Roman"/>
+        </w:rPr>
         <w:t>.</w:t>
       </w:r>
     </w:p>
@@ -4271,122 +4905,53 @@
           <w:rFonts w:cs="Times New Roman"/>
         </w:rPr>
       </w:pPr>
-      <w:r>
-        <w:rPr>
-          <w:rFonts w:cs="Times New Roman"/>
-        </w:rPr>
-        <w:t xml:space="preserve">En el ámbito aplicado, se diseñó e implementó un Smart Portable Library Management System (SPLMS) basado en RFID UHF en la biblioteca Perpustakaan Raja Tun Uda (Malasia), con el propósito de evaluar la eficiencia y efectividad de los lectores RFID en el manejo de inventarios, prestando especial atención a cómo la orientación angular del lector influye en la tasa de lectura de las etiquetas ubicadas en los lomos de los libros </w:t>
-      </w:r>
-      <w:r>
-        <w:rPr>
-          <w:rFonts w:cs="Times New Roman"/>
-        </w:rPr>
-        <w:fldChar w:fldCharType="begin" w:fldLock="1"/>
-      </w:r>
-      <w:r>
-        <w:rPr>
-          <w:rFonts w:cs="Times New Roman"/>
-        </w:rPr>
-        <w:instrText>ADDIN CSL_CITATION {"citationItems":[{"id":"ITEM-1","itemData":{"DOI":"10.24191/JMECHE.V12I1.24642","ISSN":"2550164X","abstract":"Libraries are crucial for diverse resources, particularly for students and educators. The Library Management System (LMS) in Perpustakaan Raja Tun Uda (PRTU) still used barcode technology, which was inadequate and could increase the workload of the librarians. This study presented the development and evaluation of the Smart Portable Library Management System (SPLMS) using RFID technology. The study addressed the gap in the literature by focusing on the impact of angle adjustment on the performance of UHF RFID readers in reading RFID tags placed on book spines. The study was conducted by implementing the SPLMS and performing system testing at different angles. The scope of the study encompassed the design and implementation of the SPLMS, system testing with varying angles, and evaluation of the reader's success rate in reading RFID tags. The validation of ZK-RFID101 of the results have shown that the reader has a 100% success rate for distances between 1 and 3 meters, but the success rate drops to 80% at 5 and 6 meters due to radio frequency interference. The main findings indicated that increasing the angle from 0 to 90-degrees improved the reader's performance, although certain tags still presented challenges. The results from the five conducted trials strongly indicated that a 90-degree angle was the optimum performance. The study concluded that the angle and placement of RFID readers was crucial for optimal performance in library management systems. The SPLMS provided librarians with a user-friendly dashboard for efficient book collection management, boosting productivity and enhancing user experience.","author":[{"dropping-particle":"","family":"Suhaimi","given":"Maizatul Mazni","non-dropping-particle":"","parse-names":false,"suffix":""},{"dropping-particle":"","family":"Mohamed","given":"Zulkifli","non-dropping-particle":"","parse-names":false,"suffix":""},{"dropping-particle":"","family":"Khusaini","given":"Nurul Syuhadah","non-dropping-particle":"","parse-names":false,"suffix":""}],"container-title":"Journal of Mechanical Engineering","id":"ITEM-1","issued":{"date-parts":[["2023"]]},"page":"133-152","title":"Effectiveness of RFID Smart Library Management System","type":"article-journal","volume":"SI12"},"uris":["http://www.mendeley.com/documents/?uuid=1f3d0b09-f64a-4719-b3e7-9c91755768d8"]}],"mendeley":{"formattedCitation":"(Suhaimi et al., 2023)","plainTextFormattedCitation":"(Suhaimi et al., 2023)","previouslyFormattedCitation":"(Suhaimi et al., 2023)"},"properties":{"noteIndex":0},"schema":"https://github.com/citation-style-language/schema/raw/master/csl-citation.json"}</w:instrText>
-      </w:r>
-      <w:r>
-        <w:rPr>
-          <w:rFonts w:cs="Times New Roman"/>
-        </w:rPr>
-        <w:fldChar w:fldCharType="separate"/>
+    </w:p>
+    <w:p>
+      <w:pPr>
+        <w:ind w:firstLine="708"/>
+        <w:rPr>
+          <w:rFonts w:cs="Times New Roman"/>
+        </w:rPr>
+      </w:pPr>
+      <w:r>
+        <w:rPr>
+          <w:rFonts w:cs="Times New Roman"/>
+        </w:rPr>
+        <w:t xml:space="preserve">Asimismo, investigaciones recientes han demostrado la viabilidad de integrar tecnologías de Internet de las Cosas (IoT) con RFID para optimizar los sistemas de gestión bibliotecaria. En este sentido, </w:t>
       </w:r>
       <w:r>
         <w:rPr>
           <w:rFonts w:cs="Times New Roman"/>
           <w:noProof/>
-        </w:rPr>
-        <w:t>(Suhaimi et al., 2023)</w:t>
-      </w:r>
-      <w:r>
-        <w:rPr>
-          <w:rFonts w:cs="Times New Roman"/>
-        </w:rPr>
-        <w:fldChar w:fldCharType="end"/>
-      </w:r>
-      <w:r>
-        <w:rPr>
-          <w:rFonts w:cs="Times New Roman"/>
-        </w:rPr>
-        <w:t xml:space="preserve">. De manera similar, otros autores propusieron e implementaron sistemas RFID para automatizar préstamos, devoluciones, inventario y seguridad, con el objetivo de reemplazar los códigos de barras tradicionales y mejorar la eficiencia operativa </w:t>
-      </w:r>
-      <w:r>
-        <w:rPr>
-          <w:rFonts w:cs="Times New Roman"/>
-        </w:rPr>
-        <w:fldChar w:fldCharType="begin" w:fldLock="1"/>
-      </w:r>
-      <w:r>
-        <w:rPr>
-          <w:rFonts w:cs="Times New Roman"/>
-        </w:rPr>
-        <w:instrText>ADDIN CSL_CITATION {"citationItems":[{"id":"ITEM-1","itemData":{"DOI":"10.1108/IJEM-05-2017-0129","ISBN":"9788195275700","ISSN":"0951354X","abstract":"Purpose: The purpose of this paper is to research on knowledge management (KM) in higher education institutions (HEIs) by studying its processes, knowledge creation (KC), knowledge sharing (KS) and knowledge transfer (KT), in Mauritius. Design/methodology/approach: Semi-structured interviews were conducted with senior staff in the main public and private HEIs in Mauritius. Questions focussed on KM strategy and processes. Interviews were recorded and transcribed prior to thematic analysis. Findings: Although participants could discuss KM processes, none of the participating institutions had a KM strategy. All institutions are involved in KC and acquisition, KS and KT. In addition to research, knowledge was regarded as being created through teaching and learning activities, consultancies, organisational documentation and acquisition from external sources. Knowledge is shared among peers during departmental and curriculum meetings, through annual research seminars and during conferences and publications in journals. KT with industry through consultancies is restricted to a few public HEIs. In the remaining HEIs, KT is limited to their students joining the workforce and to organising tailor-made courses and training programmes for public and private institutions. The study also provides evidence that some processes and activities contribute to more than one of KC, sharing and transfer. Originality/value: This study contributes to the very limited body of research into KM processes in countries with developing higher education sectors. In addition, this research disaggregates the processes associated with KC, sharing and transfer, whilst also examining the relationship between them.","author":[{"dropping-particle":"","family":"Veer Ramjeawon","given":"Poonam","non-dropping-particle":"","parse-names":false,"suffix":""},{"dropping-particle":"","family":"Rowley","given":"Jennifer","non-dropping-particle":"","parse-names":false,"suffix":""}],"container-title":"International Journal of Educational Management","id":"ITEM-1","issue":"7","issued":{"date-parts":[["2018"]]},"number-of-pages":"1319-1332","title":"Knowledge management in higher education institutions in Mauritius","type":"book","volume":"32"},"uris":["http://www.mendeley.com/documents/?uuid=8f8efa09-eb87-43cb-a632-b492359a6153"]}],"mendeley":{"formattedCitation":"(Veer Ramjeawon &amp; Rowley, 2018)","plainTextFormattedCitation":"(Veer Ramjeawon &amp; Rowley, 2018)","previouslyFormattedCitation":"(Veer Ramjeawon &amp; Rowley, 2018)"},"properties":{"noteIndex":0},"schema":"https://github.com/citation-style-language/schema/raw/master/csl-citation.json"}</w:instrText>
-      </w:r>
-      <w:r>
-        <w:rPr>
-          <w:rFonts w:cs="Times New Roman"/>
-        </w:rPr>
-        <w:fldChar w:fldCharType="separate"/>
+          <w:lang w:val="en-US"/>
+        </w:rPr>
+        <w:t>Olakunle</w:t>
+      </w:r>
+      <w:r>
+        <w:rPr>
+          <w:rFonts w:cs="Times New Roman"/>
+        </w:rPr>
+        <w:t xml:space="preserve"> et al. (2025) desarrollaron e implementaron un sistema de biblioteca basado en IoT que integra etiquetas RFID en los libros, lectores de radiofrecuencia y una base de datos central para automatizar los procesos de préstamo, devolución y seguimiento del material bibliográfico. El sistema fue implementado en una biblioteca universitaria en Nigeria y permitió mejorar significativamente la eficiencia operativa, reducir los tiempos de transacción y aumentar la precisión en la gestión del inventario. Los resultados obtenidos evidenciaron que más del 90 % de los usuarios percibieron el proceso de préstamo como más rápido y conveniente en comparación con el sistema tradicional, además de reportarse mejoras en la experiencia del usuario y en el control de los recursos bibliográficos (</w:t>
       </w:r>
       <w:r>
         <w:rPr>
           <w:rFonts w:cs="Times New Roman"/>
           <w:noProof/>
-        </w:rPr>
-        <w:t>(Veer Ramjeawon &amp; Rowley, 2018)</w:t>
-      </w:r>
-      <w:r>
-        <w:rPr>
-          <w:rFonts w:cs="Times New Roman"/>
-        </w:rPr>
-        <w:fldChar w:fldCharType="end"/>
-      </w:r>
-      <w:r>
-        <w:rPr>
-          <w:rFonts w:cs="Times New Roman"/>
-        </w:rPr>
-        <w:t xml:space="preserve">. Desde una perspectiva más amplia, algunos estudios realizaron una revisión de casos internacionales de implementación de RFID en bibliotecas, evaluando su papel en la automatización de inventarios, la circulación, la seguridad, el autoservicio y la mejora de la experiencia de usuario </w:t>
-      </w:r>
-      <w:r>
-        <w:rPr>
-          <w:rFonts w:cs="Times New Roman"/>
-        </w:rPr>
-        <w:fldChar w:fldCharType="begin" w:fldLock="1"/>
-      </w:r>
-      <w:r>
-        <w:rPr>
-          <w:rFonts w:cs="Times New Roman"/>
-        </w:rPr>
-        <w:instrText>ADDIN CSL_CITATION {"citationItems":[{"id":"ITEM-1","itemData":{"DOI":"10.26761/ijrls.10.4.2024.1795","author":[{"dropping-particle":"","family":"Patil","given":"Somanagouda Shankargouda","non-dropping-particle":"","parse-names":false,"suffix":""},{"dropping-particle":"","family":"Dasar","given":"Manjunath G","non-dropping-particle":"","parse-names":false,"suffix":""},{"dropping-particle":"","family":"Melinamani","given":"Pooja Ravi","non-dropping-particle":"","parse-names":false,"suffix":""},{"dropping-particle":"","family":"Patil","given":"Jyoti","non-dropping-particle":"","parse-names":false,"suffix":""},{"dropping-particle":"","family":"Waddar","given":"Nataraj","non-dropping-particle":"","parse-names":false,"suffix":""}],"container-title":"International Journal of Research in Library Science","id":"ITEM-1","issue":"4","issued":{"date-parts":[["2024"]]},"page":"57-66","title":"Unlocking Efficiency: The Role of Radio Frequency Identification (RFID) Technology in Modernizing Library Management Systems","type":"article-journal","volume":"10"},"uris":["http://www.mendeley.com/documents/?uuid=308df8b7-deed-4a41-90e5-725d25859928"]}],"mendeley":{"formattedCitation":"(Patil et al., 2024)","plainTextFormattedCitation":"(Patil et al., 2024)","previouslyFormattedCitation":"(Patil et al., 2024)"},"properties":{"noteIndex":0},"schema":"https://github.com/citation-style-language/schema/raw/master/csl-citation.json"}</w:instrText>
-      </w:r>
-      <w:r>
-        <w:rPr>
-          <w:rFonts w:cs="Times New Roman"/>
-        </w:rPr>
-        <w:fldChar w:fldCharType="separate"/>
-      </w:r>
-      <w:r>
-        <w:rPr>
-          <w:rFonts w:cs="Times New Roman"/>
-          <w:noProof/>
-        </w:rPr>
-        <w:t>(Patil et al., 2024)</w:t>
-      </w:r>
-      <w:r>
-        <w:rPr>
-          <w:rFonts w:cs="Times New Roman"/>
-        </w:rPr>
-        <w:fldChar w:fldCharType="end"/>
-      </w:r>
-      <w:r>
-        <w:rPr>
-          <w:rFonts w:cs="Times New Roman"/>
-        </w:rPr>
-        <w:t xml:space="preserve">. </w:t>
+          <w:lang w:val="en-US"/>
+        </w:rPr>
+        <w:t xml:space="preserve">Olakunle </w:t>
+      </w:r>
+      <w:r>
+        <w:rPr>
+          <w:rFonts w:cs="Times New Roman"/>
+        </w:rPr>
+        <w:t>et al., 2025). Estos hallazgos refuerzan la idea de que la adopción de RFID en entornos bibliotecarios no solo moderniza los procesos de circulación, sino que también contribuye a la automatización, la trazabilidad de los libros y la optimización de los servicios bibliotecarios en contextos académicos</w:t>
+      </w:r>
+      <w:r>
+        <w:rPr>
+          <w:rFonts w:cs="Times New Roman"/>
+        </w:rPr>
+        <w:t>.</w:t>
       </w:r>
     </w:p>
     <w:p>
@@ -4396,86 +4961,32 @@
           <w:rFonts w:cs="Times New Roman"/>
         </w:rPr>
       </w:pPr>
-      <w:r>
-        <w:rPr>
-          <w:rFonts w:cs="Times New Roman"/>
-        </w:rPr>
-        <w:t xml:space="preserve">En el plano innovador, se han desarrollado sistemas inteligentes que integran RFID con técnicas de machine learning, los cuales no solo automatizan los procesos de circulación, sino que además permiten identificar los libros más y menos utilizados, calcular multas de manera automática, clasificar libros por departamento y predecir cuáles deben descartarse por bajo uso o deterioro </w:t>
-      </w:r>
-      <w:r>
-        <w:rPr>
-          <w:rFonts w:cs="Times New Roman"/>
-        </w:rPr>
-        <w:fldChar w:fldCharType="begin" w:fldLock="1"/>
-      </w:r>
-      <w:r>
-        <w:rPr>
-          <w:rFonts w:cs="Times New Roman"/>
-        </w:rPr>
-        <w:instrText>ADDIN CSL_CITATION {"citationItems":[{"id":"ITEM-1","itemData":{"DOI":"10.1109/CONECCT52877.2021.9622566","ISBN":"9781665428491","abstract":"The term RFID stands for Frequency Identification Technology that may be a distinctive technology that uses magnetism fields to keep track of things, products or objects. Intelligent-RFID Technology in libraries helps us to analyze and predict the demand of books, books that are less utilized, count of books issued in each department, fine calculation, book enquiry, percentage ratio of total number of books in the library to total books issued, thus imparting intelligence to libraries. The process of automating the library tasks addresses the issues relating to book-searching, and tracking, thereby ensuring the safety and security of library materials. This paper proposes an Intelligent and Automated RFID based library management system along with user interface for different types that enables the quick flow of books. A PyQt web portal is designed for creating user interface to perform the desired library tasks and predictive analysis. In addition, data processing is performed to analyze various parameters required to produce statistical analysis on extensively used or less used books, which helps us to protect or discard the books from time to time and prevent the library assets from termite attacks. Fine calculation helps to calculate the fine and send text information to the users in case of expiry of due dates or lost books from some of the borrowers.","author":[{"dropping-particle":"","family":"Neha Mukund","given":"R.","non-dropping-particle":"","parse-names":false,"suffix":""},{"dropping-particle":"","family":"Arun","given":"Sanjana","non-dropping-particle":"","parse-names":false,"suffix":""},{"dropping-particle":"","family":"Kusuma","given":"S. M.","non-dropping-particle":"","parse-names":false,"suffix":""},{"dropping-particle":"","family":"Vishak","given":"K. R.","non-dropping-particle":"","parse-names":false,"suffix":""},{"dropping-particle":"","family":"Monisha","given":"M.","non-dropping-particle":"","parse-names":false,"suffix":""}],"container-title":"Proceedings of CONECCT 2021: 7th IEEE International Conference on Electronics, Computing and Communication Technologies","id":"ITEM-1","issue":"Id","issued":{"date-parts":[["2021"]]},"title":"Intelligent RFID Based Library Management System","type":"article-journal"},"uris":["http://www.mendeley.com/documents/?uuid=77f2ef32-027e-4f52-949b-cca835c20e29"]}],"mendeley":{"formattedCitation":"(Neha Mukund et al., 2021)","plainTextFormattedCitation":"(Neha Mukund et al., 2021)","previouslyFormattedCitation":"(Neha Mukund et al., 2021)"},"properties":{"noteIndex":0},"schema":"https://github.com/citation-style-language/schema/raw/master/csl-citation.json"}</w:instrText>
-      </w:r>
-      <w:r>
-        <w:rPr>
-          <w:rFonts w:cs="Times New Roman"/>
-        </w:rPr>
-        <w:fldChar w:fldCharType="separate"/>
-      </w:r>
-      <w:r>
-        <w:rPr>
-          <w:rFonts w:cs="Times New Roman"/>
-          <w:noProof/>
-        </w:rPr>
-        <w:t>(Neha Mukund et al., 2021)</w:t>
-      </w:r>
-      <w:r>
-        <w:rPr>
-          <w:rFonts w:cs="Times New Roman"/>
-        </w:rPr>
-        <w:fldChar w:fldCharType="end"/>
-      </w:r>
-      <w:r>
-        <w:rPr>
-          <w:rFonts w:cs="Times New Roman"/>
-        </w:rPr>
-        <w:t xml:space="preserve">. Finalmente, otros enfoques se centraron en reforzar la </w:t>
+    </w:p>
+    <w:p>
+      <w:pPr>
+        <w:ind w:firstLine="708"/>
+        <w:rPr>
+          <w:rFonts w:cs="Times New Roman"/>
+        </w:rPr>
+      </w:pPr>
+      <w:r>
+        <w:rPr>
+          <w:rFonts w:cs="Times New Roman"/>
+        </w:rPr>
+        <w:t>Por último</w:t>
+      </w:r>
+      <w:r>
+        <w:rPr>
+          <w:rFonts w:cs="Times New Roman"/>
+        </w:rPr>
+        <w:t xml:space="preserve">, el desarrollo de bibliotecas digitales y plataformas de acceso abierto ha tomado gran relevancia en los últimos años. Un ejemplo de ello es la National Digital Library of India (NDLI), una iniciativa orientada a integrar recursos educativos y académicos en una única plataforma digital que facilite el acceso al conocimiento a estudiantes, investigadores y docentes. Este proyecto busca consolidar colecciones provenientes de múltiples instituciones y ofrecer servicios de búsqueda, organización y acceso a grandes volúmenes de información digital, contribuyendo al fortalecimiento de los ecosistemas de conocimiento y aprendizaje en entornos </w:t>
       </w:r>
       <w:r>
         <w:rPr>
           <w:rFonts w:cs="Times New Roman"/>
         </w:rPr>
         <w:lastRenderedPageBreak/>
-        <w:t xml:space="preserve">seguridad de las colecciones mediante sistemas RFID que automatizan préstamos, devoluciones y renovaciones, al tiempo que ofrecen mayor capacidad de detección de robos, superando las limitaciones de los códigos de barras en cuanto a la necesidad de línea de visión y el escaneo individualizado </w:t>
-      </w:r>
-      <w:r>
-        <w:rPr>
-          <w:rFonts w:cs="Times New Roman"/>
-        </w:rPr>
-        <w:fldChar w:fldCharType="begin" w:fldLock="1"/>
-      </w:r>
-      <w:r>
-        <w:rPr>
-          <w:rFonts w:cs="Times New Roman"/>
-        </w:rPr>
-        <w:instrText>ADDIN CSL_CITATION {"citationItems":[{"id":"ITEM-1","itemData":{"ISBN":"9788195588473","author":[{"dropping-particle":"","family":"Kumari","given":"Kirna","non-dropping-particle":"","parse-names":false,"suffix":""}],"id":"ITEM-1","issue":"December","issued":{"date-parts":[["2022"]]},"title":"CONFERENCE PROCEEDING OF INTERNATIONAL MULTIDISCIPLINARY CONFERENCE 2022 Volume 1 , December 2022 ISBN : 978-81-955884-7-3 Conference Proceeding of International Multidisciplinary Conference 2022","type":"book","volume":"1"},"uris":["http://www.mendeley.com/documents/?uuid=b3f7776c-d629-423f-88ea-a849278495ae"]}],"mendeley":{"formattedCitation":"(Kumari, 2022)","plainTextFormattedCitation":"(Kumari, 2022)","previouslyFormattedCitation":"(Kumari, 2022)"},"properties":{"noteIndex":0},"schema":"https://github.com/citation-style-language/schema/raw/master/csl-citation.json"}</w:instrText>
-      </w:r>
-      <w:r>
-        <w:rPr>
-          <w:rFonts w:cs="Times New Roman"/>
-        </w:rPr>
-        <w:fldChar w:fldCharType="separate"/>
-      </w:r>
-      <w:r>
-        <w:rPr>
-          <w:rFonts w:cs="Times New Roman"/>
-          <w:noProof/>
-        </w:rPr>
-        <w:t>(Kumari, 2022)</w:t>
-      </w:r>
-      <w:r>
-        <w:rPr>
-          <w:rFonts w:cs="Times New Roman"/>
-        </w:rPr>
-        <w:fldChar w:fldCharType="end"/>
+        <w:t>académicos. Estas iniciativas evidencian cómo las bibliotecas modernas no solo evolucionan en la gestión de recursos físicos, sino también en la integración de plataformas digitales que amplían el acceso a la información y complementan los servicios bibliotecarios tradicionales (NDLI, 2025).</w:t>
       </w:r>
     </w:p>
     <w:p>
@@ -4485,86 +4996,6 @@
           <w:rFonts w:cs="Times New Roman"/>
         </w:rPr>
       </w:pPr>
-      <w:r>
-        <w:rPr>
-          <w:rFonts w:cs="Times New Roman"/>
-        </w:rPr>
-        <w:t xml:space="preserve">En conclusión, en términos de seguridad bibliotecaria, la tecnología RFID no solo es más avanzada, sino también más práctica, conveniente y asequible. En el ámbito de los materiales bibliotecarios, esta tecnología está reemplazando gradualmente al código de barras convencional. El uso de RFID en bibliotecas agiliza los procesos de préstamo, monitoreo y búsqueda de libros, liberando al personal para que se concentre en brindar un mejor servicio al usuario. Las etiquetas y lectores RFID deben ser de alta calidad para un rendimiento óptimo. La información que debe escribirse en las etiquetas es otro factor que influye en la eficacia del uso de la tecnología. Estos programas pueden mejorar el servicio al cliente, reducir el robo de libros, reducir significativamente los gastos de mano de obra y actualizar continuamente los registros de nuevas colecciones de libros. </w:t>
-      </w:r>
-      <w:r>
-        <w:rPr>
-          <w:rFonts w:cs="Times New Roman"/>
-        </w:rPr>
-        <w:fldChar w:fldCharType="begin" w:fldLock="1"/>
-      </w:r>
-      <w:r>
-        <w:rPr>
-          <w:rFonts w:cs="Times New Roman"/>
-        </w:rPr>
-        <w:instrText>ADDIN CSL_CITATION {"citationItems":[{"id":"ITEM-1","itemData":{"DOI":"10.47604/ijts.2041","abstract":"Purpose: The aim of this project is to design and build a library management system based on radio frequency identification that will help the librarian manage the shelves with less human involvement.\r Methodology: A dc supply at +5volts was connected to the microcontroller, with a voltage of +12volts dc connected to the buzzer, and a step-down transformer was used to convert 220volts to 5volts in this system. This power supply was connected to the switch, and by pressing a switch button, the current passed through the entire circuit. RFID collects all the data from the RFID tag. Using a UART module, the EM-18 RFID reader module was connected to 5v pic microcontrollers. The EM-1 RFID reader will read the tag number from an RFID tag when it is placed in its field of operation and output the information via a TX terminal. In order to signal successful tag detection, the beep terminal will turn low. Once the card is in front of the RFID reader, the student extracts the data from it and compares it to the data that is stored in the microprocessor, which is coded using embedded c language. If the data matches, the information is shown on the LCD.\r Finding: A library management system based on radio frequency identification and detection (RFID) was developed in this study to improve library use and management. To efficiently identify and manage the books, it will make use of the RFID reader. The student can search the database and, if the book is available, pick it up from the library because the database displays the book's availability at the library. The main advantages of this project in libraries include time savings, quick access to books, and the elimination of manual errors.\r Unique Contribution to Theory, Practice and policy: Every inventive technical design has its limits. This passive RFID-based library management system has some limitations as a technology for precise data collection. This study recommend that the RFID reader should be improved so that it has finger and thumb print access, which is needed to access student data and details. However, it should also include a facial recognition application, which would further strengthen the biometric security of the system and protect it from impersonation by careless students.","author":[{"dropping-particle":"","family":"Yusuf","given":"Moshood","non-dropping-particle":"","parse-names":false,"suffix":""},{"dropping-particle":"","family":"Akintunde","given":"Adigun","non-dropping-particle":"","parse-names":false,"suffix":""},{"dropping-particle":"","family":"Habeeb","given":"Shittu","non-dropping-particle":"","parse-names":false,"suffix":""},{"dropping-particle":"","family":"Quadri","given":"Adeyinka","non-dropping-particle":"","parse-names":false,"suffix":""}],"container-title":"International Journal of Technology and Systems","id":"ITEM-1","issue":"2","issued":{"date-parts":[["2023"]]},"page":"21-35","title":"Radio Frequency Identification (RFID) Based Library Management System","type":"article-journal","volume":"8"},"uris":["http://www.mendeley.com/documents/?uuid=a044af89-7407-4371-90c0-df23e6b6ed15","http://www.mendeley.com/documents/?uuid=48715fcd-d25c-420b-b3d1-066ce17ef2e0"]}],"mendeley":{"formattedCitation":"(Yusuf et al., 2023)","plainTextFormattedCitation":"(Yusuf et al., 2023)","previouslyFormattedCitation":"(Yusuf et al., 2023)"},"properties":{"noteIndex":0},"schema":"https://github.com/citation-style-language/schema/raw/master/csl-citation.json"}</w:instrText>
-      </w:r>
-      <w:r>
-        <w:rPr>
-          <w:rFonts w:cs="Times New Roman"/>
-        </w:rPr>
-        <w:fldChar w:fldCharType="separate"/>
-      </w:r>
-      <w:r>
-        <w:rPr>
-          <w:rFonts w:cs="Times New Roman"/>
-          <w:noProof/>
-        </w:rPr>
-        <w:t>(Yusuf et al., 2023)</w:t>
-      </w:r>
-      <w:r>
-        <w:rPr>
-          <w:rFonts w:cs="Times New Roman"/>
-        </w:rPr>
-        <w:fldChar w:fldCharType="end"/>
-      </w:r>
-      <w:r>
-        <w:rPr>
-          <w:rFonts w:cs="Times New Roman"/>
-        </w:rPr>
-        <w:t xml:space="preserve">, y de igual manera, </w:t>
-      </w:r>
-      <w:r>
-        <w:rPr>
-          <w:rFonts w:cs="Times New Roman"/>
-        </w:rPr>
-        <w:fldChar w:fldCharType="begin" w:fldLock="1"/>
-      </w:r>
-      <w:r>
-        <w:rPr>
-          <w:rFonts w:cs="Times New Roman"/>
-        </w:rPr>
-        <w:instrText>ADDIN CSL_CITATION {"citationItems":[{"id":"ITEM-1","itemData":{"author":[{"dropping-particle":"","family":"Nayak","given":"Rajib","non-dropping-particle":"","parse-names":false,"suffix":""},{"dropping-particle":"","family":"Singh","given":"Dharamvir","non-dropping-particle":"","parse-names":false,"suffix":""}],"id":"ITEM-1","issue":"7","issued":{"date-parts":[["2024"]]},"page":"1-7","title":"Challenges and Prospects of RFID Implementation in Academic Libraries of Challenges and Prospects of RFID Implementation in Academic Libraries of North East India","type":"article-journal","volume":"5"},"uris":["http://www.mendeley.com/documents/?uuid=e0ea4296-db88-45df-a22d-06dbdf02fb55","http://www.mendeley.com/documents/?uuid=ccf58a1c-812f-4e26-a583-1ce14765dfac"]}],"mendeley":{"formattedCitation":"(Nayak &amp; Singh, 2024)","plainTextFormattedCitation":"(Nayak &amp; Singh, 2024)","previouslyFormattedCitation":"(Nayak &amp; Singh, 2024)"},"properties":{"noteIndex":0},"schema":"https://github.com/citation-style-language/schema/raw/master/csl-citation.json"}</w:instrText>
-      </w:r>
-      <w:r>
-        <w:rPr>
-          <w:rFonts w:cs="Times New Roman"/>
-        </w:rPr>
-        <w:fldChar w:fldCharType="separate"/>
-      </w:r>
-      <w:r>
-        <w:rPr>
-          <w:rFonts w:cs="Times New Roman"/>
-          <w:noProof/>
-        </w:rPr>
-        <w:t>(Nayak &amp; Singh, 2024)</w:t>
-      </w:r>
-      <w:r>
-        <w:rPr>
-          <w:rFonts w:cs="Times New Roman"/>
-        </w:rPr>
-        <w:fldChar w:fldCharType="end"/>
-      </w:r>
-      <w:r>
-        <w:rPr>
-          <w:rFonts w:cs="Times New Roman"/>
-        </w:rPr>
-        <w:t xml:space="preserve"> nos explica que la tecnología RFID representa una oportunidad transformadora para la comunidad bibliotecaria, lista para redefinir la gestión bibliotecaria tradicional en los próximos años. Su capacidad para el inventario a alta velocidad y la identificación eficiente de artículos extraviados la convierten en una herramienta indispensable para las bibliotecas modernas.</w:t>
-      </w:r>
     </w:p>
     <w:p>
       <w:pPr>
@@ -4573,18 +5004,6 @@
           <w:rFonts w:cs="Times New Roman"/>
         </w:rPr>
       </w:pPr>
-      <w:r>
-        <w:rPr>
-          <w:rFonts w:cs="Times New Roman"/>
-        </w:rPr>
-        <w:t>Las bibliotecas universitarias enfrentan pérdidas de colección, inventarios lentos y errores en circulación que elevan costos operativos y deterioran la experiencia del usuario. Las soluciones con códigos de barras requieren línea de vista y escaneo individual, lo que limita la eficiencia en estantes y controles de salida. Aunque RFID ha mostrado mejoras en trazabilidad, autoservicio e inventario, su desempeño depende de la banda (HF/UHF), la orientación de etiquetas, los materiales y la integración con el SIGB; además, persisten barreras de costo total de propiedad, estandarización y privacidad. En nuestro contexto, no existe un diseño específico que optimice simultáneamente la circulación segura (HF, mostradores/portales) y el inventario rápido en estanterías (UHF) con alta tasa de acierto en lomos apilados y anti-colisión, interoperando con el SIGB. Este proyecto aborda dicha brecha mediante el diseño y validación de un sistema RFID para control e identificación eficiente de libros, con metas de reducción de tiempos de inventario, incremento de tasas de lectura y disminución de pérdidas</w:t>
-      </w:r>
-      <w:r>
-        <w:rPr>
-          <w:rFonts w:cs="Times New Roman"/>
-        </w:rPr>
-        <w:t>.</w:t>
-      </w:r>
     </w:p>
     <w:p>
       <w:pPr>
@@ -4608,6 +5027,150 @@
         </w:rPr>
       </w:pPr>
       <w:bookmarkStart w:id="21" w:name="_Toc440985128"/>
+    </w:p>
+    <w:p>
+      <w:pPr>
+        <w:jc w:val="center"/>
+        <w:rPr>
+          <w:b/>
+        </w:rPr>
+      </w:pPr>
+    </w:p>
+    <w:p>
+      <w:pPr>
+        <w:jc w:val="center"/>
+        <w:rPr>
+          <w:b/>
+        </w:rPr>
+      </w:pPr>
+    </w:p>
+    <w:p>
+      <w:pPr>
+        <w:jc w:val="center"/>
+        <w:rPr>
+          <w:b/>
+        </w:rPr>
+      </w:pPr>
+    </w:p>
+    <w:p>
+      <w:pPr>
+        <w:jc w:val="center"/>
+        <w:rPr>
+          <w:b/>
+        </w:rPr>
+      </w:pPr>
+    </w:p>
+    <w:p>
+      <w:pPr>
+        <w:jc w:val="center"/>
+        <w:rPr>
+          <w:b/>
+        </w:rPr>
+      </w:pPr>
+    </w:p>
+    <w:p>
+      <w:pPr>
+        <w:jc w:val="center"/>
+        <w:rPr>
+          <w:b/>
+        </w:rPr>
+      </w:pPr>
+    </w:p>
+    <w:p>
+      <w:pPr>
+        <w:jc w:val="center"/>
+        <w:rPr>
+          <w:b/>
+        </w:rPr>
+      </w:pPr>
+    </w:p>
+    <w:p>
+      <w:pPr>
+        <w:jc w:val="center"/>
+        <w:rPr>
+          <w:b/>
+        </w:rPr>
+      </w:pPr>
+    </w:p>
+    <w:p>
+      <w:pPr>
+        <w:jc w:val="center"/>
+        <w:rPr>
+          <w:b/>
+        </w:rPr>
+      </w:pPr>
+    </w:p>
+    <w:p>
+      <w:pPr>
+        <w:jc w:val="center"/>
+        <w:rPr>
+          <w:b/>
+        </w:rPr>
+      </w:pPr>
+    </w:p>
+    <w:p>
+      <w:pPr>
+        <w:jc w:val="center"/>
+        <w:rPr>
+          <w:b/>
+        </w:rPr>
+      </w:pPr>
+    </w:p>
+    <w:p>
+      <w:pPr>
+        <w:jc w:val="center"/>
+        <w:rPr>
+          <w:b/>
+        </w:rPr>
+      </w:pPr>
+    </w:p>
+    <w:p>
+      <w:pPr>
+        <w:jc w:val="center"/>
+        <w:rPr>
+          <w:b/>
+        </w:rPr>
+      </w:pPr>
+    </w:p>
+    <w:p>
+      <w:pPr>
+        <w:jc w:val="center"/>
+        <w:rPr>
+          <w:b/>
+        </w:rPr>
+      </w:pPr>
+    </w:p>
+    <w:p>
+      <w:pPr>
+        <w:jc w:val="center"/>
+        <w:rPr>
+          <w:b/>
+        </w:rPr>
+      </w:pPr>
+    </w:p>
+    <w:p>
+      <w:pPr>
+        <w:jc w:val="center"/>
+        <w:rPr>
+          <w:b/>
+        </w:rPr>
+      </w:pPr>
+    </w:p>
+    <w:p>
+      <w:pPr>
+        <w:jc w:val="center"/>
+        <w:rPr>
+          <w:b/>
+        </w:rPr>
+      </w:pPr>
+    </w:p>
+    <w:p>
+      <w:pPr>
+        <w:jc w:val="center"/>
+        <w:rPr>
+          <w:b/>
+        </w:rPr>
+      </w:pPr>
     </w:p>
     <w:p>
       <w:pPr>
@@ -4641,12 +5204,6 @@
           <w:b/>
         </w:rPr>
       </w:pPr>
-      <w:r>
-        <w:rPr>
-          <w:b/>
-        </w:rPr>
-        <w:br w:type="page"/>
-      </w:r>
     </w:p>
     <w:p>
       <w:pPr>
@@ -5347,6 +5904,222 @@
     </w:p>
     <w:p>
       <w:pPr>
+        <w:ind w:firstLine="360"/>
+        <w:rPr>
+          <w:rFonts w:cs="Times New Roman"/>
+          <w:szCs w:val="24"/>
+        </w:rPr>
+      </w:pPr>
+    </w:p>
+    <w:p>
+      <w:pPr>
+        <w:ind w:firstLine="360"/>
+        <w:rPr>
+          <w:rFonts w:cs="Times New Roman"/>
+          <w:szCs w:val="24"/>
+        </w:rPr>
+      </w:pPr>
+    </w:p>
+    <w:p>
+      <w:pPr>
+        <w:ind w:firstLine="360"/>
+        <w:rPr>
+          <w:rFonts w:cs="Times New Roman"/>
+          <w:szCs w:val="24"/>
+        </w:rPr>
+      </w:pPr>
+    </w:p>
+    <w:p>
+      <w:pPr>
+        <w:ind w:firstLine="360"/>
+        <w:rPr>
+          <w:rFonts w:cs="Times New Roman"/>
+          <w:szCs w:val="24"/>
+        </w:rPr>
+      </w:pPr>
+    </w:p>
+    <w:p>
+      <w:pPr>
+        <w:ind w:firstLine="360"/>
+        <w:rPr>
+          <w:rFonts w:cs="Times New Roman"/>
+          <w:szCs w:val="24"/>
+        </w:rPr>
+      </w:pPr>
+    </w:p>
+    <w:p>
+      <w:pPr>
+        <w:ind w:firstLine="360"/>
+        <w:rPr>
+          <w:rFonts w:cs="Times New Roman"/>
+          <w:szCs w:val="24"/>
+        </w:rPr>
+      </w:pPr>
+    </w:p>
+    <w:p>
+      <w:pPr>
+        <w:ind w:firstLine="360"/>
+        <w:rPr>
+          <w:rFonts w:cs="Times New Roman"/>
+          <w:szCs w:val="24"/>
+        </w:rPr>
+      </w:pPr>
+    </w:p>
+    <w:p>
+      <w:pPr>
+        <w:ind w:firstLine="360"/>
+        <w:rPr>
+          <w:rFonts w:cs="Times New Roman"/>
+          <w:szCs w:val="24"/>
+        </w:rPr>
+      </w:pPr>
+    </w:p>
+    <w:p>
+      <w:pPr>
+        <w:ind w:firstLine="360"/>
+        <w:rPr>
+          <w:rFonts w:cs="Times New Roman"/>
+          <w:szCs w:val="24"/>
+        </w:rPr>
+      </w:pPr>
+    </w:p>
+    <w:p>
+      <w:pPr>
+        <w:ind w:firstLine="360"/>
+        <w:rPr>
+          <w:rFonts w:cs="Times New Roman"/>
+          <w:szCs w:val="24"/>
+        </w:rPr>
+      </w:pPr>
+    </w:p>
+    <w:p>
+      <w:pPr>
+        <w:ind w:firstLine="360"/>
+        <w:rPr>
+          <w:rFonts w:cs="Times New Roman"/>
+          <w:szCs w:val="24"/>
+        </w:rPr>
+      </w:pPr>
+    </w:p>
+    <w:p>
+      <w:pPr>
+        <w:ind w:firstLine="360"/>
+        <w:rPr>
+          <w:rFonts w:cs="Times New Roman"/>
+          <w:szCs w:val="24"/>
+        </w:rPr>
+      </w:pPr>
+    </w:p>
+    <w:p>
+      <w:pPr>
+        <w:ind w:firstLine="360"/>
+        <w:rPr>
+          <w:rFonts w:cs="Times New Roman"/>
+          <w:szCs w:val="24"/>
+        </w:rPr>
+      </w:pPr>
+    </w:p>
+    <w:p>
+      <w:pPr>
+        <w:ind w:firstLine="360"/>
+        <w:rPr>
+          <w:rFonts w:cs="Times New Roman"/>
+          <w:szCs w:val="24"/>
+        </w:rPr>
+      </w:pPr>
+    </w:p>
+    <w:p>
+      <w:pPr>
+        <w:ind w:firstLine="360"/>
+        <w:rPr>
+          <w:rFonts w:cs="Times New Roman"/>
+          <w:szCs w:val="24"/>
+        </w:rPr>
+      </w:pPr>
+    </w:p>
+    <w:p>
+      <w:pPr>
+        <w:ind w:firstLine="360"/>
+        <w:rPr>
+          <w:rFonts w:cs="Times New Roman"/>
+          <w:szCs w:val="24"/>
+        </w:rPr>
+      </w:pPr>
+    </w:p>
+    <w:p>
+      <w:pPr>
+        <w:ind w:firstLine="360"/>
+        <w:rPr>
+          <w:rFonts w:cs="Times New Roman"/>
+          <w:szCs w:val="24"/>
+        </w:rPr>
+      </w:pPr>
+    </w:p>
+    <w:p>
+      <w:pPr>
+        <w:ind w:firstLine="360"/>
+        <w:rPr>
+          <w:rFonts w:cs="Times New Roman"/>
+          <w:szCs w:val="24"/>
+        </w:rPr>
+      </w:pPr>
+    </w:p>
+    <w:p>
+      <w:pPr>
+        <w:ind w:firstLine="360"/>
+        <w:rPr>
+          <w:rFonts w:cs="Times New Roman"/>
+          <w:szCs w:val="24"/>
+        </w:rPr>
+      </w:pPr>
+    </w:p>
+    <w:p>
+      <w:pPr>
+        <w:ind w:firstLine="360"/>
+        <w:rPr>
+          <w:rFonts w:cs="Times New Roman"/>
+          <w:szCs w:val="24"/>
+        </w:rPr>
+      </w:pPr>
+    </w:p>
+    <w:p>
+      <w:pPr>
+        <w:ind w:firstLine="360"/>
+        <w:rPr>
+          <w:rFonts w:cs="Times New Roman"/>
+          <w:szCs w:val="24"/>
+        </w:rPr>
+      </w:pPr>
+    </w:p>
+    <w:p>
+      <w:pPr>
+        <w:ind w:firstLine="360"/>
+        <w:rPr>
+          <w:rFonts w:cs="Times New Roman"/>
+          <w:szCs w:val="24"/>
+        </w:rPr>
+      </w:pPr>
+    </w:p>
+    <w:p>
+      <w:pPr>
+        <w:ind w:firstLine="360"/>
+        <w:rPr>
+          <w:rFonts w:cs="Times New Roman"/>
+          <w:szCs w:val="24"/>
+        </w:rPr>
+      </w:pPr>
+    </w:p>
+    <w:p>
+      <w:pPr>
+        <w:ind w:firstLine="360"/>
+        <w:rPr>
+          <w:rFonts w:cs="Times New Roman"/>
+          <w:szCs w:val="24"/>
+        </w:rPr>
+      </w:pPr>
+    </w:p>
+    <w:p>
+      <w:pPr>
         <w:spacing w:after="160" w:line="259" w:lineRule="auto"/>
         <w:jc w:val="left"/>
         <w:rPr>
@@ -5368,6 +6141,7 @@
           <w:b/>
           <w:bCs/>
         </w:rPr>
+        <w:lastRenderedPageBreak/>
         <w:t>5</w:t>
       </w:r>
       <w:r>
@@ -5679,6 +6453,60 @@
     </w:p>
     <w:p>
       <w:pPr>
+        <w:rPr>
+          <w:rFonts w:cs="Times New Roman"/>
+          <w:b/>
+          <w:szCs w:val="24"/>
+        </w:rPr>
+      </w:pPr>
+    </w:p>
+    <w:p>
+      <w:pPr>
+        <w:rPr>
+          <w:rFonts w:cs="Times New Roman"/>
+          <w:b/>
+          <w:szCs w:val="24"/>
+        </w:rPr>
+      </w:pPr>
+    </w:p>
+    <w:p>
+      <w:pPr>
+        <w:rPr>
+          <w:rFonts w:cs="Times New Roman"/>
+          <w:b/>
+          <w:szCs w:val="24"/>
+        </w:rPr>
+      </w:pPr>
+    </w:p>
+    <w:p>
+      <w:pPr>
+        <w:rPr>
+          <w:rFonts w:cs="Times New Roman"/>
+          <w:b/>
+          <w:szCs w:val="24"/>
+        </w:rPr>
+      </w:pPr>
+    </w:p>
+    <w:p>
+      <w:pPr>
+        <w:rPr>
+          <w:rFonts w:cs="Times New Roman"/>
+          <w:b/>
+          <w:szCs w:val="24"/>
+        </w:rPr>
+      </w:pPr>
+    </w:p>
+    <w:p>
+      <w:pPr>
+        <w:rPr>
+          <w:rFonts w:cs="Times New Roman"/>
+          <w:b/>
+          <w:szCs w:val="24"/>
+        </w:rPr>
+      </w:pPr>
+    </w:p>
+    <w:p>
+      <w:pPr>
         <w:jc w:val="center"/>
         <w:rPr>
           <w:rFonts w:cs="Times New Roman"/>
@@ -5748,16 +6576,7 @@
           <w:bCs/>
           <w:szCs w:val="24"/>
         </w:rPr>
-        <w:t xml:space="preserve">6.1 </w:t>
-      </w:r>
-      <w:r>
-        <w:rPr>
-          <w:rFonts w:cs="Times New Roman"/>
-          <w:b/>
-          <w:bCs/>
-          <w:szCs w:val="24"/>
-        </w:rPr>
-        <w:t>Sistemas de identificación automática</w:t>
+        <w:t>6.1 Sistemas de identificación automática</w:t>
       </w:r>
       <w:r>
         <w:rPr>
@@ -5954,43 +6773,7 @@
           <w:bCs/>
           <w:szCs w:val="24"/>
         </w:rPr>
-        <w:t xml:space="preserve">6.2 </w:t>
-      </w:r>
-      <w:r>
-        <w:rPr>
-          <w:rFonts w:cs="Times New Roman"/>
-          <w:b/>
-          <w:bCs/>
-          <w:szCs w:val="24"/>
-        </w:rPr>
-        <w:t xml:space="preserve">RFID: </w:t>
-      </w:r>
-      <w:r>
-        <w:rPr>
-          <w:rFonts w:cs="Times New Roman"/>
-          <w:b/>
-          <w:bCs/>
-          <w:szCs w:val="24"/>
-        </w:rPr>
-        <w:t>definición</w:t>
-      </w:r>
-      <w:r>
-        <w:rPr>
-          <w:rFonts w:cs="Times New Roman"/>
-          <w:b/>
-          <w:bCs/>
-          <w:szCs w:val="24"/>
-        </w:rPr>
-        <w:t xml:space="preserve"> y arquitectura</w:t>
-      </w:r>
-      <w:r>
-        <w:rPr>
-          <w:rFonts w:cs="Times New Roman"/>
-          <w:b/>
-          <w:bCs/>
-          <w:szCs w:val="24"/>
-        </w:rPr>
-        <w:t>.</w:t>
+        <w:t>6.2 RFID: definición y arquitectura.</w:t>
       </w:r>
     </w:p>
     <w:p>
@@ -6633,7 +7416,35 @@
           <w:rFonts w:cs="Times New Roman"/>
           <w:szCs w:val="24"/>
         </w:rPr>
-        <w:t>Este tipo de antena presenta ventajas importantes como:</w:t>
+        <w:t xml:space="preserve">Este tipo de antena presenta ventajas </w:t>
+      </w:r>
+      <w:r>
+        <w:rPr>
+          <w:rFonts w:cs="Times New Roman"/>
+          <w:szCs w:val="24"/>
+        </w:rPr>
+        <w:t>importantes</w:t>
+      </w:r>
+      <w:r>
+        <w:rPr>
+          <w:rFonts w:cs="Times New Roman"/>
+          <w:szCs w:val="24"/>
+        </w:rPr>
+        <w:t xml:space="preserve"> </w:t>
+      </w:r>
+      <w:r>
+        <w:rPr>
+          <w:rFonts w:cs="Times New Roman"/>
+          <w:szCs w:val="24"/>
+        </w:rPr>
+        <w:t>como</w:t>
+      </w:r>
+      <w:r>
+        <w:rPr>
+          <w:rFonts w:cs="Times New Roman"/>
+          <w:szCs w:val="24"/>
+        </w:rPr>
+        <w:t>:</w:t>
       </w:r>
     </w:p>
     <w:p>
@@ -6804,8 +7615,6 @@
         <w:jc w:val="left"/>
         <w:rPr>
           <w:rFonts w:cs="Times New Roman"/>
-          <w:b/>
-          <w:bCs/>
           <w:szCs w:val="24"/>
         </w:rPr>
       </w:pPr>
@@ -7151,7 +7960,7 @@
           <w:rFonts w:cs="Times New Roman"/>
           <w:szCs w:val="24"/>
         </w:rPr>
-        <w:t xml:space="preserve">El </w:t>
+        <w:t>El</w:t>
       </w:r>
       <w:r>
         <w:rPr>
@@ -7183,13 +7992,95 @@
     </w:p>
     <w:p>
       <w:pPr>
+        <w:jc w:val="left"/>
+        <w:rPr>
+          <w:rFonts w:cs="Times New Roman"/>
+          <w:szCs w:val="24"/>
+        </w:rPr>
+      </w:pPr>
+    </w:p>
+    <w:p>
+      <w:pPr>
+        <w:jc w:val="left"/>
+        <w:rPr>
+          <w:rFonts w:cs="Times New Roman"/>
+          <w:b/>
+          <w:bCs/>
+          <w:szCs w:val="24"/>
+        </w:rPr>
+      </w:pPr>
+      <w:r>
+        <w:rPr>
+          <w:rFonts w:cs="Times New Roman"/>
+          <w:b/>
+          <w:bCs/>
+          <w:szCs w:val="24"/>
+        </w:rPr>
+        <w:lastRenderedPageBreak/>
+        <w:t xml:space="preserve">6.5 </w:t>
+      </w:r>
+      <w:r>
+        <w:rPr>
+          <w:rFonts w:cs="Times New Roman"/>
+          <w:b/>
+          <w:bCs/>
+          <w:szCs w:val="24"/>
+        </w:rPr>
+        <w:t>Parámetros electromagnético</w:t>
+      </w:r>
+      <w:r>
+        <w:rPr>
+          <w:rFonts w:cs="Times New Roman"/>
+          <w:b/>
+          <w:bCs/>
+          <w:szCs w:val="24"/>
+        </w:rPr>
+        <w:t>s y de antena.</w:t>
+      </w:r>
+    </w:p>
+    <w:p>
+      <w:pPr>
+        <w:jc w:val="left"/>
+        <w:rPr>
+          <w:rFonts w:cs="Times New Roman"/>
+          <w:b/>
+          <w:bCs/>
+          <w:szCs w:val="24"/>
+        </w:rPr>
+      </w:pPr>
+    </w:p>
+    <w:p>
+      <w:pPr>
         <w:ind w:firstLine="708"/>
         <w:jc w:val="left"/>
         <w:rPr>
           <w:rFonts w:cs="Times New Roman"/>
-          <w:szCs w:val="24"/>
-        </w:rPr>
-      </w:pPr>
+        </w:rPr>
+      </w:pPr>
+      <w:r>
+        <w:rPr>
+          <w:rFonts w:cs="Times New Roman"/>
+        </w:rPr>
+        <w:t>El rendimiento de una antena se evalúa mediante diversos parámetros electromagnéticos que permiten caracterizar su comportamiento</w:t>
+      </w:r>
+      <w:r>
+        <w:rPr>
+          <w:rFonts w:cs="Times New Roman"/>
+        </w:rPr>
+        <w:t>, como</w:t>
+      </w:r>
+      <w:r>
+        <w:rPr>
+          <w:rFonts w:cs="Times New Roman"/>
+        </w:rPr>
+        <w:t xml:space="preserve"> lo</w:t>
+      </w:r>
+      <w:r>
+        <w:rPr>
+          <w:rFonts w:cs="Times New Roman"/>
+        </w:rPr>
+        <w:t xml:space="preserve"> son:</w:t>
+      </w:r>
     </w:p>
     <w:p>
       <w:pPr>
@@ -7197,6 +8088,53 @@
         <w:jc w:val="left"/>
         <w:rPr>
           <w:rFonts w:cs="Times New Roman"/>
+          <w:b/>
+          <w:bCs/>
+          <w:szCs w:val="24"/>
+        </w:rPr>
+      </w:pPr>
+    </w:p>
+    <w:p>
+      <w:pPr>
+        <w:jc w:val="left"/>
+        <w:rPr>
+          <w:rFonts w:cs="Times New Roman"/>
+          <w:szCs w:val="24"/>
+        </w:rPr>
+      </w:pPr>
+      <w:r>
+        <w:rPr>
+          <w:rFonts w:cs="Times New Roman"/>
+          <w:b/>
+          <w:bCs/>
+          <w:szCs w:val="24"/>
+        </w:rPr>
+        <w:t xml:space="preserve">6.5.1 </w:t>
+      </w:r>
+      <w:r>
+        <w:rPr>
+          <w:rFonts w:cs="Times New Roman"/>
+          <w:b/>
+          <w:bCs/>
+          <w:szCs w:val="24"/>
+        </w:rPr>
+        <w:t>Parámetros</w:t>
+      </w:r>
+      <w:r>
+        <w:rPr>
+          <w:rFonts w:cs="Times New Roman"/>
+          <w:b/>
+          <w:bCs/>
+          <w:szCs w:val="24"/>
+        </w:rPr>
+        <w:t xml:space="preserve"> S (Scattering Parameters)</w:t>
+      </w:r>
+    </w:p>
+    <w:p>
+      <w:pPr>
+        <w:jc w:val="left"/>
+        <w:rPr>
+          <w:rFonts w:cs="Times New Roman"/>
           <w:szCs w:val="24"/>
         </w:rPr>
       </w:pPr>
@@ -7207,9 +8145,53 @@
         <w:jc w:val="left"/>
         <w:rPr>
           <w:rFonts w:cs="Times New Roman"/>
-          <w:szCs w:val="24"/>
-        </w:rPr>
-      </w:pPr>
+        </w:rPr>
+      </w:pPr>
+      <w:r>
+        <w:rPr>
+          <w:rFonts w:cs="Times New Roman"/>
+          <w:szCs w:val="24"/>
+        </w:rPr>
+        <w:t>L</w:t>
+      </w:r>
+      <w:r>
+        <w:rPr>
+          <w:rFonts w:cs="Times New Roman"/>
+        </w:rPr>
+        <w:t>os parámetros S, también conocidos como parámetros de dispersión, son utilizados para describir el comportamiento de dispositivos de radiofrecuencia y microondas en términos de reflexión y transmisión de señales electromagnéticas</w:t>
+      </w:r>
+      <w:r>
+        <w:rPr>
+          <w:rFonts w:cs="Times New Roman"/>
+        </w:rPr>
+        <w:t xml:space="preserve"> </w:t>
+      </w:r>
+      <w:r>
+        <w:rPr>
+          <w:rFonts w:cs="Times New Roman"/>
+          <w:szCs w:val="24"/>
+        </w:rPr>
+        <w:t>(Pozar, 2012)</w:t>
+      </w:r>
+      <w:r>
+        <w:rPr>
+          <w:rFonts w:cs="Times New Roman"/>
+          <w:szCs w:val="24"/>
+        </w:rPr>
+        <w:t xml:space="preserve">. </w:t>
+      </w:r>
+      <w:r>
+        <w:rPr>
+          <w:rFonts w:cs="Times New Roman"/>
+        </w:rPr>
+        <w:t>Estos parámetros permiten analizar cómo una señal que entra en un sistema se refleja o se transmite entre sus diferentes puertos, lo cual resulta fundamental para el diseño y evaluación de dispositivos como filtros, antenas o amplificadores.</w:t>
+      </w:r>
+      <w:r>
+        <w:rPr>
+          <w:rFonts w:cs="Times New Roman"/>
+        </w:rPr>
+        <w:t xml:space="preserve"> </w:t>
+      </w:r>
     </w:p>
     <w:p>
       <w:pPr>
@@ -7217,6 +8199,833 @@
         <w:jc w:val="left"/>
         <w:rPr>
           <w:rFonts w:cs="Times New Roman"/>
+          <w:szCs w:val="24"/>
+        </w:rPr>
+      </w:pPr>
+      <w:r>
+        <w:rPr>
+          <w:rFonts w:cs="Times New Roman"/>
+          <w:szCs w:val="24"/>
+        </w:rPr>
+        <w:t>De acuerdo con García Gea (2024), los parámetros S permiten analizar la respuesta de los dispositivos electromagnéticos en función de la frecuencia. En este sentido, el autor señala que “estos parámetros permiten caracterizar el comportamiento del filtro en términos de transmisión y reflexión de señales electromagnéticas”.</w:t>
+      </w:r>
+    </w:p>
+    <w:p>
+      <w:pPr>
+        <w:ind w:firstLine="708"/>
+        <w:jc w:val="left"/>
+        <w:rPr>
+          <w:rFonts w:cs="Times New Roman"/>
+          <w:szCs w:val="24"/>
+        </w:rPr>
+      </w:pPr>
+      <w:r>
+        <w:rPr>
+          <w:rFonts w:cs="Times New Roman"/>
+          <w:szCs w:val="24"/>
+        </w:rPr>
+        <w:t>Imagen #1</w:t>
+      </w:r>
+    </w:p>
+    <w:p>
+      <w:pPr>
+        <w:ind w:firstLine="708"/>
+        <w:jc w:val="left"/>
+        <w:rPr>
+          <w:rFonts w:cs="Times New Roman"/>
+          <w:szCs w:val="24"/>
+        </w:rPr>
+      </w:pPr>
+      <w:r>
+        <w:rPr>
+          <w:rFonts w:cs="Times New Roman"/>
+          <w:noProof/>
+          <w:szCs w:val="24"/>
+        </w:rPr>
+        <w:drawing>
+          <wp:inline distT="0" distB="0" distL="0" distR="0" wp14:anchorId="6A48446E" wp14:editId="117FA233">
+            <wp:extent cx="4107180" cy="1840333"/>
+            <wp:effectExtent l="0" t="0" r="7620" b="7620"/>
+            <wp:docPr id="639534828" name="Imagen 1"/>
+            <wp:cNvGraphicFramePr>
+              <a:graphicFrameLocks xmlns:a="http://schemas.openxmlformats.org/drawingml/2006/main" noChangeAspect="1"/>
+            </wp:cNvGraphicFramePr>
+            <a:graphic xmlns:a="http://schemas.openxmlformats.org/drawingml/2006/main">
+              <a:graphicData uri="http://schemas.openxmlformats.org/drawingml/2006/picture">
+                <pic:pic xmlns:pic="http://schemas.openxmlformats.org/drawingml/2006/picture">
+                  <pic:nvPicPr>
+                    <pic:cNvPr id="639534828" name=""/>
+                    <pic:cNvPicPr/>
+                  </pic:nvPicPr>
+                  <pic:blipFill>
+                    <a:blip r:embed="rId16"/>
+                    <a:stretch>
+                      <a:fillRect/>
+                    </a:stretch>
+                  </pic:blipFill>
+                  <pic:spPr>
+                    <a:xfrm>
+                      <a:off x="0" y="0"/>
+                      <a:ext cx="4114380" cy="1843559"/>
+                    </a:xfrm>
+                    <a:prstGeom prst="rect">
+                      <a:avLst/>
+                    </a:prstGeom>
+                  </pic:spPr>
+                </pic:pic>
+              </a:graphicData>
+            </a:graphic>
+          </wp:inline>
+        </w:drawing>
+      </w:r>
+      <w:r>
+        <w:rPr>
+          <w:rFonts w:cs="Times New Roman"/>
+          <w:szCs w:val="24"/>
+        </w:rPr>
+        <w:t xml:space="preserve"> </w:t>
+      </w:r>
+    </w:p>
+    <w:p>
+      <w:pPr>
+        <w:ind w:firstLine="708"/>
+        <w:jc w:val="left"/>
+        <w:rPr>
+          <w:rFonts w:cs="Times New Roman"/>
+          <w:szCs w:val="24"/>
+        </w:rPr>
+      </w:pPr>
+      <w:r>
+        <w:rPr>
+          <w:rFonts w:cs="Times New Roman"/>
+          <w:b/>
+          <w:bCs/>
+          <w:szCs w:val="24"/>
+        </w:rPr>
+        <w:t>Nota.</w:t>
+      </w:r>
+      <w:r>
+        <w:rPr>
+          <w:rFonts w:cs="Times New Roman"/>
+          <w:szCs w:val="24"/>
+        </w:rPr>
+        <w:t xml:space="preserve"> Tomado de </w:t>
+      </w:r>
+      <w:r>
+        <w:rPr>
+          <w:rFonts w:cs="Times New Roman"/>
+          <w:i/>
+          <w:iCs/>
+          <w:szCs w:val="24"/>
+        </w:rPr>
+        <w:t>S-Parameters</w:t>
+      </w:r>
+      <w:r>
+        <w:rPr>
+          <w:rFonts w:cs="Times New Roman"/>
+          <w:szCs w:val="24"/>
+        </w:rPr>
+        <w:t>, por Microwaves101, s.f.</w:t>
+      </w:r>
+    </w:p>
+    <w:p>
+      <w:pPr>
+        <w:ind w:firstLine="708"/>
+        <w:jc w:val="left"/>
+        <w:rPr>
+          <w:rFonts w:cs="Times New Roman"/>
+          <w:szCs w:val="24"/>
+        </w:rPr>
+      </w:pPr>
+    </w:p>
+    <w:p>
+      <w:pPr>
+        <w:jc w:val="left"/>
+        <w:rPr>
+          <w:rFonts w:cs="Times New Roman"/>
+          <w:b/>
+          <w:bCs/>
+          <w:szCs w:val="24"/>
+        </w:rPr>
+      </w:pPr>
+      <w:r>
+        <w:rPr>
+          <w:rFonts w:cs="Times New Roman"/>
+          <w:b/>
+          <w:bCs/>
+          <w:szCs w:val="24"/>
+        </w:rPr>
+        <w:t>6.</w:t>
+      </w:r>
+      <w:r>
+        <w:rPr>
+          <w:rFonts w:cs="Times New Roman"/>
+          <w:b/>
+          <w:bCs/>
+          <w:szCs w:val="24"/>
+        </w:rPr>
+        <w:t>5.</w:t>
+      </w:r>
+      <w:r>
+        <w:rPr>
+          <w:rFonts w:cs="Times New Roman"/>
+          <w:b/>
+          <w:bCs/>
+          <w:szCs w:val="24"/>
+        </w:rPr>
+        <w:t>1</w:t>
+      </w:r>
+      <w:r>
+        <w:rPr>
+          <w:rFonts w:cs="Times New Roman"/>
+          <w:b/>
+          <w:bCs/>
+          <w:szCs w:val="24"/>
+        </w:rPr>
+        <w:t>.1</w:t>
+      </w:r>
+      <w:r>
+        <w:rPr>
+          <w:rFonts w:cs="Times New Roman"/>
+          <w:b/>
+          <w:bCs/>
+          <w:szCs w:val="24"/>
+        </w:rPr>
+        <w:t xml:space="preserve"> </w:t>
+      </w:r>
+      <w:r>
+        <w:rPr>
+          <w:rFonts w:cs="Times New Roman"/>
+          <w:b/>
+          <w:bCs/>
+          <w:szCs w:val="24"/>
+        </w:rPr>
+        <w:t>P</w:t>
+      </w:r>
+      <w:r>
+        <w:rPr>
+          <w:rFonts w:cs="Times New Roman"/>
+          <w:b/>
+          <w:bCs/>
+          <w:szCs w:val="24"/>
+        </w:rPr>
+        <w:t>arámetros</w:t>
+      </w:r>
+      <w:r>
+        <w:rPr>
+          <w:rFonts w:cs="Times New Roman"/>
+          <w:b/>
+          <w:bCs/>
+          <w:szCs w:val="24"/>
+        </w:rPr>
+        <w:t xml:space="preserve"> S11</w:t>
+      </w:r>
+      <w:r>
+        <w:rPr>
+          <w:rFonts w:cs="Times New Roman"/>
+          <w:b/>
+          <w:bCs/>
+          <w:szCs w:val="24"/>
+        </w:rPr>
+        <w:t xml:space="preserve"> (Coeficiente </w:t>
+      </w:r>
+      <w:r>
+        <w:rPr>
+          <w:rFonts w:cs="Times New Roman"/>
+          <w:b/>
+          <w:bCs/>
+          <w:szCs w:val="24"/>
+        </w:rPr>
+        <w:t>de reflexión</w:t>
+      </w:r>
+      <w:r>
+        <w:rPr>
+          <w:rFonts w:cs="Times New Roman"/>
+          <w:b/>
+          <w:bCs/>
+          <w:szCs w:val="24"/>
+        </w:rPr>
+        <w:t xml:space="preserve"> de entrada)</w:t>
+      </w:r>
+    </w:p>
+    <w:p>
+      <w:pPr>
+        <w:jc w:val="left"/>
+        <w:rPr>
+          <w:rFonts w:cs="Times New Roman"/>
+          <w:szCs w:val="24"/>
+        </w:rPr>
+      </w:pPr>
+    </w:p>
+    <w:p>
+      <w:pPr>
+        <w:ind w:firstLine="708"/>
+        <w:jc w:val="left"/>
+        <w:rPr>
+          <w:rFonts w:cs="Times New Roman"/>
+          <w:b/>
+          <w:bCs/>
+          <w:szCs w:val="24"/>
+        </w:rPr>
+      </w:pPr>
+      <w:r>
+        <w:rPr>
+          <w:rFonts w:cs="Times New Roman"/>
+        </w:rPr>
+        <w:lastRenderedPageBreak/>
+        <w:t>El parámetro S11 representa la relación entre la onda que llega al puerto de entrada del dispositivo (onda incidente) y la onda que se refleja de regreso hacia la fuente</w:t>
+      </w:r>
+      <w:r>
+        <w:rPr>
+          <w:rFonts w:cs="Times New Roman"/>
+        </w:rPr>
+        <w:t xml:space="preserve"> </w:t>
+      </w:r>
+      <w:r>
+        <w:rPr>
+          <w:rFonts w:cs="Times New Roman"/>
+          <w:szCs w:val="24"/>
+        </w:rPr>
+        <w:t>(Pozar, 2012)</w:t>
+      </w:r>
+      <w:r>
+        <w:rPr>
+          <w:rFonts w:cs="Times New Roman"/>
+        </w:rPr>
+        <w:t>. En otras palabras, permite identificar qué parte de la señal que se envía al sistema no es absorbida por el circuito y retorna por la misma línea de transmisión. Gracias a este parámetro es posible evaluar el nivel de adaptación de impedancias en el puerto de entrada del dispositivo. Cuando el valor de S11 es cercano a cero, se interpreta que la mayor parte de la señal se transmite correctamente hacia el sistema y que la cantidad de señal reflejada es mínima. Por el contrario, si el valor de S11 es elevado, significa que una fracción considerable de la señal se refleja hacia la fuente, lo cual puede indicar una mala adaptación entre el dispositivo y la línea de transmisión.</w:t>
+      </w:r>
+      <w:r>
+        <w:rPr>
+          <w:rFonts w:cs="Times New Roman"/>
+          <w:b/>
+          <w:bCs/>
+          <w:szCs w:val="24"/>
+        </w:rPr>
+        <w:t xml:space="preserve">  </w:t>
+      </w:r>
+    </w:p>
+    <w:p>
+      <w:pPr>
+        <w:ind w:firstLine="708"/>
+        <w:jc w:val="left"/>
+        <w:rPr>
+          <w:rFonts w:cs="Times New Roman"/>
+          <w:b/>
+          <w:bCs/>
+          <w:szCs w:val="24"/>
+        </w:rPr>
+      </w:pPr>
+    </w:p>
+    <w:p>
+      <w:pPr>
+        <w:jc w:val="left"/>
+        <w:rPr>
+          <w:rFonts w:cs="Times New Roman"/>
+          <w:b/>
+          <w:bCs/>
+          <w:szCs w:val="24"/>
+        </w:rPr>
+      </w:pPr>
+      <w:r>
+        <w:rPr>
+          <w:rFonts w:cs="Times New Roman"/>
+          <w:b/>
+          <w:bCs/>
+          <w:szCs w:val="24"/>
+        </w:rPr>
+        <w:t>6.</w:t>
+      </w:r>
+      <w:r>
+        <w:rPr>
+          <w:rFonts w:cs="Times New Roman"/>
+          <w:b/>
+          <w:bCs/>
+          <w:szCs w:val="24"/>
+        </w:rPr>
+        <w:t>5.</w:t>
+      </w:r>
+      <w:r>
+        <w:rPr>
+          <w:rFonts w:cs="Times New Roman"/>
+          <w:b/>
+          <w:bCs/>
+          <w:szCs w:val="24"/>
+        </w:rPr>
+        <w:t>1.</w:t>
+      </w:r>
+      <w:r>
+        <w:rPr>
+          <w:rFonts w:cs="Times New Roman"/>
+          <w:b/>
+          <w:bCs/>
+          <w:szCs w:val="24"/>
+        </w:rPr>
+        <w:t>2</w:t>
+      </w:r>
+      <w:r>
+        <w:rPr>
+          <w:rFonts w:cs="Times New Roman"/>
+          <w:b/>
+          <w:bCs/>
+          <w:szCs w:val="24"/>
+        </w:rPr>
+        <w:t xml:space="preserve"> </w:t>
+      </w:r>
+      <w:r>
+        <w:rPr>
+          <w:rFonts w:cs="Times New Roman"/>
+          <w:b/>
+          <w:bCs/>
+          <w:szCs w:val="24"/>
+        </w:rPr>
+        <w:t>P</w:t>
+      </w:r>
+      <w:r>
+        <w:rPr>
+          <w:rFonts w:cs="Times New Roman"/>
+          <w:b/>
+          <w:bCs/>
+          <w:szCs w:val="24"/>
+        </w:rPr>
+        <w:t>arámetros</w:t>
+      </w:r>
+      <w:r>
+        <w:rPr>
+          <w:rFonts w:cs="Times New Roman"/>
+          <w:b/>
+          <w:bCs/>
+          <w:szCs w:val="24"/>
+        </w:rPr>
+        <w:t xml:space="preserve"> S</w:t>
+      </w:r>
+      <w:r>
+        <w:rPr>
+          <w:rFonts w:cs="Times New Roman"/>
+          <w:b/>
+          <w:bCs/>
+          <w:szCs w:val="24"/>
+        </w:rPr>
+        <w:t>12</w:t>
+      </w:r>
+      <w:r>
+        <w:rPr>
+          <w:rFonts w:cs="Times New Roman"/>
+          <w:b/>
+          <w:bCs/>
+          <w:szCs w:val="24"/>
+        </w:rPr>
+        <w:t xml:space="preserve"> (</w:t>
+      </w:r>
+      <w:r>
+        <w:rPr>
+          <w:rFonts w:cs="Times New Roman"/>
+          <w:b/>
+          <w:bCs/>
+          <w:szCs w:val="24"/>
+        </w:rPr>
+        <w:t>Transmisión inversa</w:t>
+      </w:r>
+      <w:r>
+        <w:rPr>
+          <w:rFonts w:cs="Times New Roman"/>
+          <w:b/>
+          <w:bCs/>
+          <w:szCs w:val="24"/>
+        </w:rPr>
+        <w:t>)</w:t>
+      </w:r>
+    </w:p>
+    <w:p>
+      <w:pPr>
+        <w:jc w:val="left"/>
+        <w:rPr>
+          <w:rFonts w:cs="Times New Roman"/>
+          <w:szCs w:val="24"/>
+        </w:rPr>
+      </w:pPr>
+    </w:p>
+    <w:p>
+      <w:pPr>
+        <w:ind w:firstLine="708"/>
+        <w:jc w:val="left"/>
+        <w:rPr>
+          <w:rFonts w:cs="Times New Roman"/>
+        </w:rPr>
+      </w:pPr>
+      <w:r>
+        <w:rPr>
+          <w:rFonts w:cs="Times New Roman"/>
+        </w:rPr>
+        <w:t>E</w:t>
+      </w:r>
+      <w:r>
+        <w:rPr>
+          <w:rFonts w:cs="Times New Roman"/>
+        </w:rPr>
+        <w:t>l parámetro S12 describe la transmisión de la señal desde el puerto de salida hacia el puerto de entrada, es decir, en dirección opuesta al flujo principal de la señal dentro del dispositivo. Este parámetro permite analizar el comportamiento de la señal cuando se propaga en sentido inverso a través de la red</w:t>
+      </w:r>
+      <w:r>
+        <w:rPr>
+          <w:rFonts w:cs="Times New Roman"/>
+        </w:rPr>
+        <w:t xml:space="preserve"> </w:t>
+      </w:r>
+      <w:r>
+        <w:rPr>
+          <w:rFonts w:cs="Times New Roman"/>
+          <w:szCs w:val="24"/>
+        </w:rPr>
+        <w:t>(Pozar, 2012)</w:t>
+      </w:r>
+      <w:r>
+        <w:rPr>
+          <w:rFonts w:cs="Times New Roman"/>
+        </w:rPr>
+        <w:t>.</w:t>
+      </w:r>
+    </w:p>
+    <w:p>
+      <w:pPr>
+        <w:ind w:firstLine="708"/>
+        <w:jc w:val="left"/>
+        <w:rPr>
+          <w:rFonts w:cs="Times New Roman"/>
+        </w:rPr>
+      </w:pPr>
+    </w:p>
+    <w:p>
+      <w:pPr>
+        <w:jc w:val="left"/>
+        <w:rPr>
+          <w:rFonts w:cs="Times New Roman"/>
+          <w:b/>
+          <w:bCs/>
+          <w:szCs w:val="24"/>
+        </w:rPr>
+      </w:pPr>
+      <w:r>
+        <w:rPr>
+          <w:rFonts w:cs="Times New Roman"/>
+          <w:b/>
+          <w:bCs/>
+          <w:szCs w:val="24"/>
+        </w:rPr>
+        <w:t>6.</w:t>
+      </w:r>
+      <w:r>
+        <w:rPr>
+          <w:rFonts w:cs="Times New Roman"/>
+          <w:b/>
+          <w:bCs/>
+          <w:szCs w:val="24"/>
+        </w:rPr>
+        <w:t>5.</w:t>
+      </w:r>
+      <w:r>
+        <w:rPr>
+          <w:rFonts w:cs="Times New Roman"/>
+          <w:b/>
+          <w:bCs/>
+          <w:szCs w:val="24"/>
+        </w:rPr>
+        <w:t>1.</w:t>
+      </w:r>
+      <w:r>
+        <w:rPr>
+          <w:rFonts w:cs="Times New Roman"/>
+          <w:b/>
+          <w:bCs/>
+          <w:szCs w:val="24"/>
+        </w:rPr>
+        <w:t xml:space="preserve">3 </w:t>
+      </w:r>
+      <w:r>
+        <w:rPr>
+          <w:rFonts w:cs="Times New Roman"/>
+          <w:b/>
+          <w:bCs/>
+          <w:szCs w:val="24"/>
+        </w:rPr>
+        <w:t>P</w:t>
+      </w:r>
+      <w:r>
+        <w:rPr>
+          <w:rFonts w:cs="Times New Roman"/>
+          <w:b/>
+          <w:bCs/>
+          <w:szCs w:val="24"/>
+        </w:rPr>
+        <w:t>arámetros</w:t>
+      </w:r>
+      <w:r>
+        <w:rPr>
+          <w:rFonts w:cs="Times New Roman"/>
+          <w:b/>
+          <w:bCs/>
+          <w:szCs w:val="24"/>
+        </w:rPr>
+        <w:t xml:space="preserve"> S</w:t>
+      </w:r>
+      <w:r>
+        <w:rPr>
+          <w:rFonts w:cs="Times New Roman"/>
+          <w:b/>
+          <w:bCs/>
+          <w:szCs w:val="24"/>
+        </w:rPr>
+        <w:t>21 (Transmisión directa)</w:t>
+      </w:r>
+    </w:p>
+    <w:p>
+      <w:pPr>
+        <w:jc w:val="left"/>
+        <w:rPr>
+          <w:rFonts w:cs="Times New Roman"/>
+          <w:b/>
+          <w:bCs/>
+          <w:szCs w:val="24"/>
+        </w:rPr>
+      </w:pPr>
+    </w:p>
+    <w:p>
+      <w:pPr>
+        <w:ind w:firstLine="708"/>
+        <w:jc w:val="left"/>
+        <w:rPr>
+          <w:rFonts w:cs="Times New Roman"/>
+        </w:rPr>
+      </w:pPr>
+      <w:r>
+        <w:rPr>
+          <w:rFonts w:cs="Times New Roman"/>
+        </w:rPr>
+        <w:t>El parámetro S21 representa la transmisión de señal desde el puerto de entrada hacia el puerto de salida. Este parámetro se utiliza para medir cuánta energía de la señal que entra al sistema logra atravesarlo y salir por el segundo puerto. Permite determinar la ganancia o pérdida de inserción del sistema</w:t>
+      </w:r>
+      <w:r>
+        <w:rPr>
+          <w:rFonts w:cs="Times New Roman"/>
+        </w:rPr>
+        <w:t xml:space="preserve"> </w:t>
+      </w:r>
+      <w:r>
+        <w:rPr>
+          <w:rFonts w:cs="Times New Roman"/>
+          <w:szCs w:val="24"/>
+        </w:rPr>
+        <w:t>(Pozar, 2012)</w:t>
+      </w:r>
+      <w:r>
+        <w:rPr>
+          <w:rFonts w:cs="Times New Roman"/>
+        </w:rPr>
+        <w:t>. Un valor alto de S21 indica que la señal se transmite eficientemente desde la entrada hacia la salid</w:t>
+      </w:r>
+      <w:r>
+        <w:rPr>
+          <w:rFonts w:cs="Times New Roman"/>
+        </w:rPr>
+        <w:t>a.</w:t>
+      </w:r>
+    </w:p>
+    <w:p>
+      <w:pPr>
+        <w:ind w:firstLine="708"/>
+        <w:jc w:val="left"/>
+        <w:rPr>
+          <w:rFonts w:cs="Times New Roman"/>
+        </w:rPr>
+      </w:pPr>
+    </w:p>
+    <w:p>
+      <w:pPr>
+        <w:jc w:val="left"/>
+        <w:rPr>
+          <w:rFonts w:cs="Times New Roman"/>
+          <w:b/>
+          <w:bCs/>
+          <w:szCs w:val="24"/>
+        </w:rPr>
+      </w:pPr>
+      <w:r>
+        <w:rPr>
+          <w:rFonts w:cs="Times New Roman"/>
+          <w:b/>
+          <w:bCs/>
+          <w:szCs w:val="24"/>
+        </w:rPr>
+        <w:t>6.</w:t>
+      </w:r>
+      <w:r>
+        <w:rPr>
+          <w:rFonts w:cs="Times New Roman"/>
+          <w:b/>
+          <w:bCs/>
+          <w:szCs w:val="24"/>
+        </w:rPr>
+        <w:t>5.</w:t>
+      </w:r>
+      <w:r>
+        <w:rPr>
+          <w:rFonts w:cs="Times New Roman"/>
+          <w:b/>
+          <w:bCs/>
+          <w:szCs w:val="24"/>
+        </w:rPr>
+        <w:t>1.</w:t>
+      </w:r>
+      <w:r>
+        <w:rPr>
+          <w:rFonts w:cs="Times New Roman"/>
+          <w:b/>
+          <w:bCs/>
+          <w:szCs w:val="24"/>
+        </w:rPr>
+        <w:t xml:space="preserve">4 </w:t>
+      </w:r>
+      <w:r>
+        <w:rPr>
+          <w:rFonts w:cs="Times New Roman"/>
+          <w:b/>
+          <w:bCs/>
+          <w:szCs w:val="24"/>
+        </w:rPr>
+        <w:t>P</w:t>
+      </w:r>
+      <w:r>
+        <w:rPr>
+          <w:rFonts w:cs="Times New Roman"/>
+          <w:b/>
+          <w:bCs/>
+          <w:szCs w:val="24"/>
+        </w:rPr>
+        <w:t>arámetros</w:t>
+      </w:r>
+      <w:r>
+        <w:rPr>
+          <w:rFonts w:cs="Times New Roman"/>
+          <w:b/>
+          <w:bCs/>
+          <w:szCs w:val="24"/>
+        </w:rPr>
+        <w:t xml:space="preserve"> S</w:t>
+      </w:r>
+      <w:r>
+        <w:rPr>
+          <w:rFonts w:cs="Times New Roman"/>
+          <w:b/>
+          <w:bCs/>
+          <w:szCs w:val="24"/>
+        </w:rPr>
+        <w:t>22 (Coeficiente de reflexión de salida)</w:t>
+      </w:r>
+    </w:p>
+    <w:p>
+      <w:pPr>
+        <w:jc w:val="left"/>
+        <w:rPr>
+          <w:rFonts w:cs="Times New Roman"/>
+          <w:b/>
+          <w:bCs/>
+          <w:szCs w:val="24"/>
+        </w:rPr>
+      </w:pPr>
+    </w:p>
+    <w:p>
+      <w:pPr>
+        <w:ind w:firstLine="708"/>
+        <w:jc w:val="left"/>
+        <w:rPr>
+          <w:rFonts w:cs="Times New Roman"/>
+        </w:rPr>
+      </w:pPr>
+      <w:r>
+        <w:rPr>
+          <w:rFonts w:cs="Times New Roman"/>
+        </w:rPr>
+        <w:t xml:space="preserve">El parámetro S22 representa el coeficiente de reflexión en el puerto de salida del dispositivo. Este parámetro indica qué fracción de la señal que llega al puerto de salida es </w:t>
+      </w:r>
+      <w:r>
+        <w:rPr>
+          <w:rFonts w:cs="Times New Roman"/>
+        </w:rPr>
+        <w:lastRenderedPageBreak/>
+        <w:t>reflejada nuevamente hacia el interior del sistema</w:t>
+      </w:r>
+      <w:r>
+        <w:rPr>
+          <w:rFonts w:cs="Times New Roman"/>
+        </w:rPr>
+        <w:t xml:space="preserve"> </w:t>
+      </w:r>
+      <w:r>
+        <w:rPr>
+          <w:rFonts w:cs="Times New Roman"/>
+          <w:szCs w:val="24"/>
+        </w:rPr>
+        <w:t>(Pozar, 2012)</w:t>
+      </w:r>
+      <w:r>
+        <w:rPr>
+          <w:rFonts w:cs="Times New Roman"/>
+        </w:rPr>
+        <w:t>. El análisis de S22 permite evaluar la adaptación de impedancia en la salida del dispositivo.</w:t>
+      </w:r>
+    </w:p>
+    <w:p>
+      <w:pPr>
+        <w:ind w:firstLine="708"/>
+        <w:jc w:val="left"/>
+        <w:rPr>
+          <w:rFonts w:cs="Times New Roman"/>
+        </w:rPr>
+      </w:pPr>
+    </w:p>
+    <w:p>
+      <w:pPr>
+        <w:ind w:firstLine="708"/>
+        <w:jc w:val="left"/>
+        <w:rPr>
+          <w:rFonts w:cs="Times New Roman"/>
+          <w:szCs w:val="24"/>
+        </w:rPr>
+      </w:pPr>
+    </w:p>
+    <w:p>
+      <w:pPr>
+        <w:ind w:firstLine="708"/>
+        <w:jc w:val="left"/>
+        <w:rPr>
+          <w:rFonts w:cs="Times New Roman"/>
+          <w:szCs w:val="24"/>
+        </w:rPr>
+      </w:pPr>
+    </w:p>
+    <w:p>
+      <w:pPr>
+        <w:ind w:firstLine="708"/>
+        <w:jc w:val="left"/>
+        <w:rPr>
+          <w:rFonts w:cs="Times New Roman"/>
+          <w:szCs w:val="24"/>
+        </w:rPr>
+      </w:pPr>
+    </w:p>
+    <w:p>
+      <w:pPr>
+        <w:ind w:firstLine="708"/>
+        <w:jc w:val="left"/>
+        <w:rPr>
+          <w:rFonts w:cs="Times New Roman"/>
+          <w:szCs w:val="24"/>
+        </w:rPr>
+      </w:pPr>
+    </w:p>
+    <w:p>
+      <w:pPr>
+        <w:ind w:firstLine="708"/>
+        <w:jc w:val="left"/>
+        <w:rPr>
+          <w:rFonts w:cs="Times New Roman"/>
           <w:b/>
           <w:szCs w:val="24"/>
         </w:rPr>
@@ -7312,6 +9121,95 @@
       </w:r>
       <w:r>
         <w:t>enfoques se considera fundamental para obtener resultados más completos y precisos, ya que permitirá no solo cuantificar el rendimiento del sistema, sino también valorar su impacto operativo y aplicabilidad práctica dentro del contexto institucional.</w:t>
+      </w:r>
+    </w:p>
+    <w:p>
+      <w:pPr>
+        <w:pStyle w:val="PrrAPA"/>
+      </w:pPr>
+      <w:r>
+        <w:t>Por último, l</w:t>
+      </w:r>
+      <w:r>
+        <w:t xml:space="preserve">a población objeto de estudio está conformada por la totalidad de los miembros de la comunidad académica de la Institución Universitaria Salazar y Herrera, </w:t>
+      </w:r>
+      <w:r>
+        <w:t>en este caso los</w:t>
+      </w:r>
+      <w:r>
+        <w:t xml:space="preserve"> estudiantes</w:t>
+      </w:r>
+      <w:r>
+        <w:t xml:space="preserve"> activos </w:t>
+      </w:r>
+      <w:r>
+        <w:t>sin distinción de edad, género, nivel educativo o área de desempeño.</w:t>
+      </w:r>
+      <w:r>
+        <w:t xml:space="preserve"> </w:t>
+      </w:r>
+      <w:r>
+        <w:t>Se considera esta población debido a que todos ellos tienen acceso y hacen uso potencial de los servicios ofrecidos por la biblioteca institucional, convirtiéndose en usuarios directos del sistema objeto de estudio.</w:t>
+      </w:r>
+    </w:p>
+    <w:p>
+      <w:pPr>
+        <w:pStyle w:val="PrrAPA"/>
+      </w:pPr>
+      <w:r>
+        <w:t>En cuanto a las características generales, la población es heterogénea, ya que abarca diferentes rangos de edad</w:t>
+      </w:r>
+      <w:r>
+        <w:t xml:space="preserve"> y </w:t>
+      </w:r>
+      <w:r>
+        <w:t xml:space="preserve">niveles de formación académica, lo que permite obtener una visión </w:t>
+      </w:r>
+      <w:r>
+        <w:lastRenderedPageBreak/>
+        <w:t>integral del uso y necesidades del servicio bibliotecario.</w:t>
+      </w:r>
+      <w:r>
+        <w:t xml:space="preserve"> </w:t>
+      </w:r>
+      <w:r>
+        <w:t>Como criterios de inclusión, se consideran todos los miembros activos de la institución que tengan acceso a la biblioteca. Se excluyen aquellas personas externas que no pertenecen a la comunidad universitaria</w:t>
+      </w:r>
+      <w:r>
+        <w:t>, personal graduado</w:t>
+      </w:r>
+      <w:r>
+        <w:t xml:space="preserve"> o que no hacen uso de este servicio.</w:t>
+      </w:r>
+    </w:p>
+    <w:p>
+      <w:pPr>
+        <w:pStyle w:val="PrrAPA"/>
+      </w:pPr>
+      <w:r>
+        <w:t xml:space="preserve">El tamaño de la población corresponde al total de usuarios </w:t>
+      </w:r>
+      <w:r>
+        <w:t xml:space="preserve">activos </w:t>
+      </w:r>
+      <w:r>
+        <w:t xml:space="preserve">vinculados a la institución </w:t>
+      </w:r>
+      <w:commentRangeStart w:id="33"/>
+      <w:r>
+        <w:t>(según disponibilidad de datos institucional)</w:t>
+      </w:r>
+      <w:commentRangeEnd w:id="33"/>
+      <w:r>
+        <w:rPr>
+          <w:rStyle w:val="Refdecomentario"/>
+          <w:sz w:val="24"/>
+          <w:szCs w:val="24"/>
+        </w:rPr>
+        <w:commentReference w:id="33"/>
+      </w:r>
+      <w:r>
+        <w:t>, por lo cual se clasifica como una población finita.</w:t>
       </w:r>
     </w:p>
     <w:p>
@@ -7401,7 +9299,6 @@
         </w:numPr>
       </w:pPr>
       <w:r>
-        <w:lastRenderedPageBreak/>
         <w:t>Análisis comparativo</w:t>
       </w:r>
     </w:p>
@@ -7483,6 +9380,7 @@
         </w:numPr>
       </w:pPr>
       <w:r>
+        <w:lastRenderedPageBreak/>
         <w:t>Observar buenas prácticas, validar problemas comunes y comparar métodos de préstamo, devolución, inventario y seguridad.</w:t>
       </w:r>
     </w:p>
@@ -7573,7 +9471,6 @@
         </w:numPr>
       </w:pPr>
       <w:r>
-        <w:lastRenderedPageBreak/>
         <w:t>Implementar el prototipo del sistema RFID, valorando su desempeño en términos de alcance, velocidad, precisión y confiabilidad, y formulando recomendaciones para su adopción institucional.</w:t>
       </w:r>
     </w:p>
@@ -7631,6 +9528,7 @@
         <w:rPr>
           <w:noProof/>
         </w:rPr>
+        <w:lastRenderedPageBreak/>
         <w:drawing>
           <wp:inline distT="0" distB="0" distL="0" distR="0" wp14:anchorId="466E7E1A" wp14:editId="24679CC6">
             <wp:extent cx="4686300" cy="5230862"/>
@@ -7649,7 +9547,7 @@
                     </pic:cNvPicPr>
                   </pic:nvPicPr>
                   <pic:blipFill>
-                    <a:blip r:embed="rId16">
+                    <a:blip r:embed="rId17">
                       <a:extLst>
                         <a:ext uri="{28A0092B-C50C-407E-A947-70E740481C1C}">
                           <a14:useLocalDpi xmlns:a14="http://schemas.microsoft.com/office/drawing/2010/main" val="0"/>
@@ -7687,7 +9585,6 @@
         <w:ind w:left="1080"/>
       </w:pPr>
       <w:r>
-        <w:lastRenderedPageBreak/>
         <w:t>Cronograma:</w:t>
       </w:r>
     </w:p>
@@ -7700,6 +9597,7 @@
         <w:rPr>
           <w:noProof/>
         </w:rPr>
+        <w:lastRenderedPageBreak/>
         <w:drawing>
           <wp:inline distT="0" distB="0" distL="0" distR="0" wp14:anchorId="27A97C1E" wp14:editId="334C62F8">
             <wp:extent cx="5081224" cy="3035300"/>
@@ -7718,7 +9616,7 @@
                     </pic:cNvPicPr>
                   </pic:nvPicPr>
                   <pic:blipFill>
-                    <a:blip r:embed="rId17" cstate="print">
+                    <a:blip r:embed="rId18" cstate="print">
                       <a:extLst>
                         <a:ext uri="{28A0092B-C50C-407E-A947-70E740481C1C}">
                           <a14:useLocalDpi xmlns:a14="http://schemas.microsoft.com/office/drawing/2010/main" val="0"/>
@@ -7775,7 +9673,7 @@
           <w:bCs/>
         </w:rPr>
       </w:pPr>
-      <w:bookmarkStart w:id="33" w:name="_Toc440985140"/>
+      <w:bookmarkStart w:id="34" w:name="_Toc440985140"/>
       <w:r>
         <w:rPr>
           <w:b/>
@@ -7791,7 +9689,7 @@
         </w:rPr>
         <w:t xml:space="preserve"> Resultados</w:t>
       </w:r>
-      <w:bookmarkEnd w:id="33"/>
+      <w:bookmarkEnd w:id="34"/>
     </w:p>
     <w:p>
       <w:pPr>
@@ -7839,7 +9737,7 @@
         </w:rPr>
         <w:t xml:space="preserve">, proyecto o investigación. Aquí se pueden incluir tablas, figuras, diagramas y demás material demostrativo. </w:t>
       </w:r>
-      <w:bookmarkStart w:id="34" w:name="_Ref57038153"/>
+      <w:bookmarkStart w:id="35" w:name="_Ref57038153"/>
     </w:p>
     <w:p>
       <w:pPr>
@@ -7849,8 +9747,8 @@
           <w:b/>
         </w:rPr>
       </w:pPr>
-      <w:bookmarkStart w:id="35" w:name="_Toc440985141"/>
-      <w:bookmarkEnd w:id="34"/>
+      <w:bookmarkStart w:id="36" w:name="_Toc440985141"/>
+      <w:bookmarkEnd w:id="35"/>
       <w:r>
         <w:rPr>
           <w:b/>
@@ -7881,7 +9779,7 @@
         </w:rPr>
         <w:t xml:space="preserve"> Discusión</w:t>
       </w:r>
-      <w:bookmarkEnd w:id="35"/>
+      <w:bookmarkEnd w:id="36"/>
     </w:p>
     <w:p>
       <w:pPr>
@@ -7947,7 +9845,7 @@
           <w:bCs/>
         </w:rPr>
       </w:pPr>
-      <w:bookmarkStart w:id="36" w:name="_Toc440985142"/>
+      <w:bookmarkStart w:id="37" w:name="_Toc440985142"/>
       <w:r>
         <w:rPr>
           <w:b/>
@@ -7963,7 +9861,7 @@
         </w:rPr>
         <w:t xml:space="preserve"> Conclusiones</w:t>
       </w:r>
-      <w:bookmarkEnd w:id="36"/>
+      <w:bookmarkEnd w:id="37"/>
     </w:p>
     <w:p>
       <w:pPr>
@@ -8386,8 +10284,8 @@
       <w:pPr>
         <w:pStyle w:val="Ttulo1"/>
       </w:pPr>
-      <w:bookmarkStart w:id="37" w:name="_Toc440985143"/>
-      <w:bookmarkStart w:id="38" w:name="_Toc758643157"/>
+      <w:bookmarkStart w:id="38" w:name="_Toc440985143"/>
+      <w:bookmarkStart w:id="39" w:name="_Toc758643157"/>
       <w:r>
         <w:br w:type="page"/>
       </w:r>
@@ -8395,8 +10293,8 @@
         <w:lastRenderedPageBreak/>
         <w:t>Referencias</w:t>
       </w:r>
-      <w:bookmarkEnd w:id="37"/>
       <w:bookmarkEnd w:id="38"/>
+      <w:bookmarkEnd w:id="39"/>
     </w:p>
     <w:p/>
     <w:sdt>
@@ -8886,6 +10784,47 @@
             <w:rPr>
               <w:rFonts w:cs="Times New Roman"/>
               <w:noProof/>
+            </w:rPr>
+          </w:pPr>
+          <w:r>
+            <w:rPr>
+              <w:rFonts w:cs="Times New Roman"/>
+              <w:noProof/>
+            </w:rPr>
+            <w:t xml:space="preserve">García Gea, R. (2025). Análisis de efectos de alta potencia en filtros de microondas empleando sustratos dieléctricos y soluciones (Trabajo Fin de Máster). </w:t>
+          </w:r>
+          <w:r>
+            <w:rPr>
+              <w:rFonts w:cs="Times New Roman"/>
+              <w:noProof/>
+            </w:rPr>
+            <w:t>Universidad Politécnica de Cartagena</w:t>
+          </w:r>
+          <w:r>
+            <w:rPr>
+              <w:rFonts w:cs="Times New Roman"/>
+              <w:noProof/>
+            </w:rPr>
+            <w:t xml:space="preserve">. </w:t>
+          </w:r>
+          <w:r>
+            <w:rPr>
+              <w:rFonts w:cs="Times New Roman"/>
+              <w:noProof/>
+            </w:rPr>
+            <w:t>https://repositorio.upct.es/server/api/core/bitstreams/c52d8a9c-5549-4f75-92ba-7feff65cd529/content</w:t>
+          </w:r>
+        </w:p>
+        <w:p>
+          <w:pPr>
+            <w:widowControl w:val="0"/>
+            <w:autoSpaceDE w:val="0"/>
+            <w:autoSpaceDN w:val="0"/>
+            <w:adjustRightInd w:val="0"/>
+            <w:ind w:left="480" w:hanging="480"/>
+            <w:rPr>
+              <w:rFonts w:cs="Times New Roman"/>
+              <w:noProof/>
               <w:lang w:val="en-US"/>
             </w:rPr>
           </w:pPr>
@@ -8935,6 +10874,7 @@
               <w:noProof/>
               <w:lang w:val="en-US"/>
             </w:rPr>
+            <w:lastRenderedPageBreak/>
             <w:t xml:space="preserve">Khair, N., Yusof, N. A., Ariff, M. H., Wahab, M. A., &amp; Bari, M. F. (2022). </w:t>
           </w:r>
           <w:r>
@@ -8975,16 +10915,7 @@
               <w:noProof/>
               <w:lang w:val="en-US"/>
             </w:rPr>
-            <w:t xml:space="preserve">Krishnamo, P., &amp; Pack, M. (2025). RFID security mechanism of smart library combined with </w:t>
-          </w:r>
-          <w:r>
-            <w:rPr>
-              <w:rFonts w:cs="Times New Roman"/>
-              <w:noProof/>
-              <w:lang w:val="en-US"/>
-            </w:rPr>
-            <w:lastRenderedPageBreak/>
-            <w:t>intelligent cognitive system. Icsssm. https://doi.org/10.2991/978-2-38476-533-1</w:t>
+            <w:t>Krishnamo, P., &amp; Pack, M. (2025). RFID security mechanism of smart library combined with intelligent cognitive system. Icsssm. https://doi.org/10.2991/978-2-38476-533-1</w:t>
           </w:r>
         </w:p>
         <w:p>
@@ -9422,6 +11353,37 @@
             <w:rPr>
               <w:rFonts w:cs="Times New Roman"/>
               <w:noProof/>
+              <w:lang w:val="en-US"/>
+            </w:rPr>
+            <w:t xml:space="preserve">Olakunle Victor, A., Boyinbode, O. K., &amp; Oyelade, I. M. (2025). Implementation of Internet of </w:t>
+          </w:r>
+          <w:r>
+            <w:rPr>
+              <w:rFonts w:cs="Times New Roman"/>
+              <w:noProof/>
+              <w:lang w:val="en-US"/>
+            </w:rPr>
+            <w:lastRenderedPageBreak/>
+            <w:t>Things (IoT) library system in Nigerian universities. International Journal of Computer Applications, 186(72), 1–10.</w:t>
+          </w:r>
+        </w:p>
+        <w:p>
+          <w:pPr>
+            <w:widowControl w:val="0"/>
+            <w:autoSpaceDE w:val="0"/>
+            <w:autoSpaceDN w:val="0"/>
+            <w:adjustRightInd w:val="0"/>
+            <w:ind w:left="480" w:hanging="480"/>
+            <w:rPr>
+              <w:rFonts w:cs="Times New Roman"/>
+              <w:noProof/>
+              <w:lang w:val="en-US"/>
+            </w:rPr>
+          </w:pPr>
+          <w:r>
+            <w:rPr>
+              <w:rFonts w:cs="Times New Roman"/>
+              <w:noProof/>
             </w:rPr>
             <w:t xml:space="preserve">Patil, S. S., Dasar, M. G., Melinamani, P. R., Patil, J., &amp; Waddar, N. (2024). </w:t>
           </w:r>
@@ -9520,8 +11482,8 @@
             <w:rPr>
               <w:rFonts w:cs="Times New Roman"/>
               <w:noProof/>
+              <w:lang w:val="en-US"/>
             </w:rPr>
-            <w:lastRenderedPageBreak/>
             <w:t xml:space="preserve">Putra, I. G. S. E., &amp; Labasariyani, N. L. P. (2022). </w:t>
           </w:r>
           <w:r>
@@ -9605,20 +11567,6 @@
             </w:rPr>
             <w:t>México D. F.: Oxford University Press.</w:t>
           </w:r>
-        </w:p>
-        <w:p>
-          <w:pPr>
-            <w:widowControl w:val="0"/>
-            <w:autoSpaceDE w:val="0"/>
-            <w:autoSpaceDN w:val="0"/>
-            <w:adjustRightInd w:val="0"/>
-            <w:ind w:left="480" w:hanging="480"/>
-            <w:rPr>
-              <w:rFonts w:cs="Times New Roman"/>
-              <w:noProof/>
-              <w:lang w:val="en-US"/>
-            </w:rPr>
-          </w:pPr>
         </w:p>
         <w:p>
           <w:pPr>
@@ -9978,6 +11926,7 @@
               <w:noProof/>
               <w:lang w:val="en-US"/>
             </w:rPr>
+            <w:lastRenderedPageBreak/>
             <w:t>Systems</w:t>
           </w:r>
           <w:r>
@@ -10007,7 +11956,260 @@
             <w:t>(2), 21–35. https://doi.org/10.47604/ijts.2041</w:t>
           </w:r>
         </w:p>
-        <w:p/>
+        <w:p>
+          <w:pPr>
+            <w:widowControl w:val="0"/>
+            <w:autoSpaceDE w:val="0"/>
+            <w:autoSpaceDN w:val="0"/>
+            <w:adjustRightInd w:val="0"/>
+            <w:ind w:left="480" w:hanging="480"/>
+            <w:rPr>
+              <w:rFonts w:cs="Times New Roman"/>
+              <w:noProof/>
+              <w:lang w:val="en-US"/>
+            </w:rPr>
+          </w:pPr>
+          <w:r>
+            <w:rPr>
+              <w:rFonts w:cs="Times New Roman"/>
+              <w:noProof/>
+              <w:lang w:val="en-US"/>
+            </w:rPr>
+            <w:t>(S/f-a). Cloudfront.net.</w:t>
+          </w:r>
+          <w:r>
+            <w:rPr>
+              <w:rFonts w:cs="Times New Roman"/>
+              <w:noProof/>
+              <w:lang w:val="en-US"/>
+            </w:rPr>
+            <w:t xml:space="preserve"> (2026)</w:t>
+          </w:r>
+          <w:r>
+            <w:rPr>
+              <w:rFonts w:cs="Times New Roman"/>
+              <w:noProof/>
+              <w:lang w:val="en-US"/>
+            </w:rPr>
+            <w:t>,</w:t>
+          </w:r>
+          <w:r>
+            <w:rPr>
+              <w:rFonts w:cs="Times New Roman"/>
+              <w:noProof/>
+              <w:lang w:val="en-US"/>
+            </w:rPr>
+            <w:t xml:space="preserve"> </w:t>
+          </w:r>
+          <w:r>
+            <w:rPr>
+              <w:rFonts w:cs="Times New Roman"/>
+              <w:noProof/>
+              <w:lang w:val="en-US"/>
+            </w:rPr>
+            <w:t>h</w:t>
+          </w:r>
+          <w:r>
+            <w:rPr>
+              <w:rFonts w:cs="Times New Roman"/>
+              <w:noProof/>
+              <w:lang w:val="en-US"/>
+            </w:rPr>
+            <w:t>ttps://d1wqtxts1xzle7.cloudfront.net/125469756/KEDLD2025_1_-libre.pdf?1763778070=&amp;response-content-disposition=inline%3B+filename%3DNational_Digital_Library_of_India_NDLI_a.pdf&amp;Expires=1773545232&amp;Signature=SptK-SVemPZLkKjo17LI28xozvbsPaMyhdi68fWj7hLZ6kL-Icx7hhRaOwaO1DTS5ecWR-825jjN-YNxrPQPH6VCJJ5AWxkulteCTx-QyHjxqqCJMlG6jqd6yYmBi7q6pxawN4jWdegDeJxqvlFl4qh6jaW-uZBJ7d7~xG0mXb0xy0Jt5IXpxQDyBUyi5y~vFseQ2idd36TnQdL1z3xe7xf6eyKlFZeTRzr-HU1o9SDD7SiZEk1--AQ2UVFgHnKfq0~RoNWg-igbK71b1v3LcVxAodNWIsLBfp3lvTxrD6KkHVWqStlvC2GNwq2Iz4Yk9VMgxYbJECgbGEeukUJeow__&amp;Key-Pair-Id=APKAJLOHF5GGSLRBV4ZA</w:t>
+          </w:r>
+        </w:p>
+        <w:p>
+          <w:pPr>
+            <w:widowControl w:val="0"/>
+            <w:autoSpaceDE w:val="0"/>
+            <w:autoSpaceDN w:val="0"/>
+            <w:adjustRightInd w:val="0"/>
+            <w:ind w:left="480" w:hanging="480"/>
+            <w:rPr>
+              <w:rFonts w:cs="Times New Roman"/>
+              <w:noProof/>
+              <w:lang w:val="en-US"/>
+            </w:rPr>
+          </w:pPr>
+          <w:r>
+            <w:rPr>
+              <w:rFonts w:cs="Times New Roman"/>
+              <w:noProof/>
+              <w:lang w:val="en-US"/>
+            </w:rPr>
+            <w:t xml:space="preserve">Researchgate.net. </w:t>
+          </w:r>
+          <w:r>
+            <w:rPr>
+              <w:rFonts w:cs="Times New Roman"/>
+              <w:noProof/>
+              <w:lang w:val="en-US"/>
+            </w:rPr>
+            <w:t>(2026)</w:t>
+          </w:r>
+          <w:r>
+            <w:rPr>
+              <w:rFonts w:cs="Times New Roman"/>
+              <w:noProof/>
+              <w:lang w:val="en-US"/>
+            </w:rPr>
+            <w:t>, https://www.researchgate.net/profile/Iyinoluwa-Oyelade/publication/390212295_IMPLEMENTATION_OF_INTERNET_OF_THINGS_IoT_LIBRARY_SYSTEM_IN_NIGERIAN_UNIVERSITIES/links/67ec569c9b1c6c48776d35c4/IMPLEMENTATION-OF-INTERNET-OF-THINGS-IoT-LIBRARY-SYSTEM-IN-NIGERIAN-UNIVERSITIES.pdf</w:t>
+          </w:r>
+        </w:p>
+        <w:p>
+          <w:pPr>
+            <w:widowControl w:val="0"/>
+            <w:autoSpaceDE w:val="0"/>
+            <w:autoSpaceDN w:val="0"/>
+            <w:adjustRightInd w:val="0"/>
+            <w:ind w:left="480" w:hanging="480"/>
+            <w:rPr>
+              <w:rFonts w:cs="Times New Roman"/>
+              <w:noProof/>
+              <w:lang w:val="en-US"/>
+            </w:rPr>
+          </w:pPr>
+          <w:r>
+            <w:rPr>
+              <w:rFonts w:cs="Times New Roman"/>
+              <w:noProof/>
+              <w:lang w:val="en-US"/>
+            </w:rPr>
+            <w:t>Bevelacqua, P. (</w:t>
+          </w:r>
+          <w:r>
+            <w:rPr>
+              <w:rFonts w:cs="Times New Roman"/>
+              <w:noProof/>
+              <w:lang w:val="en-US"/>
+            </w:rPr>
+            <w:t>2026</w:t>
+          </w:r>
+          <w:r>
+            <w:rPr>
+              <w:rFonts w:cs="Times New Roman"/>
+              <w:noProof/>
+              <w:lang w:val="en-US"/>
+            </w:rPr>
+            <w:t>). </w:t>
+          </w:r>
+          <w:r>
+            <w:rPr>
+              <w:rFonts w:cs="Times New Roman"/>
+              <w:i/>
+              <w:iCs/>
+              <w:noProof/>
+              <w:lang w:val="en-US"/>
+            </w:rPr>
+            <w:t>S-Parameters</w:t>
+          </w:r>
+          <w:r>
+            <w:rPr>
+              <w:rFonts w:cs="Times New Roman"/>
+              <w:noProof/>
+              <w:lang w:val="en-US"/>
+            </w:rPr>
+            <w:t xml:space="preserve">. </w:t>
+          </w:r>
+          <w:r>
+            <w:rPr>
+              <w:rFonts w:cs="Times New Roman"/>
+              <w:noProof/>
+              <w:lang w:val="en-US"/>
+            </w:rPr>
+            <w:t>Antenna-theory.com</w:t>
+          </w:r>
+          <w:r>
+            <w:rPr>
+              <w:rFonts w:cs="Times New Roman"/>
+              <w:noProof/>
+              <w:lang w:val="en-US"/>
+            </w:rPr>
+            <w:t>.</w:t>
+          </w:r>
+          <w:r>
+            <w:rPr>
+              <w:rFonts w:cs="Times New Roman"/>
+              <w:noProof/>
+              <w:lang w:val="en-US"/>
+            </w:rPr>
+            <w:t xml:space="preserve"> https://www.antenna-theory.com/definitions/sparameters.php</w:t>
+          </w:r>
+        </w:p>
+        <w:p>
+          <w:pPr>
+            <w:widowControl w:val="0"/>
+            <w:autoSpaceDE w:val="0"/>
+            <w:autoSpaceDN w:val="0"/>
+            <w:adjustRightInd w:val="0"/>
+            <w:ind w:left="480" w:hanging="480"/>
+            <w:rPr>
+              <w:rFonts w:cs="Times New Roman"/>
+              <w:noProof/>
+              <w:lang w:val="en-US"/>
+            </w:rPr>
+          </w:pPr>
+          <w:r>
+            <w:rPr>
+              <w:rFonts w:cs="Times New Roman"/>
+              <w:i/>
+              <w:iCs/>
+              <w:noProof/>
+            </w:rPr>
+            <w:t xml:space="preserve">Microwaves101. </w:t>
+          </w:r>
+          <w:r>
+            <w:rPr>
+              <w:rFonts w:cs="Times New Roman"/>
+              <w:i/>
+              <w:iCs/>
+              <w:noProof/>
+              <w:lang w:val="en-US"/>
+            </w:rPr>
+            <w:t>(s</w:t>
+          </w:r>
+          <w:r>
+            <w:rPr>
+              <w:rFonts w:cs="Times New Roman"/>
+              <w:i/>
+              <w:iCs/>
+              <w:noProof/>
+              <w:lang w:val="en-US"/>
+            </w:rPr>
+            <w:t>.</w:t>
+          </w:r>
+          <w:r>
+            <w:rPr>
+              <w:rFonts w:cs="Times New Roman"/>
+              <w:i/>
+              <w:iCs/>
+              <w:noProof/>
+              <w:lang w:val="en-US"/>
+            </w:rPr>
+            <w:t>f.). S-parameters. https://www.microwaves101.com/encyclopedias/s-parameters</w:t>
+          </w:r>
+        </w:p>
+        <w:p>
+          <w:pPr>
+            <w:widowControl w:val="0"/>
+            <w:autoSpaceDE w:val="0"/>
+            <w:autoSpaceDN w:val="0"/>
+            <w:adjustRightInd w:val="0"/>
+            <w:ind w:left="480" w:hanging="480"/>
+            <w:rPr>
+              <w:rFonts w:cs="Times New Roman"/>
+              <w:noProof/>
+              <w:lang w:val="en-US"/>
+            </w:rPr>
+          </w:pPr>
+        </w:p>
+        <w:p>
+          <w:pPr>
+            <w:rPr>
+              <w:lang w:val="en-US"/>
+            </w:rPr>
+          </w:pPr>
+        </w:p>
         <w:p>
           <w:pPr>
             <w:widowControl w:val="0"/>
@@ -10086,15 +12288,15 @@
           <w:b/>
         </w:rPr>
       </w:pPr>
-      <w:bookmarkStart w:id="39" w:name="_Toc440985144"/>
-      <w:commentRangeStart w:id="40"/>
+      <w:bookmarkStart w:id="40" w:name="_Toc440985144"/>
+      <w:commentRangeStart w:id="41"/>
       <w:r>
         <w:rPr>
           <w:b/>
         </w:rPr>
         <w:t>A</w:t>
       </w:r>
-      <w:commentRangeEnd w:id="40"/>
+      <w:commentRangeEnd w:id="41"/>
       <w:r>
         <w:rPr>
           <w:rStyle w:val="Refdecomentario"/>
@@ -10102,7 +12304,7 @@
           <w:sz w:val="24"/>
           <w:szCs w:val="22"/>
         </w:rPr>
-        <w:commentReference w:id="40"/>
+        <w:commentReference w:id="41"/>
       </w:r>
       <w:r>
         <w:rPr>
@@ -10110,7 +12312,7 @@
         </w:rPr>
         <w:t>nexos</w:t>
       </w:r>
-      <w:bookmarkEnd w:id="39"/>
+      <w:bookmarkEnd w:id="40"/>
     </w:p>
     <w:p>
       <w:pPr>
@@ -11117,7 +13319,24 @@
       </w:r>
     </w:p>
   </w:comment>
-  <w:comment w:id="40" w:author="Autor" w:initials="A">
+  <w:comment w:id="33" w:author="Autor" w:initials="A">
+    <w:p>
+      <w:pPr>
+        <w:pStyle w:val="Textocomentario"/>
+        <w:jc w:val="left"/>
+      </w:pPr>
+      <w:r>
+        <w:rPr>
+          <w:rStyle w:val="Refdecomentario"/>
+        </w:rPr>
+        <w:annotationRef/>
+      </w:r>
+      <w:r>
+        <w:t>Estamos pendientes de obtener los datos verídicos por parte de la universidad de los estudiantes activos matriculados al semestre actual para delimitar la población de manera correcta.</w:t>
+      </w:r>
+    </w:p>
+  </w:comment>
+  <w:comment w:id="41" w:author="Autor" w:initials="A">
     <w:p>
       <w:pPr>
         <w:pStyle w:val="Textocomentario"/>
@@ -11205,6 +13424,7 @@
   <w15:commentEx w15:paraId="33EB55E0" w15:done="0"/>
   <w15:commentEx w15:paraId="278B3905" w15:done="0"/>
   <w15:commentEx w15:paraId="054A37B0" w15:done="0"/>
+  <w15:commentEx w15:paraId="7326038E" w15:done="0"/>
   <w15:commentEx w15:paraId="12DDE124" w15:done="0"/>
 </w15:commentsEx>
 </file>
@@ -11227,6 +13447,7 @@
   <w16cid:commentId w16cid:paraId="33EB55E0" w16cid:durableId="2B4B62E1"/>
   <w16cid:commentId w16cid:paraId="278B3905" w16cid:durableId="2B4B6F67"/>
   <w16cid:commentId w16cid:paraId="054A37B0" w16cid:durableId="2B4B6F7C"/>
+  <w16cid:commentId w16cid:paraId="7326038E" w16cid:durableId="42770BF9"/>
   <w16cid:commentId w16cid:paraId="12DDE124" w16cid:durableId="2B548902"/>
 </w16cid:commentsIds>
 </file>
@@ -15445,7 +17666,7 @@
   <w:style w:type="paragraph" w:default="1" w:styleId="Normal">
     <w:name w:val="Normal"/>
     <w:qFormat/>
-    <w:rsid w:val="00042255"/>
+    <w:rsid w:val="00A44D68"/>
     <w:pPr>
       <w:spacing w:after="0" w:line="360" w:lineRule="auto"/>
       <w:jc w:val="both"/>
@@ -17090,23 +19311,6 @@
 </file>
 
 <file path=customXml/item2.xml><?xml version="1.0" encoding="utf-8"?>
-<p:properties xmlns:p="http://schemas.microsoft.com/office/2006/metadata/properties" xmlns:xsi="http://www.w3.org/2001/XMLSchema-instance" xmlns:pc="http://schemas.microsoft.com/office/infopath/2007/PartnerControls">
-  <documentManagement>
-    <_activity xmlns="152b35e6-23a1-4beb-a1fd-2689778f6058" xsi:nil="true"/>
-  </documentManagement>
-</p:properties>
-</file>
-
-<file path=customXml/item3.xml><?xml version="1.0" encoding="utf-8"?>
-<?mso-contentType ?>
-<FormTemplates xmlns="http://schemas.microsoft.com/sharepoint/v3/contenttype/forms">
-  <Display>DocumentLibraryForm</Display>
-  <Edit>DocumentLibraryForm</Edit>
-  <New>DocumentLibraryForm</New>
-</FormTemplates>
-</file>
-
-<file path=customXml/item4.xml><?xml version="1.0" encoding="utf-8"?>
 <b:Sources xmlns:b="http://schemas.openxmlformats.org/officeDocument/2006/bibliography" xmlns="http://schemas.openxmlformats.org/officeDocument/2006/bibliography" SelectedStyle="\APASixthEditionOfficeOnline.xsl" StyleName="APA" Version="6">
   <b:Source>
     <b:Tag>Men90</b:Tag>
@@ -17941,6 +20145,23 @@
 </b:Sources>
 </file>
 
+<file path=customXml/item3.xml><?xml version="1.0" encoding="utf-8"?>
+<?mso-contentType ?>
+<FormTemplates xmlns="http://schemas.microsoft.com/sharepoint/v3/contenttype/forms">
+  <Display>DocumentLibraryForm</Display>
+  <Edit>DocumentLibraryForm</Edit>
+  <New>DocumentLibraryForm</New>
+</FormTemplates>
+</file>
+
+<file path=customXml/item4.xml><?xml version="1.0" encoding="utf-8"?>
+<p:properties xmlns:p="http://schemas.microsoft.com/office/2006/metadata/properties" xmlns:xsi="http://www.w3.org/2001/XMLSchema-instance" xmlns:pc="http://schemas.microsoft.com/office/infopath/2007/PartnerControls">
+  <documentManagement>
+    <_activity xmlns="152b35e6-23a1-4beb-a1fd-2689778f6058" xsi:nil="true"/>
+  </documentManagement>
+</p:properties>
+</file>
+
 <file path=customXml/itemProps1.xml><?xml version="1.0" encoding="utf-8"?>
 <ds:datastoreItem xmlns:ds="http://schemas.openxmlformats.org/officeDocument/2006/customXml" ds:itemID="{71334E21-6B6C-4687-847F-D6F99FF4EBD6}">
   <ds:schemaRefs>
@@ -17961,11 +20182,9 @@
 </file>
 
 <file path=customXml/itemProps2.xml><?xml version="1.0" encoding="utf-8"?>
-<ds:datastoreItem xmlns:ds="http://schemas.openxmlformats.org/officeDocument/2006/customXml" ds:itemID="{B58D4DAF-C7F0-4FA3-950B-89D41305B414}">
+<ds:datastoreItem xmlns:ds="http://schemas.openxmlformats.org/officeDocument/2006/customXml" ds:itemID="{27BD2DDD-D5B5-4DDA-B090-C036D7EEAD0E}">
   <ds:schemaRefs>
-    <ds:schemaRef ds:uri="http://schemas.microsoft.com/office/2006/metadata/properties"/>
-    <ds:schemaRef ds:uri="http://schemas.microsoft.com/office/infopath/2007/PartnerControls"/>
-    <ds:schemaRef ds:uri="152b35e6-23a1-4beb-a1fd-2689778f6058"/>
+    <ds:schemaRef ds:uri="http://schemas.openxmlformats.org/officeDocument/2006/bibliography"/>
   </ds:schemaRefs>
 </ds:datastoreItem>
 </file>
@@ -17979,9 +20198,11 @@
 </file>
 
 <file path=customXml/itemProps4.xml><?xml version="1.0" encoding="utf-8"?>
-<ds:datastoreItem xmlns:ds="http://schemas.openxmlformats.org/officeDocument/2006/customXml" ds:itemID="{27BD2DDD-D5B5-4DDA-B090-C036D7EEAD0E}">
+<ds:datastoreItem xmlns:ds="http://schemas.openxmlformats.org/officeDocument/2006/customXml" ds:itemID="{B58D4DAF-C7F0-4FA3-950B-89D41305B414}">
   <ds:schemaRefs>
-    <ds:schemaRef ds:uri="http://schemas.openxmlformats.org/officeDocument/2006/bibliography"/>
+    <ds:schemaRef ds:uri="http://schemas.microsoft.com/office/2006/metadata/properties"/>
+    <ds:schemaRef ds:uri="http://schemas.microsoft.com/office/infopath/2007/PartnerControls"/>
+    <ds:schemaRef ds:uri="152b35e6-23a1-4beb-a1fd-2689778f6058"/>
   </ds:schemaRefs>
 </ds:datastoreItem>
 </file>
</xml_diff>

<commit_message>
Corrección formato - Queda pendiente subir info de prototipo realizado
</commit_message>
<xml_diff>
--- a/Formato Proyecto Investigación.docx
+++ b/Formato Proyecto Investigación.docx
@@ -8009,21 +8009,7 @@
               <w:rFonts w:ascii="Cambria Math" w:hAnsi="Cambria Math" w:cs="Times New Roman"/>
               <w:szCs w:val="24"/>
             </w:rPr>
-            <m:t xml:space="preserve"> </m:t>
-          </m:r>
-          <m:r>
-            <w:rPr>
-              <w:rFonts w:ascii="Cambria Math" w:hAnsi="Cambria Math" w:cs="Times New Roman"/>
-              <w:szCs w:val="24"/>
-            </w:rPr>
-            <m:t xml:space="preserve"> </m:t>
-          </m:r>
-          <m:r>
-            <w:rPr>
-              <w:rFonts w:ascii="Cambria Math" w:hAnsi="Cambria Math" w:cs="Times New Roman"/>
-              <w:szCs w:val="24"/>
-            </w:rPr>
-            <m:t>(1)</m:t>
+            <m:t xml:space="preserve">  (1)</m:t>
           </m:r>
         </m:oMath>
       </m:oMathPara>
@@ -8525,27 +8511,14 @@
                             <w:r>
                               <w:t xml:space="preserve">Figura </w:t>
                             </w:r>
-                            <w:r>
-                              <w:fldChar w:fldCharType="begin"/>
-                            </w:r>
-                            <w:r>
-                              <w:instrText xml:space="preserve"> SEQ Figura \* ARABIC </w:instrText>
-                            </w:r>
-                            <w:r>
-                              <w:fldChar w:fldCharType="separate"/>
-                            </w:r>
-                            <w:r>
-                              <w:rPr>
-                                <w:noProof/>
-                              </w:rPr>
-                              <w:t>1</w:t>
-                            </w:r>
-                            <w:r>
-                              <w:rPr>
-                                <w:noProof/>
-                              </w:rPr>
-                              <w:fldChar w:fldCharType="end"/>
-                            </w:r>
+                            <w:fldSimple w:instr=" SEQ Figura \* ARABIC ">
+                              <w:r>
+                                <w:rPr>
+                                  <w:noProof/>
+                                </w:rPr>
+                                <w:t>1</w:t>
+                              </w:r>
+                            </w:fldSimple>
                             <w:r>
                               <w:t xml:space="preserve">. </w:t>
                             </w:r>
@@ -8592,27 +8565,14 @@
                       <w:r>
                         <w:t xml:space="preserve">Figura </w:t>
                       </w:r>
-                      <w:r>
-                        <w:fldChar w:fldCharType="begin"/>
-                      </w:r>
-                      <w:r>
-                        <w:instrText xml:space="preserve"> SEQ Figura \* ARABIC </w:instrText>
-                      </w:r>
-                      <w:r>
-                        <w:fldChar w:fldCharType="separate"/>
-                      </w:r>
-                      <w:r>
-                        <w:rPr>
-                          <w:noProof/>
-                        </w:rPr>
-                        <w:t>1</w:t>
-                      </w:r>
-                      <w:r>
-                        <w:rPr>
-                          <w:noProof/>
-                        </w:rPr>
-                        <w:fldChar w:fldCharType="end"/>
-                      </w:r>
+                      <w:fldSimple w:instr=" SEQ Figura \* ARABIC ">
+                        <w:r>
+                          <w:rPr>
+                            <w:noProof/>
+                          </w:rPr>
+                          <w:t>1</w:t>
+                        </w:r>
+                      </w:fldSimple>
                       <w:r>
                         <w:t xml:space="preserve">. </w:t>
                       </w:r>
@@ -9932,7 +9892,10 @@
                                             <m:ctrlPr>
                                               <w:rPr>
                                                 <w:rFonts w:ascii="Cambria Math" w:hAnsi="Cambria Math"/>
+                                                <w:b/>
+                                                <w:bCs/>
                                                 <w:i/>
+                                                <w:color w:val="000000" w:themeColor="text1"/>
                                                 <w:sz w:val="44"/>
                                                 <w:szCs w:val="44"/>
                                                 <w14:textOutline w14:w="9525" w14:cap="rnd" w14:cmpd="sng" w14:algn="ctr">
@@ -9950,7 +9913,10 @@
                                                   <m:ctrlPr>
                                                     <w:rPr>
                                                       <w:rFonts w:ascii="Cambria Math" w:hAnsi="Cambria Math"/>
+                                                      <w:b/>
+                                                      <w:bCs/>
                                                       <w:i/>
+                                                      <w:color w:val="000000" w:themeColor="text1"/>
                                                       <w:sz w:val="44"/>
                                                       <w:szCs w:val="44"/>
                                                       <w14:textOutline w14:w="9525" w14:cap="rnd" w14:cmpd="sng" w14:algn="ctr">
@@ -9963,8 +9929,12 @@
                                                 </m:sSubPr>
                                                 <m:e>
                                                   <m:r>
+                                                    <m:rPr>
+                                                      <m:sty m:val="bi"/>
+                                                    </m:rPr>
                                                     <w:rPr>
                                                       <w:rFonts w:ascii="Cambria Math" w:hAnsi="Cambria Math"/>
+                                                      <w:color w:val="000000" w:themeColor="text1"/>
                                                       <w:sz w:val="44"/>
                                                       <w:szCs w:val="44"/>
                                                       <w14:textOutline w14:w="9525" w14:cap="rnd" w14:cmpd="sng" w14:algn="ctr">
@@ -9978,8 +9948,12 @@
                                                 </m:e>
                                                 <m:sub>
                                                   <m:r>
+                                                    <m:rPr>
+                                                      <m:sty m:val="bi"/>
+                                                    </m:rPr>
                                                     <w:rPr>
                                                       <w:rFonts w:ascii="Cambria Math" w:hAnsi="Cambria Math"/>
+                                                      <w:color w:val="000000" w:themeColor="text1"/>
                                                       <w:sz w:val="44"/>
                                                       <w:szCs w:val="44"/>
                                                       <w14:textOutline w14:w="9525" w14:cap="rnd" w14:cmpd="sng" w14:algn="ctr">
@@ -9999,7 +9973,10 @@
                                                   <m:ctrlPr>
                                                     <w:rPr>
                                                       <w:rFonts w:ascii="Cambria Math" w:hAnsi="Cambria Math"/>
+                                                      <w:b/>
+                                                      <w:bCs/>
                                                       <w:i/>
+                                                      <w:color w:val="000000" w:themeColor="text1"/>
                                                       <w:sz w:val="44"/>
                                                       <w:szCs w:val="44"/>
                                                       <w14:textOutline w14:w="9525" w14:cap="rnd" w14:cmpd="sng" w14:algn="ctr">
@@ -10012,8 +9989,12 @@
                                                 </m:sSubPr>
                                                 <m:e>
                                                   <m:r>
+                                                    <m:rPr>
+                                                      <m:sty m:val="bi"/>
+                                                    </m:rPr>
                                                     <w:rPr>
                                                       <w:rFonts w:ascii="Cambria Math" w:hAnsi="Cambria Math"/>
+                                                      <w:color w:val="000000" w:themeColor="text1"/>
                                                       <w:sz w:val="44"/>
                                                       <w:szCs w:val="44"/>
                                                       <w14:textOutline w14:w="9525" w14:cap="rnd" w14:cmpd="sng" w14:algn="ctr">
@@ -10027,8 +10008,12 @@
                                                 </m:e>
                                                 <m:sub>
                                                   <m:r>
+                                                    <m:rPr>
+                                                      <m:sty m:val="bi"/>
+                                                    </m:rPr>
                                                     <w:rPr>
                                                       <w:rFonts w:ascii="Cambria Math" w:hAnsi="Cambria Math"/>
+                                                      <w:color w:val="000000" w:themeColor="text1"/>
                                                       <w:sz w:val="44"/>
                                                       <w:szCs w:val="44"/>
                                                       <w14:textOutline w14:w="9525" w14:cap="rnd" w14:cmpd="sng" w14:algn="ctr">
@@ -10050,7 +10035,10 @@
                                                   <m:ctrlPr>
                                                     <w:rPr>
                                                       <w:rFonts w:ascii="Cambria Math" w:hAnsi="Cambria Math"/>
+                                                      <w:b/>
+                                                      <w:bCs/>
                                                       <w:i/>
+                                                      <w:color w:val="000000" w:themeColor="text1"/>
                                                       <w:sz w:val="44"/>
                                                       <w:szCs w:val="44"/>
                                                       <w14:textOutline w14:w="9525" w14:cap="rnd" w14:cmpd="sng" w14:algn="ctr">
@@ -10063,8 +10051,12 @@
                                                 </m:sSubPr>
                                                 <m:e>
                                                   <m:r>
+                                                    <m:rPr>
+                                                      <m:sty m:val="bi"/>
+                                                    </m:rPr>
                                                     <w:rPr>
                                                       <w:rFonts w:ascii="Cambria Math" w:hAnsi="Cambria Math"/>
+                                                      <w:color w:val="000000" w:themeColor="text1"/>
                                                       <w:sz w:val="44"/>
                                                       <w:szCs w:val="44"/>
                                                       <w14:textOutline w14:w="9525" w14:cap="rnd" w14:cmpd="sng" w14:algn="ctr">
@@ -10078,8 +10070,12 @@
                                                 </m:e>
                                                 <m:sub>
                                                   <m:r>
+                                                    <m:rPr>
+                                                      <m:sty m:val="bi"/>
+                                                    </m:rPr>
                                                     <w:rPr>
                                                       <w:rFonts w:ascii="Cambria Math" w:hAnsi="Cambria Math"/>
+                                                      <w:color w:val="000000" w:themeColor="text1"/>
                                                       <w:sz w:val="44"/>
                                                       <w:szCs w:val="44"/>
                                                       <w14:textOutline w14:w="9525" w14:cap="rnd" w14:cmpd="sng" w14:algn="ctr">
@@ -10099,7 +10095,10 @@
                                                   <m:ctrlPr>
                                                     <w:rPr>
                                                       <w:rFonts w:ascii="Cambria Math" w:hAnsi="Cambria Math"/>
+                                                      <w:b/>
+                                                      <w:bCs/>
                                                       <w:i/>
+                                                      <w:color w:val="000000" w:themeColor="text1"/>
                                                       <w:sz w:val="44"/>
                                                       <w:szCs w:val="44"/>
                                                       <w14:textOutline w14:w="9525" w14:cap="rnd" w14:cmpd="sng" w14:algn="ctr">
@@ -10112,8 +10111,12 @@
                                                 </m:sSubPr>
                                                 <m:e>
                                                   <m:r>
+                                                    <m:rPr>
+                                                      <m:sty m:val="bi"/>
+                                                    </m:rPr>
                                                     <w:rPr>
                                                       <w:rFonts w:ascii="Cambria Math" w:hAnsi="Cambria Math"/>
+                                                      <w:color w:val="000000" w:themeColor="text1"/>
                                                       <w:sz w:val="44"/>
                                                       <w:szCs w:val="44"/>
                                                       <w14:textOutline w14:w="9525" w14:cap="rnd" w14:cmpd="sng" w14:algn="ctr">
@@ -10127,8 +10130,12 @@
                                                 </m:e>
                                                 <m:sub>
                                                   <m:r>
+                                                    <m:rPr>
+                                                      <m:sty m:val="bi"/>
+                                                    </m:rPr>
                                                     <w:rPr>
                                                       <w:rFonts w:ascii="Cambria Math" w:hAnsi="Cambria Math"/>
+                                                      <w:color w:val="000000" w:themeColor="text1"/>
                                                       <w:sz w:val="44"/>
                                                       <w:szCs w:val="44"/>
                                                       <w14:textOutline w14:w="9525" w14:cap="rnd" w14:cmpd="sng" w14:algn="ctr">
@@ -10354,7 +10361,10 @@
                                       <m:ctrlPr>
                                         <w:rPr>
                                           <w:rFonts w:ascii="Cambria Math" w:hAnsi="Cambria Math"/>
+                                          <w:b/>
+                                          <w:bCs/>
                                           <w:i/>
+                                          <w:color w:val="000000" w:themeColor="text1"/>
                                           <w:sz w:val="44"/>
                                           <w:szCs w:val="44"/>
                                           <w14:textOutline w14:w="9525" w14:cap="rnd" w14:cmpd="sng" w14:algn="ctr">
@@ -10372,7 +10382,10 @@
                                             <m:ctrlPr>
                                               <w:rPr>
                                                 <w:rFonts w:ascii="Cambria Math" w:hAnsi="Cambria Math"/>
+                                                <w:b/>
+                                                <w:bCs/>
                                                 <w:i/>
+                                                <w:color w:val="000000" w:themeColor="text1"/>
                                                 <w:sz w:val="44"/>
                                                 <w:szCs w:val="44"/>
                                                 <w14:textOutline w14:w="9525" w14:cap="rnd" w14:cmpd="sng" w14:algn="ctr">
@@ -10385,8 +10398,12 @@
                                           </m:sSubPr>
                                           <m:e>
                                             <m:r>
+                                              <m:rPr>
+                                                <m:sty m:val="bi"/>
+                                              </m:rPr>
                                               <w:rPr>
                                                 <w:rFonts w:ascii="Cambria Math" w:hAnsi="Cambria Math"/>
+                                                <w:color w:val="000000" w:themeColor="text1"/>
                                                 <w:sz w:val="44"/>
                                                 <w:szCs w:val="44"/>
                                                 <w14:textOutline w14:w="9525" w14:cap="rnd" w14:cmpd="sng" w14:algn="ctr">
@@ -10400,8 +10417,12 @@
                                           </m:e>
                                           <m:sub>
                                             <m:r>
+                                              <m:rPr>
+                                                <m:sty m:val="bi"/>
+                                              </m:rPr>
                                               <w:rPr>
                                                 <w:rFonts w:ascii="Cambria Math" w:hAnsi="Cambria Math"/>
+                                                <w:color w:val="000000" w:themeColor="text1"/>
                                                 <w:sz w:val="44"/>
                                                 <w:szCs w:val="44"/>
                                                 <w14:textOutline w14:w="9525" w14:cap="rnd" w14:cmpd="sng" w14:algn="ctr">
@@ -10421,7 +10442,10 @@
                                             <m:ctrlPr>
                                               <w:rPr>
                                                 <w:rFonts w:ascii="Cambria Math" w:hAnsi="Cambria Math"/>
+                                                <w:b/>
+                                                <w:bCs/>
                                                 <w:i/>
+                                                <w:color w:val="000000" w:themeColor="text1"/>
                                                 <w:sz w:val="44"/>
                                                 <w:szCs w:val="44"/>
                                                 <w14:textOutline w14:w="9525" w14:cap="rnd" w14:cmpd="sng" w14:algn="ctr">
@@ -10434,8 +10458,12 @@
                                           </m:sSubPr>
                                           <m:e>
                                             <m:r>
+                                              <m:rPr>
+                                                <m:sty m:val="bi"/>
+                                              </m:rPr>
                                               <w:rPr>
                                                 <w:rFonts w:ascii="Cambria Math" w:hAnsi="Cambria Math"/>
+                                                <w:color w:val="000000" w:themeColor="text1"/>
                                                 <w:sz w:val="44"/>
                                                 <w:szCs w:val="44"/>
                                                 <w14:textOutline w14:w="9525" w14:cap="rnd" w14:cmpd="sng" w14:algn="ctr">
@@ -10449,8 +10477,12 @@
                                           </m:e>
                                           <m:sub>
                                             <m:r>
+                                              <m:rPr>
+                                                <m:sty m:val="bi"/>
+                                              </m:rPr>
                                               <w:rPr>
                                                 <w:rFonts w:ascii="Cambria Math" w:hAnsi="Cambria Math"/>
+                                                <w:color w:val="000000" w:themeColor="text1"/>
                                                 <w:sz w:val="44"/>
                                                 <w:szCs w:val="44"/>
                                                 <w14:textOutline w14:w="9525" w14:cap="rnd" w14:cmpd="sng" w14:algn="ctr">
@@ -10472,7 +10504,10 @@
                                             <m:ctrlPr>
                                               <w:rPr>
                                                 <w:rFonts w:ascii="Cambria Math" w:hAnsi="Cambria Math"/>
+                                                <w:b/>
+                                                <w:bCs/>
                                                 <w:i/>
+                                                <w:color w:val="000000" w:themeColor="text1"/>
                                                 <w:sz w:val="44"/>
                                                 <w:szCs w:val="44"/>
                                                 <w14:textOutline w14:w="9525" w14:cap="rnd" w14:cmpd="sng" w14:algn="ctr">
@@ -10485,8 +10520,12 @@
                                           </m:sSubPr>
                                           <m:e>
                                             <m:r>
+                                              <m:rPr>
+                                                <m:sty m:val="bi"/>
+                                              </m:rPr>
                                               <w:rPr>
                                                 <w:rFonts w:ascii="Cambria Math" w:hAnsi="Cambria Math"/>
+                                                <w:color w:val="000000" w:themeColor="text1"/>
                                                 <w:sz w:val="44"/>
                                                 <w:szCs w:val="44"/>
                                                 <w14:textOutline w14:w="9525" w14:cap="rnd" w14:cmpd="sng" w14:algn="ctr">
@@ -10500,8 +10539,12 @@
                                           </m:e>
                                           <m:sub>
                                             <m:r>
+                                              <m:rPr>
+                                                <m:sty m:val="bi"/>
+                                              </m:rPr>
                                               <w:rPr>
                                                 <w:rFonts w:ascii="Cambria Math" w:hAnsi="Cambria Math"/>
+                                                <w:color w:val="000000" w:themeColor="text1"/>
                                                 <w:sz w:val="44"/>
                                                 <w:szCs w:val="44"/>
                                                 <w14:textOutline w14:w="9525" w14:cap="rnd" w14:cmpd="sng" w14:algn="ctr">
@@ -10521,7 +10564,10 @@
                                             <m:ctrlPr>
                                               <w:rPr>
                                                 <w:rFonts w:ascii="Cambria Math" w:hAnsi="Cambria Math"/>
+                                                <w:b/>
+                                                <w:bCs/>
                                                 <w:i/>
+                                                <w:color w:val="000000" w:themeColor="text1"/>
                                                 <w:sz w:val="44"/>
                                                 <w:szCs w:val="44"/>
                                                 <w14:textOutline w14:w="9525" w14:cap="rnd" w14:cmpd="sng" w14:algn="ctr">
@@ -10534,8 +10580,12 @@
                                           </m:sSubPr>
                                           <m:e>
                                             <m:r>
+                                              <m:rPr>
+                                                <m:sty m:val="bi"/>
+                                              </m:rPr>
                                               <w:rPr>
                                                 <w:rFonts w:ascii="Cambria Math" w:hAnsi="Cambria Math"/>
+                                                <w:color w:val="000000" w:themeColor="text1"/>
                                                 <w:sz w:val="44"/>
                                                 <w:szCs w:val="44"/>
                                                 <w14:textOutline w14:w="9525" w14:cap="rnd" w14:cmpd="sng" w14:algn="ctr">
@@ -10549,8 +10599,12 @@
                                           </m:e>
                                           <m:sub>
                                             <m:r>
+                                              <m:rPr>
+                                                <m:sty m:val="bi"/>
+                                              </m:rPr>
                                               <w:rPr>
                                                 <w:rFonts w:ascii="Cambria Math" w:hAnsi="Cambria Math"/>
+                                                <w:color w:val="000000" w:themeColor="text1"/>
                                                 <w:sz w:val="44"/>
                                                 <w:szCs w:val="44"/>
                                                 <w14:textOutline w14:w="9525" w14:cap="rnd" w14:cmpd="sng" w14:algn="ctr">
@@ -13266,14 +13320,7 @@
               <w:rFonts w:ascii="Cambria Math" w:hAnsi="Cambria Math" w:cs="Times New Roman"/>
               <w:szCs w:val="24"/>
             </w:rPr>
-            <m:t xml:space="preserve"> </m:t>
-          </m:r>
-          <m:r>
-            <w:rPr>
-              <w:rFonts w:ascii="Cambria Math" w:hAnsi="Cambria Math" w:cs="Times New Roman"/>
-              <w:szCs w:val="24"/>
-            </w:rPr>
-            <m:t>(4)</m:t>
+            <m:t xml:space="preserve"> (4)</m:t>
           </m:r>
         </m:oMath>
       </m:oMathPara>
@@ -13794,6 +13841,9 @@
             </m:sub>
           </m:sSub>
           <m:r>
+            <m:rPr>
+              <m:sty m:val="bi"/>
+            </m:rPr>
             <w:rPr>
               <w:rFonts w:ascii="Cambria Math" w:hAnsi="Cambria Math"/>
             </w:rPr>
@@ -14303,6 +14353,9 @@
             </m:sup>
           </m:sSup>
           <m:r>
+            <m:rPr>
+              <m:sty m:val="bi"/>
+            </m:rPr>
             <w:rPr>
               <w:rFonts w:ascii="Cambria Math" w:eastAsiaTheme="minorHAnsi" w:hAnsi="Cambria Math" w:cs="Times New Roman"/>
               <w:szCs w:val="24"/>
@@ -15158,16 +15211,7 @@
             <w:rPr>
               <w:rFonts w:ascii="Cambria Math" w:eastAsiaTheme="minorEastAsia" w:hAnsi="Cambria Math" w:cs="Times New Roman"/>
             </w:rPr>
-            <m:t>G= ηD</m:t>
-          </m:r>
-          <m:r>
-            <m:rPr>
-              <m:sty m:val="bi"/>
-            </m:rPr>
-            <w:rPr>
-              <w:rFonts w:ascii="Cambria Math" w:eastAsiaTheme="minorEastAsia" w:hAnsi="Cambria Math" w:cs="Times New Roman"/>
-            </w:rPr>
-            <m:t xml:space="preserve">  </m:t>
+            <m:t xml:space="preserve">G= ηD  </m:t>
           </m:r>
           <m:r>
             <w:rPr>
@@ -15549,13 +15593,7 @@
         <w:rPr>
           <w:rFonts w:eastAsiaTheme="minorEastAsia"/>
         </w:rPr>
-        <w:t xml:space="preserve">na antena puede ser muy </w:t>
-      </w:r>
-      <w:r>
-        <w:rPr>
-          <w:rFonts w:eastAsiaTheme="minorEastAsia"/>
-        </w:rPr>
-        <w:t>directiva,</w:t>
+        <w:t>na antena puede ser muy directiva,</w:t>
       </w:r>
       <w:r>
         <w:rPr>
@@ -15924,11 +15962,6 @@
           <w:rFonts w:eastAsiaTheme="minorEastAsia" w:cs="Times New Roman"/>
         </w:rPr>
         <w:tab/>
-      </w:r>
-      <w:r>
-        <w:rPr>
-          <w:rFonts w:eastAsiaTheme="minorEastAsia" w:cs="Times New Roman"/>
-        </w:rPr>
         <w:t>Las bandas ISM (Industrial, Scientific and Medical) son porciones del espectro radioeléctrico reservadas internacionalmente para aplicaciones industriales, científicas y médicas, sin necesidad de licencias individuales para su uso</w:t>
       </w:r>
       <w:r>
@@ -15995,24 +16028,14 @@
       <w:r>
         <w:t xml:space="preserve">Tabla </w:t>
       </w:r>
-      <w:r>
-        <w:fldChar w:fldCharType="begin"/>
-      </w:r>
-      <w:r>
-        <w:instrText xml:space="preserve"> SEQ Tabla \* ARABIC </w:instrText>
-      </w:r>
-      <w:r>
-        <w:fldChar w:fldCharType="separate"/>
-      </w:r>
-      <w:r>
-        <w:rPr>
-          <w:noProof/>
-        </w:rPr>
-        <w:t>1</w:t>
-      </w:r>
-      <w:r>
-        <w:fldChar w:fldCharType="end"/>
-      </w:r>
+      <w:fldSimple w:instr=" SEQ Tabla \* ARABIC ">
+        <w:r>
+          <w:rPr>
+            <w:noProof/>
+          </w:rPr>
+          <w:t>1</w:t>
+        </w:r>
+      </w:fldSimple>
       <w:r>
         <w:t xml:space="preserve"> </w:t>
       </w:r>
@@ -16475,6 +16498,22 @@
     </w:p>
     <w:p>
       <w:pPr>
+        <w:ind w:left="708"/>
+        <w:rPr>
+          <w:rFonts w:cs="Times New Roman"/>
+        </w:rPr>
+      </w:pPr>
+    </w:p>
+    <w:p>
+      <w:pPr>
+        <w:ind w:left="708"/>
+        <w:rPr>
+          <w:rFonts w:cs="Times New Roman"/>
+        </w:rPr>
+      </w:pPr>
+    </w:p>
+    <w:p>
+      <w:pPr>
         <w:ind w:firstLine="708"/>
         <w:jc w:val="left"/>
         <w:rPr>
@@ -16500,6 +16539,7 @@
           <w:bCs/>
           <w:szCs w:val="24"/>
         </w:rPr>
+        <w:lastRenderedPageBreak/>
         <w:t>6.</w:t>
       </w:r>
       <w:r>
@@ -16554,13 +16594,70 @@
     </w:p>
     <w:p>
       <w:pPr>
-        <w:rPr>
-          <w:rFonts w:cs="Times New Roman"/>
+        <w:ind w:firstLine="708"/>
+      </w:pPr>
+      <w:r>
+        <w:t xml:space="preserve">El desarrollo de antenas RFID flexibles ha avanzado significativamente gracias al uso de nuevos materiales conductores basados en nanomateriales, los cuales permiten mejorar la conductividad eléctrica y reducir el costo de fabricación. Entre los materiales más utilizados se encuentran el grafeno, los nanotubos de carbono y las nanopartículas metálicas, especialmente plata, cobre y oro. En este sentido, se señala que estas etiquetas pueden fabricarse “based on nanomaterials including multilayer graphene, carbon nanotubes, gold, silver and copper nanoparticles” (Khan et al., 2023) . Esta afirmación demuestra que el desarrollo de antenas RFID modernas no se limita únicamente al cobre tradicional, sino que también incorpora materiales más avanzados que permiten fabricar dispositivos más flexibles, ligeros y eficientes. </w:t>
+      </w:r>
+    </w:p>
+    <w:p>
+      <w:pPr>
+        <w:ind w:firstLine="708"/>
+      </w:pPr>
+    </w:p>
+    <w:p>
+      <w:pPr>
+        <w:ind w:firstLine="708"/>
+      </w:pPr>
+      <w:r>
+        <w:t>Además, el uso de estos materiales en forma de tinta conductora ha permitido desarrollar nuevas técnicas de fabricación basadas en la impresión electrónica, lo que facilita la producción de antenas directamente sobre superficies como papel, plástico o textiles. Esto resulta especialmente importante en aplicaciones donde se requiere bajo costo y facilidad de producción, como en los sistemas automatizados de bibliotecas, ya que permite fabricar etiquetas delgadas, económicas y fáciles de implementar sin afectar su funcionamiento (Khan et al., 2023)</w:t>
+      </w:r>
+      <w:r>
+        <w:t>.</w:t>
+      </w:r>
+    </w:p>
+    <w:p>
+      <w:pPr>
+        <w:ind w:firstLine="708"/>
+      </w:pPr>
+    </w:p>
+    <w:p>
+      <w:pPr>
+        <w:ind w:firstLine="708"/>
+      </w:pPr>
+      <w:r>
+        <w:t xml:space="preserve">El desarrollo de antenas RFID flexibles ha avanzado considerablemente gracias al uso de nuevas técnicas de fabricación basadas en la impresión electrónica y en el uso de materiales conductores modernos. En este sentido, se propone una antena RFID flexible impresa mediante tecnología, lo que permite reducir el costo de fabricación y facilitar la producción en grandes cantidades. El artículo explica que la antena se fabrica utilizando </w:t>
+      </w:r>
+      <w:r>
+        <w:rPr>
           <w:b/>
           <w:bCs/>
-          <w:szCs w:val="24"/>
-        </w:rPr>
-      </w:pPr>
+        </w:rPr>
+        <w:t>tinta conductora basada en nanopartículas de plata</w:t>
+      </w:r>
+      <w:r>
+        <w:t>, ya que la estructura “is printed on photo paper using silver nanoparticle conductive ink” (Islam et al., 2018) . Esta afirmación demuestra que el uso de nanopartículas metálicas, especialmente la plata, es uno de los métodos más utilizados actualmente para mejorar la conductividad eléctrica y el rendimiento de las antenas RFID modernas.</w:t>
+      </w:r>
+    </w:p>
+    <w:p>
+      <w:pPr>
+        <w:ind w:firstLine="708"/>
+      </w:pPr>
+    </w:p>
+    <w:p>
+      <w:pPr>
+        <w:ind w:firstLine="708"/>
+      </w:pPr>
+      <w:r>
+        <w:lastRenderedPageBreak/>
+        <w:t>Además, el mismo estudio señala que las nuevas técnicas de impresión permiten fabricar antenas directamente sobre materiales flexibles como papel fotográfico, lo que facilita el desarrollo de etiquetas ligeras, económicas y fáciles de producir. El artículo también menciona que el uso de tintas conductoras no se limita únicamente a la plata, sino que también se emplean otros materiales como nanotubos de carbono y diferentes tipos de partículas conductoras para mejorar la eficiencia y la flexibilidad de las antenas RFID (Islam et al., 2018</w:t>
+      </w:r>
+      <w:r>
+        <w:t>)</w:t>
+      </w:r>
+      <w:r>
+        <w:t>.</w:t>
+      </w:r>
     </w:p>
     <w:p>
       <w:pPr>
@@ -17012,7 +17109,22 @@
           <w:rFonts w:cs="Times New Roman"/>
           <w:szCs w:val="24"/>
         </w:rPr>
-        <w:t>. Por lo tanto, su uso en entornos como bibliotecas es seguro desde el punto de vista de exposición electromagnética, sin representar riesgos para los usuarios.</w:t>
+        <w:t xml:space="preserve">. Por lo tanto, su uso en entornos como </w:t>
+      </w:r>
+      <w:r>
+        <w:rPr>
+          <w:rFonts w:cs="Times New Roman"/>
+          <w:szCs w:val="24"/>
+        </w:rPr>
+        <w:lastRenderedPageBreak/>
+        <w:t>bibliotecas es seguro desde el punto de vista de exposición electromagnética, sin representar riesgos para los usuarios.</w:t>
+      </w:r>
+      <w:r>
+        <w:rPr>
+          <w:rFonts w:cs="Times New Roman"/>
+          <w:szCs w:val="24"/>
+        </w:rPr>
+        <w:t>3</w:t>
       </w:r>
     </w:p>
     <w:p>
@@ -17572,31 +17684,7 @@
                 <w:rPr>
                   <w:rFonts w:ascii="Cambria Math" w:hAnsi="Cambria Math"/>
                 </w:rPr>
-                <m:t xml:space="preserve"> 0,5</m:t>
-              </m:r>
-              <m:r>
-                <w:rPr>
-                  <w:rFonts w:ascii="Cambria Math" w:hAnsi="Cambria Math"/>
-                </w:rPr>
-                <m:t>*</m:t>
-              </m:r>
-              <m:r>
-                <w:rPr>
-                  <w:rFonts w:ascii="Cambria Math" w:hAnsi="Cambria Math"/>
-                </w:rPr>
-                <m:t>0,5</m:t>
-              </m:r>
-              <m:r>
-                <w:rPr>
-                  <w:rFonts w:ascii="Cambria Math" w:hAnsi="Cambria Math"/>
-                </w:rPr>
-                <m:t xml:space="preserve"> </m:t>
-              </m:r>
-              <m:r>
-                <w:rPr>
-                  <w:rFonts w:ascii="Cambria Math" w:hAnsi="Cambria Math"/>
-                </w:rPr>
-                <m:t>1670</m:t>
+                <m:t xml:space="preserve"> 0,5*0,5 1670</m:t>
               </m:r>
             </m:num>
             <m:den>
@@ -17640,13 +17728,7 @@
                     <w:rPr>
                       <w:rFonts w:ascii="Cambria Math" w:hAnsi="Cambria Math"/>
                     </w:rPr>
-                    <m:t>1670</m:t>
-                  </m:r>
-                  <m:r>
-                    <w:rPr>
-                      <w:rFonts w:ascii="Cambria Math" w:hAnsi="Cambria Math"/>
-                    </w:rPr>
-                    <m:t>-1</m:t>
+                    <m:t>1670-1</m:t>
                   </m:r>
                 </m:e>
               </m:d>
@@ -17686,19 +17768,7 @@
                 <w:rPr>
                   <w:rFonts w:ascii="Cambria Math" w:hAnsi="Cambria Math"/>
                 </w:rPr>
-                <m:t xml:space="preserve"> 0,5</m:t>
-              </m:r>
-              <m:r>
-                <w:rPr>
-                  <w:rFonts w:ascii="Cambria Math" w:hAnsi="Cambria Math"/>
-                </w:rPr>
-                <m:t>*</m:t>
-              </m:r>
-              <m:r>
-                <w:rPr>
-                  <w:rFonts w:ascii="Cambria Math" w:hAnsi="Cambria Math"/>
-                </w:rPr>
-                <m:t>0,5</m:t>
+                <m:t xml:space="preserve"> 0,5*0,5</m:t>
               </m:r>
             </m:den>
           </m:f>
@@ -17706,13 +17776,7 @@
             <w:rPr>
               <w:rFonts w:ascii="Cambria Math" w:hAnsi="Cambria Math"/>
             </w:rPr>
-            <m:t xml:space="preserve">= </m:t>
-          </m:r>
-          <m:r>
-            <w:rPr>
-              <w:rFonts w:ascii="Cambria Math" w:hAnsi="Cambria Math"/>
-            </w:rPr>
-            <m:t>90,87 ≈91</m:t>
+            <m:t>= 90,87 ≈91</m:t>
           </m:r>
         </m:oMath>
       </m:oMathPara>
@@ -18098,27 +18162,14 @@
       <w:r>
         <w:t xml:space="preserve">Tabla </w:t>
       </w:r>
-      <w:r>
-        <w:fldChar w:fldCharType="begin"/>
-      </w:r>
-      <w:r>
-        <w:instrText xml:space="preserve"> SEQ Tabla \* ARABIC </w:instrText>
-      </w:r>
-      <w:r>
-        <w:fldChar w:fldCharType="separate"/>
-      </w:r>
-      <w:r>
-        <w:rPr>
-          <w:noProof/>
-        </w:rPr>
-        <w:t>2</w:t>
-      </w:r>
-      <w:r>
-        <w:rPr>
-          <w:noProof/>
-        </w:rPr>
-        <w:fldChar w:fldCharType="end"/>
-      </w:r>
+      <w:fldSimple w:instr=" SEQ Tabla \* ARABIC ">
+        <w:r>
+          <w:rPr>
+            <w:noProof/>
+          </w:rPr>
+          <w:t>2</w:t>
+        </w:r>
+      </w:fldSimple>
       <w:r>
         <w:t xml:space="preserve">. </w:t>
       </w:r>
@@ -18175,7 +18226,7 @@
         <w:trPr>
           <w:gridAfter w:val="1"/>
           <w:wAfter w:w="36" w:type="dxa"/>
-          <w:trHeight w:val="408"/>
+          <w:trHeight w:val="458"/>
         </w:trPr>
         <w:tc>
           <w:tcPr>
@@ -20095,24 +20146,14 @@
       <w:r>
         <w:t xml:space="preserve">Tabla </w:t>
       </w:r>
-      <w:r>
-        <w:fldChar w:fldCharType="begin"/>
-      </w:r>
-      <w:r>
-        <w:instrText xml:space="preserve"> SEQ Tabla \* ARABIC </w:instrText>
-      </w:r>
-      <w:r>
-        <w:fldChar w:fldCharType="separate"/>
-      </w:r>
-      <w:r>
-        <w:rPr>
-          <w:noProof/>
-        </w:rPr>
-        <w:t>3</w:t>
-      </w:r>
-      <w:r>
-        <w:fldChar w:fldCharType="end"/>
-      </w:r>
+      <w:fldSimple w:instr=" SEQ Tabla \* ARABIC ">
+        <w:r>
+          <w:rPr>
+            <w:noProof/>
+          </w:rPr>
+          <w:t>3</w:t>
+        </w:r>
+      </w:fldSimple>
       <w:r>
         <w:t xml:space="preserve"> </w:t>
       </w:r>
@@ -20223,42 +20264,313 @@
     </w:p>
     <w:p>
       <w:pPr>
+        <w:spacing w:after="160" w:line="259" w:lineRule="auto"/>
         <w:ind w:firstLine="708"/>
         <w:rPr>
+          <w:rFonts w:cs="Times New Roman"/>
+          <w:szCs w:val="24"/>
+        </w:rPr>
+      </w:pPr>
+      <w:bookmarkStart w:id="39" w:name="_Toc440985141"/>
+      <w:r>
+        <w:rPr>
+          <w:rFonts w:cs="Times New Roman"/>
+          <w:szCs w:val="24"/>
+        </w:rPr>
+        <w:t>El análisis de las entrevistas permite observar tres realidades institucionales diferentes: la Biblioteca Pública Piloto, la Biblioteca EPM y la biblioteca de la IUSH, cada una con su propio enfoque y nivel de desarrollo en los sistemas de gestión bibliotecaria.</w:t>
+      </w:r>
+    </w:p>
+    <w:p>
+      <w:pPr>
+        <w:spacing w:after="160" w:line="259" w:lineRule="auto"/>
+        <w:ind w:firstLine="708"/>
+        <w:rPr>
+          <w:rFonts w:cs="Times New Roman"/>
+          <w:szCs w:val="24"/>
+        </w:rPr>
+      </w:pPr>
+    </w:p>
+    <w:p>
+      <w:pPr>
+        <w:spacing w:after="160" w:line="259" w:lineRule="auto"/>
+        <w:ind w:firstLine="708"/>
+        <w:rPr>
+          <w:rFonts w:cs="Times New Roman"/>
+          <w:szCs w:val="24"/>
+        </w:rPr>
+      </w:pPr>
+      <w:r>
+        <w:rPr>
+          <w:rFonts w:cs="Times New Roman"/>
+          <w:szCs w:val="24"/>
+        </w:rPr>
+        <w:t>En el caso de la Biblioteca EPM, se percibe un entorno altamente tecnificado. El uso de tecnologías como RFID, software WMS y bases de datos digitalizadas permite que los procesos de préstamo y devolución se realicen de manera ágil y precisa. Este nivel de automatización facilita el control del inventario, reduce significativamente los tiempos de operación y mejora la trazabilidad de los materiales. En general, el sistema es bien valorado por su organización y eficiencia. No obstante, se presentan fallas ocasionales, principalmente asociadas a errores humanos o a la sensibilidad de la tecnología, como problemas en la lectura de tags.</w:t>
+      </w:r>
+    </w:p>
+    <w:p>
+      <w:pPr>
+        <w:spacing w:after="160" w:line="259" w:lineRule="auto"/>
+        <w:ind w:firstLine="708"/>
+        <w:rPr>
+          <w:rFonts w:cs="Times New Roman"/>
+          <w:szCs w:val="24"/>
+        </w:rPr>
+      </w:pPr>
+    </w:p>
+    <w:p>
+      <w:pPr>
+        <w:spacing w:after="160" w:line="259" w:lineRule="auto"/>
+        <w:ind w:firstLine="708"/>
+        <w:rPr>
+          <w:rFonts w:cs="Times New Roman"/>
+          <w:szCs w:val="24"/>
+        </w:rPr>
+      </w:pPr>
+      <w:r>
+        <w:rPr>
+          <w:rFonts w:cs="Times New Roman"/>
+          <w:szCs w:val="24"/>
+        </w:rPr>
+        <w:t>Por su parte, la Biblioteca Pública Piloto también cuenta con un sistema estructurado apoyado en herramientas tecnológicas, aunque con un enfoque operativo ligeramente distinto. Los procesos de afiliación y préstamo están bien organizados y se gestionan mediante códigos de barras y sistemas digitales, lo que permite un control adecuado del material. Sin embargo, aún se evidencian algunas limitaciones tecnológicas, como la ausencia de sistemas de autopréstamo o devolución automatizada. A pesar de esto, el funcionamiento general es eficiente, con buena capacidad de respuesta y baja congestión. Además, destaca su fuerte compromiso con la promoción de la lectura mediante iniciativas como las bibliotecas viajeras.</w:t>
+      </w:r>
+    </w:p>
+    <w:p>
+      <w:pPr>
+        <w:spacing w:after="160" w:line="259" w:lineRule="auto"/>
+        <w:ind w:firstLine="708"/>
+        <w:rPr>
+          <w:rFonts w:cs="Times New Roman"/>
+          <w:szCs w:val="24"/>
+        </w:rPr>
+      </w:pPr>
+    </w:p>
+    <w:p>
+      <w:pPr>
+        <w:spacing w:after="160" w:line="259" w:lineRule="auto"/>
+        <w:ind w:firstLine="708"/>
+        <w:rPr>
+          <w:rFonts w:cs="Times New Roman"/>
+          <w:szCs w:val="24"/>
+        </w:rPr>
+      </w:pPr>
+      <w:r>
+        <w:rPr>
+          <w:rFonts w:cs="Times New Roman"/>
+          <w:szCs w:val="24"/>
+        </w:rPr>
+        <w:t>Finalmente, la biblioteca de la IUSH presenta un menor grado de desarrollo tecnológico en comparación con las otras dos. Su sistema de gestión se basa en herramientas más limitadas, como WinISIS, y en procesos que dependen en gran medida de la intervención manual. Esto genera dificultades en la administración de la información, incluyendo inconsistencias en los registros, errores en la disponibilidad del material y complicaciones en la realización de inventarios, en parte debido a la falta de personal. Asimismo, se evidencia una baja participación de la comunidad, lo que impacta directamente en la dinámica del servicio. En este contexto, se hace evidente la necesidad de modernización tecnológica y de capacitación del personal.</w:t>
+      </w:r>
+    </w:p>
+    <w:p>
+      <w:pPr>
+        <w:spacing w:after="160" w:line="259" w:lineRule="auto"/>
+        <w:ind w:firstLine="708"/>
+        <w:rPr>
+          <w:rFonts w:cs="Times New Roman"/>
+          <w:szCs w:val="24"/>
+        </w:rPr>
+      </w:pPr>
+    </w:p>
+    <w:p>
+      <w:pPr>
+        <w:spacing w:after="160" w:line="259" w:lineRule="auto"/>
+        <w:ind w:firstLine="708"/>
+        <w:rPr>
+          <w:rFonts w:cs="Times New Roman"/>
+          <w:szCs w:val="24"/>
+        </w:rPr>
+      </w:pPr>
+      <w:r>
+        <w:rPr>
+          <w:rFonts w:cs="Times New Roman"/>
+          <w:szCs w:val="24"/>
+        </w:rPr>
+        <w:t>En conjunto, el análisis cualitativo muestra que, aunque las tres bibliotecas reconocen la importancia de la tecnología, el nivel de implementación y actualización de estas herramientas influye de manera directa tanto en la eficiencia operativa como en la experiencia del usuario.</w:t>
+      </w:r>
+    </w:p>
+    <w:p>
+      <w:pPr>
+        <w:spacing w:after="160" w:line="259" w:lineRule="auto"/>
+        <w:jc w:val="center"/>
+        <w:rPr>
+          <w:rFonts w:cs="Times New Roman"/>
+          <w:szCs w:val="24"/>
+        </w:rPr>
+      </w:pPr>
+      <w:r>
+        <w:rPr>
+          <w:noProof/>
+        </w:rPr>
+        <w:lastRenderedPageBreak/>
+        <mc:AlternateContent>
+          <mc:Choice Requires="wps">
+            <w:drawing>
+              <wp:inline distT="0" distB="0" distL="0" distR="0" wp14:anchorId="3C4197E4" wp14:editId="24F61B8B">
+                <wp:extent cx="304800" cy="304800"/>
+                <wp:effectExtent l="0" t="0" r="0" b="0"/>
+                <wp:docPr id="7967258" name="Rectángulo 15" descr="Imagen de salida"/>
+                <wp:cNvGraphicFramePr>
+                  <a:graphicFrameLocks xmlns:a="http://schemas.openxmlformats.org/drawingml/2006/main" noChangeAspect="1"/>
+                </wp:cNvGraphicFramePr>
+                <a:graphic xmlns:a="http://schemas.openxmlformats.org/drawingml/2006/main">
+                  <a:graphicData uri="http://schemas.microsoft.com/office/word/2010/wordprocessingShape">
+                    <wps:wsp>
+                      <wps:cNvSpPr>
+                        <a:spLocks noChangeAspect="1" noChangeArrowheads="1"/>
+                      </wps:cNvSpPr>
+                      <wps:spPr bwMode="auto">
+                        <a:xfrm>
+                          <a:off x="0" y="0"/>
+                          <a:ext cx="304800" cy="304800"/>
+                        </a:xfrm>
+                        <a:prstGeom prst="rect">
+                          <a:avLst/>
+                        </a:prstGeom>
+                        <a:noFill/>
+                        <a:ln>
+                          <a:noFill/>
+                        </a:ln>
+                        <a:extLst>
+                          <a:ext uri="{909E8E84-426E-40DD-AFC4-6F175D3DCCD1}">
+                            <a14:hiddenFill xmlns:a14="http://schemas.microsoft.com/office/drawing/2010/main">
+                              <a:solidFill>
+                                <a:srgbClr val="FFFFFF"/>
+                              </a:solidFill>
+                            </a14:hiddenFill>
+                          </a:ext>
+                          <a:ext uri="{91240B29-F687-4F45-9708-019B960494DF}">
+                            <a14:hiddenLine xmlns:a14="http://schemas.microsoft.com/office/drawing/2010/main" w="9525">
+                              <a:solidFill>
+                                <a:srgbClr val="000000"/>
+                              </a:solidFill>
+                              <a:miter lim="800000"/>
+                              <a:headEnd/>
+                              <a:tailEnd/>
+                            </a14:hiddenLine>
+                          </a:ext>
+                        </a:extLst>
+                      </wps:spPr>
+                      <wps:bodyPr rot="0" vert="horz" wrap="square" lIns="91440" tIns="45720" rIns="91440" bIns="45720" anchor="t" anchorCtr="0" upright="1">
+                        <a:noAutofit/>
+                      </wps:bodyPr>
+                    </wps:wsp>
+                  </a:graphicData>
+                </a:graphic>
+              </wp:inline>
+            </w:drawing>
+          </mc:Choice>
+          <mc:Fallback>
+            <w:pict>
+              <v:rect w14:anchorId="3F253E82" id="Rectángulo 15" o:spid="_x0000_s1026" alt="Imagen de salida" style="width:24pt;height:24pt;visibility:visible;mso-wrap-style:square;mso-left-percent:-10001;mso-top-percent:-10001;mso-position-horizontal:absolute;mso-position-horizontal-relative:char;mso-position-vertical:absolute;mso-position-vertical-relative:line;mso-left-percent:-10001;mso-top-percent:-10001;v-text-anchor:top" o:gfxdata="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" filled="f" stroked="f">
+                <o:lock v:ext="edit" aspectratio="t"/>
+                <w10:anchorlock/>
+              </v:rect>
+            </w:pict>
+          </mc:Fallback>
+        </mc:AlternateContent>
+      </w:r>
+      <w:r>
+        <w:rPr>
+          <w:rFonts w:cs="Times New Roman"/>
+          <w:noProof/>
+          <w:szCs w:val="24"/>
+        </w:rPr>
+        <w:drawing>
+          <wp:inline distT="0" distB="0" distL="0" distR="0" wp14:anchorId="66432A80" wp14:editId="4BEC1693">
+            <wp:extent cx="3392631" cy="2786367"/>
+            <wp:effectExtent l="0" t="0" r="0" b="0"/>
+            <wp:docPr id="1551052012" name="Imagen 14"/>
+            <wp:cNvGraphicFramePr>
+              <a:graphicFrameLocks xmlns:a="http://schemas.openxmlformats.org/drawingml/2006/main" noChangeAspect="1"/>
+            </wp:cNvGraphicFramePr>
+            <a:graphic xmlns:a="http://schemas.openxmlformats.org/drawingml/2006/main">
+              <a:graphicData uri="http://schemas.openxmlformats.org/drawingml/2006/picture">
+                <pic:pic xmlns:pic="http://schemas.openxmlformats.org/drawingml/2006/picture">
+                  <pic:nvPicPr>
+                    <pic:cNvPr id="0" name="Picture 2"/>
+                    <pic:cNvPicPr>
+                      <a:picLocks noChangeAspect="1" noChangeArrowheads="1"/>
+                    </pic:cNvPicPr>
+                  </pic:nvPicPr>
+                  <pic:blipFill>
+                    <a:blip r:embed="rId17">
+                      <a:extLst>
+                        <a:ext uri="{28A0092B-C50C-407E-A947-70E740481C1C}">
+                          <a14:useLocalDpi xmlns:a14="http://schemas.microsoft.com/office/drawing/2010/main" val="0"/>
+                        </a:ext>
+                      </a:extLst>
+                    </a:blip>
+                    <a:srcRect/>
+                    <a:stretch>
+                      <a:fillRect/>
+                    </a:stretch>
+                  </pic:blipFill>
+                  <pic:spPr bwMode="auto">
+                    <a:xfrm>
+                      <a:off x="0" y="0"/>
+                      <a:ext cx="3398294" cy="2791018"/>
+                    </a:xfrm>
+                    <a:prstGeom prst="rect">
+                      <a:avLst/>
+                    </a:prstGeom>
+                    <a:noFill/>
+                  </pic:spPr>
+                </pic:pic>
+              </a:graphicData>
+            </a:graphic>
+          </wp:inline>
+        </w:drawing>
+      </w:r>
+    </w:p>
+    <w:p>
+      <w:pPr>
+        <w:pStyle w:val="Descripcin"/>
+        <w:jc w:val="center"/>
+        <w:rPr>
+          <w:noProof/>
+          <w:szCs w:val="22"/>
+        </w:rPr>
+      </w:pPr>
+      <w:r>
+        <w:t xml:space="preserve">Figura 2. </w:t>
+      </w:r>
+      <w:r>
+        <w:rPr>
           <w:b/>
           <w:bCs/>
-          <w:szCs w:val="18"/>
-        </w:rPr>
-      </w:pPr>
-      <w:r>
-        <w:rPr>
-          <w:rFonts w:cs="Times New Roman"/>
-          <w:szCs w:val="24"/>
-        </w:rPr>
-        <w:t xml:space="preserve">En </w:t>
-      </w:r>
-      <w:r>
-        <w:rPr>
-          <w:rFonts w:cs="Times New Roman"/>
-          <w:szCs w:val="24"/>
-        </w:rPr>
-        <w:t xml:space="preserve">este apartado </w:t>
-      </w:r>
-      <w:r>
-        <w:rPr>
-          <w:rFonts w:cs="Times New Roman"/>
-          <w:szCs w:val="24"/>
-        </w:rPr>
-        <w:t>se comunican los hallazgos y descubrimientos del estudio</w:t>
-      </w:r>
-      <w:r>
-        <w:rPr>
-          <w:rFonts w:cs="Times New Roman"/>
-          <w:szCs w:val="24"/>
-        </w:rPr>
-        <w:t xml:space="preserve">, proyecto o investigación. Aquí se pueden incluir tablas, figuras, diagramas y demás material demostrativo. </w:t>
-      </w:r>
-      <w:bookmarkStart w:id="39" w:name="_Ref57038153"/>
+        </w:rPr>
+        <w:t>Comparación desempeño bibliotecario</w:t>
+      </w:r>
+      <w:r>
+        <w:rPr>
+          <w:b/>
+          <w:bCs/>
+        </w:rPr>
+        <w:t xml:space="preserve"> Fuente</w:t>
+      </w:r>
+      <w:r>
+        <w:rPr>
+          <w:b/>
+          <w:bCs/>
+        </w:rPr>
+        <w:t>:</w:t>
+      </w:r>
+      <w:r>
+        <w:rPr>
+          <w:b/>
+          <w:bCs/>
+        </w:rPr>
+        <w:t xml:space="preserve"> Autor</w:t>
+      </w:r>
+    </w:p>
+    <w:p>
+      <w:pPr>
+        <w:spacing w:after="160" w:line="259" w:lineRule="auto"/>
+        <w:rPr>
+          <w:rFonts w:cs="Times New Roman"/>
+          <w:szCs w:val="24"/>
+        </w:rPr>
+      </w:pPr>
     </w:p>
     <w:p>
       <w:pPr>
@@ -20268,14 +20580,141 @@
           <w:b/>
         </w:rPr>
       </w:pPr>
-      <w:bookmarkStart w:id="40" w:name="_Toc440985141"/>
-      <w:bookmarkEnd w:id="39"/>
-      <w:r>
-        <w:rPr>
-          <w:b/>
-        </w:rPr>
-        <w:br w:type="page"/>
-      </w:r>
+    </w:p>
+    <w:p>
+      <w:pPr>
+        <w:spacing w:after="160" w:line="259" w:lineRule="auto"/>
+        <w:jc w:val="left"/>
+        <w:rPr>
+          <w:b/>
+        </w:rPr>
+      </w:pPr>
+    </w:p>
+    <w:p>
+      <w:pPr>
+        <w:spacing w:after="160" w:line="259" w:lineRule="auto"/>
+        <w:jc w:val="left"/>
+        <w:rPr>
+          <w:b/>
+        </w:rPr>
+      </w:pPr>
+    </w:p>
+    <w:p>
+      <w:pPr>
+        <w:spacing w:after="160" w:line="259" w:lineRule="auto"/>
+        <w:jc w:val="left"/>
+        <w:rPr>
+          <w:b/>
+        </w:rPr>
+      </w:pPr>
+    </w:p>
+    <w:p>
+      <w:pPr>
+        <w:spacing w:after="160" w:line="259" w:lineRule="auto"/>
+        <w:jc w:val="left"/>
+        <w:rPr>
+          <w:b/>
+        </w:rPr>
+      </w:pPr>
+    </w:p>
+    <w:p>
+      <w:pPr>
+        <w:spacing w:after="160" w:line="259" w:lineRule="auto"/>
+        <w:jc w:val="left"/>
+        <w:rPr>
+          <w:b/>
+        </w:rPr>
+      </w:pPr>
+    </w:p>
+    <w:p>
+      <w:pPr>
+        <w:spacing w:after="160" w:line="259" w:lineRule="auto"/>
+        <w:jc w:val="left"/>
+        <w:rPr>
+          <w:b/>
+        </w:rPr>
+      </w:pPr>
+    </w:p>
+    <w:p>
+      <w:pPr>
+        <w:spacing w:after="160" w:line="259" w:lineRule="auto"/>
+        <w:jc w:val="left"/>
+        <w:rPr>
+          <w:b/>
+        </w:rPr>
+      </w:pPr>
+    </w:p>
+    <w:p>
+      <w:pPr>
+        <w:spacing w:after="160" w:line="259" w:lineRule="auto"/>
+        <w:jc w:val="left"/>
+        <w:rPr>
+          <w:b/>
+        </w:rPr>
+      </w:pPr>
+    </w:p>
+    <w:p>
+      <w:pPr>
+        <w:spacing w:after="160" w:line="259" w:lineRule="auto"/>
+        <w:jc w:val="left"/>
+        <w:rPr>
+          <w:b/>
+        </w:rPr>
+      </w:pPr>
+    </w:p>
+    <w:p>
+      <w:pPr>
+        <w:spacing w:after="160" w:line="259" w:lineRule="auto"/>
+        <w:jc w:val="left"/>
+        <w:rPr>
+          <w:b/>
+        </w:rPr>
+      </w:pPr>
+    </w:p>
+    <w:p>
+      <w:pPr>
+        <w:spacing w:after="160" w:line="259" w:lineRule="auto"/>
+        <w:jc w:val="left"/>
+        <w:rPr>
+          <w:b/>
+        </w:rPr>
+      </w:pPr>
+    </w:p>
+    <w:p>
+      <w:pPr>
+        <w:spacing w:after="160" w:line="259" w:lineRule="auto"/>
+        <w:jc w:val="left"/>
+        <w:rPr>
+          <w:b/>
+        </w:rPr>
+      </w:pPr>
+    </w:p>
+    <w:p>
+      <w:pPr>
+        <w:spacing w:after="160" w:line="259" w:lineRule="auto"/>
+        <w:jc w:val="left"/>
+        <w:rPr>
+          <w:b/>
+        </w:rPr>
+      </w:pPr>
+    </w:p>
+    <w:p>
+      <w:pPr>
+        <w:spacing w:after="160" w:line="259" w:lineRule="auto"/>
+        <w:jc w:val="left"/>
+        <w:rPr>
+          <w:b/>
+        </w:rPr>
+      </w:pPr>
+    </w:p>
+    <w:p>
+      <w:pPr>
+        <w:spacing w:after="160" w:line="259" w:lineRule="auto"/>
+        <w:jc w:val="left"/>
+        <w:rPr>
+          <w:b/>
+        </w:rPr>
+      </w:pPr>
     </w:p>
     <w:p>
       <w:pPr>
@@ -20300,7 +20739,7 @@
         </w:rPr>
         <w:t xml:space="preserve"> Discusión</w:t>
       </w:r>
-      <w:bookmarkEnd w:id="40"/>
+      <w:bookmarkEnd w:id="39"/>
     </w:p>
     <w:p>
       <w:pPr>
@@ -20366,7 +20805,7 @@
           <w:bCs/>
         </w:rPr>
       </w:pPr>
-      <w:bookmarkStart w:id="41" w:name="_Toc440985142"/>
+      <w:bookmarkStart w:id="40" w:name="_Toc440985142"/>
       <w:r>
         <w:rPr>
           <w:b/>
@@ -20382,7 +20821,7 @@
         </w:rPr>
         <w:t xml:space="preserve"> Conclusiones</w:t>
       </w:r>
-      <w:bookmarkEnd w:id="41"/>
+      <w:bookmarkEnd w:id="40"/>
     </w:p>
     <w:p>
       <w:pPr>
@@ -20805,8 +21244,8 @@
       <w:pPr>
         <w:pStyle w:val="Ttulo1"/>
       </w:pPr>
-      <w:bookmarkStart w:id="42" w:name="_Toc440985143"/>
-      <w:bookmarkStart w:id="43" w:name="_Toc758643157"/>
+      <w:bookmarkStart w:id="41" w:name="_Toc440985143"/>
+      <w:bookmarkStart w:id="42" w:name="_Toc758643157"/>
       <w:r>
         <w:br w:type="page"/>
       </w:r>
@@ -20814,8 +21253,8 @@
         <w:lastRenderedPageBreak/>
         <w:t>Referencias</w:t>
       </w:r>
+      <w:bookmarkEnd w:id="41"/>
       <w:bookmarkEnd w:id="42"/>
-      <w:bookmarkEnd w:id="43"/>
     </w:p>
     <w:p/>
     <w:sdt>
@@ -22726,6 +23165,8 @@
             <w:ind w:left="480" w:hanging="480"/>
             <w:rPr>
               <w:rFonts w:cs="Times New Roman"/>
+              <w:i/>
+              <w:iCs/>
               <w:noProof/>
               <w:lang w:val="en-US"/>
             </w:rPr>
@@ -22770,6 +23211,101 @@
             </w:rPr>
             <w:t>f.). S-parameters. https://www.microwaves101.com/encyclopedias/s-parameters</w:t>
           </w:r>
+        </w:p>
+        <w:p>
+          <w:pPr>
+            <w:rPr>
+              <w:lang w:val="en-US"/>
+            </w:rPr>
+          </w:pPr>
+          <w:r>
+            <w:rPr>
+              <w:lang w:val="en-US"/>
+            </w:rPr>
+            <w:t>Islam, M. T., Alam, T., Yahya, I., &amp; Cho, M. (2018). Flexible radio-frequency identification (</w:t>
+          </w:r>
+          <w:r>
+            <w:rPr>
+              <w:lang w:val="en-US"/>
+            </w:rPr>
+            <w:tab/>
+          </w:r>
+          <w:r>
+            <w:rPr>
+              <w:lang w:val="en-US"/>
+            </w:rPr>
+            <w:t xml:space="preserve">RFID) tag antenna for sensor applications. </w:t>
+          </w:r>
+          <w:r>
+            <w:rPr>
+              <w:i/>
+              <w:iCs/>
+              <w:lang w:val="en-US"/>
+            </w:rPr>
+            <w:t>Sensors (Switzerland)</w:t>
+          </w:r>
+          <w:r>
+            <w:rPr>
+              <w:lang w:val="en-US"/>
+            </w:rPr>
+            <w:t xml:space="preserve">, </w:t>
+          </w:r>
+          <w:r>
+            <w:rPr>
+              <w:i/>
+              <w:iCs/>
+              <w:lang w:val="en-US"/>
+            </w:rPr>
+            <w:t>18</w:t>
+          </w:r>
+          <w:r>
+            <w:rPr>
+              <w:lang w:val="en-US"/>
+            </w:rPr>
+            <w:t>(12). https://doi.org/10.3390/s18124212</w:t>
+          </w:r>
+        </w:p>
+        <w:p>
+          <w:pPr>
+            <w:rPr>
+              <w:lang w:val="en-US"/>
+            </w:rPr>
+          </w:pPr>
+          <w:r>
+            <w:rPr>
+              <w:lang w:val="en-US"/>
+            </w:rPr>
+            <w:lastRenderedPageBreak/>
+            <w:t xml:space="preserve">Singh, R., Singh, E., &amp; Nalwa, H. S. (2017). Inkjet printed nanomaterial based flexible radio frequency identification (RFID) tag sensors for the internet of nano things. In </w:t>
+          </w:r>
+          <w:r>
+            <w:rPr>
+              <w:i/>
+              <w:iCs/>
+              <w:lang w:val="en-US"/>
+            </w:rPr>
+            <w:t>RSC Advances</w:t>
+          </w:r>
+          <w:r>
+            <w:rPr>
+              <w:lang w:val="en-US"/>
+            </w:rPr>
+            <w:t xml:space="preserve"> (Vol. 7, Issue 77, pp. 48597–48630). Royal Society of Chemistry. https://doi.org/10.1039/c7ra07191d</w:t>
+          </w:r>
+        </w:p>
+        <w:p>
+          <w:pPr>
+            <w:widowControl w:val="0"/>
+            <w:autoSpaceDE w:val="0"/>
+            <w:autoSpaceDN w:val="0"/>
+            <w:adjustRightInd w:val="0"/>
+            <w:ind w:left="480" w:hanging="480"/>
+            <w:rPr>
+              <w:rFonts w:cs="Times New Roman"/>
+              <w:noProof/>
+              <w:lang w:val="en-US"/>
+            </w:rPr>
+          </w:pPr>
         </w:p>
         <w:p>
           <w:pPr>
@@ -22851,7 +23387,6 @@
           <w:b/>
           <w:szCs w:val="24"/>
         </w:rPr>
-        <w:lastRenderedPageBreak/>
         <w:br w:type="page"/>
       </w:r>
     </w:p>
@@ -22871,15 +23406,15 @@
           <w:b/>
         </w:rPr>
       </w:pPr>
-      <w:bookmarkStart w:id="44" w:name="_Toc440985144"/>
-      <w:commentRangeStart w:id="45"/>
+      <w:bookmarkStart w:id="43" w:name="_Toc440985144"/>
+      <w:commentRangeStart w:id="44"/>
       <w:r>
         <w:rPr>
           <w:b/>
         </w:rPr>
         <w:t>A</w:t>
       </w:r>
-      <w:commentRangeEnd w:id="45"/>
+      <w:commentRangeEnd w:id="44"/>
       <w:r>
         <w:rPr>
           <w:rStyle w:val="Refdecomentario"/>
@@ -22887,7 +23422,7 @@
           <w:sz w:val="24"/>
           <w:szCs w:val="22"/>
         </w:rPr>
-        <w:commentReference w:id="45"/>
+        <w:commentReference w:id="44"/>
       </w:r>
       <w:r>
         <w:rPr>
@@ -22895,7 +23430,7 @@
         </w:rPr>
         <w:t>nexos</w:t>
       </w:r>
-      <w:bookmarkEnd w:id="44"/>
+      <w:bookmarkEnd w:id="43"/>
     </w:p>
     <w:p>
       <w:pPr>
@@ -23987,7 +24522,7 @@
       </w:r>
     </w:p>
   </w:comment>
-  <w:comment w:id="45" w:author="Autor" w:initials="A">
+  <w:comment w:id="44" w:author="Autor" w:initials="A">
     <w:p>
       <w:pPr>
         <w:pStyle w:val="Textocomentario"/>
@@ -30083,6 +30618,7 @@
   <w:style w:type="character" w:default="1" w:styleId="Fuentedeprrafopredeter">
     <w:name w:val="Default Paragraph Font"/>
     <w:uiPriority w:val="1"/>
+    <w:semiHidden/>
     <w:unhideWhenUsed/>
   </w:style>
   <w:style w:type="table" w:default="1" w:styleId="Tablanormal">
@@ -32680,6 +33216,23 @@
 </file>
 
 <file path=customXml/item1.xml><?xml version="1.0" encoding="utf-8"?>
+<p:properties xmlns:p="http://schemas.microsoft.com/office/2006/metadata/properties" xmlns:xsi="http://www.w3.org/2001/XMLSchema-instance" xmlns:pc="http://schemas.microsoft.com/office/infopath/2007/PartnerControls">
+  <documentManagement>
+    <_activity xmlns="152b35e6-23a1-4beb-a1fd-2689778f6058" xsi:nil="true"/>
+  </documentManagement>
+</p:properties>
+</file>
+
+<file path=customXml/item2.xml><?xml version="1.0" encoding="utf-8"?>
+<?mso-contentType ?>
+<FormTemplates xmlns="http://schemas.microsoft.com/sharepoint/v3/contenttype/forms">
+  <Display>DocumentLibraryForm</Display>
+  <Edit>DocumentLibraryForm</Edit>
+  <New>DocumentLibraryForm</New>
+</FormTemplates>
+</file>
+
+<file path=customXml/item3.xml><?xml version="1.0" encoding="utf-8"?>
 <b:Sources xmlns:b="http://schemas.openxmlformats.org/officeDocument/2006/bibliography" xmlns="http://schemas.openxmlformats.org/officeDocument/2006/bibliography" SelectedStyle="\APASixthEditionOfficeOnline.xsl" StyleName="APA" Version="6">
   <b:Source>
     <b:Tag>Men90</b:Tag>
@@ -33514,23 +34067,6 @@
 </b:Sources>
 </file>
 
-<file path=customXml/item2.xml><?xml version="1.0" encoding="utf-8"?>
-<?mso-contentType ?>
-<FormTemplates xmlns="http://schemas.microsoft.com/sharepoint/v3/contenttype/forms">
-  <Display>DocumentLibraryForm</Display>
-  <Edit>DocumentLibraryForm</Edit>
-  <New>DocumentLibraryForm</New>
-</FormTemplates>
-</file>
-
-<file path=customXml/item3.xml><?xml version="1.0" encoding="utf-8"?>
-<p:properties xmlns:p="http://schemas.microsoft.com/office/2006/metadata/properties" xmlns:xsi="http://www.w3.org/2001/XMLSchema-instance" xmlns:pc="http://schemas.microsoft.com/office/infopath/2007/PartnerControls">
-  <documentManagement>
-    <_activity xmlns="152b35e6-23a1-4beb-a1fd-2689778f6058" xsi:nil="true"/>
-  </documentManagement>
-</p:properties>
-</file>
-
 <file path=customXml/item4.xml><?xml version="1.0" encoding="utf-8"?>
 <ct:contentTypeSchema xmlns:ct="http://schemas.microsoft.com/office/2006/metadata/contentType" xmlns:ma="http://schemas.microsoft.com/office/2006/metadata/properties/metaAttributes" ct:_="" ma:_="" ma:contentTypeName="Documento" ma:contentTypeID="0x01010015BDB27AF1A6EC4C99611A7AD03A3206" ma:contentTypeVersion="18" ma:contentTypeDescription="Crear nuevo documento." ma:contentTypeScope="" ma:versionID="56de9a8de695fa7f309cf2eb59d05ef4">
   <xsd:schema xmlns:xsd="http://www.w3.org/2001/XMLSchema" xmlns:xs="http://www.w3.org/2001/XMLSchema" xmlns:p="http://schemas.microsoft.com/office/2006/metadata/properties" xmlns:ns3="ed1181c6-4963-4f9c-a6e4-d7efb21233a0" xmlns:ns4="152b35e6-23a1-4beb-a1fd-2689778f6058" targetNamespace="http://schemas.microsoft.com/office/2006/metadata/properties" ma:root="true" ma:fieldsID="cae7528616b6d30ad4c29b83143ea2c0" ns3:_="" ns4:_="">
@@ -33785,9 +34321,11 @@
 </file>
 
 <file path=customXml/itemProps1.xml><?xml version="1.0" encoding="utf-8"?>
-<ds:datastoreItem xmlns:ds="http://schemas.openxmlformats.org/officeDocument/2006/customXml" ds:itemID="{27BD2DDD-D5B5-4DDA-B090-C036D7EEAD0E}">
+<ds:datastoreItem xmlns:ds="http://schemas.openxmlformats.org/officeDocument/2006/customXml" ds:itemID="{B58D4DAF-C7F0-4FA3-950B-89D41305B414}">
   <ds:schemaRefs>
-    <ds:schemaRef ds:uri="http://schemas.openxmlformats.org/officeDocument/2006/bibliography"/>
+    <ds:schemaRef ds:uri="http://schemas.microsoft.com/office/2006/metadata/properties"/>
+    <ds:schemaRef ds:uri="http://schemas.microsoft.com/office/infopath/2007/PartnerControls"/>
+    <ds:schemaRef ds:uri="152b35e6-23a1-4beb-a1fd-2689778f6058"/>
   </ds:schemaRefs>
 </ds:datastoreItem>
 </file>
@@ -33801,11 +34339,9 @@
 </file>
 
 <file path=customXml/itemProps3.xml><?xml version="1.0" encoding="utf-8"?>
-<ds:datastoreItem xmlns:ds="http://schemas.openxmlformats.org/officeDocument/2006/customXml" ds:itemID="{B58D4DAF-C7F0-4FA3-950B-89D41305B414}">
+<ds:datastoreItem xmlns:ds="http://schemas.openxmlformats.org/officeDocument/2006/customXml" ds:itemID="{27BD2DDD-D5B5-4DDA-B090-C036D7EEAD0E}">
   <ds:schemaRefs>
-    <ds:schemaRef ds:uri="http://schemas.microsoft.com/office/2006/metadata/properties"/>
-    <ds:schemaRef ds:uri="http://schemas.microsoft.com/office/infopath/2007/PartnerControls"/>
-    <ds:schemaRef ds:uri="152b35e6-23a1-4beb-a1fd-2689778f6058"/>
+    <ds:schemaRef ds:uri="http://schemas.openxmlformats.org/officeDocument/2006/bibliography"/>
   </ds:schemaRefs>
 </ds:datastoreItem>
 </file>

</xml_diff>

<commit_message>
Correciones realizadas formato proyecto
</commit_message>
<xml_diff>
--- a/Formato Proyecto Investigación.docx
+++ b/Formato Proyecto Investigación.docx
@@ -7643,6 +7643,7 @@
     </w:p>
     <w:p>
       <w:pPr>
+        <w:ind w:left="708" w:hanging="708"/>
         <w:jc w:val="left"/>
         <w:rPr>
           <w:rFonts w:cs="Times New Roman"/>
@@ -7965,7 +7966,17 @@
               <w:rFonts w:ascii="Cambria Math" w:hAnsi="Cambria Math" w:cs="Times New Roman"/>
               <w:szCs w:val="24"/>
             </w:rPr>
-            <m:t xml:space="preserve">C= </m:t>
+            <m:t>λ</m:t>
+          </m:r>
+          <m:r>
+            <m:rPr>
+              <m:sty m:val="bi"/>
+            </m:rPr>
+            <w:rPr>
+              <w:rFonts w:ascii="Cambria Math" w:hAnsi="Cambria Math" w:cs="Times New Roman"/>
+              <w:szCs w:val="24"/>
+            </w:rPr>
+            <m:t xml:space="preserve">= </m:t>
           </m:r>
           <m:f>
             <m:fPr>
@@ -7988,7 +7999,7 @@
                   <w:rFonts w:ascii="Cambria Math" w:hAnsi="Cambria Math" w:cs="Times New Roman"/>
                   <w:szCs w:val="24"/>
                 </w:rPr>
-                <m:t>f</m:t>
+                <m:t>C</m:t>
               </m:r>
             </m:num>
             <m:den>
@@ -8000,7 +8011,7 @@
                   <w:rFonts w:ascii="Cambria Math" w:hAnsi="Cambria Math" w:cs="Times New Roman"/>
                   <w:szCs w:val="24"/>
                 </w:rPr>
-                <m:t>λ</m:t>
+                <m:t>f</m:t>
               </m:r>
             </m:den>
           </m:f>
@@ -8530,38 +8541,6 @@
                               </w:rPr>
                               <w:t>Parámetros S Fuente: Autor</w:t>
                             </w:r>
-                          </w:p>
-                          <w:p/>
-                          <w:p>
-                            <w:pPr>
-                              <w:pStyle w:val="Descripcin"/>
-                              <w:jc w:val="center"/>
-                              <w:rPr>
-                                <w:noProof/>
-                                <w:szCs w:val="22"/>
-                              </w:rPr>
-                            </w:pPr>
-                            <w:r>
-                              <w:t xml:space="preserve">Figura </w:t>
-                            </w:r>
-                            <w:fldSimple w:instr=" SEQ Figura \* ARABIC ">
-                              <w:r>
-                                <w:rPr>
-                                  <w:noProof/>
-                                </w:rPr>
-                                <w:t>1</w:t>
-                              </w:r>
-                            </w:fldSimple>
-                            <w:r>
-                              <w:t xml:space="preserve">. </w:t>
-                            </w:r>
-                            <w:r>
-                              <w:rPr>
-                                <w:b/>
-                                <w:bCs/>
-                              </w:rPr>
-                              <w:t>Parámetros S Fuente: Autor</w:t>
-                            </w:r>
                             <w:bookmarkEnd w:id="33"/>
                           </w:p>
                         </w:txbxContent>
@@ -8597,38 +8576,6 @@
                         </w:rPr>
                       </w:pPr>
                       <w:bookmarkStart w:id="34" w:name="_Toc227617917"/>
-                      <w:r>
-                        <w:t xml:space="preserve">Figura </w:t>
-                      </w:r>
-                      <w:fldSimple w:instr=" SEQ Figura \* ARABIC ">
-                        <w:r>
-                          <w:rPr>
-                            <w:noProof/>
-                          </w:rPr>
-                          <w:t>1</w:t>
-                        </w:r>
-                      </w:fldSimple>
-                      <w:r>
-                        <w:t xml:space="preserve">. </w:t>
-                      </w:r>
-                      <w:r>
-                        <w:rPr>
-                          <w:b/>
-                          <w:bCs/>
-                        </w:rPr>
-                        <w:t>Parámetros S Fuente: Autor</w:t>
-                      </w:r>
-                    </w:p>
-                    <w:p/>
-                    <w:p>
-                      <w:pPr>
-                        <w:pStyle w:val="Descripcin"/>
-                        <w:jc w:val="center"/>
-                        <w:rPr>
-                          <w:noProof/>
-                          <w:szCs w:val="22"/>
-                        </w:rPr>
-                      </w:pPr>
                       <w:r>
                         <w:t xml:space="preserve">Figura </w:t>
                       </w:r>
@@ -16881,7 +16828,7 @@
     </w:p>
     <w:p>
       <w:pPr>
-        <w:ind w:left="708"/>
+        <w:ind w:left="1416" w:hanging="708"/>
         <w:rPr>
           <w:rFonts w:eastAsiaTheme="minorEastAsia" w:cs="Times New Roman"/>
         </w:rPr>
@@ -18900,6 +18847,9 @@
       </w:pPr>
       <w:r>
         <w:t>Explorar alternativas, evaluar criterios como precisión, facilidad de uso y compatibilidad, y elegir el software más adecuado para el proyecto</w:t>
+      </w:r>
+      <w:r>
+        <w:t>.</w:t>
       </w:r>
     </w:p>
     <w:p>
@@ -33983,23 +33933,6 @@
 </file>
 
 <file path=customXml/item1.xml><?xml version="1.0" encoding="utf-8"?>
-<?mso-contentType ?>
-<FormTemplates xmlns="http://schemas.microsoft.com/sharepoint/v3/contenttype/forms">
-  <Display>DocumentLibraryForm</Display>
-  <Edit>DocumentLibraryForm</Edit>
-  <New>DocumentLibraryForm</New>
-</FormTemplates>
-</file>
-
-<file path=customXml/item2.xml><?xml version="1.0" encoding="utf-8"?>
-<p:properties xmlns:p="http://schemas.microsoft.com/office/2006/metadata/properties" xmlns:xsi="http://www.w3.org/2001/XMLSchema-instance" xmlns:pc="http://schemas.microsoft.com/office/infopath/2007/PartnerControls">
-  <documentManagement>
-    <_activity xmlns="152b35e6-23a1-4beb-a1fd-2689778f6058" xsi:nil="true"/>
-  </documentManagement>
-</p:properties>
-</file>
-
-<file path=customXml/item3.xml><?xml version="1.0" encoding="utf-8"?>
 <ct:contentTypeSchema xmlns:ct="http://schemas.microsoft.com/office/2006/metadata/contentType" xmlns:ma="http://schemas.microsoft.com/office/2006/metadata/properties/metaAttributes" ct:_="" ma:_="" ma:contentTypeName="Documento" ma:contentTypeID="0x01010015BDB27AF1A6EC4C99611A7AD03A3206" ma:contentTypeVersion="18" ma:contentTypeDescription="Crear nuevo documento." ma:contentTypeScope="" ma:versionID="56de9a8de695fa7f309cf2eb59d05ef4">
   <xsd:schema xmlns:xsd="http://www.w3.org/2001/XMLSchema" xmlns:xs="http://www.w3.org/2001/XMLSchema" xmlns:p="http://schemas.microsoft.com/office/2006/metadata/properties" xmlns:ns3="ed1181c6-4963-4f9c-a6e4-d7efb21233a0" xmlns:ns4="152b35e6-23a1-4beb-a1fd-2689778f6058" targetNamespace="http://schemas.microsoft.com/office/2006/metadata/properties" ma:root="true" ma:fieldsID="cae7528616b6d30ad4c29b83143ea2c0" ns3:_="" ns4:_="">
     <xsd:import namespace="ed1181c6-4963-4f9c-a6e4-d7efb21233a0"/>
@@ -34250,6 +34183,23 @@
     <xs:element name="TermId" type="xs:string"/>
   </xs:schema>
 </ct:contentTypeSchema>
+</file>
+
+<file path=customXml/item2.xml><?xml version="1.0" encoding="utf-8"?>
+<p:properties xmlns:p="http://schemas.microsoft.com/office/2006/metadata/properties" xmlns:xsi="http://www.w3.org/2001/XMLSchema-instance" xmlns:pc="http://schemas.microsoft.com/office/infopath/2007/PartnerControls">
+  <documentManagement>
+    <_activity xmlns="152b35e6-23a1-4beb-a1fd-2689778f6058" xsi:nil="true"/>
+  </documentManagement>
+</p:properties>
+</file>
+
+<file path=customXml/item3.xml><?xml version="1.0" encoding="utf-8"?>
+<?mso-contentType ?>
+<FormTemplates xmlns="http://schemas.microsoft.com/sharepoint/v3/contenttype/forms">
+  <Display>DocumentLibraryForm</Display>
+  <Edit>DocumentLibraryForm</Edit>
+  <New>DocumentLibraryForm</New>
+</FormTemplates>
 </file>
 
 <file path=customXml/item4.xml><?xml version="1.0" encoding="utf-8"?>
@@ -35088,24 +35038,6 @@
 </file>
 
 <file path=customXml/itemProps1.xml><?xml version="1.0" encoding="utf-8"?>
-<ds:datastoreItem xmlns:ds="http://schemas.openxmlformats.org/officeDocument/2006/customXml" ds:itemID="{7F74FD34-EBDF-4094-A9AD-E46225785B9A}">
-  <ds:schemaRefs>
-    <ds:schemaRef ds:uri="http://schemas.microsoft.com/sharepoint/v3/contenttype/forms"/>
-  </ds:schemaRefs>
-</ds:datastoreItem>
-</file>
-
-<file path=customXml/itemProps2.xml><?xml version="1.0" encoding="utf-8"?>
-<ds:datastoreItem xmlns:ds="http://schemas.openxmlformats.org/officeDocument/2006/customXml" ds:itemID="{B58D4DAF-C7F0-4FA3-950B-89D41305B414}">
-  <ds:schemaRefs>
-    <ds:schemaRef ds:uri="http://schemas.microsoft.com/office/2006/metadata/properties"/>
-    <ds:schemaRef ds:uri="http://schemas.microsoft.com/office/infopath/2007/PartnerControls"/>
-    <ds:schemaRef ds:uri="152b35e6-23a1-4beb-a1fd-2689778f6058"/>
-  </ds:schemaRefs>
-</ds:datastoreItem>
-</file>
-
-<file path=customXml/itemProps3.xml><?xml version="1.0" encoding="utf-8"?>
 <ds:datastoreItem xmlns:ds="http://schemas.openxmlformats.org/officeDocument/2006/customXml" ds:itemID="{71334E21-6B6C-4687-847F-D6F99FF4EBD6}">
   <ds:schemaRefs>
     <ds:schemaRef ds:uri="http://schemas.microsoft.com/office/2006/metadata/contentType"/>
@@ -35124,6 +35056,24 @@
 </ds:datastoreItem>
 </file>
 
+<file path=customXml/itemProps2.xml><?xml version="1.0" encoding="utf-8"?>
+<ds:datastoreItem xmlns:ds="http://schemas.openxmlformats.org/officeDocument/2006/customXml" ds:itemID="{B58D4DAF-C7F0-4FA3-950B-89D41305B414}">
+  <ds:schemaRefs>
+    <ds:schemaRef ds:uri="http://schemas.microsoft.com/office/2006/metadata/properties"/>
+    <ds:schemaRef ds:uri="http://schemas.microsoft.com/office/infopath/2007/PartnerControls"/>
+    <ds:schemaRef ds:uri="152b35e6-23a1-4beb-a1fd-2689778f6058"/>
+  </ds:schemaRefs>
+</ds:datastoreItem>
+</file>
+
+<file path=customXml/itemProps3.xml><?xml version="1.0" encoding="utf-8"?>
+<ds:datastoreItem xmlns:ds="http://schemas.openxmlformats.org/officeDocument/2006/customXml" ds:itemID="{7F74FD34-EBDF-4094-A9AD-E46225785B9A}">
+  <ds:schemaRefs>
+    <ds:schemaRef ds:uri="http://schemas.microsoft.com/sharepoint/v3/contenttype/forms"/>
+  </ds:schemaRefs>
+</ds:datastoreItem>
+</file>
+
 <file path=customXml/itemProps4.xml><?xml version="1.0" encoding="utf-8"?>
 <ds:datastoreItem xmlns:ds="http://schemas.openxmlformats.org/officeDocument/2006/customXml" ds:itemID="{5536E029-DFBE-4035-BD65-6D509AFD34FF}">
   <ds:schemaRefs>

</xml_diff>

<commit_message>
Corrección tarea de objetivo específico #1. Se suben artículos de ejemplo de Julián.
</commit_message>
<xml_diff>
--- a/Formato Proyecto Investigación.docx
+++ b/Formato Proyecto Investigación.docx
@@ -7966,17 +7966,7 @@
               <w:rFonts w:ascii="Cambria Math" w:hAnsi="Cambria Math" w:cs="Times New Roman"/>
               <w:szCs w:val="24"/>
             </w:rPr>
-            <m:t>λ</m:t>
-          </m:r>
-          <m:r>
-            <m:rPr>
-              <m:sty m:val="bi"/>
-            </m:rPr>
-            <w:rPr>
-              <w:rFonts w:ascii="Cambria Math" w:hAnsi="Cambria Math" w:cs="Times New Roman"/>
-              <w:szCs w:val="24"/>
-            </w:rPr>
-            <m:t xml:space="preserve">= </m:t>
+            <m:t xml:space="preserve">λ= </m:t>
           </m:r>
           <m:f>
             <m:fPr>
@@ -18791,18 +18781,6 @@
         </w:numPr>
       </w:pPr>
       <w:r>
-        <w:t>Observar buenas prácticas, validar problemas comunes y comparar métodos de préstamo, devolución, inventario y seguridad.</w:t>
-      </w:r>
-    </w:p>
-    <w:p>
-      <w:pPr>
-        <w:pStyle w:val="Prrafodelista"/>
-        <w:numPr>
-          <w:ilvl w:val="0"/>
-          <w:numId w:val="20"/>
-        </w:numPr>
-      </w:pPr>
-      <w:r>
         <w:t xml:space="preserve">Analizar la información recopilada </w:t>
       </w:r>
       <w:r>
@@ -18827,7 +18805,6 @@
         </w:numPr>
       </w:pPr>
       <w:r>
-        <w:lastRenderedPageBreak/>
         <w:t>Diseñar la arquitectura integral del sistema RFID, seleccionando los componentes tecnológicos adecuados e integrando los módulos de identificación, control de circulación e inventario automatizado para su adaptación al entorno bibliotecario de la IUSH.</w:t>
       </w:r>
     </w:p>
@@ -19082,7 +19059,6 @@
                 <w:szCs w:val="24"/>
                 <w:lang w:eastAsia="es-CO"/>
               </w:rPr>
-              <w:lastRenderedPageBreak/>
               <w:t>Obj. General: Diseñar un sistema de identificación por radiofrecuencia (RFID)  que permita optimizar el control, la trazabilidad y la gestión automatizada de los libros.</w:t>
             </w:r>
           </w:p>
@@ -19180,6 +19156,7 @@
                 <w:szCs w:val="24"/>
                 <w:lang w:eastAsia="es-CO"/>
               </w:rPr>
+              <w:lastRenderedPageBreak/>
               <w:t>Específicos</w:t>
             </w:r>
           </w:p>
@@ -20949,7 +20926,6 @@
       </w:pPr>
       <w:bookmarkStart w:id="40" w:name="_Toc227617918"/>
       <w:r>
-        <w:lastRenderedPageBreak/>
         <w:t xml:space="preserve">Figura </w:t>
       </w:r>
       <w:fldSimple w:instr=" SEQ Figura \* ARABIC ">
@@ -20981,6 +20957,7 @@
         <w:rPr>
           <w:noProof/>
         </w:rPr>
+        <w:lastRenderedPageBreak/>
         <w:drawing>
           <wp:inline distT="0" distB="0" distL="0" distR="0" wp14:anchorId="77E9027E" wp14:editId="243FF471">
             <wp:extent cx="5971540" cy="3521710"/>
@@ -33933,276 +33910,6 @@
 </file>
 
 <file path=customXml/item1.xml><?xml version="1.0" encoding="utf-8"?>
-<ct:contentTypeSchema xmlns:ct="http://schemas.microsoft.com/office/2006/metadata/contentType" xmlns:ma="http://schemas.microsoft.com/office/2006/metadata/properties/metaAttributes" ct:_="" ma:_="" ma:contentTypeName="Documento" ma:contentTypeID="0x01010015BDB27AF1A6EC4C99611A7AD03A3206" ma:contentTypeVersion="18" ma:contentTypeDescription="Crear nuevo documento." ma:contentTypeScope="" ma:versionID="56de9a8de695fa7f309cf2eb59d05ef4">
-  <xsd:schema xmlns:xsd="http://www.w3.org/2001/XMLSchema" xmlns:xs="http://www.w3.org/2001/XMLSchema" xmlns:p="http://schemas.microsoft.com/office/2006/metadata/properties" xmlns:ns3="ed1181c6-4963-4f9c-a6e4-d7efb21233a0" xmlns:ns4="152b35e6-23a1-4beb-a1fd-2689778f6058" targetNamespace="http://schemas.microsoft.com/office/2006/metadata/properties" ma:root="true" ma:fieldsID="cae7528616b6d30ad4c29b83143ea2c0" ns3:_="" ns4:_="">
-    <xsd:import namespace="ed1181c6-4963-4f9c-a6e4-d7efb21233a0"/>
-    <xsd:import namespace="152b35e6-23a1-4beb-a1fd-2689778f6058"/>
-    <xsd:element name="properties">
-      <xsd:complexType>
-        <xsd:sequence>
-          <xsd:element name="documentManagement">
-            <xsd:complexType>
-              <xsd:all>
-                <xsd:element ref="ns3:SharedWithUsers" minOccurs="0"/>
-                <xsd:element ref="ns3:SharedWithDetails" minOccurs="0"/>
-                <xsd:element ref="ns3:SharingHintHash" minOccurs="0"/>
-                <xsd:element ref="ns4:MediaServiceMetadata" minOccurs="0"/>
-                <xsd:element ref="ns4:MediaServiceFastMetadata" minOccurs="0"/>
-                <xsd:element ref="ns4:MediaServiceDateTaken" minOccurs="0"/>
-                <xsd:element ref="ns4:MediaServiceAutoTags" minOccurs="0"/>
-                <xsd:element ref="ns4:MediaServiceGenerationTime" minOccurs="0"/>
-                <xsd:element ref="ns4:MediaServiceEventHashCode" minOccurs="0"/>
-                <xsd:element ref="ns4:MediaServiceOCR" minOccurs="0"/>
-                <xsd:element ref="ns4:MediaLengthInSeconds" minOccurs="0"/>
-                <xsd:element ref="ns4:MediaServiceAutoKeyPoints" minOccurs="0"/>
-                <xsd:element ref="ns4:MediaServiceKeyPoints" minOccurs="0"/>
-                <xsd:element ref="ns4:_activity" minOccurs="0"/>
-                <xsd:element ref="ns4:MediaServiceObjectDetectorVersions" minOccurs="0"/>
-                <xsd:element ref="ns4:MediaServiceLocation" minOccurs="0"/>
-                <xsd:element ref="ns4:MediaServiceSystemTags" minOccurs="0"/>
-                <xsd:element ref="ns4:MediaServiceSearchProperties" minOccurs="0"/>
-              </xsd:all>
-            </xsd:complexType>
-          </xsd:element>
-        </xsd:sequence>
-      </xsd:complexType>
-    </xsd:element>
-  </xsd:schema>
-  <xsd:schema xmlns:xsd="http://www.w3.org/2001/XMLSchema" xmlns:xs="http://www.w3.org/2001/XMLSchema" xmlns:dms="http://schemas.microsoft.com/office/2006/documentManagement/types" xmlns:pc="http://schemas.microsoft.com/office/infopath/2007/PartnerControls" targetNamespace="ed1181c6-4963-4f9c-a6e4-d7efb21233a0" elementFormDefault="qualified">
-    <xsd:import namespace="http://schemas.microsoft.com/office/2006/documentManagement/types"/>
-    <xsd:import namespace="http://schemas.microsoft.com/office/infopath/2007/PartnerControls"/>
-    <xsd:element name="SharedWithUsers" ma:index="8" nillable="true" ma:displayName="Compartido con" ma:internalName="SharedWithUsers" ma:readOnly="true">
-      <xsd:complexType>
-        <xsd:complexContent>
-          <xsd:extension base="dms:UserMulti">
-            <xsd:sequence>
-              <xsd:element name="UserInfo" minOccurs="0" maxOccurs="unbounded">
-                <xsd:complexType>
-                  <xsd:sequence>
-                    <xsd:element name="DisplayName" type="xsd:string" minOccurs="0"/>
-                    <xsd:element name="AccountId" type="dms:UserId" minOccurs="0" nillable="true"/>
-                    <xsd:element name="AccountType" type="xsd:string" minOccurs="0"/>
-                  </xsd:sequence>
-                </xsd:complexType>
-              </xsd:element>
-            </xsd:sequence>
-          </xsd:extension>
-        </xsd:complexContent>
-      </xsd:complexType>
-    </xsd:element>
-    <xsd:element name="SharedWithDetails" ma:index="9" nillable="true" ma:displayName="Detalles de uso compartido" ma:internalName="SharedWithDetails" ma:readOnly="true">
-      <xsd:simpleType>
-        <xsd:restriction base="dms:Note">
-          <xsd:maxLength value="255"/>
-        </xsd:restriction>
-      </xsd:simpleType>
-    </xsd:element>
-    <xsd:element name="SharingHintHash" ma:index="10" nillable="true" ma:displayName="Hash de la sugerencia para compartir" ma:hidden="true" ma:internalName="SharingHintHash" ma:readOnly="true">
-      <xsd:simpleType>
-        <xsd:restriction base="dms:Text"/>
-      </xsd:simpleType>
-    </xsd:element>
-  </xsd:schema>
-  <xsd:schema xmlns:xsd="http://www.w3.org/2001/XMLSchema" xmlns:xs="http://www.w3.org/2001/XMLSchema" xmlns:dms="http://schemas.microsoft.com/office/2006/documentManagement/types" xmlns:pc="http://schemas.microsoft.com/office/infopath/2007/PartnerControls" targetNamespace="152b35e6-23a1-4beb-a1fd-2689778f6058" elementFormDefault="qualified">
-    <xsd:import namespace="http://schemas.microsoft.com/office/2006/documentManagement/types"/>
-    <xsd:import namespace="http://schemas.microsoft.com/office/infopath/2007/PartnerControls"/>
-    <xsd:element name="MediaServiceMetadata" ma:index="11" nillable="true" ma:displayName="MediaServiceMetadata" ma:hidden="true" ma:internalName="MediaServiceMetadata" ma:readOnly="true">
-      <xsd:simpleType>
-        <xsd:restriction base="dms:Note"/>
-      </xsd:simpleType>
-    </xsd:element>
-    <xsd:element name="MediaServiceFastMetadata" ma:index="12" nillable="true" ma:displayName="MediaServiceFastMetadata" ma:hidden="true" ma:internalName="MediaServiceFastMetadata" ma:readOnly="true">
-      <xsd:simpleType>
-        <xsd:restriction base="dms:Note"/>
-      </xsd:simpleType>
-    </xsd:element>
-    <xsd:element name="MediaServiceDateTaken" ma:index="13" nillable="true" ma:displayName="MediaServiceDateTaken" ma:hidden="true" ma:internalName="MediaServiceDateTaken" ma:readOnly="true">
-      <xsd:simpleType>
-        <xsd:restriction base="dms:Text"/>
-      </xsd:simpleType>
-    </xsd:element>
-    <xsd:element name="MediaServiceAutoTags" ma:index="14" nillable="true" ma:displayName="Tags" ma:internalName="MediaServiceAutoTags" ma:readOnly="true">
-      <xsd:simpleType>
-        <xsd:restriction base="dms:Text"/>
-      </xsd:simpleType>
-    </xsd:element>
-    <xsd:element name="MediaServiceGenerationTime" ma:index="15" nillable="true" ma:displayName="MediaServiceGenerationTime" ma:hidden="true" ma:internalName="MediaServiceGenerationTime" ma:readOnly="true">
-      <xsd:simpleType>
-        <xsd:restriction base="dms:Text"/>
-      </xsd:simpleType>
-    </xsd:element>
-    <xsd:element name="MediaServiceEventHashCode" ma:index="16" nillable="true" ma:displayName="MediaServiceEventHashCode" ma:hidden="true" ma:internalName="MediaServiceEventHashCode" ma:readOnly="true">
-      <xsd:simpleType>
-        <xsd:restriction base="dms:Text"/>
-      </xsd:simpleType>
-    </xsd:element>
-    <xsd:element name="MediaServiceOCR" ma:index="17" nillable="true" ma:displayName="Extracted Text" ma:internalName="MediaServiceOCR" ma:readOnly="true">
-      <xsd:simpleType>
-        <xsd:restriction base="dms:Note">
-          <xsd:maxLength value="255"/>
-        </xsd:restriction>
-      </xsd:simpleType>
-    </xsd:element>
-    <xsd:element name="MediaLengthInSeconds" ma:index="18" nillable="true" ma:displayName="Length (seconds)" ma:internalName="MediaLengthInSeconds" ma:readOnly="true">
-      <xsd:simpleType>
-        <xsd:restriction base="dms:Unknown"/>
-      </xsd:simpleType>
-    </xsd:element>
-    <xsd:element name="MediaServiceAutoKeyPoints" ma:index="19" nillable="true" ma:displayName="MediaServiceAutoKeyPoints" ma:hidden="true" ma:internalName="MediaServiceAutoKeyPoints" ma:readOnly="true">
-      <xsd:simpleType>
-        <xsd:restriction base="dms:Note"/>
-      </xsd:simpleType>
-    </xsd:element>
-    <xsd:element name="MediaServiceKeyPoints" ma:index="20" nillable="true" ma:displayName="KeyPoints" ma:internalName="MediaServiceKeyPoints" ma:readOnly="true">
-      <xsd:simpleType>
-        <xsd:restriction base="dms:Note">
-          <xsd:maxLength value="255"/>
-        </xsd:restriction>
-      </xsd:simpleType>
-    </xsd:element>
-    <xsd:element name="_activity" ma:index="21" nillable="true" ma:displayName="_activity" ma:hidden="true" ma:internalName="_activity">
-      <xsd:simpleType>
-        <xsd:restriction base="dms:Note"/>
-      </xsd:simpleType>
-    </xsd:element>
-    <xsd:element name="MediaServiceObjectDetectorVersions" ma:index="22" nillable="true" ma:displayName="MediaServiceObjectDetectorVersions" ma:hidden="true" ma:indexed="true" ma:internalName="MediaServiceObjectDetectorVersions" ma:readOnly="true">
-      <xsd:simpleType>
-        <xsd:restriction base="dms:Text"/>
-      </xsd:simpleType>
-    </xsd:element>
-    <xsd:element name="MediaServiceLocation" ma:index="23" nillable="true" ma:displayName="Location" ma:indexed="true" ma:internalName="MediaServiceLocation" ma:readOnly="true">
-      <xsd:simpleType>
-        <xsd:restriction base="dms:Text"/>
-      </xsd:simpleType>
-    </xsd:element>
-    <xsd:element name="MediaServiceSystemTags" ma:index="24" nillable="true" ma:displayName="MediaServiceSystemTags" ma:hidden="true" ma:internalName="MediaServiceSystemTags" ma:readOnly="true">
-      <xsd:simpleType>
-        <xsd:restriction base="dms:Note"/>
-      </xsd:simpleType>
-    </xsd:element>
-    <xsd:element name="MediaServiceSearchProperties" ma:index="25" nillable="true" ma:displayName="MediaServiceSearchProperties" ma:hidden="true" ma:internalName="MediaServiceSearchProperties" ma:readOnly="true">
-      <xsd:simpleType>
-        <xsd:restriction base="dms:Note"/>
-      </xsd:simpleType>
-    </xsd:element>
-  </xsd:schema>
-  <xsd:schema xmlns="http://schemas.openxmlformats.org/package/2006/metadata/core-properties" xmlns:xsd="http://www.w3.org/2001/XMLSchema" xmlns:xsi="http://www.w3.org/2001/XMLSchema-instance" xmlns:dc="http://purl.org/dc/elements/1.1/" xmlns:dcterms="http://purl.org/dc/terms/" xmlns:odoc="http://schemas.microsoft.com/internal/obd" targetNamespace="http://schemas.openxmlformats.org/package/2006/metadata/core-properties" elementFormDefault="qualified" attributeFormDefault="unqualified" blockDefault="#all">
-    <xsd:import namespace="http://purl.org/dc/elements/1.1/" schemaLocation="http://dublincore.org/schemas/xmls/qdc/2003/04/02/dc.xsd"/>
-    <xsd:import namespace="http://purl.org/dc/terms/" schemaLocation="http://dublincore.org/schemas/xmls/qdc/2003/04/02/dcterms.xsd"/>
-    <xsd:element name="coreProperties" type="CT_coreProperties"/>
-    <xsd:complexType name="CT_coreProperties">
-      <xsd:all>
-        <xsd:element ref="dc:creator" minOccurs="0" maxOccurs="1"/>
-        <xsd:element ref="dcterms:created" minOccurs="0" maxOccurs="1"/>
-        <xsd:element ref="dc:identifier" minOccurs="0" maxOccurs="1"/>
-        <xsd:element name="contentType" minOccurs="0" maxOccurs="1" type="xsd:string" ma:index="0" ma:displayName="Tipo de contenido"/>
-        <xsd:element ref="dc:title" minOccurs="0" maxOccurs="1" ma:index="4" ma:displayName="Título"/>
-        <xsd:element ref="dc:subject" minOccurs="0" maxOccurs="1"/>
-        <xsd:element ref="dc:description" minOccurs="0" maxOccurs="1"/>
-        <xsd:element name="keywords" minOccurs="0" maxOccurs="1" type="xsd:string"/>
-        <xsd:element ref="dc:language" minOccurs="0" maxOccurs="1"/>
-        <xsd:element name="category" minOccurs="0" maxOccurs="1" type="xsd:string"/>
-        <xsd:element name="version" minOccurs="0" maxOccurs="1" type="xsd:string"/>
-        <xsd:element name="revision" minOccurs="0" maxOccurs="1" type="xsd:string">
-          <xsd:annotation>
-            <xsd:documentation>
-                        This value indicates the number of saves or revisions. The application is responsible for updating this value after each revision.
-                    </xsd:documentation>
-          </xsd:annotation>
-        </xsd:element>
-        <xsd:element name="lastModifiedBy" minOccurs="0" maxOccurs="1" type="xsd:string"/>
-        <xsd:element ref="dcterms:modified" minOccurs="0" maxOccurs="1"/>
-        <xsd:element name="contentStatus" minOccurs="0" maxOccurs="1" type="xsd:string"/>
-      </xsd:all>
-    </xsd:complexType>
-  </xsd:schema>
-  <xs:schema xmlns:pc="http://schemas.microsoft.com/office/infopath/2007/PartnerControls" xmlns:xs="http://www.w3.org/2001/XMLSchema" targetNamespace="http://schemas.microsoft.com/office/infopath/2007/PartnerControls" elementFormDefault="qualified" attributeFormDefault="unqualified">
-    <xs:element name="Person">
-      <xs:complexType>
-        <xs:sequence>
-          <xs:element ref="pc:DisplayName" minOccurs="0"/>
-          <xs:element ref="pc:AccountId" minOccurs="0"/>
-          <xs:element ref="pc:AccountType" minOccurs="0"/>
-        </xs:sequence>
-      </xs:complexType>
-    </xs:element>
-    <xs:element name="DisplayName" type="xs:string"/>
-    <xs:element name="AccountId" type="xs:string"/>
-    <xs:element name="AccountType" type="xs:string"/>
-    <xs:element name="BDCAssociatedEntity">
-      <xs:complexType>
-        <xs:sequence>
-          <xs:element ref="pc:BDCEntity" minOccurs="0" maxOccurs="unbounded"/>
-        </xs:sequence>
-        <xs:attribute ref="pc:EntityNamespace"/>
-        <xs:attribute ref="pc:EntityName"/>
-        <xs:attribute ref="pc:SystemInstanceName"/>
-        <xs:attribute ref="pc:AssociationName"/>
-      </xs:complexType>
-    </xs:element>
-    <xs:attribute name="EntityNamespace" type="xs:string"/>
-    <xs:attribute name="EntityName" type="xs:string"/>
-    <xs:attribute name="SystemInstanceName" type="xs:string"/>
-    <xs:attribute name="AssociationName" type="xs:string"/>
-    <xs:element name="BDCEntity">
-      <xs:complexType>
-        <xs:sequence>
-          <xs:element ref="pc:EntityDisplayName" minOccurs="0"/>
-          <xs:element ref="pc:EntityInstanceReference" minOccurs="0"/>
-          <xs:element ref="pc:EntityId1" minOccurs="0"/>
-          <xs:element ref="pc:EntityId2" minOccurs="0"/>
-          <xs:element ref="pc:EntityId3" minOccurs="0"/>
-          <xs:element ref="pc:EntityId4" minOccurs="0"/>
-          <xs:element ref="pc:EntityId5" minOccurs="0"/>
-        </xs:sequence>
-      </xs:complexType>
-    </xs:element>
-    <xs:element name="EntityDisplayName" type="xs:string"/>
-    <xs:element name="EntityInstanceReference" type="xs:string"/>
-    <xs:element name="EntityId1" type="xs:string"/>
-    <xs:element name="EntityId2" type="xs:string"/>
-    <xs:element name="EntityId3" type="xs:string"/>
-    <xs:element name="EntityId4" type="xs:string"/>
-    <xs:element name="EntityId5" type="xs:string"/>
-    <xs:element name="Terms">
-      <xs:complexType>
-        <xs:sequence>
-          <xs:element ref="pc:TermInfo" minOccurs="0" maxOccurs="unbounded"/>
-        </xs:sequence>
-      </xs:complexType>
-    </xs:element>
-    <xs:element name="TermInfo">
-      <xs:complexType>
-        <xs:sequence>
-          <xs:element ref="pc:TermName" minOccurs="0"/>
-          <xs:element ref="pc:TermId" minOccurs="0"/>
-        </xs:sequence>
-      </xs:complexType>
-    </xs:element>
-    <xs:element name="TermName" type="xs:string"/>
-    <xs:element name="TermId" type="xs:string"/>
-  </xs:schema>
-</ct:contentTypeSchema>
-</file>
-
-<file path=customXml/item2.xml><?xml version="1.0" encoding="utf-8"?>
-<p:properties xmlns:p="http://schemas.microsoft.com/office/2006/metadata/properties" xmlns:xsi="http://www.w3.org/2001/XMLSchema-instance" xmlns:pc="http://schemas.microsoft.com/office/infopath/2007/PartnerControls">
-  <documentManagement>
-    <_activity xmlns="152b35e6-23a1-4beb-a1fd-2689778f6058" xsi:nil="true"/>
-  </documentManagement>
-</p:properties>
-</file>
-
-<file path=customXml/item3.xml><?xml version="1.0" encoding="utf-8"?>
-<?mso-contentType ?>
-<FormTemplates xmlns="http://schemas.microsoft.com/sharepoint/v3/contenttype/forms">
-  <Display>DocumentLibraryForm</Display>
-  <Edit>DocumentLibraryForm</Edit>
-  <New>DocumentLibraryForm</New>
-</FormTemplates>
-</file>
-
-<file path=customXml/item4.xml><?xml version="1.0" encoding="utf-8"?>
 <b:Sources xmlns:b="http://schemas.openxmlformats.org/officeDocument/2006/bibliography" xmlns="http://schemas.openxmlformats.org/officeDocument/2006/bibliography" SelectedStyle="\APASixthEditionOfficeOnline.xsl" StyleName="APA" Version="6">
   <b:Source>
     <b:Tag>Men90</b:Tag>
@@ -35037,7 +34744,303 @@
 </b:Sources>
 </file>
 
+<file path=customXml/item2.xml><?xml version="1.0" encoding="utf-8"?>
+<?mso-contentType ?>
+<FormTemplates xmlns="http://schemas.microsoft.com/sharepoint/v3/contenttype/forms">
+  <Display>DocumentLibraryForm</Display>
+  <Edit>DocumentLibraryForm</Edit>
+  <New>DocumentLibraryForm</New>
+</FormTemplates>
+</file>
+
+<file path=customXml/item3.xml><?xml version="1.0" encoding="utf-8"?>
+<p:properties xmlns:p="http://schemas.microsoft.com/office/2006/metadata/properties" xmlns:xsi="http://www.w3.org/2001/XMLSchema-instance" xmlns:pc="http://schemas.microsoft.com/office/infopath/2007/PartnerControls">
+  <documentManagement>
+    <_activity xmlns="152b35e6-23a1-4beb-a1fd-2689778f6058" xsi:nil="true"/>
+  </documentManagement>
+</p:properties>
+</file>
+
+<file path=customXml/item4.xml><?xml version="1.0" encoding="utf-8"?>
+<ct:contentTypeSchema xmlns:ct="http://schemas.microsoft.com/office/2006/metadata/contentType" xmlns:ma="http://schemas.microsoft.com/office/2006/metadata/properties/metaAttributes" ct:_="" ma:_="" ma:contentTypeName="Documento" ma:contentTypeID="0x01010015BDB27AF1A6EC4C99611A7AD03A3206" ma:contentTypeVersion="18" ma:contentTypeDescription="Crear nuevo documento." ma:contentTypeScope="" ma:versionID="56de9a8de695fa7f309cf2eb59d05ef4">
+  <xsd:schema xmlns:xsd="http://www.w3.org/2001/XMLSchema" xmlns:xs="http://www.w3.org/2001/XMLSchema" xmlns:p="http://schemas.microsoft.com/office/2006/metadata/properties" xmlns:ns3="ed1181c6-4963-4f9c-a6e4-d7efb21233a0" xmlns:ns4="152b35e6-23a1-4beb-a1fd-2689778f6058" targetNamespace="http://schemas.microsoft.com/office/2006/metadata/properties" ma:root="true" ma:fieldsID="cae7528616b6d30ad4c29b83143ea2c0" ns3:_="" ns4:_="">
+    <xsd:import namespace="ed1181c6-4963-4f9c-a6e4-d7efb21233a0"/>
+    <xsd:import namespace="152b35e6-23a1-4beb-a1fd-2689778f6058"/>
+    <xsd:element name="properties">
+      <xsd:complexType>
+        <xsd:sequence>
+          <xsd:element name="documentManagement">
+            <xsd:complexType>
+              <xsd:all>
+                <xsd:element ref="ns3:SharedWithUsers" minOccurs="0"/>
+                <xsd:element ref="ns3:SharedWithDetails" minOccurs="0"/>
+                <xsd:element ref="ns3:SharingHintHash" minOccurs="0"/>
+                <xsd:element ref="ns4:MediaServiceMetadata" minOccurs="0"/>
+                <xsd:element ref="ns4:MediaServiceFastMetadata" minOccurs="0"/>
+                <xsd:element ref="ns4:MediaServiceDateTaken" minOccurs="0"/>
+                <xsd:element ref="ns4:MediaServiceAutoTags" minOccurs="0"/>
+                <xsd:element ref="ns4:MediaServiceGenerationTime" minOccurs="0"/>
+                <xsd:element ref="ns4:MediaServiceEventHashCode" minOccurs="0"/>
+                <xsd:element ref="ns4:MediaServiceOCR" minOccurs="0"/>
+                <xsd:element ref="ns4:MediaLengthInSeconds" minOccurs="0"/>
+                <xsd:element ref="ns4:MediaServiceAutoKeyPoints" minOccurs="0"/>
+                <xsd:element ref="ns4:MediaServiceKeyPoints" minOccurs="0"/>
+                <xsd:element ref="ns4:_activity" minOccurs="0"/>
+                <xsd:element ref="ns4:MediaServiceObjectDetectorVersions" minOccurs="0"/>
+                <xsd:element ref="ns4:MediaServiceLocation" minOccurs="0"/>
+                <xsd:element ref="ns4:MediaServiceSystemTags" minOccurs="0"/>
+                <xsd:element ref="ns4:MediaServiceSearchProperties" minOccurs="0"/>
+              </xsd:all>
+            </xsd:complexType>
+          </xsd:element>
+        </xsd:sequence>
+      </xsd:complexType>
+    </xsd:element>
+  </xsd:schema>
+  <xsd:schema xmlns:xsd="http://www.w3.org/2001/XMLSchema" xmlns:xs="http://www.w3.org/2001/XMLSchema" xmlns:dms="http://schemas.microsoft.com/office/2006/documentManagement/types" xmlns:pc="http://schemas.microsoft.com/office/infopath/2007/PartnerControls" targetNamespace="ed1181c6-4963-4f9c-a6e4-d7efb21233a0" elementFormDefault="qualified">
+    <xsd:import namespace="http://schemas.microsoft.com/office/2006/documentManagement/types"/>
+    <xsd:import namespace="http://schemas.microsoft.com/office/infopath/2007/PartnerControls"/>
+    <xsd:element name="SharedWithUsers" ma:index="8" nillable="true" ma:displayName="Compartido con" ma:internalName="SharedWithUsers" ma:readOnly="true">
+      <xsd:complexType>
+        <xsd:complexContent>
+          <xsd:extension base="dms:UserMulti">
+            <xsd:sequence>
+              <xsd:element name="UserInfo" minOccurs="0" maxOccurs="unbounded">
+                <xsd:complexType>
+                  <xsd:sequence>
+                    <xsd:element name="DisplayName" type="xsd:string" minOccurs="0"/>
+                    <xsd:element name="AccountId" type="dms:UserId" minOccurs="0" nillable="true"/>
+                    <xsd:element name="AccountType" type="xsd:string" minOccurs="0"/>
+                  </xsd:sequence>
+                </xsd:complexType>
+              </xsd:element>
+            </xsd:sequence>
+          </xsd:extension>
+        </xsd:complexContent>
+      </xsd:complexType>
+    </xsd:element>
+    <xsd:element name="SharedWithDetails" ma:index="9" nillable="true" ma:displayName="Detalles de uso compartido" ma:internalName="SharedWithDetails" ma:readOnly="true">
+      <xsd:simpleType>
+        <xsd:restriction base="dms:Note">
+          <xsd:maxLength value="255"/>
+        </xsd:restriction>
+      </xsd:simpleType>
+    </xsd:element>
+    <xsd:element name="SharingHintHash" ma:index="10" nillable="true" ma:displayName="Hash de la sugerencia para compartir" ma:hidden="true" ma:internalName="SharingHintHash" ma:readOnly="true">
+      <xsd:simpleType>
+        <xsd:restriction base="dms:Text"/>
+      </xsd:simpleType>
+    </xsd:element>
+  </xsd:schema>
+  <xsd:schema xmlns:xsd="http://www.w3.org/2001/XMLSchema" xmlns:xs="http://www.w3.org/2001/XMLSchema" xmlns:dms="http://schemas.microsoft.com/office/2006/documentManagement/types" xmlns:pc="http://schemas.microsoft.com/office/infopath/2007/PartnerControls" targetNamespace="152b35e6-23a1-4beb-a1fd-2689778f6058" elementFormDefault="qualified">
+    <xsd:import namespace="http://schemas.microsoft.com/office/2006/documentManagement/types"/>
+    <xsd:import namespace="http://schemas.microsoft.com/office/infopath/2007/PartnerControls"/>
+    <xsd:element name="MediaServiceMetadata" ma:index="11" nillable="true" ma:displayName="MediaServiceMetadata" ma:hidden="true" ma:internalName="MediaServiceMetadata" ma:readOnly="true">
+      <xsd:simpleType>
+        <xsd:restriction base="dms:Note"/>
+      </xsd:simpleType>
+    </xsd:element>
+    <xsd:element name="MediaServiceFastMetadata" ma:index="12" nillable="true" ma:displayName="MediaServiceFastMetadata" ma:hidden="true" ma:internalName="MediaServiceFastMetadata" ma:readOnly="true">
+      <xsd:simpleType>
+        <xsd:restriction base="dms:Note"/>
+      </xsd:simpleType>
+    </xsd:element>
+    <xsd:element name="MediaServiceDateTaken" ma:index="13" nillable="true" ma:displayName="MediaServiceDateTaken" ma:hidden="true" ma:internalName="MediaServiceDateTaken" ma:readOnly="true">
+      <xsd:simpleType>
+        <xsd:restriction base="dms:Text"/>
+      </xsd:simpleType>
+    </xsd:element>
+    <xsd:element name="MediaServiceAutoTags" ma:index="14" nillable="true" ma:displayName="Tags" ma:internalName="MediaServiceAutoTags" ma:readOnly="true">
+      <xsd:simpleType>
+        <xsd:restriction base="dms:Text"/>
+      </xsd:simpleType>
+    </xsd:element>
+    <xsd:element name="MediaServiceGenerationTime" ma:index="15" nillable="true" ma:displayName="MediaServiceGenerationTime" ma:hidden="true" ma:internalName="MediaServiceGenerationTime" ma:readOnly="true">
+      <xsd:simpleType>
+        <xsd:restriction base="dms:Text"/>
+      </xsd:simpleType>
+    </xsd:element>
+    <xsd:element name="MediaServiceEventHashCode" ma:index="16" nillable="true" ma:displayName="MediaServiceEventHashCode" ma:hidden="true" ma:internalName="MediaServiceEventHashCode" ma:readOnly="true">
+      <xsd:simpleType>
+        <xsd:restriction base="dms:Text"/>
+      </xsd:simpleType>
+    </xsd:element>
+    <xsd:element name="MediaServiceOCR" ma:index="17" nillable="true" ma:displayName="Extracted Text" ma:internalName="MediaServiceOCR" ma:readOnly="true">
+      <xsd:simpleType>
+        <xsd:restriction base="dms:Note">
+          <xsd:maxLength value="255"/>
+        </xsd:restriction>
+      </xsd:simpleType>
+    </xsd:element>
+    <xsd:element name="MediaLengthInSeconds" ma:index="18" nillable="true" ma:displayName="Length (seconds)" ma:internalName="MediaLengthInSeconds" ma:readOnly="true">
+      <xsd:simpleType>
+        <xsd:restriction base="dms:Unknown"/>
+      </xsd:simpleType>
+    </xsd:element>
+    <xsd:element name="MediaServiceAutoKeyPoints" ma:index="19" nillable="true" ma:displayName="MediaServiceAutoKeyPoints" ma:hidden="true" ma:internalName="MediaServiceAutoKeyPoints" ma:readOnly="true">
+      <xsd:simpleType>
+        <xsd:restriction base="dms:Note"/>
+      </xsd:simpleType>
+    </xsd:element>
+    <xsd:element name="MediaServiceKeyPoints" ma:index="20" nillable="true" ma:displayName="KeyPoints" ma:internalName="MediaServiceKeyPoints" ma:readOnly="true">
+      <xsd:simpleType>
+        <xsd:restriction base="dms:Note">
+          <xsd:maxLength value="255"/>
+        </xsd:restriction>
+      </xsd:simpleType>
+    </xsd:element>
+    <xsd:element name="_activity" ma:index="21" nillable="true" ma:displayName="_activity" ma:hidden="true" ma:internalName="_activity">
+      <xsd:simpleType>
+        <xsd:restriction base="dms:Note"/>
+      </xsd:simpleType>
+    </xsd:element>
+    <xsd:element name="MediaServiceObjectDetectorVersions" ma:index="22" nillable="true" ma:displayName="MediaServiceObjectDetectorVersions" ma:hidden="true" ma:indexed="true" ma:internalName="MediaServiceObjectDetectorVersions" ma:readOnly="true">
+      <xsd:simpleType>
+        <xsd:restriction base="dms:Text"/>
+      </xsd:simpleType>
+    </xsd:element>
+    <xsd:element name="MediaServiceLocation" ma:index="23" nillable="true" ma:displayName="Location" ma:indexed="true" ma:internalName="MediaServiceLocation" ma:readOnly="true">
+      <xsd:simpleType>
+        <xsd:restriction base="dms:Text"/>
+      </xsd:simpleType>
+    </xsd:element>
+    <xsd:element name="MediaServiceSystemTags" ma:index="24" nillable="true" ma:displayName="MediaServiceSystemTags" ma:hidden="true" ma:internalName="MediaServiceSystemTags" ma:readOnly="true">
+      <xsd:simpleType>
+        <xsd:restriction base="dms:Note"/>
+      </xsd:simpleType>
+    </xsd:element>
+    <xsd:element name="MediaServiceSearchProperties" ma:index="25" nillable="true" ma:displayName="MediaServiceSearchProperties" ma:hidden="true" ma:internalName="MediaServiceSearchProperties" ma:readOnly="true">
+      <xsd:simpleType>
+        <xsd:restriction base="dms:Note"/>
+      </xsd:simpleType>
+    </xsd:element>
+  </xsd:schema>
+  <xsd:schema xmlns="http://schemas.openxmlformats.org/package/2006/metadata/core-properties" xmlns:xsd="http://www.w3.org/2001/XMLSchema" xmlns:xsi="http://www.w3.org/2001/XMLSchema-instance" xmlns:dc="http://purl.org/dc/elements/1.1/" xmlns:dcterms="http://purl.org/dc/terms/" xmlns:odoc="http://schemas.microsoft.com/internal/obd" targetNamespace="http://schemas.openxmlformats.org/package/2006/metadata/core-properties" elementFormDefault="qualified" attributeFormDefault="unqualified" blockDefault="#all">
+    <xsd:import namespace="http://purl.org/dc/elements/1.1/" schemaLocation="http://dublincore.org/schemas/xmls/qdc/2003/04/02/dc.xsd"/>
+    <xsd:import namespace="http://purl.org/dc/terms/" schemaLocation="http://dublincore.org/schemas/xmls/qdc/2003/04/02/dcterms.xsd"/>
+    <xsd:element name="coreProperties" type="CT_coreProperties"/>
+    <xsd:complexType name="CT_coreProperties">
+      <xsd:all>
+        <xsd:element ref="dc:creator" minOccurs="0" maxOccurs="1"/>
+        <xsd:element ref="dcterms:created" minOccurs="0" maxOccurs="1"/>
+        <xsd:element ref="dc:identifier" minOccurs="0" maxOccurs="1"/>
+        <xsd:element name="contentType" minOccurs="0" maxOccurs="1" type="xsd:string" ma:index="0" ma:displayName="Tipo de contenido"/>
+        <xsd:element ref="dc:title" minOccurs="0" maxOccurs="1" ma:index="4" ma:displayName="Título"/>
+        <xsd:element ref="dc:subject" minOccurs="0" maxOccurs="1"/>
+        <xsd:element ref="dc:description" minOccurs="0" maxOccurs="1"/>
+        <xsd:element name="keywords" minOccurs="0" maxOccurs="1" type="xsd:string"/>
+        <xsd:element ref="dc:language" minOccurs="0" maxOccurs="1"/>
+        <xsd:element name="category" minOccurs="0" maxOccurs="1" type="xsd:string"/>
+        <xsd:element name="version" minOccurs="0" maxOccurs="1" type="xsd:string"/>
+        <xsd:element name="revision" minOccurs="0" maxOccurs="1" type="xsd:string">
+          <xsd:annotation>
+            <xsd:documentation>
+                        This value indicates the number of saves or revisions. The application is responsible for updating this value after each revision.
+                    </xsd:documentation>
+          </xsd:annotation>
+        </xsd:element>
+        <xsd:element name="lastModifiedBy" minOccurs="0" maxOccurs="1" type="xsd:string"/>
+        <xsd:element ref="dcterms:modified" minOccurs="0" maxOccurs="1"/>
+        <xsd:element name="contentStatus" minOccurs="0" maxOccurs="1" type="xsd:string"/>
+      </xsd:all>
+    </xsd:complexType>
+  </xsd:schema>
+  <xs:schema xmlns:pc="http://schemas.microsoft.com/office/infopath/2007/PartnerControls" xmlns:xs="http://www.w3.org/2001/XMLSchema" targetNamespace="http://schemas.microsoft.com/office/infopath/2007/PartnerControls" elementFormDefault="qualified" attributeFormDefault="unqualified">
+    <xs:element name="Person">
+      <xs:complexType>
+        <xs:sequence>
+          <xs:element ref="pc:DisplayName" minOccurs="0"/>
+          <xs:element ref="pc:AccountId" minOccurs="0"/>
+          <xs:element ref="pc:AccountType" minOccurs="0"/>
+        </xs:sequence>
+      </xs:complexType>
+    </xs:element>
+    <xs:element name="DisplayName" type="xs:string"/>
+    <xs:element name="AccountId" type="xs:string"/>
+    <xs:element name="AccountType" type="xs:string"/>
+    <xs:element name="BDCAssociatedEntity">
+      <xs:complexType>
+        <xs:sequence>
+          <xs:element ref="pc:BDCEntity" minOccurs="0" maxOccurs="unbounded"/>
+        </xs:sequence>
+        <xs:attribute ref="pc:EntityNamespace"/>
+        <xs:attribute ref="pc:EntityName"/>
+        <xs:attribute ref="pc:SystemInstanceName"/>
+        <xs:attribute ref="pc:AssociationName"/>
+      </xs:complexType>
+    </xs:element>
+    <xs:attribute name="EntityNamespace" type="xs:string"/>
+    <xs:attribute name="EntityName" type="xs:string"/>
+    <xs:attribute name="SystemInstanceName" type="xs:string"/>
+    <xs:attribute name="AssociationName" type="xs:string"/>
+    <xs:element name="BDCEntity">
+      <xs:complexType>
+        <xs:sequence>
+          <xs:element ref="pc:EntityDisplayName" minOccurs="0"/>
+          <xs:element ref="pc:EntityInstanceReference" minOccurs="0"/>
+          <xs:element ref="pc:EntityId1" minOccurs="0"/>
+          <xs:element ref="pc:EntityId2" minOccurs="0"/>
+          <xs:element ref="pc:EntityId3" minOccurs="0"/>
+          <xs:element ref="pc:EntityId4" minOccurs="0"/>
+          <xs:element ref="pc:EntityId5" minOccurs="0"/>
+        </xs:sequence>
+      </xs:complexType>
+    </xs:element>
+    <xs:element name="EntityDisplayName" type="xs:string"/>
+    <xs:element name="EntityInstanceReference" type="xs:string"/>
+    <xs:element name="EntityId1" type="xs:string"/>
+    <xs:element name="EntityId2" type="xs:string"/>
+    <xs:element name="EntityId3" type="xs:string"/>
+    <xs:element name="EntityId4" type="xs:string"/>
+    <xs:element name="EntityId5" type="xs:string"/>
+    <xs:element name="Terms">
+      <xs:complexType>
+        <xs:sequence>
+          <xs:element ref="pc:TermInfo" minOccurs="0" maxOccurs="unbounded"/>
+        </xs:sequence>
+      </xs:complexType>
+    </xs:element>
+    <xs:element name="TermInfo">
+      <xs:complexType>
+        <xs:sequence>
+          <xs:element ref="pc:TermName" minOccurs="0"/>
+          <xs:element ref="pc:TermId" minOccurs="0"/>
+        </xs:sequence>
+      </xs:complexType>
+    </xs:element>
+    <xs:element name="TermName" type="xs:string"/>
+    <xs:element name="TermId" type="xs:string"/>
+  </xs:schema>
+</ct:contentTypeSchema>
+</file>
+
 <file path=customXml/itemProps1.xml><?xml version="1.0" encoding="utf-8"?>
+<ds:datastoreItem xmlns:ds="http://schemas.openxmlformats.org/officeDocument/2006/customXml" ds:itemID="{5536E029-DFBE-4035-BD65-6D509AFD34FF}">
+  <ds:schemaRefs>
+    <ds:schemaRef ds:uri="http://schemas.openxmlformats.org/officeDocument/2006/bibliography"/>
+  </ds:schemaRefs>
+</ds:datastoreItem>
+</file>
+
+<file path=customXml/itemProps2.xml><?xml version="1.0" encoding="utf-8"?>
+<ds:datastoreItem xmlns:ds="http://schemas.openxmlformats.org/officeDocument/2006/customXml" ds:itemID="{7F74FD34-EBDF-4094-A9AD-E46225785B9A}">
+  <ds:schemaRefs>
+    <ds:schemaRef ds:uri="http://schemas.microsoft.com/sharepoint/v3/contenttype/forms"/>
+  </ds:schemaRefs>
+</ds:datastoreItem>
+</file>
+
+<file path=customXml/itemProps3.xml><?xml version="1.0" encoding="utf-8"?>
+<ds:datastoreItem xmlns:ds="http://schemas.openxmlformats.org/officeDocument/2006/customXml" ds:itemID="{B58D4DAF-C7F0-4FA3-950B-89D41305B414}">
+  <ds:schemaRefs>
+    <ds:schemaRef ds:uri="http://schemas.microsoft.com/office/2006/metadata/properties"/>
+    <ds:schemaRef ds:uri="http://schemas.microsoft.com/office/infopath/2007/PartnerControls"/>
+    <ds:schemaRef ds:uri="152b35e6-23a1-4beb-a1fd-2689778f6058"/>
+  </ds:schemaRefs>
+</ds:datastoreItem>
+</file>
+
+<file path=customXml/itemProps4.xml><?xml version="1.0" encoding="utf-8"?>
 <ds:datastoreItem xmlns:ds="http://schemas.openxmlformats.org/officeDocument/2006/customXml" ds:itemID="{71334E21-6B6C-4687-847F-D6F99FF4EBD6}">
   <ds:schemaRefs>
     <ds:schemaRef ds:uri="http://schemas.microsoft.com/office/2006/metadata/contentType"/>
@@ -35054,30 +35057,4 @@
     <ds:schemaRef ds:uri="http://schemas.microsoft.com/internal/obd"/>
   </ds:schemaRefs>
 </ds:datastoreItem>
-</file>
-
-<file path=customXml/itemProps2.xml><?xml version="1.0" encoding="utf-8"?>
-<ds:datastoreItem xmlns:ds="http://schemas.openxmlformats.org/officeDocument/2006/customXml" ds:itemID="{B58D4DAF-C7F0-4FA3-950B-89D41305B414}">
-  <ds:schemaRefs>
-    <ds:schemaRef ds:uri="http://schemas.microsoft.com/office/2006/metadata/properties"/>
-    <ds:schemaRef ds:uri="http://schemas.microsoft.com/office/infopath/2007/PartnerControls"/>
-    <ds:schemaRef ds:uri="152b35e6-23a1-4beb-a1fd-2689778f6058"/>
-  </ds:schemaRefs>
-</ds:datastoreItem>
-</file>
-
-<file path=customXml/itemProps3.xml><?xml version="1.0" encoding="utf-8"?>
-<ds:datastoreItem xmlns:ds="http://schemas.openxmlformats.org/officeDocument/2006/customXml" ds:itemID="{7F74FD34-EBDF-4094-A9AD-E46225785B9A}">
-  <ds:schemaRefs>
-    <ds:schemaRef ds:uri="http://schemas.microsoft.com/sharepoint/v3/contenttype/forms"/>
-  </ds:schemaRefs>
-</ds:datastoreItem>
-</file>
-
-<file path=customXml/itemProps4.xml><?xml version="1.0" encoding="utf-8"?>
-<ds:datastoreItem xmlns:ds="http://schemas.openxmlformats.org/officeDocument/2006/customXml" ds:itemID="{5536E029-DFBE-4035-BD65-6D509AFD34FF}">
-  <ds:schemaRefs>
-    <ds:schemaRef ds:uri="http://schemas.openxmlformats.org/officeDocument/2006/bibliography"/>
-  </ds:schemaRefs>
-</ds:datastoreItem>
 </file>
</xml_diff>

<commit_message>
Creación de gráficos resultados OBJ1
</commit_message>
<xml_diff>
--- a/Formato Proyecto Investigación.docx
+++ b/Formato Proyecto Investigación.docx
@@ -8513,27 +8513,14 @@
                             <w:r>
                               <w:t xml:space="preserve">Figura </w:t>
                             </w:r>
-                            <w:r>
-                              <w:fldChar w:fldCharType="begin"/>
-                            </w:r>
-                            <w:r>
-                              <w:instrText xml:space="preserve"> SEQ Figura \* ARABIC </w:instrText>
-                            </w:r>
-                            <w:r>
-                              <w:fldChar w:fldCharType="separate"/>
-                            </w:r>
-                            <w:r>
-                              <w:rPr>
-                                <w:noProof/>
-                              </w:rPr>
-                              <w:t>1</w:t>
-                            </w:r>
-                            <w:r>
-                              <w:rPr>
-                                <w:noProof/>
-                              </w:rPr>
-                              <w:fldChar w:fldCharType="end"/>
-                            </w:r>
+                            <w:fldSimple w:instr=" SEQ Figura \* ARABIC ">
+                              <w:r>
+                                <w:rPr>
+                                  <w:noProof/>
+                                </w:rPr>
+                                <w:t>1</w:t>
+                              </w:r>
+                            </w:fldSimple>
                             <w:r>
                               <w:t xml:space="preserve">. </w:t>
                             </w:r>
@@ -8582,27 +8569,14 @@
                       <w:r>
                         <w:t xml:space="preserve">Figura </w:t>
                       </w:r>
-                      <w:r>
-                        <w:fldChar w:fldCharType="begin"/>
-                      </w:r>
-                      <w:r>
-                        <w:instrText xml:space="preserve"> SEQ Figura \* ARABIC </w:instrText>
-                      </w:r>
-                      <w:r>
-                        <w:fldChar w:fldCharType="separate"/>
-                      </w:r>
-                      <w:r>
-                        <w:rPr>
-                          <w:noProof/>
-                        </w:rPr>
-                        <w:t>1</w:t>
-                      </w:r>
-                      <w:r>
-                        <w:rPr>
-                          <w:noProof/>
-                        </w:rPr>
-                        <w:fldChar w:fldCharType="end"/>
-                      </w:r>
+                      <w:fldSimple w:instr=" SEQ Figura \* ARABIC ">
+                        <w:r>
+                          <w:rPr>
+                            <w:noProof/>
+                          </w:rPr>
+                          <w:t>1</w:t>
+                        </w:r>
+                      </w:fldSimple>
                       <w:r>
                         <w:t xml:space="preserve">. </w:t>
                       </w:r>
@@ -16863,27 +16837,14 @@
       <w:r>
         <w:t xml:space="preserve">Tabla </w:t>
       </w:r>
-      <w:r>
-        <w:fldChar w:fldCharType="begin"/>
-      </w:r>
-      <w:r>
-        <w:instrText xml:space="preserve"> SEQ Tabla \* ARABIC </w:instrText>
-      </w:r>
-      <w:r>
-        <w:fldChar w:fldCharType="separate"/>
-      </w:r>
-      <w:r>
-        <w:rPr>
-          <w:noProof/>
-        </w:rPr>
-        <w:t>1</w:t>
-      </w:r>
-      <w:r>
-        <w:rPr>
-          <w:noProof/>
-        </w:rPr>
-        <w:fldChar w:fldCharType="end"/>
-      </w:r>
+      <w:fldSimple w:instr=" SEQ Tabla \* ARABIC ">
+        <w:r>
+          <w:rPr>
+            <w:noProof/>
+          </w:rPr>
+          <w:t>1</w:t>
+        </w:r>
+      </w:fldSimple>
       <w:r>
         <w:t xml:space="preserve"> </w:t>
       </w:r>
@@ -18375,34 +18336,7 @@
             <w:rPr>
               <w:rFonts w:ascii="Cambria Math" w:eastAsiaTheme="minorEastAsia" w:hAnsi="Cambria Math"/>
             </w:rPr>
-            <m:t xml:space="preserve">  </m:t>
-          </m:r>
-          <m:r>
-            <m:rPr>
-              <m:sty m:val="bi"/>
-            </m:rPr>
-            <w:rPr>
-              <w:rFonts w:ascii="Cambria Math" w:eastAsiaTheme="minorEastAsia" w:hAnsi="Cambria Math"/>
-            </w:rPr>
-            <m:t>(1</m:t>
-          </m:r>
-          <m:r>
-            <m:rPr>
-              <m:sty m:val="bi"/>
-            </m:rPr>
-            <w:rPr>
-              <w:rFonts w:ascii="Cambria Math" w:eastAsiaTheme="minorEastAsia" w:hAnsi="Cambria Math"/>
-            </w:rPr>
-            <m:t>1</m:t>
-          </m:r>
-          <m:r>
-            <m:rPr>
-              <m:sty m:val="bi"/>
-            </m:rPr>
-            <w:rPr>
-              <w:rFonts w:ascii="Cambria Math" w:eastAsiaTheme="minorEastAsia" w:hAnsi="Cambria Math"/>
-            </w:rPr>
-            <m:t>)</m:t>
+            <m:t xml:space="preserve">  (11)</m:t>
           </m:r>
         </m:oMath>
       </m:oMathPara>
@@ -19041,27 +18975,14 @@
       <w:r>
         <w:t xml:space="preserve">Tabla </w:t>
       </w:r>
-      <w:r>
-        <w:fldChar w:fldCharType="begin"/>
-      </w:r>
-      <w:r>
-        <w:instrText xml:space="preserve"> SEQ Tabla \* ARABIC </w:instrText>
-      </w:r>
-      <w:r>
-        <w:fldChar w:fldCharType="separate"/>
-      </w:r>
-      <w:r>
-        <w:rPr>
-          <w:noProof/>
-        </w:rPr>
-        <w:t>2</w:t>
-      </w:r>
-      <w:r>
-        <w:rPr>
-          <w:noProof/>
-        </w:rPr>
-        <w:fldChar w:fldCharType="end"/>
-      </w:r>
+      <w:fldSimple w:instr=" SEQ Tabla \* ARABIC ">
+        <w:r>
+          <w:rPr>
+            <w:noProof/>
+          </w:rPr>
+          <w:t>2</w:t>
+        </w:r>
+      </w:fldSimple>
       <w:r>
         <w:t xml:space="preserve">. </w:t>
       </w:r>
@@ -21017,27 +20938,14 @@
       <w:r>
         <w:t xml:space="preserve">Figura </w:t>
       </w:r>
-      <w:r>
-        <w:fldChar w:fldCharType="begin"/>
-      </w:r>
-      <w:r>
-        <w:instrText xml:space="preserve"> SEQ Figura \* ARABIC </w:instrText>
-      </w:r>
-      <w:r>
-        <w:fldChar w:fldCharType="separate"/>
-      </w:r>
-      <w:r>
-        <w:rPr>
-          <w:noProof/>
-        </w:rPr>
-        <w:t>2</w:t>
-      </w:r>
-      <w:r>
-        <w:rPr>
-          <w:noProof/>
-        </w:rPr>
-        <w:fldChar w:fldCharType="end"/>
-      </w:r>
+      <w:fldSimple w:instr=" SEQ Figura \* ARABIC ">
+        <w:r>
+          <w:rPr>
+            <w:noProof/>
+          </w:rPr>
+          <w:t>2</w:t>
+        </w:r>
+      </w:fldSimple>
       <w:r>
         <w:t xml:space="preserve"> </w:t>
       </w:r>
@@ -21244,14 +21152,7 @@
           <w:rFonts w:cs="Times New Roman"/>
           <w:szCs w:val="24"/>
         </w:rPr>
-        <w:t xml:space="preserve"> identificación de los sistemas implementados actualmente</w:t>
-      </w:r>
-      <w:r>
-        <w:rPr>
-          <w:rFonts w:cs="Times New Roman"/>
-          <w:szCs w:val="24"/>
-        </w:rPr>
-        <w:t xml:space="preserve"> y la necesidad de integración de sistemas eficientes enfocados en la gestión bibliotecaria</w:t>
+        <w:t xml:space="preserve"> identificación de los sistemas implementados actualmente y la necesidad de integración de sistemas eficientes enfocados en la gestión bibliotecaria</w:t>
       </w:r>
       <w:r>
         <w:rPr>
@@ -21689,24 +21590,14 @@
       <w:r>
         <w:t xml:space="preserve">Tabla </w:t>
       </w:r>
-      <w:r>
-        <w:fldChar w:fldCharType="begin"/>
-      </w:r>
-      <w:r>
-        <w:instrText xml:space="preserve"> SEQ Tabla \* ARABIC </w:instrText>
-      </w:r>
-      <w:r>
-        <w:fldChar w:fldCharType="separate"/>
-      </w:r>
-      <w:r>
-        <w:rPr>
-          <w:noProof/>
-        </w:rPr>
-        <w:t>3</w:t>
-      </w:r>
-      <w:r>
-        <w:fldChar w:fldCharType="end"/>
-      </w:r>
+      <w:fldSimple w:instr=" SEQ Tabla \* ARABIC ">
+        <w:r>
+          <w:rPr>
+            <w:noProof/>
+          </w:rPr>
+          <w:t>3</w:t>
+        </w:r>
+      </w:fldSimple>
       <w:r>
         <w:t xml:space="preserve"> </w:t>
       </w:r>
@@ -22169,24 +22060,14 @@
       <w:r>
         <w:t xml:space="preserve">Tabla </w:t>
       </w:r>
-      <w:r>
-        <w:fldChar w:fldCharType="begin"/>
-      </w:r>
-      <w:r>
-        <w:instrText xml:space="preserve"> SEQ Tabla \* ARABIC </w:instrText>
-      </w:r>
-      <w:r>
-        <w:fldChar w:fldCharType="separate"/>
-      </w:r>
-      <w:r>
-        <w:rPr>
-          <w:noProof/>
-        </w:rPr>
-        <w:t>4</w:t>
-      </w:r>
-      <w:r>
-        <w:fldChar w:fldCharType="end"/>
-      </w:r>
+      <w:fldSimple w:instr=" SEQ Tabla \* ARABIC ">
+        <w:r>
+          <w:rPr>
+            <w:noProof/>
+          </w:rPr>
+          <w:t>4</w:t>
+        </w:r>
+      </w:fldSimple>
       <w:r>
         <w:t xml:space="preserve"> </w:t>
       </w:r>
@@ -22342,28 +22223,7 @@
                 <w:rFonts w:cs="Times New Roman"/>
                 <w:szCs w:val="24"/>
               </w:rPr>
-              <w:t xml:space="preserve">Registro </w:t>
-            </w:r>
-            <w:r>
-              <w:rPr>
-                <w:rFonts w:cs="Times New Roman"/>
-                <w:szCs w:val="24"/>
-              </w:rPr>
-              <w:t>manual / Código de barras</w:t>
-            </w:r>
-            <w:r>
-              <w:rPr>
-                <w:rFonts w:cs="Times New Roman"/>
-                <w:szCs w:val="24"/>
-              </w:rPr>
-              <w:t xml:space="preserve"> + Software </w:t>
-            </w:r>
-            <w:r>
-              <w:rPr>
-                <w:rFonts w:cs="Times New Roman"/>
-                <w:szCs w:val="24"/>
-              </w:rPr>
-              <w:t>Janium</w:t>
+              <w:t>Registro manual / Código de barras + Software Janium</w:t>
             </w:r>
           </w:p>
         </w:tc>
@@ -22506,14 +22366,7 @@
                 <w:rFonts w:cs="Times New Roman"/>
                 <w:szCs w:val="24"/>
               </w:rPr>
-              <w:t xml:space="preserve">Conteo </w:t>
-            </w:r>
-            <w:r>
-              <w:rPr>
-                <w:rFonts w:cs="Times New Roman"/>
-                <w:szCs w:val="24"/>
-              </w:rPr>
-              <w:t>físico</w:t>
+              <w:t>Conteo físico</w:t>
             </w:r>
           </w:p>
         </w:tc>
@@ -22630,24 +22483,14 @@
       <w:r>
         <w:t xml:space="preserve">Tabla </w:t>
       </w:r>
-      <w:r>
-        <w:fldChar w:fldCharType="begin"/>
-      </w:r>
-      <w:r>
-        <w:instrText xml:space="preserve"> SEQ Tabla \* ARABIC </w:instrText>
-      </w:r>
-      <w:r>
-        <w:fldChar w:fldCharType="separate"/>
-      </w:r>
-      <w:r>
-        <w:rPr>
-          <w:noProof/>
-        </w:rPr>
-        <w:t>5</w:t>
-      </w:r>
-      <w:r>
-        <w:fldChar w:fldCharType="end"/>
-      </w:r>
+      <w:fldSimple w:instr=" SEQ Tabla \* ARABIC ">
+        <w:r>
+          <w:rPr>
+            <w:noProof/>
+          </w:rPr>
+          <w:t>5</w:t>
+        </w:r>
+      </w:fldSimple>
       <w:r>
         <w:t xml:space="preserve"> </w:t>
       </w:r>
@@ -22796,14 +22639,7 @@
                 <w:rFonts w:cs="Times New Roman"/>
                 <w:szCs w:val="24"/>
               </w:rPr>
-              <w:t xml:space="preserve">Registro manual </w:t>
-            </w:r>
-            <w:r>
-              <w:rPr>
-                <w:rFonts w:cs="Times New Roman"/>
-                <w:szCs w:val="24"/>
-              </w:rPr>
-              <w:t>+ Software</w:t>
+              <w:t>Registro manual + Software</w:t>
             </w:r>
           </w:p>
         </w:tc>
@@ -22825,14 +22661,7 @@
                 <w:rFonts w:cs="Times New Roman"/>
                 <w:szCs w:val="24"/>
               </w:rPr>
-              <w:t>Manual</w:t>
-            </w:r>
-            <w:r>
-              <w:rPr>
-                <w:rFonts w:cs="Times New Roman"/>
-                <w:szCs w:val="24"/>
-              </w:rPr>
-              <w:t xml:space="preserve"> + Software</w:t>
+              <w:t>Manual + Software</w:t>
             </w:r>
           </w:p>
         </w:tc>
@@ -23070,24 +22899,14 @@
       <w:r>
         <w:t xml:space="preserve">Tabla </w:t>
       </w:r>
-      <w:r>
-        <w:fldChar w:fldCharType="begin"/>
-      </w:r>
-      <w:r>
-        <w:instrText xml:space="preserve"> SEQ Tabla \* ARABIC </w:instrText>
-      </w:r>
-      <w:r>
-        <w:fldChar w:fldCharType="separate"/>
-      </w:r>
-      <w:r>
-        <w:rPr>
-          <w:noProof/>
-        </w:rPr>
-        <w:t>6</w:t>
-      </w:r>
-      <w:r>
-        <w:fldChar w:fldCharType="end"/>
-      </w:r>
+      <w:fldSimple w:instr=" SEQ Tabla \* ARABIC ">
+        <w:r>
+          <w:rPr>
+            <w:noProof/>
+          </w:rPr>
+          <w:t>6</w:t>
+        </w:r>
+      </w:fldSimple>
       <w:r>
         <w:t xml:space="preserve"> </w:t>
       </w:r>
@@ -24008,19 +23827,89 @@
     </w:p>
     <w:p>
       <w:pPr>
+        <w:pStyle w:val="Descripcin"/>
+        <w:ind w:firstLine="708"/>
+        <w:rPr>
+          <w:rFonts w:cs="Times New Roman"/>
+          <w:szCs w:val="24"/>
+        </w:rPr>
+      </w:pPr>
+      <w:r>
+        <w:t xml:space="preserve">Figura </w:t>
+      </w:r>
+      <w:fldSimple w:instr=" SEQ Figura \* ARABIC ">
+        <w:r>
+          <w:rPr>
+            <w:noProof/>
+          </w:rPr>
+          <w:t>3</w:t>
+        </w:r>
+      </w:fldSimple>
+      <w:r>
+        <w:t xml:space="preserve"> </w:t>
+      </w:r>
+      <w:r>
+        <w:rPr>
+          <w:b/>
+          <w:bCs/>
+        </w:rPr>
+        <w:t>Cantidad de encuestas realizadas</w:t>
+      </w:r>
+      <w:r>
+        <w:t xml:space="preserve"> Fuente: Autor</w:t>
+      </w:r>
+    </w:p>
+    <w:p>
+      <w:pPr>
         <w:spacing w:after="160" w:line="259" w:lineRule="auto"/>
         <w:ind w:firstLine="708"/>
-        <w:rPr>
-          <w:rFonts w:cs="Times New Roman"/>
-          <w:szCs w:val="24"/>
-        </w:rPr>
-      </w:pPr>
-      <w:r>
-        <w:rPr>
-          <w:rFonts w:cs="Times New Roman"/>
-          <w:szCs w:val="24"/>
-        </w:rPr>
-        <w:t>(Gráfica donde se muestre la cantidad de encuestas realizadas)</w:t>
+        <w:jc w:val="center"/>
+        <w:rPr>
+          <w:rFonts w:cs="Times New Roman"/>
+          <w:szCs w:val="24"/>
+        </w:rPr>
+      </w:pPr>
+      <w:r>
+        <w:rPr>
+          <w:rFonts w:cs="Times New Roman"/>
+          <w:noProof/>
+          <w:szCs w:val="24"/>
+        </w:rPr>
+        <w:drawing>
+          <wp:inline distT="0" distB="0" distL="0" distR="0" wp14:anchorId="342CDC3F" wp14:editId="205FA7C2">
+            <wp:extent cx="3416300" cy="2088071"/>
+            <wp:effectExtent l="0" t="0" r="0" b="7620"/>
+            <wp:docPr id="1922125327" name="Imagen 1"/>
+            <wp:cNvGraphicFramePr>
+              <a:graphicFrameLocks xmlns:a="http://schemas.openxmlformats.org/drawingml/2006/main" noChangeAspect="1"/>
+            </wp:cNvGraphicFramePr>
+            <a:graphic xmlns:a="http://schemas.openxmlformats.org/drawingml/2006/main">
+              <a:graphicData uri="http://schemas.openxmlformats.org/drawingml/2006/picture">
+                <pic:pic xmlns:pic="http://schemas.openxmlformats.org/drawingml/2006/picture">
+                  <pic:nvPicPr>
+                    <pic:cNvPr id="1922125327" name=""/>
+                    <pic:cNvPicPr/>
+                  </pic:nvPicPr>
+                  <pic:blipFill>
+                    <a:blip r:embed="rId17"/>
+                    <a:stretch>
+                      <a:fillRect/>
+                    </a:stretch>
+                  </pic:blipFill>
+                  <pic:spPr>
+                    <a:xfrm>
+                      <a:off x="0" y="0"/>
+                      <a:ext cx="3422750" cy="2092013"/>
+                    </a:xfrm>
+                    <a:prstGeom prst="rect">
+                      <a:avLst/>
+                    </a:prstGeom>
+                  </pic:spPr>
+                </pic:pic>
+              </a:graphicData>
+            </a:graphic>
+          </wp:inline>
+        </w:drawing>
       </w:r>
     </w:p>
     <w:p>
@@ -24032,6 +23921,13 @@
           <w:szCs w:val="24"/>
         </w:rPr>
       </w:pPr>
+      <w:r>
+        <w:rPr>
+          <w:rFonts w:cs="Times New Roman"/>
+          <w:szCs w:val="24"/>
+        </w:rPr>
+        <w:t xml:space="preserve">Según la información recopilada, se puede observar que el 75% de los encuestados, usa de manera frecuenta los servicios de la biblioteca. Un dato que revela de manera importante que la utilidad de las bibliotecas sigue estando presente en la operatividad actual de los diferentes procesos académicos, con un uso considerable por parte de los estudiantes. Esto se relaciona a lo que todos los bibliotecólogos mencionaron en la entrevista estructurada y es que el uso de las bibliotecas físicas perdura y es importante conservar la dinámica actual de redes de bibliotecas para garantizar la continuidad en la prestación del servicio. </w:t>
+      </w:r>
     </w:p>
     <w:p>
       <w:pPr>
@@ -24042,53 +23938,87 @@
           <w:szCs w:val="24"/>
         </w:rPr>
       </w:pPr>
-      <w:r>
-        <w:rPr>
-          <w:rFonts w:cs="Times New Roman"/>
-          <w:szCs w:val="24"/>
-        </w:rPr>
-        <w:t xml:space="preserve">Según la información recopilada, se puede observar que el 75% de los encuestados, usa de manera frecuenta los servicios de la biblioteca. Un dato que revela de manera importante que la utilidad de las bibliotecas sigue estando presente en la operatividad actual de los diferentes procesos académicos, con un uso considerable por parte de los estudiantes. Esto se relaciona a lo que todos los bibliotecólogos mencionaron en la entrevista estructurada y es que el uso de las bibliotecas físicas perdura y es importante conservar la dinámica actual de redes de bibliotecas para garantizar la continuidad en la prestación del servicio. </w:t>
+    </w:p>
+    <w:p>
+      <w:pPr>
+        <w:pStyle w:val="Descripcin"/>
+        <w:ind w:firstLine="708"/>
+        <w:rPr>
+          <w:rFonts w:cs="Times New Roman"/>
+          <w:szCs w:val="24"/>
+        </w:rPr>
+      </w:pPr>
+      <w:r>
+        <w:t xml:space="preserve">Figura </w:t>
+      </w:r>
+      <w:fldSimple w:instr=" SEQ Figura \* ARABIC ">
+        <w:r>
+          <w:rPr>
+            <w:noProof/>
+          </w:rPr>
+          <w:t>4</w:t>
+        </w:r>
+      </w:fldSimple>
+      <w:r>
+        <w:t xml:space="preserve"> </w:t>
+      </w:r>
+      <w:r>
+        <w:rPr>
+          <w:b/>
+          <w:bCs/>
+        </w:rPr>
+        <w:t>Frecuencia de uso de las bibliotecas visitadas</w:t>
+      </w:r>
+      <w:r>
+        <w:t xml:space="preserve"> Fuente: Autor</w:t>
       </w:r>
     </w:p>
     <w:p>
       <w:pPr>
         <w:spacing w:after="160" w:line="259" w:lineRule="auto"/>
         <w:ind w:firstLine="708"/>
-        <w:rPr>
-          <w:rFonts w:cs="Times New Roman"/>
-          <w:szCs w:val="24"/>
-        </w:rPr>
-      </w:pPr>
-    </w:p>
-    <w:p>
-      <w:pPr>
-        <w:spacing w:after="160" w:line="259" w:lineRule="auto"/>
-        <w:ind w:firstLine="708"/>
-        <w:rPr>
-          <w:rFonts w:cs="Times New Roman"/>
-          <w:szCs w:val="24"/>
-        </w:rPr>
-      </w:pPr>
-      <w:r>
-        <w:rPr>
-          <w:rFonts w:cs="Times New Roman"/>
-          <w:szCs w:val="24"/>
-        </w:rPr>
-        <w:t xml:space="preserve">(Gráfica donde se muestre la </w:t>
-      </w:r>
-      <w:r>
-        <w:rPr>
-          <w:rFonts w:cs="Times New Roman"/>
-          <w:szCs w:val="24"/>
-        </w:rPr>
-        <w:t>frecuencia de uso de las bibliotecas</w:t>
-      </w:r>
-      <w:r>
-        <w:rPr>
-          <w:rFonts w:cs="Times New Roman"/>
-          <w:szCs w:val="24"/>
-        </w:rPr>
-        <w:t>)</w:t>
+        <w:jc w:val="center"/>
+        <w:rPr>
+          <w:rFonts w:cs="Times New Roman"/>
+          <w:szCs w:val="24"/>
+        </w:rPr>
+      </w:pPr>
+      <w:r>
+        <w:drawing>
+          <wp:inline distT="0" distB="0" distL="0" distR="0" wp14:anchorId="1B54FD49" wp14:editId="73F0988D">
+            <wp:extent cx="3683000" cy="2557015"/>
+            <wp:effectExtent l="0" t="0" r="0" b="0"/>
+            <wp:docPr id="581953140" name="Imagen 1"/>
+            <wp:cNvGraphicFramePr>
+              <a:graphicFrameLocks xmlns:a="http://schemas.openxmlformats.org/drawingml/2006/main" noChangeAspect="1"/>
+            </wp:cNvGraphicFramePr>
+            <a:graphic xmlns:a="http://schemas.openxmlformats.org/drawingml/2006/main">
+              <a:graphicData uri="http://schemas.openxmlformats.org/drawingml/2006/picture">
+                <pic:pic xmlns:pic="http://schemas.openxmlformats.org/drawingml/2006/picture">
+                  <pic:nvPicPr>
+                    <pic:cNvPr id="581953140" name=""/>
+                    <pic:cNvPicPr/>
+                  </pic:nvPicPr>
+                  <pic:blipFill>
+                    <a:blip r:embed="rId18"/>
+                    <a:stretch>
+                      <a:fillRect/>
+                    </a:stretch>
+                  </pic:blipFill>
+                  <pic:spPr>
+                    <a:xfrm>
+                      <a:off x="0" y="0"/>
+                      <a:ext cx="3691039" cy="2562596"/>
+                    </a:xfrm>
+                    <a:prstGeom prst="rect">
+                      <a:avLst/>
+                    </a:prstGeom>
+                  </pic:spPr>
+                </pic:pic>
+              </a:graphicData>
+            </a:graphic>
+          </wp:inline>
+        </w:drawing>
       </w:r>
     </w:p>
     <w:p>
@@ -24178,33 +24108,84 @@
     </w:p>
     <w:p>
       <w:pPr>
+        <w:pStyle w:val="Descripcin"/>
+        <w:ind w:firstLine="708"/>
+        <w:rPr>
+          <w:rFonts w:cs="Times New Roman"/>
+          <w:szCs w:val="24"/>
+        </w:rPr>
+      </w:pPr>
+      <w:r>
+        <w:t xml:space="preserve">Figura </w:t>
+      </w:r>
+      <w:fldSimple w:instr=" SEQ Figura \* ARABIC ">
+        <w:r>
+          <w:rPr>
+            <w:noProof/>
+          </w:rPr>
+          <w:t>5</w:t>
+        </w:r>
+      </w:fldSimple>
+      <w:r>
+        <w:t xml:space="preserve"> </w:t>
+      </w:r>
+      <w:r>
+        <w:rPr>
+          <w:b/>
+          <w:bCs/>
+        </w:rPr>
+        <w:t>Calificación de funcionamiento del proceso bibliotecario</w:t>
+      </w:r>
+      <w:r>
+        <w:t xml:space="preserve"> Fuente: Autor</w:t>
+      </w:r>
+    </w:p>
+    <w:p>
+      <w:pPr>
         <w:spacing w:after="160" w:line="259" w:lineRule="auto"/>
         <w:ind w:firstLine="708"/>
-        <w:rPr>
-          <w:rFonts w:cs="Times New Roman"/>
-          <w:szCs w:val="24"/>
-        </w:rPr>
-      </w:pPr>
-      <w:r>
-        <w:rPr>
-          <w:rFonts w:cs="Times New Roman"/>
-          <w:szCs w:val="24"/>
-        </w:rPr>
-        <w:t xml:space="preserve">(Gráfica donde se muestre </w:t>
-      </w:r>
-      <w:r>
-        <w:rPr>
-          <w:rFonts w:cs="Times New Roman"/>
-          <w:szCs w:val="24"/>
-        </w:rPr>
-        <w:t>funcionamiento del sistema actual</w:t>
-      </w:r>
-      <w:r>
-        <w:rPr>
-          <w:rFonts w:cs="Times New Roman"/>
-          <w:szCs w:val="24"/>
-        </w:rPr>
-        <w:t>)</w:t>
+        <w:jc w:val="center"/>
+        <w:rPr>
+          <w:rFonts w:cs="Times New Roman"/>
+          <w:szCs w:val="24"/>
+        </w:rPr>
+      </w:pPr>
+      <w:r>
+        <w:drawing>
+          <wp:inline distT="0" distB="0" distL="0" distR="0" wp14:anchorId="5499E3E8" wp14:editId="7C9D8C3A">
+            <wp:extent cx="3721100" cy="2624306"/>
+            <wp:effectExtent l="0" t="0" r="0" b="5080"/>
+            <wp:docPr id="554898085" name="Imagen 1"/>
+            <wp:cNvGraphicFramePr>
+              <a:graphicFrameLocks xmlns:a="http://schemas.openxmlformats.org/drawingml/2006/main" noChangeAspect="1"/>
+            </wp:cNvGraphicFramePr>
+            <a:graphic xmlns:a="http://schemas.openxmlformats.org/drawingml/2006/main">
+              <a:graphicData uri="http://schemas.openxmlformats.org/drawingml/2006/picture">
+                <pic:pic xmlns:pic="http://schemas.openxmlformats.org/drawingml/2006/picture">
+                  <pic:nvPicPr>
+                    <pic:cNvPr id="554898085" name=""/>
+                    <pic:cNvPicPr/>
+                  </pic:nvPicPr>
+                  <pic:blipFill>
+                    <a:blip r:embed="rId19"/>
+                    <a:stretch>
+                      <a:fillRect/>
+                    </a:stretch>
+                  </pic:blipFill>
+                  <pic:spPr>
+                    <a:xfrm>
+                      <a:off x="0" y="0"/>
+                      <a:ext cx="3730917" cy="2631229"/>
+                    </a:xfrm>
+                    <a:prstGeom prst="rect">
+                      <a:avLst/>
+                    </a:prstGeom>
+                  </pic:spPr>
+                </pic:pic>
+              </a:graphicData>
+            </a:graphic>
+          </wp:inline>
+        </w:drawing>
       </w:r>
     </w:p>
     <w:p>
@@ -24305,7 +24286,6 @@
                 <w:rFonts w:cs="Times New Roman"/>
                 <w:szCs w:val="24"/>
               </w:rPr>
-              <w:lastRenderedPageBreak/>
               <w:t>Proceso</w:t>
             </w:r>
           </w:p>
@@ -24399,14 +24379,7 @@
                 <w:rFonts w:cs="Times New Roman"/>
                 <w:szCs w:val="24"/>
               </w:rPr>
-              <w:t xml:space="preserve">Registro manual </w:t>
-            </w:r>
-            <w:r>
-              <w:rPr>
-                <w:rFonts w:cs="Times New Roman"/>
-                <w:szCs w:val="24"/>
-              </w:rPr>
-              <w:t>o en sistema básico</w:t>
+              <w:t>Registro manual o en sistema básico</w:t>
             </w:r>
           </w:p>
         </w:tc>
@@ -24454,6 +24427,7 @@
                 <w:rFonts w:cs="Times New Roman"/>
                 <w:szCs w:val="24"/>
               </w:rPr>
+              <w:lastRenderedPageBreak/>
               <w:t>Devolución</w:t>
             </w:r>
           </w:p>
@@ -24814,6 +24788,33 @@
         <w:rPr>
           <w:rFonts w:cs="Times New Roman"/>
           <w:szCs w:val="24"/>
+        </w:rPr>
+      </w:pPr>
+    </w:p>
+    <w:p>
+      <w:pPr>
+        <w:spacing w:after="160" w:line="259" w:lineRule="auto"/>
+        <w:jc w:val="left"/>
+        <w:rPr>
+          <w:b/>
+        </w:rPr>
+      </w:pPr>
+    </w:p>
+    <w:p>
+      <w:pPr>
+        <w:spacing w:after="160" w:line="259" w:lineRule="auto"/>
+        <w:jc w:val="left"/>
+        <w:rPr>
+          <w:b/>
+        </w:rPr>
+      </w:pPr>
+    </w:p>
+    <w:p>
+      <w:pPr>
+        <w:spacing w:after="160" w:line="259" w:lineRule="auto"/>
+        <w:jc w:val="left"/>
+        <w:rPr>
+          <w:b/>
         </w:rPr>
       </w:pPr>
     </w:p>
@@ -35141,6 +35142,7 @@
   <w:style w:type="character" w:default="1" w:styleId="Fuentedeprrafopredeter">
     <w:name w:val="Default Paragraph Font"/>
     <w:uiPriority w:val="1"/>
+    <w:semiHidden/>
     <w:unhideWhenUsed/>
   </w:style>
   <w:style w:type="table" w:default="1" w:styleId="Tablanormal">

</xml_diff>

<commit_message>
Se agregan la primera parte de los resultados en el uso del software
</commit_message>
<xml_diff>
--- a/Formato Proyecto Investigación.docx
+++ b/Formato Proyecto Investigación.docx
@@ -1856,10 +1856,16 @@
     <w:p>
       <w:pPr>
         <w:pStyle w:val="Ttulo1"/>
+        <w:rPr>
+          <w:lang w:val="en-US"/>
+        </w:rPr>
       </w:pPr>
       <w:bookmarkStart w:id="9" w:name="_Toc1646091618"/>
       <w:commentRangeStart w:id="10"/>
       <w:r>
+        <w:rPr>
+          <w:lang w:val="en-US"/>
+        </w:rPr>
         <w:lastRenderedPageBreak/>
         <w:t>Abstract</w:t>
       </w:r>
@@ -1870,6 +1876,7 @@
           <w:rStyle w:val="Refdecomentario"/>
           <w:sz w:val="24"/>
           <w:szCs w:val="32"/>
+          <w:lang w:val="en-US"/>
         </w:rPr>
         <w:commentReference w:id="10"/>
       </w:r>
@@ -1878,6 +1885,7 @@
       <w:pPr>
         <w:rPr>
           <w:szCs w:val="24"/>
+          <w:lang w:val="en-US"/>
         </w:rPr>
       </w:pPr>
     </w:p>
@@ -1887,12 +1895,14 @@
         <w:rPr>
           <w:color w:val="000000" w:themeColor="text1"/>
           <w:szCs w:val="24"/>
+          <w:lang w:val="en-US"/>
         </w:rPr>
       </w:pPr>
       <w:r>
         <w:rPr>
           <w:color w:val="000000" w:themeColor="text1"/>
           <w:szCs w:val="24"/>
+          <w:lang w:val="en-US"/>
         </w:rPr>
         <w:t>The city of Medellín, a Science, Technology, and Innovation District, boasts an integrated network of public libraries comprised of 26 public libraries and approximately 47 higher education libraries. These libraries serve the information needs of the 2.6 million inhabitants of Medellín's urban area, as well as the many people who commute to the city daily. Traditional methods in these libraries often result in slow response times. To address this need, this study proposes an efficient solution for book control and identification using Radio Frequency Identification (RFID) technology. This technology utilizes tags with storage chips and readers with integrated circuits.</w:t>
       </w:r>
@@ -1903,6 +1913,7 @@
         <w:rPr>
           <w:color w:val="000000" w:themeColor="text1"/>
           <w:szCs w:val="24"/>
+          <w:lang w:val="en-US"/>
         </w:rPr>
       </w:pPr>
     </w:p>
@@ -1912,12 +1923,14 @@
         <w:rPr>
           <w:color w:val="000000" w:themeColor="text1"/>
           <w:szCs w:val="24"/>
+          <w:lang w:val="en-US"/>
         </w:rPr>
       </w:pPr>
       <w:r>
         <w:rPr>
           <w:color w:val="000000" w:themeColor="text1"/>
           <w:szCs w:val="24"/>
+          <w:lang w:val="en-US"/>
         </w:rPr>
         <w:t>The research employs a mixed-methods experimental approach, divided into three stages. The first stage involved gathering information from users and library staff responsible for internal systems. The results confirm the significant value of libraries in today's environment but also reveal a lack of technological resources. For the second stage, the integral system is developed using the CST electromagnetic simulation software (CST Studio suite) where results were modeled and the correct identification of materials was achieved. In the last phase, the simulation will be implemented, according to the parameters specified therein.</w:t>
       </w:r>
@@ -1927,6 +1940,7 @@
         <w:rPr>
           <w:color w:val="000000" w:themeColor="text1"/>
           <w:szCs w:val="24"/>
+          <w:lang w:val="en-US"/>
         </w:rPr>
       </w:pPr>
     </w:p>
@@ -24011,6 +24025,13 @@
           <w:szCs w:val="24"/>
         </w:rPr>
       </w:pPr>
+      <w:r>
+        <w:rPr>
+          <w:rFonts w:cs="Times New Roman"/>
+          <w:szCs w:val="24"/>
+        </w:rPr>
+        <w:t xml:space="preserve">Continuando con el segundo objetivo, para la selección de la herramienta de simulación fue un resultado de calificaciones comparativas entre software como lo son ANSYS, CST Studio Suite, HFSS y COMSOL Multiphysics. Estas herramientas, especializadas en simulación electromagnética permiten la evaluación de parámetros como los son pérdidas por retorno, distribución de campos (eléctricos, magnéticos, cercanos y lejanos), potencia de radiación, frecuencia de resonancia entre otros. </w:t>
+      </w:r>
     </w:p>
     <w:p>
       <w:pPr>
@@ -24031,6 +24052,137 @@
           <w:szCs w:val="24"/>
         </w:rPr>
       </w:pPr>
+      <w:r>
+        <w:rPr>
+          <w:rFonts w:cs="Times New Roman"/>
+          <w:szCs w:val="24"/>
+        </w:rPr>
+        <w:t xml:space="preserve">Se puede ver un uso valioso en cada uno de los softwares, sin embargo, se optó CST Studio Suite debido a la capacidad de modelar estructura de radio frecuencia con una precisión considerable. Además, demostró una gran compatibilidad en el diseño de diferentes tipos de antenas como son las microstrip o las RFID. Por último, se destaca la facilidad para realizar el análisis de parámetros críticos como el coeficiente de reflexión, lectura de carta Smith y la distribución de campos. </w:t>
+      </w:r>
+    </w:p>
+    <w:p>
+      <w:pPr>
+        <w:spacing w:after="160" w:line="259" w:lineRule="auto"/>
+        <w:ind w:firstLine="708"/>
+        <w:rPr>
+          <w:rFonts w:cs="Times New Roman"/>
+          <w:szCs w:val="24"/>
+        </w:rPr>
+      </w:pPr>
+    </w:p>
+    <w:p>
+      <w:pPr>
+        <w:spacing w:after="160" w:line="259" w:lineRule="auto"/>
+        <w:ind w:firstLine="708"/>
+        <w:rPr>
+          <w:rFonts w:cs="Times New Roman"/>
+          <w:szCs w:val="24"/>
+        </w:rPr>
+      </w:pPr>
+      <w:r>
+        <w:rPr>
+          <w:rFonts w:cs="Times New Roman"/>
+          <w:szCs w:val="24"/>
+        </w:rPr>
+        <w:t xml:space="preserve">La elección de este software esclarece un avance en la etapa del diseño de antenas, ya que permite establecer una base </w:t>
+      </w:r>
+      <w:r>
+        <w:rPr>
+          <w:rFonts w:cs="Times New Roman"/>
+          <w:szCs w:val="24"/>
+        </w:rPr>
+        <w:t>sólida</w:t>
+      </w:r>
+      <w:r>
+        <w:rPr>
+          <w:rFonts w:cs="Times New Roman"/>
+          <w:szCs w:val="24"/>
+        </w:rPr>
+        <w:t xml:space="preserve"> confiable para realizar validaciones en el diseño de la arquitectura a implementar. Como fase de entrenamiento y familiarización con el software, se implementó inicialmente una antena tipo parche, este es un estándar fundamental para la caracterización de parámetros electromagnéticos en el diseño de antenas.</w:t>
+      </w:r>
+    </w:p>
+    <w:p>
+      <w:pPr>
+        <w:spacing w:after="160" w:line="259" w:lineRule="auto"/>
+        <w:ind w:firstLine="708"/>
+        <w:rPr>
+          <w:rFonts w:cs="Times New Roman"/>
+          <w:szCs w:val="24"/>
+        </w:rPr>
+      </w:pPr>
+    </w:p>
+    <w:p>
+      <w:pPr>
+        <w:spacing w:after="160" w:line="259" w:lineRule="auto"/>
+        <w:ind w:firstLine="708"/>
+        <w:rPr>
+          <w:rFonts w:cs="Times New Roman"/>
+          <w:szCs w:val="24"/>
+        </w:rPr>
+      </w:pPr>
+      <w:commentRangeStart w:id="40"/>
+      <w:r>
+        <w:rPr>
+          <w:rFonts w:cs="Times New Roman"/>
+          <w:szCs w:val="24"/>
+        </w:rPr>
+        <w:lastRenderedPageBreak/>
+        <w:drawing>
+          <wp:inline distT="0" distB="0" distL="0" distR="0" wp14:anchorId="4D6770D9" wp14:editId="6ABD0B81">
+            <wp:extent cx="2705100" cy="2400474"/>
+            <wp:effectExtent l="0" t="0" r="0" b="0"/>
+            <wp:docPr id="174362105" name="Imagen 1"/>
+            <wp:cNvGraphicFramePr>
+              <a:graphicFrameLocks xmlns:a="http://schemas.openxmlformats.org/drawingml/2006/main" noChangeAspect="1"/>
+            </wp:cNvGraphicFramePr>
+            <a:graphic xmlns:a="http://schemas.openxmlformats.org/drawingml/2006/main">
+              <a:graphicData uri="http://schemas.openxmlformats.org/drawingml/2006/picture">
+                <pic:pic xmlns:pic="http://schemas.openxmlformats.org/drawingml/2006/picture">
+                  <pic:nvPicPr>
+                    <pic:cNvPr id="174362105" name=""/>
+                    <pic:cNvPicPr/>
+                  </pic:nvPicPr>
+                  <pic:blipFill>
+                    <a:blip r:embed="rId20"/>
+                    <a:stretch>
+                      <a:fillRect/>
+                    </a:stretch>
+                  </pic:blipFill>
+                  <pic:spPr>
+                    <a:xfrm>
+                      <a:off x="0" y="0"/>
+                      <a:ext cx="2709679" cy="2404537"/>
+                    </a:xfrm>
+                    <a:prstGeom prst="rect">
+                      <a:avLst/>
+                    </a:prstGeom>
+                  </pic:spPr>
+                </pic:pic>
+              </a:graphicData>
+            </a:graphic>
+          </wp:inline>
+        </w:drawing>
+      </w:r>
+      <w:commentRangeEnd w:id="40"/>
+      <w:r>
+        <w:rPr>
+          <w:rStyle w:val="Refdecomentario"/>
+          <w:rFonts w:cs="Times New Roman"/>
+          <w:sz w:val="24"/>
+          <w:szCs w:val="24"/>
+        </w:rPr>
+        <w:commentReference w:id="40"/>
+      </w:r>
+    </w:p>
+    <w:p>
+      <w:pPr>
+        <w:spacing w:after="160" w:line="259" w:lineRule="auto"/>
+        <w:ind w:firstLine="708"/>
+        <w:rPr>
+          <w:rFonts w:cs="Times New Roman"/>
+          <w:szCs w:val="24"/>
+        </w:rPr>
+      </w:pPr>
     </w:p>
     <w:p>
       <w:pPr>
@@ -24180,7 +24332,6 @@
           <w:b/>
           <w:bCs/>
         </w:rPr>
-        <w:lastRenderedPageBreak/>
         <w:t>9</w:t>
       </w:r>
       <w:r>
@@ -24214,6 +24365,7 @@
           <w:rFonts w:cs="Times New Roman"/>
           <w:szCs w:val="24"/>
         </w:rPr>
+        <w:lastRenderedPageBreak/>
         <w:t xml:space="preserve">Al visualizar </w:t>
       </w:r>
       <w:r>
@@ -24424,7 +24576,7 @@
           <w:bCs/>
         </w:rPr>
       </w:pPr>
-      <w:bookmarkStart w:id="40" w:name="_Toc440985142"/>
+      <w:bookmarkStart w:id="41" w:name="_Toc440985142"/>
       <w:r>
         <w:rPr>
           <w:b/>
@@ -24440,7 +24592,7 @@
         </w:rPr>
         <w:t xml:space="preserve"> Conclusiones</w:t>
       </w:r>
-      <w:bookmarkEnd w:id="40"/>
+      <w:bookmarkEnd w:id="41"/>
     </w:p>
     <w:p>
       <w:pPr>
@@ -24847,8 +24999,8 @@
       <w:pPr>
         <w:pStyle w:val="Ttulo1"/>
       </w:pPr>
-      <w:bookmarkStart w:id="41" w:name="_Toc440985143"/>
-      <w:bookmarkStart w:id="42" w:name="_Toc758643157"/>
+      <w:bookmarkStart w:id="42" w:name="_Toc440985143"/>
+      <w:bookmarkStart w:id="43" w:name="_Toc758643157"/>
       <w:r>
         <w:br w:type="page"/>
       </w:r>
@@ -24856,8 +25008,8 @@
         <w:lastRenderedPageBreak/>
         <w:t>Referencias</w:t>
       </w:r>
-      <w:bookmarkEnd w:id="41"/>
       <w:bookmarkEnd w:id="42"/>
+      <w:bookmarkEnd w:id="43"/>
     </w:p>
     <w:p/>
     <w:p>
@@ -26847,13 +26999,7 @@
         <w:t>.</w:t>
       </w:r>
     </w:p>
-    <w:p>
-      <w:pPr>
-        <w:rPr>
-          <w:lang w:val="en-US"/>
-        </w:rPr>
-      </w:pPr>
-    </w:p>
+    <w:p/>
     <w:p>
       <w:pPr>
         <w:widowControl w:val="0"/>
@@ -26864,7 +27010,6 @@
         <w:rPr>
           <w:rFonts w:cs="Times New Roman"/>
           <w:noProof/>
-          <w:lang w:val="en-US"/>
         </w:rPr>
       </w:pPr>
     </w:p>
@@ -26878,7 +27023,6 @@
         <w:rPr>
           <w:rFonts w:cs="Times New Roman"/>
           <w:noProof/>
-          <w:lang w:val="en-US"/>
         </w:rPr>
       </w:pPr>
     </w:p>
@@ -26892,7 +27036,6 @@
         <w:rPr>
           <w:rFonts w:cs="Times New Roman"/>
           <w:noProof/>
-          <w:lang w:val="en-US"/>
         </w:rPr>
       </w:pPr>
     </w:p>
@@ -26906,7 +27049,6 @@
         <w:rPr>
           <w:rFonts w:cs="Times New Roman"/>
           <w:noProof/>
-          <w:lang w:val="en-US"/>
         </w:rPr>
       </w:pPr>
     </w:p>
@@ -27001,15 +27143,15 @@
           <w:b/>
         </w:rPr>
       </w:pPr>
-      <w:bookmarkStart w:id="43" w:name="_Toc440985144"/>
-      <w:commentRangeStart w:id="44"/>
+      <w:bookmarkStart w:id="44" w:name="_Toc440985144"/>
+      <w:commentRangeStart w:id="45"/>
       <w:r>
         <w:rPr>
           <w:b/>
         </w:rPr>
         <w:t>A</w:t>
       </w:r>
-      <w:commentRangeEnd w:id="44"/>
+      <w:commentRangeEnd w:id="45"/>
       <w:r>
         <w:rPr>
           <w:rStyle w:val="Refdecomentario"/>
@@ -27017,7 +27159,7 @@
           <w:sz w:val="24"/>
           <w:szCs w:val="22"/>
         </w:rPr>
-        <w:commentReference w:id="44"/>
+        <w:commentReference w:id="45"/>
       </w:r>
       <w:r>
         <w:rPr>
@@ -27025,7 +27167,7 @@
         </w:rPr>
         <w:t>nexos</w:t>
       </w:r>
-      <w:bookmarkEnd w:id="43"/>
+      <w:bookmarkEnd w:id="44"/>
     </w:p>
     <w:p>
       <w:pPr>
@@ -27985,7 +28127,24 @@
       </w:r>
     </w:p>
   </w:comment>
-  <w:comment w:id="44" w:author="Autor" w:initials="A">
+  <w:comment w:id="40" w:author="Autor" w:initials="A">
+    <w:p>
+      <w:pPr>
+        <w:pStyle w:val="Textocomentario"/>
+        <w:jc w:val="left"/>
+      </w:pPr>
+      <w:r>
+        <w:rPr>
+          <w:rStyle w:val="Refdecomentario"/>
+        </w:rPr>
+        <w:annotationRef/>
+      </w:r>
+      <w:r>
+        <w:t>Se tiene la simulación ejecutada y los parámetros para documentar acá en el apartado de resultados, ¿cómo seria la mejor forma de presentar estos resultados?</w:t>
+      </w:r>
+    </w:p>
+  </w:comment>
+  <w:comment w:id="45" w:author="Autor" w:initials="A">
     <w:p>
       <w:pPr>
         <w:pStyle w:val="Textocomentario"/>
@@ -28075,6 +28234,7 @@
   <w15:commentEx w15:paraId="023BACFE" w15:done="0"/>
   <w15:commentEx w15:paraId="7326038E" w15:done="1"/>
   <w15:commentEx w15:paraId="0904C27C" w15:paraIdParent="7326038E" w15:done="1"/>
+  <w15:commentEx w15:paraId="716F387D" w15:done="0"/>
   <w15:commentEx w15:paraId="12DDE124" w15:done="0"/>
 </w15:commentsEx>
 </file>
@@ -28099,6 +28259,7 @@
   <w16cid:commentId w16cid:paraId="023BACFE" w16cid:durableId="31F2B4FA"/>
   <w16cid:commentId w16cid:paraId="7326038E" w16cid:durableId="42770BF9"/>
   <w16cid:commentId w16cid:paraId="0904C27C" w16cid:durableId="17F7DCC5"/>
+  <w16cid:commentId w16cid:paraId="716F387D" w16cid:durableId="30D3890E"/>
   <w16cid:commentId w16cid:paraId="12DDE124" w16cid:durableId="2B548902"/>
 </w16cid:commentsIds>
 </file>
@@ -28271,7 +28432,7 @@
         <w:szCs w:val="20"/>
       </w:rPr>
       <w:pict w14:anchorId="12E29E18">
-        <v:rect id="_x0000_i1050" style="width:470.2pt;height:1pt" o:hralign="center" o:hrstd="t" o:hrnoshade="t" o:hr="t" fillcolor="#ed7d31 [3205]" stroked="f"/>
+        <v:rect id="_x0000_i1025" style="width:470.2pt;height:1pt" o:hralign="center" o:hrstd="t" o:hrnoshade="t" o:hr="t" fillcolor="#ed7d31 [3205]" stroked="f"/>
       </w:pict>
     </w:r>
   </w:p>
@@ -35370,7 +35531,7 @@
 <file path=word/charts/chart1.xml><?xml version="1.0" encoding="utf-8"?>
 <c:chartSpace xmlns:c="http://schemas.openxmlformats.org/drawingml/2006/chart" xmlns:a="http://schemas.openxmlformats.org/drawingml/2006/main" xmlns:r="http://schemas.openxmlformats.org/officeDocument/2006/relationships" xmlns:c16r2="http://schemas.microsoft.com/office/drawing/2015/06/chart">
   <c:date1904 val="0"/>
-  <c:lang val="es-MX"/>
+  <c:lang val="es-ES"/>
   <c:roundedCorners val="0"/>
   <mc:AlternateContent xmlns:mc="http://schemas.openxmlformats.org/markup-compatibility/2006">
     <mc:Choice xmlns:c14="http://schemas.microsoft.com/office/drawing/2007/8/2/chart" Requires="c14">
@@ -36843,6 +37004,15 @@
 </file>
 
 <file path=customXml/item1.xml><?xml version="1.0" encoding="utf-8"?>
+<?mso-contentType ?>
+<FormTemplates xmlns="http://schemas.microsoft.com/sharepoint/v3/contenttype/forms">
+  <Display>DocumentLibraryForm</Display>
+  <Edit>DocumentLibraryForm</Edit>
+  <New>DocumentLibraryForm</New>
+</FormTemplates>
+</file>
+
+<file path=customXml/item2.xml><?xml version="1.0" encoding="utf-8"?>
 <b:Sources xmlns:b="http://schemas.openxmlformats.org/officeDocument/2006/bibliography" xmlns="http://schemas.openxmlformats.org/officeDocument/2006/bibliography" SelectedStyle="\APASixthEditionOfficeOnline.xsl" StyleName="APA" Version="6">
   <b:Source>
     <b:Tag>Men90</b:Tag>
@@ -37677,24 +37847,7 @@
 </b:Sources>
 </file>
 
-<file path=customXml/item2.xml><?xml version="1.0" encoding="utf-8"?>
-<?mso-contentType ?>
-<FormTemplates xmlns="http://schemas.microsoft.com/sharepoint/v3/contenttype/forms">
-  <Display>DocumentLibraryForm</Display>
-  <Edit>DocumentLibraryForm</Edit>
-  <New>DocumentLibraryForm</New>
-</FormTemplates>
-</file>
-
 <file path=customXml/item3.xml><?xml version="1.0" encoding="utf-8"?>
-<p:properties xmlns:p="http://schemas.microsoft.com/office/2006/metadata/properties" xmlns:xsi="http://www.w3.org/2001/XMLSchema-instance" xmlns:pc="http://schemas.microsoft.com/office/infopath/2007/PartnerControls">
-  <documentManagement>
-    <_activity xmlns="152b35e6-23a1-4beb-a1fd-2689778f6058" xsi:nil="true"/>
-  </documentManagement>
-</p:properties>
-</file>
-
-<file path=customXml/item4.xml><?xml version="1.0" encoding="utf-8"?>
 <ct:contentTypeSchema xmlns:ct="http://schemas.microsoft.com/office/2006/metadata/contentType" xmlns:ma="http://schemas.microsoft.com/office/2006/metadata/properties/metaAttributes" ct:_="" ma:_="" ma:contentTypeName="Documento" ma:contentTypeID="0x01010015BDB27AF1A6EC4C99611A7AD03A3206" ma:contentTypeVersion="18" ma:contentTypeDescription="Crear nuevo documento." ma:contentTypeScope="" ma:versionID="56de9a8de695fa7f309cf2eb59d05ef4">
   <xsd:schema xmlns:xsd="http://www.w3.org/2001/XMLSchema" xmlns:xs="http://www.w3.org/2001/XMLSchema" xmlns:p="http://schemas.microsoft.com/office/2006/metadata/properties" xmlns:ns3="ed1181c6-4963-4f9c-a6e4-d7efb21233a0" xmlns:ns4="152b35e6-23a1-4beb-a1fd-2689778f6058" targetNamespace="http://schemas.microsoft.com/office/2006/metadata/properties" ma:root="true" ma:fieldsID="cae7528616b6d30ad4c29b83143ea2c0" ns3:_="" ns4:_="">
     <xsd:import namespace="ed1181c6-4963-4f9c-a6e4-d7efb21233a0"/>
@@ -37947,7 +38100,23 @@
 </ct:contentTypeSchema>
 </file>
 
+<file path=customXml/item4.xml><?xml version="1.0" encoding="utf-8"?>
+<p:properties xmlns:p="http://schemas.microsoft.com/office/2006/metadata/properties" xmlns:xsi="http://www.w3.org/2001/XMLSchema-instance" xmlns:pc="http://schemas.microsoft.com/office/infopath/2007/PartnerControls">
+  <documentManagement>
+    <_activity xmlns="152b35e6-23a1-4beb-a1fd-2689778f6058" xsi:nil="true"/>
+  </documentManagement>
+</p:properties>
+</file>
+
 <file path=customXml/itemProps1.xml><?xml version="1.0" encoding="utf-8"?>
+<ds:datastoreItem xmlns:ds="http://schemas.openxmlformats.org/officeDocument/2006/customXml" ds:itemID="{7F74FD34-EBDF-4094-A9AD-E46225785B9A}">
+  <ds:schemaRefs>
+    <ds:schemaRef ds:uri="http://schemas.microsoft.com/sharepoint/v3/contenttype/forms"/>
+  </ds:schemaRefs>
+</ds:datastoreItem>
+</file>
+
+<file path=customXml/itemProps2.xml><?xml version="1.0" encoding="utf-8"?>
 <ds:datastoreItem xmlns:ds="http://schemas.openxmlformats.org/officeDocument/2006/customXml" ds:itemID="{5536E029-DFBE-4035-BD65-6D509AFD34FF}">
   <ds:schemaRefs>
     <ds:schemaRef ds:uri="http://schemas.openxmlformats.org/officeDocument/2006/bibliography"/>
@@ -37955,25 +38124,7 @@
 </ds:datastoreItem>
 </file>
 
-<file path=customXml/itemProps2.xml><?xml version="1.0" encoding="utf-8"?>
-<ds:datastoreItem xmlns:ds="http://schemas.openxmlformats.org/officeDocument/2006/customXml" ds:itemID="{7F74FD34-EBDF-4094-A9AD-E46225785B9A}">
-  <ds:schemaRefs>
-    <ds:schemaRef ds:uri="http://schemas.microsoft.com/sharepoint/v3/contenttype/forms"/>
-  </ds:schemaRefs>
-</ds:datastoreItem>
-</file>
-
 <file path=customXml/itemProps3.xml><?xml version="1.0" encoding="utf-8"?>
-<ds:datastoreItem xmlns:ds="http://schemas.openxmlformats.org/officeDocument/2006/customXml" ds:itemID="{B58D4DAF-C7F0-4FA3-950B-89D41305B414}">
-  <ds:schemaRefs>
-    <ds:schemaRef ds:uri="http://schemas.microsoft.com/office/2006/metadata/properties"/>
-    <ds:schemaRef ds:uri="http://schemas.microsoft.com/office/infopath/2007/PartnerControls"/>
-    <ds:schemaRef ds:uri="152b35e6-23a1-4beb-a1fd-2689778f6058"/>
-  </ds:schemaRefs>
-</ds:datastoreItem>
-</file>
-
-<file path=customXml/itemProps4.xml><?xml version="1.0" encoding="utf-8"?>
 <ds:datastoreItem xmlns:ds="http://schemas.openxmlformats.org/officeDocument/2006/customXml" ds:itemID="{71334E21-6B6C-4687-847F-D6F99FF4EBD6}">
   <ds:schemaRefs>
     <ds:schemaRef ds:uri="http://schemas.microsoft.com/office/2006/metadata/contentType"/>
@@ -37990,4 +38141,14 @@
     <ds:schemaRef ds:uri="http://schemas.microsoft.com/internal/obd"/>
   </ds:schemaRefs>
 </ds:datastoreItem>
+</file>
+
+<file path=customXml/itemProps4.xml><?xml version="1.0" encoding="utf-8"?>
+<ds:datastoreItem xmlns:ds="http://schemas.openxmlformats.org/officeDocument/2006/customXml" ds:itemID="{B58D4DAF-C7F0-4FA3-950B-89D41305B414}">
+  <ds:schemaRefs>
+    <ds:schemaRef ds:uri="http://schemas.microsoft.com/office/2006/metadata/properties"/>
+    <ds:schemaRef ds:uri="http://schemas.microsoft.com/office/infopath/2007/PartnerControls"/>
+    <ds:schemaRef ds:uri="152b35e6-23a1-4beb-a1fd-2689778f6058"/>
+  </ds:schemaRefs>
+</ds:datastoreItem>
 </file>
</xml_diff>